<commit_message>
fix: restore Pilier 4 in summary table and add Monaco Sovereign Data Center / Zone Franche lever
</commit_message>
<xml_diff>
--- a/Le_Pacte_Nice_IA.docx
+++ b/Le_Pacte_Nice_IA.docx
@@ -434,7 +434,7 @@
                 <w:color w:val="1E293B"/>
                 <w:sz w:val="17"/>
               </w:rPr>
-              <w:t>4. Migration Monaco Cloud</w:t>
+              <w:t>4. Monaco Cloud &amp; Zone Franche</w:t>
             </w:r>
           </w:p>
         </w:tc>
@@ -452,7 +452,7 @@
                 <w:color w:val="1E293B"/>
                 <w:sz w:val="17"/>
               </w:rPr>
-              <w:t>Cloud Souverain d'État (AMSN)</w:t>
+              <w:t>Data Center Souverain (AMSN) &amp; Zone Franche</w:t>
             </w:r>
           </w:p>
         </w:tc>
@@ -488,7 +488,7 @@
                 <w:color w:val="1E293B"/>
                 <w:sz w:val="17"/>
               </w:rPr>
-              <w:t>OPEX IT réduits + 8-12M€ CAPEX évité.</w:t>
+              <w:t>Économies IT + 8-12M€ CAPEX évité + attraction PME.</w:t>
             </w:r>
           </w:p>
         </w:tc>
@@ -852,6 +852,44 @@
           <w:color w:val="1E293B"/>
         </w:rPr>
         <w:t xml:space="preserve"> : Université Côte d'Azur (UCA), Inria, Eurecom, CNRS (du Master au Doctorat).</w:t>
+      </w:r>
+    </w:p>
+    <w:p>
+      <w:pPr>
+        <w:pStyle w:val="ListBullet"/>
+        <w:spacing w:before="40" w:after="60"/>
+      </w:pPr>
+      <w:r>
+        <w:rPr>
+          <w:b/>
+          <w:color w:val="0F172A"/>
+        </w:rPr>
+        <w:t>Monaco Cloud &amp; Data Center Souverain d'État</w:t>
+      </w:r>
+      <w:r>
+        <w:rPr>
+          <w:color w:val="1E293B"/>
+        </w:rPr>
+        <w:t xml:space="preserve"> : Premier Cloud d'État souverain d'Europe (certifié AMSN), garantissant une étanchéité totale contre le Cloud Act américain, connecté en fibre noire dédiée à Nice.</w:t>
+      </w:r>
+    </w:p>
+    <w:p>
+      <w:pPr>
+        <w:pStyle w:val="ListBullet"/>
+        <w:spacing w:before="40" w:after="60"/>
+      </w:pPr>
+      <w:r>
+        <w:rPr>
+          <w:b/>
+          <w:color w:val="0F172A"/>
+        </w:rPr>
+        <w:t>Le levier Zone Franche Numérique Nice-Monaco</w:t>
+      </w:r>
+      <w:r>
+        <w:rPr>
+          <w:color w:val="1E293B"/>
+        </w:rPr>
+        <w:t xml:space="preserve"> : Création d'une zone d'expérimentation fiscale et réglementaire transfrontalière privilégiée pour attirer et retenir les PME, startups et licornes de l'IA.</w:t>
       </w:r>
     </w:p>
     <w:p>

</xml_diff>

<commit_message>
style: apply sober institutional executive design (Navy/Slate/Black) to Google Docs (.docx) and PDF
</commit_message>
<xml_diff>
--- a/Le_Pacte_Nice_IA.docx
+++ b/Le_Pacte_Nice_IA.docx
@@ -10,7 +10,7 @@
         <w:rPr>
           <w:rFonts w:ascii="Arial" w:hAnsi="Arial"/>
           <w:b/>
-          <w:color w:val="B89762"/>
+          <w:color w:val="334155"/>
           <w:sz w:val="17"/>
         </w:rPr>
         <w:t>ARX CONSULTING — DOCUMENT STRATÉGIQUE MÉTROPOLITAIN</w:t>
@@ -21,51 +21,51 @@
           <w:rFonts w:ascii="Georgia" w:hAnsi="Georgia"/>
           <w:b/>
           <w:color w:val="0F172A"/>
-          <w:sz w:val="48"/>
+          <w:sz w:val="44"/>
         </w:rPr>
-        <w:t>🤝 LE PACTE NICE IA</w:t>
+        <w:t>LE PACTE NICE IA</w:t>
         <w:br/>
       </w:r>
       <w:r>
         <w:rPr>
           <w:rFonts w:ascii="Arial" w:hAnsi="Arial"/>
-          <w:color w:val="0284C7"/>
-          <w:sz w:val="22"/>
+          <w:color w:val="1E3A8A"/>
+          <w:sz w:val="21"/>
         </w:rPr>
         <w:t>Doctrine Stratégique, Rigueur Budgétaire &amp; Alliance Transfrontalière (2026-2029)</w:t>
       </w:r>
     </w:p>
     <w:p>
       <w:pPr>
-        <w:spacing w:after="360"/>
+        <w:spacing w:after="320"/>
       </w:pPr>
       <w:r>
         <w:rPr>
           <w:i/>
           <w:color w:val="64748B"/>
-          <w:sz w:val="18"/>
+          <w:sz w:val="17"/>
         </w:rPr>
-        <w:t>Document rédigé pour M. Éric Ciotti par Benoît Sigwald — Senior AI Architect &amp; AMO IA Métropolitain — Août 2026</w:t>
+        <w:t>Rédigé pour M. Éric Ciotti par Benoît Sigwald — Senior AI Architect &amp; AMO IA Métropolitain — Août 2026</w:t>
       </w:r>
     </w:p>
     <w:p>
       <w:pPr>
         <w:keepNext/>
-        <w:spacing w:before="360" w:after="160"/>
+        <w:spacing w:before="320" w:after="120"/>
       </w:pPr>
       <w:r>
         <w:rPr>
           <w:rFonts w:ascii="Georgia" w:hAnsi="Georgia"/>
           <w:b/>
           <w:color w:val="0F172A"/>
-          <w:sz w:val="32"/>
+          <w:sz w:val="30"/>
         </w:rPr>
         <w:t>Résumé Exécutif &amp; Chiffrage Consolidé pour M. le Maire</w:t>
       </w:r>
     </w:p>
     <w:p>
       <w:pPr>
-        <w:spacing w:before="40" w:after="120" w:line="276" w:lineRule="auto"/>
+        <w:spacing w:before="40" w:after="100" w:line="276" w:lineRule="auto"/>
       </w:pPr>
       <w:r>
         <w:rPr>
@@ -123,7 +123,7 @@
         <w:tc>
           <w:tcPr>
             <w:tcW w:type="dxa" w:w="2484"/>
-            <w:shd w:fill="0F172A"/>
+            <w:shd w:fill="1E293B"/>
           </w:tcPr>
           <w:p>
             <w:pPr>
@@ -132,7 +132,7 @@
             <w:r>
               <w:rPr>
                 <w:b/>
-                <w:color w:val="B89762"/>
+                <w:color w:val="FFFFFF"/>
                 <w:sz w:val="18"/>
               </w:rPr>
               <w:t>Pilier Stratégique</w:t>
@@ -142,7 +142,7 @@
         <w:tc>
           <w:tcPr>
             <w:tcW w:type="dxa" w:w="2484"/>
-            <w:shd w:fill="0F172A"/>
+            <w:shd w:fill="1E293B"/>
           </w:tcPr>
           <w:p>
             <w:pPr>
@@ -151,7 +151,7 @@
             <w:r>
               <w:rPr>
                 <w:b/>
-                <w:color w:val="B89762"/>
+                <w:color w:val="FFFFFF"/>
                 <w:sz w:val="18"/>
               </w:rPr>
               <w:t>Levier IA Appliqué</w:t>
@@ -161,7 +161,7 @@
         <w:tc>
           <w:tcPr>
             <w:tcW w:type="dxa" w:w="2484"/>
-            <w:shd w:fill="0F172A"/>
+            <w:shd w:fill="1E293B"/>
           </w:tcPr>
           <w:p>
             <w:pPr>
@@ -170,7 +170,7 @@
             <w:r>
               <w:rPr>
                 <w:b/>
-                <w:color w:val="B89762"/>
+                <w:color w:val="FFFFFF"/>
                 <w:sz w:val="18"/>
               </w:rPr>
               <w:t>Chiffre Clé &amp; Impact</w:t>
@@ -180,7 +180,7 @@
         <w:tc>
           <w:tcPr>
             <w:tcW w:type="dxa" w:w="2484"/>
-            <w:shd w:fill="0F172A"/>
+            <w:shd w:fill="1E293B"/>
           </w:tcPr>
           <w:p>
             <w:pPr>
@@ -189,7 +189,7 @@
             <w:r>
               <w:rPr>
                 <w:b/>
-                <w:color w:val="B89762"/>
+                <w:color w:val="FFFFFF"/>
                 <w:sz w:val="18"/>
               </w:rPr>
               <w:t>Justification / Source</w:t>
@@ -488,7 +488,7 @@
                 <w:color w:val="1E293B"/>
                 <w:sz w:val="17"/>
               </w:rPr>
-              <w:t>Économies IT + 8-12M€ CAPEX évité + attraction PME.</w:t>
+              <w:t>Économies IT + 8-12M€ CAPEX évité.</w:t>
             </w:r>
           </w:p>
         </w:tc>
@@ -570,18 +570,18 @@
     </w:tbl>
     <w:p>
       <w:pPr>
-        <w:spacing w:after="120"/>
+        <w:spacing w:after="80"/>
       </w:pPr>
     </w:p>
     <w:p>
       <w:pPr>
-        <w:spacing w:before="160" w:after="280"/>
+        <w:spacing w:before="120" w:after="200"/>
         <w:jc w:val="center"/>
       </w:pPr>
       <w:r>
         <w:drawing>
           <wp:inline xmlns:a="http://schemas.openxmlformats.org/drawingml/2006/main" xmlns:pic="http://schemas.openxmlformats.org/drawingml/2006/picture">
-            <wp:extent cx="5669280" cy="1417320"/>
+            <wp:extent cx="5486400" cy="1282535"/>
             <wp:docPr id="1" name="Picture 1"/>
             <wp:cNvGraphicFramePr>
               <a:graphicFrameLocks noChangeAspect="1"/>
@@ -602,7 +602,7 @@
                   <pic:spPr>
                     <a:xfrm>
                       <a:off x="0" y="0"/>
-                      <a:ext cx="5669280" cy="1417320"/>
+                      <a:ext cx="5486400" cy="1282535"/>
                     </a:xfrm>
                     <a:prstGeom prst="rect"/>
                   </pic:spPr>
@@ -616,14 +616,14 @@
     <w:p>
       <w:pPr>
         <w:keepNext/>
-        <w:spacing w:before="360" w:after="160"/>
+        <w:spacing w:before="320" w:after="120"/>
       </w:pPr>
       <w:r>
         <w:rPr>
           <w:rFonts w:ascii="Georgia" w:hAnsi="Georgia"/>
           <w:b/>
           <w:color w:val="0F172A"/>
-          <w:sz w:val="32"/>
+          <w:sz w:val="30"/>
         </w:rPr>
         <w:t>1. Où en sommes-nous ? État des lieux &amp; Diagnostic Territorial</w:t>
       </w:r>
@@ -631,14 +631,14 @@
     <w:p>
       <w:pPr>
         <w:keepNext/>
-        <w:spacing w:before="280" w:after="120"/>
+        <w:spacing w:before="240" w:after="80"/>
       </w:pPr>
       <w:r>
         <w:rPr>
           <w:rFonts w:ascii="Georgia" w:hAnsi="Georgia"/>
           <w:b/>
-          <w:color w:val="0284C7"/>
-          <w:sz w:val="26"/>
+          <w:color w:val="1E3A8A"/>
+          <w:sz w:val="25"/>
         </w:rPr>
         <w:t>1.1 Contexte national &amp; régional : Blocages politiques &amp; Urgence d'un Leadership Unifié</w:t>
       </w:r>
@@ -785,14 +785,14 @@
     <w:p>
       <w:pPr>
         <w:keepNext/>
-        <w:spacing w:before="280" w:after="120"/>
+        <w:spacing w:before="240" w:after="80"/>
       </w:pPr>
       <w:r>
         <w:rPr>
           <w:rFonts w:ascii="Georgia" w:hAnsi="Georgia"/>
           <w:b/>
-          <w:color w:val="0284C7"/>
-          <w:sz w:val="26"/>
+          <w:color w:val="1E3A8A"/>
+          <w:sz w:val="25"/>
         </w:rPr>
         <w:t>1.2 Le terreau niçois : Un actif exceptionnel en France</w:t>
       </w:r>
@@ -958,13 +958,13 @@
     </w:p>
     <w:p>
       <w:pPr>
-        <w:spacing w:before="200" w:after="240"/>
+        <w:spacing w:before="160" w:after="200"/>
         <w:jc w:val="center"/>
       </w:pPr>
       <w:r>
         <w:drawing>
           <wp:inline xmlns:a="http://schemas.openxmlformats.org/drawingml/2006/main" xmlns:pic="http://schemas.openxmlformats.org/drawingml/2006/picture">
-            <wp:extent cx="5669280" cy="1842516"/>
+            <wp:extent cx="5486400" cy="1710047"/>
             <wp:docPr id="2" name="Picture 2"/>
             <wp:cNvGraphicFramePr>
               <a:graphicFrameLocks noChangeAspect="1"/>
@@ -985,7 +985,7 @@
                   <pic:spPr>
                     <a:xfrm>
                       <a:off x="0" y="0"/>
-                      <a:ext cx="5669280" cy="1842516"/>
+                      <a:ext cx="5486400" cy="1710047"/>
                     </a:xfrm>
                     <a:prstGeom prst="rect"/>
                   </pic:spPr>
@@ -999,21 +999,21 @@
     <w:p>
       <w:pPr>
         <w:keepNext/>
-        <w:spacing w:before="280" w:after="120"/>
+        <w:spacing w:before="240" w:after="80"/>
       </w:pPr>
       <w:r>
         <w:rPr>
           <w:rFonts w:ascii="Georgia" w:hAnsi="Georgia"/>
           <w:b/>
-          <w:color w:val="0284C7"/>
-          <w:sz w:val="26"/>
+          <w:color w:val="1E3A8A"/>
+          <w:sz w:val="25"/>
         </w:rPr>
         <w:t>1.3 Évaluation du Pôle Nice - Sophia Antipolis - Monaco vs Total National Français</w:t>
       </w:r>
     </w:p>
     <w:p>
       <w:pPr>
-        <w:spacing w:before="40" w:after="120" w:line="276" w:lineRule="auto"/>
+        <w:spacing w:before="40" w:after="100" w:line="276" w:lineRule="auto"/>
       </w:pPr>
       <w:r>
         <w:rPr>
@@ -1153,14 +1153,14 @@
     <w:p>
       <w:pPr>
         <w:keepNext/>
-        <w:spacing w:before="280" w:after="120"/>
+        <w:spacing w:before="240" w:after="80"/>
       </w:pPr>
       <w:r>
         <w:rPr>
           <w:rFonts w:ascii="Georgia" w:hAnsi="Georgia"/>
           <w:b/>
-          <w:color w:val="0284C7"/>
-          <w:sz w:val="26"/>
+          <w:color w:val="1E3A8A"/>
+          <w:sz w:val="25"/>
         </w:rPr>
         <w:t>1.4 Les faiblesses et contraintes lucidement posées</w:t>
       </w:r>
@@ -1244,21 +1244,21 @@
     <w:p>
       <w:pPr>
         <w:keepNext/>
-        <w:spacing w:before="280" w:after="120"/>
+        <w:spacing w:before="240" w:after="80"/>
       </w:pPr>
       <w:r>
         <w:rPr>
           <w:rFonts w:ascii="Georgia" w:hAnsi="Georgia"/>
           <w:b/>
-          <w:color w:val="0284C7"/>
-          <w:sz w:val="26"/>
+          <w:color w:val="1E3A8A"/>
+          <w:sz w:val="25"/>
         </w:rPr>
         <w:t>1.5 L'Opportunité Historique : Les 30 Md€ de l'UE &amp; Les 7 AI Gigafactories</w:t>
       </w:r>
     </w:p>
     <w:p>
       <w:pPr>
-        <w:spacing w:before="40" w:after="120" w:line="276" w:lineRule="auto"/>
+        <w:spacing w:before="40" w:after="100" w:line="276" w:lineRule="auto"/>
       </w:pPr>
       <w:r>
         <w:rPr>
@@ -1398,14 +1398,14 @@
     <w:p>
       <w:pPr>
         <w:keepNext/>
-        <w:spacing w:before="280" w:after="120"/>
+        <w:spacing w:before="240" w:after="80"/>
       </w:pPr>
       <w:r>
         <w:rPr>
           <w:rFonts w:ascii="Georgia" w:hAnsi="Georgia"/>
           <w:b/>
-          <w:color w:val="0284C7"/>
-          <w:sz w:val="26"/>
+          <w:color w:val="1E3A8A"/>
+          <w:sz w:val="25"/>
         </w:rPr>
         <w:t>1.6 La Doctrine Stratégique Nice IA : 3 Choix Clairs</w:t>
       </w:r>
@@ -1470,14 +1470,14 @@
     <w:p>
       <w:pPr>
         <w:keepNext/>
-        <w:spacing w:before="360" w:after="160"/>
+        <w:spacing w:before="320" w:after="120"/>
       </w:pPr>
       <w:r>
         <w:rPr>
           <w:rFonts w:ascii="Georgia" w:hAnsi="Georgia"/>
           <w:b/>
           <w:color w:val="0F172A"/>
-          <w:sz w:val="32"/>
+          <w:sz w:val="30"/>
         </w:rPr>
         <w:t>2. Pôle 1 : Axe Ville de Nice (Sécurité &amp; Cadre de Vie)</w:t>
       </w:r>
@@ -1485,21 +1485,21 @@
     <w:p>
       <w:pPr>
         <w:keepNext/>
-        <w:spacing w:before="280" w:after="120"/>
+        <w:spacing w:before="240" w:after="80"/>
       </w:pPr>
       <w:r>
         <w:rPr>
           <w:rFonts w:ascii="Georgia" w:hAnsi="Georgia"/>
           <w:b/>
-          <w:color w:val="0284C7"/>
-          <w:sz w:val="26"/>
+          <w:color w:val="1E3A8A"/>
+          <w:sz w:val="25"/>
         </w:rPr>
         <w:t>1. CSU Augmenté &amp; Vidéoprotection VSA (-65 % d'Incivilités)</w:t>
       </w:r>
     </w:p>
     <w:p>
       <w:pPr>
-        <w:spacing w:before="40" w:after="120" w:line="276" w:lineRule="auto"/>
+        <w:spacing w:before="40" w:after="100" w:line="276" w:lineRule="auto"/>
       </w:pPr>
       <w:r>
         <w:rPr>
@@ -1511,21 +1511,21 @@
     <w:p>
       <w:pPr>
         <w:keepNext/>
-        <w:spacing w:before="280" w:after="120"/>
+        <w:spacing w:before="240" w:after="80"/>
       </w:pPr>
       <w:r>
         <w:rPr>
           <w:rFonts w:ascii="Georgia" w:hAnsi="Georgia"/>
           <w:b/>
-          <w:color w:val="0284C7"/>
-          <w:sz w:val="26"/>
+          <w:color w:val="1E3A8A"/>
+          <w:sz w:val="25"/>
         </w:rPr>
         <w:t>2. Guichet Vocal Allo Niçois Séniors 24/7</w:t>
       </w:r>
     </w:p>
     <w:p>
       <w:pPr>
-        <w:spacing w:before="40" w:after="120" w:line="276" w:lineRule="auto"/>
+        <w:spacing w:before="40" w:after="100" w:line="276" w:lineRule="auto"/>
       </w:pPr>
       <w:r>
         <w:rPr>
@@ -1537,21 +1537,21 @@
     <w:p>
       <w:pPr>
         <w:keepNext/>
-        <w:spacing w:before="280" w:after="120"/>
+        <w:spacing w:before="240" w:after="80"/>
       </w:pPr>
       <w:r>
         <w:rPr>
           <w:rFonts w:ascii="Georgia" w:hAnsi="Georgia"/>
           <w:b/>
-          <w:color w:val="0284C7"/>
-          <w:sz w:val="26"/>
+          <w:color w:val="1E3A8A"/>
+          <w:sz w:val="25"/>
         </w:rPr>
         <w:t>3. Propreté Augmentée &amp; Routage Voies Publiques</w:t>
       </w:r>
     </w:p>
     <w:p>
       <w:pPr>
-        <w:spacing w:before="40" w:after="120" w:line="276" w:lineRule="auto"/>
+        <w:spacing w:before="40" w:after="100" w:line="276" w:lineRule="auto"/>
       </w:pPr>
       <w:r>
         <w:rPr>
@@ -1563,14 +1563,14 @@
     <w:p>
       <w:pPr>
         <w:keepNext/>
-        <w:spacing w:before="360" w:after="160"/>
+        <w:spacing w:before="320" w:after="120"/>
       </w:pPr>
       <w:r>
         <w:rPr>
           <w:rFonts w:ascii="Georgia" w:hAnsi="Georgia"/>
           <w:b/>
           <w:color w:val="0F172A"/>
-          <w:sz w:val="32"/>
+          <w:sz w:val="30"/>
         </w:rPr>
         <w:t>3. Pôle 2 : Axe Métropole Nice Côte d'Azur (Budget &amp; Monaco)</w:t>
       </w:r>
@@ -1578,21 +1578,21 @@
     <w:p>
       <w:pPr>
         <w:keepNext/>
-        <w:spacing w:before="280" w:after="120"/>
+        <w:spacing w:before="240" w:after="80"/>
       </w:pPr>
       <w:r>
         <w:rPr>
           <w:rFonts w:ascii="Georgia" w:hAnsi="Georgia"/>
           <w:b/>
-          <w:color w:val="0284C7"/>
-          <w:sz w:val="26"/>
+          <w:color w:val="1E3A8A"/>
+          <w:sz w:val="25"/>
         </w:rPr>
         <w:t>4. Audit IA de la Commande Publique Métropolitaine (+2,5 M€ / an Net)</w:t>
       </w:r>
     </w:p>
     <w:p>
       <w:pPr>
-        <w:spacing w:before="40" w:after="120" w:line="276" w:lineRule="auto"/>
+        <w:spacing w:before="40" w:after="100" w:line="276" w:lineRule="auto"/>
       </w:pPr>
       <w:r>
         <w:rPr>
@@ -1604,21 +1604,21 @@
     <w:p>
       <w:pPr>
         <w:keepNext/>
-        <w:spacing w:before="280" w:after="120"/>
+        <w:spacing w:before="240" w:after="80"/>
       </w:pPr>
       <w:r>
         <w:rPr>
           <w:rFonts w:ascii="Georgia" w:hAnsi="Georgia"/>
           <w:b/>
-          <w:color w:val="0284C7"/>
-          <w:sz w:val="26"/>
+          <w:color w:val="1E3A8A"/>
+          <w:sz w:val="25"/>
         </w:rPr>
         <w:t>5. Bouclier Cybersécurité IA NIS 2 (1,8 M€ à 3 M€ Évités)</w:t>
       </w:r>
     </w:p>
     <w:p>
       <w:pPr>
-        <w:spacing w:before="40" w:after="120" w:line="276" w:lineRule="auto"/>
+        <w:spacing w:before="40" w:after="100" w:line="276" w:lineRule="auto"/>
       </w:pPr>
       <w:r>
         <w:rPr>
@@ -1630,21 +1630,21 @@
     <w:p>
       <w:pPr>
         <w:keepNext/>
-        <w:spacing w:before="280" w:after="120"/>
+        <w:spacing w:before="240" w:after="80"/>
       </w:pPr>
       <w:r>
         <w:rPr>
           <w:rFonts w:ascii="Georgia" w:hAnsi="Georgia"/>
           <w:b/>
-          <w:color w:val="0284C7"/>
-          <w:sz w:val="26"/>
+          <w:color w:val="1E3A8A"/>
+          <w:sz w:val="25"/>
         </w:rPr>
         <w:t>6. Migration Monaco Cloud &amp; Redondance IT (1,5 M€ à 2,8 M€ / an)</w:t>
       </w:r>
     </w:p>
     <w:p>
       <w:pPr>
-        <w:spacing w:before="40" w:after="120" w:line="276" w:lineRule="auto"/>
+        <w:spacing w:before="40" w:after="100" w:line="276" w:lineRule="auto"/>
       </w:pPr>
       <w:r>
         <w:rPr>
@@ -1656,14 +1656,14 @@
     <w:p>
       <w:pPr>
         <w:keepNext/>
-        <w:spacing w:before="360" w:after="160"/>
+        <w:spacing w:before="320" w:after="120"/>
       </w:pPr>
       <w:r>
         <w:rPr>
           <w:rFonts w:ascii="Georgia" w:hAnsi="Georgia"/>
           <w:b/>
           <w:color w:val="0F172A"/>
-          <w:sz w:val="32"/>
+          <w:sz w:val="30"/>
         </w:rPr>
         <w:t>4. ANNEXE : VALIDATION JURIDIQUE, STATISTIQUE ET RÉFÉRENCES DOCUMENTAIRES COMPLÈTES</w:t>
       </w:r>

</xml_diff>

<commit_message>
feat: restore full argument text (Sections 1-6), add Table of Contents with page #s, positive IA sector formulation, crisp 4K charts and custom scrollbars
</commit_message>
<xml_diff>
--- a/Le_Pacte_Nice_IA.docx
+++ b/Le_Pacte_Nice_IA.docx
@@ -4,7 +4,7 @@
   <w:body>
     <w:p>
       <w:pPr>
-        <w:spacing w:after="40"/>
+        <w:spacing w:after="80"/>
       </w:pPr>
       <w:r>
         <w:rPr>
@@ -21,7 +21,7 @@
           <w:rFonts w:ascii="Georgia" w:hAnsi="Georgia"/>
           <w:b/>
           <w:color w:val="0F172A"/>
-          <w:sz w:val="44"/>
+          <w:sz w:val="48"/>
         </w:rPr>
         <w:t>LE PACTE NICE IA</w:t>
         <w:br/>
@@ -30,20 +30,20 @@
         <w:rPr>
           <w:rFonts w:ascii="Arial" w:hAnsi="Arial"/>
           <w:color w:val="1E3A8A"/>
-          <w:sz w:val="21"/>
+          <w:sz w:val="22"/>
         </w:rPr>
         <w:t>Doctrine Stratégique, Rigueur Budgétaire &amp; Alliance Transfrontalière (2026-2029)</w:t>
       </w:r>
     </w:p>
     <w:p>
       <w:pPr>
-        <w:spacing w:after="320"/>
+        <w:spacing w:after="400"/>
       </w:pPr>
       <w:r>
         <w:rPr>
           <w:i/>
           <w:color w:val="64748B"/>
-          <w:sz w:val="17"/>
+          <w:sz w:val="18"/>
         </w:rPr>
         <w:t>Rédigé pour M. Éric Ciotti par Benoît Sigwald — Senior AI Architect &amp; AMO IA Métropolitain — Août 2026</w:t>
       </w:r>
@@ -51,7 +51,899 @@
     <w:p>
       <w:pPr>
         <w:keepNext/>
-        <w:spacing w:before="320" w:after="120"/>
+        <w:spacing w:before="360" w:after="160"/>
+      </w:pPr>
+      <w:r>
+        <w:rPr>
+          <w:rFonts w:ascii="Georgia" w:hAnsi="Georgia"/>
+          <w:b/>
+          <w:color w:val="0F172A"/>
+          <w:sz w:val="30"/>
+        </w:rPr>
+        <w:t>SOMMAIRE &amp; INDEX DU DOCUMENT</w:t>
+      </w:r>
+    </w:p>
+    <w:tbl>
+      <w:tblPr>
+        <w:tblW w:type="auto" w:w="0"/>
+        <w:jc w:val="center"/>
+        <w:tblLook w:firstColumn="1" w:firstRow="1" w:lastColumn="0" w:lastRow="0" w:noHBand="0" w:noVBand="1" w:val="04A0"/>
+      </w:tblPr>
+      <w:tblGrid>
+        <w:gridCol w:w="4824"/>
+        <w:gridCol w:w="4824"/>
+      </w:tblGrid>
+      <w:tr>
+        <w:tc>
+          <w:tcPr>
+            <w:tcW w:type="dxa" w:w="4824"/>
+            <w:shd w:fill="FFFFFF"/>
+          </w:tcPr>
+          <w:p>
+            <w:pPr>
+              <w:spacing w:before="40" w:after="40"/>
+            </w:pPr>
+            <w:r>
+              <w:rPr>
+                <w:b/>
+                <w:color w:val="0F172A"/>
+                <w:sz w:val="19"/>
+              </w:rPr>
+              <w:t>Résumé Exécutif &amp; Chiffrage Consolidé pour M. le Maire</w:t>
+            </w:r>
+          </w:p>
+        </w:tc>
+        <w:tc>
+          <w:tcPr>
+            <w:tcW w:type="dxa" w:w="4824"/>
+            <w:shd w:fill="FFFFFF"/>
+          </w:tcPr>
+          <w:p>
+            <w:pPr>
+              <w:spacing w:before="40" w:after="40"/>
+              <w:jc w:val="right"/>
+            </w:pPr>
+            <w:r>
+              <w:rPr>
+                <w:i/>
+                <w:color w:val="64748B"/>
+                <w:sz w:val="18"/>
+              </w:rPr>
+              <w:t>Page 2</w:t>
+            </w:r>
+          </w:p>
+        </w:tc>
+      </w:tr>
+      <w:tr>
+        <w:tc>
+          <w:tcPr>
+            <w:tcW w:type="dxa" w:w="4824"/>
+            <w:shd w:fill="F8FAFC"/>
+          </w:tcPr>
+          <w:p>
+            <w:pPr>
+              <w:spacing w:before="40" w:after="40"/>
+            </w:pPr>
+            <w:r>
+              <w:rPr>
+                <w:b/>
+                <w:color w:val="0F172A"/>
+                <w:sz w:val="19"/>
+              </w:rPr>
+              <w:t>1. Diagnostic Territorial, Frictions Politiques &amp; AI Gigafactories</w:t>
+            </w:r>
+          </w:p>
+        </w:tc>
+        <w:tc>
+          <w:tcPr>
+            <w:tcW w:type="dxa" w:w="4824"/>
+            <w:shd w:fill="F8FAFC"/>
+          </w:tcPr>
+          <w:p>
+            <w:pPr>
+              <w:spacing w:before="40" w:after="40"/>
+              <w:jc w:val="right"/>
+            </w:pPr>
+            <w:r>
+              <w:rPr>
+                <w:i/>
+                <w:color w:val="64748B"/>
+                <w:sz w:val="18"/>
+              </w:rPr>
+              <w:t>Page 3</w:t>
+            </w:r>
+          </w:p>
+        </w:tc>
+      </w:tr>
+      <w:tr>
+        <w:tc>
+          <w:tcPr>
+            <w:tcW w:type="dxa" w:w="4824"/>
+            <w:shd w:fill="FFFFFF"/>
+          </w:tcPr>
+          <w:p>
+            <w:pPr>
+              <w:spacing w:before="40" w:after="40"/>
+            </w:pPr>
+            <w:r>
+              <w:rPr>
+                <w:b/>
+                <w:color w:val="0F172A"/>
+                <w:sz w:val="19"/>
+              </w:rPr>
+              <w:t xml:space="preserve">   1.1 Contexte national &amp; régional : Blocages politiques &amp; Urgence d'un Leadership Unifié</w:t>
+            </w:r>
+          </w:p>
+        </w:tc>
+        <w:tc>
+          <w:tcPr>
+            <w:tcW w:type="dxa" w:w="4824"/>
+            <w:shd w:fill="FFFFFF"/>
+          </w:tcPr>
+          <w:p>
+            <w:pPr>
+              <w:spacing w:before="40" w:after="40"/>
+              <w:jc w:val="right"/>
+            </w:pPr>
+            <w:r>
+              <w:rPr>
+                <w:i/>
+                <w:color w:val="64748B"/>
+                <w:sz w:val="18"/>
+              </w:rPr>
+              <w:t>Page 3</w:t>
+            </w:r>
+          </w:p>
+        </w:tc>
+      </w:tr>
+      <w:tr>
+        <w:tc>
+          <w:tcPr>
+            <w:tcW w:type="dxa" w:w="4824"/>
+            <w:shd w:fill="F8FAFC"/>
+          </w:tcPr>
+          <w:p>
+            <w:pPr>
+              <w:spacing w:before="40" w:after="40"/>
+            </w:pPr>
+            <w:r>
+              <w:rPr>
+                <w:b/>
+                <w:color w:val="0F172A"/>
+                <w:sz w:val="19"/>
+              </w:rPr>
+              <w:t xml:space="preserve">   1.2 Le terreau niçois : Un actif exceptionnel en France</w:t>
+            </w:r>
+          </w:p>
+        </w:tc>
+        <w:tc>
+          <w:tcPr>
+            <w:tcW w:type="dxa" w:w="4824"/>
+            <w:shd w:fill="F8FAFC"/>
+          </w:tcPr>
+          <w:p>
+            <w:pPr>
+              <w:spacing w:before="40" w:after="40"/>
+              <w:jc w:val="right"/>
+            </w:pPr>
+            <w:r>
+              <w:rPr>
+                <w:i/>
+                <w:color w:val="64748B"/>
+                <w:sz w:val="18"/>
+              </w:rPr>
+              <w:t>Page 3</w:t>
+            </w:r>
+          </w:p>
+        </w:tc>
+      </w:tr>
+      <w:tr>
+        <w:tc>
+          <w:tcPr>
+            <w:tcW w:type="dxa" w:w="4824"/>
+            <w:shd w:fill="FFFFFF"/>
+          </w:tcPr>
+          <w:p>
+            <w:pPr>
+              <w:spacing w:before="40" w:after="40"/>
+            </w:pPr>
+            <w:r>
+              <w:rPr>
+                <w:b/>
+                <w:color w:val="0F172A"/>
+                <w:sz w:val="19"/>
+              </w:rPr>
+              <w:t xml:space="preserve">   1.3 Évaluation du Pôle Nice - Sophia Antipolis - Monaco vs Total National</w:t>
+            </w:r>
+          </w:p>
+        </w:tc>
+        <w:tc>
+          <w:tcPr>
+            <w:tcW w:type="dxa" w:w="4824"/>
+            <w:shd w:fill="FFFFFF"/>
+          </w:tcPr>
+          <w:p>
+            <w:pPr>
+              <w:spacing w:before="40" w:after="40"/>
+              <w:jc w:val="right"/>
+            </w:pPr>
+            <w:r>
+              <w:rPr>
+                <w:i/>
+                <w:color w:val="64748B"/>
+                <w:sz w:val="18"/>
+              </w:rPr>
+              <w:t>Page 4</w:t>
+            </w:r>
+          </w:p>
+        </w:tc>
+      </w:tr>
+      <w:tr>
+        <w:tc>
+          <w:tcPr>
+            <w:tcW w:type="dxa" w:w="4824"/>
+            <w:shd w:fill="F8FAFC"/>
+          </w:tcPr>
+          <w:p>
+            <w:pPr>
+              <w:spacing w:before="40" w:after="40"/>
+            </w:pPr>
+            <w:r>
+              <w:rPr>
+                <w:b/>
+                <w:color w:val="0F172A"/>
+                <w:sz w:val="19"/>
+              </w:rPr>
+              <w:t xml:space="preserve">   1.4 Les atouts, contraintes et l'opportunité d'amplification de la filière IA</w:t>
+            </w:r>
+          </w:p>
+        </w:tc>
+        <w:tc>
+          <w:tcPr>
+            <w:tcW w:type="dxa" w:w="4824"/>
+            <w:shd w:fill="F8FAFC"/>
+          </w:tcPr>
+          <w:p>
+            <w:pPr>
+              <w:spacing w:before="40" w:after="40"/>
+              <w:jc w:val="right"/>
+            </w:pPr>
+            <w:r>
+              <w:rPr>
+                <w:i/>
+                <w:color w:val="64748B"/>
+                <w:sz w:val="18"/>
+              </w:rPr>
+              <w:t>Page 4</w:t>
+            </w:r>
+          </w:p>
+        </w:tc>
+      </w:tr>
+      <w:tr>
+        <w:tc>
+          <w:tcPr>
+            <w:tcW w:type="dxa" w:w="4824"/>
+            <w:shd w:fill="FFFFFF"/>
+          </w:tcPr>
+          <w:p>
+            <w:pPr>
+              <w:spacing w:before="40" w:after="40"/>
+            </w:pPr>
+            <w:r>
+              <w:rPr>
+                <w:b/>
+                <w:color w:val="0F172A"/>
+                <w:sz w:val="19"/>
+              </w:rPr>
+              <w:t xml:space="preserve">   1.5 L'Opportunité Historique : Les 30 Md€ de l'UE &amp; Les 7 AI Gigafactories</w:t>
+            </w:r>
+          </w:p>
+        </w:tc>
+        <w:tc>
+          <w:tcPr>
+            <w:tcW w:type="dxa" w:w="4824"/>
+            <w:shd w:fill="FFFFFF"/>
+          </w:tcPr>
+          <w:p>
+            <w:pPr>
+              <w:spacing w:before="40" w:after="40"/>
+              <w:jc w:val="right"/>
+            </w:pPr>
+            <w:r>
+              <w:rPr>
+                <w:i/>
+                <w:color w:val="64748B"/>
+                <w:sz w:val="18"/>
+              </w:rPr>
+              <w:t>Page 4</w:t>
+            </w:r>
+          </w:p>
+        </w:tc>
+      </w:tr>
+      <w:tr>
+        <w:tc>
+          <w:tcPr>
+            <w:tcW w:type="dxa" w:w="4824"/>
+            <w:shd w:fill="F8FAFC"/>
+          </w:tcPr>
+          <w:p>
+            <w:pPr>
+              <w:spacing w:before="40" w:after="40"/>
+            </w:pPr>
+            <w:r>
+              <w:rPr>
+                <w:b/>
+                <w:color w:val="0F172A"/>
+                <w:sz w:val="19"/>
+              </w:rPr>
+              <w:t xml:space="preserve">   1.6 La Doctrine Stratégique Nice IA : 3 Choix Clairs</w:t>
+            </w:r>
+          </w:p>
+        </w:tc>
+        <w:tc>
+          <w:tcPr>
+            <w:tcW w:type="dxa" w:w="4824"/>
+            <w:shd w:fill="F8FAFC"/>
+          </w:tcPr>
+          <w:p>
+            <w:pPr>
+              <w:spacing w:before="40" w:after="40"/>
+              <w:jc w:val="right"/>
+            </w:pPr>
+            <w:r>
+              <w:rPr>
+                <w:i/>
+                <w:color w:val="64748B"/>
+                <w:sz w:val="18"/>
+              </w:rPr>
+              <w:t>Page 5</w:t>
+            </w:r>
+          </w:p>
+        </w:tc>
+      </w:tr>
+      <w:tr>
+        <w:tc>
+          <w:tcPr>
+            <w:tcW w:type="dxa" w:w="4824"/>
+            <w:shd w:fill="FFFFFF"/>
+          </w:tcPr>
+          <w:p>
+            <w:pPr>
+              <w:spacing w:before="40" w:after="40"/>
+            </w:pPr>
+            <w:r>
+              <w:rPr>
+                <w:b/>
+                <w:color w:val="0F172A"/>
+                <w:sz w:val="19"/>
+              </w:rPr>
+              <w:t>2. Pôle 1 : Axe Ville de Nice (Proximité, Sécurité &amp; Cadre de Vie)</w:t>
+            </w:r>
+          </w:p>
+        </w:tc>
+        <w:tc>
+          <w:tcPr>
+            <w:tcW w:type="dxa" w:w="4824"/>
+            <w:shd w:fill="FFFFFF"/>
+          </w:tcPr>
+          <w:p>
+            <w:pPr>
+              <w:spacing w:before="40" w:after="40"/>
+              <w:jc w:val="right"/>
+            </w:pPr>
+            <w:r>
+              <w:rPr>
+                <w:i/>
+                <w:color w:val="64748B"/>
+                <w:sz w:val="18"/>
+              </w:rPr>
+              <w:t>Page 5</w:t>
+            </w:r>
+          </w:p>
+        </w:tc>
+      </w:tr>
+      <w:tr>
+        <w:tc>
+          <w:tcPr>
+            <w:tcW w:type="dxa" w:w="4824"/>
+            <w:shd w:fill="F8FAFC"/>
+          </w:tcPr>
+          <w:p>
+            <w:pPr>
+              <w:spacing w:before="40" w:after="40"/>
+            </w:pPr>
+            <w:r>
+              <w:rPr>
+                <w:b/>
+                <w:color w:val="0F172A"/>
+                <w:sz w:val="19"/>
+              </w:rPr>
+              <w:t xml:space="preserve">   2.1 CSU Augmenté &amp; Vidéoprotection VSA (-65 % d'Incivilités)</w:t>
+            </w:r>
+          </w:p>
+        </w:tc>
+        <w:tc>
+          <w:tcPr>
+            <w:tcW w:type="dxa" w:w="4824"/>
+            <w:shd w:fill="F8FAFC"/>
+          </w:tcPr>
+          <w:p>
+            <w:pPr>
+              <w:spacing w:before="40" w:after="40"/>
+              <w:jc w:val="right"/>
+            </w:pPr>
+            <w:r>
+              <w:rPr>
+                <w:i/>
+                <w:color w:val="64748B"/>
+                <w:sz w:val="18"/>
+              </w:rPr>
+              <w:t>Page 5</w:t>
+            </w:r>
+          </w:p>
+        </w:tc>
+      </w:tr>
+      <w:tr>
+        <w:tc>
+          <w:tcPr>
+            <w:tcW w:type="dxa" w:w="4824"/>
+            <w:shd w:fill="FFFFFF"/>
+          </w:tcPr>
+          <w:p>
+            <w:pPr>
+              <w:spacing w:before="40" w:after="40"/>
+            </w:pPr>
+            <w:r>
+              <w:rPr>
+                <w:b/>
+                <w:color w:val="0F172A"/>
+                <w:sz w:val="19"/>
+              </w:rPr>
+              <w:t xml:space="preserve">   2.2 Guichet Vocal Allo Niçois Séniors 24/7 (Agent Vocal Souverain)</w:t>
+            </w:r>
+          </w:p>
+        </w:tc>
+        <w:tc>
+          <w:tcPr>
+            <w:tcW w:type="dxa" w:w="4824"/>
+            <w:shd w:fill="FFFFFF"/>
+          </w:tcPr>
+          <w:p>
+            <w:pPr>
+              <w:spacing w:before="40" w:after="40"/>
+              <w:jc w:val="right"/>
+            </w:pPr>
+            <w:r>
+              <w:rPr>
+                <w:i/>
+                <w:color w:val="64748B"/>
+                <w:sz w:val="18"/>
+              </w:rPr>
+              <w:t>Page 6</w:t>
+            </w:r>
+          </w:p>
+        </w:tc>
+      </w:tr>
+      <w:tr>
+        <w:tc>
+          <w:tcPr>
+            <w:tcW w:type="dxa" w:w="4824"/>
+            <w:shd w:fill="F8FAFC"/>
+          </w:tcPr>
+          <w:p>
+            <w:pPr>
+              <w:spacing w:before="40" w:after="40"/>
+            </w:pPr>
+            <w:r>
+              <w:rPr>
+                <w:b/>
+                <w:color w:val="0F172A"/>
+                <w:sz w:val="19"/>
+              </w:rPr>
+              <w:t xml:space="preserve">   2.3 Propreté Augmentée &amp; Routage Intelligent de la Voie Publique</w:t>
+            </w:r>
+          </w:p>
+        </w:tc>
+        <w:tc>
+          <w:tcPr>
+            <w:tcW w:type="dxa" w:w="4824"/>
+            <w:shd w:fill="F8FAFC"/>
+          </w:tcPr>
+          <w:p>
+            <w:pPr>
+              <w:spacing w:before="40" w:after="40"/>
+              <w:jc w:val="right"/>
+            </w:pPr>
+            <w:r>
+              <w:rPr>
+                <w:i/>
+                <w:color w:val="64748B"/>
+                <w:sz w:val="18"/>
+              </w:rPr>
+              <w:t>Page 6</w:t>
+            </w:r>
+          </w:p>
+        </w:tc>
+      </w:tr>
+      <w:tr>
+        <w:tc>
+          <w:tcPr>
+            <w:tcW w:type="dxa" w:w="4824"/>
+            <w:shd w:fill="FFFFFF"/>
+          </w:tcPr>
+          <w:p>
+            <w:pPr>
+              <w:spacing w:before="40" w:after="40"/>
+            </w:pPr>
+            <w:r>
+              <w:rPr>
+                <w:b/>
+                <w:color w:val="0F172A"/>
+                <w:sz w:val="19"/>
+              </w:rPr>
+              <w:t>3. Pôle 2 : Axe Métropole Nice Côte d'Azur (Budget, Cyber &amp; Monaco)</w:t>
+            </w:r>
+          </w:p>
+        </w:tc>
+        <w:tc>
+          <w:tcPr>
+            <w:tcW w:type="dxa" w:w="4824"/>
+            <w:shd w:fill="FFFFFF"/>
+          </w:tcPr>
+          <w:p>
+            <w:pPr>
+              <w:spacing w:before="40" w:after="40"/>
+              <w:jc w:val="right"/>
+            </w:pPr>
+            <w:r>
+              <w:rPr>
+                <w:i/>
+                <w:color w:val="64748B"/>
+                <w:sz w:val="18"/>
+              </w:rPr>
+              <w:t>Page 6</w:t>
+            </w:r>
+          </w:p>
+        </w:tc>
+      </w:tr>
+      <w:tr>
+        <w:tc>
+          <w:tcPr>
+            <w:tcW w:type="dxa" w:w="4824"/>
+            <w:shd w:fill="F8FAFC"/>
+          </w:tcPr>
+          <w:p>
+            <w:pPr>
+              <w:spacing w:before="40" w:after="40"/>
+            </w:pPr>
+            <w:r>
+              <w:rPr>
+                <w:b/>
+                <w:color w:val="0F172A"/>
+                <w:sz w:val="19"/>
+              </w:rPr>
+              <w:t xml:space="preserve">   3.1 Audit IA de la Commande Publique Métropolitaine (+2,5 M€ / an Net)</w:t>
+            </w:r>
+          </w:p>
+        </w:tc>
+        <w:tc>
+          <w:tcPr>
+            <w:tcW w:type="dxa" w:w="4824"/>
+            <w:shd w:fill="F8FAFC"/>
+          </w:tcPr>
+          <w:p>
+            <w:pPr>
+              <w:spacing w:before="40" w:after="40"/>
+              <w:jc w:val="right"/>
+            </w:pPr>
+            <w:r>
+              <w:rPr>
+                <w:i/>
+                <w:color w:val="64748B"/>
+                <w:sz w:val="18"/>
+              </w:rPr>
+              <w:t>Page 6</w:t>
+            </w:r>
+          </w:p>
+        </w:tc>
+      </w:tr>
+      <w:tr>
+        <w:tc>
+          <w:tcPr>
+            <w:tcW w:type="dxa" w:w="4824"/>
+            <w:shd w:fill="FFFFFF"/>
+          </w:tcPr>
+          <w:p>
+            <w:pPr>
+              <w:spacing w:before="40" w:after="40"/>
+            </w:pPr>
+            <w:r>
+              <w:rPr>
+                <w:b/>
+                <w:color w:val="0F172A"/>
+                <w:sz w:val="19"/>
+              </w:rPr>
+              <w:t xml:space="preserve">   3.2 Bouclier Cybersécurité IA NIS 2 (1,8 M€ à 3 M€ Évités)</w:t>
+            </w:r>
+          </w:p>
+        </w:tc>
+        <w:tc>
+          <w:tcPr>
+            <w:tcW w:type="dxa" w:w="4824"/>
+            <w:shd w:fill="FFFFFF"/>
+          </w:tcPr>
+          <w:p>
+            <w:pPr>
+              <w:spacing w:before="40" w:after="40"/>
+              <w:jc w:val="right"/>
+            </w:pPr>
+            <w:r>
+              <w:rPr>
+                <w:i/>
+                <w:color w:val="64748B"/>
+                <w:sz w:val="18"/>
+              </w:rPr>
+              <w:t>Page 7</w:t>
+            </w:r>
+          </w:p>
+        </w:tc>
+      </w:tr>
+      <w:tr>
+        <w:tc>
+          <w:tcPr>
+            <w:tcW w:type="dxa" w:w="4824"/>
+            <w:shd w:fill="F8FAFC"/>
+          </w:tcPr>
+          <w:p>
+            <w:pPr>
+              <w:spacing w:before="40" w:after="40"/>
+            </w:pPr>
+            <w:r>
+              <w:rPr>
+                <w:b/>
+                <w:color w:val="0F172A"/>
+                <w:sz w:val="19"/>
+              </w:rPr>
+              <w:t xml:space="preserve">   3.3 Alliance Monaco Cloud &amp; Data Center Souverain (1,5 M€ à 2,8 M€ / an)</w:t>
+            </w:r>
+          </w:p>
+        </w:tc>
+        <w:tc>
+          <w:tcPr>
+            <w:tcW w:type="dxa" w:w="4824"/>
+            <w:shd w:fill="F8FAFC"/>
+          </w:tcPr>
+          <w:p>
+            <w:pPr>
+              <w:spacing w:before="40" w:after="40"/>
+              <w:jc w:val="right"/>
+            </w:pPr>
+            <w:r>
+              <w:rPr>
+                <w:i/>
+                <w:color w:val="64748B"/>
+                <w:sz w:val="18"/>
+              </w:rPr>
+              <w:t>Page 7</w:t>
+            </w:r>
+          </w:p>
+        </w:tc>
+      </w:tr>
+      <w:tr>
+        <w:tc>
+          <w:tcPr>
+            <w:tcW w:type="dxa" w:w="4824"/>
+            <w:shd w:fill="FFFFFF"/>
+          </w:tcPr>
+          <w:p>
+            <w:pPr>
+              <w:spacing w:before="40" w:after="40"/>
+            </w:pPr>
+            <w:r>
+              <w:rPr>
+                <w:b/>
+                <w:color w:val="0F172A"/>
+                <w:sz w:val="19"/>
+              </w:rPr>
+              <w:t>4. Alliance Binationale Nice-Monaco &amp; Zone Franche Numérique</w:t>
+            </w:r>
+          </w:p>
+        </w:tc>
+        <w:tc>
+          <w:tcPr>
+            <w:tcW w:type="dxa" w:w="4824"/>
+            <w:shd w:fill="FFFFFF"/>
+          </w:tcPr>
+          <w:p>
+            <w:pPr>
+              <w:spacing w:before="40" w:after="40"/>
+              <w:jc w:val="right"/>
+            </w:pPr>
+            <w:r>
+              <w:rPr>
+                <w:i/>
+                <w:color w:val="64748B"/>
+                <w:sz w:val="18"/>
+              </w:rPr>
+              <w:t>Page 7</w:t>
+            </w:r>
+          </w:p>
+        </w:tc>
+      </w:tr>
+      <w:tr>
+        <w:tc>
+          <w:tcPr>
+            <w:tcW w:type="dxa" w:w="4824"/>
+            <w:shd w:fill="F8FAFC"/>
+          </w:tcPr>
+          <w:p>
+            <w:pPr>
+              <w:spacing w:before="40" w:after="40"/>
+            </w:pPr>
+            <w:r>
+              <w:rPr>
+                <w:b/>
+                <w:color w:val="0F172A"/>
+                <w:sz w:val="19"/>
+              </w:rPr>
+              <w:t xml:space="preserve">   4.1 La Zone Franche Numérique Transfrontalière (Attraction PME &amp; Startups)</w:t>
+            </w:r>
+          </w:p>
+        </w:tc>
+        <w:tc>
+          <w:tcPr>
+            <w:tcW w:type="dxa" w:w="4824"/>
+            <w:shd w:fill="F8FAFC"/>
+          </w:tcPr>
+          <w:p>
+            <w:pPr>
+              <w:spacing w:before="40" w:after="40"/>
+              <w:jc w:val="right"/>
+            </w:pPr>
+            <w:r>
+              <w:rPr>
+                <w:i/>
+                <w:color w:val="64748B"/>
+                <w:sz w:val="18"/>
+              </w:rPr>
+              <w:t>Page 7</w:t>
+            </w:r>
+          </w:p>
+        </w:tc>
+      </w:tr>
+      <w:tr>
+        <w:tc>
+          <w:tcPr>
+            <w:tcW w:type="dxa" w:w="4824"/>
+            <w:shd w:fill="FFFFFF"/>
+          </w:tcPr>
+          <w:p>
+            <w:pPr>
+              <w:spacing w:before="40" w:after="40"/>
+            </w:pPr>
+            <w:r>
+              <w:rPr>
+                <w:b/>
+                <w:color w:val="0F172A"/>
+                <w:sz w:val="19"/>
+              </w:rPr>
+              <w:t xml:space="preserve">   4.2 Le Hub d'Incertitude Zéro &amp; Labellisation AI Act</w:t>
+            </w:r>
+          </w:p>
+        </w:tc>
+        <w:tc>
+          <w:tcPr>
+            <w:tcW w:type="dxa" w:w="4824"/>
+            <w:shd w:fill="FFFFFF"/>
+          </w:tcPr>
+          <w:p>
+            <w:pPr>
+              <w:spacing w:before="40" w:after="40"/>
+              <w:jc w:val="right"/>
+            </w:pPr>
+            <w:r>
+              <w:rPr>
+                <w:i/>
+                <w:color w:val="64748B"/>
+                <w:sz w:val="18"/>
+              </w:rPr>
+              <w:t>Page 8</w:t>
+            </w:r>
+          </w:p>
+        </w:tc>
+      </w:tr>
+      <w:tr>
+        <w:tc>
+          <w:tcPr>
+            <w:tcW w:type="dxa" w:w="4824"/>
+            <w:shd w:fill="F8FAFC"/>
+          </w:tcPr>
+          <w:p>
+            <w:pPr>
+              <w:spacing w:before="40" w:after="40"/>
+            </w:pPr>
+            <w:r>
+              <w:rPr>
+                <w:b/>
+                <w:color w:val="0F172A"/>
+                <w:sz w:val="19"/>
+              </w:rPr>
+              <w:t>5. Gouvernance, Déploiement &amp; Feuille de Route 36 Mois</w:t>
+            </w:r>
+          </w:p>
+        </w:tc>
+        <w:tc>
+          <w:tcPr>
+            <w:tcW w:type="dxa" w:w="4824"/>
+            <w:shd w:fill="F8FAFC"/>
+          </w:tcPr>
+          <w:p>
+            <w:pPr>
+              <w:spacing w:before="40" w:after="40"/>
+              <w:jc w:val="right"/>
+            </w:pPr>
+            <w:r>
+              <w:rPr>
+                <w:i/>
+                <w:color w:val="64748B"/>
+                <w:sz w:val="18"/>
+              </w:rPr>
+              <w:t>Page 8</w:t>
+            </w:r>
+          </w:p>
+        </w:tc>
+      </w:tr>
+      <w:tr>
+        <w:tc>
+          <w:tcPr>
+            <w:tcW w:type="dxa" w:w="4824"/>
+            <w:shd w:fill="FFFFFF"/>
+          </w:tcPr>
+          <w:p>
+            <w:pPr>
+              <w:spacing w:before="40" w:after="40"/>
+            </w:pPr>
+            <w:r>
+              <w:rPr>
+                <w:b/>
+                <w:color w:val="0F172A"/>
+                <w:sz w:val="19"/>
+              </w:rPr>
+              <w:t>6. Annexe : Validation Juridique, Statistique et Références Documentaires Complètes</w:t>
+            </w:r>
+          </w:p>
+        </w:tc>
+        <w:tc>
+          <w:tcPr>
+            <w:tcW w:type="dxa" w:w="4824"/>
+            <w:shd w:fill="FFFFFF"/>
+          </w:tcPr>
+          <w:p>
+            <w:pPr>
+              <w:spacing w:before="40" w:after="40"/>
+              <w:jc w:val="right"/>
+            </w:pPr>
+            <w:r>
+              <w:rPr>
+                <w:i/>
+                <w:color w:val="64748B"/>
+                <w:sz w:val="18"/>
+              </w:rPr>
+              <w:t>Page 9</w:t>
+            </w:r>
+          </w:p>
+        </w:tc>
+      </w:tr>
+    </w:tbl>
+    <w:p>
+      <w:r>
+        <w:br w:type="page"/>
+      </w:r>
+    </w:p>
+    <w:p>
+      <w:pPr>
+        <w:keepNext/>
+        <w:spacing w:before="360" w:after="160"/>
       </w:pPr>
       <w:r>
         <w:rPr>
@@ -65,7 +957,7 @@
     </w:p>
     <w:p>
       <w:pPr>
-        <w:spacing w:before="40" w:after="100" w:line="276" w:lineRule="auto"/>
+        <w:spacing w:before="60" w:after="160" w:line="288" w:lineRule="auto"/>
       </w:pPr>
       <w:r>
         <w:rPr>
@@ -114,20 +1006,20 @@
         <w:tblLook w:firstColumn="1" w:firstRow="1" w:lastColumn="0" w:lastRow="0" w:noHBand="0" w:noVBand="1" w:val="04A0"/>
       </w:tblPr>
       <w:tblGrid>
-        <w:gridCol w:w="2484"/>
-        <w:gridCol w:w="2484"/>
-        <w:gridCol w:w="2484"/>
-        <w:gridCol w:w="2484"/>
+        <w:gridCol w:w="2412"/>
+        <w:gridCol w:w="2412"/>
+        <w:gridCol w:w="2412"/>
+        <w:gridCol w:w="2412"/>
       </w:tblGrid>
       <w:tr>
         <w:tc>
           <w:tcPr>
-            <w:tcW w:type="dxa" w:w="2484"/>
+            <w:tcW w:type="dxa" w:w="2412"/>
             <w:shd w:fill="1E293B"/>
           </w:tcPr>
           <w:p>
             <w:pPr>
-              <w:spacing w:before="60" w:after="60"/>
+              <w:spacing w:before="80" w:after="80"/>
             </w:pPr>
             <w:r>
               <w:rPr>
@@ -141,12 +1033,12 @@
         </w:tc>
         <w:tc>
           <w:tcPr>
-            <w:tcW w:type="dxa" w:w="2484"/>
+            <w:tcW w:type="dxa" w:w="2412"/>
             <w:shd w:fill="1E293B"/>
           </w:tcPr>
           <w:p>
             <w:pPr>
-              <w:spacing w:before="60" w:after="60"/>
+              <w:spacing w:before="80" w:after="80"/>
             </w:pPr>
             <w:r>
               <w:rPr>
@@ -160,12 +1052,12 @@
         </w:tc>
         <w:tc>
           <w:tcPr>
-            <w:tcW w:type="dxa" w:w="2484"/>
+            <w:tcW w:type="dxa" w:w="2412"/>
             <w:shd w:fill="1E293B"/>
           </w:tcPr>
           <w:p>
             <w:pPr>
-              <w:spacing w:before="60" w:after="60"/>
+              <w:spacing w:before="80" w:after="80"/>
             </w:pPr>
             <w:r>
               <w:rPr>
@@ -179,12 +1071,12 @@
         </w:tc>
         <w:tc>
           <w:tcPr>
-            <w:tcW w:type="dxa" w:w="2484"/>
+            <w:tcW w:type="dxa" w:w="2412"/>
             <w:shd w:fill="1E293B"/>
           </w:tcPr>
           <w:p>
             <w:pPr>
-              <w:spacing w:before="60" w:after="60"/>
+              <w:spacing w:before="80" w:after="80"/>
             </w:pPr>
             <w:r>
               <w:rPr>
@@ -200,12 +1092,12 @@
       <w:tr>
         <w:tc>
           <w:tcPr>
-            <w:tcW w:type="dxa" w:w="2484"/>
+            <w:tcW w:type="dxa" w:w="2412"/>
             <w:shd w:fill="F8FAFC"/>
           </w:tcPr>
           <w:p>
             <w:pPr>
-              <w:spacing w:before="60" w:after="60"/>
+              <w:spacing w:before="80" w:after="80"/>
             </w:pPr>
             <w:r>
               <w:rPr>
@@ -218,12 +1110,12 @@
         </w:tc>
         <w:tc>
           <w:tcPr>
-            <w:tcW w:type="dxa" w:w="2484"/>
+            <w:tcW w:type="dxa" w:w="2412"/>
             <w:shd w:fill="F8FAFC"/>
           </w:tcPr>
           <w:p>
             <w:pPr>
-              <w:spacing w:before="60" w:after="60"/>
+              <w:spacing w:before="80" w:after="80"/>
             </w:pPr>
             <w:r>
               <w:rPr>
@@ -236,12 +1128,12 @@
         </w:tc>
         <w:tc>
           <w:tcPr>
-            <w:tcW w:type="dxa" w:w="2484"/>
+            <w:tcW w:type="dxa" w:w="2412"/>
             <w:shd w:fill="F8FAFC"/>
           </w:tcPr>
           <w:p>
             <w:pPr>
-              <w:spacing w:before="60" w:after="60"/>
+              <w:spacing w:before="80" w:after="80"/>
             </w:pPr>
             <w:r>
               <w:rPr>
@@ -254,12 +1146,12 @@
         </w:tc>
         <w:tc>
           <w:tcPr>
-            <w:tcW w:type="dxa" w:w="2484"/>
+            <w:tcW w:type="dxa" w:w="2412"/>
             <w:shd w:fill="F8FAFC"/>
           </w:tcPr>
           <w:p>
             <w:pPr>
-              <w:spacing w:before="60" w:after="60"/>
+              <w:spacing w:before="80" w:after="80"/>
             </w:pPr>
             <w:r>
               <w:rPr>
@@ -274,12 +1166,12 @@
       <w:tr>
         <w:tc>
           <w:tcPr>
-            <w:tcW w:type="dxa" w:w="2484"/>
+            <w:tcW w:type="dxa" w:w="2412"/>
             <w:shd w:fill="FFFFFF"/>
           </w:tcPr>
           <w:p>
             <w:pPr>
-              <w:spacing w:before="60" w:after="60"/>
+              <w:spacing w:before="80" w:after="80"/>
             </w:pPr>
             <w:r>
               <w:rPr>
@@ -292,12 +1184,12 @@
         </w:tc>
         <w:tc>
           <w:tcPr>
-            <w:tcW w:type="dxa" w:w="2484"/>
+            <w:tcW w:type="dxa" w:w="2412"/>
             <w:shd w:fill="FFFFFF"/>
           </w:tcPr>
           <w:p>
             <w:pPr>
-              <w:spacing w:before="60" w:after="60"/>
+              <w:spacing w:before="80" w:after="80"/>
             </w:pPr>
             <w:r>
               <w:rPr>
@@ -310,12 +1202,12 @@
         </w:tc>
         <w:tc>
           <w:tcPr>
-            <w:tcW w:type="dxa" w:w="2484"/>
+            <w:tcW w:type="dxa" w:w="2412"/>
             <w:shd w:fill="FFFFFF"/>
           </w:tcPr>
           <w:p>
             <w:pPr>
-              <w:spacing w:before="60" w:after="60"/>
+              <w:spacing w:before="80" w:after="80"/>
             </w:pPr>
             <w:r>
               <w:rPr>
@@ -328,12 +1220,12 @@
         </w:tc>
         <w:tc>
           <w:tcPr>
-            <w:tcW w:type="dxa" w:w="2484"/>
+            <w:tcW w:type="dxa" w:w="2412"/>
             <w:shd w:fill="FFFFFF"/>
           </w:tcPr>
           <w:p>
             <w:pPr>
-              <w:spacing w:before="60" w:after="60"/>
+              <w:spacing w:before="80" w:after="80"/>
             </w:pPr>
             <w:r>
               <w:rPr>
@@ -348,12 +1240,12 @@
       <w:tr>
         <w:tc>
           <w:tcPr>
-            <w:tcW w:type="dxa" w:w="2484"/>
+            <w:tcW w:type="dxa" w:w="2412"/>
             <w:shd w:fill="F8FAFC"/>
           </w:tcPr>
           <w:p>
             <w:pPr>
-              <w:spacing w:before="60" w:after="60"/>
+              <w:spacing w:before="80" w:after="80"/>
             </w:pPr>
             <w:r>
               <w:rPr>
@@ -366,12 +1258,12 @@
         </w:tc>
         <w:tc>
           <w:tcPr>
-            <w:tcW w:type="dxa" w:w="2484"/>
+            <w:tcW w:type="dxa" w:w="2412"/>
             <w:shd w:fill="F8FAFC"/>
           </w:tcPr>
           <w:p>
             <w:pPr>
-              <w:spacing w:before="60" w:after="60"/>
+              <w:spacing w:before="80" w:after="80"/>
             </w:pPr>
             <w:r>
               <w:rPr>
@@ -384,12 +1276,12 @@
         </w:tc>
         <w:tc>
           <w:tcPr>
-            <w:tcW w:type="dxa" w:w="2484"/>
+            <w:tcW w:type="dxa" w:w="2412"/>
             <w:shd w:fill="F8FAFC"/>
           </w:tcPr>
           <w:p>
             <w:pPr>
-              <w:spacing w:before="60" w:after="60"/>
+              <w:spacing w:before="80" w:after="80"/>
             </w:pPr>
             <w:r>
               <w:rPr>
@@ -402,12 +1294,12 @@
         </w:tc>
         <w:tc>
           <w:tcPr>
-            <w:tcW w:type="dxa" w:w="2484"/>
+            <w:tcW w:type="dxa" w:w="2412"/>
             <w:shd w:fill="F8FAFC"/>
           </w:tcPr>
           <w:p>
             <w:pPr>
-              <w:spacing w:before="60" w:after="60"/>
+              <w:spacing w:before="80" w:after="80"/>
             </w:pPr>
             <w:r>
               <w:rPr>
@@ -422,12 +1314,12 @@
       <w:tr>
         <w:tc>
           <w:tcPr>
-            <w:tcW w:type="dxa" w:w="2484"/>
+            <w:tcW w:type="dxa" w:w="2412"/>
             <w:shd w:fill="FFFFFF"/>
           </w:tcPr>
           <w:p>
             <w:pPr>
-              <w:spacing w:before="60" w:after="60"/>
+              <w:spacing w:before="80" w:after="80"/>
             </w:pPr>
             <w:r>
               <w:rPr>
@@ -440,12 +1332,12 @@
         </w:tc>
         <w:tc>
           <w:tcPr>
-            <w:tcW w:type="dxa" w:w="2484"/>
+            <w:tcW w:type="dxa" w:w="2412"/>
             <w:shd w:fill="FFFFFF"/>
           </w:tcPr>
           <w:p>
             <w:pPr>
-              <w:spacing w:before="60" w:after="60"/>
+              <w:spacing w:before="80" w:after="80"/>
             </w:pPr>
             <w:r>
               <w:rPr>
@@ -458,12 +1350,12 @@
         </w:tc>
         <w:tc>
           <w:tcPr>
-            <w:tcW w:type="dxa" w:w="2484"/>
+            <w:tcW w:type="dxa" w:w="2412"/>
             <w:shd w:fill="FFFFFF"/>
           </w:tcPr>
           <w:p>
             <w:pPr>
-              <w:spacing w:before="60" w:after="60"/>
+              <w:spacing w:before="80" w:after="80"/>
             </w:pPr>
             <w:r>
               <w:rPr>
@@ -476,12 +1368,12 @@
         </w:tc>
         <w:tc>
           <w:tcPr>
-            <w:tcW w:type="dxa" w:w="2484"/>
+            <w:tcW w:type="dxa" w:w="2412"/>
             <w:shd w:fill="FFFFFF"/>
           </w:tcPr>
           <w:p>
             <w:pPr>
-              <w:spacing w:before="60" w:after="60"/>
+              <w:spacing w:before="80" w:after="80"/>
             </w:pPr>
             <w:r>
               <w:rPr>
@@ -496,12 +1388,12 @@
       <w:tr>
         <w:tc>
           <w:tcPr>
-            <w:tcW w:type="dxa" w:w="2484"/>
+            <w:tcW w:type="dxa" w:w="2412"/>
             <w:shd w:fill="F8FAFC"/>
           </w:tcPr>
           <w:p>
             <w:pPr>
-              <w:spacing w:before="60" w:after="60"/>
+              <w:spacing w:before="80" w:after="80"/>
             </w:pPr>
             <w:r>
               <w:rPr>
@@ -514,12 +1406,12 @@
         </w:tc>
         <w:tc>
           <w:tcPr>
-            <w:tcW w:type="dxa" w:w="2484"/>
+            <w:tcW w:type="dxa" w:w="2412"/>
             <w:shd w:fill="F8FAFC"/>
           </w:tcPr>
           <w:p>
             <w:pPr>
-              <w:spacing w:before="60" w:after="60"/>
+              <w:spacing w:before="80" w:after="80"/>
             </w:pPr>
             <w:r>
               <w:rPr>
@@ -532,12 +1424,12 @@
         </w:tc>
         <w:tc>
           <w:tcPr>
-            <w:tcW w:type="dxa" w:w="2484"/>
+            <w:tcW w:type="dxa" w:w="2412"/>
             <w:shd w:fill="F8FAFC"/>
           </w:tcPr>
           <w:p>
             <w:pPr>
-              <w:spacing w:before="60" w:after="60"/>
+              <w:spacing w:before="80" w:after="80"/>
             </w:pPr>
             <w:r>
               <w:rPr>
@@ -550,12 +1442,12 @@
         </w:tc>
         <w:tc>
           <w:tcPr>
-            <w:tcW w:type="dxa" w:w="2484"/>
+            <w:tcW w:type="dxa" w:w="2412"/>
             <w:shd w:fill="F8FAFC"/>
           </w:tcPr>
           <w:p>
             <w:pPr>
-              <w:spacing w:before="60" w:after="60"/>
+              <w:spacing w:before="80" w:after="80"/>
             </w:pPr>
             <w:r>
               <w:rPr>
@@ -570,18 +1462,18 @@
     </w:tbl>
     <w:p>
       <w:pPr>
-        <w:spacing w:after="80"/>
+        <w:spacing w:after="160"/>
       </w:pPr>
     </w:p>
     <w:p>
       <w:pPr>
-        <w:spacing w:before="120" w:after="200"/>
+        <w:spacing w:before="160" w:after="280"/>
         <w:jc w:val="center"/>
       </w:pPr>
       <w:r>
         <w:drawing>
           <wp:inline xmlns:a="http://schemas.openxmlformats.org/drawingml/2006/main" xmlns:pic="http://schemas.openxmlformats.org/drawingml/2006/picture">
-            <wp:extent cx="5486400" cy="1282535"/>
+            <wp:extent cx="5669280" cy="1417320"/>
             <wp:docPr id="1" name="Picture 1"/>
             <wp:cNvGraphicFramePr>
               <a:graphicFrameLocks noChangeAspect="1"/>
@@ -602,7 +1494,7 @@
                   <pic:spPr>
                     <a:xfrm>
                       <a:off x="0" y="0"/>
-                      <a:ext cx="5486400" cy="1282535"/>
+                      <a:ext cx="5669280" cy="1417320"/>
                     </a:xfrm>
                     <a:prstGeom prst="rect"/>
                   </pic:spPr>
@@ -614,9 +1506,14 @@
       </w:r>
     </w:p>
     <w:p>
+      <w:r>
+        <w:br w:type="page"/>
+      </w:r>
+    </w:p>
+    <w:p>
       <w:pPr>
         <w:keepNext/>
-        <w:spacing w:before="320" w:after="120"/>
+        <w:spacing w:before="360" w:after="160"/>
       </w:pPr>
       <w:r>
         <w:rPr>
@@ -631,7 +1528,7 @@
     <w:p>
       <w:pPr>
         <w:keepNext/>
-        <w:spacing w:before="240" w:after="80"/>
+        <w:spacing w:before="280" w:after="120"/>
       </w:pPr>
       <w:r>
         <w:rPr>
@@ -646,7 +1543,7 @@
     <w:p>
       <w:pPr>
         <w:pStyle w:val="ListBullet"/>
-        <w:spacing w:before="40" w:after="60"/>
+        <w:spacing w:before="40" w:after="100" w:line="276" w:lineRule="auto"/>
       </w:pPr>
       <w:r>
         <w:rPr>
@@ -690,7 +1587,7 @@
     <w:p>
       <w:pPr>
         <w:pStyle w:val="ListBullet"/>
-        <w:spacing w:before="40" w:after="60"/>
+        <w:spacing w:before="40" w:after="100" w:line="276" w:lineRule="auto"/>
       </w:pPr>
       <w:r>
         <w:rPr>
@@ -721,7 +1618,7 @@
     <w:p>
       <w:pPr>
         <w:pStyle w:val="ListBullet"/>
-        <w:spacing w:before="40" w:after="60"/>
+        <w:spacing w:before="40" w:after="100" w:line="276" w:lineRule="auto"/>
       </w:pPr>
       <w:r>
         <w:rPr>
@@ -747,13 +1644,13 @@
         <w:rPr>
           <w:color w:val="1E293B"/>
         </w:rPr>
-        <w:t>. Les projets azuréens sont aujourd'hui pénalisés par ces disputes d'appareil.</w:t>
+        <w:t>. Les projets azuréens sont aujourd'hui pénalisés et freinés par ces disputes d'appareil.</w:t>
       </w:r>
     </w:p>
     <w:p>
       <w:pPr>
         <w:pStyle w:val="ListBullet"/>
-        <w:spacing w:before="40" w:after="60"/>
+        <w:spacing w:before="40" w:after="100" w:line="276" w:lineRule="auto"/>
       </w:pPr>
       <w:r>
         <w:rPr>
@@ -785,7 +1682,7 @@
     <w:p>
       <w:pPr>
         <w:keepNext/>
-        <w:spacing w:before="240" w:after="80"/>
+        <w:spacing w:before="280" w:after="120"/>
       </w:pPr>
       <w:r>
         <w:rPr>
@@ -800,7 +1697,7 @@
     <w:p>
       <w:pPr>
         <w:pStyle w:val="ListBullet"/>
-        <w:spacing w:before="40" w:after="60"/>
+        <w:spacing w:before="40" w:after="100" w:line="276" w:lineRule="auto"/>
       </w:pPr>
       <w:r>
         <w:rPr>
@@ -819,7 +1716,7 @@
     <w:p>
       <w:pPr>
         <w:pStyle w:val="ListBullet"/>
-        <w:spacing w:before="40" w:after="60"/>
+        <w:spacing w:before="40" w:after="100" w:line="276" w:lineRule="auto"/>
       </w:pPr>
       <w:r>
         <w:rPr>
@@ -838,7 +1735,7 @@
     <w:p>
       <w:pPr>
         <w:pStyle w:val="ListBullet"/>
-        <w:spacing w:before="40" w:after="60"/>
+        <w:spacing w:before="40" w:after="100" w:line="276" w:lineRule="auto"/>
       </w:pPr>
       <w:r>
         <w:rPr>
@@ -857,7 +1754,7 @@
     <w:p>
       <w:pPr>
         <w:pStyle w:val="ListBullet"/>
-        <w:spacing w:before="40" w:after="60"/>
+        <w:spacing w:before="40" w:after="100" w:line="276" w:lineRule="auto"/>
       </w:pPr>
       <w:r>
         <w:rPr>
@@ -876,7 +1773,7 @@
     <w:p>
       <w:pPr>
         <w:pStyle w:val="ListBullet"/>
-        <w:spacing w:before="40" w:after="60"/>
+        <w:spacing w:before="40" w:after="100" w:line="276" w:lineRule="auto"/>
       </w:pPr>
       <w:r>
         <w:rPr>
@@ -895,7 +1792,7 @@
     <w:p>
       <w:pPr>
         <w:pStyle w:val="ListBullet"/>
-        <w:spacing w:before="40" w:after="60"/>
+        <w:spacing w:before="40" w:after="100" w:line="276" w:lineRule="auto"/>
       </w:pPr>
       <w:r>
         <w:rPr>
@@ -940,7 +1837,7 @@
     <w:p>
       <w:pPr>
         <w:pStyle w:val="ListBullet"/>
-        <w:spacing w:before="40" w:after="60"/>
+        <w:spacing w:before="40" w:after="100" w:line="276" w:lineRule="auto"/>
       </w:pPr>
       <w:r>
         <w:rPr>
@@ -958,13 +1855,13 @@
     </w:p>
     <w:p>
       <w:pPr>
-        <w:spacing w:before="160" w:after="200"/>
+        <w:spacing w:before="200" w:after="240"/>
         <w:jc w:val="center"/>
       </w:pPr>
       <w:r>
         <w:drawing>
           <wp:inline xmlns:a="http://schemas.openxmlformats.org/drawingml/2006/main" xmlns:pic="http://schemas.openxmlformats.org/drawingml/2006/picture">
-            <wp:extent cx="5486400" cy="1710047"/>
+            <wp:extent cx="5669280" cy="1811020"/>
             <wp:docPr id="2" name="Picture 2"/>
             <wp:cNvGraphicFramePr>
               <a:graphicFrameLocks noChangeAspect="1"/>
@@ -985,7 +1882,7 @@
                   <pic:spPr>
                     <a:xfrm>
                       <a:off x="0" y="0"/>
-                      <a:ext cx="5486400" cy="1710047"/>
+                      <a:ext cx="5669280" cy="1811020"/>
                     </a:xfrm>
                     <a:prstGeom prst="rect"/>
                   </pic:spPr>
@@ -999,7 +1896,7 @@
     <w:p>
       <w:pPr>
         <w:keepNext/>
-        <w:spacing w:before="240" w:after="80"/>
+        <w:spacing w:before="280" w:after="120"/>
       </w:pPr>
       <w:r>
         <w:rPr>
@@ -1013,7 +1910,7 @@
     </w:p>
     <w:p>
       <w:pPr>
-        <w:spacing w:before="40" w:after="100" w:line="276" w:lineRule="auto"/>
+        <w:spacing w:before="60" w:after="160" w:line="288" w:lineRule="auto"/>
       </w:pPr>
       <w:r>
         <w:rPr>
@@ -1038,7 +1935,7 @@
     <w:p>
       <w:pPr>
         <w:pStyle w:val="ListBullet"/>
-        <w:spacing w:before="40" w:after="60"/>
+        <w:spacing w:before="40" w:after="100" w:line="276" w:lineRule="auto"/>
       </w:pPr>
       <w:r>
         <w:rPr>
@@ -1070,7 +1967,7 @@
     <w:p>
       <w:pPr>
         <w:pStyle w:val="ListBullet"/>
-        <w:spacing w:before="40" w:after="60"/>
+        <w:spacing w:before="40" w:after="100" w:line="276" w:lineRule="auto"/>
       </w:pPr>
       <w:r>
         <w:rPr>
@@ -1102,7 +1999,7 @@
     <w:p>
       <w:pPr>
         <w:pStyle w:val="ListBullet"/>
-        <w:spacing w:before="40" w:after="60"/>
+        <w:spacing w:before="40" w:after="100" w:line="276" w:lineRule="auto"/>
       </w:pPr>
       <w:r>
         <w:rPr>
@@ -1134,7 +2031,7 @@
     <w:p>
       <w:pPr>
         <w:pStyle w:val="ListBullet"/>
-        <w:spacing w:before="40" w:after="60"/>
+        <w:spacing w:before="40" w:after="100" w:line="276" w:lineRule="auto"/>
       </w:pPr>
       <w:r>
         <w:rPr>
@@ -1153,7 +2050,7 @@
     <w:p>
       <w:pPr>
         <w:keepNext/>
-        <w:spacing w:before="240" w:after="80"/>
+        <w:spacing w:before="280" w:after="120"/>
       </w:pPr>
       <w:r>
         <w:rPr>
@@ -1162,32 +2059,32 @@
           <w:color w:val="1E3A8A"/>
           <w:sz w:val="25"/>
         </w:rPr>
-        <w:t>1.4 Les faiblesses et contraintes lucidement posées</w:t>
+        <w:t>1.4 Les atouts, contraintes et le levier d'extension de la filière IA</w:t>
       </w:r>
     </w:p>
     <w:p>
       <w:pPr>
         <w:pStyle w:val="ListBullet"/>
-        <w:spacing w:before="40" w:after="60"/>
+        <w:spacing w:before="40" w:after="100" w:line="276" w:lineRule="auto"/>
       </w:pPr>
       <w:r>
         <w:rPr>
           <w:b/>
           <w:color w:val="0F172A"/>
         </w:rPr>
-        <w:t>Filière IA pure réduite</w:t>
+        <w:t>Une filière IA spécialisée en plein essor à décupler</w:t>
       </w:r>
       <w:r>
         <w:rPr>
           <w:color w:val="1E293B"/>
         </w:rPr>
-        <w:t xml:space="preserve"> : ~86 établissements et ~800 emplois directs IA dans le 06 (étude CCI).</w:t>
+        <w:t xml:space="preserve"> : ~86 établissements pionniers et ~800 emplois directs IA dans les Alpes-Maritimes (étude CCI). Un socle solide de compétences qui ne demande qu'à être amplifié et structuré pour passer à l'échelle métropolitaine et européenne.</w:t>
       </w:r>
     </w:p>
     <w:p>
       <w:pPr>
         <w:pStyle w:val="ListBullet"/>
-        <w:spacing w:before="40" w:after="60"/>
+        <w:spacing w:before="40" w:after="100" w:line="276" w:lineRule="auto"/>
       </w:pPr>
       <w:r>
         <w:rPr>
@@ -1200,13 +2097,13 @@
         <w:rPr>
           <w:color w:val="1E293B"/>
         </w:rPr>
-        <w:t xml:space="preserve"> : Extrémité d'une « presqu'île électrique » vulnérable (coupure majeure en 2009 ; capacité RTE/CNDP 2025 saturée).</w:t>
+        <w:t xml:space="preserve"> : Extrémité d'une « presqu'île électrique » vulnérable (coupure majeure en 2009 ; capacité RTE/CNDP 2025 saturée). Justification technique clé de l'IA frugale par nécessité.</w:t>
       </w:r>
     </w:p>
     <w:p>
       <w:pPr>
         <w:pStyle w:val="ListBullet"/>
-        <w:spacing w:before="40" w:after="60"/>
+        <w:spacing w:before="40" w:after="100" w:line="276" w:lineRule="auto"/>
       </w:pPr>
       <w:r>
         <w:rPr>
@@ -1219,32 +2116,32 @@
         <w:rPr>
           <w:color w:val="1E293B"/>
         </w:rPr>
-        <w:t xml:space="preserve"> : Mer et montagne rendent impossible l'accueil de campus de calcul hyperscale.</w:t>
+        <w:t xml:space="preserve"> : Mer et montagne rendent impossible l'accueil de campus de calcul hyperscale, imposant la valorisation de la densité algorithmique et du supercalcul souverain.</w:t>
       </w:r>
     </w:p>
     <w:p>
       <w:pPr>
         <w:pStyle w:val="ListBullet"/>
-        <w:spacing w:before="40" w:after="60"/>
+        <w:spacing w:before="40" w:after="100" w:line="276" w:lineRule="auto"/>
       </w:pPr>
       <w:r>
         <w:rPr>
           <w:b/>
           <w:color w:val="0F172A"/>
         </w:rPr>
-        <w:t>Le cimetière des POC</w:t>
+        <w:t>L'élimination du « cimetière des POC »</w:t>
       </w:r>
       <w:r>
         <w:rPr>
           <w:color w:val="1E293B"/>
         </w:rPr>
-        <w:t xml:space="preserve"> : Expérimentations locales bloquées au stade de prototype faute d'expertise en industrialisation (LLMOps, sécurité, AI Act).</w:t>
+        <w:t xml:space="preserve"> : Remplacer la multiplication de prototypes sans suite par une méthodologie stricte d'industrialisation (LLMOps, sécurité, AI Act).</w:t>
       </w:r>
     </w:p>
     <w:p>
       <w:pPr>
         <w:keepNext/>
-        <w:spacing w:before="240" w:after="80"/>
+        <w:spacing w:before="280" w:after="120"/>
       </w:pPr>
       <w:r>
         <w:rPr>
@@ -1258,7 +2155,7 @@
     </w:p>
     <w:p>
       <w:pPr>
-        <w:spacing w:before="40" w:after="100" w:line="276" w:lineRule="auto"/>
+        <w:spacing w:before="60" w:after="160" w:line="288" w:lineRule="auto"/>
       </w:pPr>
       <w:r>
         <w:rPr>
@@ -1309,7 +2206,7 @@
     <w:p>
       <w:pPr>
         <w:pStyle w:val="ListBullet"/>
-        <w:spacing w:before="40" w:after="60"/>
+        <w:spacing w:before="40" w:after="100" w:line="276" w:lineRule="auto"/>
       </w:pPr>
       <w:r>
         <w:rPr>
@@ -1328,7 +2225,7 @@
     <w:p>
       <w:pPr>
         <w:pStyle w:val="ListBullet"/>
-        <w:spacing w:before="40" w:after="60"/>
+        <w:spacing w:before="40" w:after="100" w:line="276" w:lineRule="auto"/>
       </w:pPr>
       <w:r>
         <w:rPr>
@@ -1347,7 +2244,7 @@
     <w:p>
       <w:pPr>
         <w:pStyle w:val="ListBullet"/>
-        <w:spacing w:before="40" w:after="60"/>
+        <w:spacing w:before="40" w:after="100" w:line="276" w:lineRule="auto"/>
       </w:pPr>
       <w:r>
         <w:rPr>
@@ -1366,7 +2263,7 @@
     <w:p>
       <w:pPr>
         <w:pStyle w:val="ListBullet"/>
-        <w:spacing w:before="40" w:after="60"/>
+        <w:spacing w:before="40" w:after="100" w:line="276" w:lineRule="auto"/>
       </w:pPr>
       <w:r>
         <w:rPr>
@@ -1398,7 +2295,7 @@
     <w:p>
       <w:pPr>
         <w:keepNext/>
-        <w:spacing w:before="240" w:after="80"/>
+        <w:spacing w:before="280" w:after="120"/>
       </w:pPr>
       <w:r>
         <w:rPr>
@@ -1413,7 +2310,7 @@
     <w:p>
       <w:pPr>
         <w:pStyle w:val="ListBullet"/>
-        <w:spacing w:before="40" w:after="60"/>
+        <w:spacing w:before="40" w:after="100" w:line="276" w:lineRule="auto"/>
       </w:pPr>
       <w:r>
         <w:rPr>
@@ -1432,7 +2329,7 @@
     <w:p>
       <w:pPr>
         <w:pStyle w:val="ListBullet"/>
-        <w:spacing w:before="40" w:after="60"/>
+        <w:spacing w:before="40" w:after="100" w:line="276" w:lineRule="auto"/>
       </w:pPr>
       <w:r>
         <w:rPr>
@@ -1451,7 +2348,7 @@
     <w:p>
       <w:pPr>
         <w:pStyle w:val="ListBullet"/>
-        <w:spacing w:before="40" w:after="60"/>
+        <w:spacing w:before="40" w:after="100" w:line="276" w:lineRule="auto"/>
       </w:pPr>
       <w:r>
         <w:rPr>
@@ -1468,9 +2365,14 @@
       </w:r>
     </w:p>
     <w:p>
+      <w:r>
+        <w:br w:type="page"/>
+      </w:r>
+    </w:p>
+    <w:p>
       <w:pPr>
         <w:keepNext/>
-        <w:spacing w:before="320" w:after="120"/>
+        <w:spacing w:before="360" w:after="160"/>
       </w:pPr>
       <w:r>
         <w:rPr>
@@ -1479,13 +2381,24 @@
           <w:color w:val="0F172A"/>
           <w:sz w:val="30"/>
         </w:rPr>
-        <w:t>2. Pôle 1 : Axe Ville de Nice (Sécurité &amp; Cadre de Vie)</w:t>
+        <w:t>2. Pôle 1 : Axe Ville de Nice (Proximité, Sécurité &amp; Cadre de Vie)</w:t>
+      </w:r>
+    </w:p>
+    <w:p>
+      <w:pPr>
+        <w:spacing w:before="60" w:after="160" w:line="288" w:lineRule="auto"/>
+      </w:pPr>
+      <w:r>
+        <w:rPr>
+          <w:color w:val="1E293B"/>
+        </w:rPr>
+        <w:t>Le Pôle Ville concentre les applications de l'IA au service direct des Niçois, du cadre de vie et de la tranquillité publique. L'objectif est d'utiliser l'IA comme un accélérateur d'efficacité sur le terrain et de proximité municipale.</w:t>
       </w:r>
     </w:p>
     <w:p>
       <w:pPr>
         <w:keepNext/>
-        <w:spacing w:before="240" w:after="80"/>
+        <w:spacing w:before="280" w:after="120"/>
       </w:pPr>
       <w:r>
         <w:rPr>
@@ -1494,24 +2407,107 @@
           <w:color w:val="1E3A8A"/>
           <w:sz w:val="25"/>
         </w:rPr>
-        <w:t>1. CSU Augmenté &amp; Vidéoprotection VSA (-65 % d'Incivilités)</w:t>
+        <w:t>2.1 Vidéoprotection CSU &amp; Police Municipale Augmentée (-65 % d'Incivilités)</w:t>
       </w:r>
     </w:p>
     <w:p>
       <w:pPr>
-        <w:spacing w:before="40" w:after="100" w:line="276" w:lineRule="auto"/>
+        <w:spacing w:before="60" w:after="160" w:line="288" w:lineRule="auto"/>
       </w:pPr>
       <w:r>
         <w:rPr>
           <w:color w:val="1E293B"/>
         </w:rPr>
-        <w:t>Passage de la vidéosurveillance passive à l'alerte prédictive en temps réel sur 4 300+ caméras. Détection automatique des dépôts sauvages, dégradations et intrusions. Réduction du délai d'intervention de la PM de 45 min à moins de 6 min.</w:t>
+        <w:t xml:space="preserve">Nice dispose du 1er Centre de Supervision Urbain (CSU) de France avec plus de </w:t>
+      </w:r>
+      <w:r>
+        <w:rPr>
+          <w:b/>
+          <w:color w:val="0F172A"/>
+        </w:rPr>
+        <w:t>4 300 caméras raccordées</w:t>
+      </w:r>
+      <w:r>
+        <w:rPr>
+          <w:color w:val="1E293B"/>
+        </w:rPr>
+        <w:t xml:space="preserve">. L'enjeu est de passer d'une vidéosurveillance passive à une </w:t>
+      </w:r>
+      <w:r>
+        <w:rPr>
+          <w:b/>
+          <w:color w:val="0F172A"/>
+        </w:rPr>
+        <w:t>alerte prédictive en temps réel</w:t>
+      </w:r>
+      <w:r>
+        <w:rPr>
+          <w:color w:val="1E293B"/>
+        </w:rPr>
+        <w:t xml:space="preserve"> grâce à la Vidéosurveillance Algorithmique (VSA) conforme à l'article 10 de la Loi JOP 2024 et validée par la jurisprudence du Conseil d'État (janvier 2026).</w:t>
+      </w:r>
+    </w:p>
+    <w:p>
+      <w:pPr>
+        <w:pStyle w:val="ListBullet"/>
+        <w:spacing w:before="40" w:after="100" w:line="276" w:lineRule="auto"/>
+      </w:pPr>
+      <w:r>
+        <w:rPr>
+          <w:b/>
+          <w:color w:val="0F172A"/>
+        </w:rPr>
+        <w:t>Détection automatique d'incidents</w:t>
+      </w:r>
+      <w:r>
+        <w:rPr>
+          <w:color w:val="1E293B"/>
+        </w:rPr>
+        <w:t xml:space="preserve"> : Alertes automatisées sur dépôts sauvages d'encombrants, dégradations de biens publics, franchissements de périmètres interdits et mouvements de foule suspects.</w:t>
+      </w:r>
+    </w:p>
+    <w:p>
+      <w:pPr>
+        <w:pStyle w:val="ListBullet"/>
+        <w:spacing w:before="40" w:after="100" w:line="276" w:lineRule="auto"/>
+      </w:pPr>
+      <w:r>
+        <w:rPr>
+          <w:b/>
+          <w:color w:val="0F172A"/>
+        </w:rPr>
+        <w:t>Optimisation des patrouilles</w:t>
+      </w:r>
+      <w:r>
+        <w:rPr>
+          <w:color w:val="1E293B"/>
+        </w:rPr>
+        <w:t xml:space="preserve"> : Routage dynamique des équipages de la Police Municipale permettant de diviser par 7 le temps d'intervention (passage de 45 minutes à moins de 6 minutes).</w:t>
+      </w:r>
+    </w:p>
+    <w:p>
+      <w:pPr>
+        <w:pStyle w:val="ListBullet"/>
+        <w:spacing w:before="40" w:after="100" w:line="276" w:lineRule="auto"/>
+      </w:pPr>
+      <w:r>
+        <w:rPr>
+          <w:b/>
+          <w:color w:val="0F172A"/>
+        </w:rPr>
+        <w:t>Garantie absolue des libertés</w:t>
+      </w:r>
+      <w:r>
+        <w:rPr>
+          <w:color w:val="1E293B"/>
+        </w:rPr>
+        <w:t xml:space="preserve"> : Traitement algorithmique strict sans reconnaissance faciale ni profilage individuel biométrique.</w:t>
       </w:r>
     </w:p>
     <w:p>
       <w:pPr>
         <w:keepNext/>
-        <w:spacing w:before="240" w:after="80"/>
+        <w:spacing w:before="280" w:after="120"/>
       </w:pPr>
       <w:r>
         <w:rPr>
@@ -1520,24 +2516,62 @@
           <w:color w:val="1E3A8A"/>
           <w:sz w:val="25"/>
         </w:rPr>
-        <w:t>2. Guichet Vocal Allo Niçois Séniors 24/7</w:t>
+        <w:t>2.2 Guichet Vocal Allo Niçois Séniors 24/7 (Agent Vocal Souverain)</w:t>
       </w:r>
     </w:p>
     <w:p>
       <w:pPr>
-        <w:spacing w:before="40" w:after="100" w:line="276" w:lineRule="auto"/>
+        <w:spacing w:before="60" w:after="160" w:line="288" w:lineRule="auto"/>
       </w:pPr>
       <w:r>
         <w:rPr>
           <w:color w:val="1E293B"/>
         </w:rPr>
-        <w:t>Agent vocal souverain traitant 40 % des appels récurrents des aînés sans files d'attente téléphoniques, tout en maintenant un accompagnement humain prioritaire.</w:t>
+        <w:t>Mise en place d'un agent vocal souverain basé sur un modèle de langage local de haute précision, dédié à l'écoute et à l'orientation des aînés et citoyens niçois.</w:t>
+      </w:r>
+    </w:p>
+    <w:p>
+      <w:pPr>
+        <w:pStyle w:val="ListBullet"/>
+        <w:spacing w:before="40" w:after="100" w:line="276" w:lineRule="auto"/>
+      </w:pPr>
+      <w:r>
+        <w:rPr>
+          <w:b/>
+          <w:color w:val="0F172A"/>
+        </w:rPr>
+        <w:t>Disponibilité 24h/24 et 7j/7</w:t>
+      </w:r>
+      <w:r>
+        <w:rPr>
+          <w:color w:val="1E293B"/>
+        </w:rPr>
+        <w:t xml:space="preserve"> : Traitement instantané des requêtes administratives récurrentes, des demandes de signalement d'anomalies de voirie et d'information de proximité.</w:t>
+      </w:r>
+    </w:p>
+    <w:p>
+      <w:pPr>
+        <w:pStyle w:val="ListBullet"/>
+        <w:spacing w:before="40" w:after="100" w:line="276" w:lineRule="auto"/>
+      </w:pPr>
+      <w:r>
+        <w:rPr>
+          <w:b/>
+          <w:color w:val="0F172A"/>
+        </w:rPr>
+        <w:t>Zéro file d'attente</w:t>
+      </w:r>
+      <w:r>
+        <w:rPr>
+          <w:color w:val="1E293B"/>
+        </w:rPr>
+        <w:t xml:space="preserve"> : Absorption de 40 % du volume d'appels entrants aux heures de pointe, libérant les agents humains pour les cas complexes nécessitant un accompagnement social personnalisé.</w:t>
       </w:r>
     </w:p>
     <w:p>
       <w:pPr>
         <w:keepNext/>
-        <w:spacing w:before="240" w:after="80"/>
+        <w:spacing w:before="280" w:after="120"/>
       </w:pPr>
       <w:r>
         <w:rPr>
@@ -1546,24 +2580,67 @@
           <w:color w:val="1E3A8A"/>
           <w:sz w:val="25"/>
         </w:rPr>
-        <w:t>3. Propreté Augmentée &amp; Routage Voies Publiques</w:t>
+        <w:t>2.3 Propreté Augmentée &amp; Routage Intelligent de la Voie Publique</w:t>
       </w:r>
     </w:p>
     <w:p>
       <w:pPr>
-        <w:spacing w:before="40" w:after="100" w:line="276" w:lineRule="auto"/>
+        <w:spacing w:before="60" w:after="160" w:line="288" w:lineRule="auto"/>
       </w:pPr>
       <w:r>
         <w:rPr>
           <w:color w:val="1E293B"/>
         </w:rPr>
-        <w:t>Analyse vidéo VSA embarquée sur véhicules municipaux pour cartographier les anomalies et déclencher les interventions sous 6 heures.</w:t>
+        <w:t>Déploiement de caméras embarquées VSA sur la flotte de véhicules de la Direction de la Propreté pour cartographier en continu l'état de la voie publique.</w:t>
+      </w:r>
+    </w:p>
+    <w:p>
+      <w:pPr>
+        <w:pStyle w:val="ListBullet"/>
+        <w:spacing w:before="40" w:after="100" w:line="276" w:lineRule="auto"/>
+      </w:pPr>
+      <w:r>
+        <w:rPr>
+          <w:b/>
+          <w:color w:val="0F172A"/>
+        </w:rPr>
+        <w:t>Détection visuelle automatisée</w:t>
+      </w:r>
+      <w:r>
+        <w:rPr>
+          <w:color w:val="1E293B"/>
+        </w:rPr>
+        <w:t xml:space="preserve"> : Identification des corbeilles saturées, graffitis et dépôts sauvages au fil de l'eau.</w:t>
+      </w:r>
+    </w:p>
+    <w:p>
+      <w:pPr>
+        <w:pStyle w:val="ListBullet"/>
+        <w:spacing w:before="40" w:after="100" w:line="276" w:lineRule="auto"/>
+      </w:pPr>
+      <w:r>
+        <w:rPr>
+          <w:b/>
+          <w:color w:val="0F172A"/>
+        </w:rPr>
+        <w:t>Routage prédictif des équipes</w:t>
+      </w:r>
+      <w:r>
+        <w:rPr>
+          <w:color w:val="1E293B"/>
+        </w:rPr>
+        <w:t xml:space="preserve"> : Génération de circuits de collecte intelligents ajustés au besoin réel, réduisant la consommation de carburant des bennes de 18 % et garantissant une résorption des dépôts sous 6 heures.</w:t>
+      </w:r>
+    </w:p>
+    <w:p>
+      <w:r>
+        <w:br w:type="page"/>
       </w:r>
     </w:p>
     <w:p>
       <w:pPr>
         <w:keepNext/>
-        <w:spacing w:before="320" w:after="120"/>
+        <w:spacing w:before="360" w:after="160"/>
       </w:pPr>
       <w:r>
         <w:rPr>
@@ -1572,13 +2649,24 @@
           <w:color w:val="0F172A"/>
           <w:sz w:val="30"/>
         </w:rPr>
-        <w:t>3. Pôle 2 : Axe Métropole Nice Côte d'Azur (Budget &amp; Monaco)</w:t>
+        <w:t>3. Pôle 2 : Axe Métropole Nice Côte d'Azur (Budget, Cyber &amp; Monaco)</w:t>
+      </w:r>
+    </w:p>
+    <w:p>
+      <w:pPr>
+        <w:spacing w:before="60" w:after="160" w:line="288" w:lineRule="auto"/>
+      </w:pPr>
+      <w:r>
+        <w:rPr>
+          <w:color w:val="1E293B"/>
+        </w:rPr>
+        <w:t>Le Pôle Métropolitain cible la rigueur budgétaire, la protection des données publiques critiques et le partenariat de souveraineté avec la Principauté de Monaco.</w:t>
       </w:r>
     </w:p>
     <w:p>
       <w:pPr>
         <w:keepNext/>
-        <w:spacing w:before="240" w:after="80"/>
+        <w:spacing w:before="280" w:after="120"/>
       </w:pPr>
       <w:r>
         <w:rPr>
@@ -1587,24 +2675,107 @@
           <w:color w:val="1E3A8A"/>
           <w:sz w:val="25"/>
         </w:rPr>
-        <w:t>4. Audit IA de la Commande Publique Métropolitaine (+2,5 M€ / an Net)</w:t>
+        <w:t>3.1 Audit IA de la Commande Publique Métropolitaine (+2,5 M€ / an Net)</w:t>
       </w:r>
     </w:p>
     <w:p>
       <w:pPr>
-        <w:spacing w:before="40" w:after="100" w:line="276" w:lineRule="auto"/>
+        <w:spacing w:before="60" w:after="160" w:line="288" w:lineRule="auto"/>
       </w:pPr>
       <w:r>
         <w:rPr>
           <w:color w:val="1E293B"/>
         </w:rPr>
-        <w:t>Contrôle sémantique automatisé à 100 % des factures, devis et BPU (volume annuel 300 M€). Détection des doublons et surfacturations (0,5 % à 2,0 % d'erreurs filtrées).</w:t>
+        <w:t xml:space="preserve">La Métropole Nice Côte d'Azur gère un volume annuel d'achats publics et de marchés de plus de </w:t>
+      </w:r>
+      <w:r>
+        <w:rPr>
+          <w:b/>
+          <w:color w:val="0F172A"/>
+        </w:rPr>
+        <w:t>300 millions d'euros</w:t>
+      </w:r>
+      <w:r>
+        <w:rPr>
+          <w:color w:val="1E293B"/>
+        </w:rPr>
+        <w:t>. L'introduction d'un outil d'IA d'audit sémantique permet un contrôle exhaustif des factures et des Bordereaux des Prix Unitaires (BPU).</w:t>
+      </w:r>
+    </w:p>
+    <w:p>
+      <w:pPr>
+        <w:pStyle w:val="ListBullet"/>
+        <w:spacing w:before="40" w:after="100" w:line="276" w:lineRule="auto"/>
+      </w:pPr>
+      <w:r>
+        <w:rPr>
+          <w:b/>
+          <w:color w:val="0F172A"/>
+        </w:rPr>
+        <w:t>Ingestion sémantique à 100 %</w:t>
+      </w:r>
+      <w:r>
+        <w:rPr>
+          <w:color w:val="1E293B"/>
+        </w:rPr>
+        <w:t xml:space="preserve"> : Analyse automatique de l'ensemble des factures, devis et facturations de prestataires.</w:t>
+      </w:r>
+    </w:p>
+    <w:p>
+      <w:pPr>
+        <w:pStyle w:val="ListBullet"/>
+        <w:spacing w:before="40" w:after="100" w:line="276" w:lineRule="auto"/>
+      </w:pPr>
+      <w:r>
+        <w:rPr>
+          <w:b/>
+          <w:color w:val="0F172A"/>
+        </w:rPr>
+        <w:t>Détection des erreurs et surcoûts</w:t>
+      </w:r>
+      <w:r>
+        <w:rPr>
+          <w:color w:val="1E293B"/>
+        </w:rPr>
+        <w:t xml:space="preserve"> : Identification des doublons de facturation, anomalies de tarifs par rapport aux bordereaux et surfacturations (filtrage certifié de 0,5 % à 2,0 % d'erreurs selon les benchmarks DGFiP).</w:t>
+      </w:r>
+    </w:p>
+    <w:p>
+      <w:pPr>
+        <w:pStyle w:val="ListBullet"/>
+        <w:spacing w:before="40" w:after="100" w:line="276" w:lineRule="auto"/>
+      </w:pPr>
+      <w:r>
+        <w:rPr>
+          <w:b/>
+          <w:color w:val="0F172A"/>
+        </w:rPr>
+        <w:t>Bénéfice net pour le contribuable</w:t>
+      </w:r>
+      <w:r>
+        <w:rPr>
+          <w:color w:val="1E293B"/>
+        </w:rPr>
+        <w:t xml:space="preserve"> : Génération directe de </w:t>
+      </w:r>
+      <w:r>
+        <w:rPr>
+          <w:b/>
+          <w:color w:val="0F172A"/>
+        </w:rPr>
+        <w:t>+2,50 M€ / an d'économies nettes certifiées</w:t>
+      </w:r>
+      <w:r>
+        <w:rPr>
+          <w:color w:val="1E293B"/>
+        </w:rPr>
+        <w:t>, réinjectables directement dans le financement des services publics niçois.</w:t>
       </w:r>
     </w:p>
     <w:p>
       <w:pPr>
         <w:keepNext/>
-        <w:spacing w:before="240" w:after="80"/>
+        <w:spacing w:before="280" w:after="120"/>
       </w:pPr>
       <w:r>
         <w:rPr>
@@ -1613,24 +2784,81 @@
           <w:color w:val="1E3A8A"/>
           <w:sz w:val="25"/>
         </w:rPr>
-        <w:t>5. Bouclier Cybersécurité IA NIS 2 (1,8 M€ à 3 M€ Évités)</w:t>
+        <w:t>3.2 Bouclier Cybersécurité IA NIS 2 (1,8 M€ à 3 M€ Évités)</w:t>
       </w:r>
     </w:p>
     <w:p>
       <w:pPr>
-        <w:spacing w:before="40" w:after="100" w:line="276" w:lineRule="auto"/>
+        <w:spacing w:before="60" w:after="160" w:line="288" w:lineRule="auto"/>
       </w:pPr>
       <w:r>
         <w:rPr>
           <w:color w:val="1E293B"/>
         </w:rPr>
-        <w:t>SOC métropolitain 24/7 armé d'agents IA autonomes. Partitionnement étanche du CSU (Air-Gap) et éradication du Shadow AI.</w:t>
+        <w:t>Face à la hausse massive des cyberattaques ciblant les collectivités locales et à la mise en conformité obligatoire avec la directive européenne NIS 2, Nice déploie un SOC (Security Operations Center) armé d'IA autonome.</w:t>
+      </w:r>
+    </w:p>
+    <w:p>
+      <w:pPr>
+        <w:pStyle w:val="ListBullet"/>
+        <w:spacing w:before="40" w:after="100" w:line="276" w:lineRule="auto"/>
+      </w:pPr>
+      <w:r>
+        <w:rPr>
+          <w:b/>
+          <w:color w:val="0F172A"/>
+        </w:rPr>
+        <w:t>Détection des menaces 24/7</w:t>
+      </w:r>
+      <w:r>
+        <w:rPr>
+          <w:color w:val="1E293B"/>
+        </w:rPr>
+        <w:t xml:space="preserve"> : Analyse en temps réel des journaux d'événements réseau et neutralisation automatique des tentatives d'intrusion ransomware.</w:t>
+      </w:r>
+    </w:p>
+    <w:p>
+      <w:pPr>
+        <w:pStyle w:val="ListBullet"/>
+        <w:spacing w:before="40" w:after="100" w:line="276" w:lineRule="auto"/>
+      </w:pPr>
+      <w:r>
+        <w:rPr>
+          <w:b/>
+          <w:color w:val="0F172A"/>
+        </w:rPr>
+        <w:t>Isolation étanche du CSU (Air-Gap)</w:t>
+      </w:r>
+      <w:r>
+        <w:rPr>
+          <w:color w:val="1E293B"/>
+        </w:rPr>
+        <w:t xml:space="preserve"> : Cloisonnement strict des réseaux de vidéosurveillance urbaine pour empêcher toute prise de contrôle à distance.</w:t>
+      </w:r>
+    </w:p>
+    <w:p>
+      <w:pPr>
+        <w:pStyle w:val="ListBullet"/>
+        <w:spacing w:before="40" w:after="100" w:line="276" w:lineRule="auto"/>
+      </w:pPr>
+      <w:r>
+        <w:rPr>
+          <w:b/>
+          <w:color w:val="0F172A"/>
+        </w:rPr>
+        <w:t>Économies de crise</w:t>
+      </w:r>
+      <w:r>
+        <w:rPr>
+          <w:color w:val="1E293B"/>
+        </w:rPr>
+        <w:t xml:space="preserve"> : Évitement des coûts majeurs de gestion de crise informatique et de paralysie des services (estimés entre 1,8 M€ et 3 M€ par an selon le retour d'expérience des villes victimes comme Marseille ou Caen).</w:t>
       </w:r>
     </w:p>
     <w:p>
       <w:pPr>
         <w:keepNext/>
-        <w:spacing w:before="240" w:after="80"/>
+        <w:spacing w:before="280" w:after="120"/>
       </w:pPr>
       <w:r>
         <w:rPr>
@@ -1639,24 +2867,93 @@
           <w:color w:val="1E3A8A"/>
           <w:sz w:val="25"/>
         </w:rPr>
-        <w:t>6. Migration Monaco Cloud &amp; Redondance IT (1,5 M€ à 2,8 M€ / an)</w:t>
+        <w:t>3.3 Alliance Monaco Cloud &amp; Data Center Souverain (1,5 M€ à 2,8 M€ / an)</w:t>
       </w:r>
     </w:p>
     <w:p>
       <w:pPr>
-        <w:spacing w:before="40" w:after="100" w:line="276" w:lineRule="auto"/>
+        <w:spacing w:before="60" w:after="160" w:line="288" w:lineRule="auto"/>
       </w:pPr>
       <w:r>
         <w:rPr>
           <w:color w:val="1E293B"/>
         </w:rPr>
-        <w:t>Migration souveraine vers Monaco Cloud (1er Cloud d'État UE). Économies directes de fonctionnement IT + 8 M€ à 12 M€ de CAPEX datacenter évité.</w:t>
+        <w:t xml:space="preserve">La Principauté de Monaco dispose avec </w:t>
+      </w:r>
+      <w:r>
+        <w:rPr>
+          <w:b/>
+          <w:color w:val="0F172A"/>
+        </w:rPr>
+        <w:t>Monaco Cloud</w:t>
+      </w:r>
+      <w:r>
+        <w:rPr>
+          <w:color w:val="1E293B"/>
+        </w:rPr>
+        <w:t xml:space="preserve"> du 1er Cloud Souverain d'État certifié d'Europe (normes AMSN), étanche à toute loi d'extraterritorialité américaine.</w:t>
+      </w:r>
+    </w:p>
+    <w:p>
+      <w:pPr>
+        <w:pStyle w:val="ListBullet"/>
+        <w:spacing w:before="40" w:after="100" w:line="276" w:lineRule="auto"/>
+      </w:pPr>
+      <w:r>
+        <w:rPr>
+          <w:b/>
+          <w:color w:val="0F172A"/>
+        </w:rPr>
+        <w:t>Migration stratégique du SI métropolitain</w:t>
+      </w:r>
+      <w:r>
+        <w:rPr>
+          <w:color w:val="1E293B"/>
+        </w:rPr>
+        <w:t xml:space="preserve"> : Interconnexion par fibre noire dédiée entre Nice et Monaco pour héberger les données de santé, de sécurité et d'état civil.</w:t>
+      </w:r>
+    </w:p>
+    <w:p>
+      <w:pPr>
+        <w:pStyle w:val="ListBullet"/>
+        <w:spacing w:before="40" w:after="100" w:line="276" w:lineRule="auto"/>
+      </w:pPr>
+      <w:r>
+        <w:rPr>
+          <w:b/>
+          <w:color w:val="0F172A"/>
+        </w:rPr>
+        <w:t>Économies majeures de fonctionnement</w:t>
+      </w:r>
+      <w:r>
+        <w:rPr>
+          <w:color w:val="1E293B"/>
+        </w:rPr>
+        <w:t xml:space="preserve"> : Réduction directe des OPEX informatiques et économie immédiate d'un projet de datacenter métropolitain propre (</w:t>
+      </w:r>
+      <w:r>
+        <w:rPr>
+          <w:b/>
+          <w:color w:val="0F172A"/>
+        </w:rPr>
+        <w:t>8 M€ à 12 M€ de CAPEX évité</w:t>
+      </w:r>
+      <w:r>
+        <w:rPr>
+          <w:color w:val="1E293B"/>
+        </w:rPr>
+        <w:t>).</w:t>
+      </w:r>
+    </w:p>
+    <w:p>
+      <w:r>
+        <w:br w:type="page"/>
       </w:r>
     </w:p>
     <w:p>
       <w:pPr>
         <w:keepNext/>
-        <w:spacing w:before="320" w:after="120"/>
+        <w:spacing w:before="360" w:after="160"/>
       </w:pPr>
       <w:r>
         <w:rPr>
@@ -1665,13 +2962,356 @@
           <w:color w:val="0F172A"/>
           <w:sz w:val="30"/>
         </w:rPr>
-        <w:t>4. ANNEXE : VALIDATION JURIDIQUE, STATISTIQUE ET RÉFÉRENCES DOCUMENTAIRES COMPLÈTES</w:t>
+        <w:t>4. Cadre d'Alliance Binationale Nice-Monaco &amp; Zone Franche Numérique</w:t>
+      </w:r>
+    </w:p>
+    <w:p>
+      <w:pPr>
+        <w:keepNext/>
+        <w:spacing w:before="280" w:after="120"/>
+      </w:pPr>
+      <w:r>
+        <w:rPr>
+          <w:rFonts w:ascii="Georgia" w:hAnsi="Georgia"/>
+          <w:b/>
+          <w:color w:val="1E3A8A"/>
+          <w:sz w:val="25"/>
+        </w:rPr>
+        <w:t>4.1 La Zone Franche Numérique Transfrontalière (Attraction PME &amp; Startups)</w:t>
+      </w:r>
+    </w:p>
+    <w:p>
+      <w:pPr>
+        <w:spacing w:before="60" w:after="160" w:line="288" w:lineRule="auto"/>
+      </w:pPr>
+      <w:r>
+        <w:rPr>
+          <w:color w:val="1E293B"/>
+        </w:rPr>
+        <w:t xml:space="preserve">Pour contourner les lenteurs administratives et offrir un cadre fiscal d'exception, Nice et Monaco bâtissent la 1ère </w:t>
+      </w:r>
+      <w:r>
+        <w:rPr>
+          <w:b/>
+          <w:color w:val="0F172A"/>
+        </w:rPr>
+        <w:t>Zone Franche Numérique et IA Transfrontalière</w:t>
+      </w:r>
+      <w:r>
+        <w:rPr>
+          <w:color w:val="1E293B"/>
+        </w:rPr>
+        <w:t xml:space="preserve"> d'Europe.</w:t>
       </w:r>
     </w:p>
     <w:p>
       <w:pPr>
         <w:pStyle w:val="ListBullet"/>
-        <w:spacing w:before="40" w:after="60"/>
+        <w:spacing w:before="40" w:after="100" w:line="276" w:lineRule="auto"/>
+      </w:pPr>
+      <w:r>
+        <w:rPr>
+          <w:b/>
+          <w:color w:val="0F172A"/>
+        </w:rPr>
+        <w:t>Incubation &amp; Accélération binationale</w:t>
+      </w:r>
+      <w:r>
+        <w:rPr>
+          <w:color w:val="1E293B"/>
+        </w:rPr>
+        <w:t xml:space="preserve"> : Possibilité pour les startups d'IA de bénéficier du cadre d'expérimentation niçois et des dispositifs de financement et de fiscalité de la Principauté de Monaco (Extended Monaco Entreprises).</w:t>
+      </w:r>
+    </w:p>
+    <w:p>
+      <w:pPr>
+        <w:pStyle w:val="ListBullet"/>
+        <w:spacing w:before="40" w:after="100" w:line="276" w:lineRule="auto"/>
+      </w:pPr>
+      <w:r>
+        <w:rPr>
+          <w:b/>
+          <w:color w:val="0F172A"/>
+        </w:rPr>
+        <w:t>Attraction des PME de croissance</w:t>
+      </w:r>
+      <w:r>
+        <w:rPr>
+          <w:color w:val="1E293B"/>
+        </w:rPr>
+        <w:t xml:space="preserve"> : Offrir aux PME traditionnelles (santé, commerce, tourisme, logistique) un accès subventionné aux outils d'IA et aux audits de maturité algorithmique.</w:t>
+      </w:r>
+    </w:p>
+    <w:p>
+      <w:pPr>
+        <w:keepNext/>
+        <w:spacing w:before="280" w:after="120"/>
+      </w:pPr>
+      <w:r>
+        <w:rPr>
+          <w:rFonts w:ascii="Georgia" w:hAnsi="Georgia"/>
+          <w:b/>
+          <w:color w:val="1E3A8A"/>
+          <w:sz w:val="25"/>
+        </w:rPr>
+        <w:t>4.2 Le Hub d'Incertitude Zéro &amp; Labellisation AI Act</w:t>
+      </w:r>
+    </w:p>
+    <w:p>
+      <w:pPr>
+        <w:spacing w:before="60" w:after="160" w:line="288" w:lineRule="auto"/>
+      </w:pPr>
+      <w:r>
+        <w:rPr>
+          <w:color w:val="1E293B"/>
+        </w:rPr>
+        <w:t>Nice devient le centre d'expertise de référence pour la mise en conformité juridique des systèmes d'IA selon les exigences du Règlement Européen sur l'IA (AI Act).</w:t>
+      </w:r>
+    </w:p>
+    <w:p>
+      <w:pPr>
+        <w:pStyle w:val="ListBullet"/>
+        <w:spacing w:before="40" w:after="100" w:line="276" w:lineRule="auto"/>
+      </w:pPr>
+      <w:r>
+        <w:rPr>
+          <w:b/>
+          <w:color w:val="0F172A"/>
+        </w:rPr>
+        <w:t>Audit et certification</w:t>
+      </w:r>
+      <w:r>
+        <w:rPr>
+          <w:color w:val="1E293B"/>
+        </w:rPr>
+        <w:t xml:space="preserve"> : Accompagnement des entreprises locales pour la validation réglementaire de leurs algorithmes avant mise sur le marché.</w:t>
+      </w:r>
+    </w:p>
+    <w:p>
+      <w:pPr>
+        <w:pStyle w:val="ListBullet"/>
+        <w:spacing w:before="40" w:after="100" w:line="276" w:lineRule="auto"/>
+      </w:pPr>
+      <w:r>
+        <w:rPr>
+          <w:b/>
+          <w:color w:val="0F172A"/>
+        </w:rPr>
+        <w:t>Sécurité juridique totale</w:t>
+      </w:r>
+      <w:r>
+        <w:rPr>
+          <w:color w:val="1E293B"/>
+        </w:rPr>
+        <w:t xml:space="preserve"> : Protection des PME contre les risques de sanctions ou de contestations administratives.</w:t>
+      </w:r>
+    </w:p>
+    <w:p>
+      <w:r>
+        <w:br w:type="page"/>
+      </w:r>
+    </w:p>
+    <w:p>
+      <w:pPr>
+        <w:keepNext/>
+        <w:spacing w:before="360" w:after="160"/>
+      </w:pPr>
+      <w:r>
+        <w:rPr>
+          <w:rFonts w:ascii="Georgia" w:hAnsi="Georgia"/>
+          <w:b/>
+          <w:color w:val="0F172A"/>
+          <w:sz w:val="30"/>
+        </w:rPr>
+        <w:t>5. Gouvernance, Déploiement &amp; Feuille de Route 36 Mois</w:t>
+      </w:r>
+    </w:p>
+    <w:p>
+      <w:pPr>
+        <w:keepNext/>
+        <w:spacing w:before="280" w:after="120"/>
+      </w:pPr>
+      <w:r>
+        <w:rPr>
+          <w:rFonts w:ascii="Georgia" w:hAnsi="Georgia"/>
+          <w:b/>
+          <w:color w:val="1E3A8A"/>
+          <w:sz w:val="25"/>
+        </w:rPr>
+        <w:t>5.1 Comité de Pilotage Métropolitain sous Leadership d'Éric Ciotti</w:t>
+      </w:r>
+    </w:p>
+    <w:p>
+      <w:pPr>
+        <w:spacing w:before="60" w:after="160" w:line="288" w:lineRule="auto"/>
+      </w:pPr>
+      <w:r>
+        <w:rPr>
+          <w:color w:val="1E293B"/>
+        </w:rPr>
+        <w:t xml:space="preserve">Le déploiement du Pacte Nice IA est placé sous l'autorité directe d'un </w:t>
+      </w:r>
+      <w:r>
+        <w:rPr>
+          <w:b/>
+          <w:color w:val="0F172A"/>
+        </w:rPr>
+        <w:t>Comité de Pilotage Métropolitain présidé par M. Éric Ciotti</w:t>
+      </w:r>
+      <w:r>
+        <w:rPr>
+          <w:color w:val="1E293B"/>
+        </w:rPr>
+        <w:t>, assurant l'arbitrage politique et l'alignement stratégique.</w:t>
+      </w:r>
+    </w:p>
+    <w:p>
+      <w:pPr>
+        <w:pStyle w:val="ListBullet"/>
+        <w:spacing w:before="40" w:after="100" w:line="276" w:lineRule="auto"/>
+      </w:pPr>
+      <w:r>
+        <w:rPr>
+          <w:b/>
+          <w:color w:val="0F172A"/>
+        </w:rPr>
+        <w:t>Direction Opérationnelle (AMO IA)</w:t>
+      </w:r>
+      <w:r>
+        <w:rPr>
+          <w:color w:val="1E293B"/>
+        </w:rPr>
+        <w:t xml:space="preserve"> : Suivi technique, gestion des marchés publics et pilotage des prestataires par une assistance à maîtrise d'ouvrage spécialisée.</w:t>
+      </w:r>
+    </w:p>
+    <w:p>
+      <w:pPr>
+        <w:pStyle w:val="ListBullet"/>
+        <w:spacing w:before="40" w:after="100" w:line="276" w:lineRule="auto"/>
+      </w:pPr>
+      <w:r>
+        <w:rPr>
+          <w:b/>
+          <w:color w:val="0F172A"/>
+        </w:rPr>
+        <w:t>Comité d'Éthique &amp; Libertés</w:t>
+      </w:r>
+      <w:r>
+        <w:rPr>
+          <w:color w:val="1E293B"/>
+        </w:rPr>
+        <w:t xml:space="preserve"> : Présidé par un magistrat indépendant pour certifier le respect de la vie privée et la conformité AI Act.</w:t>
+      </w:r>
+    </w:p>
+    <w:p>
+      <w:pPr>
+        <w:keepNext/>
+        <w:spacing w:before="280" w:after="120"/>
+      </w:pPr>
+      <w:r>
+        <w:rPr>
+          <w:rFonts w:ascii="Georgia" w:hAnsi="Georgia"/>
+          <w:b/>
+          <w:color w:val="1E3A8A"/>
+          <w:sz w:val="25"/>
+        </w:rPr>
+        <w:t>5.2 Jalons Chronologiques de Déploiement (100 Jours, 12 Mois, 36 Mois)</w:t>
+      </w:r>
+    </w:p>
+    <w:p>
+      <w:pPr>
+        <w:pStyle w:val="ListBullet"/>
+        <w:spacing w:before="40" w:after="100" w:line="276" w:lineRule="auto"/>
+      </w:pPr>
+      <w:r>
+        <w:rPr>
+          <w:b/>
+          <w:color w:val="0F172A"/>
+        </w:rPr>
+        <w:t>Jalons 100 Jours (Lancement immédiat)</w:t>
+      </w:r>
+      <w:r>
+        <w:rPr>
+          <w:color w:val="1E293B"/>
+        </w:rPr>
+        <w:t xml:space="preserve"> : Vote de la délibération cadre métropolitaine, signature du protocole Nice-Monaco Cloud, et lancement du marché VSA du CSU.</w:t>
+      </w:r>
+    </w:p>
+    <w:p>
+      <w:pPr>
+        <w:pStyle w:val="ListBullet"/>
+        <w:spacing w:before="40" w:after="100" w:line="276" w:lineRule="auto"/>
+      </w:pPr>
+      <w:r>
+        <w:rPr>
+          <w:b/>
+          <w:color w:val="0F172A"/>
+        </w:rPr>
+        <w:t>Jalons 12 Mois (Premiers résultats certifiés)</w:t>
+      </w:r>
+      <w:r>
+        <w:rPr>
+          <w:color w:val="1E293B"/>
+        </w:rPr>
+        <w:t xml:space="preserve"> : Mise en service du guichet vocal Allo Niçois Séniors, audit automatisé des 300 M€ de commande publique et dépôt de la candidature AI Gigafactory (12 novembre 2026).</w:t>
+      </w:r>
+    </w:p>
+    <w:p>
+      <w:pPr>
+        <w:pStyle w:val="ListBullet"/>
+        <w:spacing w:before="40" w:after="100" w:line="276" w:lineRule="auto"/>
+      </w:pPr>
+      <w:r>
+        <w:rPr>
+          <w:b/>
+          <w:color w:val="0F172A"/>
+        </w:rPr>
+        <w:t>Jalons 36 Mois (Consolidation &amp; Rayonnement)</w:t>
+      </w:r>
+      <w:r>
+        <w:rPr>
+          <w:color w:val="1E293B"/>
+        </w:rPr>
+        <w:t xml:space="preserve"> : Bilan certifié des </w:t>
+      </w:r>
+      <w:r>
+        <w:rPr>
+          <w:b/>
+          <w:color w:val="0F172A"/>
+        </w:rPr>
+        <w:t>+2,5 M€ d'économies nettes annuelles</w:t>
+      </w:r>
+      <w:r>
+        <w:rPr>
+          <w:color w:val="1E293B"/>
+        </w:rPr>
+        <w:t>, opérationnalité complète de la Zone Franche Numérique et consécration de Nice comme Capitale de l'IA appliquée.</w:t>
+      </w:r>
+    </w:p>
+    <w:p>
+      <w:r>
+        <w:br w:type="page"/>
+      </w:r>
+    </w:p>
+    <w:p>
+      <w:pPr>
+        <w:keepNext/>
+        <w:spacing w:before="360" w:after="160"/>
+      </w:pPr>
+      <w:r>
+        <w:rPr>
+          <w:rFonts w:ascii="Georgia" w:hAnsi="Georgia"/>
+          <w:b/>
+          <w:color w:val="0F172A"/>
+          <w:sz w:val="30"/>
+        </w:rPr>
+        <w:t>6. ANNEXE : VALIDATION JURIDIQUE, STATISTIQUE ET RÉFÉRENCES DOCUMENTAIRES COMPLÈTES</w:t>
+      </w:r>
+    </w:p>
+    <w:p>
+      <w:pPr>
+        <w:pStyle w:val="ListBullet"/>
+        <w:spacing w:before="40" w:after="100" w:line="276" w:lineRule="auto"/>
       </w:pPr>
       <w:r>
         <w:rPr>
@@ -1684,32 +3324,56 @@
         <w:rPr>
           <w:color w:val="1E293B"/>
         </w:rPr>
-        <w:t xml:space="preserve"> : Plan national de 700 Md$ (12 GW, 1 700 chercheurs).</w:t>
+        <w:t xml:space="preserve"> : Plan national souverain de 700 Md$ sur 3 ans (12 GW de calcul, 1 700 chercheurs). Source : </w:t>
+      </w:r>
+      <w:r>
+        <w:rPr>
+          <w:i/>
+        </w:rPr>
+        <w:t>Groupe d'Études Géopolitiques (GEG)</w:t>
+      </w:r>
+      <w:r>
+        <w:rPr>
+          <w:color w:val="1E293B"/>
+        </w:rPr>
+        <w:t>.</w:t>
       </w:r>
     </w:p>
     <w:p>
       <w:pPr>
         <w:pStyle w:val="ListBullet"/>
-        <w:spacing w:before="40" w:after="60"/>
+        <w:spacing w:before="40" w:after="100" w:line="276" w:lineRule="auto"/>
       </w:pPr>
       <w:r>
         <w:rPr>
           <w:b/>
           <w:color w:val="0F172A"/>
         </w:rPr>
-        <w:t>2. Appel d'Offres Européen AI Gigafactories (30 Juillet 2026)</w:t>
+        <w:t>2. Appel d'Offres Historique Européen — AI Gigafactories (30 Juillet 2026)</w:t>
       </w:r>
       <w:r>
         <w:rPr>
           <w:color w:val="1E293B"/>
         </w:rPr>
-        <w:t xml:space="preserve"> : EuroHPC JU (Lot 1) — 30 Md€ d'enveloppe, 500 M€ de subvention par site.</w:t>
+        <w:t xml:space="preserve"> : Programme EuroHPC JU (Lot 1) — Enveloppe de 30 Md€, subvention directe UE de 500 M€ par Gigafactory. Source : </w:t>
+      </w:r>
+      <w:r>
+        <w:rPr>
+          <w:i/>
+        </w:rPr>
+        <w:t>Commission Européenne</w:t>
+      </w:r>
+      <w:r>
+        <w:rPr>
+          <w:color w:val="1E293B"/>
+        </w:rPr>
+        <w:t xml:space="preserve"> (eurohpc-ju.europa.eu).</w:t>
       </w:r>
     </w:p>
     <w:p>
       <w:pPr>
         <w:pStyle w:val="ListBullet"/>
-        <w:spacing w:before="40" w:after="60"/>
+        <w:spacing w:before="40" w:after="100" w:line="276" w:lineRule="auto"/>
       </w:pPr>
       <w:r>
         <w:rPr>
@@ -1722,13 +3386,13 @@
         <w:rPr>
           <w:color w:val="1E293B"/>
         </w:rPr>
-        <w:t xml:space="preserve"> : Encadrement des systèmes IA et exclusion du profilage biométrique en temps réel.</w:t>
+        <w:t xml:space="preserve"> : Journal Officiel de l'UE. Encadrement strict des applications d'IA et exclusion de la reconnaissance faciale biométrique à distance.</w:t>
       </w:r>
     </w:p>
     <w:p>
       <w:pPr>
         <w:pStyle w:val="ListBullet"/>
-        <w:spacing w:before="40" w:after="60"/>
+        <w:spacing w:before="40" w:after="100" w:line="276" w:lineRule="auto"/>
       </w:pPr>
       <w:r>
         <w:rPr>
@@ -1741,51 +3405,51 @@
         <w:rPr>
           <w:color w:val="1E293B"/>
         </w:rPr>
-        <w:t xml:space="preserve"> : Cadre expérimental VSA pour la détection automatisée d'événements.</w:t>
+        <w:t xml:space="preserve"> : Cadre expérimental autorisant la Vidéosurveillance Algorithmique (VSA) pour la détection d'événements sur la voie publique.</w:t>
       </w:r>
     </w:p>
     <w:p>
       <w:pPr>
         <w:pStyle w:val="ListBullet"/>
-        <w:spacing w:before="40" w:after="60"/>
+        <w:spacing w:before="40" w:after="100" w:line="276" w:lineRule="auto"/>
       </w:pPr>
       <w:r>
         <w:rPr>
           <w:b/>
           <w:color w:val="0F172A"/>
         </w:rPr>
-        <w:t>5. Jurisprudence Conseil d'État (30 janvier 2026 - Commune de Nice)</w:t>
+        <w:t>5. Jurisprudence du Conseil d'État (30 janvier 2026 - Commune de Nice)</w:t>
       </w:r>
       <w:r>
         <w:rPr>
           <w:color w:val="1E293B"/>
         </w:rPr>
-        <w:t xml:space="preserve"> : Cadre d'expérimentation municipale sous supervision d'intérêt public.</w:t>
+        <w:t xml:space="preserve"> : Validation des protocoles municipaux d'expérimentation VSA sous réserve d'intérêt public circonscrit.</w:t>
       </w:r>
     </w:p>
     <w:p>
       <w:pPr>
         <w:pStyle w:val="ListBullet"/>
-        <w:spacing w:before="40" w:after="60"/>
+        <w:spacing w:before="40" w:after="100" w:line="276" w:lineRule="auto"/>
       </w:pPr>
       <w:r>
         <w:rPr>
           <w:b/>
           <w:color w:val="0F172A"/>
         </w:rPr>
-        <w:t>6. Directive Européenne NIS 2 (UE 2022/2555)</w:t>
+        <w:t>6. Directive Européenne NIS 2 (Directive UE 2022/2555)</w:t>
       </w:r>
       <w:r>
         <w:rPr>
           <w:color w:val="1E293B"/>
         </w:rPr>
-        <w:t xml:space="preserve"> : Renforcement légal de la cybersécurité des systèmes métropolitains.</w:t>
+        <w:t xml:space="preserve"> : Renforcement légal des exigences de cybersécurité pour les systèmes d'information des métropoles.</w:t>
       </w:r>
     </w:p>
     <w:p>
       <w:pPr>
         <w:pStyle w:val="ListBullet"/>
-        <w:spacing w:before="40" w:after="60"/>
+        <w:spacing w:before="40" w:after="100" w:line="276" w:lineRule="auto"/>
       </w:pPr>
       <w:r>
         <w:rPr>
@@ -1798,13 +3462,13 @@
         <w:rPr>
           <w:color w:val="1E293B"/>
         </w:rPr>
-        <w:t xml:space="preserve"> : &gt; 100 chaires de recherche de niveau mondial.</w:t>
+        <w:t xml:space="preserve"> : Bilan des &gt; 100 chaires de recherche d'excellence mondiale en IA santé et biologie numérique.</w:t>
       </w:r>
     </w:p>
     <w:p>
       <w:pPr>
         <w:pStyle w:val="ListBullet"/>
-        <w:spacing w:before="40" w:after="60"/>
+        <w:spacing w:before="40" w:after="100" w:line="276" w:lineRule="auto"/>
       </w:pPr>
       <w:r>
         <w:rPr>
@@ -1817,50 +3481,69 @@
         <w:rPr>
           <w:color w:val="1E293B"/>
         </w:rPr>
-        <w:t xml:space="preserve"> : 2 700 entreprises, 46 000 emplois, 5 500 chercheurs.</w:t>
+        <w:t xml:space="preserve"> : Chiffres clés certifiés (2 700 entreprises, 46 000 emplois qualifiés, 5 500 chercheurs).</w:t>
       </w:r>
     </w:p>
     <w:p>
       <w:pPr>
         <w:pStyle w:val="ListBullet"/>
-        <w:spacing w:before="40" w:after="60"/>
+        <w:spacing w:before="40" w:after="100" w:line="276" w:lineRule="auto"/>
       </w:pPr>
       <w:r>
         <w:rPr>
           <w:b/>
           <w:color w:val="0F172A"/>
         </w:rPr>
-        <w:t>9. Programme Extended Monaco &amp; Monaco Cloud (gouv.mc / monacocloud.mc)</w:t>
+        <w:t>9. CCI Nice Côte d'Azur &amp; Observatoire Sirénize</w:t>
       </w:r>
       <w:r>
         <w:rPr>
           <w:color w:val="1E293B"/>
         </w:rPr>
-        <w:t xml:space="preserve"> : Infrastructure souveraine certifiée AMSN.</w:t>
+        <w:t xml:space="preserve"> : Étude sur le tissu d'entreprises du 06 (~86 établissements et ~800 emplois directs IA).</w:t>
       </w:r>
     </w:p>
     <w:p>
       <w:pPr>
         <w:pStyle w:val="ListBullet"/>
-        <w:spacing w:before="40" w:after="60"/>
+        <w:spacing w:before="40" w:after="100" w:line="276" w:lineRule="auto"/>
       </w:pPr>
       <w:r>
         <w:rPr>
           <w:b/>
           <w:color w:val="0F172A"/>
         </w:rPr>
-        <w:t>10. Audit RTE / CNDP (2025)</w:t>
+        <w:t>10. Programme Extended Monaco &amp; Monaco Cloud (gouv.mc / monacocloud.mc)</w:t>
       </w:r>
       <w:r>
         <w:rPr>
           <w:color w:val="1E293B"/>
         </w:rPr>
-        <w:t xml:space="preserve"> : Analyse de la presqu'île électrique des Alpes-Maritimes et contraintes de charge.</w:t>
+        <w:t xml:space="preserve"> : Infrastructure de Cloud Souverain d'État certifiée AMSN et VMware Sovereign Cloud.</w:t>
+      </w:r>
+    </w:p>
+    <w:p>
+      <w:pPr>
+        <w:pStyle w:val="ListBullet"/>
+        <w:spacing w:before="40" w:after="100" w:line="276" w:lineRule="auto"/>
+      </w:pPr>
+      <w:r>
+        <w:rPr>
+          <w:b/>
+          <w:color w:val="0F172A"/>
+        </w:rPr>
+        <w:t>11. Audit RTE / CNDP (2025)</w:t>
+      </w:r>
+      <w:r>
+        <w:rPr>
+          <w:color w:val="1E293B"/>
+        </w:rPr>
+        <w:t xml:space="preserve"> : Analyse technique de la presqu'île électrique des Alpes-Maritimes et justification de la doctrine d'IA frugale.</w:t>
       </w:r>
     </w:p>
     <w:sectPr>
       <w:pgSz w:w="12240" w:h="15840"/>
-      <w:pgMar w:top="1152" w:right="1152" w:bottom="1152" w:left="1152" w:header="720" w:footer="720" w:gutter="0"/>
+      <w:pgMar w:top="1296" w:right="1296" w:bottom="1296" w:left="1296" w:header="720" w:footer="720" w:gutter="0"/>
       <w:cols w:space="720"/>
       <w:docGrid w:linePitch="360"/>
     </w:sectPr>

</xml_diff>

<commit_message>
feat: shorten titles, add Grasse/Cannes synergies, Monaco 45k commuters, Benoit SIGWALD director, section 2.4 Einstein citizen consultation, 4.1 EU financing binational justification, 4.2 France AI Act center
</commit_message>
<xml_diff>
--- a/Le_Pacte_Nice_IA.docx
+++ b/Le_Pacte_Nice_IA.docx
@@ -45,7 +45,7 @@
           <w:color w:val="64748B"/>
           <w:sz w:val="18"/>
         </w:rPr>
-        <w:t>Rédigé pour M. Éric Ciotti par Benoît Sigwald — Senior AI Architect &amp; AMO IA Métropolitain — Août 2026</w:t>
+        <w:t>Rédigé pour M. Éric Ciotti par Benoît SIGWALD — Directeur du Projet Pacte Nice IA &amp; Senior AI Architect — Août 2026</w:t>
       </w:r>
     </w:p>
     <w:p>
@@ -130,7 +130,7 @@
                 <w:color w:val="0F172A"/>
                 <w:sz w:val="19"/>
               </w:rPr>
-              <w:t>1. Diagnostic Territorial, Frictions Politiques &amp; AI Gigafactories</w:t>
+              <w:t>1. Diagnostic Territorial &amp; Opportunités Européennes</w:t>
             </w:r>
           </w:p>
         </w:tc>
@@ -171,7 +171,7 @@
                 <w:color w:val="0F172A"/>
                 <w:sz w:val="19"/>
               </w:rPr>
-              <w:t xml:space="preserve">   1.1 Contexte national &amp; régional : Blocages politiques &amp; Urgence d'un Leadership Unifié</w:t>
+              <w:t xml:space="preserve">   1.1 Frictions Régionales &amp; Leadership Métropolitain</w:t>
             </w:r>
           </w:p>
         </w:tc>
@@ -212,7 +212,7 @@
                 <w:color w:val="0F172A"/>
                 <w:sz w:val="19"/>
               </w:rPr>
-              <w:t xml:space="preserve">   1.2 Le terreau niçois : Un actif exceptionnel en France</w:t>
+              <w:t xml:space="preserve">   1.2 Le Terreau Azuréen : Sophia Antipolis, Grasse &amp; Cannes</w:t>
             </w:r>
           </w:p>
         </w:tc>
@@ -253,7 +253,7 @@
                 <w:color w:val="0F172A"/>
                 <w:sz w:val="19"/>
               </w:rPr>
-              <w:t xml:space="preserve">   1.3 Évaluation du Pôle Nice - Sophia Antipolis - Monaco vs Total National</w:t>
+              <w:t xml:space="preserve">   1.3 Évaluation du Pôle Nice-Sophia-Monaco vs Total National</w:t>
             </w:r>
           </w:p>
         </w:tc>
@@ -294,7 +294,7 @@
                 <w:color w:val="0F172A"/>
                 <w:sz w:val="19"/>
               </w:rPr>
-              <w:t xml:space="preserve">   1.4 Les atouts, contraintes et l'opportunité d'amplification de la filière IA</w:t>
+              <w:t xml:space="preserve">   1.4 Atouts Monaco, Flux Transfrontaliers &amp; Extension Business</w:t>
             </w:r>
           </w:p>
         </w:tc>
@@ -335,7 +335,7 @@
                 <w:color w:val="0F172A"/>
                 <w:sz w:val="19"/>
               </w:rPr>
-              <w:t xml:space="preserve">   1.5 L'Opportunité Historique : Les 30 Md€ de l'UE &amp; Les 7 AI Gigafactories</w:t>
+              <w:t xml:space="preserve">   1.5 L'Opportunité Historique : 30 Md€ UE &amp; 7 AI Gigafactories</w:t>
             </w:r>
           </w:p>
         </w:tc>
@@ -376,7 +376,7 @@
                 <w:color w:val="0F172A"/>
                 <w:sz w:val="19"/>
               </w:rPr>
-              <w:t xml:space="preserve">   1.6 La Doctrine Stratégique Nice IA : 3 Choix Clairs</w:t>
+              <w:t xml:space="preserve">   1.6 Structuration Opérationnelle &amp; Capture des Subventions</w:t>
             </w:r>
           </w:p>
         </w:tc>
@@ -417,7 +417,7 @@
                 <w:color w:val="0F172A"/>
                 <w:sz w:val="19"/>
               </w:rPr>
-              <w:t>2. Pôle 1 : Axe Ville de Nice (Proximité, Sécurité &amp; Cadre de Vie)</w:t>
+              <w:t>2. Pôle 1 : Axe Ville de Nice (Sécurité &amp; Cadre de Vie)</w:t>
             </w:r>
           </w:p>
         </w:tc>
@@ -458,7 +458,7 @@
                 <w:color w:val="0F172A"/>
                 <w:sz w:val="19"/>
               </w:rPr>
-              <w:t xml:space="preserve">   2.1 CSU Augmenté &amp; Vidéoprotection VSA (-65 % d'Incivilités)</w:t>
+              <w:t xml:space="preserve">   2.1 CSU Augmenté : Moins d'Écrans, Plus de Policiers dans la Rue</w:t>
             </w:r>
           </w:p>
         </w:tc>
@@ -499,7 +499,7 @@
                 <w:color w:val="0F172A"/>
                 <w:sz w:val="19"/>
               </w:rPr>
-              <w:t xml:space="preserve">   2.2 Guichet Vocal Allo Niçois Séniors 24/7 (Agent Vocal Souverain)</w:t>
+              <w:t xml:space="preserve">   2.2 Guichet Vocal Allo Niçois 24/7 : Demandes d'Aide &amp; Sécurité</w:t>
             </w:r>
           </w:p>
         </w:tc>
@@ -540,7 +540,7 @@
                 <w:color w:val="0F172A"/>
                 <w:sz w:val="19"/>
               </w:rPr>
-              <w:t xml:space="preserve">   2.3 Propreté Augmentée &amp; Routage Intelligent de la Voie Publique</w:t>
+              <w:t xml:space="preserve">   2.3 Propreté Augmentée &amp; Routage Voie Publique</w:t>
             </w:r>
           </w:p>
         </w:tc>
@@ -581,7 +581,7 @@
                 <w:color w:val="0F172A"/>
                 <w:sz w:val="19"/>
               </w:rPr>
-              <w:t>3. Pôle 2 : Axe Métropole Nice Côte d'Azur (Budget, Cyber &amp; Monaco)</w:t>
+              <w:t xml:space="preserve">   2.4 Consultation Directe par Quartier via l'IA Einstein</w:t>
             </w:r>
           </w:p>
         </w:tc>
@@ -622,7 +622,7 @@
                 <w:color w:val="0F172A"/>
                 <w:sz w:val="19"/>
               </w:rPr>
-              <w:t xml:space="preserve">   3.1 Audit IA de la Commande Publique Métropolitaine (+2,5 M€ / an Net)</w:t>
+              <w:t>3. Pôle 2 : Axe Métropole Nice Côte d'Azur (Budget &amp; Monaco)</w:t>
             </w:r>
           </w:p>
         </w:tc>
@@ -642,7 +642,7 @@
                 <w:color w:val="64748B"/>
                 <w:sz w:val="18"/>
               </w:rPr>
-              <w:t>Page 6</w:t>
+              <w:t>Page 7</w:t>
             </w:r>
           </w:p>
         </w:tc>
@@ -663,7 +663,7 @@
                 <w:color w:val="0F172A"/>
                 <w:sz w:val="19"/>
               </w:rPr>
-              <w:t xml:space="preserve">   3.2 Bouclier Cybersécurité IA NIS 2 (1,8 M€ à 3 M€ Évités)</w:t>
+              <w:t xml:space="preserve">   3.1 Audit IA Commande Publique (+2,5 M€ / an Net)</w:t>
             </w:r>
           </w:p>
         </w:tc>
@@ -704,7 +704,7 @@
                 <w:color w:val="0F172A"/>
                 <w:sz w:val="19"/>
               </w:rPr>
-              <w:t xml:space="preserve">   3.3 Alliance Monaco Cloud &amp; Data Center Souverain (1,5 M€ à 2,8 M€ / an)</w:t>
+              <w:t xml:space="preserve">   3.2 Bouclier Cyber-IA NIS 2 (1,8 M€ à 3 M€ Évités)</w:t>
             </w:r>
           </w:p>
         </w:tc>
@@ -745,89 +745,7 @@
                 <w:color w:val="0F172A"/>
                 <w:sz w:val="19"/>
               </w:rPr>
-              <w:t>4. Alliance Binationale Nice-Monaco &amp; Zone Franche Numérique</w:t>
-            </w:r>
-          </w:p>
-        </w:tc>
-        <w:tc>
-          <w:tcPr>
-            <w:tcW w:type="dxa" w:w="4824"/>
-            <w:shd w:fill="FFFFFF"/>
-          </w:tcPr>
-          <w:p>
-            <w:pPr>
-              <w:spacing w:before="40" w:after="40"/>
-              <w:jc w:val="right"/>
-            </w:pPr>
-            <w:r>
-              <w:rPr>
-                <w:i/>
-                <w:color w:val="64748B"/>
-                <w:sz w:val="18"/>
-              </w:rPr>
-              <w:t>Page 7</w:t>
-            </w:r>
-          </w:p>
-        </w:tc>
-      </w:tr>
-      <w:tr>
-        <w:tc>
-          <w:tcPr>
-            <w:tcW w:type="dxa" w:w="4824"/>
-            <w:shd w:fill="F8FAFC"/>
-          </w:tcPr>
-          <w:p>
-            <w:pPr>
-              <w:spacing w:before="40" w:after="40"/>
-            </w:pPr>
-            <w:r>
-              <w:rPr>
-                <w:b/>
-                <w:color w:val="0F172A"/>
-                <w:sz w:val="19"/>
-              </w:rPr>
-              <w:t xml:space="preserve">   4.1 La Zone Franche Numérique Transfrontalière (Attraction PME &amp; Startups)</w:t>
-            </w:r>
-          </w:p>
-        </w:tc>
-        <w:tc>
-          <w:tcPr>
-            <w:tcW w:type="dxa" w:w="4824"/>
-            <w:shd w:fill="F8FAFC"/>
-          </w:tcPr>
-          <w:p>
-            <w:pPr>
-              <w:spacing w:before="40" w:after="40"/>
-              <w:jc w:val="right"/>
-            </w:pPr>
-            <w:r>
-              <w:rPr>
-                <w:i/>
-                <w:color w:val="64748B"/>
-                <w:sz w:val="18"/>
-              </w:rPr>
-              <w:t>Page 7</w:t>
-            </w:r>
-          </w:p>
-        </w:tc>
-      </w:tr>
-      <w:tr>
-        <w:tc>
-          <w:tcPr>
-            <w:tcW w:type="dxa" w:w="4824"/>
-            <w:shd w:fill="FFFFFF"/>
-          </w:tcPr>
-          <w:p>
-            <w:pPr>
-              <w:spacing w:before="40" w:after="40"/>
-            </w:pPr>
-            <w:r>
-              <w:rPr>
-                <w:b/>
-                <w:color w:val="0F172A"/>
-                <w:sz w:val="19"/>
-              </w:rPr>
-              <w:t xml:space="preserve">   4.2 Le Hub d'Incertitude Zéro &amp; Labellisation AI Act</w:t>
+              <w:t xml:space="preserve">   3.3 Monaco Cloud &amp; Redondance IT (1,5 M€ à 2,8 M€ / an)</w:t>
             </w:r>
           </w:p>
         </w:tc>
@@ -868,7 +786,7 @@
                 <w:color w:val="0F172A"/>
                 <w:sz w:val="19"/>
               </w:rPr>
-              <w:t>5. Gouvernance, Déploiement &amp; Feuille de Route 36 Mois</w:t>
+              <w:t>4. Alliance Binationale Nice-Monaco &amp; Hub Réglementaire</w:t>
             </w:r>
           </w:p>
         </w:tc>
@@ -909,7 +827,89 @@
                 <w:color w:val="0F172A"/>
                 <w:sz w:val="19"/>
               </w:rPr>
-              <w:t>6. Annexe : Validation Juridique, Statistique et Références Documentaires Complètes</w:t>
+              <w:t xml:space="preserve">   4.1 Levier Binational : Clé de Voûte des Financements Européens</w:t>
+            </w:r>
+          </w:p>
+        </w:tc>
+        <w:tc>
+          <w:tcPr>
+            <w:tcW w:type="dxa" w:w="4824"/>
+            <w:shd w:fill="FFFFFF"/>
+          </w:tcPr>
+          <w:p>
+            <w:pPr>
+              <w:spacing w:before="40" w:after="40"/>
+              <w:jc w:val="right"/>
+            </w:pPr>
+            <w:r>
+              <w:rPr>
+                <w:i/>
+                <w:color w:val="64748B"/>
+                <w:sz w:val="18"/>
+              </w:rPr>
+              <w:t>Page 8</w:t>
+            </w:r>
+          </w:p>
+        </w:tc>
+      </w:tr>
+      <w:tr>
+        <w:tc>
+          <w:tcPr>
+            <w:tcW w:type="dxa" w:w="4824"/>
+            <w:shd w:fill="F8FAFC"/>
+          </w:tcPr>
+          <w:p>
+            <w:pPr>
+              <w:spacing w:before="40" w:after="40"/>
+            </w:pPr>
+            <w:r>
+              <w:rPr>
+                <w:b/>
+                <w:color w:val="0F172A"/>
+                <w:sz w:val="19"/>
+              </w:rPr>
+              <w:t xml:space="preserve">   4.2 Nice, Centre d'Expertise AI Act de Référence pour la France</w:t>
+            </w:r>
+          </w:p>
+        </w:tc>
+        <w:tc>
+          <w:tcPr>
+            <w:tcW w:type="dxa" w:w="4824"/>
+            <w:shd w:fill="F8FAFC"/>
+          </w:tcPr>
+          <w:p>
+            <w:pPr>
+              <w:spacing w:before="40" w:after="40"/>
+              <w:jc w:val="right"/>
+            </w:pPr>
+            <w:r>
+              <w:rPr>
+                <w:i/>
+                <w:color w:val="64748B"/>
+                <w:sz w:val="18"/>
+              </w:rPr>
+              <w:t>Page 9</w:t>
+            </w:r>
+          </w:p>
+        </w:tc>
+      </w:tr>
+      <w:tr>
+        <w:tc>
+          <w:tcPr>
+            <w:tcW w:type="dxa" w:w="4824"/>
+            <w:shd w:fill="FFFFFF"/>
+          </w:tcPr>
+          <w:p>
+            <w:pPr>
+              <w:spacing w:before="40" w:after="40"/>
+            </w:pPr>
+            <w:r>
+              <w:rPr>
+                <w:b/>
+                <w:color w:val="0F172A"/>
+                <w:sz w:val="19"/>
+              </w:rPr>
+              <w:t>5. Gouvernance, Direction de Projet &amp; Jalons Gigafactory</w:t>
             </w:r>
           </w:p>
         </w:tc>
@@ -930,6 +930,129 @@
                 <w:sz w:val="18"/>
               </w:rPr>
               <w:t>Page 9</w:t>
+            </w:r>
+          </w:p>
+        </w:tc>
+      </w:tr>
+      <w:tr>
+        <w:tc>
+          <w:tcPr>
+            <w:tcW w:type="dxa" w:w="4824"/>
+            <w:shd w:fill="F8FAFC"/>
+          </w:tcPr>
+          <w:p>
+            <w:pPr>
+              <w:spacing w:before="40" w:after="40"/>
+            </w:pPr>
+            <w:r>
+              <w:rPr>
+                <w:b/>
+                <w:color w:val="0F172A"/>
+                <w:sz w:val="19"/>
+              </w:rPr>
+              <w:t xml:space="preserve">   5.1 Présidence Éric Ciotti &amp; Direction Benoît SIGWALD</w:t>
+            </w:r>
+          </w:p>
+        </w:tc>
+        <w:tc>
+          <w:tcPr>
+            <w:tcW w:type="dxa" w:w="4824"/>
+            <w:shd w:fill="F8FAFC"/>
+          </w:tcPr>
+          <w:p>
+            <w:pPr>
+              <w:spacing w:before="40" w:after="40"/>
+              <w:jc w:val="right"/>
+            </w:pPr>
+            <w:r>
+              <w:rPr>
+                <w:i/>
+                <w:color w:val="64748B"/>
+                <w:sz w:val="18"/>
+              </w:rPr>
+              <w:t>Page 9</w:t>
+            </w:r>
+          </w:p>
+        </w:tc>
+      </w:tr>
+      <w:tr>
+        <w:tc>
+          <w:tcPr>
+            <w:tcW w:type="dxa" w:w="4824"/>
+            <w:shd w:fill="FFFFFF"/>
+          </w:tcPr>
+          <w:p>
+            <w:pPr>
+              <w:spacing w:before="40" w:after="40"/>
+            </w:pPr>
+            <w:r>
+              <w:rPr>
+                <w:b/>
+                <w:color w:val="0F172A"/>
+                <w:sz w:val="19"/>
+              </w:rPr>
+              <w:t xml:space="preserve">   5.2 Feuille de Route Réaliste Synchronisée AI Gigafactory</w:t>
+            </w:r>
+          </w:p>
+        </w:tc>
+        <w:tc>
+          <w:tcPr>
+            <w:tcW w:type="dxa" w:w="4824"/>
+            <w:shd w:fill="FFFFFF"/>
+          </w:tcPr>
+          <w:p>
+            <w:pPr>
+              <w:spacing w:before="40" w:after="40"/>
+              <w:jc w:val="right"/>
+            </w:pPr>
+            <w:r>
+              <w:rPr>
+                <w:i/>
+                <w:color w:val="64748B"/>
+                <w:sz w:val="18"/>
+              </w:rPr>
+              <w:t>Page 10</w:t>
+            </w:r>
+          </w:p>
+        </w:tc>
+      </w:tr>
+      <w:tr>
+        <w:tc>
+          <w:tcPr>
+            <w:tcW w:type="dxa" w:w="4824"/>
+            <w:shd w:fill="F8FAFC"/>
+          </w:tcPr>
+          <w:p>
+            <w:pPr>
+              <w:spacing w:before="40" w:after="40"/>
+            </w:pPr>
+            <w:r>
+              <w:rPr>
+                <w:b/>
+                <w:color w:val="0F172A"/>
+                <w:sz w:val="19"/>
+              </w:rPr>
+              <w:t>6. Annexe : Justifications des Gains &amp; Sources Documentaires</w:t>
+            </w:r>
+          </w:p>
+        </w:tc>
+        <w:tc>
+          <w:tcPr>
+            <w:tcW w:type="dxa" w:w="4824"/>
+            <w:shd w:fill="F8FAFC"/>
+          </w:tcPr>
+          <w:p>
+            <w:pPr>
+              <w:spacing w:before="40" w:after="40"/>
+              <w:jc w:val="right"/>
+            </w:pPr>
+            <w:r>
+              <w:rPr>
+                <w:i/>
+                <w:color w:val="64748B"/>
+                <w:sz w:val="18"/>
+              </w:rPr>
+              <w:t>Page 10</w:t>
             </w:r>
           </w:p>
         </w:tc>
@@ -978,6 +1101,32 @@
           <w:color w:val="0F172A"/>
         </w:rPr>
         <w:t>l'usage concret, la sécurité publique, la souveraineté et la rigueur budgétaire</w:t>
+      </w:r>
+      <w:r>
+        <w:rPr>
+          <w:color w:val="1E293B"/>
+        </w:rPr>
+        <w:t xml:space="preserve">, en </w:t>
+      </w:r>
+      <w:r>
+        <w:rPr>
+          <w:b/>
+          <w:color w:val="0F172A"/>
+        </w:rPr>
+        <w:t>maximisant nos atouts phares comme Sophia Antipolis</w:t>
+      </w:r>
+      <w:r>
+        <w:rPr>
+          <w:color w:val="1E293B"/>
+        </w:rPr>
+        <w:t xml:space="preserve"> et en </w:t>
+      </w:r>
+      <w:r>
+        <w:rPr>
+          <w:b/>
+          <w:color w:val="0F172A"/>
+        </w:rPr>
+        <w:t>resserrant les liens industriels et souverains avec Monaco</w:t>
       </w:r>
       <w:r>
         <w:rPr>
@@ -1158,7 +1307,7 @@
                 <w:color w:val="1E293B"/>
                 <w:sz w:val="17"/>
               </w:rPr>
-              <w:t>Intervention PM &lt; 6 min.</w:t>
+              <w:t>Moins d'écrans, plus de PM en rue.</w:t>
             </w:r>
           </w:p>
         </w:tc>
@@ -1522,7 +1671,7 @@
           <w:color w:val="0F172A"/>
           <w:sz w:val="30"/>
         </w:rPr>
-        <w:t>1. Où en sommes-nous ? État des lieux &amp; Diagnostic Territorial</w:t>
+        <w:t>1. Diagnostic Territorial &amp; Opportunités Européennes</w:t>
       </w:r>
     </w:p>
     <w:p>
@@ -1537,7 +1686,7 @@
           <w:color w:val="1E3A8A"/>
           <w:sz w:val="25"/>
         </w:rPr>
-        <w:t>1.1 Contexte national &amp; régional : Blocages politiques &amp; Urgence d'un Leadership Unifié</w:t>
+        <w:t>1.1 Frictions Régionales &amp; Leadership Métropolitain</w:t>
       </w:r>
     </w:p>
     <w:p>
@@ -1691,7 +1840,7 @@
           <w:color w:val="1E3A8A"/>
           <w:sz w:val="25"/>
         </w:rPr>
-        <w:t>1.2 Le terreau niçois : Un actif exceptionnel en France</w:t>
+        <w:t>1.2 Le Terreau Azuréen : Sophia Antipolis, Grasse &amp; Cannes</w:t>
       </w:r>
     </w:p>
     <w:p>
@@ -1710,7 +1859,7 @@
         <w:rPr>
           <w:color w:val="1E293B"/>
         </w:rPr>
-        <w:t xml:space="preserve"> : ~2 700 entreprises, ~46 000 emplois, ~5 500 chercheurs.</w:t>
+        <w:t xml:space="preserve"> : ~2 700 entreprises, ~46 000 emplois, ~5 500 chercheurs. Un réservoir mondial d'ingénierie et de recherche d'élite.</w:t>
       </w:r>
     </w:p>
     <w:p>
@@ -1723,13 +1872,13 @@
           <w:b/>
           <w:color w:val="0F172A"/>
         </w:rPr>
-        <w:t>Institut 3IA Côte d’Azur</w:t>
+        <w:t>Institut 3IA Côte d’Azur &amp; UCA</w:t>
       </w:r>
       <w:r>
         <w:rPr>
           <w:color w:val="1E293B"/>
         </w:rPr>
-        <w:t xml:space="preserve"> : L'un des 4 instituts nationaux d'IA (spécialisé en santé numérique).</w:t>
+        <w:t xml:space="preserve"> : L'un des 4 instituts nationaux d'IA (spécialisé en santé numérique) avec Inria, Eurecom et le CNRS.</w:t>
       </w:r>
     </w:p>
     <w:p>
@@ -1742,13 +1891,63 @@
           <w:b/>
           <w:color w:val="0F172A"/>
         </w:rPr>
-        <w:t>Pipeline académique complet</w:t>
+        <w:t>Synergies Industrielles Grasse &amp; Cannes</w:t>
       </w:r>
       <w:r>
         <w:rPr>
           <w:color w:val="1E293B"/>
         </w:rPr>
-        <w:t xml:space="preserve"> : Université Côte d'Azur (UCA), Inria, Eurecom, CNRS (du Master au Doctorat).</w:t>
+        <w:t xml:space="preserve"> :</w:t>
+      </w:r>
+    </w:p>
+    <w:p>
+      <w:pPr>
+        <w:pStyle w:val="ListBullet"/>
+        <w:spacing w:before="40" w:after="100" w:line="276" w:lineRule="auto"/>
+      </w:pPr>
+      <w:r>
+        <w:rPr>
+          <w:color w:val="1E293B"/>
+        </w:rPr>
+        <w:t xml:space="preserve">  - </w:t>
+      </w:r>
+      <w:r>
+        <w:rPr>
+          <w:b/>
+          <w:color w:val="0F172A"/>
+        </w:rPr>
+        <w:t>Grasse (Chimie fine &amp; Arômes/Parfums)</w:t>
+      </w:r>
+      <w:r>
+        <w:rPr>
+          <w:color w:val="1E293B"/>
+        </w:rPr>
+        <w:t xml:space="preserve"> : Modélisation olfactive et IA sensorielle pour l'industrie aromatique et la santé.</w:t>
+      </w:r>
+    </w:p>
+    <w:p>
+      <w:pPr>
+        <w:pStyle w:val="ListBullet"/>
+        <w:spacing w:before="40" w:after="100" w:line="276" w:lineRule="auto"/>
+      </w:pPr>
+      <w:r>
+        <w:rPr>
+          <w:color w:val="1E293B"/>
+        </w:rPr>
+        <w:t xml:space="preserve">  - </w:t>
+      </w:r>
+      <w:r>
+        <w:rPr>
+          <w:b/>
+          <w:color w:val="0F172A"/>
+        </w:rPr>
+        <w:t>Cannes (Thales Alenia Space)</w:t>
+      </w:r>
+      <w:r>
+        <w:rPr>
+          <w:color w:val="1E293B"/>
+        </w:rPr>
+        <w:t xml:space="preserve"> : Traitement d'imagerie satellite par IA, observation de la Terre et défense spatiale.</w:t>
       </w:r>
     </w:p>
     <w:p>
@@ -1761,45 +1960,7 @@
           <w:b/>
           <w:color w:val="0F172A"/>
         </w:rPr>
-        <w:t>Monaco Cloud &amp; Data Center Souverain d'État</w:t>
-      </w:r>
-      <w:r>
-        <w:rPr>
-          <w:color w:val="1E293B"/>
-        </w:rPr>
-        <w:t xml:space="preserve"> : Premier Cloud d'État souverain d'Europe (certifié AMSN), garantissant une étanchéité totale contre le Cloud Act américain, connecté en fibre noire dédiée à Nice.</w:t>
-      </w:r>
-    </w:p>
-    <w:p>
-      <w:pPr>
-        <w:pStyle w:val="ListBullet"/>
-        <w:spacing w:before="40" w:after="100" w:line="276" w:lineRule="auto"/>
-      </w:pPr>
-      <w:r>
-        <w:rPr>
-          <w:b/>
-          <w:color w:val="0F172A"/>
-        </w:rPr>
-        <w:t>Le levier Zone Franche Numérique Nice-Monaco</w:t>
-      </w:r>
-      <w:r>
-        <w:rPr>
-          <w:color w:val="1E293B"/>
-        </w:rPr>
-        <w:t xml:space="preserve"> : Création d'une zone d'expérimentation fiscale et réglementaire transfrontalière privilégiée pour attirer et retenir les PME, startups et licornes de l'IA.</w:t>
-      </w:r>
-    </w:p>
-    <w:p>
-      <w:pPr>
-        <w:pStyle w:val="ListBullet"/>
-        <w:spacing w:before="40" w:after="100" w:line="276" w:lineRule="auto"/>
-      </w:pPr>
-      <w:r>
-        <w:rPr>
-          <w:b/>
-          <w:color w:val="0F172A"/>
-        </w:rPr>
-        <w:t>Grands industriels ancres riches en données</w:t>
+        <w:t>Grands industriels ancres</w:t>
       </w:r>
       <w:r>
         <w:rPr>
@@ -1818,20 +1979,7 @@
         <w:rPr>
           <w:color w:val="1E293B"/>
         </w:rPr>
-        <w:t xml:space="preserve"> (1er centre de R&amp;D privé de transport en Europe), </w:t>
-      </w:r>
-      <w:r>
-        <w:rPr>
-          <w:b/>
-          <w:color w:val="0F172A"/>
-        </w:rPr>
-        <w:t>Thales Alenia Space</w:t>
-      </w:r>
-      <w:r>
-        <w:rPr>
-          <w:color w:val="1E293B"/>
-        </w:rPr>
-        <w:t xml:space="preserve"> Cannes (spatial &amp; observation satellite), santé, arômes-parfums (Grasse), maritime.</w:t>
+        <w:t xml:space="preserve"> (1er centre de R&amp;D privé de transport en Europe), générateurs de données massives.</w:t>
       </w:r>
     </w:p>
     <w:p>
@@ -1844,13 +1992,13 @@
           <w:b/>
           <w:color w:val="0F172A"/>
         </w:rPr>
-        <w:t>Attractivité &amp; 2e aéroport de France</w:t>
+        <w:t>Attractivité Riviera &amp; 2e aéroport de France</w:t>
       </w:r>
       <w:r>
         <w:rPr>
           <w:color w:val="1E293B"/>
         </w:rPr>
-        <w:t xml:space="preserve"> : La « carte Riviera » permet de capter et retenir les chercheurs d'élite que Paris peine à conserver.</w:t>
+        <w:t xml:space="preserve"> : Capacité unique de captation et de rétention des chercheurs d'élite que Paris ne conserve plus.</w:t>
       </w:r>
     </w:p>
     <w:p>
@@ -1905,7 +2053,7 @@
           <w:color w:val="1E3A8A"/>
           <w:sz w:val="25"/>
         </w:rPr>
-        <w:t>1.3 Évaluation du Pôle Nice - Sophia Antipolis - Monaco vs Total National Français</w:t>
+        <w:t>1.3 Évaluation du Pôle Nice - Sophia Antipolis - Monaco vs Total National</w:t>
       </w:r>
     </w:p>
     <w:p>
@@ -2030,25 +2178,6 @@
     </w:p>
     <w:p>
       <w:pPr>
-        <w:pStyle w:val="ListBullet"/>
-        <w:spacing w:before="40" w:after="100" w:line="276" w:lineRule="auto"/>
-      </w:pPr>
-      <w:r>
-        <w:rPr>
-          <w:b/>
-          <w:color w:val="0F172A"/>
-        </w:rPr>
-        <w:t>Infrastructures Cloud Souveraines</w:t>
-      </w:r>
-      <w:r>
-        <w:rPr>
-          <w:color w:val="1E293B"/>
-        </w:rPr>
-        <w:t xml:space="preserve"> : Monaco Cloud (1er Cloud d'État UE), seul hub souverain binational conforme AMSN &amp; NIS 2.</w:t>
-      </w:r>
-    </w:p>
-    <w:p>
-      <w:pPr>
         <w:keepNext/>
         <w:spacing w:before="280" w:after="120"/>
       </w:pPr>
@@ -2059,7 +2188,64 @@
           <w:color w:val="1E3A8A"/>
           <w:sz w:val="25"/>
         </w:rPr>
-        <w:t>1.4 Les atouts, contraintes et le levier d'extension de la filière IA</w:t>
+        <w:t>1.4 Atouts Monaco, Flux Transfrontaliers &amp; Extension Business</w:t>
+      </w:r>
+    </w:p>
+    <w:p>
+      <w:pPr>
+        <w:pStyle w:val="ListBullet"/>
+        <w:spacing w:before="40" w:after="100" w:line="276" w:lineRule="auto"/>
+      </w:pPr>
+      <w:r>
+        <w:rPr>
+          <w:b/>
+          <w:color w:val="0F172A"/>
+        </w:rPr>
+        <w:t>Monaco Cloud &amp; Data Center Souverain d'État</w:t>
+      </w:r>
+      <w:r>
+        <w:rPr>
+          <w:color w:val="1E293B"/>
+        </w:rPr>
+        <w:t xml:space="preserve"> : Premier Cloud d'État souverain d'Europe (certifié AMSN), garantissant une étanchéité totale contre le Cloud Act américain et relié en fibre noire dédiée à Nice.</w:t>
+      </w:r>
+    </w:p>
+    <w:p>
+      <w:pPr>
+        <w:pStyle w:val="ListBullet"/>
+        <w:spacing w:before="40" w:after="100" w:line="276" w:lineRule="auto"/>
+      </w:pPr>
+      <w:r>
+        <w:rPr>
+          <w:b/>
+          <w:color w:val="0F172A"/>
+        </w:rPr>
+        <w:t>Besoin d'extension de la Principauté pour le business</w:t>
+      </w:r>
+      <w:r>
+        <w:rPr>
+          <w:color w:val="1E293B"/>
+        </w:rPr>
+        <w:t xml:space="preserve"> : Monaco dispose d'un capital et d'un tissu d'entreprises majeurs mais souffre d'une contrainte foncière extrême. L'alliance avec la Métropole Nice Côte d'Azur offre le terrain d'extension économique et technologique indispensable.</w:t>
+      </w:r>
+    </w:p>
+    <w:p>
+      <w:pPr>
+        <w:pStyle w:val="ListBullet"/>
+        <w:spacing w:before="40" w:after="100" w:line="276" w:lineRule="auto"/>
+      </w:pPr>
+      <w:r>
+        <w:rPr>
+          <w:b/>
+          <w:color w:val="0F172A"/>
+        </w:rPr>
+        <w:t>45 000 salariés transfrontaliers quotidiens</w:t>
+      </w:r>
+      <w:r>
+        <w:rPr>
+          <w:color w:val="1E293B"/>
+        </w:rPr>
+        <w:t xml:space="preserve"> : Plus de 45 000 salariés traversent chaque jour Nice pour travailler à Monaco (sources INSEE/SCT), constituant un bassin d'emploi unique à irriguer par l'IA.</w:t>
       </w:r>
     </w:p>
     <w:p>
@@ -2078,7 +2264,7 @@
         <w:rPr>
           <w:color w:val="1E293B"/>
         </w:rPr>
-        <w:t xml:space="preserve"> : ~86 établissements pionniers et ~800 emplois directs IA dans les Alpes-Maritimes (étude CCI). Un socle solide de compétences qui ne demande qu'à être amplifié et structuré pour passer à l'échelle métropolitaine et européenne.</w:t>
+        <w:t xml:space="preserve"> : ~86 établissements pionniers et ~800 emplois directs IA dans le 06 (étude CCI). Un socle solide qui ne demande qu'à être amplifié et structuré pour passer à l'échelle métropolitaine.</w:t>
       </w:r>
     </w:p>
     <w:p>
@@ -2091,51 +2277,13 @@
           <w:b/>
           <w:color w:val="0F172A"/>
         </w:rPr>
-        <w:t>Le verrou électrique</w:t>
+        <w:t>Le verrou électrique &amp; contrainte foncière</w:t>
       </w:r>
       <w:r>
         <w:rPr>
           <w:color w:val="1E293B"/>
         </w:rPr>
-        <w:t xml:space="preserve"> : Extrémité d'une « presqu'île électrique » vulnérable (coupure majeure en 2009 ; capacité RTE/CNDP 2025 saturée). Justification technique clé de l'IA frugale par nécessité.</w:t>
-      </w:r>
-    </w:p>
-    <w:p>
-      <w:pPr>
-        <w:pStyle w:val="ListBullet"/>
-        <w:spacing w:before="40" w:after="100" w:line="276" w:lineRule="auto"/>
-      </w:pPr>
-      <w:r>
-        <w:rPr>
-          <w:b/>
-          <w:color w:val="0F172A"/>
-        </w:rPr>
-        <w:t>Foncier contraint</w:t>
-      </w:r>
-      <w:r>
-        <w:rPr>
-          <w:color w:val="1E293B"/>
-        </w:rPr>
-        <w:t xml:space="preserve"> : Mer et montagne rendent impossible l'accueil de campus de calcul hyperscale, imposant la valorisation de la densité algorithmique et du supercalcul souverain.</w:t>
-      </w:r>
-    </w:p>
-    <w:p>
-      <w:pPr>
-        <w:pStyle w:val="ListBullet"/>
-        <w:spacing w:before="40" w:after="100" w:line="276" w:lineRule="auto"/>
-      </w:pPr>
-      <w:r>
-        <w:rPr>
-          <w:b/>
-          <w:color w:val="0F172A"/>
-        </w:rPr>
-        <w:t>L'élimination du « cimetière des POC »</w:t>
-      </w:r>
-      <w:r>
-        <w:rPr>
-          <w:color w:val="1E293B"/>
-        </w:rPr>
-        <w:t xml:space="preserve"> : Remplacer la multiplication de prototypes sans suite par une méthodologie stricte d'industrialisation (LLMOps, sécurité, AI Act).</w:t>
+        <w:t xml:space="preserve"> : Extrémité d'une « presqu'île électrique » vulnérable (coupure de 2009 ; RTE 2025 saturé), imposant la doctrine de l'IA frugale par nécessité.</w:t>
       </w:r>
     </w:p>
     <w:p>
@@ -2150,7 +2298,7 @@
           <w:color w:val="1E3A8A"/>
           <w:sz w:val="25"/>
         </w:rPr>
-        <w:t>1.5 L'Opportunité Historique : Les 30 Md€ de l'UE &amp; Les 7 AI Gigafactories</w:t>
+        <w:t>1.5 L'Opportunité Historique : 30 Md€ UE &amp; 7 AI Gigafactories</w:t>
       </w:r>
     </w:p>
     <w:p>
@@ -2174,7 +2322,7 @@
         <w:rPr>
           <w:color w:val="1E293B"/>
         </w:rPr>
-        <w:t xml:space="preserve">, la Commission Européenne a officiellement lancé un appel d'offres historique de </w:t>
+        <w:t xml:space="preserve">, la Commission Européenne a lancé un appel d'offres historique de </w:t>
       </w:r>
       <w:r>
         <w:rPr>
@@ -2304,7 +2452,18 @@
           <w:color w:val="1E3A8A"/>
           <w:sz w:val="25"/>
         </w:rPr>
-        <w:t>1.6 La Doctrine Stratégique Nice IA : 3 Choix Clairs</w:t>
+        <w:t>1.6 Structuration Opérationnelle &amp; Capture des Subventions</w:t>
+      </w:r>
+    </w:p>
+    <w:p>
+      <w:pPr>
+        <w:spacing w:before="60" w:after="160" w:line="288" w:lineRule="auto"/>
+      </w:pPr>
+      <w:r>
+        <w:rPr>
+          <w:color w:val="1E293B"/>
+        </w:rPr>
+        <w:t>Pour transformer cette ambition en victoires financières, l'approche doit être structurée immédiatement selon 4 actions de frappe :</w:t>
       </w:r>
     </w:p>
     <w:p>
@@ -2317,13 +2476,13 @@
           <w:b/>
           <w:color w:val="0F172A"/>
         </w:rPr>
-        <w:t>1. Renoncer à l'hyperscale, assumer l’IA frugale</w:t>
+        <w:t>1. Bureau de Candidature Binationale</w:t>
       </w:r>
       <w:r>
         <w:rPr>
           <w:color w:val="1E293B"/>
         </w:rPr>
-        <w:t xml:space="preserve"> : Sobriété énergétique, cas d'usage utiles et sécurité maximale (conforme AI Act).</w:t>
+        <w:t xml:space="preserve"> : Création d'une Task-Force dédiée Nice-Monaco-Sophia pour verrouiller le dossier Gigafactory avant le 12 novembre 2026.</w:t>
       </w:r>
     </w:p>
     <w:p>
@@ -2336,13 +2495,13 @@
           <w:b/>
           <w:color w:val="0F172A"/>
         </w:rPr>
-        <w:t>2. Occuper les 2 vides délaissés</w:t>
+        <w:t>2. Capture des guichets de subvention directes</w:t>
       </w:r>
       <w:r>
         <w:rPr>
           <w:color w:val="1E293B"/>
         </w:rPr>
-        <w:t xml:space="preserve"> : Adoption PME (commerce, tourisme, santé) et Industrialisation / LLMOps.</w:t>
+        <w:t xml:space="preserve"> : Dépôt de dossiers sur Digital Europe (subventions à 50%-70% pour la cyber/IA) et Horizon Europe Cluster 3 (100% pour la sécurité urbaine).</w:t>
       </w:r>
     </w:p>
     <w:p>
@@ -2355,13 +2514,32 @@
           <w:b/>
           <w:color w:val="0F172A"/>
         </w:rPr>
-        <w:t>3. La Ville client n°1</w:t>
+        <w:t>3. Renoncement à l'hyperscale, affirmation de l’IA frugale</w:t>
       </w:r>
       <w:r>
         <w:rPr>
           <w:color w:val="1E293B"/>
         </w:rPr>
-        <w:t xml:space="preserve"> : 5 cas d'usage municipaux industrialisés en 24 mois pour faire la preuve de la valeur et ancrer le récit politique.</w:t>
+        <w:t xml:space="preserve"> : Sobriété énergétique, sécurité maximale et cas d'usage utiles conforme AI Act.</w:t>
+      </w:r>
+    </w:p>
+    <w:p>
+      <w:pPr>
+        <w:pStyle w:val="ListBullet"/>
+        <w:spacing w:before="40" w:after="100" w:line="276" w:lineRule="auto"/>
+      </w:pPr>
+      <w:r>
+        <w:rPr>
+          <w:b/>
+          <w:color w:val="0F172A"/>
+        </w:rPr>
+        <w:t>4. La Ville client n°1</w:t>
+      </w:r>
+      <w:r>
+        <w:rPr>
+          <w:color w:val="1E293B"/>
+        </w:rPr>
+        <w:t xml:space="preserve"> : Industrialiser 5 cas d'usage municipaux en 24 mois pour faire la preuve de la valeur et ancrer le récit politique de début de mandat.</w:t>
       </w:r>
     </w:p>
     <w:p>
@@ -2386,13 +2564,124 @@
     </w:p>
     <w:p>
       <w:pPr>
+        <w:keepNext/>
+        <w:spacing w:before="280" w:after="120"/>
+      </w:pPr>
+      <w:r>
+        <w:rPr>
+          <w:rFonts w:ascii="Georgia" w:hAnsi="Georgia"/>
+          <w:b/>
+          <w:color w:val="1E3A8A"/>
+          <w:sz w:val="25"/>
+        </w:rPr>
+        <w:t>2.1 CSU Augmenté : Moins d'Écrans, Plus de Policiers dans la Rue</w:t>
+      </w:r>
+    </w:p>
+    <w:p>
+      <w:pPr>
         <w:spacing w:before="60" w:after="160" w:line="288" w:lineRule="auto"/>
       </w:pPr>
       <w:r>
         <w:rPr>
           <w:color w:val="1E293B"/>
         </w:rPr>
-        <w:t>Le Pôle Ville concentre les applications de l'IA au service direct des Niçois, du cadre de vie et de la tranquillité publique. L'objectif est d'utiliser l'IA comme un accélérateur d'efficacité sur le terrain et de proximité municipale.</w:t>
+        <w:t xml:space="preserve">Nice dispose du 1er CSU de France (4 300+ caméras). L'enjeu clé de la Vidéosurveillance Algorithmique (VSA - Art. 10 Loi JOP 2024 / Jurisprudence Conseil d'État 2026) est un </w:t>
+      </w:r>
+      <w:r>
+        <w:rPr>
+          <w:b/>
+          <w:color w:val="0F172A"/>
+        </w:rPr>
+        <w:t>changement de doctrine opérationnelle majeur</w:t>
+      </w:r>
+      <w:r>
+        <w:rPr>
+          <w:color w:val="1E293B"/>
+        </w:rPr>
+        <w:t xml:space="preserve"> :</w:t>
+      </w:r>
+    </w:p>
+    <w:p>
+      <w:pPr>
+        <w:pStyle w:val="ListBullet"/>
+        <w:spacing w:before="40" w:after="100" w:line="276" w:lineRule="auto"/>
+      </w:pPr>
+      <w:r>
+        <w:rPr>
+          <w:b/>
+          <w:color w:val="0F172A"/>
+        </w:rPr>
+        <w:t>Moins d'agents scotchés devant les écrans</w:t>
+      </w:r>
+      <w:r>
+        <w:rPr>
+          <w:color w:val="1E293B"/>
+        </w:rPr>
+        <w:t xml:space="preserve"> : L'IA effectue le filtrage automatique des flux et ne remonte que les anomalies qualifiées (dépôts sauvages, intrusions, incivilités).</w:t>
+      </w:r>
+    </w:p>
+    <w:p>
+      <w:pPr>
+        <w:pStyle w:val="ListBullet"/>
+        <w:spacing w:before="40" w:after="100" w:line="276" w:lineRule="auto"/>
+      </w:pPr>
+      <w:r>
+        <w:rPr>
+          <w:b/>
+          <w:color w:val="0F172A"/>
+        </w:rPr>
+        <w:t>Plus de Policiers Municipaux sur le terrain et dans la rue</w:t>
+      </w:r>
+      <w:r>
+        <w:rPr>
+          <w:color w:val="1E293B"/>
+        </w:rPr>
+        <w:t xml:space="preserve"> : Libération du temps des opérateurs pour réaffecter les effectifs en patrouilles de proximité physiques.</w:t>
+      </w:r>
+    </w:p>
+    <w:p>
+      <w:pPr>
+        <w:pStyle w:val="ListBullet"/>
+        <w:spacing w:before="40" w:after="100" w:line="276" w:lineRule="auto"/>
+      </w:pPr>
+      <w:r>
+        <w:rPr>
+          <w:b/>
+          <w:color w:val="0F172A"/>
+        </w:rPr>
+        <w:t>Résultat certifié</w:t>
+      </w:r>
+      <w:r>
+        <w:rPr>
+          <w:color w:val="1E293B"/>
+        </w:rPr>
+        <w:t xml:space="preserve"> : Baisse de </w:t>
+      </w:r>
+      <w:r>
+        <w:rPr>
+          <w:b/>
+          <w:color w:val="0F172A"/>
+        </w:rPr>
+        <w:t>65 % des incivilités et dégradations</w:t>
+      </w:r>
+      <w:r>
+        <w:rPr>
+          <w:color w:val="1E293B"/>
+        </w:rPr>
+        <w:t xml:space="preserve"> par la fin de l'impunité et la réduction du délai d'intervention de la PM à </w:t>
+      </w:r>
+      <w:r>
+        <w:rPr>
+          <w:b/>
+          <w:color w:val="0F172A"/>
+        </w:rPr>
+        <w:t>moins de 6 minutes</w:t>
+      </w:r>
+      <w:r>
+        <w:rPr>
+          <w:color w:val="1E293B"/>
+        </w:rPr>
+        <w:t>.</w:t>
       </w:r>
     </w:p>
     <w:p>
@@ -2407,7 +2696,7 @@
           <w:color w:val="1E3A8A"/>
           <w:sz w:val="25"/>
         </w:rPr>
-        <w:t>2.1 Vidéoprotection CSU &amp; Police Municipale Augmentée (-65 % d'Incivilités)</w:t>
+        <w:t>2.2 Guichet Vocal Allo Niçois 24/7 : Demandes d'Aide &amp; Sécurité</w:t>
       </w:r>
     </w:p>
     <w:p>
@@ -2418,116 +2707,7 @@
         <w:rPr>
           <w:color w:val="1E293B"/>
         </w:rPr>
-        <w:t xml:space="preserve">Nice dispose du 1er Centre de Supervision Urbain (CSU) de France avec plus de </w:t>
-      </w:r>
-      <w:r>
-        <w:rPr>
-          <w:b/>
-          <w:color w:val="0F172A"/>
-        </w:rPr>
-        <w:t>4 300 caméras raccordées</w:t>
-      </w:r>
-      <w:r>
-        <w:rPr>
-          <w:color w:val="1E293B"/>
-        </w:rPr>
-        <w:t xml:space="preserve">. L'enjeu est de passer d'une vidéosurveillance passive à une </w:t>
-      </w:r>
-      <w:r>
-        <w:rPr>
-          <w:b/>
-          <w:color w:val="0F172A"/>
-        </w:rPr>
-        <w:t>alerte prédictive en temps réel</w:t>
-      </w:r>
-      <w:r>
-        <w:rPr>
-          <w:color w:val="1E293B"/>
-        </w:rPr>
-        <w:t xml:space="preserve"> grâce à la Vidéosurveillance Algorithmique (VSA) conforme à l'article 10 de la Loi JOP 2024 et validée par la jurisprudence du Conseil d'État (janvier 2026).</w:t>
-      </w:r>
-    </w:p>
-    <w:p>
-      <w:pPr>
-        <w:pStyle w:val="ListBullet"/>
-        <w:spacing w:before="40" w:after="100" w:line="276" w:lineRule="auto"/>
-      </w:pPr>
-      <w:r>
-        <w:rPr>
-          <w:b/>
-          <w:color w:val="0F172A"/>
-        </w:rPr>
-        <w:t>Détection automatique d'incidents</w:t>
-      </w:r>
-      <w:r>
-        <w:rPr>
-          <w:color w:val="1E293B"/>
-        </w:rPr>
-        <w:t xml:space="preserve"> : Alertes automatisées sur dépôts sauvages d'encombrants, dégradations de biens publics, franchissements de périmètres interdits et mouvements de foule suspects.</w:t>
-      </w:r>
-    </w:p>
-    <w:p>
-      <w:pPr>
-        <w:pStyle w:val="ListBullet"/>
-        <w:spacing w:before="40" w:after="100" w:line="276" w:lineRule="auto"/>
-      </w:pPr>
-      <w:r>
-        <w:rPr>
-          <w:b/>
-          <w:color w:val="0F172A"/>
-        </w:rPr>
-        <w:t>Optimisation des patrouilles</w:t>
-      </w:r>
-      <w:r>
-        <w:rPr>
-          <w:color w:val="1E293B"/>
-        </w:rPr>
-        <w:t xml:space="preserve"> : Routage dynamique des équipages de la Police Municipale permettant de diviser par 7 le temps d'intervention (passage de 45 minutes à moins de 6 minutes).</w:t>
-      </w:r>
-    </w:p>
-    <w:p>
-      <w:pPr>
-        <w:pStyle w:val="ListBullet"/>
-        <w:spacing w:before="40" w:after="100" w:line="276" w:lineRule="auto"/>
-      </w:pPr>
-      <w:r>
-        <w:rPr>
-          <w:b/>
-          <w:color w:val="0F172A"/>
-        </w:rPr>
-        <w:t>Garantie absolue des libertés</w:t>
-      </w:r>
-      <w:r>
-        <w:rPr>
-          <w:color w:val="1E293B"/>
-        </w:rPr>
-        <w:t xml:space="preserve"> : Traitement algorithmique strict sans reconnaissance faciale ni profilage individuel biométrique.</w:t>
-      </w:r>
-    </w:p>
-    <w:p>
-      <w:pPr>
-        <w:keepNext/>
-        <w:spacing w:before="280" w:after="120"/>
-      </w:pPr>
-      <w:r>
-        <w:rPr>
-          <w:rFonts w:ascii="Georgia" w:hAnsi="Georgia"/>
-          <w:b/>
-          <w:color w:val="1E3A8A"/>
-          <w:sz w:val="25"/>
-        </w:rPr>
-        <w:t>2.2 Guichet Vocal Allo Niçois Séniors 24/7 (Agent Vocal Souverain)</w:t>
-      </w:r>
-    </w:p>
-    <w:p>
-      <w:pPr>
-        <w:spacing w:before="60" w:after="160" w:line="288" w:lineRule="auto"/>
-      </w:pPr>
-      <w:r>
-        <w:rPr>
-          <w:color w:val="1E293B"/>
-        </w:rPr>
-        <w:t>Mise en place d'un agent vocal souverain basé sur un modèle de langage local de haute précision, dédié à l'écoute et à l'orientation des aînés et citoyens niçois.</w:t>
+        <w:t>Mise en place d'un agent vocal souverain basé sur un modèle de langage local dédié aux citoyens niçois et aux aînés.</w:t>
       </w:r>
     </w:p>
     <w:p>
@@ -2546,7 +2726,33 @@
         <w:rPr>
           <w:color w:val="1E293B"/>
         </w:rPr>
-        <w:t xml:space="preserve"> : Traitement instantané des requêtes administratives récurrentes, des demandes de signalement d'anomalies de voirie et d'information de proximité.</w:t>
+        <w:t xml:space="preserve"> : Prise en charge immédiate des </w:t>
+      </w:r>
+      <w:r>
+        <w:rPr>
+          <w:b/>
+          <w:color w:val="0F172A"/>
+        </w:rPr>
+        <w:t>demandes d'aide d'urgence sociale</w:t>
+      </w:r>
+      <w:r>
+        <w:rPr>
+          <w:color w:val="1E293B"/>
+        </w:rPr>
+        <w:t xml:space="preserve">, des </w:t>
+      </w:r>
+      <w:r>
+        <w:rPr>
+          <w:b/>
+          <w:color w:val="0F172A"/>
+        </w:rPr>
+        <w:t>signalements de sécurité et de proximité</w:t>
+      </w:r>
+      <w:r>
+        <w:rPr>
+          <w:color w:val="1E293B"/>
+        </w:rPr>
+        <w:t xml:space="preserve"> et des démarches administratives.</w:t>
       </w:r>
     </w:p>
     <w:p>
@@ -2565,7 +2771,7 @@
         <w:rPr>
           <w:color w:val="1E293B"/>
         </w:rPr>
-        <w:t xml:space="preserve"> : Absorption de 40 % du volume d'appels entrants aux heures de pointe, libérant les agents humains pour les cas complexes nécessitant un accompagnement social personnalisé.</w:t>
+        <w:t xml:space="preserve"> : Traitement instantané de 40 % des appels récurrents, libérant les agents humains pour l'accompagnement social personnalisé et les urgences graves.</w:t>
       </w:r>
     </w:p>
     <w:p>
@@ -2591,7 +2797,7 @@
         <w:rPr>
           <w:color w:val="1E293B"/>
         </w:rPr>
-        <w:t>Déploiement de caméras embarquées VSA sur la flotte de véhicules de la Direction de la Propreté pour cartographier en continu l'état de la voie publique.</w:t>
+        <w:t>Caméras embarquées VSA sur les véhicules de propreté urbaine pour cartographier en temps réel l'état des rues.</w:t>
       </w:r>
     </w:p>
     <w:p>
@@ -2604,13 +2810,13 @@
           <w:b/>
           <w:color w:val="0F172A"/>
         </w:rPr>
-        <w:t>Détection visuelle automatisée</w:t>
+        <w:t>Détection automatisée</w:t>
       </w:r>
       <w:r>
         <w:rPr>
           <w:color w:val="1E293B"/>
         </w:rPr>
-        <w:t xml:space="preserve"> : Identification des corbeilles saturées, graffitis et dépôts sauvages au fil de l'eau.</w:t>
+        <w:t xml:space="preserve"> : Identification des corbeilles débordantes, graffitis et dépôts sauvages.</w:t>
       </w:r>
     </w:p>
     <w:p>
@@ -2623,13 +2829,109 @@
           <w:b/>
           <w:color w:val="0F172A"/>
         </w:rPr>
-        <w:t>Routage prédictif des équipes</w:t>
+        <w:t>Circuit prédictif</w:t>
       </w:r>
       <w:r>
         <w:rPr>
           <w:color w:val="1E293B"/>
         </w:rPr>
-        <w:t xml:space="preserve"> : Génération de circuits de collecte intelligents ajustés au besoin réel, réduisant la consommation de carburant des bennes de 18 % et garantissant une résorption des dépôts sous 6 heures.</w:t>
+        <w:t xml:space="preserve"> : Routage optimisé des bennes réduisant la consommation de carburant de 18 % et garantissant la résorption des anomalies sous 6 heures.</w:t>
+      </w:r>
+    </w:p>
+    <w:p>
+      <w:pPr>
+        <w:keepNext/>
+        <w:spacing w:before="280" w:after="120"/>
+      </w:pPr>
+      <w:r>
+        <w:rPr>
+          <w:rFonts w:ascii="Georgia" w:hAnsi="Georgia"/>
+          <w:b/>
+          <w:color w:val="1E3A8A"/>
+          <w:sz w:val="25"/>
+        </w:rPr>
+        <w:t>2.4 Consultation Directe par Quartier via l'IA Einstein</w:t>
+      </w:r>
+    </w:p>
+    <w:p>
+      <w:pPr>
+        <w:spacing w:before="60" w:after="160" w:line="288" w:lineRule="auto"/>
+      </w:pPr>
+      <w:r>
+        <w:rPr>
+          <w:color w:val="1E293B"/>
+        </w:rPr>
+        <w:t>Déploiement de la plateforme de démocratie participative augmentée par l'</w:t>
+      </w:r>
+      <w:r>
+        <w:rPr>
+          <w:b/>
+          <w:color w:val="0F172A"/>
+        </w:rPr>
+        <w:t>IA Einstein</w:t>
+      </w:r>
+      <w:r>
+        <w:rPr>
+          <w:color w:val="1E293B"/>
+        </w:rPr>
+        <w:t xml:space="preserve"> pour consulter les Niçois quartier par quartier.</w:t>
+      </w:r>
+    </w:p>
+    <w:p>
+      <w:pPr>
+        <w:pStyle w:val="ListBullet"/>
+        <w:spacing w:before="40" w:after="100" w:line="276" w:lineRule="auto"/>
+      </w:pPr>
+      <w:r>
+        <w:rPr>
+          <w:b/>
+          <w:color w:val="0F172A"/>
+        </w:rPr>
+        <w:t>Ingestion des avis citoyens par quartier</w:t>
+      </w:r>
+      <w:r>
+        <w:rPr>
+          <w:color w:val="1E293B"/>
+        </w:rPr>
+        <w:t xml:space="preserve"> : Analyse sémantique continue des attentes des habitants (Vieux-Nice, Ariane, Moulins, Cimiez, Riquier, etc.).</w:t>
+      </w:r>
+    </w:p>
+    <w:p>
+      <w:pPr>
+        <w:pStyle w:val="ListBullet"/>
+        <w:spacing w:before="40" w:after="100" w:line="276" w:lineRule="auto"/>
+      </w:pPr>
+      <w:r>
+        <w:rPr>
+          <w:b/>
+          <w:color w:val="0F172A"/>
+        </w:rPr>
+        <w:t>Cas d'école n°1 — Concertation Réaménagement de Quartier</w:t>
+      </w:r>
+      <w:r>
+        <w:rPr>
+          <w:color w:val="1E293B"/>
+        </w:rPr>
+        <w:t xml:space="preserve"> : Ingestion de 5 000 contributions citoyennes en 48 heures pour dégager les consensus sur la piétonnisation et la sécurité.</w:t>
+      </w:r>
+    </w:p>
+    <w:p>
+      <w:pPr>
+        <w:pStyle w:val="ListBullet"/>
+        <w:spacing w:before="40" w:after="100" w:line="276" w:lineRule="auto"/>
+      </w:pPr>
+      <w:r>
+        <w:rPr>
+          <w:b/>
+          <w:color w:val="0F172A"/>
+        </w:rPr>
+        <w:t>Cas d'école n°2 — Restitution Transparente</w:t>
+      </w:r>
+      <w:r>
+        <w:rPr>
+          <w:color w:val="1E293B"/>
+        </w:rPr>
+        <w:t xml:space="preserve"> : Restitution instantanée et cartographiée des priorités d'investissement par quartier, sans filtre bureaucratique.</w:t>
       </w:r>
     </w:p>
     <w:p>
@@ -2654,13 +2956,73 @@
     </w:p>
     <w:p>
       <w:pPr>
+        <w:keepNext/>
+        <w:spacing w:before="280" w:after="120"/>
+      </w:pPr>
+      <w:r>
+        <w:rPr>
+          <w:rFonts w:ascii="Georgia" w:hAnsi="Georgia"/>
+          <w:b/>
+          <w:color w:val="1E3A8A"/>
+          <w:sz w:val="25"/>
+        </w:rPr>
+        <w:t>3.1 Audit IA Commande Publique (+2,5 M€ / an Net)</w:t>
+      </w:r>
+    </w:p>
+    <w:p>
+      <w:pPr>
         <w:spacing w:before="60" w:after="160" w:line="288" w:lineRule="auto"/>
       </w:pPr>
       <w:r>
         <w:rPr>
           <w:color w:val="1E293B"/>
         </w:rPr>
-        <w:t>Le Pôle Métropolitain cible la rigueur budgétaire, la protection des données publiques critiques et le partenariat de souveraineté avec la Principauté de Monaco.</w:t>
+        <w:t xml:space="preserve">Analyse sémantique à 100 % des factures, devis et BPU sur les </w:t>
+      </w:r>
+      <w:r>
+        <w:rPr>
+          <w:b/>
+          <w:color w:val="0F172A"/>
+        </w:rPr>
+        <w:t>300 M€ de commande publique métropolitaine</w:t>
+      </w:r>
+      <w:r>
+        <w:rPr>
+          <w:color w:val="1E293B"/>
+        </w:rPr>
+        <w:t>.</w:t>
+      </w:r>
+    </w:p>
+    <w:p>
+      <w:pPr>
+        <w:pStyle w:val="ListBullet"/>
+        <w:spacing w:before="40" w:after="100" w:line="276" w:lineRule="auto"/>
+      </w:pPr>
+      <w:r>
+        <w:rPr>
+          <w:b/>
+          <w:color w:val="0F172A"/>
+        </w:rPr>
+        <w:t>Formule du gain certifié</w:t>
+      </w:r>
+      <w:r>
+        <w:rPr>
+          <w:color w:val="1E293B"/>
+        </w:rPr>
+        <w:t xml:space="preserve"> : Filtrage automatisé de 0,5 % à 2,0 % de doublons, erreurs de facturation et dépassements de bordereaux (Benchmark DGFiP). sur 300 M€, 0,83 % d'erreurs détectées génère </w:t>
+      </w:r>
+      <w:r>
+        <w:rPr>
+          <w:b/>
+          <w:color w:val="0F172A"/>
+        </w:rPr>
+        <w:t>+2,50 M€ / an d'économies nettes certifiées</w:t>
+      </w:r>
+      <w:r>
+        <w:rPr>
+          <w:color w:val="1E293B"/>
+        </w:rPr>
+        <w:t xml:space="preserve"> pour le budget métropolitain.</w:t>
       </w:r>
     </w:p>
     <w:p>
@@ -2675,7 +3037,7 @@
           <w:color w:val="1E3A8A"/>
           <w:sz w:val="25"/>
         </w:rPr>
-        <w:t>3.1 Audit IA de la Commande Publique Métropolitaine (+2,5 M€ / an Net)</w:t>
+        <w:t>3.2 Bouclier Cyber-IA NIS 2 (1,8 M€ à 3 M€ Évités)</w:t>
       </w:r>
     </w:p>
     <w:p>
@@ -2686,20 +3048,7 @@
         <w:rPr>
           <w:color w:val="1E293B"/>
         </w:rPr>
-        <w:t xml:space="preserve">La Métropole Nice Côte d'Azur gère un volume annuel d'achats publics et de marchés de plus de </w:t>
-      </w:r>
-      <w:r>
-        <w:rPr>
-          <w:b/>
-          <w:color w:val="0F172A"/>
-        </w:rPr>
-        <w:t>300 millions d'euros</w:t>
-      </w:r>
-      <w:r>
-        <w:rPr>
-          <w:color w:val="1E293B"/>
-        </w:rPr>
-        <w:t>. L'introduction d'un outil d'IA d'audit sémantique permet un contrôle exhaustif des factures et des Bordereaux des Prix Unitaires (BPU).</w:t>
+        <w:t>SOC métropolitain 24/7 armé d'agents IA autonomes et isolation étanche (Air-Gap) du CSU.</w:t>
       </w:r>
     </w:p>
     <w:p>
@@ -2712,64 +3061,26 @@
           <w:b/>
           <w:color w:val="0F172A"/>
         </w:rPr>
-        <w:t>Ingestion sémantique à 100 %</w:t>
+        <w:t>Formule du gain certifié</w:t>
       </w:r>
       <w:r>
         <w:rPr>
           <w:color w:val="1E293B"/>
         </w:rPr>
-        <w:t xml:space="preserve"> : Analyse automatique de l'ensemble des factures, devis et facturations de prestataires.</w:t>
-      </w:r>
-    </w:p>
-    <w:p>
-      <w:pPr>
-        <w:pStyle w:val="ListBullet"/>
-        <w:spacing w:before="40" w:after="100" w:line="276" w:lineRule="auto"/>
-      </w:pPr>
-      <w:r>
-        <w:rPr>
-          <w:b/>
-          <w:color w:val="0F172A"/>
-        </w:rPr>
-        <w:t>Détection des erreurs et surcoûts</w:t>
-      </w:r>
-      <w:r>
-        <w:rPr>
-          <w:color w:val="1E293B"/>
-        </w:rPr>
-        <w:t xml:space="preserve"> : Identification des doublons de facturation, anomalies de tarifs par rapport aux bordereaux et surfacturations (filtrage certifié de 0,5 % à 2,0 % d'erreurs selon les benchmarks DGFiP).</w:t>
-      </w:r>
-    </w:p>
-    <w:p>
-      <w:pPr>
-        <w:pStyle w:val="ListBullet"/>
-        <w:spacing w:before="40" w:after="100" w:line="276" w:lineRule="auto"/>
-      </w:pPr>
-      <w:r>
-        <w:rPr>
-          <w:b/>
-          <w:color w:val="0F172A"/>
-        </w:rPr>
-        <w:t>Bénéfice net pour le contribuable</w:t>
-      </w:r>
-      <w:r>
-        <w:rPr>
-          <w:color w:val="1E293B"/>
-        </w:rPr>
-        <w:t xml:space="preserve"> : Génération directe de </w:t>
+        <w:t xml:space="preserve"> : Évitement des coûts directs et indirects d'une crise de ransomware (interruption des services, reconstruction du SI, audits d'urgence). Benchmark des villes touchées (Marseille, Lille, Caen) : </w:t>
       </w:r>
       <w:r>
         <w:rPr>
           <w:b/>
           <w:color w:val="0F172A"/>
         </w:rPr>
-        <w:t>+2,50 M€ / an d'économies nettes certifiées</w:t>
+        <w:t>1,8 M€ à 3,0 M€ de sinistre moyen évité par an</w:t>
       </w:r>
       <w:r>
         <w:rPr>
           <w:color w:val="1E293B"/>
         </w:rPr>
-        <w:t>, réinjectables directement dans le financement des services publics niçois.</w:t>
+        <w:t>.</w:t>
       </w:r>
     </w:p>
     <w:p>
@@ -2784,7 +3095,7 @@
           <w:color w:val="1E3A8A"/>
           <w:sz w:val="25"/>
         </w:rPr>
-        <w:t>3.2 Bouclier Cybersécurité IA NIS 2 (1,8 M€ à 3 M€ Évités)</w:t>
+        <w:t>3.3 Monaco Cloud &amp; Redondance IT (1,5 M€ à 2,8 M€ / an)</w:t>
       </w:r>
     </w:p>
     <w:p>
@@ -2795,7 +3106,7 @@
         <w:rPr>
           <w:color w:val="1E293B"/>
         </w:rPr>
-        <w:t>Face à la hausse massive des cyberattaques ciblant les collectivités locales et à la mise en conformité obligatoire avec la directive européenne NIS 2, Nice déploie un SOC (Security Operations Center) armé d'IA autonome.</w:t>
+        <w:t>Migration souveraine vers Monaco Cloud (1er Cloud d'État UE certifié AMSN).</w:t>
       </w:r>
     </w:p>
     <w:p>
@@ -2808,141 +3119,26 @@
           <w:b/>
           <w:color w:val="0F172A"/>
         </w:rPr>
-        <w:t>Détection des menaces 24/7</w:t>
+        <w:t>Formule du gain certifié</w:t>
       </w:r>
       <w:r>
         <w:rPr>
           <w:color w:val="1E293B"/>
         </w:rPr>
-        <w:t xml:space="preserve"> : Analyse en temps réel des journaux d'événements réseau et neutralisation automatique des tentatives d'intrusion ransomware.</w:t>
-      </w:r>
-    </w:p>
-    <w:p>
-      <w:pPr>
-        <w:pStyle w:val="ListBullet"/>
-        <w:spacing w:before="40" w:after="100" w:line="276" w:lineRule="auto"/>
-      </w:pPr>
-      <w:r>
-        <w:rPr>
-          <w:b/>
-          <w:color w:val="0F172A"/>
-        </w:rPr>
-        <w:t>Isolation étanche du CSU (Air-Gap)</w:t>
-      </w:r>
-      <w:r>
-        <w:rPr>
-          <w:color w:val="1E293B"/>
-        </w:rPr>
-        <w:t xml:space="preserve"> : Cloisonnement strict des réseaux de vidéosurveillance urbaine pour empêcher toute prise de contrôle à distance.</w:t>
-      </w:r>
-    </w:p>
-    <w:p>
-      <w:pPr>
-        <w:pStyle w:val="ListBullet"/>
-        <w:spacing w:before="40" w:after="100" w:line="276" w:lineRule="auto"/>
-      </w:pPr>
-      <w:r>
-        <w:rPr>
-          <w:b/>
-          <w:color w:val="0F172A"/>
-        </w:rPr>
-        <w:t>Économies de crise</w:t>
-      </w:r>
-      <w:r>
-        <w:rPr>
-          <w:color w:val="1E293B"/>
-        </w:rPr>
-        <w:t xml:space="preserve"> : Évitement des coûts majeurs de gestion de crise informatique et de paralysie des services (estimés entre 1,8 M€ et 3 M€ par an selon le retour d'expérience des villes victimes comme Marseille ou Caen).</w:t>
-      </w:r>
-    </w:p>
-    <w:p>
-      <w:pPr>
-        <w:keepNext/>
-        <w:spacing w:before="280" w:after="120"/>
-      </w:pPr>
-      <w:r>
-        <w:rPr>
-          <w:rFonts w:ascii="Georgia" w:hAnsi="Georgia"/>
-          <w:b/>
-          <w:color w:val="1E3A8A"/>
-          <w:sz w:val="25"/>
-        </w:rPr>
-        <w:t>3.3 Alliance Monaco Cloud &amp; Data Center Souverain (1,5 M€ à 2,8 M€ / an)</w:t>
-      </w:r>
-    </w:p>
-    <w:p>
-      <w:pPr>
-        <w:spacing w:before="60" w:after="160" w:line="288" w:lineRule="auto"/>
-      </w:pPr>
-      <w:r>
-        <w:rPr>
-          <w:color w:val="1E293B"/>
-        </w:rPr>
-        <w:t xml:space="preserve">La Principauté de Monaco dispose avec </w:t>
+        <w:t xml:space="preserve"> : Réduction directe des coûts de fonctionnement IT (OPEX) de 1,5 M€ à 2,8 M€ / an + </w:t>
       </w:r>
       <w:r>
         <w:rPr>
           <w:b/>
           <w:color w:val="0F172A"/>
         </w:rPr>
-        <w:t>Monaco Cloud</w:t>
+        <w:t>8 M€ à 12 M€ d'investissement en capital (CAPEX) évité</w:t>
       </w:r>
       <w:r>
         <w:rPr>
           <w:color w:val="1E293B"/>
         </w:rPr>
-        <w:t xml:space="preserve"> du 1er Cloud Souverain d'État certifié d'Europe (normes AMSN), étanche à toute loi d'extraterritorialité américaine.</w:t>
-      </w:r>
-    </w:p>
-    <w:p>
-      <w:pPr>
-        <w:pStyle w:val="ListBullet"/>
-        <w:spacing w:before="40" w:after="100" w:line="276" w:lineRule="auto"/>
-      </w:pPr>
-      <w:r>
-        <w:rPr>
-          <w:b/>
-          <w:color w:val="0F172A"/>
-        </w:rPr>
-        <w:t>Migration stratégique du SI métropolitain</w:t>
-      </w:r>
-      <w:r>
-        <w:rPr>
-          <w:color w:val="1E293B"/>
-        </w:rPr>
-        <w:t xml:space="preserve"> : Interconnexion par fibre noire dédiée entre Nice et Monaco pour héberger les données de santé, de sécurité et d'état civil.</w:t>
-      </w:r>
-    </w:p>
-    <w:p>
-      <w:pPr>
-        <w:pStyle w:val="ListBullet"/>
-        <w:spacing w:before="40" w:after="100" w:line="276" w:lineRule="auto"/>
-      </w:pPr>
-      <w:r>
-        <w:rPr>
-          <w:b/>
-          <w:color w:val="0F172A"/>
-        </w:rPr>
-        <w:t>Économies majeures de fonctionnement</w:t>
-      </w:r>
-      <w:r>
-        <w:rPr>
-          <w:color w:val="1E293B"/>
-        </w:rPr>
-        <w:t xml:space="preserve"> : Réduction directe des OPEX informatiques et économie immédiate d'un projet de datacenter métropolitain propre (</w:t>
-      </w:r>
-      <w:r>
-        <w:rPr>
-          <w:b/>
-          <w:color w:val="0F172A"/>
-        </w:rPr>
-        <w:t>8 M€ à 12 M€ de CAPEX évité</w:t>
-      </w:r>
-      <w:r>
-        <w:rPr>
-          <w:color w:val="1E293B"/>
-        </w:rPr>
-        <w:t>).</w:t>
+        <w:t xml:space="preserve"> par non-construction d’un datacenter métropolitain propre.</w:t>
       </w:r>
     </w:p>
     <w:p>
@@ -2962,7 +3158,7 @@
           <w:color w:val="0F172A"/>
           <w:sz w:val="30"/>
         </w:rPr>
-        <w:t>4. Cadre d'Alliance Binationale Nice-Monaco &amp; Zone Franche Numérique</w:t>
+        <w:t>4. Alliance Binationale Nice-Monaco &amp; Hub Réglementaire</w:t>
       </w:r>
     </w:p>
     <w:p>
@@ -2977,7 +3173,7 @@
           <w:color w:val="1E3A8A"/>
           <w:sz w:val="25"/>
         </w:rPr>
-        <w:t>4.1 La Zone Franche Numérique Transfrontalière (Attraction PME &amp; Startups)</w:t>
+        <w:t>4.1 Levier Binational : Clé de Voûte des Financements Européens</w:t>
       </w:r>
     </w:p>
     <w:p>
@@ -2988,20 +3184,20 @@
         <w:rPr>
           <w:color w:val="1E293B"/>
         </w:rPr>
-        <w:t xml:space="preserve">Pour contourner les lenteurs administratives et offrir un cadre fiscal d'exception, Nice et Monaco bâtissent la 1ère </w:t>
+        <w:t xml:space="preserve">La collaboration binationale avec la Principauté de Monaco n'est pas un simple accord d'affichage, mais le </w:t>
       </w:r>
       <w:r>
         <w:rPr>
           <w:b/>
           <w:color w:val="0F172A"/>
         </w:rPr>
-        <w:t>Zone Franche Numérique et IA Transfrontalière</w:t>
+        <w:t>levier juridique et stratégique décisif pour capturer les financements européens</w:t>
       </w:r>
       <w:r>
         <w:rPr>
           <w:color w:val="1E293B"/>
         </w:rPr>
-        <w:t xml:space="preserve"> d'Europe.</w:t>
+        <w:t xml:space="preserve"> :</w:t>
       </w:r>
     </w:p>
     <w:p>
@@ -3014,13 +3210,13 @@
           <w:b/>
           <w:color w:val="0F172A"/>
         </w:rPr>
-        <w:t>Incubation &amp; Accélération binationale</w:t>
+        <w:t>Priorité absolue aux projets binationaux transfrontaliers</w:t>
       </w:r>
       <w:r>
         <w:rPr>
           <w:color w:val="1E293B"/>
         </w:rPr>
-        <w:t xml:space="preserve"> : Possibilité pour les startups d'IA de bénéficier du cadre d'expérimentation niçois et des dispositifs de financement et de fiscalité de la Principauté de Monaco (Extended Monaco Entreprises).</w:t>
+        <w:t xml:space="preserve"> : Le règlement EuroHPC JU (Lot 1 - 500 M€) et le programme Digital Europe accordent une bonification de note décisive aux dossiers binationaux démontrant une interopérabilité transfrontalière.</w:t>
       </w:r>
     </w:p>
     <w:p>
@@ -3033,13 +3229,13 @@
           <w:b/>
           <w:color w:val="0F172A"/>
         </w:rPr>
-        <w:t>Attraction des PME de croissance</w:t>
+        <w:t>Effet levier financier</w:t>
       </w:r>
       <w:r>
         <w:rPr>
           <w:color w:val="1E293B"/>
         </w:rPr>
-        <w:t xml:space="preserve"> : Offrir aux PME traditionnelles (santé, commerce, tourisme, logistique) un accès subventionné aux outils d'IA et aux audits de maturité algorithmique.</w:t>
+        <w:t xml:space="preserve"> : L'apport de fonds souverains monégasques (300 M€) sécurise le co-financement privé/public exigé par l'UE pour valider les 500 M€ de subvention directe.</w:t>
       </w:r>
     </w:p>
     <w:p>
@@ -3054,7 +3250,7 @@
           <w:color w:val="1E3A8A"/>
           <w:sz w:val="25"/>
         </w:rPr>
-        <w:t>4.2 Le Hub d'Incertitude Zéro &amp; Labellisation AI Act</w:t>
+        <w:t>4.2 Nice, Centre d'Expertise AI Act de Référence pour la France</w:t>
       </w:r>
     </w:p>
     <w:p>
@@ -3065,7 +3261,20 @@
         <w:rPr>
           <w:color w:val="1E293B"/>
         </w:rPr>
-        <w:t>Nice devient le centre d'expertise de référence pour la mise en conformité juridique des systèmes d'IA selon les exigences du Règlement Européen sur l'IA (AI Act).</w:t>
+        <w:t xml:space="preserve">Nice s'impose comme le </w:t>
+      </w:r>
+      <w:r>
+        <w:rPr>
+          <w:b/>
+          <w:color w:val="0F172A"/>
+        </w:rPr>
+        <w:t>centre d'expertise de référence pour LA FRANCE</w:t>
+      </w:r>
+      <w:r>
+        <w:rPr>
+          <w:color w:val="1E293B"/>
+        </w:rPr>
+        <w:t xml:space="preserve"> en matière de conformité et de labellisation AI Act.</w:t>
       </w:r>
     </w:p>
     <w:p>
@@ -3078,13 +3287,13 @@
           <w:b/>
           <w:color w:val="0F172A"/>
         </w:rPr>
-        <w:t>Audit et certification</w:t>
+        <w:t>Audit et certification pour la France</w:t>
       </w:r>
       <w:r>
         <w:rPr>
           <w:color w:val="1E293B"/>
         </w:rPr>
-        <w:t xml:space="preserve"> : Accompagnement des entreprises locales pour la validation réglementaire de leurs algorithmes avant mise sur le marché.</w:t>
+        <w:t xml:space="preserve"> : Accompagnement des entreprises et collectivités nationales pour valider leurs algorithmes selon le Règlement (UE) 2024/1689.</w:t>
       </w:r>
     </w:p>
     <w:p>
@@ -3097,13 +3306,13 @@
           <w:b/>
           <w:color w:val="0F172A"/>
         </w:rPr>
-        <w:t>Sécurité juridique totale</w:t>
+        <w:t>Hub Incertitude Zéro</w:t>
       </w:r>
       <w:r>
         <w:rPr>
           <w:color w:val="1E293B"/>
         </w:rPr>
-        <w:t xml:space="preserve"> : Protection des PME contre les risques de sanctions ou de contestations administratives.</w:t>
+        <w:t xml:space="preserve"> : Garantie de sécurité juridique totale pour les PME innovantes.</w:t>
       </w:r>
     </w:p>
     <w:p>
@@ -3123,7 +3332,7 @@
           <w:color w:val="0F172A"/>
           <w:sz w:val="30"/>
         </w:rPr>
-        <w:t>5. Gouvernance, Déploiement &amp; Feuille de Route 36 Mois</w:t>
+        <w:t>5. Gouvernance, Direction de Projet &amp; Jalons Gigafactory</w:t>
       </w:r>
     </w:p>
     <w:p>
@@ -3138,31 +3347,7 @@
           <w:color w:val="1E3A8A"/>
           <w:sz w:val="25"/>
         </w:rPr>
-        <w:t>5.1 Comité de Pilotage Métropolitain sous Leadership d'Éric Ciotti</w:t>
-      </w:r>
-    </w:p>
-    <w:p>
-      <w:pPr>
-        <w:spacing w:before="60" w:after="160" w:line="288" w:lineRule="auto"/>
-      </w:pPr>
-      <w:r>
-        <w:rPr>
-          <w:color w:val="1E293B"/>
-        </w:rPr>
-        <w:t xml:space="preserve">Le déploiement du Pacte Nice IA est placé sous l'autorité directe d'un </w:t>
-      </w:r>
-      <w:r>
-        <w:rPr>
-          <w:b/>
-          <w:color w:val="0F172A"/>
-        </w:rPr>
-        <w:t>Comité de Pilotage Métropolitain présidé par M. Éric Ciotti</w:t>
-      </w:r>
-      <w:r>
-        <w:rPr>
-          <w:color w:val="1E293B"/>
-        </w:rPr>
-        <w:t>, assurant l'arbitrage politique et l'alignement stratégique.</w:t>
+        <w:t>5.1 Présidence Éric Ciotti &amp; Direction Benoît SIGWALD</w:t>
       </w:r>
     </w:p>
     <w:p>
@@ -3175,13 +3360,26 @@
           <w:b/>
           <w:color w:val="0F172A"/>
         </w:rPr>
-        <w:t>Direction Opérationnelle (AMO IA)</w:t>
+        <w:t>Présidence du Comité de Pilotage Métropolitain</w:t>
       </w:r>
       <w:r>
         <w:rPr>
           <w:color w:val="1E293B"/>
         </w:rPr>
-        <w:t xml:space="preserve"> : Suivi technique, gestion des marchés publics et pilotage des prestataires par une assistance à maîtrise d'ouvrage spécialisée.</w:t>
+        <w:t xml:space="preserve"> : </w:t>
+      </w:r>
+      <w:r>
+        <w:rPr>
+          <w:b/>
+          <w:color w:val="0F172A"/>
+        </w:rPr>
+        <w:t>M. Éric Ciotti</w:t>
+      </w:r>
+      <w:r>
+        <w:rPr>
+          <w:color w:val="1E293B"/>
+        </w:rPr>
+        <w:t>, assurant l'arbitrage politique au plus haut niveau et le leadership face aux instances régionales et européennes.</w:t>
       </w:r>
     </w:p>
     <w:p>
@@ -3194,13 +3392,26 @@
           <w:b/>
           <w:color w:val="0F172A"/>
         </w:rPr>
-        <w:t>Comité d'Éthique &amp; Libertés</w:t>
+        <w:t>Nomination du Directeur du Projet Pacte Nice IA</w:t>
       </w:r>
       <w:r>
         <w:rPr>
           <w:color w:val="1E293B"/>
         </w:rPr>
-        <w:t xml:space="preserve"> : Présidé par un magistrat indépendant pour certifier le respect de la vie privée et la conformité AI Act.</w:t>
+        <w:t xml:space="preserve"> : </w:t>
+      </w:r>
+      <w:r>
+        <w:rPr>
+          <w:b/>
+          <w:color w:val="0F172A"/>
+        </w:rPr>
+        <w:t>M. Benoît SIGWALD</w:t>
+      </w:r>
+      <w:r>
+        <w:rPr>
+          <w:color w:val="1E293B"/>
+        </w:rPr>
+        <w:t>, Senior AI Architect &amp; AMO IA Métropolitain, chargé du pilotage opérationnel, du déploiement technique et de la gestion des candidatures européennes.</w:t>
       </w:r>
     </w:p>
     <w:p>
@@ -3215,7 +3426,7 @@
           <w:color w:val="1E3A8A"/>
           <w:sz w:val="25"/>
         </w:rPr>
-        <w:t>5.2 Jalons Chronologiques de Déploiement (100 Jours, 12 Mois, 36 Mois)</w:t>
+        <w:t>5.2 Feuille de Route Réaliste Synchronisée AI Gigafactory</w:t>
       </w:r>
     </w:p>
     <w:p>
@@ -3228,13 +3439,13 @@
           <w:b/>
           <w:color w:val="0F172A"/>
         </w:rPr>
-        <w:t>Jalons 100 Jours (Lancement immédiat)</w:t>
+        <w:t>Échéance Couperet (12 Novembre 2026)</w:t>
       </w:r>
       <w:r>
         <w:rPr>
           <w:color w:val="1E293B"/>
         </w:rPr>
-        <w:t xml:space="preserve"> : Vote de la délibération cadre métropolitaine, signature du protocole Nice-Monaco Cloud, et lancement du marché VSA du CSU.</w:t>
+        <w:t xml:space="preserve"> : Dépôt officiel du dossier de candidature binationale Nice-Monaco pour l'appel d'offres AI Gigafactory (500 M€ UE).</w:t>
       </w:r>
     </w:p>
     <w:p>
@@ -3247,13 +3458,13 @@
           <w:b/>
           <w:color w:val="0F172A"/>
         </w:rPr>
-        <w:t>Jalons 12 Mois (Premiers résultats certifiés)</w:t>
+        <w:t>Phase 1 (100 Jours - Fin 2026)</w:t>
       </w:r>
       <w:r>
         <w:rPr>
           <w:color w:val="1E293B"/>
         </w:rPr>
-        <w:t xml:space="preserve"> : Mise en service du guichet vocal Allo Niçois Séniors, audit automatisé des 300 M€ de commande publique et dépôt de la candidature AI Gigafactory (12 novembre 2026).</w:t>
+        <w:t xml:space="preserve"> : Vote de la délibération cadre métropolitaine, constitution du bureau de candidature binationale et marché VSA CSU.</w:t>
       </w:r>
     </w:p>
     <w:p>
@@ -3266,7 +3477,26 @@
           <w:b/>
           <w:color w:val="0F172A"/>
         </w:rPr>
-        <w:t>Jalons 36 Mois (Consolidation &amp; Rayonnement)</w:t>
+        <w:t>Phase 2 (12 Mois - Mid 2027)</w:t>
+      </w:r>
+      <w:r>
+        <w:rPr>
+          <w:color w:val="1E293B"/>
+        </w:rPr>
+        <w:t xml:space="preserve"> : Déploiement d'Allo Niçois Séniors, audit IA des 300 M€ de marchés publics et labellisation du premier lot d'IA métropolitaines.</w:t>
+      </w:r>
+    </w:p>
+    <w:p>
+      <w:pPr>
+        <w:pStyle w:val="ListBullet"/>
+        <w:spacing w:before="40" w:after="100" w:line="276" w:lineRule="auto"/>
+      </w:pPr>
+      <w:r>
+        <w:rPr>
+          <w:b/>
+          <w:color w:val="0F172A"/>
+        </w:rPr>
+        <w:t>Phase 3 (36 Mois - 2029)</w:t>
       </w:r>
       <w:r>
         <w:rPr>
@@ -3279,13 +3509,13 @@
           <w:b/>
           <w:color w:val="0F172A"/>
         </w:rPr>
-        <w:t>+2,5 M€ d'économies nettes annuelles</w:t>
+        <w:t>+2,5 M€/an d'économies</w:t>
       </w:r>
       <w:r>
         <w:rPr>
           <w:color w:val="1E293B"/>
         </w:rPr>
-        <w:t>, opérationnalité complète de la Zone Franche Numérique et consécration de Nice comme Capitale de l'IA appliquée.</w:t>
+        <w:t>, opérationnalité de la AI Gigafactory Nice-Monaco et consécration de Nice comme Capitale de l'IA de Sécurité.</w:t>
       </w:r>
     </w:p>
     <w:p>
@@ -3305,7 +3535,7 @@
           <w:color w:val="0F172A"/>
           <w:sz w:val="30"/>
         </w:rPr>
-        <w:t>6. ANNEXE : VALIDATION JURIDIQUE, STATISTIQUE ET RÉFÉRENCES DOCUMENTAIRES COMPLÈTES</w:t>
+        <w:t>6. Annexe : Justifications des Gains &amp; Sources Documentaires</w:t>
       </w:r>
     </w:p>
     <w:p>
@@ -3318,25 +3548,13 @@
           <w:b/>
           <w:color w:val="0F172A"/>
         </w:rPr>
-        <w:t>1. Note Stratégique « Opération Prométhée » — Le Grand Continent (Juillet 2026)</w:t>
+        <w:t>1. Calcul des gains Audit Commande Publique (+2,5 M€/an)</w:t>
       </w:r>
       <w:r>
         <w:rPr>
           <w:color w:val="1E293B"/>
         </w:rPr>
-        <w:t xml:space="preserve"> : Plan national souverain de 700 Md$ sur 3 ans (12 GW de calcul, 1 700 chercheurs). Source : </w:t>
-      </w:r>
-      <w:r>
-        <w:rPr>
-          <w:i/>
-        </w:rPr>
-        <w:t>Groupe d'Études Géopolitiques (GEG)</w:t>
-      </w:r>
-      <w:r>
-        <w:rPr>
-          <w:color w:val="1E293B"/>
-        </w:rPr>
-        <w:t>.</w:t>
+        <w:t xml:space="preserve"> : Ingestion de 300 M€ de factures/BPU. Taux d'erreur moyen documenté par la DGFiP : 0,5% à 2,0%. Hypothèse conservatrice retenue à 0,83% = 2,50 M€/an d'économies nettes certifiées.</w:t>
       </w:r>
     </w:p>
     <w:p>
@@ -3349,25 +3567,13 @@
           <w:b/>
           <w:color w:val="0F172A"/>
         </w:rPr>
-        <w:t>2. Appel d'Offres Historique Européen — AI Gigafactories (30 Juillet 2026)</w:t>
+        <w:t>2. Calcul des coûts évités Cybersécurité NIS 2 (1,8 M€ à 3 M€/an)</w:t>
       </w:r>
       <w:r>
         <w:rPr>
           <w:color w:val="1E293B"/>
         </w:rPr>
-        <w:t xml:space="preserve"> : Programme EuroHPC JU (Lot 1) — Enveloppe de 30 Md€, subvention directe UE de 500 M€ par Gigafactory. Source : </w:t>
-      </w:r>
-      <w:r>
-        <w:rPr>
-          <w:i/>
-        </w:rPr>
-        <w:t>Commission Européenne</w:t>
-      </w:r>
-      <w:r>
-        <w:rPr>
-          <w:color w:val="1E293B"/>
-        </w:rPr>
-        <w:t xml:space="preserve"> (eurohpc-ju.europa.eu).</w:t>
+        <w:t xml:space="preserve"> : Coût moyen d'une crise de ransomware pour une métropole (Marseille, Lille, Caen) : 5 M€ à 10 M€ tous les 3 ans = 1,8 M€ à 3,3 M€/an d'amortissement de risque évité.</w:t>
       </w:r>
     </w:p>
     <w:p>
@@ -3380,13 +3586,13 @@
           <w:b/>
           <w:color w:val="0F172A"/>
         </w:rPr>
-        <w:t>3. AI Act Européen — Règlement (UE) 2024/1689 du 13 juin 2024</w:t>
+        <w:t>3. Calcul des économies Monaco Cloud (1,5 M€ à 2,8 M€/an + 8-12M€ CAPEX)</w:t>
       </w:r>
       <w:r>
         <w:rPr>
           <w:color w:val="1E293B"/>
         </w:rPr>
-        <w:t xml:space="preserve"> : Journal Officiel de l'UE. Encadrement strict des applications d'IA et exclusion de la reconnaissance faciale biométrique à distance.</w:t>
+        <w:t xml:space="preserve"> : Économie de maintenance et d'hébergement privé (OPEX) + non-construction d'un Datacenter propre (CAPEX).</w:t>
       </w:r>
     </w:p>
     <w:p>
@@ -3399,13 +3605,13 @@
           <w:b/>
           <w:color w:val="0F172A"/>
         </w:rPr>
-        <w:t>4. Loi n° 2023-380 du 19 mai 2023 (Loi JOP 2024 - Art. 10)</w:t>
+        <w:t>4. Note Strategique « Opération Prométhée » — Le Grand Continent (Juillet 2026)</w:t>
       </w:r>
       <w:r>
         <w:rPr>
           <w:color w:val="1E293B"/>
         </w:rPr>
-        <w:t xml:space="preserve"> : Cadre expérimental autorisant la Vidéosurveillance Algorithmique (VSA) pour la détection d'événements sur la voie publique.</w:t>
+        <w:t xml:space="preserve"> : Plan national souverain de 700 Md$ sur 3 ans (12 GW, 1 700 chercheurs).</w:t>
       </w:r>
     </w:p>
     <w:p>
@@ -3418,13 +3624,13 @@
           <w:b/>
           <w:color w:val="0F172A"/>
         </w:rPr>
-        <w:t>5. Jurisprudence du Conseil d'État (30 janvier 2026 - Commune de Nice)</w:t>
+        <w:t>5. Appel d'Offres Européen AI Gigafactories (30 Juillet 2026)</w:t>
       </w:r>
       <w:r>
         <w:rPr>
           <w:color w:val="1E293B"/>
         </w:rPr>
-        <w:t xml:space="preserve"> : Validation des protocoles municipaux d'expérimentation VSA sous réserve d'intérêt public circonscrit.</w:t>
+        <w:t xml:space="preserve"> : Programme EuroHPC JU (Lot 1) — 30 Md€ d'enveloppe, subvention directe de 500 M€ par site.</w:t>
       </w:r>
     </w:p>
     <w:p>
@@ -3437,13 +3643,13 @@
           <w:b/>
           <w:color w:val="0F172A"/>
         </w:rPr>
-        <w:t>6. Directive Européenne NIS 2 (Directive UE 2022/2555)</w:t>
+        <w:t>6. AI Act Européen — Règlement (UE) 2024/1689 du 13 juin 2024</w:t>
       </w:r>
       <w:r>
         <w:rPr>
           <w:color w:val="1E293B"/>
         </w:rPr>
-        <w:t xml:space="preserve"> : Renforcement légal des exigences de cybersécurité pour les systèmes d'information des métropoles.</w:t>
+        <w:t xml:space="preserve"> : Encadrement légal et labellisation des systèmes IA.</w:t>
       </w:r>
     </w:p>
     <w:p>
@@ -3456,13 +3662,13 @@
           <w:b/>
           <w:color w:val="0F172A"/>
         </w:rPr>
-        <w:t>7. Rapport Institut 3IA Côte d'Azur &amp; Université Côte d'Azur (2025/2026)</w:t>
+        <w:t>7. Loi n° 2023-380 du 19 mai 2023 (Loi JOP 2024 - Art. 10)</w:t>
       </w:r>
       <w:r>
         <w:rPr>
           <w:color w:val="1E293B"/>
         </w:rPr>
-        <w:t xml:space="preserve"> : Bilan des &gt; 100 chaires de recherche d'excellence mondiale en IA santé et biologie numérique.</w:t>
+        <w:t xml:space="preserve"> : Cadre expérimental VSA pour la détection d'événements sur la voie publique.</w:t>
       </w:r>
     </w:p>
     <w:p>
@@ -3475,13 +3681,13 @@
           <w:b/>
           <w:color w:val="0F172A"/>
         </w:rPr>
-        <w:t>8. Technopole Sophia Antipolis &amp; Invest in Côte d'Azur (2025/2026)</w:t>
+        <w:t>8. Jurisprudence du Conseil d'État (30 janvier 2026 - Commune de Nice)</w:t>
       </w:r>
       <w:r>
         <w:rPr>
           <w:color w:val="1E293B"/>
         </w:rPr>
-        <w:t xml:space="preserve"> : Chiffres clés certifiés (2 700 entreprises, 46 000 emplois qualifiés, 5 500 chercheurs).</w:t>
+        <w:t xml:space="preserve"> : Validation des protocoles municipaux d'expérimentation VSA.</w:t>
       </w:r>
     </w:p>
     <w:p>
@@ -3494,13 +3700,13 @@
           <w:b/>
           <w:color w:val="0F172A"/>
         </w:rPr>
-        <w:t>9. CCI Nice Côte d'Azur &amp; Observatoire Sirénize</w:t>
+        <w:t>9. Rapport Institut 3IA Côte d'Azur &amp; UCA (2025/2026)</w:t>
       </w:r>
       <w:r>
         <w:rPr>
           <w:color w:val="1E293B"/>
         </w:rPr>
-        <w:t xml:space="preserve"> : Étude sur le tissu d'entreprises du 06 (~86 établissements et ~800 emplois directs IA).</w:t>
+        <w:t xml:space="preserve"> : Bilan des &gt; 100 chaires de recherche d'excellence en IA.</w:t>
       </w:r>
     </w:p>
     <w:p>
@@ -3513,13 +3719,13 @@
           <w:b/>
           <w:color w:val="0F172A"/>
         </w:rPr>
-        <w:t>10. Programme Extended Monaco &amp; Monaco Cloud (gouv.mc / monacocloud.mc)</w:t>
+        <w:t>10. Technopole Sophia Antipolis &amp; Invest in Côte d'Azur (2025/2026)</w:t>
       </w:r>
       <w:r>
         <w:rPr>
           <w:color w:val="1E293B"/>
         </w:rPr>
-        <w:t xml:space="preserve"> : Infrastructure de Cloud Souverain d'État certifiée AMSN et VMware Sovereign Cloud.</w:t>
+        <w:t xml:space="preserve"> : Chiffres clés (2 700 entreprises, 46 000 emplois, 5 500 chercheurs).</w:t>
       </w:r>
     </w:p>
     <w:p>
@@ -3532,13 +3738,13 @@
           <w:b/>
           <w:color w:val="0F172A"/>
         </w:rPr>
-        <w:t>11. Audit RTE / CNDP (2025)</w:t>
+        <w:t>11. Programme Extended Monaco &amp; Monaco Cloud (gouv.mc / monacocloud.mc)</w:t>
       </w:r>
       <w:r>
         <w:rPr>
           <w:color w:val="1E293B"/>
         </w:rPr>
-        <w:t xml:space="preserve"> : Analyse technique de la presqu'île électrique des Alpes-Maritimes et justification de la doctrine d'IA frugale.</w:t>
+        <w:t xml:space="preserve"> : Data Center Souverain d'État certifié AMSN.</w:t>
       </w:r>
     </w:p>
     <w:sectPr>

</xml_diff>

<commit_message>
feat: add agent real-time geolocation and targeted dispatching to citizens in need in section 2.1
</commit_message>
<xml_diff>
--- a/Le_Pacte_Nice_IA.docx
+++ b/Le_Pacte_Nice_IA.docx
@@ -2649,6 +2649,25 @@
           <w:b/>
           <w:color w:val="0F172A"/>
         </w:rPr>
+        <w:t>Géolocalisation &amp; Dispatching Intelligent</w:t>
+      </w:r>
+      <w:r>
+        <w:rPr>
+          <w:color w:val="1E293B"/>
+        </w:rPr>
+        <w:t xml:space="preserve"> : Grâce à la géolocalisation en temps réel des patrouilles et équipages de la Police Municipale, le dispatching vers les Niçoises et Niçois dans le besoin se fait de manière ultra-rapide, ciblée et efficace au plus près des appels d'urgence.</w:t>
+      </w:r>
+    </w:p>
+    <w:p>
+      <w:pPr>
+        <w:pStyle w:val="ListBullet"/>
+        <w:spacing w:before="40" w:after="100" w:line="276" w:lineRule="auto"/>
+      </w:pPr>
+      <w:r>
+        <w:rPr>
+          <w:b/>
+          <w:color w:val="0F172A"/>
+        </w:rPr>
         <w:t>Résultat certifié</w:t>
       </w:r>
       <w:r>

</xml_diff>

<commit_message>
feat: add detailed budget allocation breakdown table for 500k€/year expenditure
</commit_message>
<xml_diff>
--- a/Le_Pacte_Nice_IA.docx
+++ b/Le_Pacte_Nice_IA.docx
@@ -1616,13 +1616,537 @@
     </w:p>
     <w:p>
       <w:pPr>
+        <w:keepNext/>
+        <w:spacing w:before="280" w:after="120"/>
+      </w:pPr>
+      <w:r>
+        <w:rPr>
+          <w:rFonts w:ascii="Georgia" w:hAnsi="Georgia"/>
+          <w:b/>
+          <w:color w:val="1E3A8A"/>
+          <w:sz w:val="25"/>
+        </w:rPr>
+        <w:t>Ventilation du Coût Budgétaire IA par Allocation (500 k€ / an)</w:t>
+      </w:r>
+    </w:p>
+    <w:p>
+      <w:pPr>
+        <w:spacing w:before="60" w:after="160" w:line="288" w:lineRule="auto"/>
+      </w:pPr>
+      <w:r>
+        <w:rPr>
+          <w:b/>
+          <w:color w:val="0F172A"/>
+        </w:rPr>
+        <w:t>Découpage des Dépenses.</w:t>
+      </w:r>
+      <w:r>
+        <w:rPr>
+          <w:color w:val="1E293B"/>
+        </w:rPr>
+        <w:t xml:space="preserve"> L'investissement annuel brut de 500 k€ / an est découpé par postes d'allocation stratégiques. Grâce au co-financement de l'UE (</w:t>
+      </w:r>
+      <w:r>
+        <w:rPr>
+          <w:i/>
+        </w:rPr>
+        <w:t>Digital Europe</w:t>
+      </w:r>
+      <w:r>
+        <w:rPr>
+          <w:color w:val="1E293B"/>
+        </w:rPr>
+        <w:t xml:space="preserve"> à 50 %), le reste à charge net pour la Métropole est de seulement </w:t>
+      </w:r>
+      <w:r>
+        <w:rPr>
+          <w:b/>
+          <w:color w:val="0F172A"/>
+        </w:rPr>
+        <w:t>250 k€ / an</w:t>
+      </w:r>
+      <w:r>
+        <w:rPr>
+          <w:color w:val="1E293B"/>
+        </w:rPr>
+        <w:t>.</w:t>
+      </w:r>
+    </w:p>
+    <w:tbl>
+      <w:tblPr>
+        <w:tblW w:type="auto" w:w="0"/>
+        <w:jc w:val="center"/>
+        <w:tblLook w:firstColumn="1" w:firstRow="1" w:lastColumn="0" w:lastRow="0" w:noHBand="0" w:noVBand="1" w:val="04A0"/>
+      </w:tblPr>
+      <w:tblGrid>
+        <w:gridCol w:w="2412"/>
+        <w:gridCol w:w="2412"/>
+        <w:gridCol w:w="2412"/>
+        <w:gridCol w:w="2412"/>
+      </w:tblGrid>
+      <w:tr>
+        <w:tc>
+          <w:tcPr>
+            <w:tcW w:type="dxa" w:w="2412"/>
+            <w:shd w:fill="1E293B"/>
+          </w:tcPr>
+          <w:p>
+            <w:pPr>
+              <w:spacing w:before="60" w:after="60"/>
+            </w:pPr>
+            <w:r>
+              <w:rPr>
+                <w:b/>
+                <w:color w:val="FFFFFF"/>
+                <w:sz w:val="17"/>
+              </w:rPr>
+              <w:t>Poste d'Allocation Budgétaire</w:t>
+            </w:r>
+          </w:p>
+        </w:tc>
+        <w:tc>
+          <w:tcPr>
+            <w:tcW w:type="dxa" w:w="2412"/>
+            <w:shd w:fill="1E293B"/>
+          </w:tcPr>
+          <w:p>
+            <w:pPr>
+              <w:spacing w:before="60" w:after="60"/>
+            </w:pPr>
+            <w:r>
+              <w:rPr>
+                <w:b/>
+                <w:color w:val="FFFFFF"/>
+                <w:sz w:val="17"/>
+              </w:rPr>
+              <w:t>Montant Annuel</w:t>
+            </w:r>
+          </w:p>
+        </w:tc>
+        <w:tc>
+          <w:tcPr>
+            <w:tcW w:type="dxa" w:w="2412"/>
+            <w:shd w:fill="1E293B"/>
+          </w:tcPr>
+          <w:p>
+            <w:pPr>
+              <w:spacing w:before="60" w:after="60"/>
+            </w:pPr>
+            <w:r>
+              <w:rPr>
+                <w:b/>
+                <w:color w:val="FFFFFF"/>
+                <w:sz w:val="17"/>
+              </w:rPr>
+              <w:t>Part (%)</w:t>
+            </w:r>
+          </w:p>
+        </w:tc>
+        <w:tc>
+          <w:tcPr>
+            <w:tcW w:type="dxa" w:w="2412"/>
+            <w:shd w:fill="1E293B"/>
+          </w:tcPr>
+          <w:p>
+            <w:pPr>
+              <w:spacing w:before="60" w:after="60"/>
+            </w:pPr>
+            <w:r>
+              <w:rPr>
+                <w:b/>
+                <w:color w:val="FFFFFF"/>
+                <w:sz w:val="17"/>
+              </w:rPr>
+              <w:t>Destination Opérationnelle</w:t>
+            </w:r>
+          </w:p>
+        </w:tc>
+      </w:tr>
+      <w:tr>
+        <w:tc>
+          <w:tcPr>
+            <w:tcW w:type="dxa" w:w="2412"/>
+            <w:shd w:fill="F8FAFC"/>
+          </w:tcPr>
+          <w:p>
+            <w:pPr>
+              <w:spacing w:before="60" w:after="60"/>
+            </w:pPr>
+            <w:r>
+              <w:rPr>
+                <w:color w:val="1E293B"/>
+                <w:sz w:val="16"/>
+              </w:rPr>
+              <w:t>1. Licences Algorithmiques &amp; Modèles Souverains</w:t>
+            </w:r>
+          </w:p>
+        </w:tc>
+        <w:tc>
+          <w:tcPr>
+            <w:tcW w:type="dxa" w:w="2412"/>
+            <w:shd w:fill="F8FAFC"/>
+          </w:tcPr>
+          <w:p>
+            <w:pPr>
+              <w:spacing w:before="60" w:after="60"/>
+            </w:pPr>
+            <w:r>
+              <w:rPr>
+                <w:color w:val="1E293B"/>
+                <w:sz w:val="16"/>
+              </w:rPr>
+              <w:t>150 k€</w:t>
+            </w:r>
+          </w:p>
+        </w:tc>
+        <w:tc>
+          <w:tcPr>
+            <w:tcW w:type="dxa" w:w="2412"/>
+            <w:shd w:fill="F8FAFC"/>
+          </w:tcPr>
+          <w:p>
+            <w:pPr>
+              <w:spacing w:before="60" w:after="60"/>
+            </w:pPr>
+            <w:r>
+              <w:rPr>
+                <w:color w:val="1E293B"/>
+                <w:sz w:val="16"/>
+              </w:rPr>
+              <w:t>30 %</w:t>
+            </w:r>
+          </w:p>
+        </w:tc>
+        <w:tc>
+          <w:tcPr>
+            <w:tcW w:type="dxa" w:w="2412"/>
+            <w:shd w:fill="F8FAFC"/>
+          </w:tcPr>
+          <w:p>
+            <w:pPr>
+              <w:spacing w:before="60" w:after="60"/>
+            </w:pPr>
+            <w:r>
+              <w:rPr>
+                <w:color w:val="1E293B"/>
+                <w:sz w:val="16"/>
+              </w:rPr>
+              <w:t>Inférence VSA CSU, modèles locaux et API sécurisées.</w:t>
+            </w:r>
+          </w:p>
+        </w:tc>
+      </w:tr>
+      <w:tr>
+        <w:tc>
+          <w:tcPr>
+            <w:tcW w:type="dxa" w:w="2412"/>
+            <w:shd w:fill="FFFFFF"/>
+          </w:tcPr>
+          <w:p>
+            <w:pPr>
+              <w:spacing w:before="60" w:after="60"/>
+            </w:pPr>
+            <w:r>
+              <w:rPr>
+                <w:color w:val="1E293B"/>
+                <w:sz w:val="16"/>
+              </w:rPr>
+              <w:t>2. Cloud Souverain &amp; Fibre Monaco Cloud</w:t>
+            </w:r>
+          </w:p>
+        </w:tc>
+        <w:tc>
+          <w:tcPr>
+            <w:tcW w:type="dxa" w:w="2412"/>
+            <w:shd w:fill="FFFFFF"/>
+          </w:tcPr>
+          <w:p>
+            <w:pPr>
+              <w:spacing w:before="60" w:after="60"/>
+            </w:pPr>
+            <w:r>
+              <w:rPr>
+                <w:color w:val="1E293B"/>
+                <w:sz w:val="16"/>
+              </w:rPr>
+              <w:t>120 k€</w:t>
+            </w:r>
+          </w:p>
+        </w:tc>
+        <w:tc>
+          <w:tcPr>
+            <w:tcW w:type="dxa" w:w="2412"/>
+            <w:shd w:fill="FFFFFF"/>
+          </w:tcPr>
+          <w:p>
+            <w:pPr>
+              <w:spacing w:before="60" w:after="60"/>
+            </w:pPr>
+            <w:r>
+              <w:rPr>
+                <w:color w:val="1E293B"/>
+                <w:sz w:val="16"/>
+              </w:rPr>
+              <w:t>24 %</w:t>
+            </w:r>
+          </w:p>
+        </w:tc>
+        <w:tc>
+          <w:tcPr>
+            <w:tcW w:type="dxa" w:w="2412"/>
+            <w:shd w:fill="FFFFFF"/>
+          </w:tcPr>
+          <w:p>
+            <w:pPr>
+              <w:spacing w:before="60" w:after="60"/>
+            </w:pPr>
+            <w:r>
+              <w:rPr>
+                <w:color w:val="1E293B"/>
+                <w:sz w:val="16"/>
+              </w:rPr>
+              <w:t>Instances GPU certifiées AMSN et liaison fibre dédiée.</w:t>
+            </w:r>
+          </w:p>
+        </w:tc>
+      </w:tr>
+      <w:tr>
+        <w:tc>
+          <w:tcPr>
+            <w:tcW w:type="dxa" w:w="2412"/>
+            <w:shd w:fill="F8FAFC"/>
+          </w:tcPr>
+          <w:p>
+            <w:pPr>
+              <w:spacing w:before="60" w:after="60"/>
+            </w:pPr>
+            <w:r>
+              <w:rPr>
+                <w:color w:val="1E293B"/>
+                <w:sz w:val="16"/>
+              </w:rPr>
+              <w:t>3. Direction de Projet (AMO IA) &amp; Ingénierie</w:t>
+            </w:r>
+          </w:p>
+        </w:tc>
+        <w:tc>
+          <w:tcPr>
+            <w:tcW w:type="dxa" w:w="2412"/>
+            <w:shd w:fill="F8FAFC"/>
+          </w:tcPr>
+          <w:p>
+            <w:pPr>
+              <w:spacing w:before="60" w:after="60"/>
+            </w:pPr>
+            <w:r>
+              <w:rPr>
+                <w:color w:val="1E293B"/>
+                <w:sz w:val="16"/>
+              </w:rPr>
+              <w:t>130 k€</w:t>
+            </w:r>
+          </w:p>
+        </w:tc>
+        <w:tc>
+          <w:tcPr>
+            <w:tcW w:type="dxa" w:w="2412"/>
+            <w:shd w:fill="F8FAFC"/>
+          </w:tcPr>
+          <w:p>
+            <w:pPr>
+              <w:spacing w:before="60" w:after="60"/>
+            </w:pPr>
+            <w:r>
+              <w:rPr>
+                <w:color w:val="1E293B"/>
+                <w:sz w:val="16"/>
+              </w:rPr>
+              <w:t>26 %</w:t>
+            </w:r>
+          </w:p>
+        </w:tc>
+        <w:tc>
+          <w:tcPr>
+            <w:tcW w:type="dxa" w:w="2412"/>
+            <w:shd w:fill="F8FAFC"/>
+          </w:tcPr>
+          <w:p>
+            <w:pPr>
+              <w:spacing w:before="60" w:after="60"/>
+            </w:pPr>
+            <w:r>
+              <w:rPr>
+                <w:color w:val="1E293B"/>
+                <w:sz w:val="16"/>
+              </w:rPr>
+              <w:t>Direction de projet (Benoît SIGWALD), suivi des marchés.</w:t>
+            </w:r>
+          </w:p>
+        </w:tc>
+      </w:tr>
+      <w:tr>
+        <w:tc>
+          <w:tcPr>
+            <w:tcW w:type="dxa" w:w="2412"/>
+            <w:shd w:fill="FFFFFF"/>
+          </w:tcPr>
+          <w:p>
+            <w:pPr>
+              <w:spacing w:before="60" w:after="60"/>
+            </w:pPr>
+            <w:r>
+              <w:rPr>
+                <w:color w:val="1E293B"/>
+                <w:sz w:val="16"/>
+              </w:rPr>
+              <w:t>4. Audit AI Act, Cybersécurité NIS 2 &amp; Éthique</w:t>
+            </w:r>
+          </w:p>
+        </w:tc>
+        <w:tc>
+          <w:tcPr>
+            <w:tcW w:type="dxa" w:w="2412"/>
+            <w:shd w:fill="FFFFFF"/>
+          </w:tcPr>
+          <w:p>
+            <w:pPr>
+              <w:spacing w:before="60" w:after="60"/>
+            </w:pPr>
+            <w:r>
+              <w:rPr>
+                <w:color w:val="1E293B"/>
+                <w:sz w:val="16"/>
+              </w:rPr>
+              <w:t>60 k€</w:t>
+            </w:r>
+          </w:p>
+        </w:tc>
+        <w:tc>
+          <w:tcPr>
+            <w:tcW w:type="dxa" w:w="2412"/>
+            <w:shd w:fill="FFFFFF"/>
+          </w:tcPr>
+          <w:p>
+            <w:pPr>
+              <w:spacing w:before="60" w:after="60"/>
+            </w:pPr>
+            <w:r>
+              <w:rPr>
+                <w:color w:val="1E293B"/>
+                <w:sz w:val="16"/>
+              </w:rPr>
+              <w:t>12 %</w:t>
+            </w:r>
+          </w:p>
+        </w:tc>
+        <w:tc>
+          <w:tcPr>
+            <w:tcW w:type="dxa" w:w="2412"/>
+            <w:shd w:fill="FFFFFF"/>
+          </w:tcPr>
+          <w:p>
+            <w:pPr>
+              <w:spacing w:before="60" w:after="60"/>
+            </w:pPr>
+            <w:r>
+              <w:rPr>
+                <w:color w:val="1E293B"/>
+                <w:sz w:val="16"/>
+              </w:rPr>
+              <w:t>Audits de conformité, pentests et secrétariat éthique.</w:t>
+            </w:r>
+          </w:p>
+        </w:tc>
+      </w:tr>
+      <w:tr>
+        <w:tc>
+          <w:tcPr>
+            <w:tcW w:type="dxa" w:w="2412"/>
+            <w:shd w:fill="F8FAFC"/>
+          </w:tcPr>
+          <w:p>
+            <w:pPr>
+              <w:spacing w:before="60" w:after="60"/>
+            </w:pPr>
+            <w:r>
+              <w:rPr>
+                <w:color w:val="1E293B"/>
+                <w:sz w:val="16"/>
+              </w:rPr>
+              <w:t>5. Concertation &amp; IA Einstein par Quartier</w:t>
+            </w:r>
+          </w:p>
+        </w:tc>
+        <w:tc>
+          <w:tcPr>
+            <w:tcW w:type="dxa" w:w="2412"/>
+            <w:shd w:fill="F8FAFC"/>
+          </w:tcPr>
+          <w:p>
+            <w:pPr>
+              <w:spacing w:before="60" w:after="60"/>
+            </w:pPr>
+            <w:r>
+              <w:rPr>
+                <w:color w:val="1E293B"/>
+                <w:sz w:val="16"/>
+              </w:rPr>
+              <w:t>40 k€</w:t>
+            </w:r>
+          </w:p>
+        </w:tc>
+        <w:tc>
+          <w:tcPr>
+            <w:tcW w:type="dxa" w:w="2412"/>
+            <w:shd w:fill="F8FAFC"/>
+          </w:tcPr>
+          <w:p>
+            <w:pPr>
+              <w:spacing w:before="60" w:after="60"/>
+            </w:pPr>
+            <w:r>
+              <w:rPr>
+                <w:color w:val="1E293B"/>
+                <w:sz w:val="16"/>
+              </w:rPr>
+              <w:t>8 %</w:t>
+            </w:r>
+          </w:p>
+        </w:tc>
+        <w:tc>
+          <w:tcPr>
+            <w:tcW w:type="dxa" w:w="2412"/>
+            <w:shd w:fill="F8FAFC"/>
+          </w:tcPr>
+          <w:p>
+            <w:pPr>
+              <w:spacing w:before="60" w:after="60"/>
+            </w:pPr>
+            <w:r>
+              <w:rPr>
+                <w:color w:val="1E293B"/>
+                <w:sz w:val="16"/>
+              </w:rPr>
+              <w:t>Plateforme de démocratie participative augmentée.</w:t>
+            </w:r>
+          </w:p>
+        </w:tc>
+      </w:tr>
+    </w:tbl>
+    <w:p>
+      <w:pPr>
+        <w:spacing w:after="160"/>
+      </w:pPr>
+    </w:p>
+    <w:p>
+      <w:pPr>
         <w:spacing w:before="160" w:after="280"/>
         <w:jc w:val="center"/>
       </w:pPr>
       <w:r>
         <w:drawing>
           <wp:inline xmlns:a="http://schemas.openxmlformats.org/drawingml/2006/main" xmlns:pic="http://schemas.openxmlformats.org/drawingml/2006/picture">
-            <wp:extent cx="5669280" cy="1417320"/>
+            <wp:extent cx="5669280" cy="2559050"/>
             <wp:docPr id="1" name="Picture 1"/>
             <wp:cNvGraphicFramePr>
               <a:graphicFrameLocks noChangeAspect="1"/>
@@ -1643,7 +2167,7 @@
                   <pic:spPr>
                     <a:xfrm>
                       <a:off x="0" y="0"/>
-                      <a:ext cx="5669280" cy="1417320"/>
+                      <a:ext cx="5669280" cy="2559050"/>
                     </a:xfrm>
                     <a:prstGeom prst="rect"/>
                   </pic:spPr>

</xml_diff>

<commit_message>
feat: soften governance section phrasing and generalize bullet points for all ideas across all sections
</commit_message>
<xml_diff>
--- a/Le_Pacte_Nice_IA.docx
+++ b/Le_Pacte_Nice_IA.docx
@@ -171,7 +171,7 @@
                 <w:color w:val="0F172A"/>
                 <w:sz w:val="19"/>
               </w:rPr>
-              <w:t xml:space="preserve">   1.1 Frictions Régionales &amp; Leadership Métropolitain</w:t>
+              <w:t xml:space="preserve">   1.1 Alignement Institutionnel &amp; Leadership Métropolitain</w:t>
             </w:r>
           </w:p>
         </w:tc>
@@ -1080,20 +1080,21 @@
     </w:p>
     <w:p>
       <w:pPr>
-        <w:spacing w:before="60" w:after="160" w:line="288" w:lineRule="auto"/>
+        <w:pStyle w:val="ListBullet"/>
+        <w:spacing w:before="40" w:after="100" w:line="276" w:lineRule="auto"/>
       </w:pPr>
       <w:r>
         <w:rPr>
           <w:b/>
           <w:color w:val="0F172A"/>
         </w:rPr>
-        <w:t>La thèse.</w:t>
+        <w:t>La Thèse Stratégique</w:t>
       </w:r>
       <w:r>
         <w:rPr>
           <w:color w:val="1E293B"/>
         </w:rPr>
-        <w:t xml:space="preserve"> La course aux modèles de frontière se joue à l’échelle des superpuissances. Pour Nice, la vraie bataille stratégique réside dans </w:t>
+        <w:t xml:space="preserve"> : La course aux modèles de frontière se joue à l’échelle des superpuissances. Pour Nice, la vraie bataille stratégique réside dans </w:t>
       </w:r>
       <w:r>
         <w:rPr>
@@ -1132,7 +1133,26 @@
         <w:rPr>
           <w:color w:val="1E293B"/>
         </w:rPr>
-        <w:t xml:space="preserve">. Aucune collectivité n'a encore préempté la position de </w:t>
+        <w:t>.</w:t>
+      </w:r>
+    </w:p>
+    <w:p>
+      <w:pPr>
+        <w:pStyle w:val="ListBullet"/>
+        <w:spacing w:before="40" w:after="100" w:line="276" w:lineRule="auto"/>
+      </w:pPr>
+      <w:r>
+        <w:rPr>
+          <w:b/>
+          <w:color w:val="0F172A"/>
+        </w:rPr>
+        <w:t>La Vision Politique</w:t>
+      </w:r>
+      <w:r>
+        <w:rPr>
+          <w:color w:val="1E293B"/>
+        </w:rPr>
+        <w:t xml:space="preserve"> : Aucune collectivité n'a encore préempté la position de </w:t>
       </w:r>
       <w:r>
         <w:rPr>
@@ -1611,7 +1631,7 @@
     </w:tbl>
     <w:p>
       <w:pPr>
-        <w:spacing w:after="160"/>
+        <w:spacing w:after="120"/>
       </w:pPr>
     </w:p>
     <w:p>
@@ -1631,20 +1651,21 @@
     </w:p>
     <w:p>
       <w:pPr>
-        <w:spacing w:before="60" w:after="160" w:line="288" w:lineRule="auto"/>
+        <w:pStyle w:val="ListBullet"/>
+        <w:spacing w:before="40" w:after="100" w:line="276" w:lineRule="auto"/>
       </w:pPr>
       <w:r>
         <w:rPr>
           <w:b/>
           <w:color w:val="0F172A"/>
         </w:rPr>
-        <w:t>Découpage des Dépenses.</w:t>
+        <w:t>Découpage des Dépenses</w:t>
       </w:r>
       <w:r>
         <w:rPr>
           <w:color w:val="1E293B"/>
         </w:rPr>
-        <w:t xml:space="preserve"> L'investissement annuel brut de 500 k€ / an est découpé par postes d'allocation stratégiques. Grâce au co-financement de l'UE (</w:t>
+        <w:t xml:space="preserve"> : L'investissement annuel brut de 500 k€ / an est découpé par postes d'allocation stratégiques. Grâce au co-financement de l'UE (</w:t>
       </w:r>
       <w:r>
         <w:rPr>
@@ -2210,7 +2231,7 @@
           <w:color w:val="1E3A8A"/>
           <w:sz w:val="25"/>
         </w:rPr>
-        <w:t>1.1 Frictions Régionales &amp; Leadership Métropolitain</w:t>
+        <w:t>1.1 Alignement Institutionnel &amp; Leadership Métropolitain</w:t>
       </w:r>
     </w:p>
     <w:p>
@@ -2298,7 +2319,7 @@
           <w:b/>
           <w:color w:val="0F172A"/>
         </w:rPr>
-        <w:t>Le blocage politique (Constat lucide)</w:t>
+        <w:t>Une gouvernance à unifier (Constat constructif)</w:t>
       </w:r>
       <w:r>
         <w:rPr>
@@ -2311,13 +2332,13 @@
           <w:b/>
           <w:color w:val="0F172A"/>
         </w:rPr>
-        <w:t>Les tensions et rivalités politiques au sein de la Région PACA interfèrent directement dans l'obtention des subventions publiques et régionales</w:t>
+        <w:t>Les frictions institutionnelles et les complexités d'arbitrage au sein de la Région PACA peuvent ralentir l'accès optimal aux subventions</w:t>
       </w:r>
       <w:r>
         <w:rPr>
           <w:color w:val="1E293B"/>
         </w:rPr>
-        <w:t>. Les projets azuréens sont aujourd'hui pénalisés et freinés par ces disputes d'appareil.</w:t>
+        <w:t>. Un alignement direct et unifié est indispensable pour accélérer les financements.</w:t>
       </w:r>
     </w:p>
     <w:p>
@@ -2349,7 +2370,7 @@
         <w:rPr>
           <w:color w:val="1E293B"/>
         </w:rPr>
-        <w:t xml:space="preserve"> permettra d'outrepasser ces blocages politiques régionaux et d'aller capturer directement les subventions auprès de l'État et des guichets européens.</w:t>
+        <w:t xml:space="preserve"> permettra d'outrepasser ces frictions institutionnelles et d'aller capturer directement les subventions auprès de l'État et des guichets européens.</w:t>
       </w:r>
     </w:p>
     <w:p>
@@ -2415,13 +2436,13 @@
           <w:b/>
           <w:color w:val="0F172A"/>
         </w:rPr>
-        <w:t>Synergies Industrielles Grasse &amp; Cannes</w:t>
+        <w:t>Synergie Grasse (Arômes &amp; Parfums)</w:t>
       </w:r>
       <w:r>
         <w:rPr>
           <w:color w:val="1E293B"/>
         </w:rPr>
-        <w:t xml:space="preserve"> :</w:t>
+        <w:t xml:space="preserve"> : Modélisation olfactive, chimie fine et IA sensorielle pour l'industrie aromatique et la santé.</w:t>
       </w:r>
     </w:p>
     <w:p>
@@ -2431,41 +2452,10 @@
       </w:pPr>
       <w:r>
         <w:rPr>
-          <w:color w:val="1E293B"/>
-        </w:rPr>
-        <w:t xml:space="preserve">  - </w:t>
-      </w:r>
-      <w:r>
-        <w:rPr>
           <w:b/>
           <w:color w:val="0F172A"/>
         </w:rPr>
-        <w:t>Grasse (Chimie fine &amp; Arômes/Parfums)</w:t>
-      </w:r>
-      <w:r>
-        <w:rPr>
-          <w:color w:val="1E293B"/>
-        </w:rPr>
-        <w:t xml:space="preserve"> : Modélisation olfactive et IA sensorielle pour l'industrie aromatique et la santé.</w:t>
-      </w:r>
-    </w:p>
-    <w:p>
-      <w:pPr>
-        <w:pStyle w:val="ListBullet"/>
-        <w:spacing w:before="40" w:after="100" w:line="276" w:lineRule="auto"/>
-      </w:pPr>
-      <w:r>
-        <w:rPr>
-          <w:color w:val="1E293B"/>
-        </w:rPr>
-        <w:t xml:space="preserve">  - </w:t>
-      </w:r>
-      <w:r>
-        <w:rPr>
-          <w:b/>
-          <w:color w:val="0F172A"/>
-        </w:rPr>
-        <w:t>Cannes (Thales Alenia Space)</w:t>
+        <w:t>Synergie Cannes (Thales Alenia Space)</w:t>
       </w:r>
       <w:r>
         <w:rPr>
@@ -2582,13 +2572,21 @@
     </w:p>
     <w:p>
       <w:pPr>
-        <w:spacing w:before="60" w:after="160" w:line="288" w:lineRule="auto"/>
+        <w:pStyle w:val="ListBullet"/>
+        <w:spacing w:before="40" w:after="100" w:line="276" w:lineRule="auto"/>
       </w:pPr>
+      <w:r>
+        <w:rPr>
+          <w:b/>
+          <w:color w:val="0F172A"/>
+        </w:rPr>
+        <w:t>Positionnement Stratégique</w:t>
+      </w:r>
       <w:r>
         <w:rPr>
           <w:color w:val="1E293B"/>
         </w:rPr>
-        <w:t xml:space="preserve">Afin d'emporter l'adhésion de l'État et de la Commission Européenne, le territoire fait valoir son </w:t>
+        <w:t xml:space="preserve"> : Afin d'emporter l'adhésion de l'État et de la Commission Européenne, le territoire fait valoir son </w:t>
       </w:r>
       <w:r>
         <w:rPr>
@@ -2731,7 +2729,7 @@
         <w:rPr>
           <w:color w:val="1E293B"/>
         </w:rPr>
-        <w:t xml:space="preserve"> : Premier Cloud d'État souverain d'Europe (certifié AMSN), garantissant une étanchéité totale contre le Cloud Act américain et relié en fibre noire dédiée à Nice.</w:t>
+        <w:t xml:space="preserve"> : Premier Cloud d'État souverain d'Europe (certifié AMSN), garantissant une étanchéité totale contre le Cloud Act américain, connecté en fibre noire dédiée à Nice.</w:t>
       </w:r>
     </w:p>
     <w:p>
@@ -2827,13 +2825,21 @@
     </w:p>
     <w:p>
       <w:pPr>
-        <w:spacing w:before="60" w:after="160" w:line="288" w:lineRule="auto"/>
+        <w:pStyle w:val="ListBullet"/>
+        <w:spacing w:before="40" w:after="100" w:line="276" w:lineRule="auto"/>
       </w:pPr>
+      <w:r>
+        <w:rPr>
+          <w:b/>
+          <w:color w:val="0F172A"/>
+        </w:rPr>
+        <w:t>L'Appel d'Offres Européen</w:t>
+      </w:r>
       <w:r>
         <w:rPr>
           <w:color w:val="1E293B"/>
         </w:rPr>
-        <w:t xml:space="preserve">Le </w:t>
+        <w:t xml:space="preserve"> : Le </w:t>
       </w:r>
       <w:r>
         <w:rPr>
@@ -2872,7 +2878,7 @@
         <w:rPr>
           <w:color w:val="1E293B"/>
         </w:rPr>
-        <w:t xml:space="preserve"> en Europe :</w:t>
+        <w:t xml:space="preserve"> en Europe.</w:t>
       </w:r>
     </w:p>
     <w:p>
@@ -2981,13 +2987,21 @@
     </w:p>
     <w:p>
       <w:pPr>
-        <w:spacing w:before="60" w:after="160" w:line="288" w:lineRule="auto"/>
+        <w:pStyle w:val="ListBullet"/>
+        <w:spacing w:before="40" w:after="100" w:line="276" w:lineRule="auto"/>
       </w:pPr>
+      <w:r>
+        <w:rPr>
+          <w:b/>
+          <w:color w:val="0F172A"/>
+        </w:rPr>
+        <w:t>Méthodologie d'Action</w:t>
+      </w:r>
       <w:r>
         <w:rPr>
           <w:color w:val="1E293B"/>
         </w:rPr>
-        <w:t>Pour transformer cette ambition en victoires financières, l'approche doit être structurée immédiatement selon 4 actions de frappe :</w:t>
+        <w:t xml:space="preserve"> : Pour transformer cette ambition en victoires financières, l'approche est structurée immédiatement selon 4 actions de frappe :</w:t>
       </w:r>
     </w:p>
     <w:p>
@@ -3083,7 +3097,26 @@
           <w:color w:val="0F172A"/>
           <w:sz w:val="30"/>
         </w:rPr>
-        <w:t>2. Pôle 1 : Axe Ville de Nice (Proximité, Sécurité &amp; Cadre de Vie)</w:t>
+        <w:t>2. Pôle 1 : Axe Ville de Nice (Sécurité &amp; Cadre de Vie)</w:t>
+      </w:r>
+    </w:p>
+    <w:p>
+      <w:pPr>
+        <w:pStyle w:val="ListBullet"/>
+        <w:spacing w:before="40" w:after="100" w:line="276" w:lineRule="auto"/>
+      </w:pPr>
+      <w:r>
+        <w:rPr>
+          <w:b/>
+          <w:color w:val="0F172A"/>
+        </w:rPr>
+        <w:t>Objectif Opérationnel</w:t>
+      </w:r>
+      <w:r>
+        <w:rPr>
+          <w:color w:val="1E293B"/>
+        </w:rPr>
+        <w:t xml:space="preserve"> : Le Pôle Ville concentre les applications de l'IA au service direct des Niçois, du cadre de vie et de la tranquillité publique. L'objectif est d'utiliser l'IA comme un accélérateur d'efficacité sur le terrain et de proximité municipale.</w:t>
       </w:r>
     </w:p>
     <w:p>
@@ -3103,13 +3136,21 @@
     </w:p>
     <w:p>
       <w:pPr>
-        <w:spacing w:before="60" w:after="160" w:line="288" w:lineRule="auto"/>
+        <w:pStyle w:val="ListBullet"/>
+        <w:spacing w:before="40" w:after="100" w:line="276" w:lineRule="auto"/>
       </w:pPr>
+      <w:r>
+        <w:rPr>
+          <w:b/>
+          <w:color w:val="0F172A"/>
+        </w:rPr>
+        <w:t>Le Constat Opérationnel</w:t>
+      </w:r>
       <w:r>
         <w:rPr>
           <w:color w:val="1E293B"/>
         </w:rPr>
-        <w:t xml:space="preserve">Nice dispose du 1er CSU de France (4 300+ caméras). L'enjeu clé de la Vidéosurveillance Algorithmique (VSA - Art. 10 Loi JOP 2024 / Jurisprudence Conseil d'État 2026) est un </w:t>
+        <w:t xml:space="preserve"> : Nice dispose du 1er CSU de France (4 300+ caméras). L'enjeu clé de la Vidéosurveillance Algorithmique (VSA - Art. 10 Loi JOP 2024 / Jurisprudence Conseil d'État 2026) est un </w:t>
       </w:r>
       <w:r>
         <w:rPr>
@@ -3122,7 +3163,7 @@
         <w:rPr>
           <w:color w:val="1E293B"/>
         </w:rPr>
-        <w:t xml:space="preserve"> :</w:t>
+        <w:t>.</w:t>
       </w:r>
     </w:p>
     <w:p>
@@ -3244,13 +3285,21 @@
     </w:p>
     <w:p>
       <w:pPr>
-        <w:spacing w:before="60" w:after="160" w:line="288" w:lineRule="auto"/>
+        <w:pStyle w:val="ListBullet"/>
+        <w:spacing w:before="40" w:after="100" w:line="276" w:lineRule="auto"/>
       </w:pPr>
+      <w:r>
+        <w:rPr>
+          <w:b/>
+          <w:color w:val="0F172A"/>
+        </w:rPr>
+        <w:t>L'Agent Vocal Souverain</w:t>
+      </w:r>
       <w:r>
         <w:rPr>
           <w:color w:val="1E293B"/>
         </w:rPr>
-        <w:t>Mise en place d'un agent vocal souverain basé sur un modèle de langage local dédié aux citoyens niçois et aux aînés.</w:t>
+        <w:t xml:space="preserve"> : Mise en place d'un agent vocal souverain basé sur un modèle de langage local dédié aux citoyens niçois et aux aînés.</w:t>
       </w:r>
     </w:p>
     <w:p>
@@ -3334,13 +3383,21 @@
     </w:p>
     <w:p>
       <w:pPr>
-        <w:spacing w:before="60" w:after="160" w:line="288" w:lineRule="auto"/>
+        <w:pStyle w:val="ListBullet"/>
+        <w:spacing w:before="40" w:after="100" w:line="276" w:lineRule="auto"/>
       </w:pPr>
+      <w:r>
+        <w:rPr>
+          <w:b/>
+          <w:color w:val="0F172A"/>
+        </w:rPr>
+        <w:t>Capteurs Embarqués VSA</w:t>
+      </w:r>
       <w:r>
         <w:rPr>
           <w:color w:val="1E293B"/>
         </w:rPr>
-        <w:t>Caméras embarquées VSA sur les véhicules de propreté urbaine pour cartographier en temps réel l'état des rues.</w:t>
+        <w:t xml:space="preserve"> : Caméras embarquées VSA sur les véhicules de propreté urbaine pour cartographier en temps réel l'état des rues.</w:t>
       </w:r>
     </w:p>
     <w:p>
@@ -3398,13 +3455,21 @@
     </w:p>
     <w:p>
       <w:pPr>
-        <w:spacing w:before="60" w:after="160" w:line="288" w:lineRule="auto"/>
+        <w:pStyle w:val="ListBullet"/>
+        <w:spacing w:before="40" w:after="100" w:line="276" w:lineRule="auto"/>
       </w:pPr>
+      <w:r>
+        <w:rPr>
+          <w:b/>
+          <w:color w:val="0F172A"/>
+        </w:rPr>
+        <w:t>Démocratie Participative Augmentée</w:t>
+      </w:r>
       <w:r>
         <w:rPr>
           <w:color w:val="1E293B"/>
         </w:rPr>
-        <w:t>Déploiement de la plateforme de démocratie participative augmentée par l'</w:t>
+        <w:t xml:space="preserve"> : Déploiement de la plateforme de démocratie participative augmentée par l'</w:t>
       </w:r>
       <w:r>
         <w:rPr>
@@ -3514,13 +3579,21 @@
     </w:p>
     <w:p>
       <w:pPr>
-        <w:spacing w:before="60" w:after="160" w:line="288" w:lineRule="auto"/>
+        <w:pStyle w:val="ListBullet"/>
+        <w:spacing w:before="40" w:after="100" w:line="276" w:lineRule="auto"/>
       </w:pPr>
+      <w:r>
+        <w:rPr>
+          <w:b/>
+          <w:color w:val="0F172A"/>
+        </w:rPr>
+        <w:t>Ingestion des Marchés</w:t>
+      </w:r>
       <w:r>
         <w:rPr>
           <w:color w:val="1E293B"/>
         </w:rPr>
-        <w:t xml:space="preserve">Analyse sémantique à 100 % des factures, devis et BPU sur les </w:t>
+        <w:t xml:space="preserve"> : Analyse sémantique à 100 % des factures, devis et BPU sur les </w:t>
       </w:r>
       <w:r>
         <w:rPr>
@@ -3552,7 +3625,7 @@
         <w:rPr>
           <w:color w:val="1E293B"/>
         </w:rPr>
-        <w:t xml:space="preserve"> : Filtrage automatisé de 0,5 % à 2,0 % de doublons, erreurs de facturation et dépassements de bordereaux (Benchmark DGFiP). sur 300 M€, 0,83 % d'erreurs détectées génère </w:t>
+        <w:t xml:space="preserve"> : Filtrage automatisé de 0,5 % à 2,0 % de doublons, erreurs de facturation et dépassements de bordereaux (Benchmark DGFiP). Sur 300 M€, 0,83 % d'erreurs détectées génère </w:t>
       </w:r>
       <w:r>
         <w:rPr>
@@ -3585,13 +3658,21 @@
     </w:p>
     <w:p>
       <w:pPr>
-        <w:spacing w:before="60" w:after="160" w:line="288" w:lineRule="auto"/>
+        <w:pStyle w:val="ListBullet"/>
+        <w:spacing w:before="40" w:after="100" w:line="276" w:lineRule="auto"/>
       </w:pPr>
+      <w:r>
+        <w:rPr>
+          <w:b/>
+          <w:color w:val="0F172A"/>
+        </w:rPr>
+        <w:t>Protection Inviolable du CSU</w:t>
+      </w:r>
       <w:r>
         <w:rPr>
           <w:color w:val="1E293B"/>
         </w:rPr>
-        <w:t>SOC métropolitain 24/7 armé d'agents IA autonomes et isolation étanche (Air-Gap) du CSU.</w:t>
+        <w:t xml:space="preserve"> : SOC métropolitain 24/7 armé d'agents IA autonomes et isolation étanche (Air-Gap) du CSU.</w:t>
       </w:r>
     </w:p>
     <w:p>
@@ -3643,13 +3724,21 @@
     </w:p>
     <w:p>
       <w:pPr>
-        <w:spacing w:before="60" w:after="160" w:line="288" w:lineRule="auto"/>
+        <w:pStyle w:val="ListBullet"/>
+        <w:spacing w:before="40" w:after="100" w:line="276" w:lineRule="auto"/>
       </w:pPr>
+      <w:r>
+        <w:rPr>
+          <w:b/>
+          <w:color w:val="0F172A"/>
+        </w:rPr>
+        <w:t>Partenariat d'Hébergement Souverain</w:t>
+      </w:r>
       <w:r>
         <w:rPr>
           <w:color w:val="1E293B"/>
         </w:rPr>
-        <w:t>Migration souveraine vers Monaco Cloud (1er Cloud d'État UE certifié AMSN).</w:t>
+        <w:t xml:space="preserve"> : Migration souveraine vers Monaco Cloud (1er Cloud d'État UE certifié AMSN).</w:t>
       </w:r>
     </w:p>
     <w:p>
@@ -3721,13 +3810,21 @@
     </w:p>
     <w:p>
       <w:pPr>
-        <w:spacing w:before="60" w:after="160" w:line="288" w:lineRule="auto"/>
+        <w:pStyle w:val="ListBullet"/>
+        <w:spacing w:before="40" w:after="100" w:line="276" w:lineRule="auto"/>
       </w:pPr>
+      <w:r>
+        <w:rPr>
+          <w:b/>
+          <w:color w:val="0F172A"/>
+        </w:rPr>
+        <w:t>L'Atout Juridique Binational</w:t>
+      </w:r>
       <w:r>
         <w:rPr>
           <w:color w:val="1E293B"/>
         </w:rPr>
-        <w:t xml:space="preserve">La collaboration binationale avec la Principauté de Monaco n'est pas un simple accord d'affichage, mais le </w:t>
+        <w:t xml:space="preserve"> : La collaboration binationale avec la Principauté de Monaco n'est pas un simple accord d'affichage, mais le </w:t>
       </w:r>
       <w:r>
         <w:rPr>
@@ -3740,7 +3837,7 @@
         <w:rPr>
           <w:color w:val="1E293B"/>
         </w:rPr>
-        <w:t xml:space="preserve"> :</w:t>
+        <w:t>.</w:t>
       </w:r>
     </w:p>
     <w:p>
@@ -3798,13 +3895,21 @@
     </w:p>
     <w:p>
       <w:pPr>
-        <w:spacing w:before="60" w:after="160" w:line="288" w:lineRule="auto"/>
+        <w:pStyle w:val="ListBullet"/>
+        <w:spacing w:before="40" w:after="100" w:line="276" w:lineRule="auto"/>
       </w:pPr>
+      <w:r>
+        <w:rPr>
+          <w:b/>
+          <w:color w:val="0F172A"/>
+        </w:rPr>
+        <w:t>L'Expertise Réglementaire Nationale</w:t>
+      </w:r>
       <w:r>
         <w:rPr>
           <w:color w:val="1E293B"/>
         </w:rPr>
-        <w:t xml:space="preserve">Nice s'impose comme le </w:t>
+        <w:t xml:space="preserve"> : Nice s'impose comme le </w:t>
       </w:r>
       <w:r>
         <w:rPr>
@@ -3988,7 +4093,7 @@
         <w:rPr>
           <w:color w:val="1E293B"/>
         </w:rPr>
-        <w:t xml:space="preserve"> : Dépôt officiel du dossier de candidature binationale Nice-Monaco pour l'appel d'offres AI Gigafactory (500 M€ UE).</w:t>
+        <w:t xml:space="preserve"> : Dépôt officiel du dossier de candidature binationale Nice-Monaco pour l'appel d'offres AI Gigafactories (500 M€ UE).</w:t>
       </w:r>
     </w:p>
     <w:p>

</xml_diff>

<commit_message>
feat: restore 3-year detailed roadmap and reduce project director cost to 65k€/year (2.5 days/week) with 435k€/year total budget
</commit_message>
<xml_diff>
--- a/Le_Pacte_Nice_IA.docx
+++ b/Le_Pacte_Nice_IA.docx
@@ -1646,7 +1646,7 @@
           <w:color w:val="1E3A8A"/>
           <w:sz w:val="25"/>
         </w:rPr>
-        <w:t>Ventilation du Coût Budgétaire IA par Allocation (500 k€ / an)</w:t>
+        <w:t>Ventilation du Coût Budgétaire IA par Allocation (435 k€ / an)</w:t>
       </w:r>
     </w:p>
     <w:p>
@@ -1665,7 +1665,20 @@
         <w:rPr>
           <w:color w:val="1E293B"/>
         </w:rPr>
-        <w:t xml:space="preserve"> : L'investissement annuel brut de 500 k€ / an est découpé par postes d'allocation stratégiques. Grâce au co-financement de l'UE (</w:t>
+        <w:t xml:space="preserve"> : L'investissement annuel brut est optimisé à </w:t>
+      </w:r>
+      <w:r>
+        <w:rPr>
+          <w:b/>
+          <w:color w:val="0F172A"/>
+        </w:rPr>
+        <w:t>435 k€ / an</w:t>
+      </w:r>
+      <w:r>
+        <w:rPr>
+          <w:color w:val="1E293B"/>
+        </w:rPr>
+        <w:t xml:space="preserve"> (grâce à l'engagement en temps partagé 2,5j/sem de la Direction de Projet à 65 k€). Avec le co-financement UE (</w:t>
       </w:r>
       <w:r>
         <w:rPr>
@@ -1677,14 +1690,14 @@
         <w:rPr>
           <w:color w:val="1E293B"/>
         </w:rPr>
-        <w:t xml:space="preserve"> à 50 %), le reste à charge net pour la Métropole est de seulement </w:t>
+        <w:t xml:space="preserve"> à 50 %), le reste à charge net métropolitain descend à seulement </w:t>
       </w:r>
       <w:r>
         <w:rPr>
           <w:b/>
           <w:color w:val="0F172A"/>
         </w:rPr>
-        <w:t>250 k€ / an</w:t>
+        <w:t>~217 k€ / an</w:t>
       </w:r>
       <w:r>
         <w:rPr>
@@ -1834,7 +1847,7 @@
                 <w:color w:val="1E293B"/>
                 <w:sz w:val="16"/>
               </w:rPr>
-              <w:t>30 %</w:t>
+              <w:t>34,5 %</w:t>
             </w:r>
           </w:p>
         </w:tc>
@@ -1908,7 +1921,7 @@
                 <w:color w:val="1E293B"/>
                 <w:sz w:val="16"/>
               </w:rPr>
-              <w:t>24 %</w:t>
+              <w:t>27,6 %</w:t>
             </w:r>
           </w:p>
         </w:tc>
@@ -1946,7 +1959,7 @@
                 <w:color w:val="1E293B"/>
                 <w:sz w:val="16"/>
               </w:rPr>
-              <w:t>3. Direction de Projet (AMO IA) &amp; Ingénierie</w:t>
+              <w:t>3. Direction de Projet (Benoît SIGWALD - 2,5j/sem)</w:t>
             </w:r>
           </w:p>
         </w:tc>
@@ -1964,7 +1977,7 @@
                 <w:color w:val="1E293B"/>
                 <w:sz w:val="16"/>
               </w:rPr>
-              <w:t>130 k€</w:t>
+              <w:t>65 k€</w:t>
             </w:r>
           </w:p>
         </w:tc>
@@ -1982,7 +1995,7 @@
                 <w:color w:val="1E293B"/>
                 <w:sz w:val="16"/>
               </w:rPr>
-              <w:t>26 %</w:t>
+              <w:t>14,9 %</w:t>
             </w:r>
           </w:p>
         </w:tc>
@@ -2000,7 +2013,7 @@
                 <w:color w:val="1E293B"/>
                 <w:sz w:val="16"/>
               </w:rPr>
-              <w:t>Direction de projet (Benoît SIGWALD), suivi des marchés.</w:t>
+              <w:t>Direction de projet (2,5j/semaine), suivi des marchés.</w:t>
             </w:r>
           </w:p>
         </w:tc>
@@ -2056,7 +2069,7 @@
                 <w:color w:val="1E293B"/>
                 <w:sz w:val="16"/>
               </w:rPr>
-              <w:t>12 %</w:t>
+              <w:t>13,8 %</w:t>
             </w:r>
           </w:p>
         </w:tc>
@@ -2130,7 +2143,7 @@
                 <w:color w:val="1E293B"/>
                 <w:sz w:val="16"/>
               </w:rPr>
-              <w:t>8 %</w:t>
+              <w:t>9,2 %</w:t>
             </w:r>
           </w:p>
         </w:tc>
@@ -4040,7 +4053,7 @@
           <w:b/>
           <w:color w:val="0F172A"/>
         </w:rPr>
-        <w:t>Nomination du Directeur du Projet Pacte Nice IA</w:t>
+        <w:t>Direction du Projet Pacte Nice IA (Temps Partagé)</w:t>
       </w:r>
       <w:r>
         <w:rPr>
@@ -4059,7 +4072,46 @@
         <w:rPr>
           <w:color w:val="1E293B"/>
         </w:rPr>
-        <w:t>, Senior AI Architect &amp; AMO IA Métropolitain, chargé du pilotage opérationnel, du déploiement technique et de la gestion des candidatures européennes.</w:t>
+        <w:t xml:space="preserve">, Senior AI Architect &amp; AMO IA Métropolitain. Engagement optimisé à </w:t>
+      </w:r>
+      <w:r>
+        <w:rPr>
+          <w:b/>
+          <w:color w:val="0F172A"/>
+        </w:rPr>
+        <w:t>2 à 3 jours par semaine</w:t>
+      </w:r>
+      <w:r>
+        <w:rPr>
+          <w:color w:val="1E293B"/>
+        </w:rPr>
+        <w:t xml:space="preserve">, réduisant l'honoraires de direction de projet à seulement </w:t>
+      </w:r>
+      <w:r>
+        <w:rPr>
+          <w:b/>
+          <w:color w:val="0F172A"/>
+        </w:rPr>
+        <w:t>65 k€ / an</w:t>
+      </w:r>
+      <w:r>
+        <w:rPr>
+          <w:color w:val="1E293B"/>
+        </w:rPr>
+        <w:t xml:space="preserve"> (au lieu de 130 k€), ramenant le budget total annuel brut à </w:t>
+      </w:r>
+      <w:r>
+        <w:rPr>
+          <w:b/>
+          <w:color w:val="0F172A"/>
+        </w:rPr>
+        <w:t>435 k€ / an</w:t>
+      </w:r>
+      <w:r>
+        <w:rPr>
+          <w:color w:val="1E293B"/>
+        </w:rPr>
+        <w:t xml:space="preserve"> (~217 k€ / an net après co-financement UE).</w:t>
       </w:r>
     </w:p>
     <w:p>
@@ -4074,7 +4126,7 @@
           <w:color w:val="1E3A8A"/>
           <w:sz w:val="25"/>
         </w:rPr>
-        <w:t>5.2 Feuille de Route Réaliste Synchronisée AI Gigafactory</w:t>
+        <w:t>5.2 Feuille de Route 36 Mois &amp; Allocations Budgétaires Annuelles</w:t>
       </w:r>
     </w:p>
     <w:p>
@@ -4087,13 +4139,28 @@
           <w:b/>
           <w:color w:val="0F172A"/>
         </w:rPr>
-        <w:t>Échéance Couperet (12 Novembre 2026)</w:t>
+        <w:t>Échéance Imminente (12 Novembre 2026)</w:t>
       </w:r>
       <w:r>
         <w:rPr>
           <w:color w:val="1E293B"/>
         </w:rPr>
         <w:t xml:space="preserve"> : Dépôt officiel du dossier de candidature binationale Nice-Monaco pour l'appel d'offres AI Gigafactories (500 M€ UE).</w:t>
+      </w:r>
+    </w:p>
+    <w:p>
+      <w:pPr>
+        <w:keepNext/>
+        <w:spacing w:before="200" w:after="80"/>
+      </w:pPr>
+      <w:r>
+        <w:rPr>
+          <w:rFonts w:ascii="Arial" w:hAnsi="Arial"/>
+          <w:b/>
+          <w:color w:val="334155"/>
+          <w:sz w:val="21"/>
+        </w:rPr>
+        <w:t>Phase 1 — Amorçage, Candidature Gigafactory &amp; CSU (Année 1 : 2026-2027 / 435 k€ brut)</w:t>
       </w:r>
     </w:p>
     <w:p>
@@ -4106,13 +4173,13 @@
           <w:b/>
           <w:color w:val="0F172A"/>
         </w:rPr>
-        <w:t>Phase 1 (100 Jours - Fin 2026)</w:t>
+        <w:t>Bilan Budgétaire Année 1</w:t>
       </w:r>
       <w:r>
         <w:rPr>
           <w:color w:val="1E293B"/>
         </w:rPr>
-        <w:t xml:space="preserve"> : Vote de la délibération cadre métropolitaine, constitution du bureau de candidature binationale et marché VSA CSU.</w:t>
+        <w:t xml:space="preserve"> : Direction de projet 65 k€ | Licences VSA CSU 130 k€ | Ingestion Cloud/Fibre Monaco 110 k€ | Audit AI Act &amp; Cyber NIS 2 80 k€ | Démocratie Participative Einstein 50 k€.</w:t>
       </w:r>
     </w:p>
     <w:p>
@@ -4125,13 +4192,13 @@
           <w:b/>
           <w:color w:val="0F172A"/>
         </w:rPr>
-        <w:t>Phase 2 (12 Mois - Mid 2027)</w:t>
+        <w:t>Action 100 Jours</w:t>
       </w:r>
       <w:r>
         <w:rPr>
           <w:color w:val="1E293B"/>
         </w:rPr>
-        <w:t xml:space="preserve"> : Déploiement d'Allo Niçois Séniors, audit IA des 300 M€ de marchés publics et labellisation du premier lot d'IA métropolitaines.</w:t>
+        <w:t xml:space="preserve"> : Vote de la délibération cadre métropolitaine &amp; création du Bureau de Candidature Binationale Nice-Monaco-Sophia.</w:t>
       </w:r>
     </w:p>
     <w:p>
@@ -4144,26 +4211,221 @@
           <w:b/>
           <w:color w:val="0F172A"/>
         </w:rPr>
-        <w:t>Phase 3 (36 Mois - 2029)</w:t>
+        <w:t>Action 6 Mois</w:t>
       </w:r>
       <w:r>
         <w:rPr>
           <w:color w:val="1E293B"/>
         </w:rPr>
-        <w:t xml:space="preserve"> : Bilan certifié des </w:t>
-      </w:r>
+        <w:t xml:space="preserve"> : Déploiement du filtrage VSA sur le CSU (4 300 caméras) + géolocalisation et dispatching des patrouilles PM.</w:t>
+      </w:r>
+    </w:p>
+    <w:p>
+      <w:pPr>
+        <w:pStyle w:val="ListBullet"/>
+        <w:spacing w:before="40" w:after="100" w:line="276" w:lineRule="auto"/>
+      </w:pPr>
       <w:r>
         <w:rPr>
           <w:b/>
           <w:color w:val="0F172A"/>
         </w:rPr>
-        <w:t>+2,5 M€/an d'économies</w:t>
+        <w:t>Action 12 Mois</w:t>
       </w:r>
       <w:r>
         <w:rPr>
           <w:color w:val="1E293B"/>
         </w:rPr>
-        <w:t>, opérationnalité de la AI Gigafactory Nice-Monaco et consécration de Nice comme Capitale de l'IA de Sécurité.</w:t>
+        <w:t xml:space="preserve"> : Ingestion sémantique du premier lot de factures de la commande publique métropolitaine (300 M€).</w:t>
+      </w:r>
+    </w:p>
+    <w:p>
+      <w:pPr>
+        <w:keepNext/>
+        <w:spacing w:before="200" w:after="80"/>
+      </w:pPr>
+      <w:r>
+        <w:rPr>
+          <w:rFonts w:ascii="Arial" w:hAnsi="Arial"/>
+          <w:b/>
+          <w:color w:val="334155"/>
+          <w:sz w:val="21"/>
+        </w:rPr>
+        <w:t>Phase 2 — Échelle, Allo Niçois 24/7 &amp; Audit Commande Publique (Année 2 : 2027-2028 / 435 k€ brut)</w:t>
+      </w:r>
+    </w:p>
+    <w:p>
+      <w:pPr>
+        <w:pStyle w:val="ListBullet"/>
+        <w:spacing w:before="40" w:after="100" w:line="276" w:lineRule="auto"/>
+      </w:pPr>
+      <w:r>
+        <w:rPr>
+          <w:b/>
+          <w:color w:val="0F172A"/>
+        </w:rPr>
+        <w:t>Bilan Budgétaire Année 2</w:t>
+      </w:r>
+      <w:r>
+        <w:rPr>
+          <w:color w:val="1E293B"/>
+        </w:rPr>
+        <w:t xml:space="preserve"> : Direction de projet 65 k€ | Licences Vocal &amp; Propreté 160 k€ | Cloud Souverain Monaco 125 k€ | Maintien Cyber NIS 2 &amp; AI Act 50 k€ | Concertation Einstein Quartiers 35 k€.</w:t>
+      </w:r>
+    </w:p>
+    <w:p>
+      <w:pPr>
+        <w:pStyle w:val="ListBullet"/>
+        <w:spacing w:before="40" w:after="100" w:line="276" w:lineRule="auto"/>
+      </w:pPr>
+      <w:r>
+        <w:rPr>
+          <w:b/>
+          <w:color w:val="0F172A"/>
+        </w:rPr>
+        <w:t>Lancement Guichet Vocal</w:t>
+      </w:r>
+      <w:r>
+        <w:rPr>
+          <w:color w:val="1E293B"/>
+        </w:rPr>
+        <w:t xml:space="preserve"> : Déploiement d'Allo Niçois Séniors 24/7 pour la prise en charge immédiate des demandes d'aide d'urgence et démarches.</w:t>
+      </w:r>
+    </w:p>
+    <w:p>
+      <w:pPr>
+        <w:pStyle w:val="ListBullet"/>
+        <w:spacing w:before="40" w:after="100" w:line="276" w:lineRule="auto"/>
+      </w:pPr>
+      <w:r>
+        <w:rPr>
+          <w:b/>
+          <w:color w:val="0F172A"/>
+        </w:rPr>
+        <w:t>Résultats Financiers Certifiés</w:t>
+      </w:r>
+      <w:r>
+        <w:rPr>
+          <w:color w:val="1E293B"/>
+        </w:rPr>
+        <w:t xml:space="preserve"> : Première rentrée de </w:t>
+      </w:r>
+      <w:r>
+        <w:rPr>
+          <w:b/>
+          <w:color w:val="0F172A"/>
+        </w:rPr>
+        <w:t>+2,50 M€ d'économies nettes</w:t>
+      </w:r>
+      <w:r>
+        <w:rPr>
+          <w:color w:val="1E293B"/>
+        </w:rPr>
+        <w:t xml:space="preserve"> sur la commande publique métropolitaine.</w:t>
+      </w:r>
+    </w:p>
+    <w:p>
+      <w:pPr>
+        <w:pStyle w:val="ListBullet"/>
+        <w:spacing w:before="40" w:after="100" w:line="276" w:lineRule="auto"/>
+      </w:pPr>
+      <w:r>
+        <w:rPr>
+          <w:b/>
+          <w:color w:val="0F172A"/>
+        </w:rPr>
+        <w:t>Certification AI Act</w:t>
+      </w:r>
+      <w:r>
+        <w:rPr>
+          <w:color w:val="1E293B"/>
+        </w:rPr>
+        <w:t xml:space="preserve"> : Labellisation et audit conformité du Hub Réglementaire Nice-Monaco.</w:t>
+      </w:r>
+    </w:p>
+    <w:p>
+      <w:pPr>
+        <w:keepNext/>
+        <w:spacing w:before="200" w:after="80"/>
+      </w:pPr>
+      <w:r>
+        <w:rPr>
+          <w:rFonts w:ascii="Arial" w:hAnsi="Arial"/>
+          <w:b/>
+          <w:color w:val="334155"/>
+          <w:sz w:val="21"/>
+        </w:rPr>
+        <w:t>Phase 3 — Consécration, Opérationnalité Gigafactory &amp; Autonomie (Année 3 : 2028-2029 / 435 k€ brut)</w:t>
+      </w:r>
+    </w:p>
+    <w:p>
+      <w:pPr>
+        <w:pStyle w:val="ListBullet"/>
+        <w:spacing w:before="40" w:after="100" w:line="276" w:lineRule="auto"/>
+      </w:pPr>
+      <w:r>
+        <w:rPr>
+          <w:b/>
+          <w:color w:val="0F172A"/>
+        </w:rPr>
+        <w:t>Bilan Budgétaire Année 3</w:t>
+      </w:r>
+      <w:r>
+        <w:rPr>
+          <w:color w:val="1E293B"/>
+        </w:rPr>
+        <w:t xml:space="preserve"> : Direction de projet 65 k€ | Maintenance IA &amp; Sobriété 160 k€ | Cloud Monaco &amp; Supercalculateur 125 k€ | Audit NIS 2 50 k€ | Concertation Récurrente 35 k€.</w:t>
+      </w:r>
+    </w:p>
+    <w:p>
+      <w:pPr>
+        <w:pStyle w:val="ListBullet"/>
+        <w:spacing w:before="40" w:after="100" w:line="276" w:lineRule="auto"/>
+      </w:pPr>
+      <w:r>
+        <w:rPr>
+          <w:b/>
+          <w:color w:val="0F172A"/>
+        </w:rPr>
+        <w:t>Opérationnalité AI Gigafactory</w:t>
+      </w:r>
+      <w:r>
+        <w:rPr>
+          <w:color w:val="1E293B"/>
+        </w:rPr>
+        <w:t xml:space="preserve"> : Mise en service du Supercalculateur IA binationale Nice-Monaco co-financé par l'UE.</w:t>
+      </w:r>
+    </w:p>
+    <w:p>
+      <w:pPr>
+        <w:pStyle w:val="ListBullet"/>
+        <w:spacing w:before="40" w:after="100" w:line="276" w:lineRule="auto"/>
+      </w:pPr>
+      <w:r>
+        <w:rPr>
+          <w:b/>
+          <w:color w:val="0F172A"/>
+        </w:rPr>
+        <w:t>Bilan Triennal Certifié</w:t>
+      </w:r>
+      <w:r>
+        <w:rPr>
+          <w:color w:val="1E293B"/>
+        </w:rPr>
+        <w:t xml:space="preserve"> : Inscription durable de </w:t>
+      </w:r>
+      <w:r>
+        <w:rPr>
+          <w:b/>
+          <w:color w:val="0F172A"/>
+        </w:rPr>
+        <w:t>+2,5 M€/an d'économies nettes</w:t>
+      </w:r>
+      <w:r>
+        <w:rPr>
+          <w:color w:val="1E293B"/>
+        </w:rPr>
+        <w:t xml:space="preserve"> et consécration de Nice comme Capitale de l'IA de Sécurité &amp; d'Efficience Publique.</w:t>
       </w:r>
     </w:p>
     <w:p>

</xml_diff>

<commit_message>
feat: add detailed element-by-element roadmap table with specific budgets and quarterly financial breakdown
</commit_message>
<xml_diff>
--- a/Le_Pacte_Nice_IA.docx
+++ b/Le_Pacte_Nice_IA.docx
@@ -909,7 +909,7 @@
                 <w:color w:val="0F172A"/>
                 <w:sz w:val="19"/>
               </w:rPr>
-              <w:t>5. Gouvernance, Direction de Projet &amp; Jalons Gigafactory</w:t>
+              <w:t>5. Gouvernance, Feuille de Route Détaillée &amp; Budget par Trimestre</w:t>
             </w:r>
           </w:p>
         </w:tc>
@@ -950,7 +950,7 @@
                 <w:color w:val="0F172A"/>
                 <w:sz w:val="19"/>
               </w:rPr>
-              <w:t xml:space="preserve">   5.1 Présidence Éric Ciotti &amp; Direction Benoît SIGWALD</w:t>
+              <w:t xml:space="preserve">   5.1 Présidence Éric Ciotti &amp; Direction Benoît SIGWALD (2,5j/sem)</w:t>
             </w:r>
           </w:p>
         </w:tc>
@@ -991,7 +991,7 @@
                 <w:color w:val="0F172A"/>
                 <w:sz w:val="19"/>
               </w:rPr>
-              <w:t xml:space="preserve">   5.2 Feuille de Route Réaliste Synchronisée AI Gigafactory</w:t>
+              <w:t xml:space="preserve">   5.2 Feuille de Route Détaillée &amp; Budget par Éléments (36 Mois)</w:t>
             </w:r>
           </w:p>
         </w:tc>
@@ -1032,7 +1032,7 @@
                 <w:color w:val="0F172A"/>
                 <w:sz w:val="19"/>
               </w:rPr>
-              <w:t>6. Annexe : Justifications des Gains &amp; Sources Documentaires</w:t>
+              <w:t xml:space="preserve">   5.3 Tableau de Synthèse Budgétaire Trimestriel (Q1 à Q12)</w:t>
             </w:r>
           </w:p>
         </w:tc>
@@ -1052,7 +1052,48 @@
                 <w:color w:val="64748B"/>
                 <w:sz w:val="18"/>
               </w:rPr>
-              <w:t>Page 10</w:t>
+              <w:t>Page 11</w:t>
+            </w:r>
+          </w:p>
+        </w:tc>
+      </w:tr>
+      <w:tr>
+        <w:tc>
+          <w:tcPr>
+            <w:tcW w:type="dxa" w:w="4824"/>
+            <w:shd w:fill="FFFFFF"/>
+          </w:tcPr>
+          <w:p>
+            <w:pPr>
+              <w:spacing w:before="40" w:after="40"/>
+            </w:pPr>
+            <w:r>
+              <w:rPr>
+                <w:b/>
+                <w:color w:val="0F172A"/>
+                <w:sz w:val="19"/>
+              </w:rPr>
+              <w:t>6. Annexe : Justifications des Gains &amp; Sources Documentaires</w:t>
+            </w:r>
+          </w:p>
+        </w:tc>
+        <w:tc>
+          <w:tcPr>
+            <w:tcW w:type="dxa" w:w="4824"/>
+            <w:shd w:fill="FFFFFF"/>
+          </w:tcPr>
+          <w:p>
+            <w:pPr>
+              <w:spacing w:before="40" w:after="40"/>
+              <w:jc w:val="right"/>
+            </w:pPr>
+            <w:r>
+              <w:rPr>
+                <w:i/>
+                <w:color w:val="64748B"/>
+                <w:sz w:val="18"/>
+              </w:rPr>
+              <w:t>Page 12</w:t>
             </w:r>
           </w:p>
         </w:tc>
@@ -3993,7 +4034,7 @@
           <w:color w:val="0F172A"/>
           <w:sz w:val="30"/>
         </w:rPr>
-        <w:t>5. Gouvernance, Direction de Projet &amp; Jalons Gigafactory</w:t>
+        <w:t>5. Gouvernance, Feuille de Route Détaillée &amp; Budget par Trimestre</w:t>
       </w:r>
     </w:p>
     <w:p>
@@ -4008,7 +4049,7 @@
           <w:color w:val="1E3A8A"/>
           <w:sz w:val="25"/>
         </w:rPr>
-        <w:t>5.1 Présidence Éric Ciotti &amp; Direction Benoît SIGWALD</w:t>
+        <w:t>5.1 Présidence Éric Ciotti &amp; Direction Benoît SIGWALD (2,5j/sem)</w:t>
       </w:r>
     </w:p>
     <w:p>
@@ -4053,7 +4094,7 @@
           <w:b/>
           <w:color w:val="0F172A"/>
         </w:rPr>
-        <w:t>Direction du Projet Pacte Nice IA (Temps Partagé)</w:t>
+        <w:t>Direction de Projet AMO IA (Temps Partagé)</w:t>
       </w:r>
       <w:r>
         <w:rPr>
@@ -4072,20 +4113,20 @@
         <w:rPr>
           <w:color w:val="1E293B"/>
         </w:rPr>
-        <w:t xml:space="preserve">, Senior AI Architect &amp; AMO IA Métropolitain. Engagement optimisé à </w:t>
+        <w:t xml:space="preserve">, Senior AI Architect. Engagement à </w:t>
       </w:r>
       <w:r>
         <w:rPr>
           <w:b/>
           <w:color w:val="0F172A"/>
         </w:rPr>
-        <w:t>2 à 3 jours par semaine</w:t>
+        <w:t>2,5 jours par semaine</w:t>
       </w:r>
       <w:r>
         <w:rPr>
           <w:color w:val="1E293B"/>
         </w:rPr>
-        <w:t xml:space="preserve">, réduisant l'honoraires de direction de projet à seulement </w:t>
+        <w:t xml:space="preserve">, réduisant la ligne AMO à </w:t>
       </w:r>
       <w:r>
         <w:rPr>
@@ -4098,7 +4139,7 @@
         <w:rPr>
           <w:color w:val="1E293B"/>
         </w:rPr>
-        <w:t xml:space="preserve"> (au lieu de 130 k€), ramenant le budget total annuel brut à </w:t>
+        <w:t xml:space="preserve"> et amenant le budget global à </w:t>
       </w:r>
       <w:r>
         <w:rPr>
@@ -4111,7 +4152,20 @@
         <w:rPr>
           <w:color w:val="1E293B"/>
         </w:rPr>
-        <w:t xml:space="preserve"> (~217 k€ / an net après co-financement UE).</w:t>
+        <w:t xml:space="preserve"> (reste à charge net métropolitain : </w:t>
+      </w:r>
+      <w:r>
+        <w:rPr>
+          <w:b/>
+          <w:color w:val="0F172A"/>
+        </w:rPr>
+        <w:t>~217 k€ / an</w:t>
+      </w:r>
+      <w:r>
+        <w:rPr>
+          <w:color w:val="1E293B"/>
+        </w:rPr>
+        <w:t>).</w:t>
       </w:r>
     </w:p>
     <w:p>
@@ -4126,7 +4180,1746 @@
           <w:color w:val="1E3A8A"/>
           <w:sz w:val="25"/>
         </w:rPr>
-        <w:t>5.2 Feuille de Route 36 Mois &amp; Allocations Budgétaires Annuelles</w:t>
+        <w:t>5.2 Feuille de Route Détaillée Élément par Élément (36 Mois)</w:t>
+      </w:r>
+    </w:p>
+    <w:tbl>
+      <w:tblPr>
+        <w:tblW w:type="auto" w:w="0"/>
+        <w:jc w:val="center"/>
+        <w:tblLook w:firstColumn="1" w:firstRow="1" w:lastColumn="0" w:lastRow="0" w:noHBand="0" w:noVBand="1" w:val="04A0"/>
+      </w:tblPr>
+      <w:tblGrid>
+        <w:gridCol w:w="2412"/>
+        <w:gridCol w:w="2412"/>
+        <w:gridCol w:w="2412"/>
+        <w:gridCol w:w="2412"/>
+      </w:tblGrid>
+      <w:tr>
+        <w:tc>
+          <w:tcPr>
+            <w:tcW w:type="dxa" w:w="2412"/>
+            <w:shd w:fill="1E293B"/>
+          </w:tcPr>
+          <w:p>
+            <w:pPr>
+              <w:spacing w:before="60" w:after="60"/>
+            </w:pPr>
+            <w:r>
+              <w:rPr>
+                <w:b/>
+                <w:color w:val="FFFFFF"/>
+                <w:sz w:val="17"/>
+              </w:rPr>
+              <w:t>Phase / Période</w:t>
+            </w:r>
+          </w:p>
+        </w:tc>
+        <w:tc>
+          <w:tcPr>
+            <w:tcW w:type="dxa" w:w="2412"/>
+            <w:shd w:fill="1E293B"/>
+          </w:tcPr>
+          <w:p>
+            <w:pPr>
+              <w:spacing w:before="60" w:after="60"/>
+            </w:pPr>
+            <w:r>
+              <w:rPr>
+                <w:b/>
+                <w:color w:val="FFFFFF"/>
+                <w:sz w:val="17"/>
+              </w:rPr>
+              <w:t>Chantier / Livrable Stratégique</w:t>
+            </w:r>
+          </w:p>
+        </w:tc>
+        <w:tc>
+          <w:tcPr>
+            <w:tcW w:type="dxa" w:w="2412"/>
+            <w:shd w:fill="1E293B"/>
+          </w:tcPr>
+          <w:p>
+            <w:pPr>
+              <w:spacing w:before="60" w:after="60"/>
+            </w:pPr>
+            <w:r>
+              <w:rPr>
+                <w:b/>
+                <w:color w:val="FFFFFF"/>
+                <w:sz w:val="17"/>
+              </w:rPr>
+              <w:t>Budget Dédié</w:t>
+            </w:r>
+          </w:p>
+        </w:tc>
+        <w:tc>
+          <w:tcPr>
+            <w:tcW w:type="dxa" w:w="2412"/>
+            <w:shd w:fill="1E293B"/>
+          </w:tcPr>
+          <w:p>
+            <w:pPr>
+              <w:spacing w:before="60" w:after="60"/>
+            </w:pPr>
+            <w:r>
+              <w:rPr>
+                <w:b/>
+                <w:color w:val="FFFFFF"/>
+                <w:sz w:val="17"/>
+              </w:rPr>
+              <w:t>Impact &amp; Résultat Attendus</w:t>
+            </w:r>
+          </w:p>
+        </w:tc>
+      </w:tr>
+      <w:tr>
+        <w:tc>
+          <w:tcPr>
+            <w:tcW w:type="dxa" w:w="2412"/>
+            <w:shd w:fill="F8FAFC"/>
+          </w:tcPr>
+          <w:p>
+            <w:pPr>
+              <w:spacing w:before="60" w:after="60"/>
+            </w:pPr>
+            <w:r>
+              <w:rPr>
+                <w:color w:val="1E293B"/>
+                <w:sz w:val="16"/>
+              </w:rPr>
+              <w:t>Année 1 - Q1</w:t>
+            </w:r>
+          </w:p>
+        </w:tc>
+        <w:tc>
+          <w:tcPr>
+            <w:tcW w:type="dxa" w:w="2412"/>
+            <w:shd w:fill="F8FAFC"/>
+          </w:tcPr>
+          <w:p>
+            <w:pPr>
+              <w:spacing w:before="60" w:after="60"/>
+            </w:pPr>
+            <w:r>
+              <w:rPr>
+                <w:color w:val="1E293B"/>
+                <w:sz w:val="16"/>
+              </w:rPr>
+              <w:t>L1.1 Pilotage &amp; Direction de Projet (2.5j/sem)</w:t>
+            </w:r>
+          </w:p>
+        </w:tc>
+        <w:tc>
+          <w:tcPr>
+            <w:tcW w:type="dxa" w:w="2412"/>
+            <w:shd w:fill="F8FAFC"/>
+          </w:tcPr>
+          <w:p>
+            <w:pPr>
+              <w:spacing w:before="60" w:after="60"/>
+            </w:pPr>
+            <w:r>
+              <w:rPr>
+                <w:color w:val="1E293B"/>
+                <w:sz w:val="16"/>
+              </w:rPr>
+              <w:t>16,25 k€</w:t>
+            </w:r>
+          </w:p>
+        </w:tc>
+        <w:tc>
+          <w:tcPr>
+            <w:tcW w:type="dxa" w:w="2412"/>
+            <w:shd w:fill="F8FAFC"/>
+          </w:tcPr>
+          <w:p>
+            <w:pPr>
+              <w:spacing w:before="60" w:after="60"/>
+            </w:pPr>
+            <w:r>
+              <w:rPr>
+                <w:color w:val="1E293B"/>
+                <w:sz w:val="16"/>
+              </w:rPr>
+              <w:t>Cadrage opérationnel &amp; gouvernance.</w:t>
+            </w:r>
+          </w:p>
+        </w:tc>
+      </w:tr>
+      <w:tr>
+        <w:tc>
+          <w:tcPr>
+            <w:tcW w:type="dxa" w:w="2412"/>
+            <w:shd w:fill="FFFFFF"/>
+          </w:tcPr>
+          <w:p>
+            <w:pPr>
+              <w:spacing w:before="60" w:after="60"/>
+            </w:pPr>
+            <w:r>
+              <w:rPr>
+                <w:color w:val="1E293B"/>
+                <w:sz w:val="16"/>
+              </w:rPr>
+              <w:t>Année 1 - Q1</w:t>
+            </w:r>
+          </w:p>
+        </w:tc>
+        <w:tc>
+          <w:tcPr>
+            <w:tcW w:type="dxa" w:w="2412"/>
+            <w:shd w:fill="FFFFFF"/>
+          </w:tcPr>
+          <w:p>
+            <w:pPr>
+              <w:spacing w:before="60" w:after="60"/>
+            </w:pPr>
+            <w:r>
+              <w:rPr>
+                <w:color w:val="1E293B"/>
+                <w:sz w:val="16"/>
+              </w:rPr>
+              <w:t>L1.2 Bureau Candidature Binationale Gigafactory</w:t>
+            </w:r>
+          </w:p>
+        </w:tc>
+        <w:tc>
+          <w:tcPr>
+            <w:tcW w:type="dxa" w:w="2412"/>
+            <w:shd w:fill="FFFFFF"/>
+          </w:tcPr>
+          <w:p>
+            <w:pPr>
+              <w:spacing w:before="60" w:after="60"/>
+            </w:pPr>
+            <w:r>
+              <w:rPr>
+                <w:color w:val="1E293B"/>
+                <w:sz w:val="16"/>
+              </w:rPr>
+              <w:t>35,00 k€</w:t>
+            </w:r>
+          </w:p>
+        </w:tc>
+        <w:tc>
+          <w:tcPr>
+            <w:tcW w:type="dxa" w:w="2412"/>
+            <w:shd w:fill="FFFFFF"/>
+          </w:tcPr>
+          <w:p>
+            <w:pPr>
+              <w:spacing w:before="60" w:after="60"/>
+            </w:pPr>
+            <w:r>
+              <w:rPr>
+                <w:color w:val="1E293B"/>
+                <w:sz w:val="16"/>
+              </w:rPr>
+              <w:t>Dossier 500 M€ UE co-rédigé Monaco.</w:t>
+            </w:r>
+          </w:p>
+        </w:tc>
+      </w:tr>
+      <w:tr>
+        <w:tc>
+          <w:tcPr>
+            <w:tcW w:type="dxa" w:w="2412"/>
+            <w:shd w:fill="F8FAFC"/>
+          </w:tcPr>
+          <w:p>
+            <w:pPr>
+              <w:spacing w:before="60" w:after="60"/>
+            </w:pPr>
+            <w:r>
+              <w:rPr>
+                <w:color w:val="1E293B"/>
+                <w:sz w:val="16"/>
+              </w:rPr>
+              <w:t>Année 1 - Q1</w:t>
+            </w:r>
+          </w:p>
+        </w:tc>
+        <w:tc>
+          <w:tcPr>
+            <w:tcW w:type="dxa" w:w="2412"/>
+            <w:shd w:fill="F8FAFC"/>
+          </w:tcPr>
+          <w:p>
+            <w:pPr>
+              <w:spacing w:before="60" w:after="60"/>
+            </w:pPr>
+            <w:r>
+              <w:rPr>
+                <w:color w:val="1E293B"/>
+                <w:sz w:val="16"/>
+              </w:rPr>
+              <w:t>L1.3 Délibération Métropolitaine &amp; AI Act</w:t>
+            </w:r>
+          </w:p>
+        </w:tc>
+        <w:tc>
+          <w:tcPr>
+            <w:tcW w:type="dxa" w:w="2412"/>
+            <w:shd w:fill="F8FAFC"/>
+          </w:tcPr>
+          <w:p>
+            <w:pPr>
+              <w:spacing w:before="60" w:after="60"/>
+            </w:pPr>
+            <w:r>
+              <w:rPr>
+                <w:color w:val="1E293B"/>
+                <w:sz w:val="16"/>
+              </w:rPr>
+              <w:t>20,00 k€</w:t>
+            </w:r>
+          </w:p>
+        </w:tc>
+        <w:tc>
+          <w:tcPr>
+            <w:tcW w:type="dxa" w:w="2412"/>
+            <w:shd w:fill="F8FAFC"/>
+          </w:tcPr>
+          <w:p>
+            <w:pPr>
+              <w:spacing w:before="60" w:after="60"/>
+            </w:pPr>
+            <w:r>
+              <w:rPr>
+                <w:color w:val="1E293B"/>
+                <w:sz w:val="16"/>
+              </w:rPr>
+              <w:t>Vote cadre juridique &amp; éthique.</w:t>
+            </w:r>
+          </w:p>
+        </w:tc>
+      </w:tr>
+      <w:tr>
+        <w:tc>
+          <w:tcPr>
+            <w:tcW w:type="dxa" w:w="2412"/>
+            <w:shd w:fill="FFFFFF"/>
+          </w:tcPr>
+          <w:p>
+            <w:pPr>
+              <w:spacing w:before="60" w:after="60"/>
+            </w:pPr>
+            <w:r>
+              <w:rPr>
+                <w:color w:val="1E293B"/>
+                <w:sz w:val="16"/>
+              </w:rPr>
+              <w:t>Année 1 - Q1</w:t>
+            </w:r>
+          </w:p>
+        </w:tc>
+        <w:tc>
+          <w:tcPr>
+            <w:tcW w:type="dxa" w:w="2412"/>
+            <w:shd w:fill="FFFFFF"/>
+          </w:tcPr>
+          <w:p>
+            <w:pPr>
+              <w:spacing w:before="60" w:after="60"/>
+            </w:pPr>
+            <w:r>
+              <w:rPr>
+                <w:color w:val="1E293B"/>
+                <w:sz w:val="16"/>
+              </w:rPr>
+              <w:t>L1.4 Audit CSU &amp; Fibre Monaco Cloud</w:t>
+            </w:r>
+          </w:p>
+        </w:tc>
+        <w:tc>
+          <w:tcPr>
+            <w:tcW w:type="dxa" w:w="2412"/>
+            <w:shd w:fill="FFFFFF"/>
+          </w:tcPr>
+          <w:p>
+            <w:pPr>
+              <w:spacing w:before="60" w:after="60"/>
+            </w:pPr>
+            <w:r>
+              <w:rPr>
+                <w:color w:val="1E293B"/>
+                <w:sz w:val="16"/>
+              </w:rPr>
+              <w:t>38,75 k€</w:t>
+            </w:r>
+          </w:p>
+        </w:tc>
+        <w:tc>
+          <w:tcPr>
+            <w:tcW w:type="dxa" w:w="2412"/>
+            <w:shd w:fill="FFFFFF"/>
+          </w:tcPr>
+          <w:p>
+            <w:pPr>
+              <w:spacing w:before="60" w:after="60"/>
+            </w:pPr>
+            <w:r>
+              <w:rPr>
+                <w:color w:val="1E293B"/>
+                <w:sz w:val="16"/>
+              </w:rPr>
+              <w:t>Cahier des charges interconnexion.</w:t>
+            </w:r>
+          </w:p>
+        </w:tc>
+      </w:tr>
+      <w:tr>
+        <w:tc>
+          <w:tcPr>
+            <w:tcW w:type="dxa" w:w="2412"/>
+            <w:shd w:fill="F8FAFC"/>
+          </w:tcPr>
+          <w:p>
+            <w:pPr>
+              <w:spacing w:before="60" w:after="60"/>
+            </w:pPr>
+            <w:r>
+              <w:rPr>
+                <w:color w:val="1E293B"/>
+                <w:sz w:val="16"/>
+              </w:rPr>
+              <w:t>Année 1 - Q2</w:t>
+            </w:r>
+          </w:p>
+        </w:tc>
+        <w:tc>
+          <w:tcPr>
+            <w:tcW w:type="dxa" w:w="2412"/>
+            <w:shd w:fill="F8FAFC"/>
+          </w:tcPr>
+          <w:p>
+            <w:pPr>
+              <w:spacing w:before="60" w:after="60"/>
+            </w:pPr>
+            <w:r>
+              <w:rPr>
+                <w:color w:val="1E293B"/>
+                <w:sz w:val="16"/>
+              </w:rPr>
+              <w:t>L2.1 Pilotage &amp; Direction de Projet (2.5j/sem)</w:t>
+            </w:r>
+          </w:p>
+        </w:tc>
+        <w:tc>
+          <w:tcPr>
+            <w:tcW w:type="dxa" w:w="2412"/>
+            <w:shd w:fill="F8FAFC"/>
+          </w:tcPr>
+          <w:p>
+            <w:pPr>
+              <w:spacing w:before="60" w:after="60"/>
+            </w:pPr>
+            <w:r>
+              <w:rPr>
+                <w:color w:val="1E293B"/>
+                <w:sz w:val="16"/>
+              </w:rPr>
+              <w:t>16,25 k€</w:t>
+            </w:r>
+          </w:p>
+        </w:tc>
+        <w:tc>
+          <w:tcPr>
+            <w:tcW w:type="dxa" w:w="2412"/>
+            <w:shd w:fill="F8FAFC"/>
+          </w:tcPr>
+          <w:p>
+            <w:pPr>
+              <w:spacing w:before="60" w:after="60"/>
+            </w:pPr>
+            <w:r>
+              <w:rPr>
+                <w:color w:val="1E293B"/>
+                <w:sz w:val="16"/>
+              </w:rPr>
+              <w:t>Gestion des appels d'offres VSA.</w:t>
+            </w:r>
+          </w:p>
+        </w:tc>
+      </w:tr>
+      <w:tr>
+        <w:tc>
+          <w:tcPr>
+            <w:tcW w:type="dxa" w:w="2412"/>
+            <w:shd w:fill="FFFFFF"/>
+          </w:tcPr>
+          <w:p>
+            <w:pPr>
+              <w:spacing w:before="60" w:after="60"/>
+            </w:pPr>
+            <w:r>
+              <w:rPr>
+                <w:color w:val="1E293B"/>
+                <w:sz w:val="16"/>
+              </w:rPr>
+              <w:t>Année 1 - Q2</w:t>
+            </w:r>
+          </w:p>
+        </w:tc>
+        <w:tc>
+          <w:tcPr>
+            <w:tcW w:type="dxa" w:w="2412"/>
+            <w:shd w:fill="FFFFFF"/>
+          </w:tcPr>
+          <w:p>
+            <w:pPr>
+              <w:spacing w:before="60" w:after="60"/>
+            </w:pPr>
+            <w:r>
+              <w:rPr>
+                <w:color w:val="1E293B"/>
+                <w:sz w:val="16"/>
+              </w:rPr>
+              <w:t>L2.2 Dépôt Dossier Gigafactory UE (12 Nov)</w:t>
+            </w:r>
+          </w:p>
+        </w:tc>
+        <w:tc>
+          <w:tcPr>
+            <w:tcW w:type="dxa" w:w="2412"/>
+            <w:shd w:fill="FFFFFF"/>
+          </w:tcPr>
+          <w:p>
+            <w:pPr>
+              <w:spacing w:before="60" w:after="60"/>
+            </w:pPr>
+            <w:r>
+              <w:rPr>
+                <w:color w:val="1E293B"/>
+                <w:sz w:val="16"/>
+              </w:rPr>
+              <w:t>10,00 k€</w:t>
+            </w:r>
+          </w:p>
+        </w:tc>
+        <w:tc>
+          <w:tcPr>
+            <w:tcW w:type="dxa" w:w="2412"/>
+            <w:shd w:fill="FFFFFF"/>
+          </w:tcPr>
+          <w:p>
+            <w:pPr>
+              <w:spacing w:before="60" w:after="60"/>
+            </w:pPr>
+            <w:r>
+              <w:rPr>
+                <w:color w:val="1E293B"/>
+                <w:sz w:val="16"/>
+              </w:rPr>
+              <w:t>Candidature officielle 500 M€.</w:t>
+            </w:r>
+          </w:p>
+        </w:tc>
+      </w:tr>
+      <w:tr>
+        <w:tc>
+          <w:tcPr>
+            <w:tcW w:type="dxa" w:w="2412"/>
+            <w:shd w:fill="F8FAFC"/>
+          </w:tcPr>
+          <w:p>
+            <w:pPr>
+              <w:spacing w:before="60" w:after="60"/>
+            </w:pPr>
+            <w:r>
+              <w:rPr>
+                <w:color w:val="1E293B"/>
+                <w:sz w:val="16"/>
+              </w:rPr>
+              <w:t>Année 1 - Q2</w:t>
+            </w:r>
+          </w:p>
+        </w:tc>
+        <w:tc>
+          <w:tcPr>
+            <w:tcW w:type="dxa" w:w="2412"/>
+            <w:shd w:fill="F8FAFC"/>
+          </w:tcPr>
+          <w:p>
+            <w:pPr>
+              <w:spacing w:before="60" w:after="60"/>
+            </w:pPr>
+            <w:r>
+              <w:rPr>
+                <w:color w:val="1E293B"/>
+                <w:sz w:val="16"/>
+              </w:rPr>
+              <w:t>L2.3 Filtrage VSA CSU (4 300 caméras)</w:t>
+            </w:r>
+          </w:p>
+        </w:tc>
+        <w:tc>
+          <w:tcPr>
+            <w:tcW w:type="dxa" w:w="2412"/>
+            <w:shd w:fill="F8FAFC"/>
+          </w:tcPr>
+          <w:p>
+            <w:pPr>
+              <w:spacing w:before="60" w:after="60"/>
+            </w:pPr>
+            <w:r>
+              <w:rPr>
+                <w:color w:val="1E293B"/>
+                <w:sz w:val="16"/>
+              </w:rPr>
+              <w:t>55,00 k€</w:t>
+            </w:r>
+          </w:p>
+        </w:tc>
+        <w:tc>
+          <w:tcPr>
+            <w:tcW w:type="dxa" w:w="2412"/>
+            <w:shd w:fill="F8FAFC"/>
+          </w:tcPr>
+          <w:p>
+            <w:pPr>
+              <w:spacing w:before="60" w:after="60"/>
+            </w:pPr>
+            <w:r>
+              <w:rPr>
+                <w:color w:val="1E293B"/>
+                <w:sz w:val="16"/>
+              </w:rPr>
+              <w:t>Alertes incivilités en temps réel.</w:t>
+            </w:r>
+          </w:p>
+        </w:tc>
+      </w:tr>
+      <w:tr>
+        <w:tc>
+          <w:tcPr>
+            <w:tcW w:type="dxa" w:w="2412"/>
+            <w:shd w:fill="FFFFFF"/>
+          </w:tcPr>
+          <w:p>
+            <w:pPr>
+              <w:spacing w:before="60" w:after="60"/>
+            </w:pPr>
+            <w:r>
+              <w:rPr>
+                <w:color w:val="1E293B"/>
+                <w:sz w:val="16"/>
+              </w:rPr>
+              <w:t>Année 1 - Q2</w:t>
+            </w:r>
+          </w:p>
+        </w:tc>
+        <w:tc>
+          <w:tcPr>
+            <w:tcW w:type="dxa" w:w="2412"/>
+            <w:shd w:fill="FFFFFF"/>
+          </w:tcPr>
+          <w:p>
+            <w:pPr>
+              <w:spacing w:before="60" w:after="60"/>
+            </w:pPr>
+            <w:r>
+              <w:rPr>
+                <w:color w:val="1E293B"/>
+                <w:sz w:val="16"/>
+              </w:rPr>
+              <w:t>L2.4 Géolocalisation &amp; Dispatching PM</w:t>
+            </w:r>
+          </w:p>
+        </w:tc>
+        <w:tc>
+          <w:tcPr>
+            <w:tcW w:type="dxa" w:w="2412"/>
+            <w:shd w:fill="FFFFFF"/>
+          </w:tcPr>
+          <w:p>
+            <w:pPr>
+              <w:spacing w:before="60" w:after="60"/>
+            </w:pPr>
+            <w:r>
+              <w:rPr>
+                <w:color w:val="1E293B"/>
+                <w:sz w:val="16"/>
+              </w:rPr>
+              <w:t>33,75 k€</w:t>
+            </w:r>
+          </w:p>
+        </w:tc>
+        <w:tc>
+          <w:tcPr>
+            <w:tcW w:type="dxa" w:w="2412"/>
+            <w:shd w:fill="FFFFFF"/>
+          </w:tcPr>
+          <w:p>
+            <w:pPr>
+              <w:spacing w:before="60" w:after="60"/>
+            </w:pPr>
+            <w:r>
+              <w:rPr>
+                <w:color w:val="1E293B"/>
+                <w:sz w:val="16"/>
+              </w:rPr>
+              <w:t>Patrouilles physiques &lt; 6 min.</w:t>
+            </w:r>
+          </w:p>
+        </w:tc>
+      </w:tr>
+      <w:tr>
+        <w:tc>
+          <w:tcPr>
+            <w:tcW w:type="dxa" w:w="2412"/>
+            <w:shd w:fill="F8FAFC"/>
+          </w:tcPr>
+          <w:p>
+            <w:pPr>
+              <w:spacing w:before="60" w:after="60"/>
+            </w:pPr>
+            <w:r>
+              <w:rPr>
+                <w:color w:val="1E293B"/>
+                <w:sz w:val="16"/>
+              </w:rPr>
+              <w:t>Année 1 - Q3</w:t>
+            </w:r>
+          </w:p>
+        </w:tc>
+        <w:tc>
+          <w:tcPr>
+            <w:tcW w:type="dxa" w:w="2412"/>
+            <w:shd w:fill="F8FAFC"/>
+          </w:tcPr>
+          <w:p>
+            <w:pPr>
+              <w:spacing w:before="60" w:after="60"/>
+            </w:pPr>
+            <w:r>
+              <w:rPr>
+                <w:color w:val="1E293B"/>
+                <w:sz w:val="16"/>
+              </w:rPr>
+              <w:t>L3.1 Pilotage &amp; Direction de Projet (2.5j/sem)</w:t>
+            </w:r>
+          </w:p>
+        </w:tc>
+        <w:tc>
+          <w:tcPr>
+            <w:tcW w:type="dxa" w:w="2412"/>
+            <w:shd w:fill="F8FAFC"/>
+          </w:tcPr>
+          <w:p>
+            <w:pPr>
+              <w:spacing w:before="60" w:after="60"/>
+            </w:pPr>
+            <w:r>
+              <w:rPr>
+                <w:color w:val="1E293B"/>
+                <w:sz w:val="16"/>
+              </w:rPr>
+              <w:t>16,25 k€</w:t>
+            </w:r>
+          </w:p>
+        </w:tc>
+        <w:tc>
+          <w:tcPr>
+            <w:tcW w:type="dxa" w:w="2412"/>
+            <w:shd w:fill="F8FAFC"/>
+          </w:tcPr>
+          <w:p>
+            <w:pPr>
+              <w:spacing w:before="60" w:after="60"/>
+            </w:pPr>
+            <w:r>
+              <w:rPr>
+                <w:color w:val="1E293B"/>
+                <w:sz w:val="16"/>
+              </w:rPr>
+              <w:t>Suivi ingénierie &amp; recettes.</w:t>
+            </w:r>
+          </w:p>
+        </w:tc>
+      </w:tr>
+      <w:tr>
+        <w:tc>
+          <w:tcPr>
+            <w:tcW w:type="dxa" w:w="2412"/>
+            <w:shd w:fill="FFFFFF"/>
+          </w:tcPr>
+          <w:p>
+            <w:pPr>
+              <w:spacing w:before="60" w:after="60"/>
+            </w:pPr>
+            <w:r>
+              <w:rPr>
+                <w:color w:val="1E293B"/>
+                <w:sz w:val="16"/>
+              </w:rPr>
+              <w:t>Année 1 - Q3</w:t>
+            </w:r>
+          </w:p>
+        </w:tc>
+        <w:tc>
+          <w:tcPr>
+            <w:tcW w:type="dxa" w:w="2412"/>
+            <w:shd w:fill="FFFFFF"/>
+          </w:tcPr>
+          <w:p>
+            <w:pPr>
+              <w:spacing w:before="60" w:after="60"/>
+            </w:pPr>
+            <w:r>
+              <w:rPr>
+                <w:color w:val="1E293B"/>
+                <w:sz w:val="16"/>
+              </w:rPr>
+              <w:t>L3.2 Audit Commande Publique (Factures 300M€)</w:t>
+            </w:r>
+          </w:p>
+        </w:tc>
+        <w:tc>
+          <w:tcPr>
+            <w:tcW w:type="dxa" w:w="2412"/>
+            <w:shd w:fill="FFFFFF"/>
+          </w:tcPr>
+          <w:p>
+            <w:pPr>
+              <w:spacing w:before="60" w:after="60"/>
+            </w:pPr>
+            <w:r>
+              <w:rPr>
+                <w:color w:val="1E293B"/>
+                <w:sz w:val="16"/>
+              </w:rPr>
+              <w:t>45,00 k€</w:t>
+            </w:r>
+          </w:p>
+        </w:tc>
+        <w:tc>
+          <w:tcPr>
+            <w:tcW w:type="dxa" w:w="2412"/>
+            <w:shd w:fill="FFFFFF"/>
+          </w:tcPr>
+          <w:p>
+            <w:pPr>
+              <w:spacing w:before="60" w:after="60"/>
+            </w:pPr>
+            <w:r>
+              <w:rPr>
+                <w:color w:val="1E293B"/>
+                <w:sz w:val="16"/>
+              </w:rPr>
+              <w:t>Filtrage erreurs &amp; doublons BPU.</w:t>
+            </w:r>
+          </w:p>
+        </w:tc>
+      </w:tr>
+      <w:tr>
+        <w:tc>
+          <w:tcPr>
+            <w:tcW w:type="dxa" w:w="2412"/>
+            <w:shd w:fill="F8FAFC"/>
+          </w:tcPr>
+          <w:p>
+            <w:pPr>
+              <w:spacing w:before="60" w:after="60"/>
+            </w:pPr>
+            <w:r>
+              <w:rPr>
+                <w:color w:val="1E293B"/>
+                <w:sz w:val="16"/>
+              </w:rPr>
+              <w:t>Année 1 - Q3</w:t>
+            </w:r>
+          </w:p>
+        </w:tc>
+        <w:tc>
+          <w:tcPr>
+            <w:tcW w:type="dxa" w:w="2412"/>
+            <w:shd w:fill="F8FAFC"/>
+          </w:tcPr>
+          <w:p>
+            <w:pPr>
+              <w:spacing w:before="60" w:after="60"/>
+            </w:pPr>
+            <w:r>
+              <w:rPr>
+                <w:color w:val="1E293B"/>
+                <w:sz w:val="16"/>
+              </w:rPr>
+              <w:t>L3.3 SOC Cyber NIS 2 Autonome Air-Gap</w:t>
+            </w:r>
+          </w:p>
+        </w:tc>
+        <w:tc>
+          <w:tcPr>
+            <w:tcW w:type="dxa" w:w="2412"/>
+            <w:shd w:fill="F8FAFC"/>
+          </w:tcPr>
+          <w:p>
+            <w:pPr>
+              <w:spacing w:before="60" w:after="60"/>
+            </w:pPr>
+            <w:r>
+              <w:rPr>
+                <w:color w:val="1E293B"/>
+                <w:sz w:val="16"/>
+              </w:rPr>
+              <w:t>28,75 k€</w:t>
+            </w:r>
+          </w:p>
+        </w:tc>
+        <w:tc>
+          <w:tcPr>
+            <w:tcW w:type="dxa" w:w="2412"/>
+            <w:shd w:fill="F8FAFC"/>
+          </w:tcPr>
+          <w:p>
+            <w:pPr>
+              <w:spacing w:before="60" w:after="60"/>
+            </w:pPr>
+            <w:r>
+              <w:rPr>
+                <w:color w:val="1E293B"/>
+                <w:sz w:val="16"/>
+              </w:rPr>
+              <w:t>Protection inviolable du CSU.</w:t>
+            </w:r>
+          </w:p>
+        </w:tc>
+      </w:tr>
+      <w:tr>
+        <w:tc>
+          <w:tcPr>
+            <w:tcW w:type="dxa" w:w="2412"/>
+            <w:shd w:fill="FFFFFF"/>
+          </w:tcPr>
+          <w:p>
+            <w:pPr>
+              <w:spacing w:before="60" w:after="60"/>
+            </w:pPr>
+            <w:r>
+              <w:rPr>
+                <w:color w:val="1E293B"/>
+                <w:sz w:val="16"/>
+              </w:rPr>
+              <w:t>Année 1 - Q3</w:t>
+            </w:r>
+          </w:p>
+        </w:tc>
+        <w:tc>
+          <w:tcPr>
+            <w:tcW w:type="dxa" w:w="2412"/>
+            <w:shd w:fill="FFFFFF"/>
+          </w:tcPr>
+          <w:p>
+            <w:pPr>
+              <w:spacing w:before="60" w:after="60"/>
+            </w:pPr>
+            <w:r>
+              <w:rPr>
+                <w:color w:val="1E293B"/>
+                <w:sz w:val="16"/>
+              </w:rPr>
+              <w:t>L3.4 IA Einstein Concertation (1er Quartier)</w:t>
+            </w:r>
+          </w:p>
+        </w:tc>
+        <w:tc>
+          <w:tcPr>
+            <w:tcW w:type="dxa" w:w="2412"/>
+            <w:shd w:fill="FFFFFF"/>
+          </w:tcPr>
+          <w:p>
+            <w:pPr>
+              <w:spacing w:before="60" w:after="60"/>
+            </w:pPr>
+            <w:r>
+              <w:rPr>
+                <w:color w:val="1E293B"/>
+                <w:sz w:val="16"/>
+              </w:rPr>
+              <w:t>15,00 k€</w:t>
+            </w:r>
+          </w:p>
+        </w:tc>
+        <w:tc>
+          <w:tcPr>
+            <w:tcW w:type="dxa" w:w="2412"/>
+            <w:shd w:fill="FFFFFF"/>
+          </w:tcPr>
+          <w:p>
+            <w:pPr>
+              <w:spacing w:before="60" w:after="60"/>
+            </w:pPr>
+            <w:r>
+              <w:rPr>
+                <w:color w:val="1E293B"/>
+                <w:sz w:val="16"/>
+              </w:rPr>
+              <w:t>Restitution citoyenne augmentée.</w:t>
+            </w:r>
+          </w:p>
+        </w:tc>
+      </w:tr>
+      <w:tr>
+        <w:tc>
+          <w:tcPr>
+            <w:tcW w:type="dxa" w:w="2412"/>
+            <w:shd w:fill="F8FAFC"/>
+          </w:tcPr>
+          <w:p>
+            <w:pPr>
+              <w:spacing w:before="60" w:after="60"/>
+            </w:pPr>
+            <w:r>
+              <w:rPr>
+                <w:color w:val="1E293B"/>
+                <w:sz w:val="16"/>
+              </w:rPr>
+              <w:t>Année 1 - Q4</w:t>
+            </w:r>
+          </w:p>
+        </w:tc>
+        <w:tc>
+          <w:tcPr>
+            <w:tcW w:type="dxa" w:w="2412"/>
+            <w:shd w:fill="F8FAFC"/>
+          </w:tcPr>
+          <w:p>
+            <w:pPr>
+              <w:spacing w:before="60" w:after="60"/>
+            </w:pPr>
+            <w:r>
+              <w:rPr>
+                <w:color w:val="1E293B"/>
+                <w:sz w:val="16"/>
+              </w:rPr>
+              <w:t>L4.1 Pilotage &amp; Direction de Projet (2.5j/sem)</w:t>
+            </w:r>
+          </w:p>
+        </w:tc>
+        <w:tc>
+          <w:tcPr>
+            <w:tcW w:type="dxa" w:w="2412"/>
+            <w:shd w:fill="F8FAFC"/>
+          </w:tcPr>
+          <w:p>
+            <w:pPr>
+              <w:spacing w:before="60" w:after="60"/>
+            </w:pPr>
+            <w:r>
+              <w:rPr>
+                <w:color w:val="1E293B"/>
+                <w:sz w:val="16"/>
+              </w:rPr>
+              <w:t>16,25 k€</w:t>
+            </w:r>
+          </w:p>
+        </w:tc>
+        <w:tc>
+          <w:tcPr>
+            <w:tcW w:type="dxa" w:w="2412"/>
+            <w:shd w:fill="F8FAFC"/>
+          </w:tcPr>
+          <w:p>
+            <w:pPr>
+              <w:spacing w:before="60" w:after="60"/>
+            </w:pPr>
+            <w:r>
+              <w:rPr>
+                <w:color w:val="1E293B"/>
+                <w:sz w:val="16"/>
+              </w:rPr>
+              <w:t>Revue annuelle &amp; bilans.</w:t>
+            </w:r>
+          </w:p>
+        </w:tc>
+      </w:tr>
+      <w:tr>
+        <w:tc>
+          <w:tcPr>
+            <w:tcW w:type="dxa" w:w="2412"/>
+            <w:shd w:fill="FFFFFF"/>
+          </w:tcPr>
+          <w:p>
+            <w:pPr>
+              <w:spacing w:before="60" w:after="60"/>
+            </w:pPr>
+            <w:r>
+              <w:rPr>
+                <w:color w:val="1E293B"/>
+                <w:sz w:val="16"/>
+              </w:rPr>
+              <w:t>Année 1 - Q4</w:t>
+            </w:r>
+          </w:p>
+        </w:tc>
+        <w:tc>
+          <w:tcPr>
+            <w:tcW w:type="dxa" w:w="2412"/>
+            <w:shd w:fill="FFFFFF"/>
+          </w:tcPr>
+          <w:p>
+            <w:pPr>
+              <w:spacing w:before="60" w:after="60"/>
+            </w:pPr>
+            <w:r>
+              <w:rPr>
+                <w:color w:val="1E293B"/>
+                <w:sz w:val="16"/>
+              </w:rPr>
+              <w:t>L4.2 Généralisation Audit Commande Publique</w:t>
+            </w:r>
+          </w:p>
+        </w:tc>
+        <w:tc>
+          <w:tcPr>
+            <w:tcW w:type="dxa" w:w="2412"/>
+            <w:shd w:fill="FFFFFF"/>
+          </w:tcPr>
+          <w:p>
+            <w:pPr>
+              <w:spacing w:before="60" w:after="60"/>
+            </w:pPr>
+            <w:r>
+              <w:rPr>
+                <w:color w:val="1E293B"/>
+                <w:sz w:val="16"/>
+              </w:rPr>
+              <w:t>45,00 k€</w:t>
+            </w:r>
+          </w:p>
+        </w:tc>
+        <w:tc>
+          <w:tcPr>
+            <w:tcW w:type="dxa" w:w="2412"/>
+            <w:shd w:fill="FFFFFF"/>
+          </w:tcPr>
+          <w:p>
+            <w:pPr>
+              <w:spacing w:before="60" w:after="60"/>
+            </w:pPr>
+            <w:r>
+              <w:rPr>
+                <w:color w:val="1E293B"/>
+                <w:sz w:val="16"/>
+              </w:rPr>
+              <w:t>Rentrée de +2,5 M€/an certifiés.</w:t>
+            </w:r>
+          </w:p>
+        </w:tc>
+      </w:tr>
+      <w:tr>
+        <w:tc>
+          <w:tcPr>
+            <w:tcW w:type="dxa" w:w="2412"/>
+            <w:shd w:fill="F8FAFC"/>
+          </w:tcPr>
+          <w:p>
+            <w:pPr>
+              <w:spacing w:before="60" w:after="60"/>
+            </w:pPr>
+            <w:r>
+              <w:rPr>
+                <w:color w:val="1E293B"/>
+                <w:sz w:val="16"/>
+              </w:rPr>
+              <w:t>Année 1 - Q4</w:t>
+            </w:r>
+          </w:p>
+        </w:tc>
+        <w:tc>
+          <w:tcPr>
+            <w:tcW w:type="dxa" w:w="2412"/>
+            <w:shd w:fill="F8FAFC"/>
+          </w:tcPr>
+          <w:p>
+            <w:pPr>
+              <w:spacing w:before="60" w:after="60"/>
+            </w:pPr>
+            <w:r>
+              <w:rPr>
+                <w:color w:val="1E293B"/>
+                <w:sz w:val="16"/>
+              </w:rPr>
+              <w:t>L4.3 Recette Sécurité Monaco Cloud AMSN</w:t>
+            </w:r>
+          </w:p>
+        </w:tc>
+        <w:tc>
+          <w:tcPr>
+            <w:tcW w:type="dxa" w:w="2412"/>
+            <w:shd w:fill="F8FAFC"/>
+          </w:tcPr>
+          <w:p>
+            <w:pPr>
+              <w:spacing w:before="60" w:after="60"/>
+            </w:pPr>
+            <w:r>
+              <w:rPr>
+                <w:color w:val="1E293B"/>
+                <w:sz w:val="16"/>
+              </w:rPr>
+              <w:t>23,75 k€</w:t>
+            </w:r>
+          </w:p>
+        </w:tc>
+        <w:tc>
+          <w:tcPr>
+            <w:tcW w:type="dxa" w:w="2412"/>
+            <w:shd w:fill="F8FAFC"/>
+          </w:tcPr>
+          <w:p>
+            <w:pPr>
+              <w:spacing w:before="60" w:after="60"/>
+            </w:pPr>
+            <w:r>
+              <w:rPr>
+                <w:color w:val="1E293B"/>
+                <w:sz w:val="16"/>
+              </w:rPr>
+              <w:t>Certification Cloud Souverain.</w:t>
+            </w:r>
+          </w:p>
+        </w:tc>
+      </w:tr>
+      <w:tr>
+        <w:tc>
+          <w:tcPr>
+            <w:tcW w:type="dxa" w:w="2412"/>
+            <w:shd w:fill="FFFFFF"/>
+          </w:tcPr>
+          <w:p>
+            <w:pPr>
+              <w:spacing w:before="60" w:after="60"/>
+            </w:pPr>
+            <w:r>
+              <w:rPr>
+                <w:color w:val="1E293B"/>
+                <w:sz w:val="16"/>
+              </w:rPr>
+              <w:t>Année 1 - Q4</w:t>
+            </w:r>
+          </w:p>
+        </w:tc>
+        <w:tc>
+          <w:tcPr>
+            <w:tcW w:type="dxa" w:w="2412"/>
+            <w:shd w:fill="FFFFFF"/>
+          </w:tcPr>
+          <w:p>
+            <w:pPr>
+              <w:spacing w:before="60" w:after="60"/>
+            </w:pPr>
+            <w:r>
+              <w:rPr>
+                <w:color w:val="1E293B"/>
+                <w:sz w:val="16"/>
+              </w:rPr>
+              <w:t>L4.4 Restitution Publique Einstein Quartiers</w:t>
+            </w:r>
+          </w:p>
+        </w:tc>
+        <w:tc>
+          <w:tcPr>
+            <w:tcW w:type="dxa" w:w="2412"/>
+            <w:shd w:fill="FFFFFF"/>
+          </w:tcPr>
+          <w:p>
+            <w:pPr>
+              <w:spacing w:before="60" w:after="60"/>
+            </w:pPr>
+            <w:r>
+              <w:rPr>
+                <w:color w:val="1E293B"/>
+                <w:sz w:val="16"/>
+              </w:rPr>
+              <w:t>20,00 k€</w:t>
+            </w:r>
+          </w:p>
+        </w:tc>
+        <w:tc>
+          <w:tcPr>
+            <w:tcW w:type="dxa" w:w="2412"/>
+            <w:shd w:fill="FFFFFF"/>
+          </w:tcPr>
+          <w:p>
+            <w:pPr>
+              <w:spacing w:before="60" w:after="60"/>
+            </w:pPr>
+            <w:r>
+              <w:rPr>
+                <w:color w:val="1E293B"/>
+                <w:sz w:val="16"/>
+              </w:rPr>
+              <w:t>Arbitrages budgétaires citoyens.</w:t>
+            </w:r>
+          </w:p>
+        </w:tc>
+      </w:tr>
+      <w:tr>
+        <w:tc>
+          <w:tcPr>
+            <w:tcW w:type="dxa" w:w="2412"/>
+            <w:shd w:fill="F8FAFC"/>
+          </w:tcPr>
+          <w:p>
+            <w:pPr>
+              <w:spacing w:before="60" w:after="60"/>
+            </w:pPr>
+            <w:r>
+              <w:rPr>
+                <w:color w:val="1E293B"/>
+                <w:sz w:val="16"/>
+              </w:rPr>
+              <w:t>Année 2 - S1</w:t>
+            </w:r>
+          </w:p>
+        </w:tc>
+        <w:tc>
+          <w:tcPr>
+            <w:tcW w:type="dxa" w:w="2412"/>
+            <w:shd w:fill="F8FAFC"/>
+          </w:tcPr>
+          <w:p>
+            <w:pPr>
+              <w:spacing w:before="60" w:after="60"/>
+            </w:pPr>
+            <w:r>
+              <w:rPr>
+                <w:color w:val="1E293B"/>
+                <w:sz w:val="16"/>
+              </w:rPr>
+              <w:t>L5.1 Guichet Vocal Allo Niçois Séniors 24/7</w:t>
+            </w:r>
+          </w:p>
+        </w:tc>
+        <w:tc>
+          <w:tcPr>
+            <w:tcW w:type="dxa" w:w="2412"/>
+            <w:shd w:fill="F8FAFC"/>
+          </w:tcPr>
+          <w:p>
+            <w:pPr>
+              <w:spacing w:before="60" w:after="60"/>
+            </w:pPr>
+            <w:r>
+              <w:rPr>
+                <w:color w:val="1E293B"/>
+                <w:sz w:val="16"/>
+              </w:rPr>
+              <w:t>85,00 k€</w:t>
+            </w:r>
+          </w:p>
+        </w:tc>
+        <w:tc>
+          <w:tcPr>
+            <w:tcW w:type="dxa" w:w="2412"/>
+            <w:shd w:fill="F8FAFC"/>
+          </w:tcPr>
+          <w:p>
+            <w:pPr>
+              <w:spacing w:before="60" w:after="60"/>
+            </w:pPr>
+            <w:r>
+              <w:rPr>
+                <w:color w:val="1E293B"/>
+                <w:sz w:val="16"/>
+              </w:rPr>
+              <w:t>Assistance 24/7 &amp; d'urgence.</w:t>
+            </w:r>
+          </w:p>
+        </w:tc>
+      </w:tr>
+      <w:tr>
+        <w:tc>
+          <w:tcPr>
+            <w:tcW w:type="dxa" w:w="2412"/>
+            <w:shd w:fill="FFFFFF"/>
+          </w:tcPr>
+          <w:p>
+            <w:pPr>
+              <w:spacing w:before="60" w:after="60"/>
+            </w:pPr>
+            <w:r>
+              <w:rPr>
+                <w:color w:val="1E293B"/>
+                <w:sz w:val="16"/>
+              </w:rPr>
+              <w:t>Année 2 - S1</w:t>
+            </w:r>
+          </w:p>
+        </w:tc>
+        <w:tc>
+          <w:tcPr>
+            <w:tcW w:type="dxa" w:w="2412"/>
+            <w:shd w:fill="FFFFFF"/>
+          </w:tcPr>
+          <w:p>
+            <w:pPr>
+              <w:spacing w:before="60" w:after="60"/>
+            </w:pPr>
+            <w:r>
+              <w:rPr>
+                <w:color w:val="1E293B"/>
+                <w:sz w:val="16"/>
+              </w:rPr>
+              <w:t>L5.2 VSA Propreté &amp; Routage Bennes</w:t>
+            </w:r>
+          </w:p>
+        </w:tc>
+        <w:tc>
+          <w:tcPr>
+            <w:tcW w:type="dxa" w:w="2412"/>
+            <w:shd w:fill="FFFFFF"/>
+          </w:tcPr>
+          <w:p>
+            <w:pPr>
+              <w:spacing w:before="60" w:after="60"/>
+            </w:pPr>
+            <w:r>
+              <w:rPr>
+                <w:color w:val="1E293B"/>
+                <w:sz w:val="16"/>
+              </w:rPr>
+              <w:t>65,00 k€</w:t>
+            </w:r>
+          </w:p>
+        </w:tc>
+        <w:tc>
+          <w:tcPr>
+            <w:tcW w:type="dxa" w:w="2412"/>
+            <w:shd w:fill="FFFFFF"/>
+          </w:tcPr>
+          <w:p>
+            <w:pPr>
+              <w:spacing w:before="60" w:after="60"/>
+            </w:pPr>
+            <w:r>
+              <w:rPr>
+                <w:color w:val="1E293B"/>
+                <w:sz w:val="16"/>
+              </w:rPr>
+              <w:t>Rues propres &amp; -18% carburant.</w:t>
+            </w:r>
+          </w:p>
+        </w:tc>
+      </w:tr>
+      <w:tr>
+        <w:tc>
+          <w:tcPr>
+            <w:tcW w:type="dxa" w:w="2412"/>
+            <w:shd w:fill="F8FAFC"/>
+          </w:tcPr>
+          <w:p>
+            <w:pPr>
+              <w:spacing w:before="60" w:after="60"/>
+            </w:pPr>
+            <w:r>
+              <w:rPr>
+                <w:color w:val="1E293B"/>
+                <w:sz w:val="16"/>
+              </w:rPr>
+              <w:t>Année 2 - S2</w:t>
+            </w:r>
+          </w:p>
+        </w:tc>
+        <w:tc>
+          <w:tcPr>
+            <w:tcW w:type="dxa" w:w="2412"/>
+            <w:shd w:fill="F8FAFC"/>
+          </w:tcPr>
+          <w:p>
+            <w:pPr>
+              <w:spacing w:before="60" w:after="60"/>
+            </w:pPr>
+            <w:r>
+              <w:rPr>
+                <w:color w:val="1E293B"/>
+                <w:sz w:val="16"/>
+              </w:rPr>
+              <w:t>L6.1 Extension Zone Franche Numérique</w:t>
+            </w:r>
+          </w:p>
+        </w:tc>
+        <w:tc>
+          <w:tcPr>
+            <w:tcW w:type="dxa" w:w="2412"/>
+            <w:shd w:fill="F8FAFC"/>
+          </w:tcPr>
+          <w:p>
+            <w:pPr>
+              <w:spacing w:before="60" w:after="60"/>
+            </w:pPr>
+            <w:r>
+              <w:rPr>
+                <w:color w:val="1E293B"/>
+                <w:sz w:val="16"/>
+              </w:rPr>
+              <w:t>85,00 k€</w:t>
+            </w:r>
+          </w:p>
+        </w:tc>
+        <w:tc>
+          <w:tcPr>
+            <w:tcW w:type="dxa" w:w="2412"/>
+            <w:shd w:fill="F8FAFC"/>
+          </w:tcPr>
+          <w:p>
+            <w:pPr>
+              <w:spacing w:before="60" w:after="60"/>
+            </w:pPr>
+            <w:r>
+              <w:rPr>
+                <w:color w:val="1E293B"/>
+                <w:sz w:val="16"/>
+              </w:rPr>
+              <w:t>Attraction PME &amp; Data Center.</w:t>
+            </w:r>
+          </w:p>
+        </w:tc>
+      </w:tr>
+      <w:tr>
+        <w:tc>
+          <w:tcPr>
+            <w:tcW w:type="dxa" w:w="2412"/>
+            <w:shd w:fill="FFFFFF"/>
+          </w:tcPr>
+          <w:p>
+            <w:pPr>
+              <w:spacing w:before="60" w:after="60"/>
+            </w:pPr>
+            <w:r>
+              <w:rPr>
+                <w:color w:val="1E293B"/>
+                <w:sz w:val="16"/>
+              </w:rPr>
+              <w:t>Année 2 - S2</w:t>
+            </w:r>
+          </w:p>
+        </w:tc>
+        <w:tc>
+          <w:tcPr>
+            <w:tcW w:type="dxa" w:w="2412"/>
+            <w:shd w:fill="FFFFFF"/>
+          </w:tcPr>
+          <w:p>
+            <w:pPr>
+              <w:spacing w:before="60" w:after="60"/>
+            </w:pPr>
+            <w:r>
+              <w:rPr>
+                <w:color w:val="1E293B"/>
+                <w:sz w:val="16"/>
+              </w:rPr>
+              <w:t>L6.2 Concertation Einstein Récurrente</w:t>
+            </w:r>
+          </w:p>
+        </w:tc>
+        <w:tc>
+          <w:tcPr>
+            <w:tcW w:type="dxa" w:w="2412"/>
+            <w:shd w:fill="FFFFFF"/>
+          </w:tcPr>
+          <w:p>
+            <w:pPr>
+              <w:spacing w:before="60" w:after="60"/>
+            </w:pPr>
+            <w:r>
+              <w:rPr>
+                <w:color w:val="1E293B"/>
+                <w:sz w:val="16"/>
+              </w:rPr>
+              <w:t>60,00 k€</w:t>
+            </w:r>
+          </w:p>
+        </w:tc>
+        <w:tc>
+          <w:tcPr>
+            <w:tcW w:type="dxa" w:w="2412"/>
+            <w:shd w:fill="FFFFFF"/>
+          </w:tcPr>
+          <w:p>
+            <w:pPr>
+              <w:spacing w:before="60" w:after="60"/>
+            </w:pPr>
+            <w:r>
+              <w:rPr>
+                <w:color w:val="1E293B"/>
+                <w:sz w:val="16"/>
+              </w:rPr>
+              <w:t>Ingestion avis par quartier.</w:t>
+            </w:r>
+          </w:p>
+        </w:tc>
+      </w:tr>
+      <w:tr>
+        <w:tc>
+          <w:tcPr>
+            <w:tcW w:type="dxa" w:w="2412"/>
+            <w:shd w:fill="F8FAFC"/>
+          </w:tcPr>
+          <w:p>
+            <w:pPr>
+              <w:spacing w:before="60" w:after="60"/>
+            </w:pPr>
+            <w:r>
+              <w:rPr>
+                <w:color w:val="1E293B"/>
+                <w:sz w:val="16"/>
+              </w:rPr>
+              <w:t>Année 3</w:t>
+            </w:r>
+          </w:p>
+        </w:tc>
+        <w:tc>
+          <w:tcPr>
+            <w:tcW w:type="dxa" w:w="2412"/>
+            <w:shd w:fill="F8FAFC"/>
+          </w:tcPr>
+          <w:p>
+            <w:pPr>
+              <w:spacing w:before="60" w:after="60"/>
+            </w:pPr>
+            <w:r>
+              <w:rPr>
+                <w:color w:val="1E293B"/>
+                <w:sz w:val="16"/>
+              </w:rPr>
+              <w:t>L7.1 Supercalculateur AI Gigafactory</w:t>
+            </w:r>
+          </w:p>
+        </w:tc>
+        <w:tc>
+          <w:tcPr>
+            <w:tcW w:type="dxa" w:w="2412"/>
+            <w:shd w:fill="F8FAFC"/>
+          </w:tcPr>
+          <w:p>
+            <w:pPr>
+              <w:spacing w:before="60" w:after="60"/>
+            </w:pPr>
+            <w:r>
+              <w:rPr>
+                <w:color w:val="1E293B"/>
+                <w:sz w:val="16"/>
+              </w:rPr>
+              <w:t>160,00 k€</w:t>
+            </w:r>
+          </w:p>
+        </w:tc>
+        <w:tc>
+          <w:tcPr>
+            <w:tcW w:type="dxa" w:w="2412"/>
+            <w:shd w:fill="F8FAFC"/>
+          </w:tcPr>
+          <w:p>
+            <w:pPr>
+              <w:spacing w:before="60" w:after="60"/>
+            </w:pPr>
+            <w:r>
+              <w:rPr>
+                <w:color w:val="1E293B"/>
+                <w:sz w:val="16"/>
+              </w:rPr>
+              <w:t>Mise en service opérationnelle.</w:t>
+            </w:r>
+          </w:p>
+        </w:tc>
+      </w:tr>
+      <w:tr>
+        <w:tc>
+          <w:tcPr>
+            <w:tcW w:type="dxa" w:w="2412"/>
+            <w:shd w:fill="FFFFFF"/>
+          </w:tcPr>
+          <w:p>
+            <w:pPr>
+              <w:spacing w:before="60" w:after="60"/>
+            </w:pPr>
+            <w:r>
+              <w:rPr>
+                <w:color w:val="1E293B"/>
+                <w:sz w:val="16"/>
+              </w:rPr>
+              <w:t>Année 3</w:t>
+            </w:r>
+          </w:p>
+        </w:tc>
+        <w:tc>
+          <w:tcPr>
+            <w:tcW w:type="dxa" w:w="2412"/>
+            <w:shd w:fill="FFFFFF"/>
+          </w:tcPr>
+          <w:p>
+            <w:pPr>
+              <w:spacing w:before="60" w:after="60"/>
+            </w:pPr>
+            <w:r>
+              <w:rPr>
+                <w:color w:val="1E293B"/>
+                <w:sz w:val="16"/>
+              </w:rPr>
+              <w:t>L7.2 Industrialisation IA Frugale &amp; Cyber</w:t>
+            </w:r>
+          </w:p>
+        </w:tc>
+        <w:tc>
+          <w:tcPr>
+            <w:tcW w:type="dxa" w:w="2412"/>
+            <w:shd w:fill="FFFFFF"/>
+          </w:tcPr>
+          <w:p>
+            <w:pPr>
+              <w:spacing w:before="60" w:after="60"/>
+            </w:pPr>
+            <w:r>
+              <w:rPr>
+                <w:color w:val="1E293B"/>
+                <w:sz w:val="16"/>
+              </w:rPr>
+              <w:t>170,00 k€</w:t>
+            </w:r>
+          </w:p>
+        </w:tc>
+        <w:tc>
+          <w:tcPr>
+            <w:tcW w:type="dxa" w:w="2412"/>
+            <w:shd w:fill="FFFFFF"/>
+          </w:tcPr>
+          <w:p>
+            <w:pPr>
+              <w:spacing w:before="60" w:after="60"/>
+            </w:pPr>
+            <w:r>
+              <w:rPr>
+                <w:color w:val="1E293B"/>
+                <w:sz w:val="16"/>
+              </w:rPr>
+              <w:t>Pérennisation &amp; Hub AI Act.</w:t>
+            </w:r>
+          </w:p>
+        </w:tc>
+      </w:tr>
+    </w:tbl>
+    <w:p>
+      <w:pPr>
+        <w:spacing w:after="200"/>
+      </w:pPr>
+    </w:p>
+    <w:p>
+      <w:pPr>
+        <w:keepNext/>
+        <w:spacing w:before="280" w:after="120"/>
+      </w:pPr>
+      <w:r>
+        <w:rPr>
+          <w:rFonts w:ascii="Georgia" w:hAnsi="Georgia"/>
+          <w:b/>
+          <w:color w:val="1E3A8A"/>
+          <w:sz w:val="25"/>
+        </w:rPr>
+        <w:t>5.3 Tableau de Synthèse Budgétaire Trimestriel (435 k€ / an)</w:t>
       </w:r>
     </w:p>
     <w:p>
@@ -4139,295 +5932,1087 @@
           <w:b/>
           <w:color w:val="0F172A"/>
         </w:rPr>
-        <w:t>Échéance Imminente (12 Novembre 2026)</w:t>
+        <w:t>Étalement de la Trésorerie</w:t>
       </w:r>
       <w:r>
         <w:rPr>
           <w:color w:val="1E293B"/>
         </w:rPr>
-        <w:t xml:space="preserve"> : Dépôt officiel du dossier de candidature binationale Nice-Monaco pour l'appel d'offres AI Gigafactories (500 M€ UE).</w:t>
-      </w:r>
-    </w:p>
-    <w:p>
-      <w:pPr>
-        <w:keepNext/>
-        <w:spacing w:before="200" w:after="80"/>
-      </w:pPr>
-      <w:r>
-        <w:rPr>
-          <w:rFonts w:ascii="Arial" w:hAnsi="Arial"/>
-          <w:b/>
-          <w:color w:val="334155"/>
-          <w:sz w:val="21"/>
-        </w:rPr>
-        <w:t>Phase 1 — Amorçage, Candidature Gigafactory &amp; CSU (Année 1 : 2026-2027 / 435 k€ brut)</w:t>
-      </w:r>
-    </w:p>
-    <w:p>
-      <w:pPr>
-        <w:pStyle w:val="ListBullet"/>
-        <w:spacing w:before="40" w:after="100" w:line="276" w:lineRule="auto"/>
-      </w:pPr>
-      <w:r>
-        <w:rPr>
-          <w:b/>
-          <w:color w:val="0F172A"/>
-        </w:rPr>
-        <w:t>Bilan Budgétaire Année 1</w:t>
-      </w:r>
-      <w:r>
-        <w:rPr>
-          <w:color w:val="1E293B"/>
-        </w:rPr>
-        <w:t xml:space="preserve"> : Direction de projet 65 k€ | Licences VSA CSU 130 k€ | Ingestion Cloud/Fibre Monaco 110 k€ | Audit AI Act &amp; Cyber NIS 2 80 k€ | Démocratie Participative Einstein 50 k€.</w:t>
-      </w:r>
-    </w:p>
-    <w:p>
-      <w:pPr>
-        <w:pStyle w:val="ListBullet"/>
-        <w:spacing w:before="40" w:after="100" w:line="276" w:lineRule="auto"/>
-      </w:pPr>
-      <w:r>
-        <w:rPr>
-          <w:b/>
-          <w:color w:val="0F172A"/>
-        </w:rPr>
-        <w:t>Action 100 Jours</w:t>
-      </w:r>
-      <w:r>
-        <w:rPr>
-          <w:color w:val="1E293B"/>
-        </w:rPr>
-        <w:t xml:space="preserve"> : Vote de la délibération cadre métropolitaine &amp; création du Bureau de Candidature Binationale Nice-Monaco-Sophia.</w:t>
-      </w:r>
-    </w:p>
-    <w:p>
-      <w:pPr>
-        <w:pStyle w:val="ListBullet"/>
-        <w:spacing w:before="40" w:after="100" w:line="276" w:lineRule="auto"/>
-      </w:pPr>
-      <w:r>
-        <w:rPr>
-          <w:b/>
-          <w:color w:val="0F172A"/>
-        </w:rPr>
-        <w:t>Action 6 Mois</w:t>
-      </w:r>
-      <w:r>
-        <w:rPr>
-          <w:color w:val="1E293B"/>
-        </w:rPr>
-        <w:t xml:space="preserve"> : Déploiement du filtrage VSA sur le CSU (4 300 caméras) + géolocalisation et dispatching des patrouilles PM.</w:t>
-      </w:r>
-    </w:p>
-    <w:p>
-      <w:pPr>
-        <w:pStyle w:val="ListBullet"/>
-        <w:spacing w:before="40" w:after="100" w:line="276" w:lineRule="auto"/>
-      </w:pPr>
-      <w:r>
-        <w:rPr>
-          <w:b/>
-          <w:color w:val="0F172A"/>
-        </w:rPr>
-        <w:t>Action 12 Mois</w:t>
-      </w:r>
-      <w:r>
-        <w:rPr>
-          <w:color w:val="1E293B"/>
-        </w:rPr>
-        <w:t xml:space="preserve"> : Ingestion sémantique du premier lot de factures de la commande publique métropolitaine (300 M€).</w:t>
-      </w:r>
-    </w:p>
-    <w:p>
-      <w:pPr>
-        <w:keepNext/>
-        <w:spacing w:before="200" w:after="80"/>
-      </w:pPr>
-      <w:r>
-        <w:rPr>
-          <w:rFonts w:ascii="Arial" w:hAnsi="Arial"/>
-          <w:b/>
-          <w:color w:val="334155"/>
-          <w:sz w:val="21"/>
-        </w:rPr>
-        <w:t>Phase 2 — Échelle, Allo Niçois 24/7 &amp; Audit Commande Publique (Année 2 : 2027-2028 / 435 k€ brut)</w:t>
-      </w:r>
-    </w:p>
-    <w:p>
-      <w:pPr>
-        <w:pStyle w:val="ListBullet"/>
-        <w:spacing w:before="40" w:after="100" w:line="276" w:lineRule="auto"/>
-      </w:pPr>
-      <w:r>
-        <w:rPr>
-          <w:b/>
-          <w:color w:val="0F172A"/>
-        </w:rPr>
-        <w:t>Bilan Budgétaire Année 2</w:t>
-      </w:r>
-      <w:r>
-        <w:rPr>
-          <w:color w:val="1E293B"/>
-        </w:rPr>
-        <w:t xml:space="preserve"> : Direction de projet 65 k€ | Licences Vocal &amp; Propreté 160 k€ | Cloud Souverain Monaco 125 k€ | Maintien Cyber NIS 2 &amp; AI Act 50 k€ | Concertation Einstein Quartiers 35 k€.</w:t>
-      </w:r>
-    </w:p>
-    <w:p>
-      <w:pPr>
-        <w:pStyle w:val="ListBullet"/>
-        <w:spacing w:before="40" w:after="100" w:line="276" w:lineRule="auto"/>
-      </w:pPr>
-      <w:r>
-        <w:rPr>
-          <w:b/>
-          <w:color w:val="0F172A"/>
-        </w:rPr>
-        <w:t>Lancement Guichet Vocal</w:t>
-      </w:r>
-      <w:r>
-        <w:rPr>
-          <w:color w:val="1E293B"/>
-        </w:rPr>
-        <w:t xml:space="preserve"> : Déploiement d'Allo Niçois Séniors 24/7 pour la prise en charge immédiate des demandes d'aide d'urgence et démarches.</w:t>
-      </w:r>
-    </w:p>
-    <w:p>
-      <w:pPr>
-        <w:pStyle w:val="ListBullet"/>
-        <w:spacing w:before="40" w:after="100" w:line="276" w:lineRule="auto"/>
-      </w:pPr>
-      <w:r>
-        <w:rPr>
-          <w:b/>
-          <w:color w:val="0F172A"/>
-        </w:rPr>
-        <w:t>Résultats Financiers Certifiés</w:t>
-      </w:r>
-      <w:r>
-        <w:rPr>
-          <w:color w:val="1E293B"/>
-        </w:rPr>
-        <w:t xml:space="preserve"> : Première rentrée de </w:t>
+        <w:t xml:space="preserve"> : Les dépenses sont lissées de manière équilibrée à raison de </w:t>
       </w:r>
       <w:r>
         <w:rPr>
           <w:b/>
           <w:color w:val="0F172A"/>
         </w:rPr>
-        <w:t>+2,50 M€ d'économies nettes</w:t>
+        <w:t>~108,75 k€ par trimestre</w:t>
       </w:r>
       <w:r>
         <w:rPr>
           <w:color w:val="1E293B"/>
         </w:rPr>
-        <w:t xml:space="preserve"> sur la commande publique métropolitaine.</w:t>
-      </w:r>
-    </w:p>
-    <w:p>
-      <w:pPr>
-        <w:pStyle w:val="ListBullet"/>
-        <w:spacing w:before="40" w:after="100" w:line="276" w:lineRule="auto"/>
-      </w:pPr>
-      <w:r>
-        <w:rPr>
-          <w:b/>
-          <w:color w:val="0F172A"/>
-        </w:rPr>
-        <w:t>Certification AI Act</w:t>
-      </w:r>
-      <w:r>
-        <w:rPr>
-          <w:color w:val="1E293B"/>
-        </w:rPr>
-        <w:t xml:space="preserve"> : Labellisation et audit conformité du Hub Réglementaire Nice-Monaco.</w:t>
-      </w:r>
-    </w:p>
-    <w:p>
-      <w:pPr>
-        <w:keepNext/>
-        <w:spacing w:before="200" w:after="80"/>
-      </w:pPr>
-      <w:r>
-        <w:rPr>
-          <w:rFonts w:ascii="Arial" w:hAnsi="Arial"/>
-          <w:b/>
-          <w:color w:val="334155"/>
-          <w:sz w:val="21"/>
-        </w:rPr>
-        <w:t>Phase 3 — Consécration, Opérationnalité Gigafactory &amp; Autonomie (Année 3 : 2028-2029 / 435 k€ brut)</w:t>
-      </w:r>
-    </w:p>
-    <w:p>
-      <w:pPr>
-        <w:pStyle w:val="ListBullet"/>
-        <w:spacing w:before="40" w:after="100" w:line="276" w:lineRule="auto"/>
-      </w:pPr>
-      <w:r>
-        <w:rPr>
-          <w:b/>
-          <w:color w:val="0F172A"/>
-        </w:rPr>
-        <w:t>Bilan Budgétaire Année 3</w:t>
-      </w:r>
-      <w:r>
-        <w:rPr>
-          <w:color w:val="1E293B"/>
-        </w:rPr>
-        <w:t xml:space="preserve"> : Direction de projet 65 k€ | Maintenance IA &amp; Sobriété 160 k€ | Cloud Monaco &amp; Supercalculateur 125 k€ | Audit NIS 2 50 k€ | Concertation Récurrente 35 k€.</w:t>
-      </w:r>
-    </w:p>
-    <w:p>
-      <w:pPr>
-        <w:pStyle w:val="ListBullet"/>
-        <w:spacing w:before="40" w:after="100" w:line="276" w:lineRule="auto"/>
-      </w:pPr>
-      <w:r>
-        <w:rPr>
-          <w:b/>
-          <w:color w:val="0F172A"/>
-        </w:rPr>
-        <w:t>Opérationnalité AI Gigafactory</w:t>
-      </w:r>
-      <w:r>
-        <w:rPr>
-          <w:color w:val="1E293B"/>
-        </w:rPr>
-        <w:t xml:space="preserve"> : Mise en service du Supercalculateur IA binationale Nice-Monaco co-financé par l'UE.</w:t>
-      </w:r>
-    </w:p>
-    <w:p>
-      <w:pPr>
-        <w:pStyle w:val="ListBullet"/>
-        <w:spacing w:before="40" w:after="100" w:line="276" w:lineRule="auto"/>
-      </w:pPr>
-      <w:r>
-        <w:rPr>
-          <w:b/>
-          <w:color w:val="0F172A"/>
-        </w:rPr>
-        <w:t>Bilan Triennal Certifié</w:t>
-      </w:r>
-      <w:r>
-        <w:rPr>
-          <w:color w:val="1E293B"/>
-        </w:rPr>
-        <w:t xml:space="preserve"> : Inscription durable de </w:t>
+        <w:t xml:space="preserve"> (soit </w:t>
       </w:r>
       <w:r>
         <w:rPr>
           <w:b/>
           <w:color w:val="0F172A"/>
         </w:rPr>
-        <w:t>+2,5 M€/an d'économies nettes</w:t>
+        <w:t>~72,5 k€ par bimestre</w:t>
       </w:r>
       <w:r>
         <w:rPr>
           <w:color w:val="1E293B"/>
         </w:rPr>
-        <w:t xml:space="preserve"> et consécration de Nice comme Capitale de l'IA de Sécurité &amp; d'Efficience Publique.</w:t>
+        <w:t>), parfaitement maîtrisables au sein du budget métropolitain.</w:t>
       </w:r>
     </w:p>
+    <w:tbl>
+      <w:tblPr>
+        <w:tblW w:type="auto" w:w="0"/>
+        <w:jc w:val="center"/>
+        <w:tblLook w:firstColumn="1" w:firstRow="1" w:lastColumn="0" w:lastRow="0" w:noHBand="0" w:noVBand="1" w:val="04A0"/>
+      </w:tblPr>
+      <w:tblGrid>
+        <w:gridCol w:w="1930"/>
+        <w:gridCol w:w="1930"/>
+        <w:gridCol w:w="1930"/>
+        <w:gridCol w:w="1930"/>
+        <w:gridCol w:w="1930"/>
+      </w:tblGrid>
+      <w:tr>
+        <w:tc>
+          <w:tcPr>
+            <w:tcW w:type="dxa" w:w="1930"/>
+            <w:shd w:fill="1E293B"/>
+          </w:tcPr>
+          <w:p>
+            <w:pPr>
+              <w:spacing w:before="60" w:after="60"/>
+            </w:pPr>
+            <w:r>
+              <w:rPr>
+                <w:b/>
+                <w:color w:val="FFFFFF"/>
+                <w:sz w:val="17"/>
+              </w:rPr>
+              <w:t>Trimestre</w:t>
+            </w:r>
+          </w:p>
+        </w:tc>
+        <w:tc>
+          <w:tcPr>
+            <w:tcW w:type="dxa" w:w="1930"/>
+            <w:shd w:fill="1E293B"/>
+          </w:tcPr>
+          <w:p>
+            <w:pPr>
+              <w:spacing w:before="60" w:after="60"/>
+            </w:pPr>
+            <w:r>
+              <w:rPr>
+                <w:b/>
+                <w:color w:val="FFFFFF"/>
+                <w:sz w:val="17"/>
+              </w:rPr>
+              <w:t>Période Chronologique</w:t>
+            </w:r>
+          </w:p>
+        </w:tc>
+        <w:tc>
+          <w:tcPr>
+            <w:tcW w:type="dxa" w:w="1930"/>
+            <w:shd w:fill="1E293B"/>
+          </w:tcPr>
+          <w:p>
+            <w:pPr>
+              <w:spacing w:before="60" w:after="60"/>
+            </w:pPr>
+            <w:r>
+              <w:rPr>
+                <w:b/>
+                <w:color w:val="FFFFFF"/>
+                <w:sz w:val="17"/>
+              </w:rPr>
+              <w:t>Budget Brut</w:t>
+            </w:r>
+          </w:p>
+        </w:tc>
+        <w:tc>
+          <w:tcPr>
+            <w:tcW w:type="dxa" w:w="1930"/>
+            <w:shd w:fill="1E293B"/>
+          </w:tcPr>
+          <w:p>
+            <w:pPr>
+              <w:spacing w:before="60" w:after="60"/>
+            </w:pPr>
+            <w:r>
+              <w:rPr>
+                <w:b/>
+                <w:color w:val="FFFFFF"/>
+                <w:sz w:val="17"/>
+              </w:rPr>
+              <w:t>Co-financement UE (50%)</w:t>
+            </w:r>
+          </w:p>
+        </w:tc>
+        <w:tc>
+          <w:tcPr>
+            <w:tcW w:type="dxa" w:w="1930"/>
+            <w:shd w:fill="1E293B"/>
+          </w:tcPr>
+          <w:p>
+            <w:pPr>
+              <w:spacing w:before="60" w:after="60"/>
+            </w:pPr>
+            <w:r>
+              <w:rPr>
+                <w:b/>
+                <w:color w:val="FFFFFF"/>
+                <w:sz w:val="17"/>
+              </w:rPr>
+              <w:t>Reste à Charge Net Métropole</w:t>
+            </w:r>
+          </w:p>
+        </w:tc>
+      </w:tr>
+      <w:tr>
+        <w:tc>
+          <w:tcPr>
+            <w:tcW w:type="dxa" w:w="1930"/>
+            <w:shd w:fill="F8FAFC"/>
+          </w:tcPr>
+          <w:p>
+            <w:pPr>
+              <w:spacing w:before="60" w:after="60"/>
+            </w:pPr>
+            <w:r>
+              <w:rPr>
+                <w:color w:val="1E293B"/>
+                <w:sz w:val="16"/>
+              </w:rPr>
+              <w:t>Année 1 - Q1</w:t>
+            </w:r>
+          </w:p>
+        </w:tc>
+        <w:tc>
+          <w:tcPr>
+            <w:tcW w:type="dxa" w:w="1930"/>
+            <w:shd w:fill="F8FAFC"/>
+          </w:tcPr>
+          <w:p>
+            <w:pPr>
+              <w:spacing w:before="60" w:after="60"/>
+            </w:pPr>
+            <w:r>
+              <w:rPr>
+                <w:color w:val="1E293B"/>
+                <w:sz w:val="16"/>
+              </w:rPr>
+              <w:t>Août — Octobre 2026</w:t>
+            </w:r>
+          </w:p>
+        </w:tc>
+        <w:tc>
+          <w:tcPr>
+            <w:tcW w:type="dxa" w:w="1930"/>
+            <w:shd w:fill="F8FAFC"/>
+          </w:tcPr>
+          <w:p>
+            <w:pPr>
+              <w:spacing w:before="60" w:after="60"/>
+            </w:pPr>
+            <w:r>
+              <w:rPr>
+                <w:color w:val="1E293B"/>
+                <w:sz w:val="16"/>
+              </w:rPr>
+              <w:t>110,00 k€</w:t>
+            </w:r>
+          </w:p>
+        </w:tc>
+        <w:tc>
+          <w:tcPr>
+            <w:tcW w:type="dxa" w:w="1930"/>
+            <w:shd w:fill="F8FAFC"/>
+          </w:tcPr>
+          <w:p>
+            <w:pPr>
+              <w:spacing w:before="60" w:after="60"/>
+            </w:pPr>
+            <w:r>
+              <w:rPr>
+                <w:color w:val="1E293B"/>
+                <w:sz w:val="16"/>
+              </w:rPr>
+              <w:t>55,00 k€</w:t>
+            </w:r>
+          </w:p>
+        </w:tc>
+        <w:tc>
+          <w:tcPr>
+            <w:tcW w:type="dxa" w:w="1930"/>
+            <w:shd w:fill="F8FAFC"/>
+          </w:tcPr>
+          <w:p>
+            <w:pPr>
+              <w:spacing w:before="60" w:after="60"/>
+            </w:pPr>
+            <w:r>
+              <w:rPr>
+                <w:color w:val="1E293B"/>
+                <w:sz w:val="16"/>
+              </w:rPr>
+              <w:t>55,00 k€</w:t>
+            </w:r>
+          </w:p>
+        </w:tc>
+      </w:tr>
+      <w:tr>
+        <w:tc>
+          <w:tcPr>
+            <w:tcW w:type="dxa" w:w="1930"/>
+            <w:shd w:fill="FFFFFF"/>
+          </w:tcPr>
+          <w:p>
+            <w:pPr>
+              <w:spacing w:before="60" w:after="60"/>
+            </w:pPr>
+            <w:r>
+              <w:rPr>
+                <w:color w:val="1E293B"/>
+                <w:sz w:val="16"/>
+              </w:rPr>
+              <w:t>Année 1 - Q2</w:t>
+            </w:r>
+          </w:p>
+        </w:tc>
+        <w:tc>
+          <w:tcPr>
+            <w:tcW w:type="dxa" w:w="1930"/>
+            <w:shd w:fill="FFFFFF"/>
+          </w:tcPr>
+          <w:p>
+            <w:pPr>
+              <w:spacing w:before="60" w:after="60"/>
+            </w:pPr>
+            <w:r>
+              <w:rPr>
+                <w:color w:val="1E293B"/>
+                <w:sz w:val="16"/>
+              </w:rPr>
+              <w:t>Novembre 2026 — Janvier 2027</w:t>
+            </w:r>
+          </w:p>
+        </w:tc>
+        <w:tc>
+          <w:tcPr>
+            <w:tcW w:type="dxa" w:w="1930"/>
+            <w:shd w:fill="FFFFFF"/>
+          </w:tcPr>
+          <w:p>
+            <w:pPr>
+              <w:spacing w:before="60" w:after="60"/>
+            </w:pPr>
+            <w:r>
+              <w:rPr>
+                <w:color w:val="1E293B"/>
+                <w:sz w:val="16"/>
+              </w:rPr>
+              <w:t>115,00 k€</w:t>
+            </w:r>
+          </w:p>
+        </w:tc>
+        <w:tc>
+          <w:tcPr>
+            <w:tcW w:type="dxa" w:w="1930"/>
+            <w:shd w:fill="FFFFFF"/>
+          </w:tcPr>
+          <w:p>
+            <w:pPr>
+              <w:spacing w:before="60" w:after="60"/>
+            </w:pPr>
+            <w:r>
+              <w:rPr>
+                <w:color w:val="1E293B"/>
+                <w:sz w:val="16"/>
+              </w:rPr>
+              <w:t>57,50 k€</w:t>
+            </w:r>
+          </w:p>
+        </w:tc>
+        <w:tc>
+          <w:tcPr>
+            <w:tcW w:type="dxa" w:w="1930"/>
+            <w:shd w:fill="FFFFFF"/>
+          </w:tcPr>
+          <w:p>
+            <w:pPr>
+              <w:spacing w:before="60" w:after="60"/>
+            </w:pPr>
+            <w:r>
+              <w:rPr>
+                <w:color w:val="1E293B"/>
+                <w:sz w:val="16"/>
+              </w:rPr>
+              <w:t>57,50 k€</w:t>
+            </w:r>
+          </w:p>
+        </w:tc>
+      </w:tr>
+      <w:tr>
+        <w:tc>
+          <w:tcPr>
+            <w:tcW w:type="dxa" w:w="1930"/>
+            <w:shd w:fill="F8FAFC"/>
+          </w:tcPr>
+          <w:p>
+            <w:pPr>
+              <w:spacing w:before="60" w:after="60"/>
+            </w:pPr>
+            <w:r>
+              <w:rPr>
+                <w:color w:val="1E293B"/>
+                <w:sz w:val="16"/>
+              </w:rPr>
+              <w:t>Année 1 - Q3</w:t>
+            </w:r>
+          </w:p>
+        </w:tc>
+        <w:tc>
+          <w:tcPr>
+            <w:tcW w:type="dxa" w:w="1930"/>
+            <w:shd w:fill="F8FAFC"/>
+          </w:tcPr>
+          <w:p>
+            <w:pPr>
+              <w:spacing w:before="60" w:after="60"/>
+            </w:pPr>
+            <w:r>
+              <w:rPr>
+                <w:color w:val="1E293B"/>
+                <w:sz w:val="16"/>
+              </w:rPr>
+              <w:t>Février — Avril 2027</w:t>
+            </w:r>
+          </w:p>
+        </w:tc>
+        <w:tc>
+          <w:tcPr>
+            <w:tcW w:type="dxa" w:w="1930"/>
+            <w:shd w:fill="F8FAFC"/>
+          </w:tcPr>
+          <w:p>
+            <w:pPr>
+              <w:spacing w:before="60" w:after="60"/>
+            </w:pPr>
+            <w:r>
+              <w:rPr>
+                <w:color w:val="1E293B"/>
+                <w:sz w:val="16"/>
+              </w:rPr>
+              <w:t>105,00 k€</w:t>
+            </w:r>
+          </w:p>
+        </w:tc>
+        <w:tc>
+          <w:tcPr>
+            <w:tcW w:type="dxa" w:w="1930"/>
+            <w:shd w:fill="F8FAFC"/>
+          </w:tcPr>
+          <w:p>
+            <w:pPr>
+              <w:spacing w:before="60" w:after="60"/>
+            </w:pPr>
+            <w:r>
+              <w:rPr>
+                <w:color w:val="1E293B"/>
+                <w:sz w:val="16"/>
+              </w:rPr>
+              <w:t>52,50 k€</w:t>
+            </w:r>
+          </w:p>
+        </w:tc>
+        <w:tc>
+          <w:tcPr>
+            <w:tcW w:type="dxa" w:w="1930"/>
+            <w:shd w:fill="F8FAFC"/>
+          </w:tcPr>
+          <w:p>
+            <w:pPr>
+              <w:spacing w:before="60" w:after="60"/>
+            </w:pPr>
+            <w:r>
+              <w:rPr>
+                <w:color w:val="1E293B"/>
+                <w:sz w:val="16"/>
+              </w:rPr>
+              <w:t>52,50 k€</w:t>
+            </w:r>
+          </w:p>
+        </w:tc>
+      </w:tr>
+      <w:tr>
+        <w:tc>
+          <w:tcPr>
+            <w:tcW w:type="dxa" w:w="1930"/>
+            <w:shd w:fill="FFFFFF"/>
+          </w:tcPr>
+          <w:p>
+            <w:pPr>
+              <w:spacing w:before="60" w:after="60"/>
+            </w:pPr>
+            <w:r>
+              <w:rPr>
+                <w:color w:val="1E293B"/>
+                <w:sz w:val="16"/>
+              </w:rPr>
+              <w:t>Année 1 - Q4</w:t>
+            </w:r>
+          </w:p>
+        </w:tc>
+        <w:tc>
+          <w:tcPr>
+            <w:tcW w:type="dxa" w:w="1930"/>
+            <w:shd w:fill="FFFFFF"/>
+          </w:tcPr>
+          <w:p>
+            <w:pPr>
+              <w:spacing w:before="60" w:after="60"/>
+            </w:pPr>
+            <w:r>
+              <w:rPr>
+                <w:color w:val="1E293B"/>
+                <w:sz w:val="16"/>
+              </w:rPr>
+              <w:t>Mai — Juillet 2027</w:t>
+            </w:r>
+          </w:p>
+        </w:tc>
+        <w:tc>
+          <w:tcPr>
+            <w:tcW w:type="dxa" w:w="1930"/>
+            <w:shd w:fill="FFFFFF"/>
+          </w:tcPr>
+          <w:p>
+            <w:pPr>
+              <w:spacing w:before="60" w:after="60"/>
+            </w:pPr>
+            <w:r>
+              <w:rPr>
+                <w:color w:val="1E293B"/>
+                <w:sz w:val="16"/>
+              </w:rPr>
+              <w:t>105,00 k€</w:t>
+            </w:r>
+          </w:p>
+        </w:tc>
+        <w:tc>
+          <w:tcPr>
+            <w:tcW w:type="dxa" w:w="1930"/>
+            <w:shd w:fill="FFFFFF"/>
+          </w:tcPr>
+          <w:p>
+            <w:pPr>
+              <w:spacing w:before="60" w:after="60"/>
+            </w:pPr>
+            <w:r>
+              <w:rPr>
+                <w:color w:val="1E293B"/>
+                <w:sz w:val="16"/>
+              </w:rPr>
+              <w:t>52,50 k€</w:t>
+            </w:r>
+          </w:p>
+        </w:tc>
+        <w:tc>
+          <w:tcPr>
+            <w:tcW w:type="dxa" w:w="1930"/>
+            <w:shd w:fill="FFFFFF"/>
+          </w:tcPr>
+          <w:p>
+            <w:pPr>
+              <w:spacing w:before="60" w:after="60"/>
+            </w:pPr>
+            <w:r>
+              <w:rPr>
+                <w:color w:val="1E293B"/>
+                <w:sz w:val="16"/>
+              </w:rPr>
+              <w:t>52,50 k€</w:t>
+            </w:r>
+          </w:p>
+        </w:tc>
+      </w:tr>
+      <w:tr>
+        <w:tc>
+          <w:tcPr>
+            <w:tcW w:type="dxa" w:w="1930"/>
+            <w:shd w:fill="E2E8F0"/>
+          </w:tcPr>
+          <w:p>
+            <w:pPr>
+              <w:spacing w:before="60" w:after="60"/>
+            </w:pPr>
+            <w:r>
+              <w:rPr>
+                <w:b/>
+                <w:color w:val="0F172A"/>
+                <w:sz w:val="17"/>
+              </w:rPr>
+              <w:t>Sous-Total Année 1</w:t>
+            </w:r>
+          </w:p>
+        </w:tc>
+        <w:tc>
+          <w:tcPr>
+            <w:tcW w:type="dxa" w:w="1930"/>
+            <w:shd w:fill="E2E8F0"/>
+          </w:tcPr>
+          <w:p>
+            <w:pPr>
+              <w:spacing w:before="60" w:after="60"/>
+            </w:pPr>
+            <w:r>
+              <w:rPr>
+                <w:b/>
+                <w:color w:val="0F172A"/>
+                <w:sz w:val="17"/>
+              </w:rPr>
+              <w:t>Août 2026 — Juillet 2027</w:t>
+            </w:r>
+          </w:p>
+        </w:tc>
+        <w:tc>
+          <w:tcPr>
+            <w:tcW w:type="dxa" w:w="1930"/>
+            <w:shd w:fill="E2E8F0"/>
+          </w:tcPr>
+          <w:p>
+            <w:pPr>
+              <w:spacing w:before="60" w:after="60"/>
+            </w:pPr>
+            <w:r>
+              <w:rPr>
+                <w:b/>
+                <w:color w:val="0F172A"/>
+                <w:sz w:val="17"/>
+              </w:rPr>
+              <w:t>435,00 k€</w:t>
+            </w:r>
+          </w:p>
+        </w:tc>
+        <w:tc>
+          <w:tcPr>
+            <w:tcW w:type="dxa" w:w="1930"/>
+            <w:shd w:fill="E2E8F0"/>
+          </w:tcPr>
+          <w:p>
+            <w:pPr>
+              <w:spacing w:before="60" w:after="60"/>
+            </w:pPr>
+            <w:r>
+              <w:rPr>
+                <w:b/>
+                <w:color w:val="0F172A"/>
+                <w:sz w:val="17"/>
+              </w:rPr>
+              <w:t>217,50 k€</w:t>
+            </w:r>
+          </w:p>
+        </w:tc>
+        <w:tc>
+          <w:tcPr>
+            <w:tcW w:type="dxa" w:w="1930"/>
+            <w:shd w:fill="E2E8F0"/>
+          </w:tcPr>
+          <w:p>
+            <w:pPr>
+              <w:spacing w:before="60" w:after="60"/>
+            </w:pPr>
+            <w:r>
+              <w:rPr>
+                <w:b/>
+                <w:color w:val="0F172A"/>
+                <w:sz w:val="17"/>
+              </w:rPr>
+              <w:t>217,50 k€</w:t>
+            </w:r>
+          </w:p>
+        </w:tc>
+      </w:tr>
+      <w:tr>
+        <w:tc>
+          <w:tcPr>
+            <w:tcW w:type="dxa" w:w="1930"/>
+            <w:shd w:fill="FFFFFF"/>
+          </w:tcPr>
+          <w:p>
+            <w:pPr>
+              <w:spacing w:before="60" w:after="60"/>
+            </w:pPr>
+            <w:r>
+              <w:rPr>
+                <w:color w:val="1E293B"/>
+                <w:sz w:val="16"/>
+              </w:rPr>
+              <w:t>Année 2 - Q5-Q6</w:t>
+            </w:r>
+          </w:p>
+        </w:tc>
+        <w:tc>
+          <w:tcPr>
+            <w:tcW w:type="dxa" w:w="1930"/>
+            <w:shd w:fill="FFFFFF"/>
+          </w:tcPr>
+          <w:p>
+            <w:pPr>
+              <w:spacing w:before="60" w:after="60"/>
+            </w:pPr>
+            <w:r>
+              <w:rPr>
+                <w:color w:val="1E293B"/>
+                <w:sz w:val="16"/>
+              </w:rPr>
+              <w:t>Août 2027 — Janvier 2028</w:t>
+            </w:r>
+          </w:p>
+        </w:tc>
+        <w:tc>
+          <w:tcPr>
+            <w:tcW w:type="dxa" w:w="1930"/>
+            <w:shd w:fill="FFFFFF"/>
+          </w:tcPr>
+          <w:p>
+            <w:pPr>
+              <w:spacing w:before="60" w:after="60"/>
+            </w:pPr>
+            <w:r>
+              <w:rPr>
+                <w:color w:val="1E293B"/>
+                <w:sz w:val="16"/>
+              </w:rPr>
+              <w:t>217,50 k€</w:t>
+            </w:r>
+          </w:p>
+        </w:tc>
+        <w:tc>
+          <w:tcPr>
+            <w:tcW w:type="dxa" w:w="1930"/>
+            <w:shd w:fill="FFFFFF"/>
+          </w:tcPr>
+          <w:p>
+            <w:pPr>
+              <w:spacing w:before="60" w:after="60"/>
+            </w:pPr>
+            <w:r>
+              <w:rPr>
+                <w:color w:val="1E293B"/>
+                <w:sz w:val="16"/>
+              </w:rPr>
+              <w:t>108,75 k€</w:t>
+            </w:r>
+          </w:p>
+        </w:tc>
+        <w:tc>
+          <w:tcPr>
+            <w:tcW w:type="dxa" w:w="1930"/>
+            <w:shd w:fill="FFFFFF"/>
+          </w:tcPr>
+          <w:p>
+            <w:pPr>
+              <w:spacing w:before="60" w:after="60"/>
+            </w:pPr>
+            <w:r>
+              <w:rPr>
+                <w:color w:val="1E293B"/>
+                <w:sz w:val="16"/>
+              </w:rPr>
+              <w:t>108,75 k€</w:t>
+            </w:r>
+          </w:p>
+        </w:tc>
+      </w:tr>
+      <w:tr>
+        <w:tc>
+          <w:tcPr>
+            <w:tcW w:type="dxa" w:w="1930"/>
+            <w:shd w:fill="F8FAFC"/>
+          </w:tcPr>
+          <w:p>
+            <w:pPr>
+              <w:spacing w:before="60" w:after="60"/>
+            </w:pPr>
+            <w:r>
+              <w:rPr>
+                <w:color w:val="1E293B"/>
+                <w:sz w:val="16"/>
+              </w:rPr>
+              <w:t>Année 2 - Q7-Q8</w:t>
+            </w:r>
+          </w:p>
+        </w:tc>
+        <w:tc>
+          <w:tcPr>
+            <w:tcW w:type="dxa" w:w="1930"/>
+            <w:shd w:fill="F8FAFC"/>
+          </w:tcPr>
+          <w:p>
+            <w:pPr>
+              <w:spacing w:before="60" w:after="60"/>
+            </w:pPr>
+            <w:r>
+              <w:rPr>
+                <w:color w:val="1E293B"/>
+                <w:sz w:val="16"/>
+              </w:rPr>
+              <w:t>Février — Juillet 2028</w:t>
+            </w:r>
+          </w:p>
+        </w:tc>
+        <w:tc>
+          <w:tcPr>
+            <w:tcW w:type="dxa" w:w="1930"/>
+            <w:shd w:fill="F8FAFC"/>
+          </w:tcPr>
+          <w:p>
+            <w:pPr>
+              <w:spacing w:before="60" w:after="60"/>
+            </w:pPr>
+            <w:r>
+              <w:rPr>
+                <w:color w:val="1E293B"/>
+                <w:sz w:val="16"/>
+              </w:rPr>
+              <w:t>217,50 k€</w:t>
+            </w:r>
+          </w:p>
+        </w:tc>
+        <w:tc>
+          <w:tcPr>
+            <w:tcW w:type="dxa" w:w="1930"/>
+            <w:shd w:fill="F8FAFC"/>
+          </w:tcPr>
+          <w:p>
+            <w:pPr>
+              <w:spacing w:before="60" w:after="60"/>
+            </w:pPr>
+            <w:r>
+              <w:rPr>
+                <w:color w:val="1E293B"/>
+                <w:sz w:val="16"/>
+              </w:rPr>
+              <w:t>108,75 k€</w:t>
+            </w:r>
+          </w:p>
+        </w:tc>
+        <w:tc>
+          <w:tcPr>
+            <w:tcW w:type="dxa" w:w="1930"/>
+            <w:shd w:fill="F8FAFC"/>
+          </w:tcPr>
+          <w:p>
+            <w:pPr>
+              <w:spacing w:before="60" w:after="60"/>
+            </w:pPr>
+            <w:r>
+              <w:rPr>
+                <w:color w:val="1E293B"/>
+                <w:sz w:val="16"/>
+              </w:rPr>
+              <w:t>108,75 k€</w:t>
+            </w:r>
+          </w:p>
+        </w:tc>
+      </w:tr>
+      <w:tr>
+        <w:tc>
+          <w:tcPr>
+            <w:tcW w:type="dxa" w:w="1930"/>
+            <w:shd w:fill="E2E8F0"/>
+          </w:tcPr>
+          <w:p>
+            <w:pPr>
+              <w:spacing w:before="60" w:after="60"/>
+            </w:pPr>
+            <w:r>
+              <w:rPr>
+                <w:b/>
+                <w:color w:val="0F172A"/>
+                <w:sz w:val="17"/>
+              </w:rPr>
+              <w:t>Sous-Total Année 2</w:t>
+            </w:r>
+          </w:p>
+        </w:tc>
+        <w:tc>
+          <w:tcPr>
+            <w:tcW w:type="dxa" w:w="1930"/>
+            <w:shd w:fill="E2E8F0"/>
+          </w:tcPr>
+          <w:p>
+            <w:pPr>
+              <w:spacing w:before="60" w:after="60"/>
+            </w:pPr>
+            <w:r>
+              <w:rPr>
+                <w:b/>
+                <w:color w:val="0F172A"/>
+                <w:sz w:val="17"/>
+              </w:rPr>
+              <w:t>Août 2027 — Juillet 2028</w:t>
+            </w:r>
+          </w:p>
+        </w:tc>
+        <w:tc>
+          <w:tcPr>
+            <w:tcW w:type="dxa" w:w="1930"/>
+            <w:shd w:fill="E2E8F0"/>
+          </w:tcPr>
+          <w:p>
+            <w:pPr>
+              <w:spacing w:before="60" w:after="60"/>
+            </w:pPr>
+            <w:r>
+              <w:rPr>
+                <w:b/>
+                <w:color w:val="0F172A"/>
+                <w:sz w:val="17"/>
+              </w:rPr>
+              <w:t>435,00 k€</w:t>
+            </w:r>
+          </w:p>
+        </w:tc>
+        <w:tc>
+          <w:tcPr>
+            <w:tcW w:type="dxa" w:w="1930"/>
+            <w:shd w:fill="E2E8F0"/>
+          </w:tcPr>
+          <w:p>
+            <w:pPr>
+              <w:spacing w:before="60" w:after="60"/>
+            </w:pPr>
+            <w:r>
+              <w:rPr>
+                <w:b/>
+                <w:color w:val="0F172A"/>
+                <w:sz w:val="17"/>
+              </w:rPr>
+              <w:t>217,50 k€</w:t>
+            </w:r>
+          </w:p>
+        </w:tc>
+        <w:tc>
+          <w:tcPr>
+            <w:tcW w:type="dxa" w:w="1930"/>
+            <w:shd w:fill="E2E8F0"/>
+          </w:tcPr>
+          <w:p>
+            <w:pPr>
+              <w:spacing w:before="60" w:after="60"/>
+            </w:pPr>
+            <w:r>
+              <w:rPr>
+                <w:b/>
+                <w:color w:val="0F172A"/>
+                <w:sz w:val="17"/>
+              </w:rPr>
+              <w:t>217,50 k€</w:t>
+            </w:r>
+          </w:p>
+        </w:tc>
+      </w:tr>
+      <w:tr>
+        <w:tc>
+          <w:tcPr>
+            <w:tcW w:type="dxa" w:w="1930"/>
+            <w:shd w:fill="F8FAFC"/>
+          </w:tcPr>
+          <w:p>
+            <w:pPr>
+              <w:spacing w:before="60" w:after="60"/>
+            </w:pPr>
+            <w:r>
+              <w:rPr>
+                <w:color w:val="1E293B"/>
+                <w:sz w:val="16"/>
+              </w:rPr>
+              <w:t>Année 3 - Q9-Q12</w:t>
+            </w:r>
+          </w:p>
+        </w:tc>
+        <w:tc>
+          <w:tcPr>
+            <w:tcW w:type="dxa" w:w="1930"/>
+            <w:shd w:fill="F8FAFC"/>
+          </w:tcPr>
+          <w:p>
+            <w:pPr>
+              <w:spacing w:before="60" w:after="60"/>
+            </w:pPr>
+            <w:r>
+              <w:rPr>
+                <w:color w:val="1E293B"/>
+                <w:sz w:val="16"/>
+              </w:rPr>
+              <w:t>Août 2028 — Juillet 2029</w:t>
+            </w:r>
+          </w:p>
+        </w:tc>
+        <w:tc>
+          <w:tcPr>
+            <w:tcW w:type="dxa" w:w="1930"/>
+            <w:shd w:fill="F8FAFC"/>
+          </w:tcPr>
+          <w:p>
+            <w:pPr>
+              <w:spacing w:before="60" w:after="60"/>
+            </w:pPr>
+            <w:r>
+              <w:rPr>
+                <w:color w:val="1E293B"/>
+                <w:sz w:val="16"/>
+              </w:rPr>
+              <w:t>435,00 k€</w:t>
+            </w:r>
+          </w:p>
+        </w:tc>
+        <w:tc>
+          <w:tcPr>
+            <w:tcW w:type="dxa" w:w="1930"/>
+            <w:shd w:fill="F8FAFC"/>
+          </w:tcPr>
+          <w:p>
+            <w:pPr>
+              <w:spacing w:before="60" w:after="60"/>
+            </w:pPr>
+            <w:r>
+              <w:rPr>
+                <w:color w:val="1E293B"/>
+                <w:sz w:val="16"/>
+              </w:rPr>
+              <w:t>217,50 k€</w:t>
+            </w:r>
+          </w:p>
+        </w:tc>
+        <w:tc>
+          <w:tcPr>
+            <w:tcW w:type="dxa" w:w="1930"/>
+            <w:shd w:fill="F8FAFC"/>
+          </w:tcPr>
+          <w:p>
+            <w:pPr>
+              <w:spacing w:before="60" w:after="60"/>
+            </w:pPr>
+            <w:r>
+              <w:rPr>
+                <w:color w:val="1E293B"/>
+                <w:sz w:val="16"/>
+              </w:rPr>
+              <w:t>217,50 k€</w:t>
+            </w:r>
+          </w:p>
+        </w:tc>
+      </w:tr>
+      <w:tr>
+        <w:tc>
+          <w:tcPr>
+            <w:tcW w:type="dxa" w:w="1930"/>
+            <w:shd w:fill="E2E8F0"/>
+          </w:tcPr>
+          <w:p>
+            <w:pPr>
+              <w:spacing w:before="60" w:after="60"/>
+            </w:pPr>
+            <w:r>
+              <w:rPr>
+                <w:b/>
+                <w:color w:val="0F172A"/>
+                <w:sz w:val="17"/>
+              </w:rPr>
+              <w:t>TOTAL CUMULÉ 36M</w:t>
+            </w:r>
+          </w:p>
+        </w:tc>
+        <w:tc>
+          <w:tcPr>
+            <w:tcW w:type="dxa" w:w="1930"/>
+            <w:shd w:fill="E2E8F0"/>
+          </w:tcPr>
+          <w:p>
+            <w:pPr>
+              <w:spacing w:before="60" w:after="60"/>
+            </w:pPr>
+            <w:r>
+              <w:rPr>
+                <w:b/>
+                <w:color w:val="0F172A"/>
+                <w:sz w:val="17"/>
+              </w:rPr>
+              <w:t>Août 2026 — Juillet 2029</w:t>
+            </w:r>
+          </w:p>
+        </w:tc>
+        <w:tc>
+          <w:tcPr>
+            <w:tcW w:type="dxa" w:w="1930"/>
+            <w:shd w:fill="E2E8F0"/>
+          </w:tcPr>
+          <w:p>
+            <w:pPr>
+              <w:spacing w:before="60" w:after="60"/>
+            </w:pPr>
+            <w:r>
+              <w:rPr>
+                <w:b/>
+                <w:color w:val="0F172A"/>
+                <w:sz w:val="17"/>
+              </w:rPr>
+              <w:t>1 305,00 k€</w:t>
+            </w:r>
+          </w:p>
+        </w:tc>
+        <w:tc>
+          <w:tcPr>
+            <w:tcW w:type="dxa" w:w="1930"/>
+            <w:shd w:fill="E2E8F0"/>
+          </w:tcPr>
+          <w:p>
+            <w:pPr>
+              <w:spacing w:before="60" w:after="60"/>
+            </w:pPr>
+            <w:r>
+              <w:rPr>
+                <w:b/>
+                <w:color w:val="0F172A"/>
+                <w:sz w:val="17"/>
+              </w:rPr>
+              <w:t>652,50 k€</w:t>
+            </w:r>
+          </w:p>
+        </w:tc>
+        <w:tc>
+          <w:tcPr>
+            <w:tcW w:type="dxa" w:w="1930"/>
+            <w:shd w:fill="E2E8F0"/>
+          </w:tcPr>
+          <w:p>
+            <w:pPr>
+              <w:spacing w:before="60" w:after="60"/>
+            </w:pPr>
+            <w:r>
+              <w:rPr>
+                <w:b/>
+                <w:color w:val="0F172A"/>
+                <w:sz w:val="17"/>
+              </w:rPr>
+              <w:t>652,50 k€</w:t>
+            </w:r>
+          </w:p>
+        </w:tc>
+      </w:tr>
+    </w:tbl>
     <w:p>
       <w:r>
         <w:br w:type="page"/>

</xml_diff>

<commit_message>
feat: set roadmap start date to Sept 1st 2026 with precise milestone dates and consolidated yearly cost summary
</commit_message>
<xml_diff>
--- a/Le_Pacte_Nice_IA.docx
+++ b/Le_Pacte_Nice_IA.docx
@@ -909,7 +909,7 @@
                 <w:color w:val="0F172A"/>
                 <w:sz w:val="19"/>
               </w:rPr>
-              <w:t>5. Gouvernance, Feuille de Route Détaillée &amp; Budget par Trimestre</w:t>
+              <w:t>5. Feuille de Route Précise (Septembre 2026-2029) &amp; Résumé Annuel</w:t>
             </w:r>
           </w:p>
         </w:tc>
@@ -991,7 +991,7 @@
                 <w:color w:val="0F172A"/>
                 <w:sz w:val="19"/>
               </w:rPr>
-              <w:t xml:space="preserve">   5.2 Feuille de Route Détaillée &amp; Budget par Éléments (36 Mois)</w:t>
+              <w:t xml:space="preserve">   5.2 Échéancier Précis &amp; Jalons par Date (Septembre 2026-2029)</w:t>
             </w:r>
           </w:p>
         </w:tc>
@@ -1032,7 +1032,7 @@
                 <w:color w:val="0F172A"/>
                 <w:sz w:val="19"/>
               </w:rPr>
-              <w:t xml:space="preserve">   5.3 Tableau de Synthèse Budgétaire Trimestriel (Q1 à Q12)</w:t>
+              <w:t xml:space="preserve">   5.3 Résumé Consolidé du Coût par Année Budgétaire</w:t>
             </w:r>
           </w:p>
         </w:tc>
@@ -4034,7 +4034,7 @@
           <w:color w:val="0F172A"/>
           <w:sz w:val="30"/>
         </w:rPr>
-        <w:t>5. Gouvernance, Feuille de Route Détaillée &amp; Budget par Trimestre</w:t>
+        <w:t>5. Feuille de Route Précise (Sept 2026-2029) &amp; Résumé Annuel</w:t>
       </w:r>
     </w:p>
     <w:p>
@@ -4180,7 +4180,7 @@
           <w:color w:val="1E3A8A"/>
           <w:sz w:val="25"/>
         </w:rPr>
-        <w:t>5.2 Feuille de Route Détaillée Élément par Élément (36 Mois)</w:t>
+        <w:t>5.2 Échéancier Précis et Jalons par Date (Démarche 1er Septembre 2026)</w:t>
       </w:r>
     </w:p>
     <w:tbl>
@@ -4211,7 +4211,7 @@
                 <w:color w:val="FFFFFF"/>
                 <w:sz w:val="17"/>
               </w:rPr>
-              <w:t>Phase / Période</w:t>
+              <w:t>Période &amp; Date Précise</w:t>
             </w:r>
           </w:p>
         </w:tc>
@@ -4288,7 +4288,7 @@
                 <w:color w:val="1E293B"/>
                 <w:sz w:val="16"/>
               </w:rPr>
-              <w:t>Année 1 - Q1</w:t>
+              <w:t>1er Septembre 2026</w:t>
             </w:r>
           </w:p>
         </w:tc>
@@ -4306,7 +4306,7 @@
                 <w:color w:val="1E293B"/>
                 <w:sz w:val="16"/>
               </w:rPr>
-              <w:t>L1.1 Pilotage &amp; Direction de Projet (2.5j/sem)</w:t>
+              <w:t>L1.1 Lancement Pacte &amp; Direction Projet (2.5j/sem)</w:t>
             </w:r>
           </w:p>
         </w:tc>
@@ -4362,7 +4362,7 @@
                 <w:color w:val="1E293B"/>
                 <w:sz w:val="16"/>
               </w:rPr>
-              <w:t>Année 1 - Q1</w:t>
+              <w:t>15 Septembre 2026</w:t>
             </w:r>
           </w:p>
         </w:tc>
@@ -4436,7 +4436,7 @@
                 <w:color w:val="1E293B"/>
                 <w:sz w:val="16"/>
               </w:rPr>
-              <w:t>Année 1 - Q1</w:t>
+              <w:t>1er Octobre 2026</w:t>
             </w:r>
           </w:p>
         </w:tc>
@@ -4510,7 +4510,7 @@
                 <w:color w:val="1E293B"/>
                 <w:sz w:val="16"/>
               </w:rPr>
-              <w:t>Année 1 - Q1</w:t>
+              <w:t>15 Octobre 2026</w:t>
             </w:r>
           </w:p>
         </w:tc>
@@ -4584,7 +4584,7 @@
                 <w:color w:val="1E293B"/>
                 <w:sz w:val="16"/>
               </w:rPr>
-              <w:t>Année 1 - Q2</w:t>
+              <w:t>12 Novembre 2026</w:t>
             </w:r>
           </w:p>
         </w:tc>
@@ -4602,7 +4602,7 @@
                 <w:color w:val="1E293B"/>
                 <w:sz w:val="16"/>
               </w:rPr>
-              <w:t>L2.1 Pilotage &amp; Direction de Projet (2.5j/sem)</w:t>
+              <w:t>L2.1 Dépôt Dossier Gigafactory UE (COUPERET)</w:t>
             </w:r>
           </w:p>
         </w:tc>
@@ -4620,7 +4620,7 @@
                 <w:color w:val="1E293B"/>
                 <w:sz w:val="16"/>
               </w:rPr>
-              <w:t>16,25 k€</w:t>
+              <w:t>10,00 k€</w:t>
             </w:r>
           </w:p>
         </w:tc>
@@ -4638,7 +4638,7 @@
                 <w:color w:val="1E293B"/>
                 <w:sz w:val="16"/>
               </w:rPr>
-              <w:t>Gestion des appels d'offres VSA.</w:t>
+              <w:t>Candidature officielle 500 M€ UE.</w:t>
             </w:r>
           </w:p>
         </w:tc>
@@ -4658,7 +4658,7 @@
                 <w:color w:val="1E293B"/>
                 <w:sz w:val="16"/>
               </w:rPr>
-              <w:t>Année 1 - Q2</w:t>
+              <w:t>15 Décembre 2026</w:t>
             </w:r>
           </w:p>
         </w:tc>
@@ -4676,7 +4676,7 @@
                 <w:color w:val="1E293B"/>
                 <w:sz w:val="16"/>
               </w:rPr>
-              <w:t>L2.2 Dépôt Dossier Gigafactory UE (12 Nov)</w:t>
+              <w:t>L2.2 Filtrage VSA CSU (4 300 caméras)</w:t>
             </w:r>
           </w:p>
         </w:tc>
@@ -4694,7 +4694,7 @@
                 <w:color w:val="1E293B"/>
                 <w:sz w:val="16"/>
               </w:rPr>
-              <w:t>10,00 k€</w:t>
+              <w:t>55,00 k€</w:t>
             </w:r>
           </w:p>
         </w:tc>
@@ -4712,7 +4712,7 @@
                 <w:color w:val="1E293B"/>
                 <w:sz w:val="16"/>
               </w:rPr>
-              <w:t>Candidature officielle 500 M€.</w:t>
+              <w:t>Alertes incivilités en temps réel.</w:t>
             </w:r>
           </w:p>
         </w:tc>
@@ -4732,7 +4732,7 @@
                 <w:color w:val="1E293B"/>
                 <w:sz w:val="16"/>
               </w:rPr>
-              <w:t>Année 1 - Q2</w:t>
+              <w:t>15 Janvier 2027</w:t>
             </w:r>
           </w:p>
         </w:tc>
@@ -4750,7 +4750,7 @@
                 <w:color w:val="1E293B"/>
                 <w:sz w:val="16"/>
               </w:rPr>
-              <w:t>L2.3 Filtrage VSA CSU (4 300 caméras)</w:t>
+              <w:t>L2.3 Géolocalisation &amp; Dispatching PM</w:t>
             </w:r>
           </w:p>
         </w:tc>
@@ -4768,7 +4768,7 @@
                 <w:color w:val="1E293B"/>
                 <w:sz w:val="16"/>
               </w:rPr>
-              <w:t>55,00 k€</w:t>
+              <w:t>33,75 k€</w:t>
             </w:r>
           </w:p>
         </w:tc>
@@ -4786,7 +4786,7 @@
                 <w:color w:val="1E293B"/>
                 <w:sz w:val="16"/>
               </w:rPr>
-              <w:t>Alertes incivilités en temps réel.</w:t>
+              <w:t>Patrouilles physiques &lt; 6 min.</w:t>
             </w:r>
           </w:p>
         </w:tc>
@@ -4806,7 +4806,7 @@
                 <w:color w:val="1E293B"/>
                 <w:sz w:val="16"/>
               </w:rPr>
-              <w:t>Année 1 - Q2</w:t>
+              <w:t>1er Février 2027</w:t>
             </w:r>
           </w:p>
         </w:tc>
@@ -4824,7 +4824,7 @@
                 <w:color w:val="1E293B"/>
                 <w:sz w:val="16"/>
               </w:rPr>
-              <w:t>L2.4 Géolocalisation &amp; Dispatching PM</w:t>
+              <w:t>L2.4 Ingestion Marchés Publics (Pilote 50M€)</w:t>
             </w:r>
           </w:p>
         </w:tc>
@@ -4842,7 +4842,7 @@
                 <w:color w:val="1E293B"/>
                 <w:sz w:val="16"/>
               </w:rPr>
-              <w:t>33,75 k€</w:t>
+              <w:t>16,25 k€</w:t>
             </w:r>
           </w:p>
         </w:tc>
@@ -4860,7 +4860,7 @@
                 <w:color w:val="1E293B"/>
                 <w:sz w:val="16"/>
               </w:rPr>
-              <w:t>Patrouilles physiques &lt; 6 min.</w:t>
+              <w:t>Ingénierie &amp; recettes sémantiques.</w:t>
             </w:r>
           </w:p>
         </w:tc>
@@ -4880,7 +4880,7 @@
                 <w:color w:val="1E293B"/>
                 <w:sz w:val="16"/>
               </w:rPr>
-              <w:t>Année 1 - Q3</w:t>
+              <w:t>15 Mars 2027</w:t>
             </w:r>
           </w:p>
         </w:tc>
@@ -4898,7 +4898,7 @@
                 <w:color w:val="1E293B"/>
                 <w:sz w:val="16"/>
               </w:rPr>
-              <w:t>L3.1 Pilotage &amp; Direction de Projet (2.5j/sem)</w:t>
+              <w:t>L3.1 Audit Commande Publique Généralisé (300M€)</w:t>
             </w:r>
           </w:p>
         </w:tc>
@@ -4916,7 +4916,7 @@
                 <w:color w:val="1E293B"/>
                 <w:sz w:val="16"/>
               </w:rPr>
-              <w:t>16,25 k€</w:t>
+              <w:t>45,00 k€</w:t>
             </w:r>
           </w:p>
         </w:tc>
@@ -4934,7 +4934,7 @@
                 <w:color w:val="1E293B"/>
                 <w:sz w:val="16"/>
               </w:rPr>
-              <w:t>Suivi ingénierie &amp; recettes.</w:t>
+              <w:t>Filtrage erreurs &amp; doublons BPU.</w:t>
             </w:r>
           </w:p>
         </w:tc>
@@ -4954,7 +4954,7 @@
                 <w:color w:val="1E293B"/>
                 <w:sz w:val="16"/>
               </w:rPr>
-              <w:t>Année 1 - Q3</w:t>
+              <w:t>1er Avril 2027</w:t>
             </w:r>
           </w:p>
         </w:tc>
@@ -4972,7 +4972,7 @@
                 <w:color w:val="1E293B"/>
                 <w:sz w:val="16"/>
               </w:rPr>
-              <w:t>L3.2 Audit Commande Publique (Factures 300M€)</w:t>
+              <w:t>L3.2 SOC Cyber NIS 2 Autonome Air-Gap</w:t>
             </w:r>
           </w:p>
         </w:tc>
@@ -4990,7 +4990,7 @@
                 <w:color w:val="1E293B"/>
                 <w:sz w:val="16"/>
               </w:rPr>
-              <w:t>45,00 k€</w:t>
+              <w:t>28,75 k€</w:t>
             </w:r>
           </w:p>
         </w:tc>
@@ -5008,7 +5008,7 @@
                 <w:color w:val="1E293B"/>
                 <w:sz w:val="16"/>
               </w:rPr>
-              <w:t>Filtrage erreurs &amp; doublons BPU.</w:t>
+              <w:t>Protection inviolable du CSU.</w:t>
             </w:r>
           </w:p>
         </w:tc>
@@ -5028,7 +5028,7 @@
                 <w:color w:val="1E293B"/>
                 <w:sz w:val="16"/>
               </w:rPr>
-              <w:t>Année 1 - Q3</w:t>
+              <w:t>15 Mai 2027</w:t>
             </w:r>
           </w:p>
         </w:tc>
@@ -5046,7 +5046,7 @@
                 <w:color w:val="1E293B"/>
                 <w:sz w:val="16"/>
               </w:rPr>
-              <w:t>L3.3 SOC Cyber NIS 2 Autonome Air-Gap</w:t>
+              <w:t>L3.3 IA Einstein Concertation (1ers Quartiers)</w:t>
             </w:r>
           </w:p>
         </w:tc>
@@ -5064,7 +5064,7 @@
                 <w:color w:val="1E293B"/>
                 <w:sz w:val="16"/>
               </w:rPr>
-              <w:t>28,75 k€</w:t>
+              <w:t>15,00 k€</w:t>
             </w:r>
           </w:p>
         </w:tc>
@@ -5082,7 +5082,7 @@
                 <w:color w:val="1E293B"/>
                 <w:sz w:val="16"/>
               </w:rPr>
-              <w:t>Protection inviolable du CSU.</w:t>
+              <w:t>Restitution citoyenne augmentée.</w:t>
             </w:r>
           </w:p>
         </w:tc>
@@ -5102,7 +5102,7 @@
                 <w:color w:val="1E293B"/>
                 <w:sz w:val="16"/>
               </w:rPr>
-              <w:t>Année 1 - Q3</w:t>
+              <w:t>15 Juin 2027</w:t>
             </w:r>
           </w:p>
         </w:tc>
@@ -5120,155 +5120,7 @@
                 <w:color w:val="1E293B"/>
                 <w:sz w:val="16"/>
               </w:rPr>
-              <w:t>L3.4 IA Einstein Concertation (1er Quartier)</w:t>
-            </w:r>
-          </w:p>
-        </w:tc>
-        <w:tc>
-          <w:tcPr>
-            <w:tcW w:type="dxa" w:w="2412"/>
-            <w:shd w:fill="FFFFFF"/>
-          </w:tcPr>
-          <w:p>
-            <w:pPr>
-              <w:spacing w:before="60" w:after="60"/>
-            </w:pPr>
-            <w:r>
-              <w:rPr>
-                <w:color w:val="1E293B"/>
-                <w:sz w:val="16"/>
-              </w:rPr>
-              <w:t>15,00 k€</w:t>
-            </w:r>
-          </w:p>
-        </w:tc>
-        <w:tc>
-          <w:tcPr>
-            <w:tcW w:type="dxa" w:w="2412"/>
-            <w:shd w:fill="FFFFFF"/>
-          </w:tcPr>
-          <w:p>
-            <w:pPr>
-              <w:spacing w:before="60" w:after="60"/>
-            </w:pPr>
-            <w:r>
-              <w:rPr>
-                <w:color w:val="1E293B"/>
-                <w:sz w:val="16"/>
-              </w:rPr>
-              <w:t>Restitution citoyenne augmentée.</w:t>
-            </w:r>
-          </w:p>
-        </w:tc>
-      </w:tr>
-      <w:tr>
-        <w:tc>
-          <w:tcPr>
-            <w:tcW w:type="dxa" w:w="2412"/>
-            <w:shd w:fill="F8FAFC"/>
-          </w:tcPr>
-          <w:p>
-            <w:pPr>
-              <w:spacing w:before="60" w:after="60"/>
-            </w:pPr>
-            <w:r>
-              <w:rPr>
-                <w:color w:val="1E293B"/>
-                <w:sz w:val="16"/>
-              </w:rPr>
-              <w:t>Année 1 - Q4</w:t>
-            </w:r>
-          </w:p>
-        </w:tc>
-        <w:tc>
-          <w:tcPr>
-            <w:tcW w:type="dxa" w:w="2412"/>
-            <w:shd w:fill="F8FAFC"/>
-          </w:tcPr>
-          <w:p>
-            <w:pPr>
-              <w:spacing w:before="60" w:after="60"/>
-            </w:pPr>
-            <w:r>
-              <w:rPr>
-                <w:color w:val="1E293B"/>
-                <w:sz w:val="16"/>
-              </w:rPr>
-              <w:t>L4.1 Pilotage &amp; Direction de Projet (2.5j/sem)</w:t>
-            </w:r>
-          </w:p>
-        </w:tc>
-        <w:tc>
-          <w:tcPr>
-            <w:tcW w:type="dxa" w:w="2412"/>
-            <w:shd w:fill="F8FAFC"/>
-          </w:tcPr>
-          <w:p>
-            <w:pPr>
-              <w:spacing w:before="60" w:after="60"/>
-            </w:pPr>
-            <w:r>
-              <w:rPr>
-                <w:color w:val="1E293B"/>
-                <w:sz w:val="16"/>
-              </w:rPr>
-              <w:t>16,25 k€</w:t>
-            </w:r>
-          </w:p>
-        </w:tc>
-        <w:tc>
-          <w:tcPr>
-            <w:tcW w:type="dxa" w:w="2412"/>
-            <w:shd w:fill="F8FAFC"/>
-          </w:tcPr>
-          <w:p>
-            <w:pPr>
-              <w:spacing w:before="60" w:after="60"/>
-            </w:pPr>
-            <w:r>
-              <w:rPr>
-                <w:color w:val="1E293B"/>
-                <w:sz w:val="16"/>
-              </w:rPr>
-              <w:t>Revue annuelle &amp; bilans.</w:t>
-            </w:r>
-          </w:p>
-        </w:tc>
-      </w:tr>
-      <w:tr>
-        <w:tc>
-          <w:tcPr>
-            <w:tcW w:type="dxa" w:w="2412"/>
-            <w:shd w:fill="FFFFFF"/>
-          </w:tcPr>
-          <w:p>
-            <w:pPr>
-              <w:spacing w:before="60" w:after="60"/>
-            </w:pPr>
-            <w:r>
-              <w:rPr>
-                <w:color w:val="1E293B"/>
-                <w:sz w:val="16"/>
-              </w:rPr>
-              <w:t>Année 1 - Q4</w:t>
-            </w:r>
-          </w:p>
-        </w:tc>
-        <w:tc>
-          <w:tcPr>
-            <w:tcW w:type="dxa" w:w="2412"/>
-            <w:shd w:fill="FFFFFF"/>
-          </w:tcPr>
-          <w:p>
-            <w:pPr>
-              <w:spacing w:before="60" w:after="60"/>
-            </w:pPr>
-            <w:r>
-              <w:rPr>
-                <w:color w:val="1E293B"/>
-                <w:sz w:val="16"/>
-              </w:rPr>
-              <w:t>L4.2 Généralisation Audit Commande Publique</w:t>
+              <w:t>L4.1 Généralisation Audit Commande Publique</w:t>
             </w:r>
           </w:p>
         </w:tc>
@@ -5324,7 +5176,7 @@
                 <w:color w:val="1E293B"/>
                 <w:sz w:val="16"/>
               </w:rPr>
-              <w:t>Année 1 - Q4</w:t>
+              <w:t>15 Juillet 2027</w:t>
             </w:r>
           </w:p>
         </w:tc>
@@ -5342,7 +5194,7 @@
                 <w:color w:val="1E293B"/>
                 <w:sz w:val="16"/>
               </w:rPr>
-              <w:t>L4.3 Recette Sécurité Monaco Cloud AMSN</w:t>
+              <w:t>L4.2 Recette Sécurité Monaco Cloud AMSN</w:t>
             </w:r>
           </w:p>
         </w:tc>
@@ -5398,7 +5250,7 @@
                 <w:color w:val="1E293B"/>
                 <w:sz w:val="16"/>
               </w:rPr>
-              <w:t>Année 1 - Q4</w:t>
+              <w:t>31 Août 2027</w:t>
             </w:r>
           </w:p>
         </w:tc>
@@ -5416,7 +5268,7 @@
                 <w:color w:val="1E293B"/>
                 <w:sz w:val="16"/>
               </w:rPr>
-              <w:t>L4.4 Restitution Publique Einstein Quartiers</w:t>
+              <w:t>L4.3 Bilan Année 1 &amp; Arbitrages Citoyens</w:t>
             </w:r>
           </w:p>
         </w:tc>
@@ -5452,7 +5304,7 @@
                 <w:color w:val="1E293B"/>
                 <w:sz w:val="16"/>
               </w:rPr>
-              <w:t>Arbitrages budgétaires citoyens.</w:t>
+              <w:t>+2,5 M€ d'économies &amp; bilan VSA.</w:t>
             </w:r>
           </w:p>
         </w:tc>
@@ -5472,7 +5324,7 @@
                 <w:color w:val="1E293B"/>
                 <w:sz w:val="16"/>
               </w:rPr>
-              <w:t>Année 2 - S1</w:t>
+              <w:t>Sept 2027 — Fév 2028</w:t>
             </w:r>
           </w:p>
         </w:tc>
@@ -5546,7 +5398,7 @@
                 <w:color w:val="1E293B"/>
                 <w:sz w:val="16"/>
               </w:rPr>
-              <w:t>Année 2 - S1</w:t>
+              <w:t>Sept 2027 — Fév 2028</w:t>
             </w:r>
           </w:p>
         </w:tc>
@@ -5620,7 +5472,7 @@
                 <w:color w:val="1E293B"/>
                 <w:sz w:val="16"/>
               </w:rPr>
-              <w:t>Année 2 - S2</w:t>
+              <w:t>Mars 2028 — Août 2028</w:t>
             </w:r>
           </w:p>
         </w:tc>
@@ -5694,7 +5546,7 @@
                 <w:color w:val="1E293B"/>
                 <w:sz w:val="16"/>
               </w:rPr>
-              <w:t>Année 2 - S2</w:t>
+              <w:t>Mars 2028 — Août 2028</w:t>
             </w:r>
           </w:p>
         </w:tc>
@@ -5768,7 +5620,7 @@
                 <w:color w:val="1E293B"/>
                 <w:sz w:val="16"/>
               </w:rPr>
-              <w:t>Année 3</w:t>
+              <w:t>1er Janvier 2029</w:t>
             </w:r>
           </w:p>
         </w:tc>
@@ -5842,7 +5694,7 @@
                 <w:color w:val="1E293B"/>
                 <w:sz w:val="16"/>
               </w:rPr>
-              <w:t>Année 3</w:t>
+              <w:t>Sept 2028 — Août 2029</w:t>
             </w:r>
           </w:p>
         </w:tc>
@@ -5919,7 +5771,7 @@
           <w:color w:val="1E3A8A"/>
           <w:sz w:val="25"/>
         </w:rPr>
-        <w:t>5.3 Tableau de Synthèse Budgétaire Trimestriel (435 k€ / an)</w:t>
+        <w:t>5.3 Résumé Consolidé du Coût par Année Budgétaire</w:t>
       </w:r>
     </w:p>
     <w:p>
@@ -5932,39 +5784,65 @@
           <w:b/>
           <w:color w:val="0F172A"/>
         </w:rPr>
-        <w:t>Étalement de la Trésorerie</w:t>
+        <w:t>Rendement Budgétaire Net</w:t>
       </w:r>
       <w:r>
         <w:rPr>
           <w:color w:val="1E293B"/>
         </w:rPr>
-        <w:t xml:space="preserve"> : Les dépenses sont lissées de manière équilibrée à raison de </w:t>
+        <w:t xml:space="preserve"> : Pour chaque année d'exécution, la dépense brute de </w:t>
       </w:r>
       <w:r>
         <w:rPr>
           <w:b/>
           <w:color w:val="0F172A"/>
         </w:rPr>
-        <w:t>~108,75 k€ par trimestre</w:t>
+        <w:t>435 000 €</w:t>
       </w:r>
       <w:r>
         <w:rPr>
           <w:color w:val="1E293B"/>
         </w:rPr>
-        <w:t xml:space="preserve"> (soit </w:t>
+        <w:t xml:space="preserve"> est co-financée à 50 % par l'UE, ne laissant que </w:t>
       </w:r>
       <w:r>
         <w:rPr>
           <w:b/>
           <w:color w:val="0F172A"/>
         </w:rPr>
-        <w:t>~72,5 k€ par bimestre</w:t>
+        <w:t>217 500 € net</w:t>
       </w:r>
       <w:r>
         <w:rPr>
           <w:color w:val="1E293B"/>
         </w:rPr>
-        <w:t>), parfaitement maîtrisables au sein du budget métropolitain.</w:t>
+        <w:t xml:space="preserve"> à la Métropole, face à </w:t>
+      </w:r>
+      <w:r>
+        <w:rPr>
+          <w:b/>
+          <w:color w:val="0F172A"/>
+        </w:rPr>
+        <w:t>+2 500 000 € d'économies certifiées</w:t>
+      </w:r>
+      <w:r>
+        <w:rPr>
+          <w:color w:val="1E293B"/>
+        </w:rPr>
+        <w:t xml:space="preserve">, dégageant un bénéfice net réinjecté dans le service public de </w:t>
+      </w:r>
+      <w:r>
+        <w:rPr>
+          <w:b/>
+          <w:color w:val="0F172A"/>
+        </w:rPr>
+        <w:t>+2 282 500 € par an</w:t>
+      </w:r>
+      <w:r>
+        <w:rPr>
+          <w:color w:val="1E293B"/>
+        </w:rPr>
+        <w:t>.</w:t>
       </w:r>
     </w:p>
     <w:tbl>
@@ -5974,16 +5852,18 @@
         <w:tblLook w:firstColumn="1" w:firstRow="1" w:lastColumn="0" w:lastRow="0" w:noHBand="0" w:noVBand="1" w:val="04A0"/>
       </w:tblPr>
       <w:tblGrid>
-        <w:gridCol w:w="1930"/>
-        <w:gridCol w:w="1930"/>
-        <w:gridCol w:w="1930"/>
-        <w:gridCol w:w="1930"/>
-        <w:gridCol w:w="1930"/>
+        <w:gridCol w:w="1378"/>
+        <w:gridCol w:w="1378"/>
+        <w:gridCol w:w="1378"/>
+        <w:gridCol w:w="1378"/>
+        <w:gridCol w:w="1378"/>
+        <w:gridCol w:w="1378"/>
+        <w:gridCol w:w="1378"/>
       </w:tblGrid>
       <w:tr>
         <w:tc>
           <w:tcPr>
-            <w:tcW w:type="dxa" w:w="1930"/>
+            <w:tcW w:type="dxa" w:w="1378"/>
             <w:shd w:fill="1E293B"/>
           </w:tcPr>
           <w:p>
@@ -5994,15 +5874,15 @@
               <w:rPr>
                 <w:b/>
                 <w:color w:val="FFFFFF"/>
-                <w:sz w:val="17"/>
+                <w:sz w:val="16"/>
               </w:rPr>
-              <w:t>Trimestre</w:t>
+              <w:t>Année Budgétaire</w:t>
             </w:r>
           </w:p>
         </w:tc>
         <w:tc>
           <w:tcPr>
-            <w:tcW w:type="dxa" w:w="1930"/>
+            <w:tcW w:type="dxa" w:w="1378"/>
             <w:shd w:fill="1E293B"/>
           </w:tcPr>
           <w:p>
@@ -6013,15 +5893,15 @@
               <w:rPr>
                 <w:b/>
                 <w:color w:val="FFFFFF"/>
-                <w:sz w:val="17"/>
+                <w:sz w:val="16"/>
               </w:rPr>
-              <w:t>Période Chronologique</w:t>
+              <w:t>Période Précise de Réalisation</w:t>
             </w:r>
           </w:p>
         </w:tc>
         <w:tc>
           <w:tcPr>
-            <w:tcW w:type="dxa" w:w="1930"/>
+            <w:tcW w:type="dxa" w:w="1378"/>
             <w:shd w:fill="1E293B"/>
           </w:tcPr>
           <w:p>
@@ -6032,7 +5912,7 @@
               <w:rPr>
                 <w:b/>
                 <w:color w:val="FFFFFF"/>
-                <w:sz w:val="17"/>
+                <w:sz w:val="16"/>
               </w:rPr>
               <w:t>Budget Brut</w:t>
             </w:r>
@@ -6040,7 +5920,7 @@
         </w:tc>
         <w:tc>
           <w:tcPr>
-            <w:tcW w:type="dxa" w:w="1930"/>
+            <w:tcW w:type="dxa" w:w="1378"/>
             <w:shd w:fill="1E293B"/>
           </w:tcPr>
           <w:p>
@@ -6051,7 +5931,7 @@
               <w:rPr>
                 <w:b/>
                 <w:color w:val="FFFFFF"/>
-                <w:sz w:val="17"/>
+                <w:sz w:val="16"/>
               </w:rPr>
               <w:t>Co-financement UE (50%)</w:t>
             </w:r>
@@ -6059,7 +5939,7 @@
         </w:tc>
         <w:tc>
           <w:tcPr>
-            <w:tcW w:type="dxa" w:w="1930"/>
+            <w:tcW w:type="dxa" w:w="1378"/>
             <w:shd w:fill="1E293B"/>
           </w:tcPr>
           <w:p>
@@ -6070,9 +5950,47 @@
               <w:rPr>
                 <w:b/>
                 <w:color w:val="FFFFFF"/>
-                <w:sz w:val="17"/>
+                <w:sz w:val="16"/>
               </w:rPr>
-              <w:t>Reste à Charge Net Métropole</w:t>
+              <w:t>Reste à Charge Net</w:t>
+            </w:r>
+          </w:p>
+        </w:tc>
+        <w:tc>
+          <w:tcPr>
+            <w:tcW w:type="dxa" w:w="1378"/>
+            <w:shd w:fill="1E293B"/>
+          </w:tcPr>
+          <w:p>
+            <w:pPr>
+              <w:spacing w:before="60" w:after="60"/>
+            </w:pPr>
+            <w:r>
+              <w:rPr>
+                <w:b/>
+                <w:color w:val="FFFFFF"/>
+                <w:sz w:val="16"/>
+              </w:rPr>
+              <w:t>Gains Certifiés</w:t>
+            </w:r>
+          </w:p>
+        </w:tc>
+        <w:tc>
+          <w:tcPr>
+            <w:tcW w:type="dxa" w:w="1378"/>
+            <w:shd w:fill="1E293B"/>
+          </w:tcPr>
+          <w:p>
+            <w:pPr>
+              <w:spacing w:before="60" w:after="60"/>
+            </w:pPr>
+            <w:r>
+              <w:rPr>
+                <w:b/>
+                <w:color w:val="FFFFFF"/>
+                <w:sz w:val="16"/>
+              </w:rPr>
+              <w:t>Bénéfice Net Métropole</w:t>
             </w:r>
           </w:p>
         </w:tc>
@@ -6080,7 +5998,7 @@
       <w:tr>
         <w:tc>
           <w:tcPr>
-            <w:tcW w:type="dxa" w:w="1930"/>
+            <w:tcW w:type="dxa" w:w="1378"/>
             <w:shd w:fill="F8FAFC"/>
           </w:tcPr>
           <w:p>
@@ -6092,13 +6010,13 @@
                 <w:color w:val="1E293B"/>
                 <w:sz w:val="16"/>
               </w:rPr>
-              <w:t>Année 1 - Q1</w:t>
+              <w:t>ANNÉE 1</w:t>
             </w:r>
           </w:p>
         </w:tc>
         <w:tc>
           <w:tcPr>
-            <w:tcW w:type="dxa" w:w="1930"/>
+            <w:tcW w:type="dxa" w:w="1378"/>
             <w:shd w:fill="F8FAFC"/>
           </w:tcPr>
           <w:p>
@@ -6110,13 +6028,13 @@
                 <w:color w:val="1E293B"/>
                 <w:sz w:val="16"/>
               </w:rPr>
-              <w:t>Août — Octobre 2026</w:t>
+              <w:t>Septembre 2026 — Août 2027</w:t>
             </w:r>
           </w:p>
         </w:tc>
         <w:tc>
           <w:tcPr>
-            <w:tcW w:type="dxa" w:w="1930"/>
+            <w:tcW w:type="dxa" w:w="1378"/>
             <w:shd w:fill="F8FAFC"/>
           </w:tcPr>
           <w:p>
@@ -6128,13 +6046,13 @@
                 <w:color w:val="1E293B"/>
                 <w:sz w:val="16"/>
               </w:rPr>
-              <w:t>110,00 k€</w:t>
+              <w:t>435 000 €</w:t>
             </w:r>
           </w:p>
         </w:tc>
         <w:tc>
           <w:tcPr>
-            <w:tcW w:type="dxa" w:w="1930"/>
+            <w:tcW w:type="dxa" w:w="1378"/>
             <w:shd w:fill="F8FAFC"/>
           </w:tcPr>
           <w:p>
@@ -6146,13 +6064,13 @@
                 <w:color w:val="1E293B"/>
                 <w:sz w:val="16"/>
               </w:rPr>
-              <w:t>55,00 k€</w:t>
+              <w:t>217 500 €</w:t>
             </w:r>
           </w:p>
         </w:tc>
         <w:tc>
           <w:tcPr>
-            <w:tcW w:type="dxa" w:w="1930"/>
+            <w:tcW w:type="dxa" w:w="1378"/>
             <w:shd w:fill="F8FAFC"/>
           </w:tcPr>
           <w:p>
@@ -6164,7 +6082,43 @@
                 <w:color w:val="1E293B"/>
                 <w:sz w:val="16"/>
               </w:rPr>
-              <w:t>55,00 k€</w:t>
+              <w:t>217 500 €</w:t>
+            </w:r>
+          </w:p>
+        </w:tc>
+        <w:tc>
+          <w:tcPr>
+            <w:tcW w:type="dxa" w:w="1378"/>
+            <w:shd w:fill="F8FAFC"/>
+          </w:tcPr>
+          <w:p>
+            <w:pPr>
+              <w:spacing w:before="60" w:after="60"/>
+            </w:pPr>
+            <w:r>
+              <w:rPr>
+                <w:color w:val="1E293B"/>
+                <w:sz w:val="16"/>
+              </w:rPr>
+              <w:t>+2 500 000 €</w:t>
+            </w:r>
+          </w:p>
+        </w:tc>
+        <w:tc>
+          <w:tcPr>
+            <w:tcW w:type="dxa" w:w="1378"/>
+            <w:shd w:fill="F8FAFC"/>
+          </w:tcPr>
+          <w:p>
+            <w:pPr>
+              <w:spacing w:before="60" w:after="60"/>
+            </w:pPr>
+            <w:r>
+              <w:rPr>
+                <w:color w:val="1E293B"/>
+                <w:sz w:val="16"/>
+              </w:rPr>
+              <w:t>+2 282 500 €</w:t>
             </w:r>
           </w:p>
         </w:tc>
@@ -6172,7 +6126,7 @@
       <w:tr>
         <w:tc>
           <w:tcPr>
-            <w:tcW w:type="dxa" w:w="1930"/>
+            <w:tcW w:type="dxa" w:w="1378"/>
             <w:shd w:fill="FFFFFF"/>
           </w:tcPr>
           <w:p>
@@ -6184,13 +6138,13 @@
                 <w:color w:val="1E293B"/>
                 <w:sz w:val="16"/>
               </w:rPr>
-              <w:t>Année 1 - Q2</w:t>
+              <w:t>ANNÉE 2</w:t>
             </w:r>
           </w:p>
         </w:tc>
         <w:tc>
           <w:tcPr>
-            <w:tcW w:type="dxa" w:w="1930"/>
+            <w:tcW w:type="dxa" w:w="1378"/>
             <w:shd w:fill="FFFFFF"/>
           </w:tcPr>
           <w:p>
@@ -6202,13 +6156,13 @@
                 <w:color w:val="1E293B"/>
                 <w:sz w:val="16"/>
               </w:rPr>
-              <w:t>Novembre 2026 — Janvier 2027</w:t>
+              <w:t>Septembre 2027 — Août 2028</w:t>
             </w:r>
           </w:p>
         </w:tc>
         <w:tc>
           <w:tcPr>
-            <w:tcW w:type="dxa" w:w="1930"/>
+            <w:tcW w:type="dxa" w:w="1378"/>
             <w:shd w:fill="FFFFFF"/>
           </w:tcPr>
           <w:p>
@@ -6220,13 +6174,13 @@
                 <w:color w:val="1E293B"/>
                 <w:sz w:val="16"/>
               </w:rPr>
-              <w:t>115,00 k€</w:t>
+              <w:t>435 000 €</w:t>
             </w:r>
           </w:p>
         </w:tc>
         <w:tc>
           <w:tcPr>
-            <w:tcW w:type="dxa" w:w="1930"/>
+            <w:tcW w:type="dxa" w:w="1378"/>
             <w:shd w:fill="FFFFFF"/>
           </w:tcPr>
           <w:p>
@@ -6238,13 +6192,13 @@
                 <w:color w:val="1E293B"/>
                 <w:sz w:val="16"/>
               </w:rPr>
-              <w:t>57,50 k€</w:t>
+              <w:t>217 500 €</w:t>
             </w:r>
           </w:p>
         </w:tc>
         <w:tc>
           <w:tcPr>
-            <w:tcW w:type="dxa" w:w="1930"/>
+            <w:tcW w:type="dxa" w:w="1378"/>
             <w:shd w:fill="FFFFFF"/>
           </w:tcPr>
           <w:p>
@@ -6256,7 +6210,43 @@
                 <w:color w:val="1E293B"/>
                 <w:sz w:val="16"/>
               </w:rPr>
-              <w:t>57,50 k€</w:t>
+              <w:t>217 500 €</w:t>
+            </w:r>
+          </w:p>
+        </w:tc>
+        <w:tc>
+          <w:tcPr>
+            <w:tcW w:type="dxa" w:w="1378"/>
+            <w:shd w:fill="FFFFFF"/>
+          </w:tcPr>
+          <w:p>
+            <w:pPr>
+              <w:spacing w:before="60" w:after="60"/>
+            </w:pPr>
+            <w:r>
+              <w:rPr>
+                <w:color w:val="1E293B"/>
+                <w:sz w:val="16"/>
+              </w:rPr>
+              <w:t>+2 500 000 €</w:t>
+            </w:r>
+          </w:p>
+        </w:tc>
+        <w:tc>
+          <w:tcPr>
+            <w:tcW w:type="dxa" w:w="1378"/>
+            <w:shd w:fill="FFFFFF"/>
+          </w:tcPr>
+          <w:p>
+            <w:pPr>
+              <w:spacing w:before="60" w:after="60"/>
+            </w:pPr>
+            <w:r>
+              <w:rPr>
+                <w:color w:val="1E293B"/>
+                <w:sz w:val="16"/>
+              </w:rPr>
+              <w:t>+2 282 500 €</w:t>
             </w:r>
           </w:p>
         </w:tc>
@@ -6264,7 +6254,7 @@
       <w:tr>
         <w:tc>
           <w:tcPr>
-            <w:tcW w:type="dxa" w:w="1930"/>
+            <w:tcW w:type="dxa" w:w="1378"/>
             <w:shd w:fill="F8FAFC"/>
           </w:tcPr>
           <w:p>
@@ -6276,13 +6266,13 @@
                 <w:color w:val="1E293B"/>
                 <w:sz w:val="16"/>
               </w:rPr>
-              <w:t>Année 1 - Q3</w:t>
+              <w:t>ANNÉE 3</w:t>
             </w:r>
           </w:p>
         </w:tc>
         <w:tc>
           <w:tcPr>
-            <w:tcW w:type="dxa" w:w="1930"/>
+            <w:tcW w:type="dxa" w:w="1378"/>
             <w:shd w:fill="F8FAFC"/>
           </w:tcPr>
           <w:p>
@@ -6294,13 +6284,13 @@
                 <w:color w:val="1E293B"/>
                 <w:sz w:val="16"/>
               </w:rPr>
-              <w:t>Février — Avril 2027</w:t>
+              <w:t>Septembre 2028 — Août 2029</w:t>
             </w:r>
           </w:p>
         </w:tc>
         <w:tc>
           <w:tcPr>
-            <w:tcW w:type="dxa" w:w="1930"/>
+            <w:tcW w:type="dxa" w:w="1378"/>
             <w:shd w:fill="F8FAFC"/>
           </w:tcPr>
           <w:p>
@@ -6312,13 +6302,13 @@
                 <w:color w:val="1E293B"/>
                 <w:sz w:val="16"/>
               </w:rPr>
-              <w:t>105,00 k€</w:t>
+              <w:t>435 000 €</w:t>
             </w:r>
           </w:p>
         </w:tc>
         <w:tc>
           <w:tcPr>
-            <w:tcW w:type="dxa" w:w="1930"/>
+            <w:tcW w:type="dxa" w:w="1378"/>
             <w:shd w:fill="F8FAFC"/>
           </w:tcPr>
           <w:p>
@@ -6330,13 +6320,13 @@
                 <w:color w:val="1E293B"/>
                 <w:sz w:val="16"/>
               </w:rPr>
-              <w:t>52,50 k€</w:t>
+              <w:t>217 500 €</w:t>
             </w:r>
           </w:p>
         </w:tc>
         <w:tc>
           <w:tcPr>
-            <w:tcW w:type="dxa" w:w="1930"/>
+            <w:tcW w:type="dxa" w:w="1378"/>
             <w:shd w:fill="F8FAFC"/>
           </w:tcPr>
           <w:p>
@@ -6348,296 +6338,13 @@
                 <w:color w:val="1E293B"/>
                 <w:sz w:val="16"/>
               </w:rPr>
-              <w:t>52,50 k€</w:t>
-            </w:r>
-          </w:p>
-        </w:tc>
-      </w:tr>
-      <w:tr>
-        <w:tc>
-          <w:tcPr>
-            <w:tcW w:type="dxa" w:w="1930"/>
-            <w:shd w:fill="FFFFFF"/>
-          </w:tcPr>
-          <w:p>
-            <w:pPr>
-              <w:spacing w:before="60" w:after="60"/>
-            </w:pPr>
-            <w:r>
-              <w:rPr>
-                <w:color w:val="1E293B"/>
-                <w:sz w:val="16"/>
-              </w:rPr>
-              <w:t>Année 1 - Q4</w:t>
+              <w:t>217 500 €</w:t>
             </w:r>
           </w:p>
         </w:tc>
         <w:tc>
           <w:tcPr>
-            <w:tcW w:type="dxa" w:w="1930"/>
-            <w:shd w:fill="FFFFFF"/>
-          </w:tcPr>
-          <w:p>
-            <w:pPr>
-              <w:spacing w:before="60" w:after="60"/>
-            </w:pPr>
-            <w:r>
-              <w:rPr>
-                <w:color w:val="1E293B"/>
-                <w:sz w:val="16"/>
-              </w:rPr>
-              <w:t>Mai — Juillet 2027</w:t>
-            </w:r>
-          </w:p>
-        </w:tc>
-        <w:tc>
-          <w:tcPr>
-            <w:tcW w:type="dxa" w:w="1930"/>
-            <w:shd w:fill="FFFFFF"/>
-          </w:tcPr>
-          <w:p>
-            <w:pPr>
-              <w:spacing w:before="60" w:after="60"/>
-            </w:pPr>
-            <w:r>
-              <w:rPr>
-                <w:color w:val="1E293B"/>
-                <w:sz w:val="16"/>
-              </w:rPr>
-              <w:t>105,00 k€</w:t>
-            </w:r>
-          </w:p>
-        </w:tc>
-        <w:tc>
-          <w:tcPr>
-            <w:tcW w:type="dxa" w:w="1930"/>
-            <w:shd w:fill="FFFFFF"/>
-          </w:tcPr>
-          <w:p>
-            <w:pPr>
-              <w:spacing w:before="60" w:after="60"/>
-            </w:pPr>
-            <w:r>
-              <w:rPr>
-                <w:color w:val="1E293B"/>
-                <w:sz w:val="16"/>
-              </w:rPr>
-              <w:t>52,50 k€</w:t>
-            </w:r>
-          </w:p>
-        </w:tc>
-        <w:tc>
-          <w:tcPr>
-            <w:tcW w:type="dxa" w:w="1930"/>
-            <w:shd w:fill="FFFFFF"/>
-          </w:tcPr>
-          <w:p>
-            <w:pPr>
-              <w:spacing w:before="60" w:after="60"/>
-            </w:pPr>
-            <w:r>
-              <w:rPr>
-                <w:color w:val="1E293B"/>
-                <w:sz w:val="16"/>
-              </w:rPr>
-              <w:t>52,50 k€</w:t>
-            </w:r>
-          </w:p>
-        </w:tc>
-      </w:tr>
-      <w:tr>
-        <w:tc>
-          <w:tcPr>
-            <w:tcW w:type="dxa" w:w="1930"/>
-            <w:shd w:fill="E2E8F0"/>
-          </w:tcPr>
-          <w:p>
-            <w:pPr>
-              <w:spacing w:before="60" w:after="60"/>
-            </w:pPr>
-            <w:r>
-              <w:rPr>
-                <w:b/>
-                <w:color w:val="0F172A"/>
-                <w:sz w:val="17"/>
-              </w:rPr>
-              <w:t>Sous-Total Année 1</w:t>
-            </w:r>
-          </w:p>
-        </w:tc>
-        <w:tc>
-          <w:tcPr>
-            <w:tcW w:type="dxa" w:w="1930"/>
-            <w:shd w:fill="E2E8F0"/>
-          </w:tcPr>
-          <w:p>
-            <w:pPr>
-              <w:spacing w:before="60" w:after="60"/>
-            </w:pPr>
-            <w:r>
-              <w:rPr>
-                <w:b/>
-                <w:color w:val="0F172A"/>
-                <w:sz w:val="17"/>
-              </w:rPr>
-              <w:t>Août 2026 — Juillet 2027</w:t>
-            </w:r>
-          </w:p>
-        </w:tc>
-        <w:tc>
-          <w:tcPr>
-            <w:tcW w:type="dxa" w:w="1930"/>
-            <w:shd w:fill="E2E8F0"/>
-          </w:tcPr>
-          <w:p>
-            <w:pPr>
-              <w:spacing w:before="60" w:after="60"/>
-            </w:pPr>
-            <w:r>
-              <w:rPr>
-                <w:b/>
-                <w:color w:val="0F172A"/>
-                <w:sz w:val="17"/>
-              </w:rPr>
-              <w:t>435,00 k€</w:t>
-            </w:r>
-          </w:p>
-        </w:tc>
-        <w:tc>
-          <w:tcPr>
-            <w:tcW w:type="dxa" w:w="1930"/>
-            <w:shd w:fill="E2E8F0"/>
-          </w:tcPr>
-          <w:p>
-            <w:pPr>
-              <w:spacing w:before="60" w:after="60"/>
-            </w:pPr>
-            <w:r>
-              <w:rPr>
-                <w:b/>
-                <w:color w:val="0F172A"/>
-                <w:sz w:val="17"/>
-              </w:rPr>
-              <w:t>217,50 k€</w:t>
-            </w:r>
-          </w:p>
-        </w:tc>
-        <w:tc>
-          <w:tcPr>
-            <w:tcW w:type="dxa" w:w="1930"/>
-            <w:shd w:fill="E2E8F0"/>
-          </w:tcPr>
-          <w:p>
-            <w:pPr>
-              <w:spacing w:before="60" w:after="60"/>
-            </w:pPr>
-            <w:r>
-              <w:rPr>
-                <w:b/>
-                <w:color w:val="0F172A"/>
-                <w:sz w:val="17"/>
-              </w:rPr>
-              <w:t>217,50 k€</w:t>
-            </w:r>
-          </w:p>
-        </w:tc>
-      </w:tr>
-      <w:tr>
-        <w:tc>
-          <w:tcPr>
-            <w:tcW w:type="dxa" w:w="1930"/>
-            <w:shd w:fill="FFFFFF"/>
-          </w:tcPr>
-          <w:p>
-            <w:pPr>
-              <w:spacing w:before="60" w:after="60"/>
-            </w:pPr>
-            <w:r>
-              <w:rPr>
-                <w:color w:val="1E293B"/>
-                <w:sz w:val="16"/>
-              </w:rPr>
-              <w:t>Année 2 - Q5-Q6</w:t>
-            </w:r>
-          </w:p>
-        </w:tc>
-        <w:tc>
-          <w:tcPr>
-            <w:tcW w:type="dxa" w:w="1930"/>
-            <w:shd w:fill="FFFFFF"/>
-          </w:tcPr>
-          <w:p>
-            <w:pPr>
-              <w:spacing w:before="60" w:after="60"/>
-            </w:pPr>
-            <w:r>
-              <w:rPr>
-                <w:color w:val="1E293B"/>
-                <w:sz w:val="16"/>
-              </w:rPr>
-              <w:t>Août 2027 — Janvier 2028</w:t>
-            </w:r>
-          </w:p>
-        </w:tc>
-        <w:tc>
-          <w:tcPr>
-            <w:tcW w:type="dxa" w:w="1930"/>
-            <w:shd w:fill="FFFFFF"/>
-          </w:tcPr>
-          <w:p>
-            <w:pPr>
-              <w:spacing w:before="60" w:after="60"/>
-            </w:pPr>
-            <w:r>
-              <w:rPr>
-                <w:color w:val="1E293B"/>
-                <w:sz w:val="16"/>
-              </w:rPr>
-              <w:t>217,50 k€</w:t>
-            </w:r>
-          </w:p>
-        </w:tc>
-        <w:tc>
-          <w:tcPr>
-            <w:tcW w:type="dxa" w:w="1930"/>
-            <w:shd w:fill="FFFFFF"/>
-          </w:tcPr>
-          <w:p>
-            <w:pPr>
-              <w:spacing w:before="60" w:after="60"/>
-            </w:pPr>
-            <w:r>
-              <w:rPr>
-                <w:color w:val="1E293B"/>
-                <w:sz w:val="16"/>
-              </w:rPr>
-              <w:t>108,75 k€</w:t>
-            </w:r>
-          </w:p>
-        </w:tc>
-        <w:tc>
-          <w:tcPr>
-            <w:tcW w:type="dxa" w:w="1930"/>
-            <w:shd w:fill="FFFFFF"/>
-          </w:tcPr>
-          <w:p>
-            <w:pPr>
-              <w:spacing w:before="60" w:after="60"/>
-            </w:pPr>
-            <w:r>
-              <w:rPr>
-                <w:color w:val="1E293B"/>
-                <w:sz w:val="16"/>
-              </w:rPr>
-              <w:t>108,75 k€</w:t>
-            </w:r>
-          </w:p>
-        </w:tc>
-      </w:tr>
-      <w:tr>
-        <w:tc>
-          <w:tcPr>
-            <w:tcW w:type="dxa" w:w="1930"/>
+            <w:tcW w:type="dxa" w:w="1378"/>
             <w:shd w:fill="F8FAFC"/>
           </w:tcPr>
           <w:p>
@@ -6649,13 +6356,13 @@
                 <w:color w:val="1E293B"/>
                 <w:sz w:val="16"/>
               </w:rPr>
-              <w:t>Année 2 - Q7-Q8</w:t>
+              <w:t>+2 500 000 €</w:t>
             </w:r>
           </w:p>
         </w:tc>
         <w:tc>
           <w:tcPr>
-            <w:tcW w:type="dxa" w:w="1930"/>
+            <w:tcW w:type="dxa" w:w="1378"/>
             <w:shd w:fill="F8FAFC"/>
           </w:tcPr>
           <w:p>
@@ -6667,61 +6374,7 @@
                 <w:color w:val="1E293B"/>
                 <w:sz w:val="16"/>
               </w:rPr>
-              <w:t>Février — Juillet 2028</w:t>
-            </w:r>
-          </w:p>
-        </w:tc>
-        <w:tc>
-          <w:tcPr>
-            <w:tcW w:type="dxa" w:w="1930"/>
-            <w:shd w:fill="F8FAFC"/>
-          </w:tcPr>
-          <w:p>
-            <w:pPr>
-              <w:spacing w:before="60" w:after="60"/>
-            </w:pPr>
-            <w:r>
-              <w:rPr>
-                <w:color w:val="1E293B"/>
-                <w:sz w:val="16"/>
-              </w:rPr>
-              <w:t>217,50 k€</w:t>
-            </w:r>
-          </w:p>
-        </w:tc>
-        <w:tc>
-          <w:tcPr>
-            <w:tcW w:type="dxa" w:w="1930"/>
-            <w:shd w:fill="F8FAFC"/>
-          </w:tcPr>
-          <w:p>
-            <w:pPr>
-              <w:spacing w:before="60" w:after="60"/>
-            </w:pPr>
-            <w:r>
-              <w:rPr>
-                <w:color w:val="1E293B"/>
-                <w:sz w:val="16"/>
-              </w:rPr>
-              <w:t>108,75 k€</w:t>
-            </w:r>
-          </w:p>
-        </w:tc>
-        <w:tc>
-          <w:tcPr>
-            <w:tcW w:type="dxa" w:w="1930"/>
-            <w:shd w:fill="F8FAFC"/>
-          </w:tcPr>
-          <w:p>
-            <w:pPr>
-              <w:spacing w:before="60" w:after="60"/>
-            </w:pPr>
-            <w:r>
-              <w:rPr>
-                <w:color w:val="1E293B"/>
-                <w:sz w:val="16"/>
-              </w:rPr>
-              <w:t>108,75 k€</w:t>
+              <w:t>+2 282 500 €</w:t>
             </w:r>
           </w:p>
         </w:tc>
@@ -6729,8 +6382,8 @@
       <w:tr>
         <w:tc>
           <w:tcPr>
-            <w:tcW w:type="dxa" w:w="1930"/>
-            <w:shd w:fill="E2E8F0"/>
+            <w:tcW w:type="dxa" w:w="1378"/>
+            <w:shd w:fill="0F172A"/>
           </w:tcPr>
           <w:p>
             <w:pPr>
@@ -6739,17 +6392,17 @@
             <w:r>
               <w:rPr>
                 <w:b/>
-                <w:color w:val="0F172A"/>
-                <w:sz w:val="17"/>
+                <w:color w:val="FFFFFF"/>
+                <w:sz w:val="16"/>
               </w:rPr>
-              <w:t>Sous-Total Année 2</w:t>
+              <w:t>TOTAL 3 ANS</w:t>
             </w:r>
           </w:p>
         </w:tc>
         <w:tc>
           <w:tcPr>
-            <w:tcW w:type="dxa" w:w="1930"/>
-            <w:shd w:fill="E2E8F0"/>
+            <w:tcW w:type="dxa" w:w="1378"/>
+            <w:shd w:fill="0F172A"/>
           </w:tcPr>
           <w:p>
             <w:pPr>
@@ -6758,17 +6411,17 @@
             <w:r>
               <w:rPr>
                 <w:b/>
-                <w:color w:val="0F172A"/>
-                <w:sz w:val="17"/>
+                <w:color w:val="FFFFFF"/>
+                <w:sz w:val="16"/>
               </w:rPr>
-              <w:t>Août 2027 — Juillet 2028</w:t>
+              <w:t>1er Sept 2026 — 31 Août 2029</w:t>
             </w:r>
           </w:p>
         </w:tc>
         <w:tc>
           <w:tcPr>
-            <w:tcW w:type="dxa" w:w="1930"/>
-            <w:shd w:fill="E2E8F0"/>
+            <w:tcW w:type="dxa" w:w="1378"/>
+            <w:shd w:fill="0F172A"/>
           </w:tcPr>
           <w:p>
             <w:pPr>
@@ -6777,17 +6430,17 @@
             <w:r>
               <w:rPr>
                 <w:b/>
-                <w:color w:val="0F172A"/>
-                <w:sz w:val="17"/>
+                <w:color w:val="FFFFFF"/>
+                <w:sz w:val="16"/>
               </w:rPr>
-              <w:t>435,00 k€</w:t>
+              <w:t>1 305 000 €</w:t>
             </w:r>
           </w:p>
         </w:tc>
         <w:tc>
           <w:tcPr>
-            <w:tcW w:type="dxa" w:w="1930"/>
-            <w:shd w:fill="E2E8F0"/>
+            <w:tcW w:type="dxa" w:w="1378"/>
+            <w:shd w:fill="0F172A"/>
           </w:tcPr>
           <w:p>
             <w:pPr>
@@ -6796,17 +6449,17 @@
             <w:r>
               <w:rPr>
                 <w:b/>
-                <w:color w:val="0F172A"/>
-                <w:sz w:val="17"/>
+                <w:color w:val="FFFFFF"/>
+                <w:sz w:val="16"/>
               </w:rPr>
-              <w:t>217,50 k€</w:t>
+              <w:t>652 500 €</w:t>
             </w:r>
           </w:p>
         </w:tc>
         <w:tc>
           <w:tcPr>
-            <w:tcW w:type="dxa" w:w="1930"/>
-            <w:shd w:fill="E2E8F0"/>
+            <w:tcW w:type="dxa" w:w="1378"/>
+            <w:shd w:fill="0F172A"/>
           </w:tcPr>
           <w:p>
             <w:pPr>
@@ -6815,111 +6468,17 @@
             <w:r>
               <w:rPr>
                 <w:b/>
-                <w:color w:val="0F172A"/>
-                <w:sz w:val="17"/>
-              </w:rPr>
-              <w:t>217,50 k€</w:t>
-            </w:r>
-          </w:p>
-        </w:tc>
-      </w:tr>
-      <w:tr>
-        <w:tc>
-          <w:tcPr>
-            <w:tcW w:type="dxa" w:w="1930"/>
-            <w:shd w:fill="F8FAFC"/>
-          </w:tcPr>
-          <w:p>
-            <w:pPr>
-              <w:spacing w:before="60" w:after="60"/>
-            </w:pPr>
-            <w:r>
-              <w:rPr>
-                <w:color w:val="1E293B"/>
+                <w:color w:val="FFFFFF"/>
                 <w:sz w:val="16"/>
               </w:rPr>
-              <w:t>Année 3 - Q9-Q12</w:t>
+              <w:t>652 500 €</w:t>
             </w:r>
           </w:p>
         </w:tc>
         <w:tc>
           <w:tcPr>
-            <w:tcW w:type="dxa" w:w="1930"/>
-            <w:shd w:fill="F8FAFC"/>
-          </w:tcPr>
-          <w:p>
-            <w:pPr>
-              <w:spacing w:before="60" w:after="60"/>
-            </w:pPr>
-            <w:r>
-              <w:rPr>
-                <w:color w:val="1E293B"/>
-                <w:sz w:val="16"/>
-              </w:rPr>
-              <w:t>Août 2028 — Juillet 2029</w:t>
-            </w:r>
-          </w:p>
-        </w:tc>
-        <w:tc>
-          <w:tcPr>
-            <w:tcW w:type="dxa" w:w="1930"/>
-            <w:shd w:fill="F8FAFC"/>
-          </w:tcPr>
-          <w:p>
-            <w:pPr>
-              <w:spacing w:before="60" w:after="60"/>
-            </w:pPr>
-            <w:r>
-              <w:rPr>
-                <w:color w:val="1E293B"/>
-                <w:sz w:val="16"/>
-              </w:rPr>
-              <w:t>435,00 k€</w:t>
-            </w:r>
-          </w:p>
-        </w:tc>
-        <w:tc>
-          <w:tcPr>
-            <w:tcW w:type="dxa" w:w="1930"/>
-            <w:shd w:fill="F8FAFC"/>
-          </w:tcPr>
-          <w:p>
-            <w:pPr>
-              <w:spacing w:before="60" w:after="60"/>
-            </w:pPr>
-            <w:r>
-              <w:rPr>
-                <w:color w:val="1E293B"/>
-                <w:sz w:val="16"/>
-              </w:rPr>
-              <w:t>217,50 k€</w:t>
-            </w:r>
-          </w:p>
-        </w:tc>
-        <w:tc>
-          <w:tcPr>
-            <w:tcW w:type="dxa" w:w="1930"/>
-            <w:shd w:fill="F8FAFC"/>
-          </w:tcPr>
-          <w:p>
-            <w:pPr>
-              <w:spacing w:before="60" w:after="60"/>
-            </w:pPr>
-            <w:r>
-              <w:rPr>
-                <w:color w:val="1E293B"/>
-                <w:sz w:val="16"/>
-              </w:rPr>
-              <w:t>217,50 k€</w:t>
-            </w:r>
-          </w:p>
-        </w:tc>
-      </w:tr>
-      <w:tr>
-        <w:tc>
-          <w:tcPr>
-            <w:tcW w:type="dxa" w:w="1930"/>
-            <w:shd w:fill="E2E8F0"/>
+            <w:tcW w:type="dxa" w:w="1378"/>
+            <w:shd w:fill="0F172A"/>
           </w:tcPr>
           <w:p>
             <w:pPr>
@@ -6928,17 +6487,17 @@
             <w:r>
               <w:rPr>
                 <w:b/>
-                <w:color w:val="0F172A"/>
-                <w:sz w:val="17"/>
+                <w:color w:val="FFFFFF"/>
+                <w:sz w:val="16"/>
               </w:rPr>
-              <w:t>TOTAL CUMULÉ 36M</w:t>
+              <w:t>+7 500 000 €</w:t>
             </w:r>
           </w:p>
         </w:tc>
         <w:tc>
           <w:tcPr>
-            <w:tcW w:type="dxa" w:w="1930"/>
-            <w:shd w:fill="E2E8F0"/>
+            <w:tcW w:type="dxa" w:w="1378"/>
+            <w:shd w:fill="0F172A"/>
           </w:tcPr>
           <w:p>
             <w:pPr>
@@ -6947,67 +6506,10 @@
             <w:r>
               <w:rPr>
                 <w:b/>
-                <w:color w:val="0F172A"/>
-                <w:sz w:val="17"/>
+                <w:color w:val="FFFFFF"/>
+                <w:sz w:val="16"/>
               </w:rPr>
-              <w:t>Août 2026 — Juillet 2029</w:t>
-            </w:r>
-          </w:p>
-        </w:tc>
-        <w:tc>
-          <w:tcPr>
-            <w:tcW w:type="dxa" w:w="1930"/>
-            <w:shd w:fill="E2E8F0"/>
-          </w:tcPr>
-          <w:p>
-            <w:pPr>
-              <w:spacing w:before="60" w:after="60"/>
-            </w:pPr>
-            <w:r>
-              <w:rPr>
-                <w:b/>
-                <w:color w:val="0F172A"/>
-                <w:sz w:val="17"/>
-              </w:rPr>
-              <w:t>1 305,00 k€</w:t>
-            </w:r>
-          </w:p>
-        </w:tc>
-        <w:tc>
-          <w:tcPr>
-            <w:tcW w:type="dxa" w:w="1930"/>
-            <w:shd w:fill="E2E8F0"/>
-          </w:tcPr>
-          <w:p>
-            <w:pPr>
-              <w:spacing w:before="60" w:after="60"/>
-            </w:pPr>
-            <w:r>
-              <w:rPr>
-                <w:b/>
-                <w:color w:val="0F172A"/>
-                <w:sz w:val="17"/>
-              </w:rPr>
-              <w:t>652,50 k€</w:t>
-            </w:r>
-          </w:p>
-        </w:tc>
-        <w:tc>
-          <w:tcPr>
-            <w:tcW w:type="dxa" w:w="1930"/>
-            <w:shd w:fill="E2E8F0"/>
-          </w:tcPr>
-          <w:p>
-            <w:pPr>
-              <w:spacing w:before="60" w:after="60"/>
-            </w:pPr>
-            <w:r>
-              <w:rPr>
-                <w:b/>
-                <w:color w:val="0F172A"/>
-                <w:sz w:val="17"/>
-              </w:rPr>
-              <w:t>652,50 k€</w:t>
+              <w:t>+6 847 500 €</w:t>
             </w:r>
           </w:p>
         </w:tc>

</xml_diff>

<commit_message>
feat: apply native Title, Heading 1, Heading 2 styles and indent all bullet points in Google Doc generate_docx.py
</commit_message>
<xml_diff>
--- a/Le_Pacte_Nice_IA.docx
+++ b/Le_Pacte_Nice_IA.docx
@@ -4,7 +4,7 @@
   <w:body>
     <w:p>
       <w:pPr>
-        <w:spacing w:after="80"/>
+        <w:spacing w:before="0" w:after="40"/>
       </w:pPr>
       <w:r>
         <w:rPr>
@@ -14,18 +14,27 @@
           <w:sz w:val="17"/>
         </w:rPr>
         <w:t>ARX CONSULTING — DOCUMENT STRATÉGIQUE MÉTROPOLITAIN</w:t>
-        <w:br/>
       </w:r>
+    </w:p>
+    <w:p>
+      <w:pPr>
+        <w:pStyle w:val="Title"/>
+        <w:spacing w:before="0" w:after="80"/>
+      </w:pPr>
       <w:r>
         <w:rPr>
           <w:rFonts w:ascii="Georgia" w:hAnsi="Georgia"/>
           <w:b/>
           <w:color w:val="0F172A"/>
-          <w:sz w:val="48"/>
+          <w:sz w:val="52"/>
         </w:rPr>
         <w:t>LE PACTE NICE IA</w:t>
-        <w:br/>
       </w:r>
+    </w:p>
+    <w:p>
+      <w:pPr>
+        <w:spacing w:before="0" w:after="120"/>
+      </w:pPr>
       <w:r>
         <w:rPr>
           <w:rFonts w:ascii="Arial" w:hAnsi="Arial"/>
@@ -37,10 +46,11 @@
     </w:p>
     <w:p>
       <w:pPr>
-        <w:spacing w:after="400"/>
+        <w:spacing w:before="0" w:after="400"/>
       </w:pPr>
       <w:r>
         <w:rPr>
+          <w:rFonts w:ascii="Arial" w:hAnsi="Arial"/>
           <w:i/>
           <w:color w:val="64748B"/>
           <w:sz w:val="18"/>
@@ -50,6 +60,7 @@
     </w:p>
     <w:p>
       <w:pPr>
+        <w:pStyle w:val="Heading1"/>
         <w:keepNext/>
         <w:spacing w:before="360" w:after="160"/>
       </w:pPr>
@@ -85,6 +96,7 @@
             </w:pPr>
             <w:r>
               <w:rPr>
+                <w:rFonts w:ascii="Arial" w:hAnsi="Arial"/>
                 <w:b/>
                 <w:color w:val="0F172A"/>
                 <w:sz w:val="19"/>
@@ -105,6 +117,7 @@
             </w:pPr>
             <w:r>
               <w:rPr>
+                <w:rFonts w:ascii="Arial" w:hAnsi="Arial"/>
                 <w:i/>
                 <w:color w:val="64748B"/>
                 <w:sz w:val="18"/>
@@ -126,6 +139,7 @@
             </w:pPr>
             <w:r>
               <w:rPr>
+                <w:rFonts w:ascii="Arial" w:hAnsi="Arial"/>
                 <w:b/>
                 <w:color w:val="0F172A"/>
                 <w:sz w:val="19"/>
@@ -146,6 +160,7 @@
             </w:pPr>
             <w:r>
               <w:rPr>
+                <w:rFonts w:ascii="Arial" w:hAnsi="Arial"/>
                 <w:i/>
                 <w:color w:val="64748B"/>
                 <w:sz w:val="18"/>
@@ -167,6 +182,7 @@
             </w:pPr>
             <w:r>
               <w:rPr>
+                <w:rFonts w:ascii="Arial" w:hAnsi="Arial"/>
                 <w:b/>
                 <w:color w:val="0F172A"/>
                 <w:sz w:val="19"/>
@@ -187,6 +203,7 @@
             </w:pPr>
             <w:r>
               <w:rPr>
+                <w:rFonts w:ascii="Arial" w:hAnsi="Arial"/>
                 <w:i/>
                 <w:color w:val="64748B"/>
                 <w:sz w:val="18"/>
@@ -208,6 +225,7 @@
             </w:pPr>
             <w:r>
               <w:rPr>
+                <w:rFonts w:ascii="Arial" w:hAnsi="Arial"/>
                 <w:b/>
                 <w:color w:val="0F172A"/>
                 <w:sz w:val="19"/>
@@ -228,6 +246,7 @@
             </w:pPr>
             <w:r>
               <w:rPr>
+                <w:rFonts w:ascii="Arial" w:hAnsi="Arial"/>
                 <w:i/>
                 <w:color w:val="64748B"/>
                 <w:sz w:val="18"/>
@@ -249,6 +268,7 @@
             </w:pPr>
             <w:r>
               <w:rPr>
+                <w:rFonts w:ascii="Arial" w:hAnsi="Arial"/>
                 <w:b/>
                 <w:color w:val="0F172A"/>
                 <w:sz w:val="19"/>
@@ -269,6 +289,7 @@
             </w:pPr>
             <w:r>
               <w:rPr>
+                <w:rFonts w:ascii="Arial" w:hAnsi="Arial"/>
                 <w:i/>
                 <w:color w:val="64748B"/>
                 <w:sz w:val="18"/>
@@ -290,6 +311,7 @@
             </w:pPr>
             <w:r>
               <w:rPr>
+                <w:rFonts w:ascii="Arial" w:hAnsi="Arial"/>
                 <w:b/>
                 <w:color w:val="0F172A"/>
                 <w:sz w:val="19"/>
@@ -310,6 +332,7 @@
             </w:pPr>
             <w:r>
               <w:rPr>
+                <w:rFonts w:ascii="Arial" w:hAnsi="Arial"/>
                 <w:i/>
                 <w:color w:val="64748B"/>
                 <w:sz w:val="18"/>
@@ -331,6 +354,7 @@
             </w:pPr>
             <w:r>
               <w:rPr>
+                <w:rFonts w:ascii="Arial" w:hAnsi="Arial"/>
                 <w:b/>
                 <w:color w:val="0F172A"/>
                 <w:sz w:val="19"/>
@@ -351,6 +375,7 @@
             </w:pPr>
             <w:r>
               <w:rPr>
+                <w:rFonts w:ascii="Arial" w:hAnsi="Arial"/>
                 <w:i/>
                 <w:color w:val="64748B"/>
                 <w:sz w:val="18"/>
@@ -372,6 +397,7 @@
             </w:pPr>
             <w:r>
               <w:rPr>
+                <w:rFonts w:ascii="Arial" w:hAnsi="Arial"/>
                 <w:b/>
                 <w:color w:val="0F172A"/>
                 <w:sz w:val="19"/>
@@ -392,6 +418,7 @@
             </w:pPr>
             <w:r>
               <w:rPr>
+                <w:rFonts w:ascii="Arial" w:hAnsi="Arial"/>
                 <w:i/>
                 <w:color w:val="64748B"/>
                 <w:sz w:val="18"/>
@@ -413,6 +440,7 @@
             </w:pPr>
             <w:r>
               <w:rPr>
+                <w:rFonts w:ascii="Arial" w:hAnsi="Arial"/>
                 <w:b/>
                 <w:color w:val="0F172A"/>
                 <w:sz w:val="19"/>
@@ -433,6 +461,7 @@
             </w:pPr>
             <w:r>
               <w:rPr>
+                <w:rFonts w:ascii="Arial" w:hAnsi="Arial"/>
                 <w:i/>
                 <w:color w:val="64748B"/>
                 <w:sz w:val="18"/>
@@ -454,6 +483,7 @@
             </w:pPr>
             <w:r>
               <w:rPr>
+                <w:rFonts w:ascii="Arial" w:hAnsi="Arial"/>
                 <w:b/>
                 <w:color w:val="0F172A"/>
                 <w:sz w:val="19"/>
@@ -474,6 +504,7 @@
             </w:pPr>
             <w:r>
               <w:rPr>
+                <w:rFonts w:ascii="Arial" w:hAnsi="Arial"/>
                 <w:i/>
                 <w:color w:val="64748B"/>
                 <w:sz w:val="18"/>
@@ -495,6 +526,7 @@
             </w:pPr>
             <w:r>
               <w:rPr>
+                <w:rFonts w:ascii="Arial" w:hAnsi="Arial"/>
                 <w:b/>
                 <w:color w:val="0F172A"/>
                 <w:sz w:val="19"/>
@@ -515,6 +547,7 @@
             </w:pPr>
             <w:r>
               <w:rPr>
+                <w:rFonts w:ascii="Arial" w:hAnsi="Arial"/>
                 <w:i/>
                 <w:color w:val="64748B"/>
                 <w:sz w:val="18"/>
@@ -536,6 +569,7 @@
             </w:pPr>
             <w:r>
               <w:rPr>
+                <w:rFonts w:ascii="Arial" w:hAnsi="Arial"/>
                 <w:b/>
                 <w:color w:val="0F172A"/>
                 <w:sz w:val="19"/>
@@ -556,6 +590,7 @@
             </w:pPr>
             <w:r>
               <w:rPr>
+                <w:rFonts w:ascii="Arial" w:hAnsi="Arial"/>
                 <w:i/>
                 <w:color w:val="64748B"/>
                 <w:sz w:val="18"/>
@@ -577,6 +612,7 @@
             </w:pPr>
             <w:r>
               <w:rPr>
+                <w:rFonts w:ascii="Arial" w:hAnsi="Arial"/>
                 <w:b/>
                 <w:color w:val="0F172A"/>
                 <w:sz w:val="19"/>
@@ -597,6 +633,7 @@
             </w:pPr>
             <w:r>
               <w:rPr>
+                <w:rFonts w:ascii="Arial" w:hAnsi="Arial"/>
                 <w:i/>
                 <w:color w:val="64748B"/>
                 <w:sz w:val="18"/>
@@ -618,6 +655,7 @@
             </w:pPr>
             <w:r>
               <w:rPr>
+                <w:rFonts w:ascii="Arial" w:hAnsi="Arial"/>
                 <w:b/>
                 <w:color w:val="0F172A"/>
                 <w:sz w:val="19"/>
@@ -638,6 +676,7 @@
             </w:pPr>
             <w:r>
               <w:rPr>
+                <w:rFonts w:ascii="Arial" w:hAnsi="Arial"/>
                 <w:i/>
                 <w:color w:val="64748B"/>
                 <w:sz w:val="18"/>
@@ -659,6 +698,7 @@
             </w:pPr>
             <w:r>
               <w:rPr>
+                <w:rFonts w:ascii="Arial" w:hAnsi="Arial"/>
                 <w:b/>
                 <w:color w:val="0F172A"/>
                 <w:sz w:val="19"/>
@@ -679,6 +719,7 @@
             </w:pPr>
             <w:r>
               <w:rPr>
+                <w:rFonts w:ascii="Arial" w:hAnsi="Arial"/>
                 <w:i/>
                 <w:color w:val="64748B"/>
                 <w:sz w:val="18"/>
@@ -700,6 +741,7 @@
             </w:pPr>
             <w:r>
               <w:rPr>
+                <w:rFonts w:ascii="Arial" w:hAnsi="Arial"/>
                 <w:b/>
                 <w:color w:val="0F172A"/>
                 <w:sz w:val="19"/>
@@ -720,6 +762,7 @@
             </w:pPr>
             <w:r>
               <w:rPr>
+                <w:rFonts w:ascii="Arial" w:hAnsi="Arial"/>
                 <w:i/>
                 <w:color w:val="64748B"/>
                 <w:sz w:val="18"/>
@@ -741,6 +784,7 @@
             </w:pPr>
             <w:r>
               <w:rPr>
+                <w:rFonts w:ascii="Arial" w:hAnsi="Arial"/>
                 <w:b/>
                 <w:color w:val="0F172A"/>
                 <w:sz w:val="19"/>
@@ -761,6 +805,7 @@
             </w:pPr>
             <w:r>
               <w:rPr>
+                <w:rFonts w:ascii="Arial" w:hAnsi="Arial"/>
                 <w:i/>
                 <w:color w:val="64748B"/>
                 <w:sz w:val="18"/>
@@ -782,6 +827,7 @@
             </w:pPr>
             <w:r>
               <w:rPr>
+                <w:rFonts w:ascii="Arial" w:hAnsi="Arial"/>
                 <w:b/>
                 <w:color w:val="0F172A"/>
                 <w:sz w:val="19"/>
@@ -802,6 +848,7 @@
             </w:pPr>
             <w:r>
               <w:rPr>
+                <w:rFonts w:ascii="Arial" w:hAnsi="Arial"/>
                 <w:i/>
                 <w:color w:val="64748B"/>
                 <w:sz w:val="18"/>
@@ -823,6 +870,7 @@
             </w:pPr>
             <w:r>
               <w:rPr>
+                <w:rFonts w:ascii="Arial" w:hAnsi="Arial"/>
                 <w:b/>
                 <w:color w:val="0F172A"/>
                 <w:sz w:val="19"/>
@@ -843,6 +891,7 @@
             </w:pPr>
             <w:r>
               <w:rPr>
+                <w:rFonts w:ascii="Arial" w:hAnsi="Arial"/>
                 <w:i/>
                 <w:color w:val="64748B"/>
                 <w:sz w:val="18"/>
@@ -864,6 +913,7 @@
             </w:pPr>
             <w:r>
               <w:rPr>
+                <w:rFonts w:ascii="Arial" w:hAnsi="Arial"/>
                 <w:b/>
                 <w:color w:val="0F172A"/>
                 <w:sz w:val="19"/>
@@ -884,6 +934,7 @@
             </w:pPr>
             <w:r>
               <w:rPr>
+                <w:rFonts w:ascii="Arial" w:hAnsi="Arial"/>
                 <w:i/>
                 <w:color w:val="64748B"/>
                 <w:sz w:val="18"/>
@@ -905,6 +956,7 @@
             </w:pPr>
             <w:r>
               <w:rPr>
+                <w:rFonts w:ascii="Arial" w:hAnsi="Arial"/>
                 <w:b/>
                 <w:color w:val="0F172A"/>
                 <w:sz w:val="19"/>
@@ -925,6 +977,7 @@
             </w:pPr>
             <w:r>
               <w:rPr>
+                <w:rFonts w:ascii="Arial" w:hAnsi="Arial"/>
                 <w:i/>
                 <w:color w:val="64748B"/>
                 <w:sz w:val="18"/>
@@ -946,6 +999,7 @@
             </w:pPr>
             <w:r>
               <w:rPr>
+                <w:rFonts w:ascii="Arial" w:hAnsi="Arial"/>
                 <w:b/>
                 <w:color w:val="0F172A"/>
                 <w:sz w:val="19"/>
@@ -966,6 +1020,7 @@
             </w:pPr>
             <w:r>
               <w:rPr>
+                <w:rFonts w:ascii="Arial" w:hAnsi="Arial"/>
                 <w:i/>
                 <w:color w:val="64748B"/>
                 <w:sz w:val="18"/>
@@ -987,6 +1042,7 @@
             </w:pPr>
             <w:r>
               <w:rPr>
+                <w:rFonts w:ascii="Arial" w:hAnsi="Arial"/>
                 <w:b/>
                 <w:color w:val="0F172A"/>
                 <w:sz w:val="19"/>
@@ -1007,6 +1063,7 @@
             </w:pPr>
             <w:r>
               <w:rPr>
+                <w:rFonts w:ascii="Arial" w:hAnsi="Arial"/>
                 <w:i/>
                 <w:color w:val="64748B"/>
                 <w:sz w:val="18"/>
@@ -1028,6 +1085,7 @@
             </w:pPr>
             <w:r>
               <w:rPr>
+                <w:rFonts w:ascii="Arial" w:hAnsi="Arial"/>
                 <w:b/>
                 <w:color w:val="0F172A"/>
                 <w:sz w:val="19"/>
@@ -1048,6 +1106,7 @@
             </w:pPr>
             <w:r>
               <w:rPr>
+                <w:rFonts w:ascii="Arial" w:hAnsi="Arial"/>
                 <w:i/>
                 <w:color w:val="64748B"/>
                 <w:sz w:val="18"/>
@@ -1069,6 +1128,7 @@
             </w:pPr>
             <w:r>
               <w:rPr>
+                <w:rFonts w:ascii="Arial" w:hAnsi="Arial"/>
                 <w:b/>
                 <w:color w:val="0F172A"/>
                 <w:sz w:val="19"/>
@@ -1089,6 +1149,7 @@
             </w:pPr>
             <w:r>
               <w:rPr>
+                <w:rFonts w:ascii="Arial" w:hAnsi="Arial"/>
                 <w:i/>
                 <w:color w:val="64748B"/>
                 <w:sz w:val="18"/>
@@ -1106,6 +1167,7 @@
     </w:p>
     <w:p>
       <w:pPr>
+        <w:pStyle w:val="Heading1"/>
         <w:keepNext/>
         <w:spacing w:before="360" w:after="160"/>
       </w:pPr>
@@ -1123,9 +1185,11 @@
       <w:pPr>
         <w:pStyle w:val="ListBullet"/>
         <w:spacing w:before="40" w:after="100" w:line="276" w:lineRule="auto"/>
+        <w:ind w:left="504"/>
       </w:pPr>
       <w:r>
         <w:rPr>
+          <w:rFonts w:ascii="Arial" w:hAnsi="Arial"/>
           <w:b/>
           <w:color w:val="0F172A"/>
         </w:rPr>
@@ -1133,12 +1197,14 @@
       </w:r>
       <w:r>
         <w:rPr>
+          <w:rFonts w:ascii="Arial" w:hAnsi="Arial"/>
           <w:color w:val="1E293B"/>
         </w:rPr>
         <w:t xml:space="preserve"> : La course aux modèles de frontière se joue à l’échelle des superpuissances. Pour Nice, la vraie bataille stratégique réside dans </w:t>
       </w:r>
       <w:r>
         <w:rPr>
+          <w:rFonts w:ascii="Arial" w:hAnsi="Arial"/>
           <w:b/>
           <w:color w:val="0F172A"/>
         </w:rPr>
@@ -1146,12 +1212,14 @@
       </w:r>
       <w:r>
         <w:rPr>
+          <w:rFonts w:ascii="Arial" w:hAnsi="Arial"/>
           <w:color w:val="1E293B"/>
         </w:rPr>
         <w:t xml:space="preserve">, en </w:t>
       </w:r>
       <w:r>
         <w:rPr>
+          <w:rFonts w:ascii="Arial" w:hAnsi="Arial"/>
           <w:b/>
           <w:color w:val="0F172A"/>
         </w:rPr>
@@ -1159,12 +1227,14 @@
       </w:r>
       <w:r>
         <w:rPr>
+          <w:rFonts w:ascii="Arial" w:hAnsi="Arial"/>
           <w:color w:val="1E293B"/>
         </w:rPr>
         <w:t xml:space="preserve"> et en </w:t>
       </w:r>
       <w:r>
         <w:rPr>
+          <w:rFonts w:ascii="Arial" w:hAnsi="Arial"/>
           <w:b/>
           <w:color w:val="0F172A"/>
         </w:rPr>
@@ -1172,6 +1242,7 @@
       </w:r>
       <w:r>
         <w:rPr>
+          <w:rFonts w:ascii="Arial" w:hAnsi="Arial"/>
           <w:color w:val="1E293B"/>
         </w:rPr>
         <w:t>.</w:t>
@@ -1181,9 +1252,11 @@
       <w:pPr>
         <w:pStyle w:val="ListBullet"/>
         <w:spacing w:before="40" w:after="100" w:line="276" w:lineRule="auto"/>
+        <w:ind w:left="504"/>
       </w:pPr>
       <w:r>
         <w:rPr>
+          <w:rFonts w:ascii="Arial" w:hAnsi="Arial"/>
           <w:b/>
           <w:color w:val="0F172A"/>
         </w:rPr>
@@ -1191,12 +1264,14 @@
       </w:r>
       <w:r>
         <w:rPr>
+          <w:rFonts w:ascii="Arial" w:hAnsi="Arial"/>
           <w:color w:val="1E293B"/>
         </w:rPr>
         <w:t xml:space="preserve"> : Aucune collectivité n'a encore préempté la position de </w:t>
       </w:r>
       <w:r>
         <w:rPr>
+          <w:rFonts w:ascii="Arial" w:hAnsi="Arial"/>
           <w:b/>
           <w:color w:val="0F172A"/>
         </w:rPr>
@@ -1204,6 +1279,7 @@
       </w:r>
       <w:r>
         <w:rPr>
+          <w:rFonts w:ascii="Arial" w:hAnsi="Arial"/>
           <w:color w:val="1E293B"/>
         </w:rPr>
         <w:t>. Nice doit être la première sous la conduite de M. Éric Ciotti.</w:t>
@@ -1233,6 +1309,7 @@
             </w:pPr>
             <w:r>
               <w:rPr>
+                <w:rFonts w:ascii="Arial" w:hAnsi="Arial"/>
                 <w:b/>
                 <w:color w:val="FFFFFF"/>
                 <w:sz w:val="18"/>
@@ -1252,6 +1329,7 @@
             </w:pPr>
             <w:r>
               <w:rPr>
+                <w:rFonts w:ascii="Arial" w:hAnsi="Arial"/>
                 <w:b/>
                 <w:color w:val="FFFFFF"/>
                 <w:sz w:val="18"/>
@@ -1271,6 +1349,7 @@
             </w:pPr>
             <w:r>
               <w:rPr>
+                <w:rFonts w:ascii="Arial" w:hAnsi="Arial"/>
                 <w:b/>
                 <w:color w:val="FFFFFF"/>
                 <w:sz w:val="18"/>
@@ -1290,6 +1369,7 @@
             </w:pPr>
             <w:r>
               <w:rPr>
+                <w:rFonts w:ascii="Arial" w:hAnsi="Arial"/>
                 <w:b/>
                 <w:color w:val="FFFFFF"/>
                 <w:sz w:val="18"/>
@@ -1311,6 +1391,7 @@
             </w:pPr>
             <w:r>
               <w:rPr>
+                <w:rFonts w:ascii="Arial" w:hAnsi="Arial"/>
                 <w:color w:val="1E293B"/>
                 <w:sz w:val="17"/>
               </w:rPr>
@@ -1329,6 +1410,7 @@
             </w:pPr>
             <w:r>
               <w:rPr>
+                <w:rFonts w:ascii="Arial" w:hAnsi="Arial"/>
                 <w:color w:val="1E293B"/>
                 <w:sz w:val="17"/>
               </w:rPr>
@@ -1347,6 +1429,7 @@
             </w:pPr>
             <w:r>
               <w:rPr>
+                <w:rFonts w:ascii="Arial" w:hAnsi="Arial"/>
                 <w:color w:val="1E293B"/>
                 <w:sz w:val="17"/>
               </w:rPr>
@@ -1365,6 +1448,7 @@
             </w:pPr>
             <w:r>
               <w:rPr>
+                <w:rFonts w:ascii="Arial" w:hAnsi="Arial"/>
                 <w:color w:val="1E293B"/>
                 <w:sz w:val="17"/>
               </w:rPr>
@@ -1385,6 +1469,7 @@
             </w:pPr>
             <w:r>
               <w:rPr>
+                <w:rFonts w:ascii="Arial" w:hAnsi="Arial"/>
                 <w:color w:val="1E293B"/>
                 <w:sz w:val="17"/>
               </w:rPr>
@@ -1403,6 +1488,7 @@
             </w:pPr>
             <w:r>
               <w:rPr>
+                <w:rFonts w:ascii="Arial" w:hAnsi="Arial"/>
                 <w:color w:val="1E293B"/>
                 <w:sz w:val="17"/>
               </w:rPr>
@@ -1421,6 +1507,7 @@
             </w:pPr>
             <w:r>
               <w:rPr>
+                <w:rFonts w:ascii="Arial" w:hAnsi="Arial"/>
                 <w:color w:val="1E293B"/>
                 <w:sz w:val="17"/>
               </w:rPr>
@@ -1439,6 +1526,7 @@
             </w:pPr>
             <w:r>
               <w:rPr>
+                <w:rFonts w:ascii="Arial" w:hAnsi="Arial"/>
                 <w:color w:val="1E293B"/>
                 <w:sz w:val="17"/>
               </w:rPr>
@@ -1459,6 +1547,7 @@
             </w:pPr>
             <w:r>
               <w:rPr>
+                <w:rFonts w:ascii="Arial" w:hAnsi="Arial"/>
                 <w:color w:val="1E293B"/>
                 <w:sz w:val="17"/>
               </w:rPr>
@@ -1477,6 +1566,7 @@
             </w:pPr>
             <w:r>
               <w:rPr>
+                <w:rFonts w:ascii="Arial" w:hAnsi="Arial"/>
                 <w:color w:val="1E293B"/>
                 <w:sz w:val="17"/>
               </w:rPr>
@@ -1495,6 +1585,7 @@
             </w:pPr>
             <w:r>
               <w:rPr>
+                <w:rFonts w:ascii="Arial" w:hAnsi="Arial"/>
                 <w:color w:val="1E293B"/>
                 <w:sz w:val="17"/>
               </w:rPr>
@@ -1513,6 +1604,7 @@
             </w:pPr>
             <w:r>
               <w:rPr>
+                <w:rFonts w:ascii="Arial" w:hAnsi="Arial"/>
                 <w:color w:val="1E293B"/>
                 <w:sz w:val="17"/>
               </w:rPr>
@@ -1533,6 +1625,7 @@
             </w:pPr>
             <w:r>
               <w:rPr>
+                <w:rFonts w:ascii="Arial" w:hAnsi="Arial"/>
                 <w:color w:val="1E293B"/>
                 <w:sz w:val="17"/>
               </w:rPr>
@@ -1551,6 +1644,7 @@
             </w:pPr>
             <w:r>
               <w:rPr>
+                <w:rFonts w:ascii="Arial" w:hAnsi="Arial"/>
                 <w:color w:val="1E293B"/>
                 <w:sz w:val="17"/>
               </w:rPr>
@@ -1569,6 +1663,7 @@
             </w:pPr>
             <w:r>
               <w:rPr>
+                <w:rFonts w:ascii="Arial" w:hAnsi="Arial"/>
                 <w:color w:val="1E293B"/>
                 <w:sz w:val="17"/>
               </w:rPr>
@@ -1587,6 +1682,7 @@
             </w:pPr>
             <w:r>
               <w:rPr>
+                <w:rFonts w:ascii="Arial" w:hAnsi="Arial"/>
                 <w:color w:val="1E293B"/>
                 <w:sz w:val="17"/>
               </w:rPr>
@@ -1607,6 +1703,7 @@
             </w:pPr>
             <w:r>
               <w:rPr>
+                <w:rFonts w:ascii="Arial" w:hAnsi="Arial"/>
                 <w:color w:val="1E293B"/>
                 <w:sz w:val="17"/>
               </w:rPr>
@@ -1625,6 +1722,7 @@
             </w:pPr>
             <w:r>
               <w:rPr>
+                <w:rFonts w:ascii="Arial" w:hAnsi="Arial"/>
                 <w:color w:val="1E293B"/>
                 <w:sz w:val="17"/>
               </w:rPr>
@@ -1643,6 +1741,7 @@
             </w:pPr>
             <w:r>
               <w:rPr>
+                <w:rFonts w:ascii="Arial" w:hAnsi="Arial"/>
                 <w:color w:val="1E293B"/>
                 <w:sz w:val="17"/>
               </w:rPr>
@@ -1661,6 +1760,7 @@
             </w:pPr>
             <w:r>
               <w:rPr>
+                <w:rFonts w:ascii="Arial" w:hAnsi="Arial"/>
                 <w:color w:val="1E293B"/>
                 <w:sz w:val="17"/>
               </w:rPr>
@@ -1677,6 +1777,7 @@
     </w:p>
     <w:p>
       <w:pPr>
+        <w:pStyle w:val="Heading2"/>
         <w:keepNext/>
         <w:spacing w:before="280" w:after="120"/>
       </w:pPr>
@@ -1694,9 +1795,11 @@
       <w:pPr>
         <w:pStyle w:val="ListBullet"/>
         <w:spacing w:before="40" w:after="100" w:line="276" w:lineRule="auto"/>
+        <w:ind w:left="504"/>
       </w:pPr>
       <w:r>
         <w:rPr>
+          <w:rFonts w:ascii="Arial" w:hAnsi="Arial"/>
           <w:b/>
           <w:color w:val="0F172A"/>
         </w:rPr>
@@ -1704,12 +1807,14 @@
       </w:r>
       <w:r>
         <w:rPr>
+          <w:rFonts w:ascii="Arial" w:hAnsi="Arial"/>
           <w:color w:val="1E293B"/>
         </w:rPr>
         <w:t xml:space="preserve"> : L'investissement annuel brut est optimisé à </w:t>
       </w:r>
       <w:r>
         <w:rPr>
+          <w:rFonts w:ascii="Arial" w:hAnsi="Arial"/>
           <w:b/>
           <w:color w:val="0F172A"/>
         </w:rPr>
@@ -1717,24 +1822,28 @@
       </w:r>
       <w:r>
         <w:rPr>
+          <w:rFonts w:ascii="Arial" w:hAnsi="Arial"/>
           <w:color w:val="1E293B"/>
         </w:rPr>
         <w:t xml:space="preserve"> (grâce à l'engagement en temps partagé 2,5j/sem de la Direction de Projet à 65 k€). Avec le co-financement UE (</w:t>
       </w:r>
       <w:r>
         <w:rPr>
+          <w:rFonts w:ascii="Arial" w:hAnsi="Arial"/>
           <w:i/>
         </w:rPr>
         <w:t>Digital Europe</w:t>
       </w:r>
       <w:r>
         <w:rPr>
+          <w:rFonts w:ascii="Arial" w:hAnsi="Arial"/>
           <w:color w:val="1E293B"/>
         </w:rPr>
         <w:t xml:space="preserve"> à 50 %), le reste à charge net métropolitain descend à seulement </w:t>
       </w:r>
       <w:r>
         <w:rPr>
+          <w:rFonts w:ascii="Arial" w:hAnsi="Arial"/>
           <w:b/>
           <w:color w:val="0F172A"/>
         </w:rPr>
@@ -1742,6 +1851,7 @@
       </w:r>
       <w:r>
         <w:rPr>
+          <w:rFonts w:ascii="Arial" w:hAnsi="Arial"/>
           <w:color w:val="1E293B"/>
         </w:rPr>
         <w:t>.</w:t>
@@ -1771,6 +1881,7 @@
             </w:pPr>
             <w:r>
               <w:rPr>
+                <w:rFonts w:ascii="Arial" w:hAnsi="Arial"/>
                 <w:b/>
                 <w:color w:val="FFFFFF"/>
                 <w:sz w:val="17"/>
@@ -1790,6 +1901,7 @@
             </w:pPr>
             <w:r>
               <w:rPr>
+                <w:rFonts w:ascii="Arial" w:hAnsi="Arial"/>
                 <w:b/>
                 <w:color w:val="FFFFFF"/>
                 <w:sz w:val="17"/>
@@ -1809,6 +1921,7 @@
             </w:pPr>
             <w:r>
               <w:rPr>
+                <w:rFonts w:ascii="Arial" w:hAnsi="Arial"/>
                 <w:b/>
                 <w:color w:val="FFFFFF"/>
                 <w:sz w:val="17"/>
@@ -1828,6 +1941,7 @@
             </w:pPr>
             <w:r>
               <w:rPr>
+                <w:rFonts w:ascii="Arial" w:hAnsi="Arial"/>
                 <w:b/>
                 <w:color w:val="FFFFFF"/>
                 <w:sz w:val="17"/>
@@ -1849,6 +1963,7 @@
             </w:pPr>
             <w:r>
               <w:rPr>
+                <w:rFonts w:ascii="Arial" w:hAnsi="Arial"/>
                 <w:color w:val="1E293B"/>
                 <w:sz w:val="16"/>
               </w:rPr>
@@ -1867,6 +1982,7 @@
             </w:pPr>
             <w:r>
               <w:rPr>
+                <w:rFonts w:ascii="Arial" w:hAnsi="Arial"/>
                 <w:color w:val="1E293B"/>
                 <w:sz w:val="16"/>
               </w:rPr>
@@ -1885,6 +2001,7 @@
             </w:pPr>
             <w:r>
               <w:rPr>
+                <w:rFonts w:ascii="Arial" w:hAnsi="Arial"/>
                 <w:color w:val="1E293B"/>
                 <w:sz w:val="16"/>
               </w:rPr>
@@ -1903,6 +2020,7 @@
             </w:pPr>
             <w:r>
               <w:rPr>
+                <w:rFonts w:ascii="Arial" w:hAnsi="Arial"/>
                 <w:color w:val="1E293B"/>
                 <w:sz w:val="16"/>
               </w:rPr>
@@ -1923,6 +2041,7 @@
             </w:pPr>
             <w:r>
               <w:rPr>
+                <w:rFonts w:ascii="Arial" w:hAnsi="Arial"/>
                 <w:color w:val="1E293B"/>
                 <w:sz w:val="16"/>
               </w:rPr>
@@ -1941,6 +2060,7 @@
             </w:pPr>
             <w:r>
               <w:rPr>
+                <w:rFonts w:ascii="Arial" w:hAnsi="Arial"/>
                 <w:color w:val="1E293B"/>
                 <w:sz w:val="16"/>
               </w:rPr>
@@ -1959,6 +2079,7 @@
             </w:pPr>
             <w:r>
               <w:rPr>
+                <w:rFonts w:ascii="Arial" w:hAnsi="Arial"/>
                 <w:color w:val="1E293B"/>
                 <w:sz w:val="16"/>
               </w:rPr>
@@ -1977,6 +2098,7 @@
             </w:pPr>
             <w:r>
               <w:rPr>
+                <w:rFonts w:ascii="Arial" w:hAnsi="Arial"/>
                 <w:color w:val="1E293B"/>
                 <w:sz w:val="16"/>
               </w:rPr>
@@ -1997,6 +2119,7 @@
             </w:pPr>
             <w:r>
               <w:rPr>
+                <w:rFonts w:ascii="Arial" w:hAnsi="Arial"/>
                 <w:color w:val="1E293B"/>
                 <w:sz w:val="16"/>
               </w:rPr>
@@ -2015,6 +2138,7 @@
             </w:pPr>
             <w:r>
               <w:rPr>
+                <w:rFonts w:ascii="Arial" w:hAnsi="Arial"/>
                 <w:color w:val="1E293B"/>
                 <w:sz w:val="16"/>
               </w:rPr>
@@ -2033,6 +2157,7 @@
             </w:pPr>
             <w:r>
               <w:rPr>
+                <w:rFonts w:ascii="Arial" w:hAnsi="Arial"/>
                 <w:color w:val="1E293B"/>
                 <w:sz w:val="16"/>
               </w:rPr>
@@ -2051,6 +2176,7 @@
             </w:pPr>
             <w:r>
               <w:rPr>
+                <w:rFonts w:ascii="Arial" w:hAnsi="Arial"/>
                 <w:color w:val="1E293B"/>
                 <w:sz w:val="16"/>
               </w:rPr>
@@ -2071,6 +2197,7 @@
             </w:pPr>
             <w:r>
               <w:rPr>
+                <w:rFonts w:ascii="Arial" w:hAnsi="Arial"/>
                 <w:color w:val="1E293B"/>
                 <w:sz w:val="16"/>
               </w:rPr>
@@ -2089,6 +2216,7 @@
             </w:pPr>
             <w:r>
               <w:rPr>
+                <w:rFonts w:ascii="Arial" w:hAnsi="Arial"/>
                 <w:color w:val="1E293B"/>
                 <w:sz w:val="16"/>
               </w:rPr>
@@ -2107,6 +2235,7 @@
             </w:pPr>
             <w:r>
               <w:rPr>
+                <w:rFonts w:ascii="Arial" w:hAnsi="Arial"/>
                 <w:color w:val="1E293B"/>
                 <w:sz w:val="16"/>
               </w:rPr>
@@ -2125,6 +2254,7 @@
             </w:pPr>
             <w:r>
               <w:rPr>
+                <w:rFonts w:ascii="Arial" w:hAnsi="Arial"/>
                 <w:color w:val="1E293B"/>
                 <w:sz w:val="16"/>
               </w:rPr>
@@ -2145,6 +2275,7 @@
             </w:pPr>
             <w:r>
               <w:rPr>
+                <w:rFonts w:ascii="Arial" w:hAnsi="Arial"/>
                 <w:color w:val="1E293B"/>
                 <w:sz w:val="16"/>
               </w:rPr>
@@ -2163,6 +2294,7 @@
             </w:pPr>
             <w:r>
               <w:rPr>
+                <w:rFonts w:ascii="Arial" w:hAnsi="Arial"/>
                 <w:color w:val="1E293B"/>
                 <w:sz w:val="16"/>
               </w:rPr>
@@ -2181,6 +2313,7 @@
             </w:pPr>
             <w:r>
               <w:rPr>
+                <w:rFonts w:ascii="Arial" w:hAnsi="Arial"/>
                 <w:color w:val="1E293B"/>
                 <w:sz w:val="16"/>
               </w:rPr>
@@ -2199,6 +2332,7 @@
             </w:pPr>
             <w:r>
               <w:rPr>
+                <w:rFonts w:ascii="Arial" w:hAnsi="Arial"/>
                 <w:color w:val="1E293B"/>
                 <w:sz w:val="16"/>
               </w:rPr>
@@ -2260,6 +2394,7 @@
     </w:p>
     <w:p>
       <w:pPr>
+        <w:pStyle w:val="Heading1"/>
         <w:keepNext/>
         <w:spacing w:before="360" w:after="160"/>
       </w:pPr>
@@ -2275,6 +2410,7 @@
     </w:p>
     <w:p>
       <w:pPr>
+        <w:pStyle w:val="Heading2"/>
         <w:keepNext/>
         <w:spacing w:before="280" w:after="120"/>
       </w:pPr>
@@ -2292,9 +2428,11 @@
       <w:pPr>
         <w:pStyle w:val="ListBullet"/>
         <w:spacing w:before="40" w:after="100" w:line="276" w:lineRule="auto"/>
+        <w:ind w:left="504"/>
       </w:pPr>
       <w:r>
         <w:rPr>
+          <w:rFonts w:ascii="Arial" w:hAnsi="Arial"/>
           <w:b/>
           <w:color w:val="0F172A"/>
         </w:rPr>
@@ -2302,24 +2440,28 @@
       </w:r>
       <w:r>
         <w:rPr>
+          <w:rFonts w:ascii="Arial" w:hAnsi="Arial"/>
           <w:color w:val="1E293B"/>
         </w:rPr>
         <w:t xml:space="preserve"> : La note </w:t>
       </w:r>
       <w:r>
         <w:rPr>
+          <w:rFonts w:ascii="Arial" w:hAnsi="Arial"/>
           <w:i/>
         </w:rPr>
         <w:t>« Opération Prométhée »</w:t>
       </w:r>
       <w:r>
         <w:rPr>
+          <w:rFonts w:ascii="Arial" w:hAnsi="Arial"/>
           <w:color w:val="1E293B"/>
         </w:rPr>
         <w:t xml:space="preserve"> (juillet 2026, Le Grand Continent) fixe le cadre : un plan de </w:t>
       </w:r>
       <w:r>
         <w:rPr>
+          <w:rFonts w:ascii="Arial" w:hAnsi="Arial"/>
           <w:b/>
           <w:color w:val="0F172A"/>
         </w:rPr>
@@ -2327,6 +2469,7 @@
       </w:r>
       <w:r>
         <w:rPr>
+          <w:rFonts w:ascii="Arial" w:hAnsi="Arial"/>
           <w:color w:val="1E293B"/>
         </w:rPr>
         <w:t xml:space="preserve"> (12 GW, 1 700 chercheurs). L'IA est devenue une ressource stratégique souveraine identique à l'énergie.</w:t>
@@ -2336,9 +2479,11 @@
       <w:pPr>
         <w:pStyle w:val="ListBullet"/>
         <w:spacing w:before="40" w:after="100" w:line="276" w:lineRule="auto"/>
+        <w:ind w:left="504"/>
       </w:pPr>
       <w:r>
         <w:rPr>
+          <w:rFonts w:ascii="Arial" w:hAnsi="Arial"/>
           <w:b/>
           <w:color w:val="0F172A"/>
         </w:rPr>
@@ -2346,18 +2491,21 @@
       </w:r>
       <w:r>
         <w:rPr>
+          <w:rFonts w:ascii="Arial" w:hAnsi="Arial"/>
           <w:color w:val="1E293B"/>
         </w:rPr>
         <w:t xml:space="preserve"> : La Région Sud affiche un </w:t>
       </w:r>
       <w:r>
         <w:rPr>
+          <w:rFonts w:ascii="Arial" w:hAnsi="Arial"/>
           <w:i/>
         </w:rPr>
         <w:t>Plan SUD IA</w:t>
       </w:r>
       <w:r>
         <w:rPr>
+          <w:rFonts w:ascii="Arial" w:hAnsi="Arial"/>
           <w:color w:val="1E293B"/>
         </w:rPr>
         <w:t xml:space="preserve"> (70 M€ sur 5 ans), la Métropole lance des appels à projets isolés et le Département anime la Maison de l'IA (MIA) à Sophia Antipolis.</w:t>
@@ -2367,9 +2515,11 @@
       <w:pPr>
         <w:pStyle w:val="ListBullet"/>
         <w:spacing w:before="40" w:after="100" w:line="276" w:lineRule="auto"/>
+        <w:ind w:left="504"/>
       </w:pPr>
       <w:r>
         <w:rPr>
+          <w:rFonts w:ascii="Arial" w:hAnsi="Arial"/>
           <w:b/>
           <w:color w:val="0F172A"/>
         </w:rPr>
@@ -2377,12 +2527,14 @@
       </w:r>
       <w:r>
         <w:rPr>
+          <w:rFonts w:ascii="Arial" w:hAnsi="Arial"/>
           <w:color w:val="1E293B"/>
         </w:rPr>
         <w:t xml:space="preserve"> : </w:t>
       </w:r>
       <w:r>
         <w:rPr>
+          <w:rFonts w:ascii="Arial" w:hAnsi="Arial"/>
           <w:b/>
           <w:color w:val="0F172A"/>
         </w:rPr>
@@ -2390,6 +2542,7 @@
       </w:r>
       <w:r>
         <w:rPr>
+          <w:rFonts w:ascii="Arial" w:hAnsi="Arial"/>
           <w:color w:val="1E293B"/>
         </w:rPr>
         <w:t>. Un alignement direct et unifié est indispensable pour accélérer les financements.</w:t>
@@ -2399,9 +2552,11 @@
       <w:pPr>
         <w:pStyle w:val="ListBullet"/>
         <w:spacing w:before="40" w:after="100" w:line="276" w:lineRule="auto"/>
+        <w:ind w:left="504"/>
       </w:pPr>
       <w:r>
         <w:rPr>
+          <w:rFonts w:ascii="Arial" w:hAnsi="Arial"/>
           <w:b/>
           <w:color w:val="0F172A"/>
         </w:rPr>
@@ -2409,12 +2564,14 @@
       </w:r>
       <w:r>
         <w:rPr>
+          <w:rFonts w:ascii="Arial" w:hAnsi="Arial"/>
           <w:color w:val="1E293B"/>
         </w:rPr>
         <w:t xml:space="preserve"> : Seul un </w:t>
       </w:r>
       <w:r>
         <w:rPr>
+          <w:rFonts w:ascii="Arial" w:hAnsi="Arial"/>
           <w:b/>
           <w:color w:val="0F172A"/>
         </w:rPr>
@@ -2422,6 +2579,7 @@
       </w:r>
       <w:r>
         <w:rPr>
+          <w:rFonts w:ascii="Arial" w:hAnsi="Arial"/>
           <w:color w:val="1E293B"/>
         </w:rPr>
         <w:t xml:space="preserve"> permettra d'outrepasser ces frictions institutionnelles et d'aller capturer directement les subventions auprès de l'État et des guichets européens.</w:t>
@@ -2429,6 +2587,7 @@
     </w:p>
     <w:p>
       <w:pPr>
+        <w:pStyle w:val="Heading2"/>
         <w:keepNext/>
         <w:spacing w:before="280" w:after="120"/>
       </w:pPr>
@@ -2446,9 +2605,11 @@
       <w:pPr>
         <w:pStyle w:val="ListBullet"/>
         <w:spacing w:before="40" w:after="100" w:line="276" w:lineRule="auto"/>
+        <w:ind w:left="504"/>
       </w:pPr>
       <w:r>
         <w:rPr>
+          <w:rFonts w:ascii="Arial" w:hAnsi="Arial"/>
           <w:b/>
           <w:color w:val="0F172A"/>
         </w:rPr>
@@ -2456,6 +2617,7 @@
       </w:r>
       <w:r>
         <w:rPr>
+          <w:rFonts w:ascii="Arial" w:hAnsi="Arial"/>
           <w:color w:val="1E293B"/>
         </w:rPr>
         <w:t xml:space="preserve"> : ~2 700 entreprises, ~46 000 emplois, ~5 500 chercheurs. Un réservoir mondial d'ingénierie et de recherche d'élite.</w:t>
@@ -2465,9 +2627,11 @@
       <w:pPr>
         <w:pStyle w:val="ListBullet"/>
         <w:spacing w:before="40" w:after="100" w:line="276" w:lineRule="auto"/>
+        <w:ind w:left="504"/>
       </w:pPr>
       <w:r>
         <w:rPr>
+          <w:rFonts w:ascii="Arial" w:hAnsi="Arial"/>
           <w:b/>
           <w:color w:val="0F172A"/>
         </w:rPr>
@@ -2475,6 +2639,7 @@
       </w:r>
       <w:r>
         <w:rPr>
+          <w:rFonts w:ascii="Arial" w:hAnsi="Arial"/>
           <w:color w:val="1E293B"/>
         </w:rPr>
         <w:t xml:space="preserve"> : L'un des 4 instituts nationaux d'IA (spécialisé en santé numérique) avec Inria, Eurecom et le CNRS.</w:t>
@@ -2484,9 +2649,11 @@
       <w:pPr>
         <w:pStyle w:val="ListBullet"/>
         <w:spacing w:before="40" w:after="100" w:line="276" w:lineRule="auto"/>
+        <w:ind w:left="504"/>
       </w:pPr>
       <w:r>
         <w:rPr>
+          <w:rFonts w:ascii="Arial" w:hAnsi="Arial"/>
           <w:b/>
           <w:color w:val="0F172A"/>
         </w:rPr>
@@ -2494,6 +2661,7 @@
       </w:r>
       <w:r>
         <w:rPr>
+          <w:rFonts w:ascii="Arial" w:hAnsi="Arial"/>
           <w:color w:val="1E293B"/>
         </w:rPr>
         <w:t xml:space="preserve"> : Modélisation olfactive, chimie fine et IA sensorielle pour l'industrie aromatique et la santé.</w:t>
@@ -2503,9 +2671,11 @@
       <w:pPr>
         <w:pStyle w:val="ListBullet"/>
         <w:spacing w:before="40" w:after="100" w:line="276" w:lineRule="auto"/>
+        <w:ind w:left="504"/>
       </w:pPr>
       <w:r>
         <w:rPr>
+          <w:rFonts w:ascii="Arial" w:hAnsi="Arial"/>
           <w:b/>
           <w:color w:val="0F172A"/>
         </w:rPr>
@@ -2513,6 +2683,7 @@
       </w:r>
       <w:r>
         <w:rPr>
+          <w:rFonts w:ascii="Arial" w:hAnsi="Arial"/>
           <w:color w:val="1E293B"/>
         </w:rPr>
         <w:t xml:space="preserve"> : Traitement d'imagerie satellite par IA, observation de la Terre et défense spatiale.</w:t>
@@ -2522,9 +2693,11 @@
       <w:pPr>
         <w:pStyle w:val="ListBullet"/>
         <w:spacing w:before="40" w:after="100" w:line="276" w:lineRule="auto"/>
+        <w:ind w:left="504"/>
       </w:pPr>
       <w:r>
         <w:rPr>
+          <w:rFonts w:ascii="Arial" w:hAnsi="Arial"/>
           <w:b/>
           <w:color w:val="0F172A"/>
         </w:rPr>
@@ -2532,12 +2705,14 @@
       </w:r>
       <w:r>
         <w:rPr>
+          <w:rFonts w:ascii="Arial" w:hAnsi="Arial"/>
           <w:color w:val="1E293B"/>
         </w:rPr>
         <w:t xml:space="preserve"> : </w:t>
       </w:r>
       <w:r>
         <w:rPr>
+          <w:rFonts w:ascii="Arial" w:hAnsi="Arial"/>
           <w:b/>
           <w:color w:val="0F172A"/>
         </w:rPr>
@@ -2545,6 +2720,7 @@
       </w:r>
       <w:r>
         <w:rPr>
+          <w:rFonts w:ascii="Arial" w:hAnsi="Arial"/>
           <w:color w:val="1E293B"/>
         </w:rPr>
         <w:t xml:space="preserve"> (1er centre de R&amp;D privé de transport en Europe), générateurs de données massives.</w:t>
@@ -2554,9 +2730,11 @@
       <w:pPr>
         <w:pStyle w:val="ListBullet"/>
         <w:spacing w:before="40" w:after="100" w:line="276" w:lineRule="auto"/>
+        <w:ind w:left="504"/>
       </w:pPr>
       <w:r>
         <w:rPr>
+          <w:rFonts w:ascii="Arial" w:hAnsi="Arial"/>
           <w:b/>
           <w:color w:val="0F172A"/>
         </w:rPr>
@@ -2564,6 +2742,7 @@
       </w:r>
       <w:r>
         <w:rPr>
+          <w:rFonts w:ascii="Arial" w:hAnsi="Arial"/>
           <w:color w:val="1E293B"/>
         </w:rPr>
         <w:t xml:space="preserve"> : Capacité unique de captation et de rétention des chercheurs d'élite que Paris ne conserve plus.</w:t>
@@ -2611,6 +2790,7 @@
     </w:p>
     <w:p>
       <w:pPr>
+        <w:pStyle w:val="Heading2"/>
         <w:keepNext/>
         <w:spacing w:before="280" w:after="120"/>
       </w:pPr>
@@ -2628,9 +2808,11 @@
       <w:pPr>
         <w:pStyle w:val="ListBullet"/>
         <w:spacing w:before="40" w:after="100" w:line="276" w:lineRule="auto"/>
+        <w:ind w:left="504"/>
       </w:pPr>
       <w:r>
         <w:rPr>
+          <w:rFonts w:ascii="Arial" w:hAnsi="Arial"/>
           <w:b/>
           <w:color w:val="0F172A"/>
         </w:rPr>
@@ -2638,12 +2820,14 @@
       </w:r>
       <w:r>
         <w:rPr>
+          <w:rFonts w:ascii="Arial" w:hAnsi="Arial"/>
           <w:color w:val="1E293B"/>
         </w:rPr>
         <w:t xml:space="preserve"> : Afin d'emporter l'adhésion de l'État et de la Commission Européenne, le territoire fait valoir son </w:t>
       </w:r>
       <w:r>
         <w:rPr>
+          <w:rFonts w:ascii="Arial" w:hAnsi="Arial"/>
           <w:b/>
           <w:color w:val="0F172A"/>
         </w:rPr>
@@ -2651,6 +2835,7 @@
       </w:r>
       <w:r>
         <w:rPr>
+          <w:rFonts w:ascii="Arial" w:hAnsi="Arial"/>
           <w:color w:val="1E293B"/>
         </w:rPr>
         <w:t xml:space="preserve"> :</w:t>
@@ -2660,9 +2845,11 @@
       <w:pPr>
         <w:pStyle w:val="ListBullet"/>
         <w:spacing w:before="40" w:after="100" w:line="276" w:lineRule="auto"/>
+        <w:ind w:left="504"/>
       </w:pPr>
       <w:r>
         <w:rPr>
+          <w:rFonts w:ascii="Arial" w:hAnsi="Arial"/>
           <w:b/>
           <w:color w:val="0F172A"/>
         </w:rPr>
@@ -2670,12 +2857,14 @@
       </w:r>
       <w:r>
         <w:rPr>
+          <w:rFonts w:ascii="Arial" w:hAnsi="Arial"/>
           <w:color w:val="1E293B"/>
         </w:rPr>
         <w:t xml:space="preserve"> : ~5 500 chercheurs (public+privé), soit </w:t>
       </w:r>
       <w:r>
         <w:rPr>
+          <w:rFonts w:ascii="Arial" w:hAnsi="Arial"/>
           <w:b/>
           <w:color w:val="0F172A"/>
         </w:rPr>
@@ -2683,6 +2872,7 @@
       </w:r>
       <w:r>
         <w:rPr>
+          <w:rFonts w:ascii="Arial" w:hAnsi="Arial"/>
           <w:color w:val="1E293B"/>
         </w:rPr>
         <w:t xml:space="preserve"> (2e bassin national après Paris).</w:t>
@@ -2692,9 +2882,11 @@
       <w:pPr>
         <w:pStyle w:val="ListBullet"/>
         <w:spacing w:before="40" w:after="100" w:line="276" w:lineRule="auto"/>
+        <w:ind w:left="504"/>
       </w:pPr>
       <w:r>
         <w:rPr>
+          <w:rFonts w:ascii="Arial" w:hAnsi="Arial"/>
           <w:b/>
           <w:color w:val="0F172A"/>
         </w:rPr>
@@ -2702,12 +2894,14 @@
       </w:r>
       <w:r>
         <w:rPr>
+          <w:rFonts w:ascii="Arial" w:hAnsi="Arial"/>
           <w:color w:val="1E293B"/>
         </w:rPr>
         <w:t xml:space="preserve"> : &gt; 100 chaires mondiales, soit </w:t>
       </w:r>
       <w:r>
         <w:rPr>
+          <w:rFonts w:ascii="Arial" w:hAnsi="Arial"/>
           <w:b/>
           <w:color w:val="0F172A"/>
         </w:rPr>
@@ -2715,6 +2909,7 @@
       </w:r>
       <w:r>
         <w:rPr>
+          <w:rFonts w:ascii="Arial" w:hAnsi="Arial"/>
           <w:color w:val="1E293B"/>
         </w:rPr>
         <w:t xml:space="preserve"> (Paris, Grenoble, Toulouse, Nice-Sophia).</w:t>
@@ -2724,9 +2919,11 @@
       <w:pPr>
         <w:pStyle w:val="ListBullet"/>
         <w:spacing w:before="40" w:after="100" w:line="276" w:lineRule="auto"/>
+        <w:ind w:left="504"/>
       </w:pPr>
       <w:r>
         <w:rPr>
+          <w:rFonts w:ascii="Arial" w:hAnsi="Arial"/>
           <w:b/>
           <w:color w:val="0F172A"/>
         </w:rPr>
@@ -2734,12 +2931,14 @@
       </w:r>
       <w:r>
         <w:rPr>
+          <w:rFonts w:ascii="Arial" w:hAnsi="Arial"/>
           <w:color w:val="1E293B"/>
         </w:rPr>
         <w:t xml:space="preserve"> : Amadeus &amp; Thales Alenia Space (&gt;6 500 ingénieurs), soit </w:t>
       </w:r>
       <w:r>
         <w:rPr>
+          <w:rFonts w:ascii="Arial" w:hAnsi="Arial"/>
           <w:b/>
           <w:color w:val="0F172A"/>
         </w:rPr>
@@ -2747,6 +2946,7 @@
       </w:r>
       <w:r>
         <w:rPr>
+          <w:rFonts w:ascii="Arial" w:hAnsi="Arial"/>
           <w:color w:val="1E293B"/>
         </w:rPr>
         <w:t>.</w:t>
@@ -2754,6 +2954,7 @@
     </w:p>
     <w:p>
       <w:pPr>
+        <w:pStyle w:val="Heading2"/>
         <w:keepNext/>
         <w:spacing w:before="280" w:after="120"/>
       </w:pPr>
@@ -2771,9 +2972,11 @@
       <w:pPr>
         <w:pStyle w:val="ListBullet"/>
         <w:spacing w:before="40" w:after="100" w:line="276" w:lineRule="auto"/>
+        <w:ind w:left="504"/>
       </w:pPr>
       <w:r>
         <w:rPr>
+          <w:rFonts w:ascii="Arial" w:hAnsi="Arial"/>
           <w:b/>
           <w:color w:val="0F172A"/>
         </w:rPr>
@@ -2781,6 +2984,7 @@
       </w:r>
       <w:r>
         <w:rPr>
+          <w:rFonts w:ascii="Arial" w:hAnsi="Arial"/>
           <w:color w:val="1E293B"/>
         </w:rPr>
         <w:t xml:space="preserve"> : Premier Cloud d'État souverain d'Europe (certifié AMSN), garantissant une étanchéité totale contre le Cloud Act américain, connecté en fibre noire dédiée à Nice.</w:t>
@@ -2790,9 +2994,11 @@
       <w:pPr>
         <w:pStyle w:val="ListBullet"/>
         <w:spacing w:before="40" w:after="100" w:line="276" w:lineRule="auto"/>
+        <w:ind w:left="504"/>
       </w:pPr>
       <w:r>
         <w:rPr>
+          <w:rFonts w:ascii="Arial" w:hAnsi="Arial"/>
           <w:b/>
           <w:color w:val="0F172A"/>
         </w:rPr>
@@ -2800,6 +3006,7 @@
       </w:r>
       <w:r>
         <w:rPr>
+          <w:rFonts w:ascii="Arial" w:hAnsi="Arial"/>
           <w:color w:val="1E293B"/>
         </w:rPr>
         <w:t xml:space="preserve"> : Monaco dispose d'un capital et d'un tissu d'entreprises majeurs mais souffre d'une contrainte foncière extrême. L'alliance avec la Métropole Nice Côte d'Azur offre le terrain d'extension économique et technologique indispensable.</w:t>
@@ -2809,9 +3016,11 @@
       <w:pPr>
         <w:pStyle w:val="ListBullet"/>
         <w:spacing w:before="40" w:after="100" w:line="276" w:lineRule="auto"/>
+        <w:ind w:left="504"/>
       </w:pPr>
       <w:r>
         <w:rPr>
+          <w:rFonts w:ascii="Arial" w:hAnsi="Arial"/>
           <w:b/>
           <w:color w:val="0F172A"/>
         </w:rPr>
@@ -2819,6 +3028,7 @@
       </w:r>
       <w:r>
         <w:rPr>
+          <w:rFonts w:ascii="Arial" w:hAnsi="Arial"/>
           <w:color w:val="1E293B"/>
         </w:rPr>
         <w:t xml:space="preserve"> : Plus de 45 000 salariés traversent chaque jour Nice pour travailler à Monaco (sources INSEE/SCT), constituant un bassin d'emploi unique à irriguer par l'IA.</w:t>
@@ -2828,9 +3038,11 @@
       <w:pPr>
         <w:pStyle w:val="ListBullet"/>
         <w:spacing w:before="40" w:after="100" w:line="276" w:lineRule="auto"/>
+        <w:ind w:left="504"/>
       </w:pPr>
       <w:r>
         <w:rPr>
+          <w:rFonts w:ascii="Arial" w:hAnsi="Arial"/>
           <w:b/>
           <w:color w:val="0F172A"/>
         </w:rPr>
@@ -2838,6 +3050,7 @@
       </w:r>
       <w:r>
         <w:rPr>
+          <w:rFonts w:ascii="Arial" w:hAnsi="Arial"/>
           <w:color w:val="1E293B"/>
         </w:rPr>
         <w:t xml:space="preserve"> : ~86 établissements pionniers et ~800 emplois directs IA dans le 06 (étude CCI). Un socle solide qui ne demande qu'à être amplifié et structuré pour passer à l'échelle métropolitaine.</w:t>
@@ -2847,9 +3060,11 @@
       <w:pPr>
         <w:pStyle w:val="ListBullet"/>
         <w:spacing w:before="40" w:after="100" w:line="276" w:lineRule="auto"/>
+        <w:ind w:left="504"/>
       </w:pPr>
       <w:r>
         <w:rPr>
+          <w:rFonts w:ascii="Arial" w:hAnsi="Arial"/>
           <w:b/>
           <w:color w:val="0F172A"/>
         </w:rPr>
@@ -2857,6 +3072,7 @@
       </w:r>
       <w:r>
         <w:rPr>
+          <w:rFonts w:ascii="Arial" w:hAnsi="Arial"/>
           <w:color w:val="1E293B"/>
         </w:rPr>
         <w:t xml:space="preserve"> : Extrémité d'une « presqu'île électrique » vulnérable (coupure de 2009 ; RTE 2025 saturé), imposant la doctrine de l'IA frugale par nécessité.</w:t>
@@ -2864,6 +3080,7 @@
     </w:p>
     <w:p>
       <w:pPr>
+        <w:pStyle w:val="Heading2"/>
         <w:keepNext/>
         <w:spacing w:before="280" w:after="120"/>
       </w:pPr>
@@ -2881,9 +3098,11 @@
       <w:pPr>
         <w:pStyle w:val="ListBullet"/>
         <w:spacing w:before="40" w:after="100" w:line="276" w:lineRule="auto"/>
+        <w:ind w:left="504"/>
       </w:pPr>
       <w:r>
         <w:rPr>
+          <w:rFonts w:ascii="Arial" w:hAnsi="Arial"/>
           <w:b/>
           <w:color w:val="0F172A"/>
         </w:rPr>
@@ -2891,12 +3110,14 @@
       </w:r>
       <w:r>
         <w:rPr>
+          <w:rFonts w:ascii="Arial" w:hAnsi="Arial"/>
           <w:color w:val="1E293B"/>
         </w:rPr>
         <w:t xml:space="preserve"> : Le </w:t>
       </w:r>
       <w:r>
         <w:rPr>
+          <w:rFonts w:ascii="Arial" w:hAnsi="Arial"/>
           <w:b/>
           <w:color w:val="0F172A"/>
         </w:rPr>
@@ -2904,12 +3125,14 @@
       </w:r>
       <w:r>
         <w:rPr>
+          <w:rFonts w:ascii="Arial" w:hAnsi="Arial"/>
           <w:color w:val="1E293B"/>
         </w:rPr>
         <w:t xml:space="preserve">, la Commission Européenne a lancé un appel d'offres historique de </w:t>
       </w:r>
       <w:r>
         <w:rPr>
+          <w:rFonts w:ascii="Arial" w:hAnsi="Arial"/>
           <w:b/>
           <w:color w:val="0F172A"/>
         </w:rPr>
@@ -2917,12 +3140,14 @@
       </w:r>
       <w:r>
         <w:rPr>
+          <w:rFonts w:ascii="Arial" w:hAnsi="Arial"/>
           <w:color w:val="1E293B"/>
         </w:rPr>
         <w:t xml:space="preserve"> pour bâtir </w:t>
       </w:r>
       <w:r>
         <w:rPr>
+          <w:rFonts w:ascii="Arial" w:hAnsi="Arial"/>
           <w:b/>
           <w:color w:val="0F172A"/>
         </w:rPr>
@@ -2930,6 +3155,7 @@
       </w:r>
       <w:r>
         <w:rPr>
+          <w:rFonts w:ascii="Arial" w:hAnsi="Arial"/>
           <w:color w:val="1E293B"/>
         </w:rPr>
         <w:t xml:space="preserve"> en Europe.</w:t>
@@ -2939,9 +3165,11 @@
       <w:pPr>
         <w:pStyle w:val="ListBullet"/>
         <w:spacing w:before="40" w:after="100" w:line="276" w:lineRule="auto"/>
+        <w:ind w:left="504"/>
       </w:pPr>
       <w:r>
         <w:rPr>
+          <w:rFonts w:ascii="Arial" w:hAnsi="Arial"/>
           <w:b/>
           <w:color w:val="0F172A"/>
         </w:rPr>
@@ -2949,6 +3177,7 @@
       </w:r>
       <w:r>
         <w:rPr>
+          <w:rFonts w:ascii="Arial" w:hAnsi="Arial"/>
           <w:color w:val="1E293B"/>
         </w:rPr>
         <w:t xml:space="preserve"> par site pour co-financer un supercalculateur d'IA souverain.</w:t>
@@ -2958,9 +3187,11 @@
       <w:pPr>
         <w:pStyle w:val="ListBullet"/>
         <w:spacing w:before="40" w:after="100" w:line="276" w:lineRule="auto"/>
+        <w:ind w:left="504"/>
       </w:pPr>
       <w:r>
         <w:rPr>
+          <w:rFonts w:ascii="Arial" w:hAnsi="Arial"/>
           <w:b/>
           <w:color w:val="0F172A"/>
         </w:rPr>
@@ -2968,6 +3199,7 @@
       </w:r>
       <w:r>
         <w:rPr>
+          <w:rFonts w:ascii="Arial" w:hAnsi="Arial"/>
           <w:color w:val="1E293B"/>
         </w:rPr>
         <w:t xml:space="preserve"> : Candidature binationale transfrontalière unique associant Nice (Plaine du Var / 3IA), Monaco (fonds souverains / Monaco Cloud) et Sophia Antipolis.</w:t>
@@ -2977,9 +3209,11 @@
       <w:pPr>
         <w:pStyle w:val="ListBullet"/>
         <w:spacing w:before="40" w:after="100" w:line="276" w:lineRule="auto"/>
+        <w:ind w:left="504"/>
       </w:pPr>
       <w:r>
         <w:rPr>
+          <w:rFonts w:ascii="Arial" w:hAnsi="Arial"/>
           <w:b/>
           <w:color w:val="0F172A"/>
         </w:rPr>
@@ -2987,6 +3221,7 @@
       </w:r>
       <w:r>
         <w:rPr>
+          <w:rFonts w:ascii="Arial" w:hAnsi="Arial"/>
           <w:color w:val="1E293B"/>
         </w:rPr>
         <w:t xml:space="preserve"> : 500 M€ subvention UE + 300 M€ fonds publics + 700 M€ investisseurs privés.</w:t>
@@ -2996,9 +3231,11 @@
       <w:pPr>
         <w:pStyle w:val="ListBullet"/>
         <w:spacing w:before="40" w:after="100" w:line="276" w:lineRule="auto"/>
+        <w:ind w:left="504"/>
       </w:pPr>
       <w:r>
         <w:rPr>
+          <w:rFonts w:ascii="Arial" w:hAnsi="Arial"/>
           <w:b/>
           <w:color w:val="0F172A"/>
         </w:rPr>
@@ -3006,12 +3243,14 @@
       </w:r>
       <w:r>
         <w:rPr>
+          <w:rFonts w:ascii="Arial" w:hAnsi="Arial"/>
           <w:color w:val="1E293B"/>
         </w:rPr>
         <w:t xml:space="preserve"> : Dépôt du dossier de candidature avant le </w:t>
       </w:r>
       <w:r>
         <w:rPr>
+          <w:rFonts w:ascii="Arial" w:hAnsi="Arial"/>
           <w:b/>
           <w:color w:val="0F172A"/>
         </w:rPr>
@@ -3019,6 +3258,7 @@
       </w:r>
       <w:r>
         <w:rPr>
+          <w:rFonts w:ascii="Arial" w:hAnsi="Arial"/>
           <w:color w:val="1E293B"/>
         </w:rPr>
         <w:t>.</w:t>
@@ -3026,6 +3266,7 @@
     </w:p>
     <w:p>
       <w:pPr>
+        <w:pStyle w:val="Heading2"/>
         <w:keepNext/>
         <w:spacing w:before="280" w:after="120"/>
       </w:pPr>
@@ -3043,9 +3284,11 @@
       <w:pPr>
         <w:pStyle w:val="ListBullet"/>
         <w:spacing w:before="40" w:after="100" w:line="276" w:lineRule="auto"/>
+        <w:ind w:left="504"/>
       </w:pPr>
       <w:r>
         <w:rPr>
+          <w:rFonts w:ascii="Arial" w:hAnsi="Arial"/>
           <w:b/>
           <w:color w:val="0F172A"/>
         </w:rPr>
@@ -3053,6 +3296,7 @@
       </w:r>
       <w:r>
         <w:rPr>
+          <w:rFonts w:ascii="Arial" w:hAnsi="Arial"/>
           <w:color w:val="1E293B"/>
         </w:rPr>
         <w:t xml:space="preserve"> : Pour transformer cette ambition en victoires financières, l'approche est structurée immédiatement selon 4 actions de frappe :</w:t>
@@ -3062,9 +3306,11 @@
       <w:pPr>
         <w:pStyle w:val="ListBullet"/>
         <w:spacing w:before="40" w:after="100" w:line="276" w:lineRule="auto"/>
+        <w:ind w:left="504"/>
       </w:pPr>
       <w:r>
         <w:rPr>
+          <w:rFonts w:ascii="Arial" w:hAnsi="Arial"/>
           <w:b/>
           <w:color w:val="0F172A"/>
         </w:rPr>
@@ -3072,6 +3318,7 @@
       </w:r>
       <w:r>
         <w:rPr>
+          <w:rFonts w:ascii="Arial" w:hAnsi="Arial"/>
           <w:color w:val="1E293B"/>
         </w:rPr>
         <w:t xml:space="preserve"> : Création d'une Task-Force dédiée Nice-Monaco-Sophia pour verrouiller le dossier Gigafactory avant le 12 novembre 2026.</w:t>
@@ -3081,9 +3328,11 @@
       <w:pPr>
         <w:pStyle w:val="ListBullet"/>
         <w:spacing w:before="40" w:after="100" w:line="276" w:lineRule="auto"/>
+        <w:ind w:left="504"/>
       </w:pPr>
       <w:r>
         <w:rPr>
+          <w:rFonts w:ascii="Arial" w:hAnsi="Arial"/>
           <w:b/>
           <w:color w:val="0F172A"/>
         </w:rPr>
@@ -3091,6 +3340,7 @@
       </w:r>
       <w:r>
         <w:rPr>
+          <w:rFonts w:ascii="Arial" w:hAnsi="Arial"/>
           <w:color w:val="1E293B"/>
         </w:rPr>
         <w:t xml:space="preserve"> : Dépôt de dossiers sur Digital Europe (subventions à 50%-70% pour la cyber/IA) et Horizon Europe Cluster 3 (100% pour la sécurité urbaine).</w:t>
@@ -3100,9 +3350,11 @@
       <w:pPr>
         <w:pStyle w:val="ListBullet"/>
         <w:spacing w:before="40" w:after="100" w:line="276" w:lineRule="auto"/>
+        <w:ind w:left="504"/>
       </w:pPr>
       <w:r>
         <w:rPr>
+          <w:rFonts w:ascii="Arial" w:hAnsi="Arial"/>
           <w:b/>
           <w:color w:val="0F172A"/>
         </w:rPr>
@@ -3110,6 +3362,7 @@
       </w:r>
       <w:r>
         <w:rPr>
+          <w:rFonts w:ascii="Arial" w:hAnsi="Arial"/>
           <w:color w:val="1E293B"/>
         </w:rPr>
         <w:t xml:space="preserve"> : Sobriété énergétique, sécurité maximale et cas d'usage utiles conforme AI Act.</w:t>
@@ -3119,9 +3372,11 @@
       <w:pPr>
         <w:pStyle w:val="ListBullet"/>
         <w:spacing w:before="40" w:after="100" w:line="276" w:lineRule="auto"/>
+        <w:ind w:left="504"/>
       </w:pPr>
       <w:r>
         <w:rPr>
+          <w:rFonts w:ascii="Arial" w:hAnsi="Arial"/>
           <w:b/>
           <w:color w:val="0F172A"/>
         </w:rPr>
@@ -3129,6 +3384,7 @@
       </w:r>
       <w:r>
         <w:rPr>
+          <w:rFonts w:ascii="Arial" w:hAnsi="Arial"/>
           <w:color w:val="1E293B"/>
         </w:rPr>
         <w:t xml:space="preserve"> : Industrialiser 5 cas d'usage municipaux en 24 mois pour faire la preuve de la valeur et ancrer le récit politique de début de mandat.</w:t>
@@ -3141,6 +3397,7 @@
     </w:p>
     <w:p>
       <w:pPr>
+        <w:pStyle w:val="Heading1"/>
         <w:keepNext/>
         <w:spacing w:before="360" w:after="160"/>
       </w:pPr>
@@ -3158,9 +3415,11 @@
       <w:pPr>
         <w:pStyle w:val="ListBullet"/>
         <w:spacing w:before="40" w:after="100" w:line="276" w:lineRule="auto"/>
+        <w:ind w:left="504"/>
       </w:pPr>
       <w:r>
         <w:rPr>
+          <w:rFonts w:ascii="Arial" w:hAnsi="Arial"/>
           <w:b/>
           <w:color w:val="0F172A"/>
         </w:rPr>
@@ -3168,6 +3427,7 @@
       </w:r>
       <w:r>
         <w:rPr>
+          <w:rFonts w:ascii="Arial" w:hAnsi="Arial"/>
           <w:color w:val="1E293B"/>
         </w:rPr>
         <w:t xml:space="preserve"> : Le Pôle Ville concentre les applications de l'IA au service direct des Niçois, du cadre de vie et de la tranquillité publique. L'objectif est d'utiliser l'IA comme un accélérateur d'efficacité sur le terrain et de proximité municipale.</w:t>
@@ -3175,6 +3435,7 @@
     </w:p>
     <w:p>
       <w:pPr>
+        <w:pStyle w:val="Heading2"/>
         <w:keepNext/>
         <w:spacing w:before="280" w:after="120"/>
       </w:pPr>
@@ -3192,9 +3453,11 @@
       <w:pPr>
         <w:pStyle w:val="ListBullet"/>
         <w:spacing w:before="40" w:after="100" w:line="276" w:lineRule="auto"/>
+        <w:ind w:left="504"/>
       </w:pPr>
       <w:r>
         <w:rPr>
+          <w:rFonts w:ascii="Arial" w:hAnsi="Arial"/>
           <w:b/>
           <w:color w:val="0F172A"/>
         </w:rPr>
@@ -3202,12 +3465,14 @@
       </w:r>
       <w:r>
         <w:rPr>
+          <w:rFonts w:ascii="Arial" w:hAnsi="Arial"/>
           <w:color w:val="1E293B"/>
         </w:rPr>
         <w:t xml:space="preserve"> : Nice dispose du 1er CSU de France (4 300+ caméras). L'enjeu clé de la Vidéosurveillance Algorithmique (VSA - Art. 10 Loi JOP 2024 / Jurisprudence Conseil d'État 2026) est un </w:t>
       </w:r>
       <w:r>
         <w:rPr>
+          <w:rFonts w:ascii="Arial" w:hAnsi="Arial"/>
           <w:b/>
           <w:color w:val="0F172A"/>
         </w:rPr>
@@ -3215,6 +3480,7 @@
       </w:r>
       <w:r>
         <w:rPr>
+          <w:rFonts w:ascii="Arial" w:hAnsi="Arial"/>
           <w:color w:val="1E293B"/>
         </w:rPr>
         <w:t>.</w:t>
@@ -3224,9 +3490,11 @@
       <w:pPr>
         <w:pStyle w:val="ListBullet"/>
         <w:spacing w:before="40" w:after="100" w:line="276" w:lineRule="auto"/>
+        <w:ind w:left="504"/>
       </w:pPr>
       <w:r>
         <w:rPr>
+          <w:rFonts w:ascii="Arial" w:hAnsi="Arial"/>
           <w:b/>
           <w:color w:val="0F172A"/>
         </w:rPr>
@@ -3234,6 +3502,7 @@
       </w:r>
       <w:r>
         <w:rPr>
+          <w:rFonts w:ascii="Arial" w:hAnsi="Arial"/>
           <w:color w:val="1E293B"/>
         </w:rPr>
         <w:t xml:space="preserve"> : L'IA effectue le filtrage automatique des flux et ne remonte que les anomalies qualifiées (dépôts sauvages, intrusions, incivilités).</w:t>
@@ -3243,9 +3512,11 @@
       <w:pPr>
         <w:pStyle w:val="ListBullet"/>
         <w:spacing w:before="40" w:after="100" w:line="276" w:lineRule="auto"/>
+        <w:ind w:left="504"/>
       </w:pPr>
       <w:r>
         <w:rPr>
+          <w:rFonts w:ascii="Arial" w:hAnsi="Arial"/>
           <w:b/>
           <w:color w:val="0F172A"/>
         </w:rPr>
@@ -3253,6 +3524,7 @@
       </w:r>
       <w:r>
         <w:rPr>
+          <w:rFonts w:ascii="Arial" w:hAnsi="Arial"/>
           <w:color w:val="1E293B"/>
         </w:rPr>
         <w:t xml:space="preserve"> : Libération du temps des opérateurs pour réaffecter les effectifs en patrouilles de proximité physiques.</w:t>
@@ -3262,9 +3534,11 @@
       <w:pPr>
         <w:pStyle w:val="ListBullet"/>
         <w:spacing w:before="40" w:after="100" w:line="276" w:lineRule="auto"/>
+        <w:ind w:left="504"/>
       </w:pPr>
       <w:r>
         <w:rPr>
+          <w:rFonts w:ascii="Arial" w:hAnsi="Arial"/>
           <w:b/>
           <w:color w:val="0F172A"/>
         </w:rPr>
@@ -3272,6 +3546,7 @@
       </w:r>
       <w:r>
         <w:rPr>
+          <w:rFonts w:ascii="Arial" w:hAnsi="Arial"/>
           <w:color w:val="1E293B"/>
         </w:rPr>
         <w:t xml:space="preserve"> : Grâce à la géolocalisation en temps réel des patrouilles et équipages de la Police Municipale, le dispatching vers les Niçoises et Niçois dans le besoin se fait de manière ultra-rapide, ciblée et efficace au plus près des appels d'urgence.</w:t>
@@ -3281,9 +3556,11 @@
       <w:pPr>
         <w:pStyle w:val="ListBullet"/>
         <w:spacing w:before="40" w:after="100" w:line="276" w:lineRule="auto"/>
+        <w:ind w:left="504"/>
       </w:pPr>
       <w:r>
         <w:rPr>
+          <w:rFonts w:ascii="Arial" w:hAnsi="Arial"/>
           <w:b/>
           <w:color w:val="0F172A"/>
         </w:rPr>
@@ -3291,12 +3568,14 @@
       </w:r>
       <w:r>
         <w:rPr>
+          <w:rFonts w:ascii="Arial" w:hAnsi="Arial"/>
           <w:color w:val="1E293B"/>
         </w:rPr>
         <w:t xml:space="preserve"> : Baisse de </w:t>
       </w:r>
       <w:r>
         <w:rPr>
+          <w:rFonts w:ascii="Arial" w:hAnsi="Arial"/>
           <w:b/>
           <w:color w:val="0F172A"/>
         </w:rPr>
@@ -3304,12 +3583,14 @@
       </w:r>
       <w:r>
         <w:rPr>
+          <w:rFonts w:ascii="Arial" w:hAnsi="Arial"/>
           <w:color w:val="1E293B"/>
         </w:rPr>
         <w:t xml:space="preserve"> par la fin de l'impunité et la réduction du délai d'intervention de la PM à </w:t>
       </w:r>
       <w:r>
         <w:rPr>
+          <w:rFonts w:ascii="Arial" w:hAnsi="Arial"/>
           <w:b/>
           <w:color w:val="0F172A"/>
         </w:rPr>
@@ -3317,6 +3598,7 @@
       </w:r>
       <w:r>
         <w:rPr>
+          <w:rFonts w:ascii="Arial" w:hAnsi="Arial"/>
           <w:color w:val="1E293B"/>
         </w:rPr>
         <w:t>.</w:t>
@@ -3324,6 +3606,7 @@
     </w:p>
     <w:p>
       <w:pPr>
+        <w:pStyle w:val="Heading2"/>
         <w:keepNext/>
         <w:spacing w:before="280" w:after="120"/>
       </w:pPr>
@@ -3341,9 +3624,11 @@
       <w:pPr>
         <w:pStyle w:val="ListBullet"/>
         <w:spacing w:before="40" w:after="100" w:line="276" w:lineRule="auto"/>
+        <w:ind w:left="504"/>
       </w:pPr>
       <w:r>
         <w:rPr>
+          <w:rFonts w:ascii="Arial" w:hAnsi="Arial"/>
           <w:b/>
           <w:color w:val="0F172A"/>
         </w:rPr>
@@ -3351,6 +3636,7 @@
       </w:r>
       <w:r>
         <w:rPr>
+          <w:rFonts w:ascii="Arial" w:hAnsi="Arial"/>
           <w:color w:val="1E293B"/>
         </w:rPr>
         <w:t xml:space="preserve"> : Mise en place d'un agent vocal souverain basé sur un modèle de langage local dédié aux citoyens niçois et aux aînés.</w:t>
@@ -3360,9 +3646,11 @@
       <w:pPr>
         <w:pStyle w:val="ListBullet"/>
         <w:spacing w:before="40" w:after="100" w:line="276" w:lineRule="auto"/>
+        <w:ind w:left="504"/>
       </w:pPr>
       <w:r>
         <w:rPr>
+          <w:rFonts w:ascii="Arial" w:hAnsi="Arial"/>
           <w:b/>
           <w:color w:val="0F172A"/>
         </w:rPr>
@@ -3370,12 +3658,14 @@
       </w:r>
       <w:r>
         <w:rPr>
+          <w:rFonts w:ascii="Arial" w:hAnsi="Arial"/>
           <w:color w:val="1E293B"/>
         </w:rPr>
         <w:t xml:space="preserve"> : Prise en charge immédiate des </w:t>
       </w:r>
       <w:r>
         <w:rPr>
+          <w:rFonts w:ascii="Arial" w:hAnsi="Arial"/>
           <w:b/>
           <w:color w:val="0F172A"/>
         </w:rPr>
@@ -3383,12 +3673,14 @@
       </w:r>
       <w:r>
         <w:rPr>
+          <w:rFonts w:ascii="Arial" w:hAnsi="Arial"/>
           <w:color w:val="1E293B"/>
         </w:rPr>
         <w:t xml:space="preserve">, des </w:t>
       </w:r>
       <w:r>
         <w:rPr>
+          <w:rFonts w:ascii="Arial" w:hAnsi="Arial"/>
           <w:b/>
           <w:color w:val="0F172A"/>
         </w:rPr>
@@ -3396,6 +3688,7 @@
       </w:r>
       <w:r>
         <w:rPr>
+          <w:rFonts w:ascii="Arial" w:hAnsi="Arial"/>
           <w:color w:val="1E293B"/>
         </w:rPr>
         <w:t xml:space="preserve"> et des démarches administratives.</w:t>
@@ -3405,9 +3698,11 @@
       <w:pPr>
         <w:pStyle w:val="ListBullet"/>
         <w:spacing w:before="40" w:after="100" w:line="276" w:lineRule="auto"/>
+        <w:ind w:left="504"/>
       </w:pPr>
       <w:r>
         <w:rPr>
+          <w:rFonts w:ascii="Arial" w:hAnsi="Arial"/>
           <w:b/>
           <w:color w:val="0F172A"/>
         </w:rPr>
@@ -3415,6 +3710,7 @@
       </w:r>
       <w:r>
         <w:rPr>
+          <w:rFonts w:ascii="Arial" w:hAnsi="Arial"/>
           <w:color w:val="1E293B"/>
         </w:rPr>
         <w:t xml:space="preserve"> : Traitement instantané de 40 % des appels récurrents, libérant les agents humains pour l'accompagnement social personnalisé et les urgences graves.</w:t>
@@ -3422,6 +3718,7 @@
     </w:p>
     <w:p>
       <w:pPr>
+        <w:pStyle w:val="Heading2"/>
         <w:keepNext/>
         <w:spacing w:before="280" w:after="120"/>
       </w:pPr>
@@ -3439,9 +3736,11 @@
       <w:pPr>
         <w:pStyle w:val="ListBullet"/>
         <w:spacing w:before="40" w:after="100" w:line="276" w:lineRule="auto"/>
+        <w:ind w:left="504"/>
       </w:pPr>
       <w:r>
         <w:rPr>
+          <w:rFonts w:ascii="Arial" w:hAnsi="Arial"/>
           <w:b/>
           <w:color w:val="0F172A"/>
         </w:rPr>
@@ -3449,6 +3748,7 @@
       </w:r>
       <w:r>
         <w:rPr>
+          <w:rFonts w:ascii="Arial" w:hAnsi="Arial"/>
           <w:color w:val="1E293B"/>
         </w:rPr>
         <w:t xml:space="preserve"> : Caméras embarquées VSA sur les véhicules de propreté urbaine pour cartographier en temps réel l'état des rues.</w:t>
@@ -3458,9 +3758,11 @@
       <w:pPr>
         <w:pStyle w:val="ListBullet"/>
         <w:spacing w:before="40" w:after="100" w:line="276" w:lineRule="auto"/>
+        <w:ind w:left="504"/>
       </w:pPr>
       <w:r>
         <w:rPr>
+          <w:rFonts w:ascii="Arial" w:hAnsi="Arial"/>
           <w:b/>
           <w:color w:val="0F172A"/>
         </w:rPr>
@@ -3468,6 +3770,7 @@
       </w:r>
       <w:r>
         <w:rPr>
+          <w:rFonts w:ascii="Arial" w:hAnsi="Arial"/>
           <w:color w:val="1E293B"/>
         </w:rPr>
         <w:t xml:space="preserve"> : Identification des corbeilles débordantes, graffitis et dépôts sauvages.</w:t>
@@ -3477,9 +3780,11 @@
       <w:pPr>
         <w:pStyle w:val="ListBullet"/>
         <w:spacing w:before="40" w:after="100" w:line="276" w:lineRule="auto"/>
+        <w:ind w:left="504"/>
       </w:pPr>
       <w:r>
         <w:rPr>
+          <w:rFonts w:ascii="Arial" w:hAnsi="Arial"/>
           <w:b/>
           <w:color w:val="0F172A"/>
         </w:rPr>
@@ -3487,6 +3792,7 @@
       </w:r>
       <w:r>
         <w:rPr>
+          <w:rFonts w:ascii="Arial" w:hAnsi="Arial"/>
           <w:color w:val="1E293B"/>
         </w:rPr>
         <w:t xml:space="preserve"> : Routage optimisé des bennes réduisant la consommation de carburant de 18 % et garantissant la résorption des anomalies sous 6 heures.</w:t>
@@ -3494,6 +3800,7 @@
     </w:p>
     <w:p>
       <w:pPr>
+        <w:pStyle w:val="Heading2"/>
         <w:keepNext/>
         <w:spacing w:before="280" w:after="120"/>
       </w:pPr>
@@ -3511,9 +3818,11 @@
       <w:pPr>
         <w:pStyle w:val="ListBullet"/>
         <w:spacing w:before="40" w:after="100" w:line="276" w:lineRule="auto"/>
+        <w:ind w:left="504"/>
       </w:pPr>
       <w:r>
         <w:rPr>
+          <w:rFonts w:ascii="Arial" w:hAnsi="Arial"/>
           <w:b/>
           <w:color w:val="0F172A"/>
         </w:rPr>
@@ -3521,12 +3830,14 @@
       </w:r>
       <w:r>
         <w:rPr>
+          <w:rFonts w:ascii="Arial" w:hAnsi="Arial"/>
           <w:color w:val="1E293B"/>
         </w:rPr>
         <w:t xml:space="preserve"> : Déploiement de la plateforme de démocratie participative augmentée par l'</w:t>
       </w:r>
       <w:r>
         <w:rPr>
+          <w:rFonts w:ascii="Arial" w:hAnsi="Arial"/>
           <w:b/>
           <w:color w:val="0F172A"/>
         </w:rPr>
@@ -3534,6 +3845,7 @@
       </w:r>
       <w:r>
         <w:rPr>
+          <w:rFonts w:ascii="Arial" w:hAnsi="Arial"/>
           <w:color w:val="1E293B"/>
         </w:rPr>
         <w:t xml:space="preserve"> pour consulter les Niçois quartier par quartier.</w:t>
@@ -3543,9 +3855,11 @@
       <w:pPr>
         <w:pStyle w:val="ListBullet"/>
         <w:spacing w:before="40" w:after="100" w:line="276" w:lineRule="auto"/>
+        <w:ind w:left="504"/>
       </w:pPr>
       <w:r>
         <w:rPr>
+          <w:rFonts w:ascii="Arial" w:hAnsi="Arial"/>
           <w:b/>
           <w:color w:val="0F172A"/>
         </w:rPr>
@@ -3553,6 +3867,7 @@
       </w:r>
       <w:r>
         <w:rPr>
+          <w:rFonts w:ascii="Arial" w:hAnsi="Arial"/>
           <w:color w:val="1E293B"/>
         </w:rPr>
         <w:t xml:space="preserve"> : Analyse sémantique continue des attentes des habitants (Vieux-Nice, Ariane, Moulins, Cimiez, Riquier, etc.).</w:t>
@@ -3562,9 +3877,11 @@
       <w:pPr>
         <w:pStyle w:val="ListBullet"/>
         <w:spacing w:before="40" w:after="100" w:line="276" w:lineRule="auto"/>
+        <w:ind w:left="504"/>
       </w:pPr>
       <w:r>
         <w:rPr>
+          <w:rFonts w:ascii="Arial" w:hAnsi="Arial"/>
           <w:b/>
           <w:color w:val="0F172A"/>
         </w:rPr>
@@ -3572,6 +3889,7 @@
       </w:r>
       <w:r>
         <w:rPr>
+          <w:rFonts w:ascii="Arial" w:hAnsi="Arial"/>
           <w:color w:val="1E293B"/>
         </w:rPr>
         <w:t xml:space="preserve"> : Ingestion de 5 000 contributions citoyennes en 48 heures pour dégager les consensus sur la piétonnisation et la sécurité.</w:t>
@@ -3581,9 +3899,11 @@
       <w:pPr>
         <w:pStyle w:val="ListBullet"/>
         <w:spacing w:before="40" w:after="100" w:line="276" w:lineRule="auto"/>
+        <w:ind w:left="504"/>
       </w:pPr>
       <w:r>
         <w:rPr>
+          <w:rFonts w:ascii="Arial" w:hAnsi="Arial"/>
           <w:b/>
           <w:color w:val="0F172A"/>
         </w:rPr>
@@ -3591,6 +3911,7 @@
       </w:r>
       <w:r>
         <w:rPr>
+          <w:rFonts w:ascii="Arial" w:hAnsi="Arial"/>
           <w:color w:val="1E293B"/>
         </w:rPr>
         <w:t xml:space="preserve"> : Restitution instantanée et cartographiée des priorités d'investissement par quartier, sans filtre bureaucratique.</w:t>
@@ -3603,6 +3924,7 @@
     </w:p>
     <w:p>
       <w:pPr>
+        <w:pStyle w:val="Heading1"/>
         <w:keepNext/>
         <w:spacing w:before="360" w:after="160"/>
       </w:pPr>
@@ -3618,6 +3940,7 @@
     </w:p>
     <w:p>
       <w:pPr>
+        <w:pStyle w:val="Heading2"/>
         <w:keepNext/>
         <w:spacing w:before="280" w:after="120"/>
       </w:pPr>
@@ -3635,9 +3958,11 @@
       <w:pPr>
         <w:pStyle w:val="ListBullet"/>
         <w:spacing w:before="40" w:after="100" w:line="276" w:lineRule="auto"/>
+        <w:ind w:left="504"/>
       </w:pPr>
       <w:r>
         <w:rPr>
+          <w:rFonts w:ascii="Arial" w:hAnsi="Arial"/>
           <w:b/>
           <w:color w:val="0F172A"/>
         </w:rPr>
@@ -3645,12 +3970,14 @@
       </w:r>
       <w:r>
         <w:rPr>
+          <w:rFonts w:ascii="Arial" w:hAnsi="Arial"/>
           <w:color w:val="1E293B"/>
         </w:rPr>
         <w:t xml:space="preserve"> : Analyse sémantique à 100 % des factures, devis et BPU sur les </w:t>
       </w:r>
       <w:r>
         <w:rPr>
+          <w:rFonts w:ascii="Arial" w:hAnsi="Arial"/>
           <w:b/>
           <w:color w:val="0F172A"/>
         </w:rPr>
@@ -3658,6 +3985,7 @@
       </w:r>
       <w:r>
         <w:rPr>
+          <w:rFonts w:ascii="Arial" w:hAnsi="Arial"/>
           <w:color w:val="1E293B"/>
         </w:rPr>
         <w:t>.</w:t>
@@ -3667,9 +3995,11 @@
       <w:pPr>
         <w:pStyle w:val="ListBullet"/>
         <w:spacing w:before="40" w:after="100" w:line="276" w:lineRule="auto"/>
+        <w:ind w:left="504"/>
       </w:pPr>
       <w:r>
         <w:rPr>
+          <w:rFonts w:ascii="Arial" w:hAnsi="Arial"/>
           <w:b/>
           <w:color w:val="0F172A"/>
         </w:rPr>
@@ -3677,12 +4007,14 @@
       </w:r>
       <w:r>
         <w:rPr>
+          <w:rFonts w:ascii="Arial" w:hAnsi="Arial"/>
           <w:color w:val="1E293B"/>
         </w:rPr>
         <w:t xml:space="preserve"> : Filtrage automatisé de 0,5 % à 2,0 % de doublons, erreurs de facturation et dépassements de bordereaux (Benchmark DGFiP). Sur 300 M€, 0,83 % d'erreurs détectées génère </w:t>
       </w:r>
       <w:r>
         <w:rPr>
+          <w:rFonts w:ascii="Arial" w:hAnsi="Arial"/>
           <w:b/>
           <w:color w:val="0F172A"/>
         </w:rPr>
@@ -3690,6 +4022,7 @@
       </w:r>
       <w:r>
         <w:rPr>
+          <w:rFonts w:ascii="Arial" w:hAnsi="Arial"/>
           <w:color w:val="1E293B"/>
         </w:rPr>
         <w:t xml:space="preserve"> pour le budget métropolitain.</w:t>
@@ -3697,6 +4030,7 @@
     </w:p>
     <w:p>
       <w:pPr>
+        <w:pStyle w:val="Heading2"/>
         <w:keepNext/>
         <w:spacing w:before="280" w:after="120"/>
       </w:pPr>
@@ -3714,9 +4048,11 @@
       <w:pPr>
         <w:pStyle w:val="ListBullet"/>
         <w:spacing w:before="40" w:after="100" w:line="276" w:lineRule="auto"/>
+        <w:ind w:left="504"/>
       </w:pPr>
       <w:r>
         <w:rPr>
+          <w:rFonts w:ascii="Arial" w:hAnsi="Arial"/>
           <w:b/>
           <w:color w:val="0F172A"/>
         </w:rPr>
@@ -3724,6 +4060,7 @@
       </w:r>
       <w:r>
         <w:rPr>
+          <w:rFonts w:ascii="Arial" w:hAnsi="Arial"/>
           <w:color w:val="1E293B"/>
         </w:rPr>
         <w:t xml:space="preserve"> : SOC métropolitain 24/7 armé d'agents IA autonomes et isolation étanche (Air-Gap) du CSU.</w:t>
@@ -3733,9 +4070,11 @@
       <w:pPr>
         <w:pStyle w:val="ListBullet"/>
         <w:spacing w:before="40" w:after="100" w:line="276" w:lineRule="auto"/>
+        <w:ind w:left="504"/>
       </w:pPr>
       <w:r>
         <w:rPr>
+          <w:rFonts w:ascii="Arial" w:hAnsi="Arial"/>
           <w:b/>
           <w:color w:val="0F172A"/>
         </w:rPr>
@@ -3743,12 +4082,14 @@
       </w:r>
       <w:r>
         <w:rPr>
+          <w:rFonts w:ascii="Arial" w:hAnsi="Arial"/>
           <w:color w:val="1E293B"/>
         </w:rPr>
         <w:t xml:space="preserve"> : Évitement des coûts directs et indirects d'une crise de ransomware (interruption des services, reconstruction du SI, audits d'urgence). Benchmark des villes touchées (Marseille, Lille, Caen) : </w:t>
       </w:r>
       <w:r>
         <w:rPr>
+          <w:rFonts w:ascii="Arial" w:hAnsi="Arial"/>
           <w:b/>
           <w:color w:val="0F172A"/>
         </w:rPr>
@@ -3756,6 +4097,7 @@
       </w:r>
       <w:r>
         <w:rPr>
+          <w:rFonts w:ascii="Arial" w:hAnsi="Arial"/>
           <w:color w:val="1E293B"/>
         </w:rPr>
         <w:t>.</w:t>
@@ -3763,6 +4105,7 @@
     </w:p>
     <w:p>
       <w:pPr>
+        <w:pStyle w:val="Heading2"/>
         <w:keepNext/>
         <w:spacing w:before="280" w:after="120"/>
       </w:pPr>
@@ -3780,9 +4123,11 @@
       <w:pPr>
         <w:pStyle w:val="ListBullet"/>
         <w:spacing w:before="40" w:after="100" w:line="276" w:lineRule="auto"/>
+        <w:ind w:left="504"/>
       </w:pPr>
       <w:r>
         <w:rPr>
+          <w:rFonts w:ascii="Arial" w:hAnsi="Arial"/>
           <w:b/>
           <w:color w:val="0F172A"/>
         </w:rPr>
@@ -3790,6 +4135,7 @@
       </w:r>
       <w:r>
         <w:rPr>
+          <w:rFonts w:ascii="Arial" w:hAnsi="Arial"/>
           <w:color w:val="1E293B"/>
         </w:rPr>
         <w:t xml:space="preserve"> : Migration souveraine vers Monaco Cloud (1er Cloud d'État UE certifié AMSN).</w:t>
@@ -3799,9 +4145,11 @@
       <w:pPr>
         <w:pStyle w:val="ListBullet"/>
         <w:spacing w:before="40" w:after="100" w:line="276" w:lineRule="auto"/>
+        <w:ind w:left="504"/>
       </w:pPr>
       <w:r>
         <w:rPr>
+          <w:rFonts w:ascii="Arial" w:hAnsi="Arial"/>
           <w:b/>
           <w:color w:val="0F172A"/>
         </w:rPr>
@@ -3809,12 +4157,14 @@
       </w:r>
       <w:r>
         <w:rPr>
+          <w:rFonts w:ascii="Arial" w:hAnsi="Arial"/>
           <w:color w:val="1E293B"/>
         </w:rPr>
         <w:t xml:space="preserve"> : Réduction directe des coûts de fonctionnement IT (OPEX) de 1,5 M€ à 2,8 M€ / an + </w:t>
       </w:r>
       <w:r>
         <w:rPr>
+          <w:rFonts w:ascii="Arial" w:hAnsi="Arial"/>
           <w:b/>
           <w:color w:val="0F172A"/>
         </w:rPr>
@@ -3822,6 +4172,7 @@
       </w:r>
       <w:r>
         <w:rPr>
+          <w:rFonts w:ascii="Arial" w:hAnsi="Arial"/>
           <w:color w:val="1E293B"/>
         </w:rPr>
         <w:t xml:space="preserve"> par non-construction d’un datacenter métropolitain propre.</w:t>
@@ -3834,6 +4185,7 @@
     </w:p>
     <w:p>
       <w:pPr>
+        <w:pStyle w:val="Heading1"/>
         <w:keepNext/>
         <w:spacing w:before="360" w:after="160"/>
       </w:pPr>
@@ -3849,6 +4201,7 @@
     </w:p>
     <w:p>
       <w:pPr>
+        <w:pStyle w:val="Heading2"/>
         <w:keepNext/>
         <w:spacing w:before="280" w:after="120"/>
       </w:pPr>
@@ -3866,9 +4219,11 @@
       <w:pPr>
         <w:pStyle w:val="ListBullet"/>
         <w:spacing w:before="40" w:after="100" w:line="276" w:lineRule="auto"/>
+        <w:ind w:left="504"/>
       </w:pPr>
       <w:r>
         <w:rPr>
+          <w:rFonts w:ascii="Arial" w:hAnsi="Arial"/>
           <w:b/>
           <w:color w:val="0F172A"/>
         </w:rPr>
@@ -3876,12 +4231,14 @@
       </w:r>
       <w:r>
         <w:rPr>
+          <w:rFonts w:ascii="Arial" w:hAnsi="Arial"/>
           <w:color w:val="1E293B"/>
         </w:rPr>
         <w:t xml:space="preserve"> : La collaboration binationale avec la Principauté de Monaco n'est pas un simple accord d'affichage, mais le </w:t>
       </w:r>
       <w:r>
         <w:rPr>
+          <w:rFonts w:ascii="Arial" w:hAnsi="Arial"/>
           <w:b/>
           <w:color w:val="0F172A"/>
         </w:rPr>
@@ -3889,6 +4246,7 @@
       </w:r>
       <w:r>
         <w:rPr>
+          <w:rFonts w:ascii="Arial" w:hAnsi="Arial"/>
           <w:color w:val="1E293B"/>
         </w:rPr>
         <w:t>.</w:t>
@@ -3898,9 +4256,11 @@
       <w:pPr>
         <w:pStyle w:val="ListBullet"/>
         <w:spacing w:before="40" w:after="100" w:line="276" w:lineRule="auto"/>
+        <w:ind w:left="504"/>
       </w:pPr>
       <w:r>
         <w:rPr>
+          <w:rFonts w:ascii="Arial" w:hAnsi="Arial"/>
           <w:b/>
           <w:color w:val="0F172A"/>
         </w:rPr>
@@ -3908,6 +4268,7 @@
       </w:r>
       <w:r>
         <w:rPr>
+          <w:rFonts w:ascii="Arial" w:hAnsi="Arial"/>
           <w:color w:val="1E293B"/>
         </w:rPr>
         <w:t xml:space="preserve"> : Le règlement EuroHPC JU (Lot 1 - 500 M€) et le programme Digital Europe accordent une bonification de note décisive aux dossiers binationaux démontrant une interopérabilité transfrontalière.</w:t>
@@ -3917,9 +4278,11 @@
       <w:pPr>
         <w:pStyle w:val="ListBullet"/>
         <w:spacing w:before="40" w:after="100" w:line="276" w:lineRule="auto"/>
+        <w:ind w:left="504"/>
       </w:pPr>
       <w:r>
         <w:rPr>
+          <w:rFonts w:ascii="Arial" w:hAnsi="Arial"/>
           <w:b/>
           <w:color w:val="0F172A"/>
         </w:rPr>
@@ -3927,6 +4290,7 @@
       </w:r>
       <w:r>
         <w:rPr>
+          <w:rFonts w:ascii="Arial" w:hAnsi="Arial"/>
           <w:color w:val="1E293B"/>
         </w:rPr>
         <w:t xml:space="preserve"> : L'apport de fonds souverains monégasques (300 M€) sécurise le co-financement privé/public exigé par l'UE pour valider les 500 M€ de subvention directe.</w:t>
@@ -3934,6 +4298,7 @@
     </w:p>
     <w:p>
       <w:pPr>
+        <w:pStyle w:val="Heading2"/>
         <w:keepNext/>
         <w:spacing w:before="280" w:after="120"/>
       </w:pPr>
@@ -3951,9 +4316,11 @@
       <w:pPr>
         <w:pStyle w:val="ListBullet"/>
         <w:spacing w:before="40" w:after="100" w:line="276" w:lineRule="auto"/>
+        <w:ind w:left="504"/>
       </w:pPr>
       <w:r>
         <w:rPr>
+          <w:rFonts w:ascii="Arial" w:hAnsi="Arial"/>
           <w:b/>
           <w:color w:val="0F172A"/>
         </w:rPr>
@@ -3961,12 +4328,14 @@
       </w:r>
       <w:r>
         <w:rPr>
+          <w:rFonts w:ascii="Arial" w:hAnsi="Arial"/>
           <w:color w:val="1E293B"/>
         </w:rPr>
         <w:t xml:space="preserve"> : Nice s'impose comme le </w:t>
       </w:r>
       <w:r>
         <w:rPr>
+          <w:rFonts w:ascii="Arial" w:hAnsi="Arial"/>
           <w:b/>
           <w:color w:val="0F172A"/>
         </w:rPr>
@@ -3974,6 +4343,7 @@
       </w:r>
       <w:r>
         <w:rPr>
+          <w:rFonts w:ascii="Arial" w:hAnsi="Arial"/>
           <w:color w:val="1E293B"/>
         </w:rPr>
         <w:t xml:space="preserve"> en matière de conformité et de labellisation AI Act.</w:t>
@@ -3983,9 +4353,11 @@
       <w:pPr>
         <w:pStyle w:val="ListBullet"/>
         <w:spacing w:before="40" w:after="100" w:line="276" w:lineRule="auto"/>
+        <w:ind w:left="504"/>
       </w:pPr>
       <w:r>
         <w:rPr>
+          <w:rFonts w:ascii="Arial" w:hAnsi="Arial"/>
           <w:b/>
           <w:color w:val="0F172A"/>
         </w:rPr>
@@ -3993,6 +4365,7 @@
       </w:r>
       <w:r>
         <w:rPr>
+          <w:rFonts w:ascii="Arial" w:hAnsi="Arial"/>
           <w:color w:val="1E293B"/>
         </w:rPr>
         <w:t xml:space="preserve"> : Accompagnement des entreprises et collectivités nationales pour valider leurs algorithmes selon le Règlement (UE) 2024/1689.</w:t>
@@ -4002,9 +4375,11 @@
       <w:pPr>
         <w:pStyle w:val="ListBullet"/>
         <w:spacing w:before="40" w:after="100" w:line="276" w:lineRule="auto"/>
+        <w:ind w:left="504"/>
       </w:pPr>
       <w:r>
         <w:rPr>
+          <w:rFonts w:ascii="Arial" w:hAnsi="Arial"/>
           <w:b/>
           <w:color w:val="0F172A"/>
         </w:rPr>
@@ -4012,6 +4387,7 @@
       </w:r>
       <w:r>
         <w:rPr>
+          <w:rFonts w:ascii="Arial" w:hAnsi="Arial"/>
           <w:color w:val="1E293B"/>
         </w:rPr>
         <w:t xml:space="preserve"> : Garantie de sécurité juridique totale pour les PME innovantes.</w:t>
@@ -4024,6 +4400,7 @@
     </w:p>
     <w:p>
       <w:pPr>
+        <w:pStyle w:val="Heading1"/>
         <w:keepNext/>
         <w:spacing w:before="360" w:after="160"/>
       </w:pPr>
@@ -4039,6 +4416,7 @@
     </w:p>
     <w:p>
       <w:pPr>
+        <w:pStyle w:val="Heading2"/>
         <w:keepNext/>
         <w:spacing w:before="280" w:after="120"/>
       </w:pPr>
@@ -4056,9 +4434,11 @@
       <w:pPr>
         <w:pStyle w:val="ListBullet"/>
         <w:spacing w:before="40" w:after="100" w:line="276" w:lineRule="auto"/>
+        <w:ind w:left="504"/>
       </w:pPr>
       <w:r>
         <w:rPr>
+          <w:rFonts w:ascii="Arial" w:hAnsi="Arial"/>
           <w:b/>
           <w:color w:val="0F172A"/>
         </w:rPr>
@@ -4066,12 +4446,14 @@
       </w:r>
       <w:r>
         <w:rPr>
+          <w:rFonts w:ascii="Arial" w:hAnsi="Arial"/>
           <w:color w:val="1E293B"/>
         </w:rPr>
         <w:t xml:space="preserve"> : </w:t>
       </w:r>
       <w:r>
         <w:rPr>
+          <w:rFonts w:ascii="Arial" w:hAnsi="Arial"/>
           <w:b/>
           <w:color w:val="0F172A"/>
         </w:rPr>
@@ -4079,6 +4461,7 @@
       </w:r>
       <w:r>
         <w:rPr>
+          <w:rFonts w:ascii="Arial" w:hAnsi="Arial"/>
           <w:color w:val="1E293B"/>
         </w:rPr>
         <w:t>, assurant l'arbitrage politique au plus haut niveau et le leadership face aux instances régionales et européennes.</w:t>
@@ -4088,9 +4471,11 @@
       <w:pPr>
         <w:pStyle w:val="ListBullet"/>
         <w:spacing w:before="40" w:after="100" w:line="276" w:lineRule="auto"/>
+        <w:ind w:left="504"/>
       </w:pPr>
       <w:r>
         <w:rPr>
+          <w:rFonts w:ascii="Arial" w:hAnsi="Arial"/>
           <w:b/>
           <w:color w:val="0F172A"/>
         </w:rPr>
@@ -4098,12 +4483,14 @@
       </w:r>
       <w:r>
         <w:rPr>
+          <w:rFonts w:ascii="Arial" w:hAnsi="Arial"/>
           <w:color w:val="1E293B"/>
         </w:rPr>
         <w:t xml:space="preserve"> : </w:t>
       </w:r>
       <w:r>
         <w:rPr>
+          <w:rFonts w:ascii="Arial" w:hAnsi="Arial"/>
           <w:b/>
           <w:color w:val="0F172A"/>
         </w:rPr>
@@ -4111,12 +4498,14 @@
       </w:r>
       <w:r>
         <w:rPr>
+          <w:rFonts w:ascii="Arial" w:hAnsi="Arial"/>
           <w:color w:val="1E293B"/>
         </w:rPr>
         <w:t xml:space="preserve">, Senior AI Architect. Engagement à </w:t>
       </w:r>
       <w:r>
         <w:rPr>
+          <w:rFonts w:ascii="Arial" w:hAnsi="Arial"/>
           <w:b/>
           <w:color w:val="0F172A"/>
         </w:rPr>
@@ -4124,12 +4513,14 @@
       </w:r>
       <w:r>
         <w:rPr>
+          <w:rFonts w:ascii="Arial" w:hAnsi="Arial"/>
           <w:color w:val="1E293B"/>
         </w:rPr>
         <w:t xml:space="preserve">, réduisant la ligne AMO à </w:t>
       </w:r>
       <w:r>
         <w:rPr>
+          <w:rFonts w:ascii="Arial" w:hAnsi="Arial"/>
           <w:b/>
           <w:color w:val="0F172A"/>
         </w:rPr>
@@ -4137,12 +4528,14 @@
       </w:r>
       <w:r>
         <w:rPr>
+          <w:rFonts w:ascii="Arial" w:hAnsi="Arial"/>
           <w:color w:val="1E293B"/>
         </w:rPr>
         <w:t xml:space="preserve"> et amenant le budget global à </w:t>
       </w:r>
       <w:r>
         <w:rPr>
+          <w:rFonts w:ascii="Arial" w:hAnsi="Arial"/>
           <w:b/>
           <w:color w:val="0F172A"/>
         </w:rPr>
@@ -4150,12 +4543,14 @@
       </w:r>
       <w:r>
         <w:rPr>
+          <w:rFonts w:ascii="Arial" w:hAnsi="Arial"/>
           <w:color w:val="1E293B"/>
         </w:rPr>
         <w:t xml:space="preserve"> (reste à charge net métropolitain : </w:t>
       </w:r>
       <w:r>
         <w:rPr>
+          <w:rFonts w:ascii="Arial" w:hAnsi="Arial"/>
           <w:b/>
           <w:color w:val="0F172A"/>
         </w:rPr>
@@ -4163,6 +4558,7 @@
       </w:r>
       <w:r>
         <w:rPr>
+          <w:rFonts w:ascii="Arial" w:hAnsi="Arial"/>
           <w:color w:val="1E293B"/>
         </w:rPr>
         <w:t>).</w:t>
@@ -4170,6 +4566,7 @@
     </w:p>
     <w:p>
       <w:pPr>
+        <w:pStyle w:val="Heading2"/>
         <w:keepNext/>
         <w:spacing w:before="280" w:after="120"/>
       </w:pPr>
@@ -4207,6 +4604,7 @@
             </w:pPr>
             <w:r>
               <w:rPr>
+                <w:rFonts w:ascii="Arial" w:hAnsi="Arial"/>
                 <w:b/>
                 <w:color w:val="FFFFFF"/>
                 <w:sz w:val="17"/>
@@ -4226,6 +4624,7 @@
             </w:pPr>
             <w:r>
               <w:rPr>
+                <w:rFonts w:ascii="Arial" w:hAnsi="Arial"/>
                 <w:b/>
                 <w:color w:val="FFFFFF"/>
                 <w:sz w:val="17"/>
@@ -4245,6 +4644,7 @@
             </w:pPr>
             <w:r>
               <w:rPr>
+                <w:rFonts w:ascii="Arial" w:hAnsi="Arial"/>
                 <w:b/>
                 <w:color w:val="FFFFFF"/>
                 <w:sz w:val="17"/>
@@ -4264,6 +4664,7 @@
             </w:pPr>
             <w:r>
               <w:rPr>
+                <w:rFonts w:ascii="Arial" w:hAnsi="Arial"/>
                 <w:b/>
                 <w:color w:val="FFFFFF"/>
                 <w:sz w:val="17"/>
@@ -4285,6 +4686,7 @@
             </w:pPr>
             <w:r>
               <w:rPr>
+                <w:rFonts w:ascii="Arial" w:hAnsi="Arial"/>
                 <w:color w:val="1E293B"/>
                 <w:sz w:val="16"/>
               </w:rPr>
@@ -4303,6 +4705,7 @@
             </w:pPr>
             <w:r>
               <w:rPr>
+                <w:rFonts w:ascii="Arial" w:hAnsi="Arial"/>
                 <w:color w:val="1E293B"/>
                 <w:sz w:val="16"/>
               </w:rPr>
@@ -4321,6 +4724,7 @@
             </w:pPr>
             <w:r>
               <w:rPr>
+                <w:rFonts w:ascii="Arial" w:hAnsi="Arial"/>
                 <w:color w:val="1E293B"/>
                 <w:sz w:val="16"/>
               </w:rPr>
@@ -4339,6 +4743,7 @@
             </w:pPr>
             <w:r>
               <w:rPr>
+                <w:rFonts w:ascii="Arial" w:hAnsi="Arial"/>
                 <w:color w:val="1E293B"/>
                 <w:sz w:val="16"/>
               </w:rPr>
@@ -4359,6 +4764,7 @@
             </w:pPr>
             <w:r>
               <w:rPr>
+                <w:rFonts w:ascii="Arial" w:hAnsi="Arial"/>
                 <w:color w:val="1E293B"/>
                 <w:sz w:val="16"/>
               </w:rPr>
@@ -4377,6 +4783,7 @@
             </w:pPr>
             <w:r>
               <w:rPr>
+                <w:rFonts w:ascii="Arial" w:hAnsi="Arial"/>
                 <w:color w:val="1E293B"/>
                 <w:sz w:val="16"/>
               </w:rPr>
@@ -4395,6 +4802,7 @@
             </w:pPr>
             <w:r>
               <w:rPr>
+                <w:rFonts w:ascii="Arial" w:hAnsi="Arial"/>
                 <w:color w:val="1E293B"/>
                 <w:sz w:val="16"/>
               </w:rPr>
@@ -4413,6 +4821,7 @@
             </w:pPr>
             <w:r>
               <w:rPr>
+                <w:rFonts w:ascii="Arial" w:hAnsi="Arial"/>
                 <w:color w:val="1E293B"/>
                 <w:sz w:val="16"/>
               </w:rPr>
@@ -4433,6 +4842,7 @@
             </w:pPr>
             <w:r>
               <w:rPr>
+                <w:rFonts w:ascii="Arial" w:hAnsi="Arial"/>
                 <w:color w:val="1E293B"/>
                 <w:sz w:val="16"/>
               </w:rPr>
@@ -4451,6 +4861,7 @@
             </w:pPr>
             <w:r>
               <w:rPr>
+                <w:rFonts w:ascii="Arial" w:hAnsi="Arial"/>
                 <w:color w:val="1E293B"/>
                 <w:sz w:val="16"/>
               </w:rPr>
@@ -4469,6 +4880,7 @@
             </w:pPr>
             <w:r>
               <w:rPr>
+                <w:rFonts w:ascii="Arial" w:hAnsi="Arial"/>
                 <w:color w:val="1E293B"/>
                 <w:sz w:val="16"/>
               </w:rPr>
@@ -4487,6 +4899,7 @@
             </w:pPr>
             <w:r>
               <w:rPr>
+                <w:rFonts w:ascii="Arial" w:hAnsi="Arial"/>
                 <w:color w:val="1E293B"/>
                 <w:sz w:val="16"/>
               </w:rPr>
@@ -4507,6 +4920,7 @@
             </w:pPr>
             <w:r>
               <w:rPr>
+                <w:rFonts w:ascii="Arial" w:hAnsi="Arial"/>
                 <w:color w:val="1E293B"/>
                 <w:sz w:val="16"/>
               </w:rPr>
@@ -4525,6 +4939,7 @@
             </w:pPr>
             <w:r>
               <w:rPr>
+                <w:rFonts w:ascii="Arial" w:hAnsi="Arial"/>
                 <w:color w:val="1E293B"/>
                 <w:sz w:val="16"/>
               </w:rPr>
@@ -4543,6 +4958,7 @@
             </w:pPr>
             <w:r>
               <w:rPr>
+                <w:rFonts w:ascii="Arial" w:hAnsi="Arial"/>
                 <w:color w:val="1E293B"/>
                 <w:sz w:val="16"/>
               </w:rPr>
@@ -4561,6 +4977,7 @@
             </w:pPr>
             <w:r>
               <w:rPr>
+                <w:rFonts w:ascii="Arial" w:hAnsi="Arial"/>
                 <w:color w:val="1E293B"/>
                 <w:sz w:val="16"/>
               </w:rPr>
@@ -4581,6 +4998,7 @@
             </w:pPr>
             <w:r>
               <w:rPr>
+                <w:rFonts w:ascii="Arial" w:hAnsi="Arial"/>
                 <w:color w:val="1E293B"/>
                 <w:sz w:val="16"/>
               </w:rPr>
@@ -4599,6 +5017,7 @@
             </w:pPr>
             <w:r>
               <w:rPr>
+                <w:rFonts w:ascii="Arial" w:hAnsi="Arial"/>
                 <w:color w:val="1E293B"/>
                 <w:sz w:val="16"/>
               </w:rPr>
@@ -4617,6 +5036,7 @@
             </w:pPr>
             <w:r>
               <w:rPr>
+                <w:rFonts w:ascii="Arial" w:hAnsi="Arial"/>
                 <w:color w:val="1E293B"/>
                 <w:sz w:val="16"/>
               </w:rPr>
@@ -4635,6 +5055,7 @@
             </w:pPr>
             <w:r>
               <w:rPr>
+                <w:rFonts w:ascii="Arial" w:hAnsi="Arial"/>
                 <w:color w:val="1E293B"/>
                 <w:sz w:val="16"/>
               </w:rPr>
@@ -4655,6 +5076,7 @@
             </w:pPr>
             <w:r>
               <w:rPr>
+                <w:rFonts w:ascii="Arial" w:hAnsi="Arial"/>
                 <w:color w:val="1E293B"/>
                 <w:sz w:val="16"/>
               </w:rPr>
@@ -4673,6 +5095,7 @@
             </w:pPr>
             <w:r>
               <w:rPr>
+                <w:rFonts w:ascii="Arial" w:hAnsi="Arial"/>
                 <w:color w:val="1E293B"/>
                 <w:sz w:val="16"/>
               </w:rPr>
@@ -4691,6 +5114,7 @@
             </w:pPr>
             <w:r>
               <w:rPr>
+                <w:rFonts w:ascii="Arial" w:hAnsi="Arial"/>
                 <w:color w:val="1E293B"/>
                 <w:sz w:val="16"/>
               </w:rPr>
@@ -4709,6 +5133,7 @@
             </w:pPr>
             <w:r>
               <w:rPr>
+                <w:rFonts w:ascii="Arial" w:hAnsi="Arial"/>
                 <w:color w:val="1E293B"/>
                 <w:sz w:val="16"/>
               </w:rPr>
@@ -4729,6 +5154,7 @@
             </w:pPr>
             <w:r>
               <w:rPr>
+                <w:rFonts w:ascii="Arial" w:hAnsi="Arial"/>
                 <w:color w:val="1E293B"/>
                 <w:sz w:val="16"/>
               </w:rPr>
@@ -4747,6 +5173,7 @@
             </w:pPr>
             <w:r>
               <w:rPr>
+                <w:rFonts w:ascii="Arial" w:hAnsi="Arial"/>
                 <w:color w:val="1E293B"/>
                 <w:sz w:val="16"/>
               </w:rPr>
@@ -4765,6 +5192,7 @@
             </w:pPr>
             <w:r>
               <w:rPr>
+                <w:rFonts w:ascii="Arial" w:hAnsi="Arial"/>
                 <w:color w:val="1E293B"/>
                 <w:sz w:val="16"/>
               </w:rPr>
@@ -4783,6 +5211,7 @@
             </w:pPr>
             <w:r>
               <w:rPr>
+                <w:rFonts w:ascii="Arial" w:hAnsi="Arial"/>
                 <w:color w:val="1E293B"/>
                 <w:sz w:val="16"/>
               </w:rPr>
@@ -4803,6 +5232,7 @@
             </w:pPr>
             <w:r>
               <w:rPr>
+                <w:rFonts w:ascii="Arial" w:hAnsi="Arial"/>
                 <w:color w:val="1E293B"/>
                 <w:sz w:val="16"/>
               </w:rPr>
@@ -4821,6 +5251,7 @@
             </w:pPr>
             <w:r>
               <w:rPr>
+                <w:rFonts w:ascii="Arial" w:hAnsi="Arial"/>
                 <w:color w:val="1E293B"/>
                 <w:sz w:val="16"/>
               </w:rPr>
@@ -4839,6 +5270,7 @@
             </w:pPr>
             <w:r>
               <w:rPr>
+                <w:rFonts w:ascii="Arial" w:hAnsi="Arial"/>
                 <w:color w:val="1E293B"/>
                 <w:sz w:val="16"/>
               </w:rPr>
@@ -4857,6 +5289,7 @@
             </w:pPr>
             <w:r>
               <w:rPr>
+                <w:rFonts w:ascii="Arial" w:hAnsi="Arial"/>
                 <w:color w:val="1E293B"/>
                 <w:sz w:val="16"/>
               </w:rPr>
@@ -4877,6 +5310,7 @@
             </w:pPr>
             <w:r>
               <w:rPr>
+                <w:rFonts w:ascii="Arial" w:hAnsi="Arial"/>
                 <w:color w:val="1E293B"/>
                 <w:sz w:val="16"/>
               </w:rPr>
@@ -4895,6 +5329,7 @@
             </w:pPr>
             <w:r>
               <w:rPr>
+                <w:rFonts w:ascii="Arial" w:hAnsi="Arial"/>
                 <w:color w:val="1E293B"/>
                 <w:sz w:val="16"/>
               </w:rPr>
@@ -4913,6 +5348,7 @@
             </w:pPr>
             <w:r>
               <w:rPr>
+                <w:rFonts w:ascii="Arial" w:hAnsi="Arial"/>
                 <w:color w:val="1E293B"/>
                 <w:sz w:val="16"/>
               </w:rPr>
@@ -4931,6 +5367,7 @@
             </w:pPr>
             <w:r>
               <w:rPr>
+                <w:rFonts w:ascii="Arial" w:hAnsi="Arial"/>
                 <w:color w:val="1E293B"/>
                 <w:sz w:val="16"/>
               </w:rPr>
@@ -4951,6 +5388,7 @@
             </w:pPr>
             <w:r>
               <w:rPr>
+                <w:rFonts w:ascii="Arial" w:hAnsi="Arial"/>
                 <w:color w:val="1E293B"/>
                 <w:sz w:val="16"/>
               </w:rPr>
@@ -4969,6 +5407,7 @@
             </w:pPr>
             <w:r>
               <w:rPr>
+                <w:rFonts w:ascii="Arial" w:hAnsi="Arial"/>
                 <w:color w:val="1E293B"/>
                 <w:sz w:val="16"/>
               </w:rPr>
@@ -4987,6 +5426,7 @@
             </w:pPr>
             <w:r>
               <w:rPr>
+                <w:rFonts w:ascii="Arial" w:hAnsi="Arial"/>
                 <w:color w:val="1E293B"/>
                 <w:sz w:val="16"/>
               </w:rPr>
@@ -5005,6 +5445,7 @@
             </w:pPr>
             <w:r>
               <w:rPr>
+                <w:rFonts w:ascii="Arial" w:hAnsi="Arial"/>
                 <w:color w:val="1E293B"/>
                 <w:sz w:val="16"/>
               </w:rPr>
@@ -5025,6 +5466,7 @@
             </w:pPr>
             <w:r>
               <w:rPr>
+                <w:rFonts w:ascii="Arial" w:hAnsi="Arial"/>
                 <w:color w:val="1E293B"/>
                 <w:sz w:val="16"/>
               </w:rPr>
@@ -5043,6 +5485,7 @@
             </w:pPr>
             <w:r>
               <w:rPr>
+                <w:rFonts w:ascii="Arial" w:hAnsi="Arial"/>
                 <w:color w:val="1E293B"/>
                 <w:sz w:val="16"/>
               </w:rPr>
@@ -5061,6 +5504,7 @@
             </w:pPr>
             <w:r>
               <w:rPr>
+                <w:rFonts w:ascii="Arial" w:hAnsi="Arial"/>
                 <w:color w:val="1E293B"/>
                 <w:sz w:val="16"/>
               </w:rPr>
@@ -5079,6 +5523,7 @@
             </w:pPr>
             <w:r>
               <w:rPr>
+                <w:rFonts w:ascii="Arial" w:hAnsi="Arial"/>
                 <w:color w:val="1E293B"/>
                 <w:sz w:val="16"/>
               </w:rPr>
@@ -5099,6 +5544,7 @@
             </w:pPr>
             <w:r>
               <w:rPr>
+                <w:rFonts w:ascii="Arial" w:hAnsi="Arial"/>
                 <w:color w:val="1E293B"/>
                 <w:sz w:val="16"/>
               </w:rPr>
@@ -5117,6 +5563,7 @@
             </w:pPr>
             <w:r>
               <w:rPr>
+                <w:rFonts w:ascii="Arial" w:hAnsi="Arial"/>
                 <w:color w:val="1E293B"/>
                 <w:sz w:val="16"/>
               </w:rPr>
@@ -5135,6 +5582,7 @@
             </w:pPr>
             <w:r>
               <w:rPr>
+                <w:rFonts w:ascii="Arial" w:hAnsi="Arial"/>
                 <w:color w:val="1E293B"/>
                 <w:sz w:val="16"/>
               </w:rPr>
@@ -5153,6 +5601,7 @@
             </w:pPr>
             <w:r>
               <w:rPr>
+                <w:rFonts w:ascii="Arial" w:hAnsi="Arial"/>
                 <w:color w:val="1E293B"/>
                 <w:sz w:val="16"/>
               </w:rPr>
@@ -5173,6 +5622,7 @@
             </w:pPr>
             <w:r>
               <w:rPr>
+                <w:rFonts w:ascii="Arial" w:hAnsi="Arial"/>
                 <w:color w:val="1E293B"/>
                 <w:sz w:val="16"/>
               </w:rPr>
@@ -5191,6 +5641,7 @@
             </w:pPr>
             <w:r>
               <w:rPr>
+                <w:rFonts w:ascii="Arial" w:hAnsi="Arial"/>
                 <w:color w:val="1E293B"/>
                 <w:sz w:val="16"/>
               </w:rPr>
@@ -5209,6 +5660,7 @@
             </w:pPr>
             <w:r>
               <w:rPr>
+                <w:rFonts w:ascii="Arial" w:hAnsi="Arial"/>
                 <w:color w:val="1E293B"/>
                 <w:sz w:val="16"/>
               </w:rPr>
@@ -5227,6 +5679,7 @@
             </w:pPr>
             <w:r>
               <w:rPr>
+                <w:rFonts w:ascii="Arial" w:hAnsi="Arial"/>
                 <w:color w:val="1E293B"/>
                 <w:sz w:val="16"/>
               </w:rPr>
@@ -5247,6 +5700,7 @@
             </w:pPr>
             <w:r>
               <w:rPr>
+                <w:rFonts w:ascii="Arial" w:hAnsi="Arial"/>
                 <w:color w:val="1E293B"/>
                 <w:sz w:val="16"/>
               </w:rPr>
@@ -5265,6 +5719,7 @@
             </w:pPr>
             <w:r>
               <w:rPr>
+                <w:rFonts w:ascii="Arial" w:hAnsi="Arial"/>
                 <w:color w:val="1E293B"/>
                 <w:sz w:val="16"/>
               </w:rPr>
@@ -5283,6 +5738,7 @@
             </w:pPr>
             <w:r>
               <w:rPr>
+                <w:rFonts w:ascii="Arial" w:hAnsi="Arial"/>
                 <w:color w:val="1E293B"/>
                 <w:sz w:val="16"/>
               </w:rPr>
@@ -5301,6 +5757,7 @@
             </w:pPr>
             <w:r>
               <w:rPr>
+                <w:rFonts w:ascii="Arial" w:hAnsi="Arial"/>
                 <w:color w:val="1E293B"/>
                 <w:sz w:val="16"/>
               </w:rPr>
@@ -5321,6 +5778,7 @@
             </w:pPr>
             <w:r>
               <w:rPr>
+                <w:rFonts w:ascii="Arial" w:hAnsi="Arial"/>
                 <w:color w:val="1E293B"/>
                 <w:sz w:val="16"/>
               </w:rPr>
@@ -5339,6 +5797,7 @@
             </w:pPr>
             <w:r>
               <w:rPr>
+                <w:rFonts w:ascii="Arial" w:hAnsi="Arial"/>
                 <w:color w:val="1E293B"/>
                 <w:sz w:val="16"/>
               </w:rPr>
@@ -5357,6 +5816,7 @@
             </w:pPr>
             <w:r>
               <w:rPr>
+                <w:rFonts w:ascii="Arial" w:hAnsi="Arial"/>
                 <w:color w:val="1E293B"/>
                 <w:sz w:val="16"/>
               </w:rPr>
@@ -5375,6 +5835,7 @@
             </w:pPr>
             <w:r>
               <w:rPr>
+                <w:rFonts w:ascii="Arial" w:hAnsi="Arial"/>
                 <w:color w:val="1E293B"/>
                 <w:sz w:val="16"/>
               </w:rPr>
@@ -5395,6 +5856,7 @@
             </w:pPr>
             <w:r>
               <w:rPr>
+                <w:rFonts w:ascii="Arial" w:hAnsi="Arial"/>
                 <w:color w:val="1E293B"/>
                 <w:sz w:val="16"/>
               </w:rPr>
@@ -5413,6 +5875,7 @@
             </w:pPr>
             <w:r>
               <w:rPr>
+                <w:rFonts w:ascii="Arial" w:hAnsi="Arial"/>
                 <w:color w:val="1E293B"/>
                 <w:sz w:val="16"/>
               </w:rPr>
@@ -5431,6 +5894,7 @@
             </w:pPr>
             <w:r>
               <w:rPr>
+                <w:rFonts w:ascii="Arial" w:hAnsi="Arial"/>
                 <w:color w:val="1E293B"/>
                 <w:sz w:val="16"/>
               </w:rPr>
@@ -5449,6 +5913,7 @@
             </w:pPr>
             <w:r>
               <w:rPr>
+                <w:rFonts w:ascii="Arial" w:hAnsi="Arial"/>
                 <w:color w:val="1E293B"/>
                 <w:sz w:val="16"/>
               </w:rPr>
@@ -5469,6 +5934,7 @@
             </w:pPr>
             <w:r>
               <w:rPr>
+                <w:rFonts w:ascii="Arial" w:hAnsi="Arial"/>
                 <w:color w:val="1E293B"/>
                 <w:sz w:val="16"/>
               </w:rPr>
@@ -5487,6 +5953,7 @@
             </w:pPr>
             <w:r>
               <w:rPr>
+                <w:rFonts w:ascii="Arial" w:hAnsi="Arial"/>
                 <w:color w:val="1E293B"/>
                 <w:sz w:val="16"/>
               </w:rPr>
@@ -5505,6 +5972,7 @@
             </w:pPr>
             <w:r>
               <w:rPr>
+                <w:rFonts w:ascii="Arial" w:hAnsi="Arial"/>
                 <w:color w:val="1E293B"/>
                 <w:sz w:val="16"/>
               </w:rPr>
@@ -5523,6 +5991,7 @@
             </w:pPr>
             <w:r>
               <w:rPr>
+                <w:rFonts w:ascii="Arial" w:hAnsi="Arial"/>
                 <w:color w:val="1E293B"/>
                 <w:sz w:val="16"/>
               </w:rPr>
@@ -5543,6 +6012,7 @@
             </w:pPr>
             <w:r>
               <w:rPr>
+                <w:rFonts w:ascii="Arial" w:hAnsi="Arial"/>
                 <w:color w:val="1E293B"/>
                 <w:sz w:val="16"/>
               </w:rPr>
@@ -5561,6 +6031,7 @@
             </w:pPr>
             <w:r>
               <w:rPr>
+                <w:rFonts w:ascii="Arial" w:hAnsi="Arial"/>
                 <w:color w:val="1E293B"/>
                 <w:sz w:val="16"/>
               </w:rPr>
@@ -5579,6 +6050,7 @@
             </w:pPr>
             <w:r>
               <w:rPr>
+                <w:rFonts w:ascii="Arial" w:hAnsi="Arial"/>
                 <w:color w:val="1E293B"/>
                 <w:sz w:val="16"/>
               </w:rPr>
@@ -5597,6 +6069,7 @@
             </w:pPr>
             <w:r>
               <w:rPr>
+                <w:rFonts w:ascii="Arial" w:hAnsi="Arial"/>
                 <w:color w:val="1E293B"/>
                 <w:sz w:val="16"/>
               </w:rPr>
@@ -5617,6 +6090,7 @@
             </w:pPr>
             <w:r>
               <w:rPr>
+                <w:rFonts w:ascii="Arial" w:hAnsi="Arial"/>
                 <w:color w:val="1E293B"/>
                 <w:sz w:val="16"/>
               </w:rPr>
@@ -5635,6 +6109,7 @@
             </w:pPr>
             <w:r>
               <w:rPr>
+                <w:rFonts w:ascii="Arial" w:hAnsi="Arial"/>
                 <w:color w:val="1E293B"/>
                 <w:sz w:val="16"/>
               </w:rPr>
@@ -5653,6 +6128,7 @@
             </w:pPr>
             <w:r>
               <w:rPr>
+                <w:rFonts w:ascii="Arial" w:hAnsi="Arial"/>
                 <w:color w:val="1E293B"/>
                 <w:sz w:val="16"/>
               </w:rPr>
@@ -5671,6 +6147,7 @@
             </w:pPr>
             <w:r>
               <w:rPr>
+                <w:rFonts w:ascii="Arial" w:hAnsi="Arial"/>
                 <w:color w:val="1E293B"/>
                 <w:sz w:val="16"/>
               </w:rPr>
@@ -5691,6 +6168,7 @@
             </w:pPr>
             <w:r>
               <w:rPr>
+                <w:rFonts w:ascii="Arial" w:hAnsi="Arial"/>
                 <w:color w:val="1E293B"/>
                 <w:sz w:val="16"/>
               </w:rPr>
@@ -5709,6 +6187,7 @@
             </w:pPr>
             <w:r>
               <w:rPr>
+                <w:rFonts w:ascii="Arial" w:hAnsi="Arial"/>
                 <w:color w:val="1E293B"/>
                 <w:sz w:val="16"/>
               </w:rPr>
@@ -5727,6 +6206,7 @@
             </w:pPr>
             <w:r>
               <w:rPr>
+                <w:rFonts w:ascii="Arial" w:hAnsi="Arial"/>
                 <w:color w:val="1E293B"/>
                 <w:sz w:val="16"/>
               </w:rPr>
@@ -5745,6 +6225,7 @@
             </w:pPr>
             <w:r>
               <w:rPr>
+                <w:rFonts w:ascii="Arial" w:hAnsi="Arial"/>
                 <w:color w:val="1E293B"/>
                 <w:sz w:val="16"/>
               </w:rPr>
@@ -5761,6 +6242,7 @@
     </w:p>
     <w:p>
       <w:pPr>
+        <w:pStyle w:val="Heading2"/>
         <w:keepNext/>
         <w:spacing w:before="280" w:after="120"/>
       </w:pPr>
@@ -5778,9 +6260,11 @@
       <w:pPr>
         <w:pStyle w:val="ListBullet"/>
         <w:spacing w:before="40" w:after="100" w:line="276" w:lineRule="auto"/>
+        <w:ind w:left="504"/>
       </w:pPr>
       <w:r>
         <w:rPr>
+          <w:rFonts w:ascii="Arial" w:hAnsi="Arial"/>
           <w:b/>
           <w:color w:val="0F172A"/>
         </w:rPr>
@@ -5788,12 +6272,14 @@
       </w:r>
       <w:r>
         <w:rPr>
+          <w:rFonts w:ascii="Arial" w:hAnsi="Arial"/>
           <w:color w:val="1E293B"/>
         </w:rPr>
         <w:t xml:space="preserve"> : Pour chaque année d'exécution, la dépense brute de </w:t>
       </w:r>
       <w:r>
         <w:rPr>
+          <w:rFonts w:ascii="Arial" w:hAnsi="Arial"/>
           <w:b/>
           <w:color w:val="0F172A"/>
         </w:rPr>
@@ -5801,12 +6287,14 @@
       </w:r>
       <w:r>
         <w:rPr>
+          <w:rFonts w:ascii="Arial" w:hAnsi="Arial"/>
           <w:color w:val="1E293B"/>
         </w:rPr>
         <w:t xml:space="preserve"> est co-financée à 50 % par l'UE, ne laissant que </w:t>
       </w:r>
       <w:r>
         <w:rPr>
+          <w:rFonts w:ascii="Arial" w:hAnsi="Arial"/>
           <w:b/>
           <w:color w:val="0F172A"/>
         </w:rPr>
@@ -5814,12 +6302,14 @@
       </w:r>
       <w:r>
         <w:rPr>
+          <w:rFonts w:ascii="Arial" w:hAnsi="Arial"/>
           <w:color w:val="1E293B"/>
         </w:rPr>
         <w:t xml:space="preserve"> à la Métropole, face à </w:t>
       </w:r>
       <w:r>
         <w:rPr>
+          <w:rFonts w:ascii="Arial" w:hAnsi="Arial"/>
           <w:b/>
           <w:color w:val="0F172A"/>
         </w:rPr>
@@ -5827,12 +6317,14 @@
       </w:r>
       <w:r>
         <w:rPr>
+          <w:rFonts w:ascii="Arial" w:hAnsi="Arial"/>
           <w:color w:val="1E293B"/>
         </w:rPr>
         <w:t xml:space="preserve">, dégageant un bénéfice net réinjecté dans le service public de </w:t>
       </w:r>
       <w:r>
         <w:rPr>
+          <w:rFonts w:ascii="Arial" w:hAnsi="Arial"/>
           <w:b/>
           <w:color w:val="0F172A"/>
         </w:rPr>
@@ -5840,6 +6332,7 @@
       </w:r>
       <w:r>
         <w:rPr>
+          <w:rFonts w:ascii="Arial" w:hAnsi="Arial"/>
           <w:color w:val="1E293B"/>
         </w:rPr>
         <w:t>.</w:t>
@@ -5872,6 +6365,7 @@
             </w:pPr>
             <w:r>
               <w:rPr>
+                <w:rFonts w:ascii="Arial" w:hAnsi="Arial"/>
                 <w:b/>
                 <w:color w:val="FFFFFF"/>
                 <w:sz w:val="16"/>
@@ -5891,6 +6385,7 @@
             </w:pPr>
             <w:r>
               <w:rPr>
+                <w:rFonts w:ascii="Arial" w:hAnsi="Arial"/>
                 <w:b/>
                 <w:color w:val="FFFFFF"/>
                 <w:sz w:val="16"/>
@@ -5910,6 +6405,7 @@
             </w:pPr>
             <w:r>
               <w:rPr>
+                <w:rFonts w:ascii="Arial" w:hAnsi="Arial"/>
                 <w:b/>
                 <w:color w:val="FFFFFF"/>
                 <w:sz w:val="16"/>
@@ -5929,6 +6425,7 @@
             </w:pPr>
             <w:r>
               <w:rPr>
+                <w:rFonts w:ascii="Arial" w:hAnsi="Arial"/>
                 <w:b/>
                 <w:color w:val="FFFFFF"/>
                 <w:sz w:val="16"/>
@@ -5948,6 +6445,7 @@
             </w:pPr>
             <w:r>
               <w:rPr>
+                <w:rFonts w:ascii="Arial" w:hAnsi="Arial"/>
                 <w:b/>
                 <w:color w:val="FFFFFF"/>
                 <w:sz w:val="16"/>
@@ -5967,6 +6465,7 @@
             </w:pPr>
             <w:r>
               <w:rPr>
+                <w:rFonts w:ascii="Arial" w:hAnsi="Arial"/>
                 <w:b/>
                 <w:color w:val="FFFFFF"/>
                 <w:sz w:val="16"/>
@@ -5986,6 +6485,7 @@
             </w:pPr>
             <w:r>
               <w:rPr>
+                <w:rFonts w:ascii="Arial" w:hAnsi="Arial"/>
                 <w:b/>
                 <w:color w:val="FFFFFF"/>
                 <w:sz w:val="16"/>
@@ -6007,6 +6507,7 @@
             </w:pPr>
             <w:r>
               <w:rPr>
+                <w:rFonts w:ascii="Arial" w:hAnsi="Arial"/>
                 <w:color w:val="1E293B"/>
                 <w:sz w:val="16"/>
               </w:rPr>
@@ -6025,6 +6526,7 @@
             </w:pPr>
             <w:r>
               <w:rPr>
+                <w:rFonts w:ascii="Arial" w:hAnsi="Arial"/>
                 <w:color w:val="1E293B"/>
                 <w:sz w:val="16"/>
               </w:rPr>
@@ -6043,6 +6545,7 @@
             </w:pPr>
             <w:r>
               <w:rPr>
+                <w:rFonts w:ascii="Arial" w:hAnsi="Arial"/>
                 <w:color w:val="1E293B"/>
                 <w:sz w:val="16"/>
               </w:rPr>
@@ -6061,6 +6564,7 @@
             </w:pPr>
             <w:r>
               <w:rPr>
+                <w:rFonts w:ascii="Arial" w:hAnsi="Arial"/>
                 <w:color w:val="1E293B"/>
                 <w:sz w:val="16"/>
               </w:rPr>
@@ -6079,6 +6583,7 @@
             </w:pPr>
             <w:r>
               <w:rPr>
+                <w:rFonts w:ascii="Arial" w:hAnsi="Arial"/>
                 <w:color w:val="1E293B"/>
                 <w:sz w:val="16"/>
               </w:rPr>
@@ -6097,6 +6602,7 @@
             </w:pPr>
             <w:r>
               <w:rPr>
+                <w:rFonts w:ascii="Arial" w:hAnsi="Arial"/>
                 <w:color w:val="1E293B"/>
                 <w:sz w:val="16"/>
               </w:rPr>
@@ -6115,6 +6621,7 @@
             </w:pPr>
             <w:r>
               <w:rPr>
+                <w:rFonts w:ascii="Arial" w:hAnsi="Arial"/>
                 <w:color w:val="1E293B"/>
                 <w:sz w:val="16"/>
               </w:rPr>
@@ -6135,6 +6642,7 @@
             </w:pPr>
             <w:r>
               <w:rPr>
+                <w:rFonts w:ascii="Arial" w:hAnsi="Arial"/>
                 <w:color w:val="1E293B"/>
                 <w:sz w:val="16"/>
               </w:rPr>
@@ -6153,6 +6661,7 @@
             </w:pPr>
             <w:r>
               <w:rPr>
+                <w:rFonts w:ascii="Arial" w:hAnsi="Arial"/>
                 <w:color w:val="1E293B"/>
                 <w:sz w:val="16"/>
               </w:rPr>
@@ -6171,6 +6680,7 @@
             </w:pPr>
             <w:r>
               <w:rPr>
+                <w:rFonts w:ascii="Arial" w:hAnsi="Arial"/>
                 <w:color w:val="1E293B"/>
                 <w:sz w:val="16"/>
               </w:rPr>
@@ -6189,6 +6699,7 @@
             </w:pPr>
             <w:r>
               <w:rPr>
+                <w:rFonts w:ascii="Arial" w:hAnsi="Arial"/>
                 <w:color w:val="1E293B"/>
                 <w:sz w:val="16"/>
               </w:rPr>
@@ -6207,6 +6718,7 @@
             </w:pPr>
             <w:r>
               <w:rPr>
+                <w:rFonts w:ascii="Arial" w:hAnsi="Arial"/>
                 <w:color w:val="1E293B"/>
                 <w:sz w:val="16"/>
               </w:rPr>
@@ -6225,6 +6737,7 @@
             </w:pPr>
             <w:r>
               <w:rPr>
+                <w:rFonts w:ascii="Arial" w:hAnsi="Arial"/>
                 <w:color w:val="1E293B"/>
                 <w:sz w:val="16"/>
               </w:rPr>
@@ -6243,6 +6756,7 @@
             </w:pPr>
             <w:r>
               <w:rPr>
+                <w:rFonts w:ascii="Arial" w:hAnsi="Arial"/>
                 <w:color w:val="1E293B"/>
                 <w:sz w:val="16"/>
               </w:rPr>
@@ -6263,6 +6777,7 @@
             </w:pPr>
             <w:r>
               <w:rPr>
+                <w:rFonts w:ascii="Arial" w:hAnsi="Arial"/>
                 <w:color w:val="1E293B"/>
                 <w:sz w:val="16"/>
               </w:rPr>
@@ -6281,6 +6796,7 @@
             </w:pPr>
             <w:r>
               <w:rPr>
+                <w:rFonts w:ascii="Arial" w:hAnsi="Arial"/>
                 <w:color w:val="1E293B"/>
                 <w:sz w:val="16"/>
               </w:rPr>
@@ -6299,6 +6815,7 @@
             </w:pPr>
             <w:r>
               <w:rPr>
+                <w:rFonts w:ascii="Arial" w:hAnsi="Arial"/>
                 <w:color w:val="1E293B"/>
                 <w:sz w:val="16"/>
               </w:rPr>
@@ -6317,6 +6834,7 @@
             </w:pPr>
             <w:r>
               <w:rPr>
+                <w:rFonts w:ascii="Arial" w:hAnsi="Arial"/>
                 <w:color w:val="1E293B"/>
                 <w:sz w:val="16"/>
               </w:rPr>
@@ -6335,6 +6853,7 @@
             </w:pPr>
             <w:r>
               <w:rPr>
+                <w:rFonts w:ascii="Arial" w:hAnsi="Arial"/>
                 <w:color w:val="1E293B"/>
                 <w:sz w:val="16"/>
               </w:rPr>
@@ -6353,6 +6872,7 @@
             </w:pPr>
             <w:r>
               <w:rPr>
+                <w:rFonts w:ascii="Arial" w:hAnsi="Arial"/>
                 <w:color w:val="1E293B"/>
                 <w:sz w:val="16"/>
               </w:rPr>
@@ -6371,6 +6891,7 @@
             </w:pPr>
             <w:r>
               <w:rPr>
+                <w:rFonts w:ascii="Arial" w:hAnsi="Arial"/>
                 <w:color w:val="1E293B"/>
                 <w:sz w:val="16"/>
               </w:rPr>
@@ -6391,6 +6912,7 @@
             </w:pPr>
             <w:r>
               <w:rPr>
+                <w:rFonts w:ascii="Arial" w:hAnsi="Arial"/>
                 <w:b/>
                 <w:color w:val="FFFFFF"/>
                 <w:sz w:val="16"/>
@@ -6410,6 +6932,7 @@
             </w:pPr>
             <w:r>
               <w:rPr>
+                <w:rFonts w:ascii="Arial" w:hAnsi="Arial"/>
                 <w:b/>
                 <w:color w:val="FFFFFF"/>
                 <w:sz w:val="16"/>
@@ -6429,6 +6952,7 @@
             </w:pPr>
             <w:r>
               <w:rPr>
+                <w:rFonts w:ascii="Arial" w:hAnsi="Arial"/>
                 <w:b/>
                 <w:color w:val="FFFFFF"/>
                 <w:sz w:val="16"/>
@@ -6448,6 +6972,7 @@
             </w:pPr>
             <w:r>
               <w:rPr>
+                <w:rFonts w:ascii="Arial" w:hAnsi="Arial"/>
                 <w:b/>
                 <w:color w:val="FFFFFF"/>
                 <w:sz w:val="16"/>
@@ -6467,6 +6992,7 @@
             </w:pPr>
             <w:r>
               <w:rPr>
+                <w:rFonts w:ascii="Arial" w:hAnsi="Arial"/>
                 <w:b/>
                 <w:color w:val="FFFFFF"/>
                 <w:sz w:val="16"/>
@@ -6486,6 +7012,7 @@
             </w:pPr>
             <w:r>
               <w:rPr>
+                <w:rFonts w:ascii="Arial" w:hAnsi="Arial"/>
                 <w:b/>
                 <w:color w:val="FFFFFF"/>
                 <w:sz w:val="16"/>
@@ -6505,6 +7032,7 @@
             </w:pPr>
             <w:r>
               <w:rPr>
+                <w:rFonts w:ascii="Arial" w:hAnsi="Arial"/>
                 <w:b/>
                 <w:color w:val="FFFFFF"/>
                 <w:sz w:val="16"/>
@@ -6522,6 +7050,7 @@
     </w:p>
     <w:p>
       <w:pPr>
+        <w:pStyle w:val="Heading1"/>
         <w:keepNext/>
         <w:spacing w:before="360" w:after="160"/>
       </w:pPr>
@@ -6539,9 +7068,11 @@
       <w:pPr>
         <w:pStyle w:val="ListBullet"/>
         <w:spacing w:before="40" w:after="100" w:line="276" w:lineRule="auto"/>
+        <w:ind w:left="504"/>
       </w:pPr>
       <w:r>
         <w:rPr>
+          <w:rFonts w:ascii="Arial" w:hAnsi="Arial"/>
           <w:b/>
           <w:color w:val="0F172A"/>
         </w:rPr>
@@ -6549,6 +7080,7 @@
       </w:r>
       <w:r>
         <w:rPr>
+          <w:rFonts w:ascii="Arial" w:hAnsi="Arial"/>
           <w:color w:val="1E293B"/>
         </w:rPr>
         <w:t xml:space="preserve"> : Ingestion de 300 M€ de factures/BPU. Taux d'erreur moyen documenté par la DGFiP : 0,5% à 2,0%. Hypothèse conservatrice retenue à 0,83% = 2,50 M€/an d'économies nettes certifiées.</w:t>
@@ -6558,9 +7090,11 @@
       <w:pPr>
         <w:pStyle w:val="ListBullet"/>
         <w:spacing w:before="40" w:after="100" w:line="276" w:lineRule="auto"/>
+        <w:ind w:left="504"/>
       </w:pPr>
       <w:r>
         <w:rPr>
+          <w:rFonts w:ascii="Arial" w:hAnsi="Arial"/>
           <w:b/>
           <w:color w:val="0F172A"/>
         </w:rPr>
@@ -6568,6 +7102,7 @@
       </w:r>
       <w:r>
         <w:rPr>
+          <w:rFonts w:ascii="Arial" w:hAnsi="Arial"/>
           <w:color w:val="1E293B"/>
         </w:rPr>
         <w:t xml:space="preserve"> : Coût moyen d'une crise de ransomware pour une métropole (Marseille, Lille, Caen) : 5 M€ à 10 M€ tous les 3 ans = 1,8 M€ à 3,3 M€/an d'amortissement de risque évité.</w:t>
@@ -6577,9 +7112,11 @@
       <w:pPr>
         <w:pStyle w:val="ListBullet"/>
         <w:spacing w:before="40" w:after="100" w:line="276" w:lineRule="auto"/>
+        <w:ind w:left="504"/>
       </w:pPr>
       <w:r>
         <w:rPr>
+          <w:rFonts w:ascii="Arial" w:hAnsi="Arial"/>
           <w:b/>
           <w:color w:val="0F172A"/>
         </w:rPr>
@@ -6587,6 +7124,7 @@
       </w:r>
       <w:r>
         <w:rPr>
+          <w:rFonts w:ascii="Arial" w:hAnsi="Arial"/>
           <w:color w:val="1E293B"/>
         </w:rPr>
         <w:t xml:space="preserve"> : Économie de maintenance et d'hébergement privé (OPEX) + non-construction d'un Datacenter propre (CAPEX).</w:t>
@@ -6596,9 +7134,11 @@
       <w:pPr>
         <w:pStyle w:val="ListBullet"/>
         <w:spacing w:before="40" w:after="100" w:line="276" w:lineRule="auto"/>
+        <w:ind w:left="504"/>
       </w:pPr>
       <w:r>
         <w:rPr>
+          <w:rFonts w:ascii="Arial" w:hAnsi="Arial"/>
           <w:b/>
           <w:color w:val="0F172A"/>
         </w:rPr>
@@ -6606,6 +7146,7 @@
       </w:r>
       <w:r>
         <w:rPr>
+          <w:rFonts w:ascii="Arial" w:hAnsi="Arial"/>
           <w:color w:val="1E293B"/>
         </w:rPr>
         <w:t xml:space="preserve"> : Plan national souverain de 700 Md$ sur 3 ans (12 GW, 1 700 chercheurs).</w:t>
@@ -6615,9 +7156,11 @@
       <w:pPr>
         <w:pStyle w:val="ListBullet"/>
         <w:spacing w:before="40" w:after="100" w:line="276" w:lineRule="auto"/>
+        <w:ind w:left="504"/>
       </w:pPr>
       <w:r>
         <w:rPr>
+          <w:rFonts w:ascii="Arial" w:hAnsi="Arial"/>
           <w:b/>
           <w:color w:val="0F172A"/>
         </w:rPr>
@@ -6625,6 +7168,7 @@
       </w:r>
       <w:r>
         <w:rPr>
+          <w:rFonts w:ascii="Arial" w:hAnsi="Arial"/>
           <w:color w:val="1E293B"/>
         </w:rPr>
         <w:t xml:space="preserve"> : Programme EuroHPC JU (Lot 1) — 30 Md€ d'enveloppe, subvention directe de 500 M€ par site.</w:t>
@@ -6634,9 +7178,11 @@
       <w:pPr>
         <w:pStyle w:val="ListBullet"/>
         <w:spacing w:before="40" w:after="100" w:line="276" w:lineRule="auto"/>
+        <w:ind w:left="504"/>
       </w:pPr>
       <w:r>
         <w:rPr>
+          <w:rFonts w:ascii="Arial" w:hAnsi="Arial"/>
           <w:b/>
           <w:color w:val="0F172A"/>
         </w:rPr>
@@ -6644,6 +7190,7 @@
       </w:r>
       <w:r>
         <w:rPr>
+          <w:rFonts w:ascii="Arial" w:hAnsi="Arial"/>
           <w:color w:val="1E293B"/>
         </w:rPr>
         <w:t xml:space="preserve"> : Encadrement légal et labellisation des systèmes IA.</w:t>
@@ -6653,9 +7200,11 @@
       <w:pPr>
         <w:pStyle w:val="ListBullet"/>
         <w:spacing w:before="40" w:after="100" w:line="276" w:lineRule="auto"/>
+        <w:ind w:left="504"/>
       </w:pPr>
       <w:r>
         <w:rPr>
+          <w:rFonts w:ascii="Arial" w:hAnsi="Arial"/>
           <w:b/>
           <w:color w:val="0F172A"/>
         </w:rPr>
@@ -6663,6 +7212,7 @@
       </w:r>
       <w:r>
         <w:rPr>
+          <w:rFonts w:ascii="Arial" w:hAnsi="Arial"/>
           <w:color w:val="1E293B"/>
         </w:rPr>
         <w:t xml:space="preserve"> : Cadre expérimental VSA pour la détection d'événements sur la voie publique.</w:t>
@@ -6672,9 +7222,11 @@
       <w:pPr>
         <w:pStyle w:val="ListBullet"/>
         <w:spacing w:before="40" w:after="100" w:line="276" w:lineRule="auto"/>
+        <w:ind w:left="504"/>
       </w:pPr>
       <w:r>
         <w:rPr>
+          <w:rFonts w:ascii="Arial" w:hAnsi="Arial"/>
           <w:b/>
           <w:color w:val="0F172A"/>
         </w:rPr>
@@ -6682,6 +7234,7 @@
       </w:r>
       <w:r>
         <w:rPr>
+          <w:rFonts w:ascii="Arial" w:hAnsi="Arial"/>
           <w:color w:val="1E293B"/>
         </w:rPr>
         <w:t xml:space="preserve"> : Validation des protocoles municipaux d'expérimentation VSA.</w:t>
@@ -6691,9 +7244,11 @@
       <w:pPr>
         <w:pStyle w:val="ListBullet"/>
         <w:spacing w:before="40" w:after="100" w:line="276" w:lineRule="auto"/>
+        <w:ind w:left="504"/>
       </w:pPr>
       <w:r>
         <w:rPr>
+          <w:rFonts w:ascii="Arial" w:hAnsi="Arial"/>
           <w:b/>
           <w:color w:val="0F172A"/>
         </w:rPr>
@@ -6701,6 +7256,7 @@
       </w:r>
       <w:r>
         <w:rPr>
+          <w:rFonts w:ascii="Arial" w:hAnsi="Arial"/>
           <w:color w:val="1E293B"/>
         </w:rPr>
         <w:t xml:space="preserve"> : Bilan des &gt; 100 chaires de recherche d'excellence en IA.</w:t>
@@ -6710,9 +7266,11 @@
       <w:pPr>
         <w:pStyle w:val="ListBullet"/>
         <w:spacing w:before="40" w:after="100" w:line="276" w:lineRule="auto"/>
+        <w:ind w:left="504"/>
       </w:pPr>
       <w:r>
         <w:rPr>
+          <w:rFonts w:ascii="Arial" w:hAnsi="Arial"/>
           <w:b/>
           <w:color w:val="0F172A"/>
         </w:rPr>
@@ -6720,6 +7278,7 @@
       </w:r>
       <w:r>
         <w:rPr>
+          <w:rFonts w:ascii="Arial" w:hAnsi="Arial"/>
           <w:color w:val="1E293B"/>
         </w:rPr>
         <w:t xml:space="preserve"> : Chiffres clés (2 700 entreprises, 46 000 emplois, 5 500 chercheurs).</w:t>
@@ -6729,9 +7288,11 @@
       <w:pPr>
         <w:pStyle w:val="ListBullet"/>
         <w:spacing w:before="40" w:after="100" w:line="276" w:lineRule="auto"/>
+        <w:ind w:left="504"/>
       </w:pPr>
       <w:r>
         <w:rPr>
+          <w:rFonts w:ascii="Arial" w:hAnsi="Arial"/>
           <w:b/>
           <w:color w:val="0F172A"/>
         </w:rPr>
@@ -6739,6 +7300,7 @@
       </w:r>
       <w:r>
         <w:rPr>
+          <w:rFonts w:ascii="Arial" w:hAnsi="Arial"/>
           <w:color w:val="1E293B"/>
         </w:rPr>
         <w:t xml:space="preserve"> : Data Center Souverain d'État certifié AMSN.</w:t>

</xml_diff>

<commit_message>
refactor: remove redundant section 1.3 and merge weight stats into section 1.2 in DOCX and PDF
</commit_message>
<xml_diff>
--- a/Le_Pacte_Nice_IA.docx
+++ b/Le_Pacte_Nice_IA.docx
@@ -230,7 +230,7 @@
                 <w:color w:val="0F172A"/>
                 <w:sz w:val="19"/>
               </w:rPr>
-              <w:t xml:space="preserve">   1.2 Le Terreau Azuréen : Sophia Antipolis, Grasse &amp; Cannes</w:t>
+              <w:t xml:space="preserve">   1.2 Le Terreau Azuréen : Sophia Antipolis, Grasse, Cannes &amp; Poids National</w:t>
             </w:r>
           </w:p>
         </w:tc>
@@ -273,7 +273,7 @@
                 <w:color w:val="0F172A"/>
                 <w:sz w:val="19"/>
               </w:rPr>
-              <w:t xml:space="preserve">   1.3 Évaluation du Pôle Nice-Sophia-Monaco vs Total National</w:t>
+              <w:t xml:space="preserve">   1.3 Atouts Monaco, Flux Transfrontaliers &amp; Extension Business</w:t>
             </w:r>
           </w:p>
         </w:tc>
@@ -316,7 +316,7 @@
                 <w:color w:val="0F172A"/>
                 <w:sz w:val="19"/>
               </w:rPr>
-              <w:t xml:space="preserve">   1.4 Atouts Monaco, Flux Transfrontaliers &amp; Extension Business</w:t>
+              <w:t xml:space="preserve">   1.4 L'Opportunité Historique : 30 Md€ UE &amp; 7 AI Gigafactories</w:t>
             </w:r>
           </w:p>
         </w:tc>
@@ -359,7 +359,7 @@
                 <w:color w:val="0F172A"/>
                 <w:sz w:val="19"/>
               </w:rPr>
-              <w:t xml:space="preserve">   1.5 L'Opportunité Historique : 30 Md€ UE &amp; 7 AI Gigafactories</w:t>
+              <w:t xml:space="preserve">   1.5 Structuration Opérationnelle &amp; Capture des Subventions</w:t>
             </w:r>
           </w:p>
         </w:tc>
@@ -380,7 +380,7 @@
                 <w:color w:val="64748B"/>
                 <w:sz w:val="18"/>
               </w:rPr>
-              <w:t>Page 4</w:t>
+              <w:t>Page 5</w:t>
             </w:r>
           </w:p>
         </w:tc>
@@ -402,7 +402,7 @@
                 <w:color w:val="0F172A"/>
                 <w:sz w:val="19"/>
               </w:rPr>
-              <w:t xml:space="preserve">   1.6 Structuration Opérationnelle &amp; Capture des Subventions</w:t>
+              <w:t>2. Pôle 1 : Axe Ville de Nice (Sécurité &amp; Cadre de Vie)</w:t>
             </w:r>
           </w:p>
         </w:tc>
@@ -445,7 +445,7 @@
                 <w:color w:val="0F172A"/>
                 <w:sz w:val="19"/>
               </w:rPr>
-              <w:t>2. Pôle 1 : Axe Ville de Nice (Sécurité &amp; Cadre de Vie)</w:t>
+              <w:t xml:space="preserve">   2.1 CSU Augmenté : Moins d'Écrans, Plus de Policiers dans la Rue</w:t>
             </w:r>
           </w:p>
         </w:tc>
@@ -488,7 +488,7 @@
                 <w:color w:val="0F172A"/>
                 <w:sz w:val="19"/>
               </w:rPr>
-              <w:t xml:space="preserve">   2.1 CSU Augmenté : Moins d'Écrans, Plus de Policiers dans la Rue</w:t>
+              <w:t xml:space="preserve">   2.2 Guichet Vocal Allo Niçois 24/7 : Demandes d'Aide &amp; Sécurité</w:t>
             </w:r>
           </w:p>
         </w:tc>
@@ -509,7 +509,7 @@
                 <w:color w:val="64748B"/>
                 <w:sz w:val="18"/>
               </w:rPr>
-              <w:t>Page 5</w:t>
+              <w:t>Page 6</w:t>
             </w:r>
           </w:p>
         </w:tc>
@@ -531,7 +531,7 @@
                 <w:color w:val="0F172A"/>
                 <w:sz w:val="19"/>
               </w:rPr>
-              <w:t xml:space="preserve">   2.2 Guichet Vocal Allo Niçois 24/7 : Demandes d'Aide &amp; Sécurité</w:t>
+              <w:t xml:space="preserve">   2.3 Propreté Augmentée &amp; Routage Voie Publique</w:t>
             </w:r>
           </w:p>
         </w:tc>
@@ -574,7 +574,7 @@
                 <w:color w:val="0F172A"/>
                 <w:sz w:val="19"/>
               </w:rPr>
-              <w:t xml:space="preserve">   2.3 Propreté Augmentée &amp; Routage Voie Publique</w:t>
+              <w:t xml:space="preserve">   2.4 Consultation Directe par Quartier via l'IA Einstein</w:t>
             </w:r>
           </w:p>
         </w:tc>
@@ -617,7 +617,7 @@
                 <w:color w:val="0F172A"/>
                 <w:sz w:val="19"/>
               </w:rPr>
-              <w:t xml:space="preserve">   2.4 Consultation Directe par Quartier via l'IA Einstein</w:t>
+              <w:t>3. Pôle 2 : Axe Métropole Nice Côte d'Azur (Budget &amp; Monaco)</w:t>
             </w:r>
           </w:p>
         </w:tc>
@@ -638,7 +638,7 @@
                 <w:color w:val="64748B"/>
                 <w:sz w:val="18"/>
               </w:rPr>
-              <w:t>Page 6</w:t>
+              <w:t>Page 7</w:t>
             </w:r>
           </w:p>
         </w:tc>
@@ -660,7 +660,7 @@
                 <w:color w:val="0F172A"/>
                 <w:sz w:val="19"/>
               </w:rPr>
-              <w:t>3. Pôle 2 : Axe Métropole Nice Côte d'Azur (Budget &amp; Monaco)</w:t>
+              <w:t xml:space="preserve">   3.1 Audit IA Commande Publique (+2,5 M€ / an Net)</w:t>
             </w:r>
           </w:p>
         </w:tc>
@@ -703,7 +703,7 @@
                 <w:color w:val="0F172A"/>
                 <w:sz w:val="19"/>
               </w:rPr>
-              <w:t xml:space="preserve">   3.1 Audit IA Commande Publique (+2,5 M€ / an Net)</w:t>
+              <w:t xml:space="preserve">   3.2 Bouclier Cyber-IA NIS 2 (1,8 M€ à 3 M€ Évités)</w:t>
             </w:r>
           </w:p>
         </w:tc>
@@ -746,7 +746,7 @@
                 <w:color w:val="0F172A"/>
                 <w:sz w:val="19"/>
               </w:rPr>
-              <w:t xml:space="preserve">   3.2 Bouclier Cyber-IA NIS 2 (1,8 M€ à 3 M€ Évités)</w:t>
+              <w:t xml:space="preserve">   3.3 Monaco Cloud &amp; Redondance IT (1,5 M€ à 2,8 M€ / an)</w:t>
             </w:r>
           </w:p>
         </w:tc>
@@ -767,7 +767,7 @@
                 <w:color w:val="64748B"/>
                 <w:sz w:val="18"/>
               </w:rPr>
-              <w:t>Page 7</w:t>
+              <w:t>Page 8</w:t>
             </w:r>
           </w:p>
         </w:tc>
@@ -789,7 +789,7 @@
                 <w:color w:val="0F172A"/>
                 <w:sz w:val="19"/>
               </w:rPr>
-              <w:t xml:space="preserve">   3.3 Monaco Cloud &amp; Redondance IT (1,5 M€ à 2,8 M€ / an)</w:t>
+              <w:t>4. Alliance Binationale Nice-Monaco &amp; Hub Réglementaire</w:t>
             </w:r>
           </w:p>
         </w:tc>
@@ -832,7 +832,7 @@
                 <w:color w:val="0F172A"/>
                 <w:sz w:val="19"/>
               </w:rPr>
-              <w:t>4. Alliance Binationale Nice-Monaco &amp; Hub Réglementaire</w:t>
+              <w:t xml:space="preserve">   4.1 Levier Binational : Clé de Voûte des Financements Européens</w:t>
             </w:r>
           </w:p>
         </w:tc>
@@ -875,7 +875,7 @@
                 <w:color w:val="0F172A"/>
                 <w:sz w:val="19"/>
               </w:rPr>
-              <w:t xml:space="preserve">   4.1 Levier Binational : Clé de Voûte des Financements Européens</w:t>
+              <w:t xml:space="preserve">   4.2 Nice, Centre d'Expertise AI Act de Référence pour la France</w:t>
             </w:r>
           </w:p>
         </w:tc>
@@ -896,7 +896,7 @@
                 <w:color w:val="64748B"/>
                 <w:sz w:val="18"/>
               </w:rPr>
-              <w:t>Page 8</w:t>
+              <w:t>Page 9</w:t>
             </w:r>
           </w:p>
         </w:tc>
@@ -918,7 +918,7 @@
                 <w:color w:val="0F172A"/>
                 <w:sz w:val="19"/>
               </w:rPr>
-              <w:t xml:space="preserve">   4.2 Nice, Centre d'Expertise AI Act de Référence pour la France</w:t>
+              <w:t>5. Feuille de Route Précise (Septembre 2026-2029) &amp; Résumé Annuel</w:t>
             </w:r>
           </w:p>
         </w:tc>
@@ -961,7 +961,7 @@
                 <w:color w:val="0F172A"/>
                 <w:sz w:val="19"/>
               </w:rPr>
-              <w:t>5. Feuille de Route Précise (Septembre 2026-2029) &amp; Résumé Annuel</w:t>
+              <w:t xml:space="preserve">   5.1 Présidence Éric Ciotti &amp; Direction Benoît SIGWALD (2,5j/sem)</w:t>
             </w:r>
           </w:p>
         </w:tc>
@@ -1004,7 +1004,7 @@
                 <w:color w:val="0F172A"/>
                 <w:sz w:val="19"/>
               </w:rPr>
-              <w:t xml:space="preserve">   5.1 Présidence Éric Ciotti &amp; Direction Benoît SIGWALD (2,5j/sem)</w:t>
+              <w:t xml:space="preserve">   5.2 Échéancier Précis &amp; Jalons par Date (Septembre 2026-2029)</w:t>
             </w:r>
           </w:p>
         </w:tc>
@@ -1012,49 +1012,6 @@
           <w:tcPr>
             <w:tcW w:type="dxa" w:w="4824"/>
             <w:shd w:fill="F8FAFC"/>
-          </w:tcPr>
-          <w:p>
-            <w:pPr>
-              <w:spacing w:before="40" w:after="40"/>
-              <w:jc w:val="right"/>
-            </w:pPr>
-            <w:r>
-              <w:rPr>
-                <w:rFonts w:ascii="Arial" w:hAnsi="Arial"/>
-                <w:i/>
-                <w:color w:val="64748B"/>
-                <w:sz w:val="18"/>
-              </w:rPr>
-              <w:t>Page 9</w:t>
-            </w:r>
-          </w:p>
-        </w:tc>
-      </w:tr>
-      <w:tr>
-        <w:tc>
-          <w:tcPr>
-            <w:tcW w:type="dxa" w:w="4824"/>
-            <w:shd w:fill="FFFFFF"/>
-          </w:tcPr>
-          <w:p>
-            <w:pPr>
-              <w:spacing w:before="40" w:after="40"/>
-            </w:pPr>
-            <w:r>
-              <w:rPr>
-                <w:rFonts w:ascii="Arial" w:hAnsi="Arial"/>
-                <w:b/>
-                <w:color w:val="0F172A"/>
-                <w:sz w:val="19"/>
-              </w:rPr>
-              <w:t xml:space="preserve">   5.2 Échéancier Précis &amp; Jalons par Date (Septembre 2026-2029)</w:t>
-            </w:r>
-          </w:p>
-        </w:tc>
-        <w:tc>
-          <w:tcPr>
-            <w:tcW w:type="dxa" w:w="4824"/>
-            <w:shd w:fill="FFFFFF"/>
           </w:tcPr>
           <w:p>
             <w:pPr>
@@ -1077,7 +1034,7 @@
         <w:tc>
           <w:tcPr>
             <w:tcW w:type="dxa" w:w="4824"/>
-            <w:shd w:fill="F8FAFC"/>
+            <w:shd w:fill="FFFFFF"/>
           </w:tcPr>
           <w:p>
             <w:pPr>
@@ -1097,7 +1054,7 @@
         <w:tc>
           <w:tcPr>
             <w:tcW w:type="dxa" w:w="4824"/>
-            <w:shd w:fill="F8FAFC"/>
+            <w:shd w:fill="FFFFFF"/>
           </w:tcPr>
           <w:p>
             <w:pPr>
@@ -1120,7 +1077,7 @@
         <w:tc>
           <w:tcPr>
             <w:tcW w:type="dxa" w:w="4824"/>
-            <w:shd w:fill="FFFFFF"/>
+            <w:shd w:fill="F8FAFC"/>
           </w:tcPr>
           <w:p>
             <w:pPr>
@@ -1140,7 +1097,7 @@
         <w:tc>
           <w:tcPr>
             <w:tcW w:type="dxa" w:w="4824"/>
-            <w:shd w:fill="FFFFFF"/>
+            <w:shd w:fill="F8FAFC"/>
           </w:tcPr>
           <w:p>
             <w:pPr>
@@ -2598,7 +2555,7 @@
           <w:color w:val="1E3A8A"/>
           <w:sz w:val="25"/>
         </w:rPr>
-        <w:t>1.2 Le Terreau Azuréen : Sophia Antipolis, Grasse &amp; Cannes</w:t>
+        <w:t>1.2 Le Terreau Azuréen : Sophia Antipolis, Grasse, Cannes &amp; Poids National</w:t>
       </w:r>
     </w:p>
     <w:p>
@@ -2642,7 +2599,22 @@
           <w:rFonts w:ascii="Arial" w:hAnsi="Arial"/>
           <w:color w:val="1E293B"/>
         </w:rPr>
-        <w:t xml:space="preserve"> : L'un des 4 instituts nationaux d'IA (spécialisé en santé numérique) avec Inria, Eurecom et le CNRS.</w:t>
+        <w:t xml:space="preserve"> : L'un des 4 instituts nationaux d'IA (spécialisé en santé numérique) avec Inria, Eurecom et le CNRS (représentant </w:t>
+      </w:r>
+      <w:r>
+        <w:rPr>
+          <w:rFonts w:ascii="Arial" w:hAnsi="Arial"/>
+          <w:b/>
+          <w:color w:val="0F172A"/>
+        </w:rPr>
+        <w:t>25 % du réseau national des 4 Instituts 3IA</w:t>
+      </w:r>
+      <w:r>
+        <w:rPr>
+          <w:rFonts w:ascii="Arial" w:hAnsi="Arial"/>
+          <w:color w:val="1E293B"/>
+        </w:rPr>
+        <w:t>).</w:t>
       </w:r>
     </w:p>
     <w:p>
@@ -2686,7 +2658,22 @@
           <w:rFonts w:ascii="Arial" w:hAnsi="Arial"/>
           <w:color w:val="1E293B"/>
         </w:rPr>
-        <w:t xml:space="preserve"> : Traitement d'imagerie satellite par IA, observation de la Terre et défense spatiale.</w:t>
+        <w:t xml:space="preserve"> : Traitement d'imagerie satellite par IA, observation de la Terre et défense spatiale (représentant avec Amadeus </w:t>
+      </w:r>
+      <w:r>
+        <w:rPr>
+          <w:rFonts w:ascii="Arial" w:hAnsi="Arial"/>
+          <w:b/>
+          <w:color w:val="0F172A"/>
+        </w:rPr>
+        <w:t>6 % de la dépense privée R&amp;D logicielle/spatiale française</w:t>
+      </w:r>
+      <w:r>
+        <w:rPr>
+          <w:rFonts w:ascii="Arial" w:hAnsi="Arial"/>
+          <w:color w:val="1E293B"/>
+        </w:rPr>
+        <w:t>).</w:t>
       </w:r>
     </w:p>
     <w:p>
@@ -2701,14 +2688,14 @@
           <w:b/>
           <w:color w:val="0F172A"/>
         </w:rPr>
-        <w:t>Grands industriels ancres</w:t>
+        <w:t>Chercheurs R&amp;D Numérique</w:t>
       </w:r>
       <w:r>
         <w:rPr>
           <w:rFonts w:ascii="Arial" w:hAnsi="Arial"/>
           <w:color w:val="1E293B"/>
         </w:rPr>
-        <w:t xml:space="preserve"> : </w:t>
+        <w:t xml:space="preserve"> : ~5 500 chercheurs (public+privé), soit </w:t>
       </w:r>
       <w:r>
         <w:rPr>
@@ -2716,14 +2703,14 @@
           <w:b/>
           <w:color w:val="0F172A"/>
         </w:rPr>
-        <w:t>Amadeus</w:t>
+        <w:t>~12 % du total national hors Île-de-France</w:t>
       </w:r>
       <w:r>
         <w:rPr>
           <w:rFonts w:ascii="Arial" w:hAnsi="Arial"/>
           <w:color w:val="1E293B"/>
         </w:rPr>
-        <w:t xml:space="preserve"> (1er centre de R&amp;D privé de transport en Europe), générateurs de données massives.</w:t>
+        <w:t xml:space="preserve"> (2e bassin français après Paris).</w:t>
       </w:r>
     </w:p>
     <w:p>
@@ -2801,171 +2788,7 @@
           <w:color w:val="1E3A8A"/>
           <w:sz w:val="25"/>
         </w:rPr>
-        <w:t>1.3 Évaluation du Pôle Nice - Sophia Antipolis - Monaco vs Total National</w:t>
-      </w:r>
-    </w:p>
-    <w:p>
-      <w:pPr>
-        <w:pStyle w:val="ListBullet"/>
-        <w:spacing w:before="40" w:after="100" w:line="276" w:lineRule="auto"/>
-        <w:ind w:left="504"/>
-      </w:pPr>
-      <w:r>
-        <w:rPr>
-          <w:rFonts w:ascii="Arial" w:hAnsi="Arial"/>
-          <w:b/>
-          <w:color w:val="0F172A"/>
-        </w:rPr>
-        <w:t>Positionnement Stratégique</w:t>
-      </w:r>
-      <w:r>
-        <w:rPr>
-          <w:rFonts w:ascii="Arial" w:hAnsi="Arial"/>
-          <w:color w:val="1E293B"/>
-        </w:rPr>
-        <w:t xml:space="preserve"> : Afin d'emporter l'adhésion de l'État et de la Commission Européenne, le territoire fait valoir son </w:t>
-      </w:r>
-      <w:r>
-        <w:rPr>
-          <w:rFonts w:ascii="Arial" w:hAnsi="Arial"/>
-          <w:b/>
-          <w:color w:val="0F172A"/>
-        </w:rPr>
-        <w:t>poids relatif massif à l'échelle de la France</w:t>
-      </w:r>
-      <w:r>
-        <w:rPr>
-          <w:rFonts w:ascii="Arial" w:hAnsi="Arial"/>
-          <w:color w:val="1E293B"/>
-        </w:rPr>
-        <w:t xml:space="preserve"> :</w:t>
-      </w:r>
-    </w:p>
-    <w:p>
-      <w:pPr>
-        <w:pStyle w:val="ListBullet"/>
-        <w:spacing w:before="40" w:after="100" w:line="276" w:lineRule="auto"/>
-        <w:ind w:left="504"/>
-      </w:pPr>
-      <w:r>
-        <w:rPr>
-          <w:rFonts w:ascii="Arial" w:hAnsi="Arial"/>
-          <w:b/>
-          <w:color w:val="0F172A"/>
-        </w:rPr>
-        <w:t>Chercheurs R&amp;D Numérique</w:t>
-      </w:r>
-      <w:r>
-        <w:rPr>
-          <w:rFonts w:ascii="Arial" w:hAnsi="Arial"/>
-          <w:color w:val="1E293B"/>
-        </w:rPr>
-        <w:t xml:space="preserve"> : ~5 500 chercheurs (public+privé), soit </w:t>
-      </w:r>
-      <w:r>
-        <w:rPr>
-          <w:rFonts w:ascii="Arial" w:hAnsi="Arial"/>
-          <w:b/>
-          <w:color w:val="0F172A"/>
-        </w:rPr>
-        <w:t>~12 % du total hors Île-de-France</w:t>
-      </w:r>
-      <w:r>
-        <w:rPr>
-          <w:rFonts w:ascii="Arial" w:hAnsi="Arial"/>
-          <w:color w:val="1E293B"/>
-        </w:rPr>
-        <w:t xml:space="preserve"> (2e bassin national après Paris).</w:t>
-      </w:r>
-    </w:p>
-    <w:p>
-      <w:pPr>
-        <w:pStyle w:val="ListBullet"/>
-        <w:spacing w:before="40" w:after="100" w:line="276" w:lineRule="auto"/>
-        <w:ind w:left="504"/>
-      </w:pPr>
-      <w:r>
-        <w:rPr>
-          <w:rFonts w:ascii="Arial" w:hAnsi="Arial"/>
-          <w:b/>
-          <w:color w:val="0F172A"/>
-        </w:rPr>
-        <w:t>Recherche Académique 3IA</w:t>
-      </w:r>
-      <w:r>
-        <w:rPr>
-          <w:rFonts w:ascii="Arial" w:hAnsi="Arial"/>
-          <w:color w:val="1E293B"/>
-        </w:rPr>
-        <w:t xml:space="preserve"> : &gt; 100 chaires mondiales, soit </w:t>
-      </w:r>
-      <w:r>
-        <w:rPr>
-          <w:rFonts w:ascii="Arial" w:hAnsi="Arial"/>
-          <w:b/>
-          <w:color w:val="0F172A"/>
-        </w:rPr>
-        <w:t>~25 % du réseau national des 4 Instituts 3IA</w:t>
-      </w:r>
-      <w:r>
-        <w:rPr>
-          <w:rFonts w:ascii="Arial" w:hAnsi="Arial"/>
-          <w:color w:val="1E293B"/>
-        </w:rPr>
-        <w:t xml:space="preserve"> (Paris, Grenoble, Toulouse, Nice-Sophia).</w:t>
-      </w:r>
-    </w:p>
-    <w:p>
-      <w:pPr>
-        <w:pStyle w:val="ListBullet"/>
-        <w:spacing w:before="40" w:after="100" w:line="276" w:lineRule="auto"/>
-        <w:ind w:left="504"/>
-      </w:pPr>
-      <w:r>
-        <w:rPr>
-          <w:rFonts w:ascii="Arial" w:hAnsi="Arial"/>
-          <w:b/>
-          <w:color w:val="0F172A"/>
-        </w:rPr>
-        <w:t>R&amp;D Privée</w:t>
-      </w:r>
-      <w:r>
-        <w:rPr>
-          <w:rFonts w:ascii="Arial" w:hAnsi="Arial"/>
-          <w:color w:val="1E293B"/>
-        </w:rPr>
-        <w:t xml:space="preserve"> : Amadeus &amp; Thales Alenia Space (&gt;6 500 ingénieurs), soit </w:t>
-      </w:r>
-      <w:r>
-        <w:rPr>
-          <w:rFonts w:ascii="Arial" w:hAnsi="Arial"/>
-          <w:b/>
-          <w:color w:val="0F172A"/>
-        </w:rPr>
-        <w:t>~6 % de la dépense privée logicielle/spatiale française</w:t>
-      </w:r>
-      <w:r>
-        <w:rPr>
-          <w:rFonts w:ascii="Arial" w:hAnsi="Arial"/>
-          <w:color w:val="1E293B"/>
-        </w:rPr>
-        <w:t>.</w:t>
-      </w:r>
-    </w:p>
-    <w:p>
-      <w:pPr>
-        <w:pStyle w:val="Heading2"/>
-        <w:keepNext/>
-        <w:spacing w:before="280" w:after="120"/>
-      </w:pPr>
-      <w:r>
-        <w:rPr>
-          <w:rFonts w:ascii="Georgia" w:hAnsi="Georgia"/>
-          <w:b/>
-          <w:color w:val="1E3A8A"/>
-          <w:sz w:val="25"/>
-        </w:rPr>
-        <w:t>1.4 Atouts Monaco, Flux Transfrontaliers &amp; Extension Business</w:t>
+        <w:t>1.3 Atouts Monaco, Flux Transfrontaliers &amp; Extension Business</w:t>
       </w:r>
     </w:p>
     <w:p>
@@ -3091,7 +2914,7 @@
           <w:color w:val="1E3A8A"/>
           <w:sz w:val="25"/>
         </w:rPr>
-        <w:t>1.5 L'Opportunité Historique : 30 Md€ UE &amp; 7 AI Gigafactories</w:t>
+        <w:t>1.4 L'Opportunité Historique : 30 Md€ UE &amp; 7 AI Gigafactories</w:t>
       </w:r>
     </w:p>
     <w:p>
@@ -3277,7 +3100,7 @@
           <w:color w:val="1E3A8A"/>
           <w:sz w:val="25"/>
         </w:rPr>
-        <w:t>1.6 Structuration Opérationnelle &amp; Capture des Subventions</w:t>
+        <w:t>1.5 Structuration Opérationnelle &amp; Capture des Subventions</w:t>
       </w:r>
     </w:p>
     <w:p>

</xml_diff>

<commit_message>
feat: re-add section 4.3 PME/PMI excellence hub and reusable souverain AI use case library
</commit_message>
<xml_diff>
--- a/Le_Pacte_Nice_IA.docx
+++ b/Le_Pacte_Nice_IA.docx
@@ -918,7 +918,7 @@
                 <w:color w:val="0F172A"/>
                 <w:sz w:val="19"/>
               </w:rPr>
-              <w:t>5. Feuille de Route Précise (Septembre 2026-2029) &amp; Résumé Annuel</w:t>
+              <w:t xml:space="preserve">   4.3 Pôle d'Excellence PME/PMI &amp; Bibliothèque de Cas d'Usage Souverains</w:t>
             </w:r>
           </w:p>
         </w:tc>
@@ -961,7 +961,7 @@
                 <w:color w:val="0F172A"/>
                 <w:sz w:val="19"/>
               </w:rPr>
-              <w:t xml:space="preserve">   5.1 Présidence Éric Ciotti &amp; Direction Benoît SIGWALD (2,5j/sem)</w:t>
+              <w:t>5. Feuille de Route Précise (Septembre 2026-2029) &amp; Résumé Annuel</w:t>
             </w:r>
           </w:p>
         </w:tc>
@@ -982,7 +982,7 @@
                 <w:color w:val="64748B"/>
                 <w:sz w:val="18"/>
               </w:rPr>
-              <w:t>Page 9</w:t>
+              <w:t>Page 10</w:t>
             </w:r>
           </w:p>
         </w:tc>
@@ -1004,7 +1004,7 @@
                 <w:color w:val="0F172A"/>
                 <w:sz w:val="19"/>
               </w:rPr>
-              <w:t xml:space="preserve">   5.2 Échéancier Précis &amp; Jalons par Date (Septembre 2026-2029)</w:t>
+              <w:t xml:space="preserve">   5.1 Présidence Éric Ciotti &amp; Direction Benoît SIGWALD (2,5j/sem)</w:t>
             </w:r>
           </w:p>
         </w:tc>
@@ -1047,6 +1047,49 @@
                 <w:color w:val="0F172A"/>
                 <w:sz w:val="19"/>
               </w:rPr>
+              <w:t xml:space="preserve">   5.2 Échéancier Précis &amp; Jalons par Date (Septembre 2026-2029)</w:t>
+            </w:r>
+          </w:p>
+        </w:tc>
+        <w:tc>
+          <w:tcPr>
+            <w:tcW w:type="dxa" w:w="4824"/>
+            <w:shd w:fill="FFFFFF"/>
+          </w:tcPr>
+          <w:p>
+            <w:pPr>
+              <w:spacing w:before="40" w:after="40"/>
+              <w:jc w:val="right"/>
+            </w:pPr>
+            <w:r>
+              <w:rPr>
+                <w:rFonts w:ascii="Arial" w:hAnsi="Arial"/>
+                <w:i/>
+                <w:color w:val="64748B"/>
+                <w:sz w:val="18"/>
+              </w:rPr>
+              <w:t>Page 10</w:t>
+            </w:r>
+          </w:p>
+        </w:tc>
+      </w:tr>
+      <w:tr>
+        <w:tc>
+          <w:tcPr>
+            <w:tcW w:type="dxa" w:w="4824"/>
+            <w:shd w:fill="F8FAFC"/>
+          </w:tcPr>
+          <w:p>
+            <w:pPr>
+              <w:spacing w:before="40" w:after="40"/>
+            </w:pPr>
+            <w:r>
+              <w:rPr>
+                <w:rFonts w:ascii="Arial" w:hAnsi="Arial"/>
+                <w:b/>
+                <w:color w:val="0F172A"/>
+                <w:sz w:val="19"/>
+              </w:rPr>
               <w:t xml:space="preserve">   5.3 Résumé Consolidé du Coût par Année Budgétaire</w:t>
             </w:r>
           </w:p>
@@ -1054,7 +1097,7 @@
         <w:tc>
           <w:tcPr>
             <w:tcW w:type="dxa" w:w="4824"/>
-            <w:shd w:fill="FFFFFF"/>
+            <w:shd w:fill="F8FAFC"/>
           </w:tcPr>
           <w:p>
             <w:pPr>
@@ -1077,7 +1120,7 @@
         <w:tc>
           <w:tcPr>
             <w:tcW w:type="dxa" w:w="4824"/>
-            <w:shd w:fill="F8FAFC"/>
+            <w:shd w:fill="FFFFFF"/>
           </w:tcPr>
           <w:p>
             <w:pPr>
@@ -1097,7 +1140,7 @@
         <w:tc>
           <w:tcPr>
             <w:tcW w:type="dxa" w:w="4824"/>
-            <w:shd w:fill="F8FAFC"/>
+            <w:shd w:fill="FFFFFF"/>
           </w:tcPr>
           <w:p>
             <w:pPr>
@@ -4217,6 +4260,124 @@
       </w:r>
     </w:p>
     <w:p>
+      <w:pPr>
+        <w:pStyle w:val="Heading2"/>
+        <w:keepNext/>
+        <w:spacing w:before="280" w:after="120"/>
+      </w:pPr>
+      <w:r>
+        <w:rPr>
+          <w:rFonts w:ascii="Georgia" w:hAnsi="Georgia"/>
+          <w:b/>
+          <w:color w:val="1E3A8A"/>
+          <w:sz w:val="25"/>
+        </w:rPr>
+        <w:t>4.3 Pôle d'Excellence PME/PMI &amp; Bibliothèque de Cas d'Usage Souverains</w:t>
+      </w:r>
+    </w:p>
+    <w:p>
+      <w:pPr>
+        <w:pStyle w:val="ListBullet"/>
+        <w:spacing w:before="40" w:after="100" w:line="276" w:lineRule="auto"/>
+        <w:ind w:left="504"/>
+      </w:pPr>
+      <w:r>
+        <w:rPr>
+          <w:rFonts w:ascii="Arial" w:hAnsi="Arial"/>
+          <w:b/>
+          <w:color w:val="0F172A"/>
+        </w:rPr>
+        <w:t>Guichet Unique PME/PMI</w:t>
+      </w:r>
+      <w:r>
+        <w:rPr>
+          <w:rFonts w:ascii="Arial" w:hAnsi="Arial"/>
+          <w:color w:val="1E293B"/>
+        </w:rPr>
+        <w:t xml:space="preserve"> : Création du Pôle d'Excellence Métropolitain pour accompagner la transformation numérique des 200 PME/PMI clés des Alpes-Maritimes et de Monaco.</w:t>
+      </w:r>
+    </w:p>
+    <w:p>
+      <w:pPr>
+        <w:pStyle w:val="ListBullet"/>
+        <w:spacing w:before="40" w:after="100" w:line="276" w:lineRule="auto"/>
+        <w:ind w:left="504"/>
+      </w:pPr>
+      <w:r>
+        <w:rPr>
+          <w:rFonts w:ascii="Arial" w:hAnsi="Arial"/>
+          <w:b/>
+          <w:color w:val="0F172A"/>
+        </w:rPr>
+        <w:t>Bibliothèque de Cas d'Usage Réutilisables</w:t>
+      </w:r>
+      <w:r>
+        <w:rPr>
+          <w:rFonts w:ascii="Arial" w:hAnsi="Arial"/>
+          <w:color w:val="1E293B"/>
+        </w:rPr>
+        <w:t xml:space="preserve"> : Mise à disposition d'un catalogue de briques d'IA souveraines pré-packagées (analyse sémantique de contrats, contrôle qualité vidéo pour la chimie/arômes à Grasse, maintenance prédictive spatiale pour Cannes).</w:t>
+      </w:r>
+    </w:p>
+    <w:p>
+      <w:pPr>
+        <w:pStyle w:val="ListBullet"/>
+        <w:spacing w:before="40" w:after="100" w:line="276" w:lineRule="auto"/>
+        <w:ind w:left="504"/>
+      </w:pPr>
+      <w:r>
+        <w:rPr>
+          <w:rFonts w:ascii="Arial" w:hAnsi="Arial"/>
+          <w:b/>
+          <w:color w:val="0F172A"/>
+        </w:rPr>
+        <w:t>Accélération de la Migration IA</w:t>
+      </w:r>
+      <w:r>
+        <w:rPr>
+          <w:rFonts w:ascii="Arial" w:hAnsi="Arial"/>
+          <w:color w:val="1E293B"/>
+        </w:rPr>
+        <w:t xml:space="preserve"> : Réduction par 3 des coûts et des délais d'intégration grâce au réemploi des briques logicielles souveraines développées par la Métropole.</w:t>
+      </w:r>
+    </w:p>
+    <w:p>
+      <w:pPr>
+        <w:pStyle w:val="ListBullet"/>
+        <w:spacing w:before="40" w:after="100" w:line="276" w:lineRule="auto"/>
+        <w:ind w:left="504"/>
+      </w:pPr>
+      <w:r>
+        <w:rPr>
+          <w:rFonts w:ascii="Arial" w:hAnsi="Arial"/>
+          <w:b/>
+          <w:color w:val="0F172A"/>
+        </w:rPr>
+        <w:t>Accompagnement Financement UE (EDIH)</w:t>
+      </w:r>
+      <w:r>
+        <w:rPr>
+          <w:rFonts w:ascii="Arial" w:hAnsi="Arial"/>
+          <w:color w:val="1E293B"/>
+        </w:rPr>
+        <w:t xml:space="preserve"> : Prise en charge jusqu'à 70 % des coûts de diagnostic et de migration IA via le guichet européen </w:t>
+      </w:r>
+      <w:r>
+        <w:rPr>
+          <w:rFonts w:ascii="Arial" w:hAnsi="Arial"/>
+          <w:i/>
+        </w:rPr>
+        <w:t>Digital Europe</w:t>
+      </w:r>
+      <w:r>
+        <w:rPr>
+          <w:rFonts w:ascii="Arial" w:hAnsi="Arial"/>
+          <w:color w:val="1E293B"/>
+        </w:rPr>
+        <w:t xml:space="preserve"> / EDIH Côte d'Azur.</w:t>
+      </w:r>
+    </w:p>
+    <w:p>
       <w:r>
         <w:br w:type="page"/>
       </w:r>
@@ -5780,7 +5941,7 @@
                 <w:color w:val="1E293B"/>
                 <w:sz w:val="16"/>
               </w:rPr>
-              <w:t>L6.1 Extension Zone Franche Numérique</w:t>
+              <w:t>L6.1 Pôle Excellence PME/PMI &amp; Bibliothèque Cas Usage</w:t>
             </w:r>
           </w:p>
         </w:tc>
@@ -5818,7 +5979,7 @@
                 <w:color w:val="1E293B"/>
                 <w:sz w:val="16"/>
               </w:rPr>
-              <w:t>Attraction PME &amp; Data Center.</w:t>
+              <w:t>Migration IA de 200 PME/PMI.</w:t>
             </w:r>
           </w:p>
         </w:tc>

</xml_diff>

<commit_message>
feat: align exactly with reference PDF format, fully develop section 4.4 and simplify budget into Mairie, Metropole, and Monaco extension axes
</commit_message>
<xml_diff>
--- a/Le_Pacte_Nice_IA.docx
+++ b/Le_Pacte_Nice_IA.docx
@@ -46,7 +46,7 @@
     </w:p>
     <w:p>
       <w:pPr>
-        <w:spacing w:before="0" w:after="400"/>
+        <w:spacing w:before="0" w:after="320"/>
       </w:pPr>
       <w:r>
         <w:rPr>
@@ -71,7 +71,7 @@
           <w:color w:val="0F172A"/>
           <w:sz w:val="30"/>
         </w:rPr>
-        <w:t>SOMMAIRE &amp; INDEX DU DOCUMENT</w:t>
+        <w:t>Index</w:t>
       </w:r>
     </w:p>
     <w:tbl>
@@ -81,25 +81,65 @@
         <w:tblLook w:firstColumn="1" w:firstRow="1" w:lastColumn="0" w:lastRow="0" w:noHBand="0" w:noVBand="1" w:val="04A0"/>
       </w:tblPr>
       <w:tblGrid>
-        <w:gridCol w:w="4824"/>
-        <w:gridCol w:w="4824"/>
+        <w:gridCol w:w="4896"/>
+        <w:gridCol w:w="4896"/>
       </w:tblGrid>
       <w:tr>
         <w:tc>
           <w:tcPr>
-            <w:tcW w:type="dxa" w:w="4824"/>
-            <w:shd w:fill="FFFFFF"/>
+            <w:tcW w:type="dxa" w:w="4896"/>
           </w:tcPr>
           <w:p>
             <w:pPr>
-              <w:spacing w:before="40" w:after="40"/>
+              <w:spacing w:before="30" w:after="30"/>
             </w:pPr>
             <w:r>
               <w:rPr>
                 <w:rFonts w:ascii="Arial" w:hAnsi="Arial"/>
                 <w:b/>
                 <w:color w:val="0F172A"/>
-                <w:sz w:val="19"/>
+                <w:sz w:val="18"/>
+              </w:rPr>
+              <w:t>Index</w:t>
+            </w:r>
+          </w:p>
+        </w:tc>
+        <w:tc>
+          <w:tcPr>
+            <w:tcW w:type="dxa" w:w="4896"/>
+          </w:tcPr>
+          <w:p>
+            <w:pPr>
+              <w:spacing w:before="30" w:after="30"/>
+              <w:jc w:val="right"/>
+            </w:pPr>
+            <w:r>
+              <w:rPr>
+                <w:rFonts w:ascii="Arial" w:hAnsi="Arial"/>
+                <w:b/>
+                <w:color w:val="0F172A"/>
+                <w:sz w:val="18"/>
+              </w:rPr>
+              <w:t>1</w:t>
+            </w:r>
+          </w:p>
+        </w:tc>
+      </w:tr>
+      <w:tr>
+        <w:tc>
+          <w:tcPr>
+            <w:tcW w:type="dxa" w:w="4896"/>
+          </w:tcPr>
+          <w:p>
+            <w:pPr>
+              <w:spacing w:before="30" w:after="30"/>
+            </w:pPr>
+            <w:r>
+              <w:rPr>
+                <w:rFonts w:ascii="Georgia" w:hAnsi="Georgia"/>
+                <w:b/>
+                <w:color w:val="0F172A"/>
+                <w:sz w:val="18"/>
               </w:rPr>
               <w:t>Résumé Exécutif &amp; Chiffrage Consolidé pour M. le Maire</w:t>
             </w:r>
@@ -107,22 +147,21 @@
         </w:tc>
         <w:tc>
           <w:tcPr>
-            <w:tcW w:type="dxa" w:w="4824"/>
-            <w:shd w:fill="FFFFFF"/>
+            <w:tcW w:type="dxa" w:w="4896"/>
           </w:tcPr>
           <w:p>
             <w:pPr>
-              <w:spacing w:before="40" w:after="40"/>
+              <w:spacing w:before="30" w:after="30"/>
               <w:jc w:val="right"/>
             </w:pPr>
             <w:r>
               <w:rPr>
                 <w:rFonts w:ascii="Arial" w:hAnsi="Arial"/>
-                <w:i/>
-                <w:color w:val="64748B"/>
+                <w:b/>
+                <w:color w:val="0F172A"/>
                 <w:sz w:val="18"/>
               </w:rPr>
-              <w:t>Page 2</w:t>
+              <w:t>1</w:t>
             </w:r>
           </w:p>
         </w:tc>
@@ -130,19 +169,18 @@
       <w:tr>
         <w:tc>
           <w:tcPr>
-            <w:tcW w:type="dxa" w:w="4824"/>
-            <w:shd w:fill="F8FAFC"/>
+            <w:tcW w:type="dxa" w:w="4896"/>
           </w:tcPr>
           <w:p>
             <w:pPr>
-              <w:spacing w:before="40" w:after="40"/>
+              <w:spacing w:before="30" w:after="30"/>
             </w:pPr>
             <w:r>
               <w:rPr>
-                <w:rFonts w:ascii="Arial" w:hAnsi="Arial"/>
+                <w:rFonts w:ascii="Georgia" w:hAnsi="Georgia"/>
                 <w:b/>
                 <w:color w:val="0F172A"/>
-                <w:sz w:val="19"/>
+                <w:sz w:val="18"/>
               </w:rPr>
               <w:t>1. Diagnostic Territorial &amp; Opportunités Européennes</w:t>
             </w:r>
@@ -150,22 +188,21 @@
         </w:tc>
         <w:tc>
           <w:tcPr>
-            <w:tcW w:type="dxa" w:w="4824"/>
-            <w:shd w:fill="F8FAFC"/>
+            <w:tcW w:type="dxa" w:w="4896"/>
           </w:tcPr>
           <w:p>
             <w:pPr>
-              <w:spacing w:before="40" w:after="40"/>
+              <w:spacing w:before="30" w:after="30"/>
               <w:jc w:val="right"/>
             </w:pPr>
             <w:r>
               <w:rPr>
                 <w:rFonts w:ascii="Arial" w:hAnsi="Arial"/>
-                <w:i/>
-                <w:color w:val="64748B"/>
+                <w:b/>
+                <w:color w:val="0F172A"/>
                 <w:sz w:val="18"/>
               </w:rPr>
-              <w:t>Page 3</w:t>
+              <w:t>2</w:t>
             </w:r>
           </w:p>
         </w:tc>
@@ -173,42 +210,40 @@
       <w:tr>
         <w:tc>
           <w:tcPr>
-            <w:tcW w:type="dxa" w:w="4824"/>
-            <w:shd w:fill="FFFFFF"/>
+            <w:tcW w:type="dxa" w:w="4896"/>
           </w:tcPr>
           <w:p>
             <w:pPr>
-              <w:spacing w:before="40" w:after="40"/>
+              <w:spacing w:before="30" w:after="30"/>
+            </w:pPr>
+            <w:r>
+              <w:rPr>
+                <w:rFonts w:ascii="Georgia" w:hAnsi="Georgia"/>
+                <w:b/>
+                <w:color w:val="0F172A"/>
+                <w:sz w:val="18"/>
+              </w:rPr>
+              <w:t>1.1 Alignement Institutionnel &amp; Leadership</w:t>
+            </w:r>
+          </w:p>
+        </w:tc>
+        <w:tc>
+          <w:tcPr>
+            <w:tcW w:type="dxa" w:w="4896"/>
+          </w:tcPr>
+          <w:p>
+            <w:pPr>
+              <w:spacing w:before="30" w:after="30"/>
+              <w:jc w:val="right"/>
             </w:pPr>
             <w:r>
               <w:rPr>
                 <w:rFonts w:ascii="Arial" w:hAnsi="Arial"/>
                 <w:b/>
                 <w:color w:val="0F172A"/>
-                <w:sz w:val="19"/>
-              </w:rPr>
-              <w:t xml:space="preserve">   1.1 Alignement Institutionnel &amp; Leadership Métropolitain</w:t>
-            </w:r>
-          </w:p>
-        </w:tc>
-        <w:tc>
-          <w:tcPr>
-            <w:tcW w:type="dxa" w:w="4824"/>
-            <w:shd w:fill="FFFFFF"/>
-          </w:tcPr>
-          <w:p>
-            <w:pPr>
-              <w:spacing w:before="40" w:after="40"/>
-              <w:jc w:val="right"/>
-            </w:pPr>
-            <w:r>
-              <w:rPr>
-                <w:rFonts w:ascii="Arial" w:hAnsi="Arial"/>
-                <w:i/>
-                <w:color w:val="64748B"/>
                 <w:sz w:val="18"/>
               </w:rPr>
-              <w:t>Page 3</w:t>
+              <w:t>2</w:t>
             </w:r>
           </w:p>
         </w:tc>
@@ -216,42 +251,40 @@
       <w:tr>
         <w:tc>
           <w:tcPr>
-            <w:tcW w:type="dxa" w:w="4824"/>
-            <w:shd w:fill="F8FAFC"/>
+            <w:tcW w:type="dxa" w:w="4896"/>
           </w:tcPr>
           <w:p>
             <w:pPr>
-              <w:spacing w:before="40" w:after="40"/>
+              <w:spacing w:before="30" w:after="30"/>
+            </w:pPr>
+            <w:r>
+              <w:rPr>
+                <w:rFonts w:ascii="Georgia" w:hAnsi="Georgia"/>
+                <w:b/>
+                <w:color w:val="0F172A"/>
+                <w:sz w:val="18"/>
+              </w:rPr>
+              <w:t>1.2 Le Terreau Azuréen : Sophia Antipolis, Grasse, Cannes &amp; Poids National</w:t>
+            </w:r>
+          </w:p>
+        </w:tc>
+        <w:tc>
+          <w:tcPr>
+            <w:tcW w:type="dxa" w:w="4896"/>
+          </w:tcPr>
+          <w:p>
+            <w:pPr>
+              <w:spacing w:before="30" w:after="30"/>
+              <w:jc w:val="right"/>
             </w:pPr>
             <w:r>
               <w:rPr>
                 <w:rFonts w:ascii="Arial" w:hAnsi="Arial"/>
                 <w:b/>
                 <w:color w:val="0F172A"/>
-                <w:sz w:val="19"/>
-              </w:rPr>
-              <w:t xml:space="preserve">   1.2 Le Terreau Azuréen : Sophia Antipolis, Grasse, Cannes &amp; Poids National</w:t>
-            </w:r>
-          </w:p>
-        </w:tc>
-        <w:tc>
-          <w:tcPr>
-            <w:tcW w:type="dxa" w:w="4824"/>
-            <w:shd w:fill="F8FAFC"/>
-          </w:tcPr>
-          <w:p>
-            <w:pPr>
-              <w:spacing w:before="40" w:after="40"/>
-              <w:jc w:val="right"/>
-            </w:pPr>
-            <w:r>
-              <w:rPr>
-                <w:rFonts w:ascii="Arial" w:hAnsi="Arial"/>
-                <w:i/>
-                <w:color w:val="64748B"/>
                 <w:sz w:val="18"/>
               </w:rPr>
-              <w:t>Page 3</w:t>
+              <w:t>2</w:t>
             </w:r>
           </w:p>
         </w:tc>
@@ -259,42 +292,40 @@
       <w:tr>
         <w:tc>
           <w:tcPr>
-            <w:tcW w:type="dxa" w:w="4824"/>
-            <w:shd w:fill="FFFFFF"/>
+            <w:tcW w:type="dxa" w:w="4896"/>
           </w:tcPr>
           <w:p>
             <w:pPr>
-              <w:spacing w:before="40" w:after="40"/>
+              <w:spacing w:before="30" w:after="30"/>
+            </w:pPr>
+            <w:r>
+              <w:rPr>
+                <w:rFonts w:ascii="Georgia" w:hAnsi="Georgia"/>
+                <w:b/>
+                <w:color w:val="0F172A"/>
+                <w:sz w:val="18"/>
+              </w:rPr>
+              <w:t>1.3 Atouts Monaco, Flux Transfrontaliers &amp; Extension Business</w:t>
+            </w:r>
+          </w:p>
+        </w:tc>
+        <w:tc>
+          <w:tcPr>
+            <w:tcW w:type="dxa" w:w="4896"/>
+          </w:tcPr>
+          <w:p>
+            <w:pPr>
+              <w:spacing w:before="30" w:after="30"/>
+              <w:jc w:val="right"/>
             </w:pPr>
             <w:r>
               <w:rPr>
                 <w:rFonts w:ascii="Arial" w:hAnsi="Arial"/>
                 <w:b/>
                 <w:color w:val="0F172A"/>
-                <w:sz w:val="19"/>
-              </w:rPr>
-              <w:t xml:space="preserve">   1.3 Atouts Monaco, Flux Transfrontaliers &amp; Extension Business</w:t>
-            </w:r>
-          </w:p>
-        </w:tc>
-        <w:tc>
-          <w:tcPr>
-            <w:tcW w:type="dxa" w:w="4824"/>
-            <w:shd w:fill="FFFFFF"/>
-          </w:tcPr>
-          <w:p>
-            <w:pPr>
-              <w:spacing w:before="40" w:after="40"/>
-              <w:jc w:val="right"/>
-            </w:pPr>
-            <w:r>
-              <w:rPr>
-                <w:rFonts w:ascii="Arial" w:hAnsi="Arial"/>
-                <w:i/>
-                <w:color w:val="64748B"/>
                 <w:sz w:val="18"/>
               </w:rPr>
-              <w:t>Page 4</w:t>
+              <w:t>3</w:t>
             </w:r>
           </w:p>
         </w:tc>
@@ -302,42 +333,40 @@
       <w:tr>
         <w:tc>
           <w:tcPr>
-            <w:tcW w:type="dxa" w:w="4824"/>
-            <w:shd w:fill="F8FAFC"/>
+            <w:tcW w:type="dxa" w:w="4896"/>
           </w:tcPr>
           <w:p>
             <w:pPr>
-              <w:spacing w:before="40" w:after="40"/>
+              <w:spacing w:before="30" w:after="30"/>
+            </w:pPr>
+            <w:r>
+              <w:rPr>
+                <w:rFonts w:ascii="Georgia" w:hAnsi="Georgia"/>
+                <w:b/>
+                <w:color w:val="0F172A"/>
+                <w:sz w:val="18"/>
+              </w:rPr>
+              <w:t>1.4 L'Opportunité Historique : 30 Md€ UE &amp; 7 AI Gigafactories</w:t>
+            </w:r>
+          </w:p>
+        </w:tc>
+        <w:tc>
+          <w:tcPr>
+            <w:tcW w:type="dxa" w:w="4896"/>
+          </w:tcPr>
+          <w:p>
+            <w:pPr>
+              <w:spacing w:before="30" w:after="30"/>
+              <w:jc w:val="right"/>
             </w:pPr>
             <w:r>
               <w:rPr>
                 <w:rFonts w:ascii="Arial" w:hAnsi="Arial"/>
                 <w:b/>
                 <w:color w:val="0F172A"/>
-                <w:sz w:val="19"/>
-              </w:rPr>
-              <w:t xml:space="preserve">   1.4 L'Opportunité Historique : 30 Md€ UE &amp; 7 AI Gigafactories</w:t>
-            </w:r>
-          </w:p>
-        </w:tc>
-        <w:tc>
-          <w:tcPr>
-            <w:tcW w:type="dxa" w:w="4824"/>
-            <w:shd w:fill="F8FAFC"/>
-          </w:tcPr>
-          <w:p>
-            <w:pPr>
-              <w:spacing w:before="40" w:after="40"/>
-              <w:jc w:val="right"/>
-            </w:pPr>
-            <w:r>
-              <w:rPr>
-                <w:rFonts w:ascii="Arial" w:hAnsi="Arial"/>
-                <w:i/>
-                <w:color w:val="64748B"/>
                 <w:sz w:val="18"/>
               </w:rPr>
-              <w:t>Page 4</w:t>
+              <w:t>4</w:t>
             </w:r>
           </w:p>
         </w:tc>
@@ -345,42 +374,40 @@
       <w:tr>
         <w:tc>
           <w:tcPr>
-            <w:tcW w:type="dxa" w:w="4824"/>
-            <w:shd w:fill="FFFFFF"/>
+            <w:tcW w:type="dxa" w:w="4896"/>
           </w:tcPr>
           <w:p>
             <w:pPr>
-              <w:spacing w:before="40" w:after="40"/>
+              <w:spacing w:before="30" w:after="30"/>
+            </w:pPr>
+            <w:r>
+              <w:rPr>
+                <w:rFonts w:ascii="Georgia" w:hAnsi="Georgia"/>
+                <w:b/>
+                <w:color w:val="0F172A"/>
+                <w:sz w:val="18"/>
+              </w:rPr>
+              <w:t>1.5 Structuration Opérationnelle &amp; Capture des Subventions</w:t>
+            </w:r>
+          </w:p>
+        </w:tc>
+        <w:tc>
+          <w:tcPr>
+            <w:tcW w:type="dxa" w:w="4896"/>
+          </w:tcPr>
+          <w:p>
+            <w:pPr>
+              <w:spacing w:before="30" w:after="30"/>
+              <w:jc w:val="right"/>
             </w:pPr>
             <w:r>
               <w:rPr>
                 <w:rFonts w:ascii="Arial" w:hAnsi="Arial"/>
                 <w:b/>
                 <w:color w:val="0F172A"/>
-                <w:sz w:val="19"/>
-              </w:rPr>
-              <w:t xml:space="preserve">   1.5 Structuration Opérationnelle &amp; Capture des Subventions</w:t>
-            </w:r>
-          </w:p>
-        </w:tc>
-        <w:tc>
-          <w:tcPr>
-            <w:tcW w:type="dxa" w:w="4824"/>
-            <w:shd w:fill="FFFFFF"/>
-          </w:tcPr>
-          <w:p>
-            <w:pPr>
-              <w:spacing w:before="40" w:after="40"/>
-              <w:jc w:val="right"/>
-            </w:pPr>
-            <w:r>
-              <w:rPr>
-                <w:rFonts w:ascii="Arial" w:hAnsi="Arial"/>
-                <w:i/>
-                <w:color w:val="64748B"/>
                 <w:sz w:val="18"/>
               </w:rPr>
-              <w:t>Page 5</w:t>
+              <w:t>4</w:t>
             </w:r>
           </w:p>
         </w:tc>
@@ -388,19 +415,18 @@
       <w:tr>
         <w:tc>
           <w:tcPr>
-            <w:tcW w:type="dxa" w:w="4824"/>
-            <w:shd w:fill="F8FAFC"/>
+            <w:tcW w:type="dxa" w:w="4896"/>
           </w:tcPr>
           <w:p>
             <w:pPr>
-              <w:spacing w:before="40" w:after="40"/>
+              <w:spacing w:before="30" w:after="30"/>
             </w:pPr>
             <w:r>
               <w:rPr>
-                <w:rFonts w:ascii="Arial" w:hAnsi="Arial"/>
+                <w:rFonts w:ascii="Georgia" w:hAnsi="Georgia"/>
                 <w:b/>
                 <w:color w:val="0F172A"/>
-                <w:sz w:val="19"/>
+                <w:sz w:val="18"/>
               </w:rPr>
               <w:t>2. Pôle 1 : Axe Ville de Nice (Sécurité &amp; Cadre de Vie)</w:t>
             </w:r>
@@ -408,22 +434,21 @@
         </w:tc>
         <w:tc>
           <w:tcPr>
-            <w:tcW w:type="dxa" w:w="4824"/>
-            <w:shd w:fill="F8FAFC"/>
+            <w:tcW w:type="dxa" w:w="4896"/>
           </w:tcPr>
           <w:p>
             <w:pPr>
-              <w:spacing w:before="40" w:after="40"/>
+              <w:spacing w:before="30" w:after="30"/>
               <w:jc w:val="right"/>
             </w:pPr>
             <w:r>
               <w:rPr>
                 <w:rFonts w:ascii="Arial" w:hAnsi="Arial"/>
-                <w:i/>
-                <w:color w:val="64748B"/>
+                <w:b/>
+                <w:color w:val="0F172A"/>
                 <w:sz w:val="18"/>
               </w:rPr>
-              <w:t>Page 5</w:t>
+              <w:t>5</w:t>
             </w:r>
           </w:p>
         </w:tc>
@@ -431,42 +456,40 @@
       <w:tr>
         <w:tc>
           <w:tcPr>
-            <w:tcW w:type="dxa" w:w="4824"/>
-            <w:shd w:fill="FFFFFF"/>
+            <w:tcW w:type="dxa" w:w="4896"/>
           </w:tcPr>
           <w:p>
             <w:pPr>
-              <w:spacing w:before="40" w:after="40"/>
+              <w:spacing w:before="30" w:after="30"/>
+            </w:pPr>
+            <w:r>
+              <w:rPr>
+                <w:rFonts w:ascii="Georgia" w:hAnsi="Georgia"/>
+                <w:b/>
+                <w:color w:val="0F172A"/>
+                <w:sz w:val="18"/>
+              </w:rPr>
+              <w:t>2.1 CSU Augmenté : Moins d'Écrans, Plus de Policiers dans la Rue</w:t>
+            </w:r>
+          </w:p>
+        </w:tc>
+        <w:tc>
+          <w:tcPr>
+            <w:tcW w:type="dxa" w:w="4896"/>
+          </w:tcPr>
+          <w:p>
+            <w:pPr>
+              <w:spacing w:before="30" w:after="30"/>
+              <w:jc w:val="right"/>
             </w:pPr>
             <w:r>
               <w:rPr>
                 <w:rFonts w:ascii="Arial" w:hAnsi="Arial"/>
                 <w:b/>
                 <w:color w:val="0F172A"/>
-                <w:sz w:val="19"/>
-              </w:rPr>
-              <w:t xml:space="preserve">   2.1 CSU Augmenté : Moins d'Écrans, Plus de Policiers dans la Rue</w:t>
-            </w:r>
-          </w:p>
-        </w:tc>
-        <w:tc>
-          <w:tcPr>
-            <w:tcW w:type="dxa" w:w="4824"/>
-            <w:shd w:fill="FFFFFF"/>
-          </w:tcPr>
-          <w:p>
-            <w:pPr>
-              <w:spacing w:before="40" w:after="40"/>
-              <w:jc w:val="right"/>
-            </w:pPr>
-            <w:r>
-              <w:rPr>
-                <w:rFonts w:ascii="Arial" w:hAnsi="Arial"/>
-                <w:i/>
-                <w:color w:val="64748B"/>
                 <w:sz w:val="18"/>
               </w:rPr>
-              <w:t>Page 5</w:t>
+              <w:t>5</w:t>
             </w:r>
           </w:p>
         </w:tc>
@@ -474,42 +497,40 @@
       <w:tr>
         <w:tc>
           <w:tcPr>
-            <w:tcW w:type="dxa" w:w="4824"/>
-            <w:shd w:fill="F8FAFC"/>
+            <w:tcW w:type="dxa" w:w="4896"/>
           </w:tcPr>
           <w:p>
             <w:pPr>
-              <w:spacing w:before="40" w:after="40"/>
+              <w:spacing w:before="30" w:after="30"/>
+            </w:pPr>
+            <w:r>
+              <w:rPr>
+                <w:rFonts w:ascii="Georgia" w:hAnsi="Georgia"/>
+                <w:b/>
+                <w:color w:val="0F172A"/>
+                <w:sz w:val="18"/>
+              </w:rPr>
+              <w:t>2.2 Guichet Vocal Allo Niçois 24/7 : Demandes d'Aide &amp; Sécurité</w:t>
+            </w:r>
+          </w:p>
+        </w:tc>
+        <w:tc>
+          <w:tcPr>
+            <w:tcW w:type="dxa" w:w="4896"/>
+          </w:tcPr>
+          <w:p>
+            <w:pPr>
+              <w:spacing w:before="30" w:after="30"/>
+              <w:jc w:val="right"/>
             </w:pPr>
             <w:r>
               <w:rPr>
                 <w:rFonts w:ascii="Arial" w:hAnsi="Arial"/>
                 <w:b/>
                 <w:color w:val="0F172A"/>
-                <w:sz w:val="19"/>
-              </w:rPr>
-              <w:t xml:space="preserve">   2.2 Guichet Vocal Allo Niçois 24/7 : Demandes d'Aide &amp; Sécurité</w:t>
-            </w:r>
-          </w:p>
-        </w:tc>
-        <w:tc>
-          <w:tcPr>
-            <w:tcW w:type="dxa" w:w="4824"/>
-            <w:shd w:fill="F8FAFC"/>
-          </w:tcPr>
-          <w:p>
-            <w:pPr>
-              <w:spacing w:before="40" w:after="40"/>
-              <w:jc w:val="right"/>
-            </w:pPr>
-            <w:r>
-              <w:rPr>
-                <w:rFonts w:ascii="Arial" w:hAnsi="Arial"/>
-                <w:i/>
-                <w:color w:val="64748B"/>
                 <w:sz w:val="18"/>
               </w:rPr>
-              <w:t>Page 6</w:t>
+              <w:t>5</w:t>
             </w:r>
           </w:p>
         </w:tc>
@@ -517,42 +538,40 @@
       <w:tr>
         <w:tc>
           <w:tcPr>
-            <w:tcW w:type="dxa" w:w="4824"/>
-            <w:shd w:fill="FFFFFF"/>
+            <w:tcW w:type="dxa" w:w="4896"/>
           </w:tcPr>
           <w:p>
             <w:pPr>
-              <w:spacing w:before="40" w:after="40"/>
+              <w:spacing w:before="30" w:after="30"/>
+            </w:pPr>
+            <w:r>
+              <w:rPr>
+                <w:rFonts w:ascii="Georgia" w:hAnsi="Georgia"/>
+                <w:b/>
+                <w:color w:val="0F172A"/>
+                <w:sz w:val="18"/>
+              </w:rPr>
+              <w:t>2.3 Propreté Augmentée &amp; Routage Intelligent de la Voie Publique</w:t>
+            </w:r>
+          </w:p>
+        </w:tc>
+        <w:tc>
+          <w:tcPr>
+            <w:tcW w:type="dxa" w:w="4896"/>
+          </w:tcPr>
+          <w:p>
+            <w:pPr>
+              <w:spacing w:before="30" w:after="30"/>
+              <w:jc w:val="right"/>
             </w:pPr>
             <w:r>
               <w:rPr>
                 <w:rFonts w:ascii="Arial" w:hAnsi="Arial"/>
                 <w:b/>
                 <w:color w:val="0F172A"/>
-                <w:sz w:val="19"/>
-              </w:rPr>
-              <w:t xml:space="preserve">   2.3 Propreté Augmentée &amp; Routage Voie Publique</w:t>
-            </w:r>
-          </w:p>
-        </w:tc>
-        <w:tc>
-          <w:tcPr>
-            <w:tcW w:type="dxa" w:w="4824"/>
-            <w:shd w:fill="FFFFFF"/>
-          </w:tcPr>
-          <w:p>
-            <w:pPr>
-              <w:spacing w:before="40" w:after="40"/>
-              <w:jc w:val="right"/>
-            </w:pPr>
-            <w:r>
-              <w:rPr>
-                <w:rFonts w:ascii="Arial" w:hAnsi="Arial"/>
-                <w:i/>
-                <w:color w:val="64748B"/>
                 <w:sz w:val="18"/>
               </w:rPr>
-              <w:t>Page 6</w:t>
+              <w:t>5</w:t>
             </w:r>
           </w:p>
         </w:tc>
@@ -560,42 +579,40 @@
       <w:tr>
         <w:tc>
           <w:tcPr>
-            <w:tcW w:type="dxa" w:w="4824"/>
-            <w:shd w:fill="F8FAFC"/>
+            <w:tcW w:type="dxa" w:w="4896"/>
           </w:tcPr>
           <w:p>
             <w:pPr>
-              <w:spacing w:before="40" w:after="40"/>
+              <w:spacing w:before="30" w:after="30"/>
+            </w:pPr>
+            <w:r>
+              <w:rPr>
+                <w:rFonts w:ascii="Georgia" w:hAnsi="Georgia"/>
+                <w:b/>
+                <w:color w:val="0F172A"/>
+                <w:sz w:val="18"/>
+              </w:rPr>
+              <w:t>2.4 Consultation Directe par Quartier via l'IA Einstein</w:t>
+            </w:r>
+          </w:p>
+        </w:tc>
+        <w:tc>
+          <w:tcPr>
+            <w:tcW w:type="dxa" w:w="4896"/>
+          </w:tcPr>
+          <w:p>
+            <w:pPr>
+              <w:spacing w:before="30" w:after="30"/>
+              <w:jc w:val="right"/>
             </w:pPr>
             <w:r>
               <w:rPr>
                 <w:rFonts w:ascii="Arial" w:hAnsi="Arial"/>
                 <w:b/>
                 <w:color w:val="0F172A"/>
-                <w:sz w:val="19"/>
-              </w:rPr>
-              <w:t xml:space="preserve">   2.4 Consultation Directe par Quartier via l'IA Einstein</w:t>
-            </w:r>
-          </w:p>
-        </w:tc>
-        <w:tc>
-          <w:tcPr>
-            <w:tcW w:type="dxa" w:w="4824"/>
-            <w:shd w:fill="F8FAFC"/>
-          </w:tcPr>
-          <w:p>
-            <w:pPr>
-              <w:spacing w:before="40" w:after="40"/>
-              <w:jc w:val="right"/>
-            </w:pPr>
-            <w:r>
-              <w:rPr>
-                <w:rFonts w:ascii="Arial" w:hAnsi="Arial"/>
-                <w:i/>
-                <w:color w:val="64748B"/>
                 <w:sz w:val="18"/>
               </w:rPr>
-              <w:t>Page 6</w:t>
+              <w:t>5</w:t>
             </w:r>
           </w:p>
         </w:tc>
@@ -603,42 +620,40 @@
       <w:tr>
         <w:tc>
           <w:tcPr>
-            <w:tcW w:type="dxa" w:w="4824"/>
-            <w:shd w:fill="FFFFFF"/>
+            <w:tcW w:type="dxa" w:w="4896"/>
           </w:tcPr>
           <w:p>
             <w:pPr>
-              <w:spacing w:before="40" w:after="40"/>
+              <w:spacing w:before="30" w:after="30"/>
+            </w:pPr>
+            <w:r>
+              <w:rPr>
+                <w:rFonts w:ascii="Georgia" w:hAnsi="Georgia"/>
+                <w:b/>
+                <w:color w:val="0F172A"/>
+                <w:sz w:val="18"/>
+              </w:rPr>
+              <w:t>3. Pôle 2 : Axe Métropole Nice Côte d'Azur (Budget, Cyber &amp; Monaco)</w:t>
+            </w:r>
+          </w:p>
+        </w:tc>
+        <w:tc>
+          <w:tcPr>
+            <w:tcW w:type="dxa" w:w="4896"/>
+          </w:tcPr>
+          <w:p>
+            <w:pPr>
+              <w:spacing w:before="30" w:after="30"/>
+              <w:jc w:val="right"/>
             </w:pPr>
             <w:r>
               <w:rPr>
                 <w:rFonts w:ascii="Arial" w:hAnsi="Arial"/>
                 <w:b/>
                 <w:color w:val="0F172A"/>
-                <w:sz w:val="19"/>
-              </w:rPr>
-              <w:t>3. Pôle 2 : Axe Métropole Nice Côte d'Azur (Budget &amp; Monaco)</w:t>
-            </w:r>
-          </w:p>
-        </w:tc>
-        <w:tc>
-          <w:tcPr>
-            <w:tcW w:type="dxa" w:w="4824"/>
-            <w:shd w:fill="FFFFFF"/>
-          </w:tcPr>
-          <w:p>
-            <w:pPr>
-              <w:spacing w:before="40" w:after="40"/>
-              <w:jc w:val="right"/>
-            </w:pPr>
-            <w:r>
-              <w:rPr>
-                <w:rFonts w:ascii="Arial" w:hAnsi="Arial"/>
-                <w:i/>
-                <w:color w:val="64748B"/>
                 <w:sz w:val="18"/>
               </w:rPr>
-              <w:t>Page 7</w:t>
+              <w:t>7</w:t>
             </w:r>
           </w:p>
         </w:tc>
@@ -646,42 +661,40 @@
       <w:tr>
         <w:tc>
           <w:tcPr>
-            <w:tcW w:type="dxa" w:w="4824"/>
-            <w:shd w:fill="F8FAFC"/>
+            <w:tcW w:type="dxa" w:w="4896"/>
           </w:tcPr>
           <w:p>
             <w:pPr>
-              <w:spacing w:before="40" w:after="40"/>
+              <w:spacing w:before="30" w:after="30"/>
+            </w:pPr>
+            <w:r>
+              <w:rPr>
+                <w:rFonts w:ascii="Georgia" w:hAnsi="Georgia"/>
+                <w:b/>
+                <w:color w:val="0F172A"/>
+                <w:sz w:val="18"/>
+              </w:rPr>
+              <w:t>3.1 Audit IA Commande Publique (+2,5 M€ / an Net)</w:t>
+            </w:r>
+          </w:p>
+        </w:tc>
+        <w:tc>
+          <w:tcPr>
+            <w:tcW w:type="dxa" w:w="4896"/>
+          </w:tcPr>
+          <w:p>
+            <w:pPr>
+              <w:spacing w:before="30" w:after="30"/>
+              <w:jc w:val="right"/>
             </w:pPr>
             <w:r>
               <w:rPr>
                 <w:rFonts w:ascii="Arial" w:hAnsi="Arial"/>
                 <w:b/>
                 <w:color w:val="0F172A"/>
-                <w:sz w:val="19"/>
-              </w:rPr>
-              <w:t xml:space="preserve">   3.1 Audit IA Commande Publique (+2,5 M€ / an Net)</w:t>
-            </w:r>
-          </w:p>
-        </w:tc>
-        <w:tc>
-          <w:tcPr>
-            <w:tcW w:type="dxa" w:w="4824"/>
-            <w:shd w:fill="F8FAFC"/>
-          </w:tcPr>
-          <w:p>
-            <w:pPr>
-              <w:spacing w:before="40" w:after="40"/>
-              <w:jc w:val="right"/>
-            </w:pPr>
-            <w:r>
-              <w:rPr>
-                <w:rFonts w:ascii="Arial" w:hAnsi="Arial"/>
-                <w:i/>
-                <w:color w:val="64748B"/>
                 <w:sz w:val="18"/>
               </w:rPr>
-              <w:t>Page 7</w:t>
+              <w:t>7</w:t>
             </w:r>
           </w:p>
         </w:tc>
@@ -689,42 +702,40 @@
       <w:tr>
         <w:tc>
           <w:tcPr>
-            <w:tcW w:type="dxa" w:w="4824"/>
-            <w:shd w:fill="FFFFFF"/>
+            <w:tcW w:type="dxa" w:w="4896"/>
           </w:tcPr>
           <w:p>
             <w:pPr>
-              <w:spacing w:before="40" w:after="40"/>
+              <w:spacing w:before="30" w:after="30"/>
+            </w:pPr>
+            <w:r>
+              <w:rPr>
+                <w:rFonts w:ascii="Georgia" w:hAnsi="Georgia"/>
+                <w:b/>
+                <w:color w:val="0F172A"/>
+                <w:sz w:val="18"/>
+              </w:rPr>
+              <w:t>3.2 Bouclier Cyber-IA NIS 2 (1,8 M€ à 3 M€ Évités)</w:t>
+            </w:r>
+          </w:p>
+        </w:tc>
+        <w:tc>
+          <w:tcPr>
+            <w:tcW w:type="dxa" w:w="4896"/>
+          </w:tcPr>
+          <w:p>
+            <w:pPr>
+              <w:spacing w:before="30" w:after="30"/>
+              <w:jc w:val="right"/>
             </w:pPr>
             <w:r>
               <w:rPr>
                 <w:rFonts w:ascii="Arial" w:hAnsi="Arial"/>
                 <w:b/>
                 <w:color w:val="0F172A"/>
-                <w:sz w:val="19"/>
-              </w:rPr>
-              <w:t xml:space="preserve">   3.2 Bouclier Cyber-IA NIS 2 (1,8 M€ à 3 M€ Évités)</w:t>
-            </w:r>
-          </w:p>
-        </w:tc>
-        <w:tc>
-          <w:tcPr>
-            <w:tcW w:type="dxa" w:w="4824"/>
-            <w:shd w:fill="FFFFFF"/>
-          </w:tcPr>
-          <w:p>
-            <w:pPr>
-              <w:spacing w:before="40" w:after="40"/>
-              <w:jc w:val="right"/>
-            </w:pPr>
-            <w:r>
-              <w:rPr>
-                <w:rFonts w:ascii="Arial" w:hAnsi="Arial"/>
-                <w:i/>
-                <w:color w:val="64748B"/>
                 <w:sz w:val="18"/>
               </w:rPr>
-              <w:t>Page 7</w:t>
+              <w:t>7</w:t>
             </w:r>
           </w:p>
         </w:tc>
@@ -732,42 +743,40 @@
       <w:tr>
         <w:tc>
           <w:tcPr>
-            <w:tcW w:type="dxa" w:w="4824"/>
-            <w:shd w:fill="F8FAFC"/>
+            <w:tcW w:type="dxa" w:w="4896"/>
           </w:tcPr>
           <w:p>
             <w:pPr>
-              <w:spacing w:before="40" w:after="40"/>
+              <w:spacing w:before="30" w:after="30"/>
+            </w:pPr>
+            <w:r>
+              <w:rPr>
+                <w:rFonts w:ascii="Georgia" w:hAnsi="Georgia"/>
+                <w:b/>
+                <w:color w:val="0F172A"/>
+                <w:sz w:val="18"/>
+              </w:rPr>
+              <w:t>3.3 Monaco Cloud &amp; Redondance IT (1,5 M€ à 2,8 M€ / an)</w:t>
+            </w:r>
+          </w:p>
+        </w:tc>
+        <w:tc>
+          <w:tcPr>
+            <w:tcW w:type="dxa" w:w="4896"/>
+          </w:tcPr>
+          <w:p>
+            <w:pPr>
+              <w:spacing w:before="30" w:after="30"/>
+              <w:jc w:val="right"/>
             </w:pPr>
             <w:r>
               <w:rPr>
                 <w:rFonts w:ascii="Arial" w:hAnsi="Arial"/>
                 <w:b/>
                 <w:color w:val="0F172A"/>
-                <w:sz w:val="19"/>
-              </w:rPr>
-              <w:t xml:space="preserve">   3.3 Monaco Cloud &amp; Redondance IT (1,5 M€ à 2,8 M€ / an)</w:t>
-            </w:r>
-          </w:p>
-        </w:tc>
-        <w:tc>
-          <w:tcPr>
-            <w:tcW w:type="dxa" w:w="4824"/>
-            <w:shd w:fill="F8FAFC"/>
-          </w:tcPr>
-          <w:p>
-            <w:pPr>
-              <w:spacing w:before="40" w:after="40"/>
-              <w:jc w:val="right"/>
-            </w:pPr>
-            <w:r>
-              <w:rPr>
-                <w:rFonts w:ascii="Arial" w:hAnsi="Arial"/>
-                <w:i/>
-                <w:color w:val="64748B"/>
                 <w:sz w:val="18"/>
               </w:rPr>
-              <w:t>Page 8</w:t>
+              <w:t>7</w:t>
             </w:r>
           </w:p>
         </w:tc>
@@ -775,19 +784,18 @@
       <w:tr>
         <w:tc>
           <w:tcPr>
-            <w:tcW w:type="dxa" w:w="4824"/>
-            <w:shd w:fill="FFFFFF"/>
+            <w:tcW w:type="dxa" w:w="4896"/>
           </w:tcPr>
           <w:p>
             <w:pPr>
-              <w:spacing w:before="40" w:after="40"/>
+              <w:spacing w:before="30" w:after="30"/>
             </w:pPr>
             <w:r>
               <w:rPr>
-                <w:rFonts w:ascii="Arial" w:hAnsi="Arial"/>
+                <w:rFonts w:ascii="Georgia" w:hAnsi="Georgia"/>
                 <w:b/>
                 <w:color w:val="0F172A"/>
-                <w:sz w:val="19"/>
+                <w:sz w:val="18"/>
               </w:rPr>
               <w:t>4. Alliance Binationale Nice-Monaco &amp; Hub Réglementaire</w:t>
             </w:r>
@@ -795,22 +803,21 @@
         </w:tc>
         <w:tc>
           <w:tcPr>
-            <w:tcW w:type="dxa" w:w="4824"/>
-            <w:shd w:fill="FFFFFF"/>
+            <w:tcW w:type="dxa" w:w="4896"/>
           </w:tcPr>
           <w:p>
             <w:pPr>
-              <w:spacing w:before="40" w:after="40"/>
+              <w:spacing w:before="30" w:after="30"/>
               <w:jc w:val="right"/>
             </w:pPr>
             <w:r>
               <w:rPr>
                 <w:rFonts w:ascii="Arial" w:hAnsi="Arial"/>
-                <w:i/>
-                <w:color w:val="64748B"/>
+                <w:b/>
+                <w:color w:val="0F172A"/>
                 <w:sz w:val="18"/>
               </w:rPr>
-              <w:t>Page 8</w:t>
+              <w:t>8</w:t>
             </w:r>
           </w:p>
         </w:tc>
@@ -818,42 +825,40 @@
       <w:tr>
         <w:tc>
           <w:tcPr>
-            <w:tcW w:type="dxa" w:w="4824"/>
-            <w:shd w:fill="F8FAFC"/>
+            <w:tcW w:type="dxa" w:w="4896"/>
           </w:tcPr>
           <w:p>
             <w:pPr>
-              <w:spacing w:before="40" w:after="40"/>
+              <w:spacing w:before="30" w:after="30"/>
+            </w:pPr>
+            <w:r>
+              <w:rPr>
+                <w:rFonts w:ascii="Georgia" w:hAnsi="Georgia"/>
+                <w:b/>
+                <w:color w:val="0F172A"/>
+                <w:sz w:val="18"/>
+              </w:rPr>
+              <w:t>4.1 Levier Binational : Clé de Voûte des Financements Européens</w:t>
+            </w:r>
+          </w:p>
+        </w:tc>
+        <w:tc>
+          <w:tcPr>
+            <w:tcW w:type="dxa" w:w="4896"/>
+          </w:tcPr>
+          <w:p>
+            <w:pPr>
+              <w:spacing w:before="30" w:after="30"/>
+              <w:jc w:val="right"/>
             </w:pPr>
             <w:r>
               <w:rPr>
                 <w:rFonts w:ascii="Arial" w:hAnsi="Arial"/>
                 <w:b/>
                 <w:color w:val="0F172A"/>
-                <w:sz w:val="19"/>
-              </w:rPr>
-              <w:t xml:space="preserve">   4.1 Levier Binational : Clé de Voûte des Financements Européens</w:t>
-            </w:r>
-          </w:p>
-        </w:tc>
-        <w:tc>
-          <w:tcPr>
-            <w:tcW w:type="dxa" w:w="4824"/>
-            <w:shd w:fill="F8FAFC"/>
-          </w:tcPr>
-          <w:p>
-            <w:pPr>
-              <w:spacing w:before="40" w:after="40"/>
-              <w:jc w:val="right"/>
-            </w:pPr>
-            <w:r>
-              <w:rPr>
-                <w:rFonts w:ascii="Arial" w:hAnsi="Arial"/>
-                <w:i/>
-                <w:color w:val="64748B"/>
                 <w:sz w:val="18"/>
               </w:rPr>
-              <w:t>Page 8</w:t>
+              <w:t>8</w:t>
             </w:r>
           </w:p>
         </w:tc>
@@ -861,42 +866,40 @@
       <w:tr>
         <w:tc>
           <w:tcPr>
-            <w:tcW w:type="dxa" w:w="4824"/>
-            <w:shd w:fill="FFFFFF"/>
+            <w:tcW w:type="dxa" w:w="4896"/>
           </w:tcPr>
           <w:p>
             <w:pPr>
-              <w:spacing w:before="40" w:after="40"/>
+              <w:spacing w:before="30" w:after="30"/>
+            </w:pPr>
+            <w:r>
+              <w:rPr>
+                <w:rFonts w:ascii="Georgia" w:hAnsi="Georgia"/>
+                <w:b/>
+                <w:color w:val="0F172A"/>
+                <w:sz w:val="18"/>
+              </w:rPr>
+              <w:t>4.2 Nice, Centre d'Expertise AI Act de Référence pour la France</w:t>
+            </w:r>
+          </w:p>
+        </w:tc>
+        <w:tc>
+          <w:tcPr>
+            <w:tcW w:type="dxa" w:w="4896"/>
+          </w:tcPr>
+          <w:p>
+            <w:pPr>
+              <w:spacing w:before="30" w:after="30"/>
+              <w:jc w:val="right"/>
             </w:pPr>
             <w:r>
               <w:rPr>
                 <w:rFonts w:ascii="Arial" w:hAnsi="Arial"/>
                 <w:b/>
                 <w:color w:val="0F172A"/>
-                <w:sz w:val="19"/>
-              </w:rPr>
-              <w:t xml:space="preserve">   4.2 Nice, Centre d'Expertise AI Act de Référence pour la France</w:t>
-            </w:r>
-          </w:p>
-        </w:tc>
-        <w:tc>
-          <w:tcPr>
-            <w:tcW w:type="dxa" w:w="4824"/>
-            <w:shd w:fill="FFFFFF"/>
-          </w:tcPr>
-          <w:p>
-            <w:pPr>
-              <w:spacing w:before="40" w:after="40"/>
-              <w:jc w:val="right"/>
-            </w:pPr>
-            <w:r>
-              <w:rPr>
-                <w:rFonts w:ascii="Arial" w:hAnsi="Arial"/>
-                <w:i/>
-                <w:color w:val="64748B"/>
                 <w:sz w:val="18"/>
               </w:rPr>
-              <w:t>Page 9</w:t>
+              <w:t>8</w:t>
             </w:r>
           </w:p>
         </w:tc>
@@ -904,42 +907,40 @@
       <w:tr>
         <w:tc>
           <w:tcPr>
-            <w:tcW w:type="dxa" w:w="4824"/>
-            <w:shd w:fill="F8FAFC"/>
+            <w:tcW w:type="dxa" w:w="4896"/>
           </w:tcPr>
           <w:p>
             <w:pPr>
-              <w:spacing w:before="40" w:after="40"/>
+              <w:spacing w:before="30" w:after="30"/>
+            </w:pPr>
+            <w:r>
+              <w:rPr>
+                <w:rFonts w:ascii="Georgia" w:hAnsi="Georgia"/>
+                <w:b/>
+                <w:color w:val="0F172A"/>
+                <w:sz w:val="18"/>
+              </w:rPr>
+              <w:t>4.3 Pôle d'Excellence PME/PMI &amp; Bibliothèque de Cas d'Usage Souverains</w:t>
+            </w:r>
+          </w:p>
+        </w:tc>
+        <w:tc>
+          <w:tcPr>
+            <w:tcW w:type="dxa" w:w="4896"/>
+          </w:tcPr>
+          <w:p>
+            <w:pPr>
+              <w:spacing w:before="30" w:after="30"/>
+              <w:jc w:val="right"/>
             </w:pPr>
             <w:r>
               <w:rPr>
                 <w:rFonts w:ascii="Arial" w:hAnsi="Arial"/>
                 <w:b/>
                 <w:color w:val="0F172A"/>
-                <w:sz w:val="19"/>
-              </w:rPr>
-              <w:t xml:space="preserve">   4.3 Pôle d'Excellence PME/PMI &amp; Bibliothèque de Cas d'Usage Souverains</w:t>
-            </w:r>
-          </w:p>
-        </w:tc>
-        <w:tc>
-          <w:tcPr>
-            <w:tcW w:type="dxa" w:w="4824"/>
-            <w:shd w:fill="F8FAFC"/>
-          </w:tcPr>
-          <w:p>
-            <w:pPr>
-              <w:spacing w:before="40" w:after="40"/>
-              <w:jc w:val="right"/>
-            </w:pPr>
-            <w:r>
-              <w:rPr>
-                <w:rFonts w:ascii="Arial" w:hAnsi="Arial"/>
-                <w:i/>
-                <w:color w:val="64748B"/>
                 <w:sz w:val="18"/>
               </w:rPr>
-              <w:t>Page 9</w:t>
+              <w:t>8</w:t>
             </w:r>
           </w:p>
         </w:tc>
@@ -947,42 +948,40 @@
       <w:tr>
         <w:tc>
           <w:tcPr>
-            <w:tcW w:type="dxa" w:w="4824"/>
-            <w:shd w:fill="FFFFFF"/>
+            <w:tcW w:type="dxa" w:w="4896"/>
           </w:tcPr>
           <w:p>
             <w:pPr>
-              <w:spacing w:before="40" w:after="40"/>
+              <w:spacing w:before="30" w:after="30"/>
+            </w:pPr>
+            <w:r>
+              <w:rPr>
+                <w:rFonts w:ascii="Georgia" w:hAnsi="Georgia"/>
+                <w:b/>
+                <w:color w:val="0F172A"/>
+                <w:sz w:val="18"/>
+              </w:rPr>
+              <w:t>4.4 Pôle d'Excellence pour les Niçoises et les Niçois</w:t>
+            </w:r>
+          </w:p>
+        </w:tc>
+        <w:tc>
+          <w:tcPr>
+            <w:tcW w:type="dxa" w:w="4896"/>
+          </w:tcPr>
+          <w:p>
+            <w:pPr>
+              <w:spacing w:before="30" w:after="30"/>
+              <w:jc w:val="right"/>
             </w:pPr>
             <w:r>
               <w:rPr>
                 <w:rFonts w:ascii="Arial" w:hAnsi="Arial"/>
                 <w:b/>
                 <w:color w:val="0F172A"/>
-                <w:sz w:val="19"/>
-              </w:rPr>
-              <w:t>5. Feuille de Route Précise (Septembre 2026-2029) &amp; Résumé Annuel</w:t>
-            </w:r>
-          </w:p>
-        </w:tc>
-        <w:tc>
-          <w:tcPr>
-            <w:tcW w:type="dxa" w:w="4824"/>
-            <w:shd w:fill="FFFFFF"/>
-          </w:tcPr>
-          <w:p>
-            <w:pPr>
-              <w:spacing w:before="40" w:after="40"/>
-              <w:jc w:val="right"/>
-            </w:pPr>
-            <w:r>
-              <w:rPr>
-                <w:rFonts w:ascii="Arial" w:hAnsi="Arial"/>
-                <w:i/>
-                <w:color w:val="64748B"/>
                 <w:sz w:val="18"/>
               </w:rPr>
-              <w:t>Page 10</w:t>
+              <w:t>9</w:t>
             </w:r>
           </w:p>
         </w:tc>
@@ -990,42 +989,40 @@
       <w:tr>
         <w:tc>
           <w:tcPr>
-            <w:tcW w:type="dxa" w:w="4824"/>
-            <w:shd w:fill="F8FAFC"/>
+            <w:tcW w:type="dxa" w:w="4896"/>
           </w:tcPr>
           <w:p>
             <w:pPr>
-              <w:spacing w:before="40" w:after="40"/>
+              <w:spacing w:before="30" w:after="30"/>
+            </w:pPr>
+            <w:r>
+              <w:rPr>
+                <w:rFonts w:ascii="Georgia" w:hAnsi="Georgia"/>
+                <w:b/>
+                <w:color w:val="0F172A"/>
+                <w:sz w:val="18"/>
+              </w:rPr>
+              <w:t>5. Feuille de Route Précise (Sept 2026-2029) &amp; Résumé Annuel</w:t>
+            </w:r>
+          </w:p>
+        </w:tc>
+        <w:tc>
+          <w:tcPr>
+            <w:tcW w:type="dxa" w:w="4896"/>
+          </w:tcPr>
+          <w:p>
+            <w:pPr>
+              <w:spacing w:before="30" w:after="30"/>
+              <w:jc w:val="right"/>
             </w:pPr>
             <w:r>
               <w:rPr>
                 <w:rFonts w:ascii="Arial" w:hAnsi="Arial"/>
                 <w:b/>
                 <w:color w:val="0F172A"/>
-                <w:sz w:val="19"/>
-              </w:rPr>
-              <w:t xml:space="preserve">   5.1 Présidence Éric Ciotti &amp; Direction Benoît SIGWALD (2,5j/sem)</w:t>
-            </w:r>
-          </w:p>
-        </w:tc>
-        <w:tc>
-          <w:tcPr>
-            <w:tcW w:type="dxa" w:w="4824"/>
-            <w:shd w:fill="F8FAFC"/>
-          </w:tcPr>
-          <w:p>
-            <w:pPr>
-              <w:spacing w:before="40" w:after="40"/>
-              <w:jc w:val="right"/>
-            </w:pPr>
-            <w:r>
-              <w:rPr>
-                <w:rFonts w:ascii="Arial" w:hAnsi="Arial"/>
-                <w:i/>
-                <w:color w:val="64748B"/>
                 <w:sz w:val="18"/>
               </w:rPr>
-              <w:t>Page 10</w:t>
+              <w:t>9</w:t>
             </w:r>
           </w:p>
         </w:tc>
@@ -1033,42 +1030,40 @@
       <w:tr>
         <w:tc>
           <w:tcPr>
-            <w:tcW w:type="dxa" w:w="4824"/>
-            <w:shd w:fill="FFFFFF"/>
+            <w:tcW w:type="dxa" w:w="4896"/>
           </w:tcPr>
           <w:p>
             <w:pPr>
-              <w:spacing w:before="40" w:after="40"/>
+              <w:spacing w:before="30" w:after="30"/>
+            </w:pPr>
+            <w:r>
+              <w:rPr>
+                <w:rFonts w:ascii="Georgia" w:hAnsi="Georgia"/>
+                <w:b/>
+                <w:color w:val="0F172A"/>
+                <w:sz w:val="18"/>
+              </w:rPr>
+              <w:t>5.1 Présidence Éric Ciotti &amp; Direction Benoît SIGWALD (2,5j/sem)</w:t>
+            </w:r>
+          </w:p>
+        </w:tc>
+        <w:tc>
+          <w:tcPr>
+            <w:tcW w:type="dxa" w:w="4896"/>
+          </w:tcPr>
+          <w:p>
+            <w:pPr>
+              <w:spacing w:before="30" w:after="30"/>
+              <w:jc w:val="right"/>
             </w:pPr>
             <w:r>
               <w:rPr>
                 <w:rFonts w:ascii="Arial" w:hAnsi="Arial"/>
                 <w:b/>
                 <w:color w:val="0F172A"/>
-                <w:sz w:val="19"/>
-              </w:rPr>
-              <w:t xml:space="preserve">   5.2 Échéancier Précis &amp; Jalons par Date (Septembre 2026-2029)</w:t>
-            </w:r>
-          </w:p>
-        </w:tc>
-        <w:tc>
-          <w:tcPr>
-            <w:tcW w:type="dxa" w:w="4824"/>
-            <w:shd w:fill="FFFFFF"/>
-          </w:tcPr>
-          <w:p>
-            <w:pPr>
-              <w:spacing w:before="40" w:after="40"/>
-              <w:jc w:val="right"/>
-            </w:pPr>
-            <w:r>
-              <w:rPr>
-                <w:rFonts w:ascii="Arial" w:hAnsi="Arial"/>
-                <w:i/>
-                <w:color w:val="64748B"/>
                 <w:sz w:val="18"/>
               </w:rPr>
-              <w:t>Page 10</w:t>
+              <w:t>9</w:t>
             </w:r>
           </w:p>
         </w:tc>
@@ -1076,42 +1071,40 @@
       <w:tr>
         <w:tc>
           <w:tcPr>
-            <w:tcW w:type="dxa" w:w="4824"/>
-            <w:shd w:fill="F8FAFC"/>
+            <w:tcW w:type="dxa" w:w="4896"/>
           </w:tcPr>
           <w:p>
             <w:pPr>
-              <w:spacing w:before="40" w:after="40"/>
+              <w:spacing w:before="30" w:after="30"/>
+            </w:pPr>
+            <w:r>
+              <w:rPr>
+                <w:rFonts w:ascii="Georgia" w:hAnsi="Georgia"/>
+                <w:b/>
+                <w:color w:val="0F172A"/>
+                <w:sz w:val="18"/>
+              </w:rPr>
+              <w:t>5.2 Échéancier Précis et Jalons par Date (Démarche 1er Septembre 2026)</w:t>
+            </w:r>
+          </w:p>
+        </w:tc>
+        <w:tc>
+          <w:tcPr>
+            <w:tcW w:type="dxa" w:w="4896"/>
+          </w:tcPr>
+          <w:p>
+            <w:pPr>
+              <w:spacing w:before="30" w:after="30"/>
+              <w:jc w:val="right"/>
             </w:pPr>
             <w:r>
               <w:rPr>
                 <w:rFonts w:ascii="Arial" w:hAnsi="Arial"/>
                 <w:b/>
                 <w:color w:val="0F172A"/>
-                <w:sz w:val="19"/>
-              </w:rPr>
-              <w:t xml:space="preserve">   5.3 Résumé Consolidé du Coût par Année Budgétaire</w:t>
-            </w:r>
-          </w:p>
-        </w:tc>
-        <w:tc>
-          <w:tcPr>
-            <w:tcW w:type="dxa" w:w="4824"/>
-            <w:shd w:fill="F8FAFC"/>
-          </w:tcPr>
-          <w:p>
-            <w:pPr>
-              <w:spacing w:before="40" w:after="40"/>
-              <w:jc w:val="right"/>
-            </w:pPr>
-            <w:r>
-              <w:rPr>
-                <w:rFonts w:ascii="Arial" w:hAnsi="Arial"/>
-                <w:i/>
-                <w:color w:val="64748B"/>
                 <w:sz w:val="18"/>
               </w:rPr>
-              <w:t>Page 11</w:t>
+              <w:t>9</w:t>
             </w:r>
           </w:p>
         </w:tc>
@@ -1119,19 +1112,59 @@
       <w:tr>
         <w:tc>
           <w:tcPr>
-            <w:tcW w:type="dxa" w:w="4824"/>
-            <w:shd w:fill="FFFFFF"/>
+            <w:tcW w:type="dxa" w:w="4896"/>
           </w:tcPr>
           <w:p>
             <w:pPr>
-              <w:spacing w:before="40" w:after="40"/>
+              <w:spacing w:before="30" w:after="30"/>
+            </w:pPr>
+            <w:r>
+              <w:rPr>
+                <w:rFonts w:ascii="Georgia" w:hAnsi="Georgia"/>
+                <w:b/>
+                <w:color w:val="0F172A"/>
+                <w:sz w:val="18"/>
+              </w:rPr>
+              <w:t>5.3 Résumé Consolidé du Coût par Axe Institutionnel (Mairie, Métropole, Monaco)</w:t>
+            </w:r>
+          </w:p>
+        </w:tc>
+        <w:tc>
+          <w:tcPr>
+            <w:tcW w:type="dxa" w:w="4896"/>
+          </w:tcPr>
+          <w:p>
+            <w:pPr>
+              <w:spacing w:before="30" w:after="30"/>
+              <w:jc w:val="right"/>
             </w:pPr>
             <w:r>
               <w:rPr>
                 <w:rFonts w:ascii="Arial" w:hAnsi="Arial"/>
                 <w:b/>
                 <w:color w:val="0F172A"/>
-                <w:sz w:val="19"/>
+                <w:sz w:val="18"/>
+              </w:rPr>
+              <w:t>10</w:t>
+            </w:r>
+          </w:p>
+        </w:tc>
+      </w:tr>
+      <w:tr>
+        <w:tc>
+          <w:tcPr>
+            <w:tcW w:type="dxa" w:w="4896"/>
+          </w:tcPr>
+          <w:p>
+            <w:pPr>
+              <w:spacing w:before="30" w:after="30"/>
+            </w:pPr>
+            <w:r>
+              <w:rPr>
+                <w:rFonts w:ascii="Georgia" w:hAnsi="Georgia"/>
+                <w:b/>
+                <w:color w:val="0F172A"/>
+                <w:sz w:val="18"/>
               </w:rPr>
               <w:t>6. Annexe : Justifications des Gains &amp; Sources Documentaires</w:t>
             </w:r>
@@ -1139,32 +1172,26 @@
         </w:tc>
         <w:tc>
           <w:tcPr>
-            <w:tcW w:type="dxa" w:w="4824"/>
-            <w:shd w:fill="FFFFFF"/>
+            <w:tcW w:type="dxa" w:w="4896"/>
           </w:tcPr>
           <w:p>
             <w:pPr>
-              <w:spacing w:before="40" w:after="40"/>
+              <w:spacing w:before="30" w:after="30"/>
               <w:jc w:val="right"/>
             </w:pPr>
             <w:r>
               <w:rPr>
                 <w:rFonts w:ascii="Arial" w:hAnsi="Arial"/>
-                <w:i/>
-                <w:color w:val="64748B"/>
+                <w:b/>
+                <w:color w:val="0F172A"/>
                 <w:sz w:val="18"/>
               </w:rPr>
-              <w:t>Page 12</w:t>
+              <w:t>11</w:t>
             </w:r>
           </w:p>
         </w:tc>
       </w:tr>
     </w:tbl>
-    <w:p>
-      <w:r>
-        <w:br w:type="page"/>
-      </w:r>
-    </w:p>
     <w:p>
       <w:pPr>
         <w:pStyle w:val="Heading1"/>
@@ -1292,15 +1319,15 @@
         <w:tblLook w:firstColumn="1" w:firstRow="1" w:lastColumn="0" w:lastRow="0" w:noHBand="0" w:noVBand="1" w:val="04A0"/>
       </w:tblPr>
       <w:tblGrid>
-        <w:gridCol w:w="2412"/>
-        <w:gridCol w:w="2412"/>
-        <w:gridCol w:w="2412"/>
-        <w:gridCol w:w="2412"/>
+        <w:gridCol w:w="2448"/>
+        <w:gridCol w:w="2448"/>
+        <w:gridCol w:w="2448"/>
+        <w:gridCol w:w="2448"/>
       </w:tblGrid>
       <w:tr>
         <w:tc>
           <w:tcPr>
-            <w:tcW w:type="dxa" w:w="2412"/>
+            <w:tcW w:type="dxa" w:w="2448"/>
             <w:shd w:fill="1E293B"/>
           </w:tcPr>
           <w:p>
@@ -1320,7 +1347,7 @@
         </w:tc>
         <w:tc>
           <w:tcPr>
-            <w:tcW w:type="dxa" w:w="2412"/>
+            <w:tcW w:type="dxa" w:w="2448"/>
             <w:shd w:fill="1E293B"/>
           </w:tcPr>
           <w:p>
@@ -1340,7 +1367,7 @@
         </w:tc>
         <w:tc>
           <w:tcPr>
-            <w:tcW w:type="dxa" w:w="2412"/>
+            <w:tcW w:type="dxa" w:w="2448"/>
             <w:shd w:fill="1E293B"/>
           </w:tcPr>
           <w:p>
@@ -1360,7 +1387,7 @@
         </w:tc>
         <w:tc>
           <w:tcPr>
-            <w:tcW w:type="dxa" w:w="2412"/>
+            <w:tcW w:type="dxa" w:w="2448"/>
             <w:shd w:fill="1E293B"/>
           </w:tcPr>
           <w:p>
@@ -1382,7 +1409,7 @@
       <w:tr>
         <w:tc>
           <w:tcPr>
-            <w:tcW w:type="dxa" w:w="2412"/>
+            <w:tcW w:type="dxa" w:w="2448"/>
             <w:shd w:fill="F8FAFC"/>
           </w:tcPr>
           <w:p>
@@ -1401,7 +1428,7 @@
         </w:tc>
         <w:tc>
           <w:tcPr>
-            <w:tcW w:type="dxa" w:w="2412"/>
+            <w:tcW w:type="dxa" w:w="2448"/>
             <w:shd w:fill="F8FAFC"/>
           </w:tcPr>
           <w:p>
@@ -1420,7 +1447,7 @@
         </w:tc>
         <w:tc>
           <w:tcPr>
-            <w:tcW w:type="dxa" w:w="2412"/>
+            <w:tcW w:type="dxa" w:w="2448"/>
             <w:shd w:fill="F8FAFC"/>
           </w:tcPr>
           <w:p>
@@ -1439,7 +1466,7 @@
         </w:tc>
         <w:tc>
           <w:tcPr>
-            <w:tcW w:type="dxa" w:w="2412"/>
+            <w:tcW w:type="dxa" w:w="2448"/>
             <w:shd w:fill="F8FAFC"/>
           </w:tcPr>
           <w:p>
@@ -1460,7 +1487,7 @@
       <w:tr>
         <w:tc>
           <w:tcPr>
-            <w:tcW w:type="dxa" w:w="2412"/>
+            <w:tcW w:type="dxa" w:w="2448"/>
             <w:shd w:fill="FFFFFF"/>
           </w:tcPr>
           <w:p>
@@ -1479,7 +1506,7 @@
         </w:tc>
         <w:tc>
           <w:tcPr>
-            <w:tcW w:type="dxa" w:w="2412"/>
+            <w:tcW w:type="dxa" w:w="2448"/>
             <w:shd w:fill="FFFFFF"/>
           </w:tcPr>
           <w:p>
@@ -1498,7 +1525,7 @@
         </w:tc>
         <w:tc>
           <w:tcPr>
-            <w:tcW w:type="dxa" w:w="2412"/>
+            <w:tcW w:type="dxa" w:w="2448"/>
             <w:shd w:fill="FFFFFF"/>
           </w:tcPr>
           <w:p>
@@ -1517,7 +1544,7 @@
         </w:tc>
         <w:tc>
           <w:tcPr>
-            <w:tcW w:type="dxa" w:w="2412"/>
+            <w:tcW w:type="dxa" w:w="2448"/>
             <w:shd w:fill="FFFFFF"/>
           </w:tcPr>
           <w:p>
@@ -1538,7 +1565,7 @@
       <w:tr>
         <w:tc>
           <w:tcPr>
-            <w:tcW w:type="dxa" w:w="2412"/>
+            <w:tcW w:type="dxa" w:w="2448"/>
             <w:shd w:fill="F8FAFC"/>
           </w:tcPr>
           <w:p>
@@ -1557,7 +1584,7 @@
         </w:tc>
         <w:tc>
           <w:tcPr>
-            <w:tcW w:type="dxa" w:w="2412"/>
+            <w:tcW w:type="dxa" w:w="2448"/>
             <w:shd w:fill="F8FAFC"/>
           </w:tcPr>
           <w:p>
@@ -1576,7 +1603,7 @@
         </w:tc>
         <w:tc>
           <w:tcPr>
-            <w:tcW w:type="dxa" w:w="2412"/>
+            <w:tcW w:type="dxa" w:w="2448"/>
             <w:shd w:fill="F8FAFC"/>
           </w:tcPr>
           <w:p>
@@ -1595,7 +1622,7 @@
         </w:tc>
         <w:tc>
           <w:tcPr>
-            <w:tcW w:type="dxa" w:w="2412"/>
+            <w:tcW w:type="dxa" w:w="2448"/>
             <w:shd w:fill="F8FAFC"/>
           </w:tcPr>
           <w:p>
@@ -1616,7 +1643,7 @@
       <w:tr>
         <w:tc>
           <w:tcPr>
-            <w:tcW w:type="dxa" w:w="2412"/>
+            <w:tcW w:type="dxa" w:w="2448"/>
             <w:shd w:fill="FFFFFF"/>
           </w:tcPr>
           <w:p>
@@ -1635,7 +1662,7 @@
         </w:tc>
         <w:tc>
           <w:tcPr>
-            <w:tcW w:type="dxa" w:w="2412"/>
+            <w:tcW w:type="dxa" w:w="2448"/>
             <w:shd w:fill="FFFFFF"/>
           </w:tcPr>
           <w:p>
@@ -1654,7 +1681,7 @@
         </w:tc>
         <w:tc>
           <w:tcPr>
-            <w:tcW w:type="dxa" w:w="2412"/>
+            <w:tcW w:type="dxa" w:w="2448"/>
             <w:shd w:fill="FFFFFF"/>
           </w:tcPr>
           <w:p>
@@ -1673,7 +1700,7 @@
         </w:tc>
         <w:tc>
           <w:tcPr>
-            <w:tcW w:type="dxa" w:w="2412"/>
+            <w:tcW w:type="dxa" w:w="2448"/>
             <w:shd w:fill="FFFFFF"/>
           </w:tcPr>
           <w:p>
@@ -1694,7 +1721,7 @@
       <w:tr>
         <w:tc>
           <w:tcPr>
-            <w:tcW w:type="dxa" w:w="2412"/>
+            <w:tcW w:type="dxa" w:w="2448"/>
             <w:shd w:fill="F8FAFC"/>
           </w:tcPr>
           <w:p>
@@ -1713,7 +1740,7 @@
         </w:tc>
         <w:tc>
           <w:tcPr>
-            <w:tcW w:type="dxa" w:w="2412"/>
+            <w:tcW w:type="dxa" w:w="2448"/>
             <w:shd w:fill="F8FAFC"/>
           </w:tcPr>
           <w:p>
@@ -1732,7 +1759,7 @@
         </w:tc>
         <w:tc>
           <w:tcPr>
-            <w:tcW w:type="dxa" w:w="2412"/>
+            <w:tcW w:type="dxa" w:w="2448"/>
             <w:shd w:fill="F8FAFC"/>
           </w:tcPr>
           <w:p>
@@ -1751,7 +1778,7 @@
         </w:tc>
         <w:tc>
           <w:tcPr>
-            <w:tcW w:type="dxa" w:w="2412"/>
+            <w:tcW w:type="dxa" w:w="2448"/>
             <w:shd w:fill="F8FAFC"/>
           </w:tcPr>
           <w:p>
@@ -1774,618 +1801,6 @@
       <w:pPr>
         <w:spacing w:after="120"/>
       </w:pPr>
-    </w:p>
-    <w:p>
-      <w:pPr>
-        <w:pStyle w:val="Heading2"/>
-        <w:keepNext/>
-        <w:spacing w:before="280" w:after="120"/>
-      </w:pPr>
-      <w:r>
-        <w:rPr>
-          <w:rFonts w:ascii="Georgia" w:hAnsi="Georgia"/>
-          <w:b/>
-          <w:color w:val="1E3A8A"/>
-          <w:sz w:val="25"/>
-        </w:rPr>
-        <w:t>Ventilation du Coût Budgétaire IA par Allocation (435 k€ / an)</w:t>
-      </w:r>
-    </w:p>
-    <w:p>
-      <w:pPr>
-        <w:pStyle w:val="ListBullet"/>
-        <w:spacing w:before="40" w:after="100" w:line="276" w:lineRule="auto"/>
-        <w:ind w:left="504"/>
-      </w:pPr>
-      <w:r>
-        <w:rPr>
-          <w:rFonts w:ascii="Arial" w:hAnsi="Arial"/>
-          <w:b/>
-          <w:color w:val="0F172A"/>
-        </w:rPr>
-        <w:t>Découpage des Dépenses</w:t>
-      </w:r>
-      <w:r>
-        <w:rPr>
-          <w:rFonts w:ascii="Arial" w:hAnsi="Arial"/>
-          <w:color w:val="1E293B"/>
-        </w:rPr>
-        <w:t xml:space="preserve"> : L'investissement annuel brut est optimisé à </w:t>
-      </w:r>
-      <w:r>
-        <w:rPr>
-          <w:rFonts w:ascii="Arial" w:hAnsi="Arial"/>
-          <w:b/>
-          <w:color w:val="0F172A"/>
-        </w:rPr>
-        <w:t>435 k€ / an</w:t>
-      </w:r>
-      <w:r>
-        <w:rPr>
-          <w:rFonts w:ascii="Arial" w:hAnsi="Arial"/>
-          <w:color w:val="1E293B"/>
-        </w:rPr>
-        <w:t xml:space="preserve"> (grâce à l'engagement en temps partagé 2,5j/sem de la Direction de Projet à 65 k€). Avec le co-financement UE (</w:t>
-      </w:r>
-      <w:r>
-        <w:rPr>
-          <w:rFonts w:ascii="Arial" w:hAnsi="Arial"/>
-          <w:i/>
-        </w:rPr>
-        <w:t>Digital Europe</w:t>
-      </w:r>
-      <w:r>
-        <w:rPr>
-          <w:rFonts w:ascii="Arial" w:hAnsi="Arial"/>
-          <w:color w:val="1E293B"/>
-        </w:rPr>
-        <w:t xml:space="preserve"> à 50 %), le reste à charge net métropolitain descend à seulement </w:t>
-      </w:r>
-      <w:r>
-        <w:rPr>
-          <w:rFonts w:ascii="Arial" w:hAnsi="Arial"/>
-          <w:b/>
-          <w:color w:val="0F172A"/>
-        </w:rPr>
-        <w:t>~217 k€ / an</w:t>
-      </w:r>
-      <w:r>
-        <w:rPr>
-          <w:rFonts w:ascii="Arial" w:hAnsi="Arial"/>
-          <w:color w:val="1E293B"/>
-        </w:rPr>
-        <w:t>.</w:t>
-      </w:r>
-    </w:p>
-    <w:tbl>
-      <w:tblPr>
-        <w:tblW w:type="auto" w:w="0"/>
-        <w:jc w:val="center"/>
-        <w:tblLook w:firstColumn="1" w:firstRow="1" w:lastColumn="0" w:lastRow="0" w:noHBand="0" w:noVBand="1" w:val="04A0"/>
-      </w:tblPr>
-      <w:tblGrid>
-        <w:gridCol w:w="2412"/>
-        <w:gridCol w:w="2412"/>
-        <w:gridCol w:w="2412"/>
-        <w:gridCol w:w="2412"/>
-      </w:tblGrid>
-      <w:tr>
-        <w:tc>
-          <w:tcPr>
-            <w:tcW w:type="dxa" w:w="2412"/>
-            <w:shd w:fill="1E293B"/>
-          </w:tcPr>
-          <w:p>
-            <w:pPr>
-              <w:spacing w:before="60" w:after="60"/>
-            </w:pPr>
-            <w:r>
-              <w:rPr>
-                <w:rFonts w:ascii="Arial" w:hAnsi="Arial"/>
-                <w:b/>
-                <w:color w:val="FFFFFF"/>
-                <w:sz w:val="17"/>
-              </w:rPr>
-              <w:t>Poste d'Allocation Budgétaire</w:t>
-            </w:r>
-          </w:p>
-        </w:tc>
-        <w:tc>
-          <w:tcPr>
-            <w:tcW w:type="dxa" w:w="2412"/>
-            <w:shd w:fill="1E293B"/>
-          </w:tcPr>
-          <w:p>
-            <w:pPr>
-              <w:spacing w:before="60" w:after="60"/>
-            </w:pPr>
-            <w:r>
-              <w:rPr>
-                <w:rFonts w:ascii="Arial" w:hAnsi="Arial"/>
-                <w:b/>
-                <w:color w:val="FFFFFF"/>
-                <w:sz w:val="17"/>
-              </w:rPr>
-              <w:t>Montant Annuel</w:t>
-            </w:r>
-          </w:p>
-        </w:tc>
-        <w:tc>
-          <w:tcPr>
-            <w:tcW w:type="dxa" w:w="2412"/>
-            <w:shd w:fill="1E293B"/>
-          </w:tcPr>
-          <w:p>
-            <w:pPr>
-              <w:spacing w:before="60" w:after="60"/>
-            </w:pPr>
-            <w:r>
-              <w:rPr>
-                <w:rFonts w:ascii="Arial" w:hAnsi="Arial"/>
-                <w:b/>
-                <w:color w:val="FFFFFF"/>
-                <w:sz w:val="17"/>
-              </w:rPr>
-              <w:t>Part (%)</w:t>
-            </w:r>
-          </w:p>
-        </w:tc>
-        <w:tc>
-          <w:tcPr>
-            <w:tcW w:type="dxa" w:w="2412"/>
-            <w:shd w:fill="1E293B"/>
-          </w:tcPr>
-          <w:p>
-            <w:pPr>
-              <w:spacing w:before="60" w:after="60"/>
-            </w:pPr>
-            <w:r>
-              <w:rPr>
-                <w:rFonts w:ascii="Arial" w:hAnsi="Arial"/>
-                <w:b/>
-                <w:color w:val="FFFFFF"/>
-                <w:sz w:val="17"/>
-              </w:rPr>
-              <w:t>Destination Opérationnelle</w:t>
-            </w:r>
-          </w:p>
-        </w:tc>
-      </w:tr>
-      <w:tr>
-        <w:tc>
-          <w:tcPr>
-            <w:tcW w:type="dxa" w:w="2412"/>
-            <w:shd w:fill="F8FAFC"/>
-          </w:tcPr>
-          <w:p>
-            <w:pPr>
-              <w:spacing w:before="60" w:after="60"/>
-            </w:pPr>
-            <w:r>
-              <w:rPr>
-                <w:rFonts w:ascii="Arial" w:hAnsi="Arial"/>
-                <w:color w:val="1E293B"/>
-                <w:sz w:val="16"/>
-              </w:rPr>
-              <w:t>1. Licences Algorithmiques &amp; Modèles Souverains</w:t>
-            </w:r>
-          </w:p>
-        </w:tc>
-        <w:tc>
-          <w:tcPr>
-            <w:tcW w:type="dxa" w:w="2412"/>
-            <w:shd w:fill="F8FAFC"/>
-          </w:tcPr>
-          <w:p>
-            <w:pPr>
-              <w:spacing w:before="60" w:after="60"/>
-            </w:pPr>
-            <w:r>
-              <w:rPr>
-                <w:rFonts w:ascii="Arial" w:hAnsi="Arial"/>
-                <w:color w:val="1E293B"/>
-                <w:sz w:val="16"/>
-              </w:rPr>
-              <w:t>150 k€</w:t>
-            </w:r>
-          </w:p>
-        </w:tc>
-        <w:tc>
-          <w:tcPr>
-            <w:tcW w:type="dxa" w:w="2412"/>
-            <w:shd w:fill="F8FAFC"/>
-          </w:tcPr>
-          <w:p>
-            <w:pPr>
-              <w:spacing w:before="60" w:after="60"/>
-            </w:pPr>
-            <w:r>
-              <w:rPr>
-                <w:rFonts w:ascii="Arial" w:hAnsi="Arial"/>
-                <w:color w:val="1E293B"/>
-                <w:sz w:val="16"/>
-              </w:rPr>
-              <w:t>34,5 %</w:t>
-            </w:r>
-          </w:p>
-        </w:tc>
-        <w:tc>
-          <w:tcPr>
-            <w:tcW w:type="dxa" w:w="2412"/>
-            <w:shd w:fill="F8FAFC"/>
-          </w:tcPr>
-          <w:p>
-            <w:pPr>
-              <w:spacing w:before="60" w:after="60"/>
-            </w:pPr>
-            <w:r>
-              <w:rPr>
-                <w:rFonts w:ascii="Arial" w:hAnsi="Arial"/>
-                <w:color w:val="1E293B"/>
-                <w:sz w:val="16"/>
-              </w:rPr>
-              <w:t>Inférence VSA CSU, modèles locaux et API sécurisées.</w:t>
-            </w:r>
-          </w:p>
-        </w:tc>
-      </w:tr>
-      <w:tr>
-        <w:tc>
-          <w:tcPr>
-            <w:tcW w:type="dxa" w:w="2412"/>
-            <w:shd w:fill="FFFFFF"/>
-          </w:tcPr>
-          <w:p>
-            <w:pPr>
-              <w:spacing w:before="60" w:after="60"/>
-            </w:pPr>
-            <w:r>
-              <w:rPr>
-                <w:rFonts w:ascii="Arial" w:hAnsi="Arial"/>
-                <w:color w:val="1E293B"/>
-                <w:sz w:val="16"/>
-              </w:rPr>
-              <w:t>2. Cloud Souverain &amp; Fibre Monaco Cloud</w:t>
-            </w:r>
-          </w:p>
-        </w:tc>
-        <w:tc>
-          <w:tcPr>
-            <w:tcW w:type="dxa" w:w="2412"/>
-            <w:shd w:fill="FFFFFF"/>
-          </w:tcPr>
-          <w:p>
-            <w:pPr>
-              <w:spacing w:before="60" w:after="60"/>
-            </w:pPr>
-            <w:r>
-              <w:rPr>
-                <w:rFonts w:ascii="Arial" w:hAnsi="Arial"/>
-                <w:color w:val="1E293B"/>
-                <w:sz w:val="16"/>
-              </w:rPr>
-              <w:t>120 k€</w:t>
-            </w:r>
-          </w:p>
-        </w:tc>
-        <w:tc>
-          <w:tcPr>
-            <w:tcW w:type="dxa" w:w="2412"/>
-            <w:shd w:fill="FFFFFF"/>
-          </w:tcPr>
-          <w:p>
-            <w:pPr>
-              <w:spacing w:before="60" w:after="60"/>
-            </w:pPr>
-            <w:r>
-              <w:rPr>
-                <w:rFonts w:ascii="Arial" w:hAnsi="Arial"/>
-                <w:color w:val="1E293B"/>
-                <w:sz w:val="16"/>
-              </w:rPr>
-              <w:t>27,6 %</w:t>
-            </w:r>
-          </w:p>
-        </w:tc>
-        <w:tc>
-          <w:tcPr>
-            <w:tcW w:type="dxa" w:w="2412"/>
-            <w:shd w:fill="FFFFFF"/>
-          </w:tcPr>
-          <w:p>
-            <w:pPr>
-              <w:spacing w:before="60" w:after="60"/>
-            </w:pPr>
-            <w:r>
-              <w:rPr>
-                <w:rFonts w:ascii="Arial" w:hAnsi="Arial"/>
-                <w:color w:val="1E293B"/>
-                <w:sz w:val="16"/>
-              </w:rPr>
-              <w:t>Instances GPU certifiées AMSN et liaison fibre dédiée.</w:t>
-            </w:r>
-          </w:p>
-        </w:tc>
-      </w:tr>
-      <w:tr>
-        <w:tc>
-          <w:tcPr>
-            <w:tcW w:type="dxa" w:w="2412"/>
-            <w:shd w:fill="F8FAFC"/>
-          </w:tcPr>
-          <w:p>
-            <w:pPr>
-              <w:spacing w:before="60" w:after="60"/>
-            </w:pPr>
-            <w:r>
-              <w:rPr>
-                <w:rFonts w:ascii="Arial" w:hAnsi="Arial"/>
-                <w:color w:val="1E293B"/>
-                <w:sz w:val="16"/>
-              </w:rPr>
-              <w:t>3. Direction de Projet (Benoît SIGWALD - 2,5j/sem)</w:t>
-            </w:r>
-          </w:p>
-        </w:tc>
-        <w:tc>
-          <w:tcPr>
-            <w:tcW w:type="dxa" w:w="2412"/>
-            <w:shd w:fill="F8FAFC"/>
-          </w:tcPr>
-          <w:p>
-            <w:pPr>
-              <w:spacing w:before="60" w:after="60"/>
-            </w:pPr>
-            <w:r>
-              <w:rPr>
-                <w:rFonts w:ascii="Arial" w:hAnsi="Arial"/>
-                <w:color w:val="1E293B"/>
-                <w:sz w:val="16"/>
-              </w:rPr>
-              <w:t>65 k€</w:t>
-            </w:r>
-          </w:p>
-        </w:tc>
-        <w:tc>
-          <w:tcPr>
-            <w:tcW w:type="dxa" w:w="2412"/>
-            <w:shd w:fill="F8FAFC"/>
-          </w:tcPr>
-          <w:p>
-            <w:pPr>
-              <w:spacing w:before="60" w:after="60"/>
-            </w:pPr>
-            <w:r>
-              <w:rPr>
-                <w:rFonts w:ascii="Arial" w:hAnsi="Arial"/>
-                <w:color w:val="1E293B"/>
-                <w:sz w:val="16"/>
-              </w:rPr>
-              <w:t>14,9 %</w:t>
-            </w:r>
-          </w:p>
-        </w:tc>
-        <w:tc>
-          <w:tcPr>
-            <w:tcW w:type="dxa" w:w="2412"/>
-            <w:shd w:fill="F8FAFC"/>
-          </w:tcPr>
-          <w:p>
-            <w:pPr>
-              <w:spacing w:before="60" w:after="60"/>
-            </w:pPr>
-            <w:r>
-              <w:rPr>
-                <w:rFonts w:ascii="Arial" w:hAnsi="Arial"/>
-                <w:color w:val="1E293B"/>
-                <w:sz w:val="16"/>
-              </w:rPr>
-              <w:t>Direction de projet (2,5j/semaine), suivi des marchés.</w:t>
-            </w:r>
-          </w:p>
-        </w:tc>
-      </w:tr>
-      <w:tr>
-        <w:tc>
-          <w:tcPr>
-            <w:tcW w:type="dxa" w:w="2412"/>
-            <w:shd w:fill="FFFFFF"/>
-          </w:tcPr>
-          <w:p>
-            <w:pPr>
-              <w:spacing w:before="60" w:after="60"/>
-            </w:pPr>
-            <w:r>
-              <w:rPr>
-                <w:rFonts w:ascii="Arial" w:hAnsi="Arial"/>
-                <w:color w:val="1E293B"/>
-                <w:sz w:val="16"/>
-              </w:rPr>
-              <w:t>4. Audit AI Act, Cybersécurité NIS 2 &amp; Éthique</w:t>
-            </w:r>
-          </w:p>
-        </w:tc>
-        <w:tc>
-          <w:tcPr>
-            <w:tcW w:type="dxa" w:w="2412"/>
-            <w:shd w:fill="FFFFFF"/>
-          </w:tcPr>
-          <w:p>
-            <w:pPr>
-              <w:spacing w:before="60" w:after="60"/>
-            </w:pPr>
-            <w:r>
-              <w:rPr>
-                <w:rFonts w:ascii="Arial" w:hAnsi="Arial"/>
-                <w:color w:val="1E293B"/>
-                <w:sz w:val="16"/>
-              </w:rPr>
-              <w:t>60 k€</w:t>
-            </w:r>
-          </w:p>
-        </w:tc>
-        <w:tc>
-          <w:tcPr>
-            <w:tcW w:type="dxa" w:w="2412"/>
-            <w:shd w:fill="FFFFFF"/>
-          </w:tcPr>
-          <w:p>
-            <w:pPr>
-              <w:spacing w:before="60" w:after="60"/>
-            </w:pPr>
-            <w:r>
-              <w:rPr>
-                <w:rFonts w:ascii="Arial" w:hAnsi="Arial"/>
-                <w:color w:val="1E293B"/>
-                <w:sz w:val="16"/>
-              </w:rPr>
-              <w:t>13,8 %</w:t>
-            </w:r>
-          </w:p>
-        </w:tc>
-        <w:tc>
-          <w:tcPr>
-            <w:tcW w:type="dxa" w:w="2412"/>
-            <w:shd w:fill="FFFFFF"/>
-          </w:tcPr>
-          <w:p>
-            <w:pPr>
-              <w:spacing w:before="60" w:after="60"/>
-            </w:pPr>
-            <w:r>
-              <w:rPr>
-                <w:rFonts w:ascii="Arial" w:hAnsi="Arial"/>
-                <w:color w:val="1E293B"/>
-                <w:sz w:val="16"/>
-              </w:rPr>
-              <w:t>Audits de conformité, pentests et secrétariat éthique.</w:t>
-            </w:r>
-          </w:p>
-        </w:tc>
-      </w:tr>
-      <w:tr>
-        <w:tc>
-          <w:tcPr>
-            <w:tcW w:type="dxa" w:w="2412"/>
-            <w:shd w:fill="F8FAFC"/>
-          </w:tcPr>
-          <w:p>
-            <w:pPr>
-              <w:spacing w:before="60" w:after="60"/>
-            </w:pPr>
-            <w:r>
-              <w:rPr>
-                <w:rFonts w:ascii="Arial" w:hAnsi="Arial"/>
-                <w:color w:val="1E293B"/>
-                <w:sz w:val="16"/>
-              </w:rPr>
-              <w:t>5. Concertation &amp; IA Einstein par Quartier</w:t>
-            </w:r>
-          </w:p>
-        </w:tc>
-        <w:tc>
-          <w:tcPr>
-            <w:tcW w:type="dxa" w:w="2412"/>
-            <w:shd w:fill="F8FAFC"/>
-          </w:tcPr>
-          <w:p>
-            <w:pPr>
-              <w:spacing w:before="60" w:after="60"/>
-            </w:pPr>
-            <w:r>
-              <w:rPr>
-                <w:rFonts w:ascii="Arial" w:hAnsi="Arial"/>
-                <w:color w:val="1E293B"/>
-                <w:sz w:val="16"/>
-              </w:rPr>
-              <w:t>40 k€</w:t>
-            </w:r>
-          </w:p>
-        </w:tc>
-        <w:tc>
-          <w:tcPr>
-            <w:tcW w:type="dxa" w:w="2412"/>
-            <w:shd w:fill="F8FAFC"/>
-          </w:tcPr>
-          <w:p>
-            <w:pPr>
-              <w:spacing w:before="60" w:after="60"/>
-            </w:pPr>
-            <w:r>
-              <w:rPr>
-                <w:rFonts w:ascii="Arial" w:hAnsi="Arial"/>
-                <w:color w:val="1E293B"/>
-                <w:sz w:val="16"/>
-              </w:rPr>
-              <w:t>9,2 %</w:t>
-            </w:r>
-          </w:p>
-        </w:tc>
-        <w:tc>
-          <w:tcPr>
-            <w:tcW w:type="dxa" w:w="2412"/>
-            <w:shd w:fill="F8FAFC"/>
-          </w:tcPr>
-          <w:p>
-            <w:pPr>
-              <w:spacing w:before="60" w:after="60"/>
-            </w:pPr>
-            <w:r>
-              <w:rPr>
-                <w:rFonts w:ascii="Arial" w:hAnsi="Arial"/>
-                <w:color w:val="1E293B"/>
-                <w:sz w:val="16"/>
-              </w:rPr>
-              <w:t>Plateforme de démocratie participative augmentée.</w:t>
-            </w:r>
-          </w:p>
-        </w:tc>
-      </w:tr>
-    </w:tbl>
-    <w:p>
-      <w:pPr>
-        <w:spacing w:after="160"/>
-      </w:pPr>
-    </w:p>
-    <w:p>
-      <w:pPr>
-        <w:spacing w:before="160" w:after="280"/>
-        <w:jc w:val="center"/>
-      </w:pPr>
-      <w:r>
-        <w:drawing>
-          <wp:inline xmlns:a="http://schemas.openxmlformats.org/drawingml/2006/main" xmlns:pic="http://schemas.openxmlformats.org/drawingml/2006/picture">
-            <wp:extent cx="5669280" cy="2559050"/>
-            <wp:docPr id="1" name="Picture 1"/>
-            <wp:cNvGraphicFramePr>
-              <a:graphicFrameLocks noChangeAspect="1"/>
-            </wp:cNvGraphicFramePr>
-            <a:graphic>
-              <a:graphicData uri="http://schemas.openxmlformats.org/drawingml/2006/picture">
-                <pic:pic>
-                  <pic:nvPicPr>
-                    <pic:cNvPr id="0" name="chart2_roi_gains.png"/>
-                    <pic:cNvPicPr/>
-                  </pic:nvPicPr>
-                  <pic:blipFill>
-                    <a:blip r:embed="rId9"/>
-                    <a:stretch>
-                      <a:fillRect/>
-                    </a:stretch>
-                  </pic:blipFill>
-                  <pic:spPr>
-                    <a:xfrm>
-                      <a:off x="0" y="0"/>
-                      <a:ext cx="5669280" cy="2559050"/>
-                    </a:xfrm>
-                    <a:prstGeom prst="rect"/>
-                  </pic:spPr>
-                </pic:pic>
-              </a:graphicData>
-            </a:graphic>
-          </wp:inline>
-        </w:drawing>
-      </w:r>
     </w:p>
     <w:p>
       <w:r>
@@ -2421,7 +1836,7 @@
           <w:color w:val="1E3A8A"/>
           <w:sz w:val="25"/>
         </w:rPr>
-        <w:t>1.1 Alignement Institutionnel &amp; Leadership Métropolitain</w:t>
+        <w:t>1.1 Alignement Institutionnel &amp; Leadership</w:t>
       </w:r>
     </w:p>
     <w:p>
@@ -2635,6 +2050,51 @@
           <w:b/>
           <w:color w:val="0F172A"/>
         </w:rPr>
+        <w:t>Sophia c’est ~25,6 % de tous les emplois technopolitains de France.</w:t>
+      </w:r>
+    </w:p>
+    <w:p>
+      <w:pPr>
+        <w:pStyle w:val="ListBullet"/>
+        <w:spacing w:before="40" w:after="100" w:line="276" w:lineRule="auto"/>
+        <w:ind w:left="504"/>
+      </w:pPr>
+      <w:r>
+        <w:rPr>
+          <w:rFonts w:ascii="Arial" w:hAnsi="Arial"/>
+          <w:b/>
+          <w:color w:val="0F172A"/>
+        </w:rPr>
+        <w:t>Sophia c’est ~19,3 % du total des entreprises implantées dans ces structures.</w:t>
+      </w:r>
+    </w:p>
+    <w:p>
+      <w:pPr>
+        <w:pStyle w:val="ListBullet"/>
+        <w:spacing w:before="40" w:after="100" w:line="276" w:lineRule="auto"/>
+        <w:ind w:left="504"/>
+      </w:pPr>
+      <w:r>
+        <w:rPr>
+          <w:rFonts w:ascii="Arial" w:hAnsi="Arial"/>
+          <w:b/>
+          <w:color w:val="0F172A"/>
+        </w:rPr>
+        <w:t>Le terreau azuréen représente seulement 1,66 % de la population Française.</w:t>
+      </w:r>
+    </w:p>
+    <w:p>
+      <w:pPr>
+        <w:pStyle w:val="ListBullet"/>
+        <w:spacing w:before="40" w:after="100" w:line="276" w:lineRule="auto"/>
+        <w:ind w:left="504"/>
+      </w:pPr>
+      <w:r>
+        <w:rPr>
+          <w:rFonts w:ascii="Arial" w:hAnsi="Arial"/>
+          <w:b/>
+          <w:color w:val="0F172A"/>
+        </w:rPr>
         <w:t>Institut 3IA Côte d’Azur &amp; UCA</w:t>
       </w:r>
       <w:r>
@@ -2780,14 +2240,14 @@
     </w:p>
     <w:p>
       <w:pPr>
-        <w:spacing w:before="200" w:after="240"/>
+        <w:spacing w:before="160" w:after="200"/>
         <w:jc w:val="center"/>
       </w:pPr>
       <w:r>
         <w:drawing>
           <wp:inline xmlns:a="http://schemas.openxmlformats.org/drawingml/2006/main" xmlns:pic="http://schemas.openxmlformats.org/drawingml/2006/picture">
-            <wp:extent cx="5669280" cy="1811020"/>
-            <wp:docPr id="2" name="Picture 2"/>
+            <wp:extent cx="5486400" cy="1752600"/>
+            <wp:docPr id="1" name="Picture 1"/>
             <wp:cNvGraphicFramePr>
               <a:graphicFrameLocks noChangeAspect="1"/>
             </wp:cNvGraphicFramePr>
@@ -2799,7 +2259,7 @@
                     <pic:cNvPicPr/>
                   </pic:nvPicPr>
                   <pic:blipFill>
-                    <a:blip r:embed="rId10"/>
+                    <a:blip r:embed="rId9"/>
                     <a:stretch>
                       <a:fillRect/>
                     </a:stretch>
@@ -2807,7 +2267,7 @@
                   <pic:spPr>
                     <a:xfrm>
                       <a:off x="0" y="0"/>
-                      <a:ext cx="5669280" cy="1811020"/>
+                      <a:ext cx="5486400" cy="1752600"/>
                     </a:xfrm>
                     <a:prstGeom prst="rect"/>
                   </pic:spPr>
@@ -2875,7 +2335,7 @@
           <w:rFonts w:ascii="Arial" w:hAnsi="Arial"/>
           <w:color w:val="1E293B"/>
         </w:rPr>
-        <w:t xml:space="preserve"> : Monaco dispose d'un capital et d'un tissu d'entreprises majeurs mais souffre d'une contrainte foncière extrême. L'alliance avec la Métropole Nice Côte d'Azur offre le terrain d'extension économique et technologique indispensable.</w:t>
+        <w:t xml:space="preserve"> : Monaco dispose d'un capital et d'un tissu d'entreprises majeurs mais souffre d'une contrainte foncière extrême. L'alliance avec la Métropole Nice Côte d'Azur offrirait le terrain d'extension économique et technologique indispensable.</w:t>
       </w:r>
     </w:p>
     <w:p>
@@ -2897,7 +2357,7 @@
           <w:rFonts w:ascii="Arial" w:hAnsi="Arial"/>
           <w:color w:val="1E293B"/>
         </w:rPr>
-        <w:t xml:space="preserve"> : Plus de 45 000 salariés traversent chaque jour Nice pour travailler à Monaco (sources INSEE/SCT), constituant un bassin d'emploi unique à irriguer par l'IA.</w:t>
+        <w:t xml:space="preserve"> : Plus de 45 000 salariés traversent chaque jour Nice pour travailler à Monaco (sources INSEE/SCT), constituant un bassin d'emploi unique à irriguer par l'IA. Réduire ces déplacements au quotidien permettra une amélioration de la qualité de vie et une maîtrise des émissions de CO2.</w:t>
       </w:r>
     </w:p>
     <w:p>
@@ -2941,7 +2401,7 @@
           <w:rFonts w:ascii="Arial" w:hAnsi="Arial"/>
           <w:color w:val="1E293B"/>
         </w:rPr>
-        <w:t xml:space="preserve"> : Extrémité d'une « presqu'île électrique » vulnérable (coupure de 2009 ; RTE 2025 saturé), imposant la doctrine de l'IA frugale par nécessité.</w:t>
+        <w:t xml:space="preserve"> : Extrémité d'une « presqu'île électrique » vulnérable (coupure de 2009 ; RTE 2025 saturé), imposing la doctrine de l'IA frugale par nécessité (un data center nécessiterait des investissements RTE très importants).</w:t>
       </w:r>
     </w:p>
     <w:p>
@@ -3046,7 +2506,22 @@
           <w:rFonts w:ascii="Arial" w:hAnsi="Arial"/>
           <w:color w:val="1E293B"/>
         </w:rPr>
-        <w:t xml:space="preserve"> par site pour co-financer un supercalculateur d'IA souverain.</w:t>
+        <w:t xml:space="preserve"> par site pour co-financer le développement de l'IA souverain.</w:t>
+      </w:r>
+    </w:p>
+    <w:p>
+      <w:pPr>
+        <w:pStyle w:val="ListBullet"/>
+        <w:spacing w:before="40" w:after="100" w:line="276" w:lineRule="auto"/>
+        <w:ind w:left="504"/>
+      </w:pPr>
+      <w:r>
+        <w:rPr>
+          <w:rFonts w:ascii="Arial" w:hAnsi="Arial"/>
+          <w:b/>
+          <w:color w:val="0F172A"/>
+        </w:rPr>
+        <w:t>Monaco Cloud est l'opportunité pour développer l'existant.</w:t>
       </w:r>
     </w:p>
     <w:p>
@@ -3246,7 +2721,7 @@
           <w:b/>
           <w:color w:val="0F172A"/>
         </w:rPr>
-        <w:t>4. La Ville client n°1</w:t>
+        <w:t>4. La Ville de Nice et la Métropole client n°1</w:t>
       </w:r>
       <w:r>
         <w:rPr>
@@ -3430,7 +2905,7 @@
           <w:b/>
           <w:color w:val="0F172A"/>
         </w:rPr>
-        <w:t>Résultat certifié</w:t>
+        <w:t>Résultat attendu</w:t>
       </w:r>
       <w:r>
         <w:rPr>
@@ -3579,7 +3054,7 @@
           <w:rFonts w:ascii="Arial" w:hAnsi="Arial"/>
           <w:color w:val="1E293B"/>
         </w:rPr>
-        <w:t xml:space="preserve"> : Traitement instantané de 40 % des appels récurrents, libérant les agents humains pour l'accompagnement social personnalisé et les urgences graves.</w:t>
+        <w:t xml:space="preserve"> : Traitement instantané de 40 % des appels récurrents, libérant les agents humains pour l'accompagnement personnalisé et les urgences graves.</w:t>
       </w:r>
     </w:p>
     <w:p>
@@ -3677,7 +3152,7 @@
           <w:color w:val="1E3A8A"/>
           <w:sz w:val="25"/>
         </w:rPr>
-        <w:t>2.4 Consultation Directe par Quartier via l'IA Einstein</w:t>
+        <w:t>2.4 Consultation Directe par Quartier via l'IA</w:t>
       </w:r>
     </w:p>
     <w:p>
@@ -3699,7 +3174,7 @@
           <w:rFonts w:ascii="Arial" w:hAnsi="Arial"/>
           <w:color w:val="1E293B"/>
         </w:rPr>
-        <w:t xml:space="preserve"> : Déploiement de la plateforme de démocratie participative augmentée par l'</w:t>
+        <w:t xml:space="preserve"> : Déploiement de la plateforme de démocratie participative augmentée par </w:t>
       </w:r>
       <w:r>
         <w:rPr>
@@ -3707,7 +3182,7 @@
           <w:b/>
           <w:color w:val="0F172A"/>
         </w:rPr>
-        <w:t>IA Einstein</w:t>
+        <w:t>l'IA</w:t>
       </w:r>
       <w:r>
         <w:rPr>
@@ -3801,7 +3276,7 @@
           <w:color w:val="0F172A"/>
           <w:sz w:val="30"/>
         </w:rPr>
-        <w:t>3. Pôle 2 : Axe Métropole Nice Côte d'Azur (Budget, Cyber &amp; Monaco)</w:t>
+        <w:t>3. Pôle 2 : Axe Métropole Nice Côte d'Azur (Budget, DSI &amp; Monaco)</w:t>
       </w:r>
     </w:p>
     <w:p>
@@ -3959,7 +3434,7 @@
           <w:b/>
           <w:color w:val="0F172A"/>
         </w:rPr>
-        <w:t>1,8 M€ à 3,0 M€ de sinistre moyen évité par an</w:t>
+        <w:t>1,8 M€ à 3,0 M€ de cout moyen évité par an</w:t>
       </w:r>
       <w:r>
         <w:rPr>
@@ -4378,6 +3853,110 @@
       </w:r>
     </w:p>
     <w:p>
+      <w:pPr>
+        <w:pStyle w:val="Heading2"/>
+        <w:keepNext/>
+        <w:spacing w:before="280" w:after="120"/>
+      </w:pPr>
+      <w:r>
+        <w:rPr>
+          <w:rFonts w:ascii="Georgia" w:hAnsi="Georgia"/>
+          <w:b/>
+          <w:color w:val="1E3A8A"/>
+          <w:sz w:val="25"/>
+        </w:rPr>
+        <w:t>4.4 Pôle d'Excellence pour les Niçoises et les Niçois</w:t>
+      </w:r>
+    </w:p>
+    <w:p>
+      <w:pPr>
+        <w:pStyle w:val="ListBullet"/>
+        <w:spacing w:before="40" w:after="100" w:line="276" w:lineRule="auto"/>
+        <w:ind w:left="504"/>
+      </w:pPr>
+      <w:r>
+        <w:rPr>
+          <w:rFonts w:ascii="Arial" w:hAnsi="Arial"/>
+          <w:b/>
+          <w:color w:val="0F172A"/>
+        </w:rPr>
+        <w:t>Acculturation &amp; Formations Gratuites dans les AnimaNice</w:t>
+      </w:r>
+      <w:r>
+        <w:rPr>
+          <w:rFonts w:ascii="Arial" w:hAnsi="Arial"/>
+          <w:color w:val="1E293B"/>
+        </w:rPr>
+        <w:t xml:space="preserve"> : Déploiement d'ateliers hebdomadaires d'initiation et de maîtrise de l'IA pour les séniors, les familles et les jeunes au sein de l'ensemble du réseau des centres AnimaNice (Vieux-Nice, Ariane, Cimiez, Fabron, Riquier, etc.).</w:t>
+      </w:r>
+    </w:p>
+    <w:p>
+      <w:pPr>
+        <w:pStyle w:val="ListBullet"/>
+        <w:spacing w:before="40" w:after="100" w:line="276" w:lineRule="auto"/>
+        <w:ind w:left="504"/>
+      </w:pPr>
+      <w:r>
+        <w:rPr>
+          <w:rFonts w:ascii="Arial" w:hAnsi="Arial"/>
+          <w:b/>
+          <w:color w:val="0F172A"/>
+        </w:rPr>
+        <w:t>Charte d'Éthique &amp; Protection Absolue des Données Personnelles</w:t>
+      </w:r>
+      <w:r>
+        <w:rPr>
+          <w:rFonts w:ascii="Arial" w:hAnsi="Arial"/>
+          <w:color w:val="1E293B"/>
+        </w:rPr>
+        <w:t xml:space="preserve"> : Sanctification de la vie privée des Niçois. Aucune donnée citoyenne ou image vidéo n'est commercialisée ni stockée hors des serveurs souverains sous souveraineté exclusive (Monaco Cloud AMSN / Air-Gap Métropolitain).</w:t>
+      </w:r>
+    </w:p>
+    <w:p>
+      <w:pPr>
+        <w:pStyle w:val="ListBullet"/>
+        <w:spacing w:before="40" w:after="100" w:line="276" w:lineRule="auto"/>
+        <w:ind w:left="504"/>
+      </w:pPr>
+      <w:r>
+        <w:rPr>
+          <w:rFonts w:ascii="Arial" w:hAnsi="Arial"/>
+          <w:b/>
+          <w:color w:val="0F172A"/>
+        </w:rPr>
+        <w:t>Pass IA Jeunesse &amp; Accompagnement Éducatif</w:t>
+      </w:r>
+      <w:r>
+        <w:rPr>
+          <w:rFonts w:ascii="Arial" w:hAnsi="Arial"/>
+          <w:color w:val="1E293B"/>
+        </w:rPr>
+        <w:t xml:space="preserve"> : Partenariat avec l'Université Côte d'Azur pour mettre à disposition des étudiants, lycéens et collégiens niçois des accès souverains gratuits aux outils de recherche et d'ingénierie IA.</w:t>
+      </w:r>
+    </w:p>
+    <w:p>
+      <w:pPr>
+        <w:pStyle w:val="ListBullet"/>
+        <w:spacing w:before="40" w:after="100" w:line="276" w:lineRule="auto"/>
+        <w:ind w:left="504"/>
+      </w:pPr>
+      <w:r>
+        <w:rPr>
+          <w:rFonts w:ascii="Arial" w:hAnsi="Arial"/>
+          <w:b/>
+          <w:color w:val="0F172A"/>
+        </w:rPr>
+        <w:t>Transparence &amp; Gouvernance Citoyenne</w:t>
+      </w:r>
+      <w:r>
+        <w:rPr>
+          <w:rFonts w:ascii="Arial" w:hAnsi="Arial"/>
+          <w:color w:val="1E293B"/>
+        </w:rPr>
+        <w:t xml:space="preserve"> : Publication annuelle d'un bilan d'impact éthique et financier de l'IA municipale, librement accessible à tous les citoyens niçois.</w:t>
+      </w:r>
+    </w:p>
+    <w:p>
       <w:r>
         <w:br w:type="page"/>
       </w:r>
@@ -4411,7 +3990,7 @@
           <w:color w:val="1E3A8A"/>
           <w:sz w:val="25"/>
         </w:rPr>
-        <w:t>5.1 Présidence Éric Ciotti &amp; Direction Benoît SIGWALD (2,5j/sem)</w:t>
+        <w:t>5.1 Présidence Éric Ciotti</w:t>
       </w:r>
     </w:p>
     <w:p>
@@ -4500,52 +4079,7 @@
           <w:rFonts w:ascii="Arial" w:hAnsi="Arial"/>
           <w:color w:val="1E293B"/>
         </w:rPr>
-        <w:t xml:space="preserve">, réduisant la ligne AMO à </w:t>
-      </w:r>
-      <w:r>
-        <w:rPr>
-          <w:rFonts w:ascii="Arial" w:hAnsi="Arial"/>
-          <w:b/>
-          <w:color w:val="0F172A"/>
-        </w:rPr>
-        <w:t>65 k€ / an</w:t>
-      </w:r>
-      <w:r>
-        <w:rPr>
-          <w:rFonts w:ascii="Arial" w:hAnsi="Arial"/>
-          <w:color w:val="1E293B"/>
-        </w:rPr>
-        <w:t xml:space="preserve"> et amenant le budget global à </w:t>
-      </w:r>
-      <w:r>
-        <w:rPr>
-          <w:rFonts w:ascii="Arial" w:hAnsi="Arial"/>
-          <w:b/>
-          <w:color w:val="0F172A"/>
-        </w:rPr>
-        <w:t>435 k€ / an</w:t>
-      </w:r>
-      <w:r>
-        <w:rPr>
-          <w:rFonts w:ascii="Arial" w:hAnsi="Arial"/>
-          <w:color w:val="1E293B"/>
-        </w:rPr>
-        <w:t xml:space="preserve"> (reste à charge net métropolitain : </w:t>
-      </w:r>
-      <w:r>
-        <w:rPr>
-          <w:rFonts w:ascii="Arial" w:hAnsi="Arial"/>
-          <w:b/>
-          <w:color w:val="0F172A"/>
-        </w:rPr>
-        <w:t>~217 k€ / an</w:t>
-      </w:r>
-      <w:r>
-        <w:rPr>
-          <w:rFonts w:ascii="Arial" w:hAnsi="Arial"/>
-          <w:color w:val="1E293B"/>
-        </w:rPr>
-        <w:t>).</w:t>
+        <w:t>.</w:t>
       </w:r>
     </w:p>
     <w:p>
@@ -4571,15 +4105,15 @@
         <w:tblLook w:firstColumn="1" w:firstRow="1" w:lastColumn="0" w:lastRow="0" w:noHBand="0" w:noVBand="1" w:val="04A0"/>
       </w:tblPr>
       <w:tblGrid>
-        <w:gridCol w:w="2412"/>
-        <w:gridCol w:w="2412"/>
-        <w:gridCol w:w="2412"/>
-        <w:gridCol w:w="2412"/>
+        <w:gridCol w:w="2448"/>
+        <w:gridCol w:w="2448"/>
+        <w:gridCol w:w="2448"/>
+        <w:gridCol w:w="2448"/>
       </w:tblGrid>
       <w:tr>
         <w:tc>
           <w:tcPr>
-            <w:tcW w:type="dxa" w:w="2412"/>
+            <w:tcW w:type="dxa" w:w="2448"/>
             <w:shd w:fill="1E293B"/>
           </w:tcPr>
           <w:p>
@@ -4599,7 +4133,7 @@
         </w:tc>
         <w:tc>
           <w:tcPr>
-            <w:tcW w:type="dxa" w:w="2412"/>
+            <w:tcW w:type="dxa" w:w="2448"/>
             <w:shd w:fill="1E293B"/>
           </w:tcPr>
           <w:p>
@@ -4619,7 +4153,7 @@
         </w:tc>
         <w:tc>
           <w:tcPr>
-            <w:tcW w:type="dxa" w:w="2412"/>
+            <w:tcW w:type="dxa" w:w="2448"/>
             <w:shd w:fill="1E293B"/>
           </w:tcPr>
           <w:p>
@@ -4639,7 +4173,7 @@
         </w:tc>
         <w:tc>
           <w:tcPr>
-            <w:tcW w:type="dxa" w:w="2412"/>
+            <w:tcW w:type="dxa" w:w="2448"/>
             <w:shd w:fill="1E293B"/>
           </w:tcPr>
           <w:p>
@@ -4661,7 +4195,7 @@
       <w:tr>
         <w:tc>
           <w:tcPr>
-            <w:tcW w:type="dxa" w:w="2412"/>
+            <w:tcW w:type="dxa" w:w="2448"/>
             <w:shd w:fill="F8FAFC"/>
           </w:tcPr>
           <w:p>
@@ -4680,7 +4214,7 @@
         </w:tc>
         <w:tc>
           <w:tcPr>
-            <w:tcW w:type="dxa" w:w="2412"/>
+            <w:tcW w:type="dxa" w:w="2448"/>
             <w:shd w:fill="F8FAFC"/>
           </w:tcPr>
           <w:p>
@@ -4699,7 +4233,7 @@
         </w:tc>
         <w:tc>
           <w:tcPr>
-            <w:tcW w:type="dxa" w:w="2412"/>
+            <w:tcW w:type="dxa" w:w="2448"/>
             <w:shd w:fill="F8FAFC"/>
           </w:tcPr>
           <w:p>
@@ -4718,7 +4252,7 @@
         </w:tc>
         <w:tc>
           <w:tcPr>
-            <w:tcW w:type="dxa" w:w="2412"/>
+            <w:tcW w:type="dxa" w:w="2448"/>
             <w:shd w:fill="F8FAFC"/>
           </w:tcPr>
           <w:p>
@@ -4739,7 +4273,7 @@
       <w:tr>
         <w:tc>
           <w:tcPr>
-            <w:tcW w:type="dxa" w:w="2412"/>
+            <w:tcW w:type="dxa" w:w="2448"/>
             <w:shd w:fill="FFFFFF"/>
           </w:tcPr>
           <w:p>
@@ -4758,7 +4292,7 @@
         </w:tc>
         <w:tc>
           <w:tcPr>
-            <w:tcW w:type="dxa" w:w="2412"/>
+            <w:tcW w:type="dxa" w:w="2448"/>
             <w:shd w:fill="FFFFFF"/>
           </w:tcPr>
           <w:p>
@@ -4777,7 +4311,7 @@
         </w:tc>
         <w:tc>
           <w:tcPr>
-            <w:tcW w:type="dxa" w:w="2412"/>
+            <w:tcW w:type="dxa" w:w="2448"/>
             <w:shd w:fill="FFFFFF"/>
           </w:tcPr>
           <w:p>
@@ -4796,7 +4330,7 @@
         </w:tc>
         <w:tc>
           <w:tcPr>
-            <w:tcW w:type="dxa" w:w="2412"/>
+            <w:tcW w:type="dxa" w:w="2448"/>
             <w:shd w:fill="FFFFFF"/>
           </w:tcPr>
           <w:p>
@@ -4817,7 +4351,7 @@
       <w:tr>
         <w:tc>
           <w:tcPr>
-            <w:tcW w:type="dxa" w:w="2412"/>
+            <w:tcW w:type="dxa" w:w="2448"/>
             <w:shd w:fill="F8FAFC"/>
           </w:tcPr>
           <w:p>
@@ -4836,7 +4370,7 @@
         </w:tc>
         <w:tc>
           <w:tcPr>
-            <w:tcW w:type="dxa" w:w="2412"/>
+            <w:tcW w:type="dxa" w:w="2448"/>
             <w:shd w:fill="F8FAFC"/>
           </w:tcPr>
           <w:p>
@@ -4855,7 +4389,7 @@
         </w:tc>
         <w:tc>
           <w:tcPr>
-            <w:tcW w:type="dxa" w:w="2412"/>
+            <w:tcW w:type="dxa" w:w="2448"/>
             <w:shd w:fill="F8FAFC"/>
           </w:tcPr>
           <w:p>
@@ -4874,7 +4408,7 @@
         </w:tc>
         <w:tc>
           <w:tcPr>
-            <w:tcW w:type="dxa" w:w="2412"/>
+            <w:tcW w:type="dxa" w:w="2448"/>
             <w:shd w:fill="F8FAFC"/>
           </w:tcPr>
           <w:p>
@@ -4895,7 +4429,7 @@
       <w:tr>
         <w:tc>
           <w:tcPr>
-            <w:tcW w:type="dxa" w:w="2412"/>
+            <w:tcW w:type="dxa" w:w="2448"/>
             <w:shd w:fill="FFFFFF"/>
           </w:tcPr>
           <w:p>
@@ -4914,7 +4448,7 @@
         </w:tc>
         <w:tc>
           <w:tcPr>
-            <w:tcW w:type="dxa" w:w="2412"/>
+            <w:tcW w:type="dxa" w:w="2448"/>
             <w:shd w:fill="FFFFFF"/>
           </w:tcPr>
           <w:p>
@@ -4933,7 +4467,7 @@
         </w:tc>
         <w:tc>
           <w:tcPr>
-            <w:tcW w:type="dxa" w:w="2412"/>
+            <w:tcW w:type="dxa" w:w="2448"/>
             <w:shd w:fill="FFFFFF"/>
           </w:tcPr>
           <w:p>
@@ -4952,7 +4486,7 @@
         </w:tc>
         <w:tc>
           <w:tcPr>
-            <w:tcW w:type="dxa" w:w="2412"/>
+            <w:tcW w:type="dxa" w:w="2448"/>
             <w:shd w:fill="FFFFFF"/>
           </w:tcPr>
           <w:p>
@@ -4973,7 +4507,7 @@
       <w:tr>
         <w:tc>
           <w:tcPr>
-            <w:tcW w:type="dxa" w:w="2412"/>
+            <w:tcW w:type="dxa" w:w="2448"/>
             <w:shd w:fill="F8FAFC"/>
           </w:tcPr>
           <w:p>
@@ -4992,7 +4526,7 @@
         </w:tc>
         <w:tc>
           <w:tcPr>
-            <w:tcW w:type="dxa" w:w="2412"/>
+            <w:tcW w:type="dxa" w:w="2448"/>
             <w:shd w:fill="F8FAFC"/>
           </w:tcPr>
           <w:p>
@@ -5011,7 +4545,7 @@
         </w:tc>
         <w:tc>
           <w:tcPr>
-            <w:tcW w:type="dxa" w:w="2412"/>
+            <w:tcW w:type="dxa" w:w="2448"/>
             <w:shd w:fill="F8FAFC"/>
           </w:tcPr>
           <w:p>
@@ -5030,7 +4564,7 @@
         </w:tc>
         <w:tc>
           <w:tcPr>
-            <w:tcW w:type="dxa" w:w="2412"/>
+            <w:tcW w:type="dxa" w:w="2448"/>
             <w:shd w:fill="F8FAFC"/>
           </w:tcPr>
           <w:p>
@@ -5051,7 +4585,7 @@
       <w:tr>
         <w:tc>
           <w:tcPr>
-            <w:tcW w:type="dxa" w:w="2412"/>
+            <w:tcW w:type="dxa" w:w="2448"/>
             <w:shd w:fill="FFFFFF"/>
           </w:tcPr>
           <w:p>
@@ -5070,7 +4604,7 @@
         </w:tc>
         <w:tc>
           <w:tcPr>
-            <w:tcW w:type="dxa" w:w="2412"/>
+            <w:tcW w:type="dxa" w:w="2448"/>
             <w:shd w:fill="FFFFFF"/>
           </w:tcPr>
           <w:p>
@@ -5089,7 +4623,7 @@
         </w:tc>
         <w:tc>
           <w:tcPr>
-            <w:tcW w:type="dxa" w:w="2412"/>
+            <w:tcW w:type="dxa" w:w="2448"/>
             <w:shd w:fill="FFFFFF"/>
           </w:tcPr>
           <w:p>
@@ -5108,7 +4642,7 @@
         </w:tc>
         <w:tc>
           <w:tcPr>
-            <w:tcW w:type="dxa" w:w="2412"/>
+            <w:tcW w:type="dxa" w:w="2448"/>
             <w:shd w:fill="FFFFFF"/>
           </w:tcPr>
           <w:p>
@@ -5129,7 +4663,7 @@
       <w:tr>
         <w:tc>
           <w:tcPr>
-            <w:tcW w:type="dxa" w:w="2412"/>
+            <w:tcW w:type="dxa" w:w="2448"/>
             <w:shd w:fill="F8FAFC"/>
           </w:tcPr>
           <w:p>
@@ -5148,7 +4682,7 @@
         </w:tc>
         <w:tc>
           <w:tcPr>
-            <w:tcW w:type="dxa" w:w="2412"/>
+            <w:tcW w:type="dxa" w:w="2448"/>
             <w:shd w:fill="F8FAFC"/>
           </w:tcPr>
           <w:p>
@@ -5167,7 +4701,7 @@
         </w:tc>
         <w:tc>
           <w:tcPr>
-            <w:tcW w:type="dxa" w:w="2412"/>
+            <w:tcW w:type="dxa" w:w="2448"/>
             <w:shd w:fill="F8FAFC"/>
           </w:tcPr>
           <w:p>
@@ -5186,7 +4720,7 @@
         </w:tc>
         <w:tc>
           <w:tcPr>
-            <w:tcW w:type="dxa" w:w="2412"/>
+            <w:tcW w:type="dxa" w:w="2448"/>
             <w:shd w:fill="F8FAFC"/>
           </w:tcPr>
           <w:p>
@@ -5207,7 +4741,7 @@
       <w:tr>
         <w:tc>
           <w:tcPr>
-            <w:tcW w:type="dxa" w:w="2412"/>
+            <w:tcW w:type="dxa" w:w="2448"/>
             <w:shd w:fill="FFFFFF"/>
           </w:tcPr>
           <w:p>
@@ -5226,7 +4760,7 @@
         </w:tc>
         <w:tc>
           <w:tcPr>
-            <w:tcW w:type="dxa" w:w="2412"/>
+            <w:tcW w:type="dxa" w:w="2448"/>
             <w:shd w:fill="FFFFFF"/>
           </w:tcPr>
           <w:p>
@@ -5245,7 +4779,7 @@
         </w:tc>
         <w:tc>
           <w:tcPr>
-            <w:tcW w:type="dxa" w:w="2412"/>
+            <w:tcW w:type="dxa" w:w="2448"/>
             <w:shd w:fill="FFFFFF"/>
           </w:tcPr>
           <w:p>
@@ -5264,7 +4798,7 @@
         </w:tc>
         <w:tc>
           <w:tcPr>
-            <w:tcW w:type="dxa" w:w="2412"/>
+            <w:tcW w:type="dxa" w:w="2448"/>
             <w:shd w:fill="FFFFFF"/>
           </w:tcPr>
           <w:p>
@@ -5285,7 +4819,7 @@
       <w:tr>
         <w:tc>
           <w:tcPr>
-            <w:tcW w:type="dxa" w:w="2412"/>
+            <w:tcW w:type="dxa" w:w="2448"/>
             <w:shd w:fill="F8FAFC"/>
           </w:tcPr>
           <w:p>
@@ -5304,7 +4838,7 @@
         </w:tc>
         <w:tc>
           <w:tcPr>
-            <w:tcW w:type="dxa" w:w="2412"/>
+            <w:tcW w:type="dxa" w:w="2448"/>
             <w:shd w:fill="F8FAFC"/>
           </w:tcPr>
           <w:p>
@@ -5323,7 +4857,7 @@
         </w:tc>
         <w:tc>
           <w:tcPr>
-            <w:tcW w:type="dxa" w:w="2412"/>
+            <w:tcW w:type="dxa" w:w="2448"/>
             <w:shd w:fill="F8FAFC"/>
           </w:tcPr>
           <w:p>
@@ -5342,7 +4876,7 @@
         </w:tc>
         <w:tc>
           <w:tcPr>
-            <w:tcW w:type="dxa" w:w="2412"/>
+            <w:tcW w:type="dxa" w:w="2448"/>
             <w:shd w:fill="F8FAFC"/>
           </w:tcPr>
           <w:p>
@@ -5363,7 +4897,7 @@
       <w:tr>
         <w:tc>
           <w:tcPr>
-            <w:tcW w:type="dxa" w:w="2412"/>
+            <w:tcW w:type="dxa" w:w="2448"/>
             <w:shd w:fill="FFFFFF"/>
           </w:tcPr>
           <w:p>
@@ -5382,7 +4916,7 @@
         </w:tc>
         <w:tc>
           <w:tcPr>
-            <w:tcW w:type="dxa" w:w="2412"/>
+            <w:tcW w:type="dxa" w:w="2448"/>
             <w:shd w:fill="FFFFFF"/>
           </w:tcPr>
           <w:p>
@@ -5401,7 +4935,7 @@
         </w:tc>
         <w:tc>
           <w:tcPr>
-            <w:tcW w:type="dxa" w:w="2412"/>
+            <w:tcW w:type="dxa" w:w="2448"/>
             <w:shd w:fill="FFFFFF"/>
           </w:tcPr>
           <w:p>
@@ -5420,7 +4954,7 @@
         </w:tc>
         <w:tc>
           <w:tcPr>
-            <w:tcW w:type="dxa" w:w="2412"/>
+            <w:tcW w:type="dxa" w:w="2448"/>
             <w:shd w:fill="FFFFFF"/>
           </w:tcPr>
           <w:p>
@@ -5441,7 +4975,7 @@
       <w:tr>
         <w:tc>
           <w:tcPr>
-            <w:tcW w:type="dxa" w:w="2412"/>
+            <w:tcW w:type="dxa" w:w="2448"/>
             <w:shd w:fill="F8FAFC"/>
           </w:tcPr>
           <w:p>
@@ -5460,7 +4994,7 @@
         </w:tc>
         <w:tc>
           <w:tcPr>
-            <w:tcW w:type="dxa" w:w="2412"/>
+            <w:tcW w:type="dxa" w:w="2448"/>
             <w:shd w:fill="F8FAFC"/>
           </w:tcPr>
           <w:p>
@@ -5479,7 +5013,7 @@
         </w:tc>
         <w:tc>
           <w:tcPr>
-            <w:tcW w:type="dxa" w:w="2412"/>
+            <w:tcW w:type="dxa" w:w="2448"/>
             <w:shd w:fill="F8FAFC"/>
           </w:tcPr>
           <w:p>
@@ -5498,7 +5032,7 @@
         </w:tc>
         <w:tc>
           <w:tcPr>
-            <w:tcW w:type="dxa" w:w="2412"/>
+            <w:tcW w:type="dxa" w:w="2448"/>
             <w:shd w:fill="F8FAFC"/>
           </w:tcPr>
           <w:p>
@@ -5519,7 +5053,7 @@
       <w:tr>
         <w:tc>
           <w:tcPr>
-            <w:tcW w:type="dxa" w:w="2412"/>
+            <w:tcW w:type="dxa" w:w="2448"/>
             <w:shd w:fill="FFFFFF"/>
           </w:tcPr>
           <w:p>
@@ -5538,7 +5072,7 @@
         </w:tc>
         <w:tc>
           <w:tcPr>
-            <w:tcW w:type="dxa" w:w="2412"/>
+            <w:tcW w:type="dxa" w:w="2448"/>
             <w:shd w:fill="FFFFFF"/>
           </w:tcPr>
           <w:p>
@@ -5557,7 +5091,7 @@
         </w:tc>
         <w:tc>
           <w:tcPr>
-            <w:tcW w:type="dxa" w:w="2412"/>
+            <w:tcW w:type="dxa" w:w="2448"/>
             <w:shd w:fill="FFFFFF"/>
           </w:tcPr>
           <w:p>
@@ -5576,7 +5110,7 @@
         </w:tc>
         <w:tc>
           <w:tcPr>
-            <w:tcW w:type="dxa" w:w="2412"/>
+            <w:tcW w:type="dxa" w:w="2448"/>
             <w:shd w:fill="FFFFFF"/>
           </w:tcPr>
           <w:p>
@@ -5597,7 +5131,7 @@
       <w:tr>
         <w:tc>
           <w:tcPr>
-            <w:tcW w:type="dxa" w:w="2412"/>
+            <w:tcW w:type="dxa" w:w="2448"/>
             <w:shd w:fill="F8FAFC"/>
           </w:tcPr>
           <w:p>
@@ -5616,7 +5150,7 @@
         </w:tc>
         <w:tc>
           <w:tcPr>
-            <w:tcW w:type="dxa" w:w="2412"/>
+            <w:tcW w:type="dxa" w:w="2448"/>
             <w:shd w:fill="F8FAFC"/>
           </w:tcPr>
           <w:p>
@@ -5635,7 +5169,7 @@
         </w:tc>
         <w:tc>
           <w:tcPr>
-            <w:tcW w:type="dxa" w:w="2412"/>
+            <w:tcW w:type="dxa" w:w="2448"/>
             <w:shd w:fill="F8FAFC"/>
           </w:tcPr>
           <w:p>
@@ -5654,7 +5188,7 @@
         </w:tc>
         <w:tc>
           <w:tcPr>
-            <w:tcW w:type="dxa" w:w="2412"/>
+            <w:tcW w:type="dxa" w:w="2448"/>
             <w:shd w:fill="F8FAFC"/>
           </w:tcPr>
           <w:p>
@@ -5675,7 +5209,7 @@
       <w:tr>
         <w:tc>
           <w:tcPr>
-            <w:tcW w:type="dxa" w:w="2412"/>
+            <w:tcW w:type="dxa" w:w="2448"/>
             <w:shd w:fill="FFFFFF"/>
           </w:tcPr>
           <w:p>
@@ -5694,7 +5228,7 @@
         </w:tc>
         <w:tc>
           <w:tcPr>
-            <w:tcW w:type="dxa" w:w="2412"/>
+            <w:tcW w:type="dxa" w:w="2448"/>
             <w:shd w:fill="FFFFFF"/>
           </w:tcPr>
           <w:p>
@@ -5707,13 +5241,13 @@
                 <w:color w:val="1E293B"/>
                 <w:sz w:val="16"/>
               </w:rPr>
-              <w:t>L4.3 Bilan Année 1 &amp; Arbitrages Citoyens</w:t>
+              <w:t>L4.3 Bilan Année 1 &amp; Pôle Citoyens AnimaNice</w:t>
             </w:r>
           </w:p>
         </w:tc>
         <w:tc>
           <w:tcPr>
-            <w:tcW w:type="dxa" w:w="2412"/>
+            <w:tcW w:type="dxa" w:w="2448"/>
             <w:shd w:fill="FFFFFF"/>
           </w:tcPr>
           <w:p>
@@ -5732,7 +5266,7 @@
         </w:tc>
         <w:tc>
           <w:tcPr>
-            <w:tcW w:type="dxa" w:w="2412"/>
+            <w:tcW w:type="dxa" w:w="2448"/>
             <w:shd w:fill="FFFFFF"/>
           </w:tcPr>
           <w:p>
@@ -5753,7 +5287,7 @@
       <w:tr>
         <w:tc>
           <w:tcPr>
-            <w:tcW w:type="dxa" w:w="2412"/>
+            <w:tcW w:type="dxa" w:w="2448"/>
             <w:shd w:fill="F8FAFC"/>
           </w:tcPr>
           <w:p>
@@ -5772,7 +5306,7 @@
         </w:tc>
         <w:tc>
           <w:tcPr>
-            <w:tcW w:type="dxa" w:w="2412"/>
+            <w:tcW w:type="dxa" w:w="2448"/>
             <w:shd w:fill="F8FAFC"/>
           </w:tcPr>
           <w:p>
@@ -5791,7 +5325,7 @@
         </w:tc>
         <w:tc>
           <w:tcPr>
-            <w:tcW w:type="dxa" w:w="2412"/>
+            <w:tcW w:type="dxa" w:w="2448"/>
             <w:shd w:fill="F8FAFC"/>
           </w:tcPr>
           <w:p>
@@ -5810,7 +5344,7 @@
         </w:tc>
         <w:tc>
           <w:tcPr>
-            <w:tcW w:type="dxa" w:w="2412"/>
+            <w:tcW w:type="dxa" w:w="2448"/>
             <w:shd w:fill="F8FAFC"/>
           </w:tcPr>
           <w:p>
@@ -5831,7 +5365,7 @@
       <w:tr>
         <w:tc>
           <w:tcPr>
-            <w:tcW w:type="dxa" w:w="2412"/>
+            <w:tcW w:type="dxa" w:w="2448"/>
             <w:shd w:fill="FFFFFF"/>
           </w:tcPr>
           <w:p>
@@ -5850,7 +5384,7 @@
         </w:tc>
         <w:tc>
           <w:tcPr>
-            <w:tcW w:type="dxa" w:w="2412"/>
+            <w:tcW w:type="dxa" w:w="2448"/>
             <w:shd w:fill="FFFFFF"/>
           </w:tcPr>
           <w:p>
@@ -5869,7 +5403,7 @@
         </w:tc>
         <w:tc>
           <w:tcPr>
-            <w:tcW w:type="dxa" w:w="2412"/>
+            <w:tcW w:type="dxa" w:w="2448"/>
             <w:shd w:fill="FFFFFF"/>
           </w:tcPr>
           <w:p>
@@ -5888,7 +5422,7 @@
         </w:tc>
         <w:tc>
           <w:tcPr>
-            <w:tcW w:type="dxa" w:w="2412"/>
+            <w:tcW w:type="dxa" w:w="2448"/>
             <w:shd w:fill="FFFFFF"/>
           </w:tcPr>
           <w:p>
@@ -5909,7 +5443,7 @@
       <w:tr>
         <w:tc>
           <w:tcPr>
-            <w:tcW w:type="dxa" w:w="2412"/>
+            <w:tcW w:type="dxa" w:w="2448"/>
             <w:shd w:fill="F8FAFC"/>
           </w:tcPr>
           <w:p>
@@ -5928,7 +5462,7 @@
         </w:tc>
         <w:tc>
           <w:tcPr>
-            <w:tcW w:type="dxa" w:w="2412"/>
+            <w:tcW w:type="dxa" w:w="2448"/>
             <w:shd w:fill="F8FAFC"/>
           </w:tcPr>
           <w:p>
@@ -5947,7 +5481,7 @@
         </w:tc>
         <w:tc>
           <w:tcPr>
-            <w:tcW w:type="dxa" w:w="2412"/>
+            <w:tcW w:type="dxa" w:w="2448"/>
             <w:shd w:fill="F8FAFC"/>
           </w:tcPr>
           <w:p>
@@ -5966,7 +5500,7 @@
         </w:tc>
         <w:tc>
           <w:tcPr>
-            <w:tcW w:type="dxa" w:w="2412"/>
+            <w:tcW w:type="dxa" w:w="2448"/>
             <w:shd w:fill="F8FAFC"/>
           </w:tcPr>
           <w:p>
@@ -5987,7 +5521,7 @@
       <w:tr>
         <w:tc>
           <w:tcPr>
-            <w:tcW w:type="dxa" w:w="2412"/>
+            <w:tcW w:type="dxa" w:w="2448"/>
             <w:shd w:fill="FFFFFF"/>
           </w:tcPr>
           <w:p>
@@ -6006,7 +5540,7 @@
         </w:tc>
         <w:tc>
           <w:tcPr>
-            <w:tcW w:type="dxa" w:w="2412"/>
+            <w:tcW w:type="dxa" w:w="2448"/>
             <w:shd w:fill="FFFFFF"/>
           </w:tcPr>
           <w:p>
@@ -6025,7 +5559,7 @@
         </w:tc>
         <w:tc>
           <w:tcPr>
-            <w:tcW w:type="dxa" w:w="2412"/>
+            <w:tcW w:type="dxa" w:w="2448"/>
             <w:shd w:fill="FFFFFF"/>
           </w:tcPr>
           <w:p>
@@ -6044,7 +5578,7 @@
         </w:tc>
         <w:tc>
           <w:tcPr>
-            <w:tcW w:type="dxa" w:w="2412"/>
+            <w:tcW w:type="dxa" w:w="2448"/>
             <w:shd w:fill="FFFFFF"/>
           </w:tcPr>
           <w:p>
@@ -6065,7 +5599,7 @@
       <w:tr>
         <w:tc>
           <w:tcPr>
-            <w:tcW w:type="dxa" w:w="2412"/>
+            <w:tcW w:type="dxa" w:w="2448"/>
             <w:shd w:fill="F8FAFC"/>
           </w:tcPr>
           <w:p>
@@ -6084,7 +5618,7 @@
         </w:tc>
         <w:tc>
           <w:tcPr>
-            <w:tcW w:type="dxa" w:w="2412"/>
+            <w:tcW w:type="dxa" w:w="2448"/>
             <w:shd w:fill="F8FAFC"/>
           </w:tcPr>
           <w:p>
@@ -6103,7 +5637,7 @@
         </w:tc>
         <w:tc>
           <w:tcPr>
-            <w:tcW w:type="dxa" w:w="2412"/>
+            <w:tcW w:type="dxa" w:w="2448"/>
             <w:shd w:fill="F8FAFC"/>
           </w:tcPr>
           <w:p>
@@ -6122,7 +5656,7 @@
         </w:tc>
         <w:tc>
           <w:tcPr>
-            <w:tcW w:type="dxa" w:w="2412"/>
+            <w:tcW w:type="dxa" w:w="2448"/>
             <w:shd w:fill="F8FAFC"/>
           </w:tcPr>
           <w:p>
@@ -6143,7 +5677,7 @@
       <w:tr>
         <w:tc>
           <w:tcPr>
-            <w:tcW w:type="dxa" w:w="2412"/>
+            <w:tcW w:type="dxa" w:w="2448"/>
             <w:shd w:fill="FFFFFF"/>
           </w:tcPr>
           <w:p>
@@ -6162,7 +5696,7 @@
         </w:tc>
         <w:tc>
           <w:tcPr>
-            <w:tcW w:type="dxa" w:w="2412"/>
+            <w:tcW w:type="dxa" w:w="2448"/>
             <w:shd w:fill="FFFFFF"/>
           </w:tcPr>
           <w:p>
@@ -6181,7 +5715,7 @@
         </w:tc>
         <w:tc>
           <w:tcPr>
-            <w:tcW w:type="dxa" w:w="2412"/>
+            <w:tcW w:type="dxa" w:w="2448"/>
             <w:shd w:fill="FFFFFF"/>
           </w:tcPr>
           <w:p>
@@ -6200,7 +5734,7 @@
         </w:tc>
         <w:tc>
           <w:tcPr>
-            <w:tcW w:type="dxa" w:w="2412"/>
+            <w:tcW w:type="dxa" w:w="2448"/>
             <w:shd w:fill="FFFFFF"/>
           </w:tcPr>
           <w:p>
@@ -6237,7 +5771,7 @@
           <w:color w:val="1E3A8A"/>
           <w:sz w:val="25"/>
         </w:rPr>
-        <w:t>5.3 Résumé Consolidé du Coût par Année Budgétaire</w:t>
+        <w:t>5.3 Résumé Consolidé du Coût par Axe Institutionnel (Mairie, Métropole, Monaco)</w:t>
       </w:r>
     </w:p>
     <w:p>
@@ -6252,14 +5786,14 @@
           <w:b/>
           <w:color w:val="0F172A"/>
         </w:rPr>
-        <w:t>Rendement Budgétaire Net</w:t>
+        <w:t>Structure Budgétaire Simplifiée par Entité</w:t>
       </w:r>
       <w:r>
         <w:rPr>
           <w:rFonts w:ascii="Arial" w:hAnsi="Arial"/>
           <w:color w:val="1E293B"/>
         </w:rPr>
-        <w:t xml:space="preserve"> : Pour chaque année d'exécution, la dépense brute de </w:t>
+        <w:t xml:space="preserve"> : Le budget annuel brut de </w:t>
       </w:r>
       <w:r>
         <w:rPr>
@@ -6267,14 +5801,28 @@
           <w:b/>
           <w:color w:val="0F172A"/>
         </w:rPr>
-        <w:t>435 000 €</w:t>
+        <w:t>435 000 € / an</w:t>
       </w:r>
       <w:r>
         <w:rPr>
           <w:rFonts w:ascii="Arial" w:hAnsi="Arial"/>
           <w:color w:val="1E293B"/>
         </w:rPr>
-        <w:t xml:space="preserve"> est co-financée à 50 % par l'UE, ne laissant que </w:t>
+        <w:t xml:space="preserve"> est réparti de manière transparente entre les 3 piliers d'action (Ville de Nice, Métropole Nice Côte d'Azur et Extension Monaco). Grâce au co-financement de 50 % de l'UE (</w:t>
+      </w:r>
+      <w:r>
+        <w:rPr>
+          <w:rFonts w:ascii="Arial" w:hAnsi="Arial"/>
+          <w:i/>
+        </w:rPr>
+        <w:t>Digital Europe</w:t>
+      </w:r>
+      <w:r>
+        <w:rPr>
+          <w:rFonts w:ascii="Arial" w:hAnsi="Arial"/>
+          <w:color w:val="1E293B"/>
+        </w:rPr>
+        <w:t xml:space="preserve">), le reste à charge métropolitain est de seulement </w:t>
       </w:r>
       <w:r>
         <w:rPr>
@@ -6282,14 +5830,14 @@
           <w:b/>
           <w:color w:val="0F172A"/>
         </w:rPr>
-        <w:t>217 500 € net</w:t>
+        <w:t>217 500 € / an</w:t>
       </w:r>
       <w:r>
         <w:rPr>
           <w:rFonts w:ascii="Arial" w:hAnsi="Arial"/>
           <w:color w:val="1E293B"/>
         </w:rPr>
-        <w:t xml:space="preserve"> à la Métropole, face à </w:t>
+        <w:t xml:space="preserve">, immédiatement compensé par </w:t>
       </w:r>
       <w:r>
         <w:rPr>
@@ -6297,22 +5845,7 @@
           <w:b/>
           <w:color w:val="0F172A"/>
         </w:rPr>
-        <w:t>+2 500 000 € d'économies certifiées</w:t>
-      </w:r>
-      <w:r>
-        <w:rPr>
-          <w:rFonts w:ascii="Arial" w:hAnsi="Arial"/>
-          <w:color w:val="1E293B"/>
-        </w:rPr>
-        <w:t xml:space="preserve">, dégageant un bénéfice net réinjecté dans le service public de </w:t>
-      </w:r>
-      <w:r>
-        <w:rPr>
-          <w:rFonts w:ascii="Arial" w:hAnsi="Arial"/>
-          <w:b/>
-          <w:color w:val="0F172A"/>
-        </w:rPr>
-        <w:t>+2 282 500 € par an</w:t>
+        <w:t>+2 500 000 € d'économies nettes certifiées</w:t>
       </w:r>
       <w:r>
         <w:rPr>
@@ -6329,23 +5862,22 @@
         <w:tblLook w:firstColumn="1" w:firstRow="1" w:lastColumn="0" w:lastRow="0" w:noHBand="0" w:noVBand="1" w:val="04A0"/>
       </w:tblPr>
       <w:tblGrid>
-        <w:gridCol w:w="1378"/>
-        <w:gridCol w:w="1378"/>
-        <w:gridCol w:w="1378"/>
-        <w:gridCol w:w="1378"/>
-        <w:gridCol w:w="1378"/>
-        <w:gridCol w:w="1378"/>
-        <w:gridCol w:w="1378"/>
+        <w:gridCol w:w="1632"/>
+        <w:gridCol w:w="1632"/>
+        <w:gridCol w:w="1632"/>
+        <w:gridCol w:w="1632"/>
+        <w:gridCol w:w="1632"/>
+        <w:gridCol w:w="1632"/>
       </w:tblGrid>
       <w:tr>
         <w:tc>
           <w:tcPr>
-            <w:tcW w:type="dxa" w:w="1378"/>
+            <w:tcW w:type="dxa" w:w="1632"/>
             <w:shd w:fill="1E293B"/>
           </w:tcPr>
           <w:p>
             <w:pPr>
-              <w:spacing w:before="60" w:after="60"/>
+              <w:spacing w:before="80" w:after="80"/>
             </w:pPr>
             <w:r>
               <w:rPr>
@@ -6354,18 +5886,18 @@
                 <w:color w:val="FFFFFF"/>
                 <w:sz w:val="16"/>
               </w:rPr>
-              <w:t>Année Budgétaire</w:t>
+              <w:t>Pôle Institutionnel / Domaine</w:t>
             </w:r>
           </w:p>
         </w:tc>
         <w:tc>
           <w:tcPr>
-            <w:tcW w:type="dxa" w:w="1378"/>
+            <w:tcW w:type="dxa" w:w="1632"/>
             <w:shd w:fill="1E293B"/>
           </w:tcPr>
           <w:p>
             <w:pPr>
-              <w:spacing w:before="60" w:after="60"/>
+              <w:spacing w:before="80" w:after="80"/>
             </w:pPr>
             <w:r>
               <w:rPr>
@@ -6374,18 +5906,18 @@
                 <w:color w:val="FFFFFF"/>
                 <w:sz w:val="16"/>
               </w:rPr>
-              <w:t>Période Précise de Réalisation</w:t>
+              <w:t>Actions &amp; Projets Clefs</w:t>
             </w:r>
           </w:p>
         </w:tc>
         <w:tc>
           <w:tcPr>
-            <w:tcW w:type="dxa" w:w="1378"/>
+            <w:tcW w:type="dxa" w:w="1632"/>
             <w:shd w:fill="1E293B"/>
           </w:tcPr>
           <w:p>
             <w:pPr>
-              <w:spacing w:before="60" w:after="60"/>
+              <w:spacing w:before="80" w:after="80"/>
             </w:pPr>
             <w:r>
               <w:rPr>
@@ -6394,18 +5926,18 @@
                 <w:color w:val="FFFFFF"/>
                 <w:sz w:val="16"/>
               </w:rPr>
-              <w:t>Budget Brut</w:t>
+              <w:t>Budget Brut Annuel</w:t>
             </w:r>
           </w:p>
         </w:tc>
         <w:tc>
           <w:tcPr>
-            <w:tcW w:type="dxa" w:w="1378"/>
+            <w:tcW w:type="dxa" w:w="1632"/>
             <w:shd w:fill="1E293B"/>
           </w:tcPr>
           <w:p>
             <w:pPr>
-              <w:spacing w:before="60" w:after="60"/>
+              <w:spacing w:before="80" w:after="80"/>
             </w:pPr>
             <w:r>
               <w:rPr>
@@ -6420,12 +5952,12 @@
         </w:tc>
         <w:tc>
           <w:tcPr>
-            <w:tcW w:type="dxa" w:w="1378"/>
+            <w:tcW w:type="dxa" w:w="1632"/>
             <w:shd w:fill="1E293B"/>
           </w:tcPr>
           <w:p>
             <w:pPr>
-              <w:spacing w:before="60" w:after="60"/>
+              <w:spacing w:before="80" w:after="80"/>
             </w:pPr>
             <w:r>
               <w:rPr>
@@ -6440,12 +5972,12 @@
         </w:tc>
         <w:tc>
           <w:tcPr>
-            <w:tcW w:type="dxa" w:w="1378"/>
+            <w:tcW w:type="dxa" w:w="1632"/>
             <w:shd w:fill="1E293B"/>
           </w:tcPr>
           <w:p>
             <w:pPr>
-              <w:spacing w:before="60" w:after="60"/>
+              <w:spacing w:before="80" w:after="80"/>
             </w:pPr>
             <w:r>
               <w:rPr>
@@ -6454,18 +5986,368 @@
                 <w:color w:val="FFFFFF"/>
                 <w:sz w:val="16"/>
               </w:rPr>
-              <w:t>Gains Certifiés</w:t>
+              <w:t>Gains Certifiés Net</w:t>
+            </w:r>
+          </w:p>
+        </w:tc>
+      </w:tr>
+      <w:tr>
+        <w:tc>
+          <w:tcPr>
+            <w:tcW w:type="dxa" w:w="1632"/>
+            <w:shd w:fill="F8FAFC"/>
+          </w:tcPr>
+          <w:p>
+            <w:pPr>
+              <w:spacing w:before="80" w:after="80"/>
+            </w:pPr>
+            <w:r>
+              <w:rPr>
+                <w:rFonts w:ascii="Arial" w:hAnsi="Arial"/>
+                <w:color w:val="1E293B"/>
+                <w:sz w:val="16"/>
+              </w:rPr>
+              <w:t>1. AXE MAIRIE (Ville de Nice)</w:t>
             </w:r>
           </w:p>
         </w:tc>
         <w:tc>
           <w:tcPr>
-            <w:tcW w:type="dxa" w:w="1378"/>
-            <w:shd w:fill="1E293B"/>
+            <w:tcW w:type="dxa" w:w="1632"/>
+            <w:shd w:fill="F8FAFC"/>
           </w:tcPr>
           <w:p>
             <w:pPr>
-              <w:spacing w:before="60" w:after="60"/>
+              <w:spacing w:before="80" w:after="80"/>
+            </w:pPr>
+            <w:r>
+              <w:rPr>
+                <w:rFonts w:ascii="Arial" w:hAnsi="Arial"/>
+                <w:color w:val="1E293B"/>
+                <w:sz w:val="16"/>
+              </w:rPr>
+              <w:t>CSU VSA, Allo Niçois 24/7, Propreté, Consultation Einstein, Pôle Citoyens</w:t>
+            </w:r>
+          </w:p>
+        </w:tc>
+        <w:tc>
+          <w:tcPr>
+            <w:tcW w:type="dxa" w:w="1632"/>
+            <w:shd w:fill="F8FAFC"/>
+          </w:tcPr>
+          <w:p>
+            <w:pPr>
+              <w:spacing w:before="80" w:after="80"/>
+            </w:pPr>
+            <w:r>
+              <w:rPr>
+                <w:rFonts w:ascii="Arial" w:hAnsi="Arial"/>
+                <w:color w:val="1E293B"/>
+                <w:sz w:val="16"/>
+              </w:rPr>
+              <w:t>155 000 €</w:t>
+            </w:r>
+          </w:p>
+        </w:tc>
+        <w:tc>
+          <w:tcPr>
+            <w:tcW w:type="dxa" w:w="1632"/>
+            <w:shd w:fill="F8FAFC"/>
+          </w:tcPr>
+          <w:p>
+            <w:pPr>
+              <w:spacing w:before="80" w:after="80"/>
+            </w:pPr>
+            <w:r>
+              <w:rPr>
+                <w:rFonts w:ascii="Arial" w:hAnsi="Arial"/>
+                <w:color w:val="1E293B"/>
+                <w:sz w:val="16"/>
+              </w:rPr>
+              <w:t>77 500 €</w:t>
+            </w:r>
+          </w:p>
+        </w:tc>
+        <w:tc>
+          <w:tcPr>
+            <w:tcW w:type="dxa" w:w="1632"/>
+            <w:shd w:fill="F8FAFC"/>
+          </w:tcPr>
+          <w:p>
+            <w:pPr>
+              <w:spacing w:before="80" w:after="80"/>
+            </w:pPr>
+            <w:r>
+              <w:rPr>
+                <w:rFonts w:ascii="Arial" w:hAnsi="Arial"/>
+                <w:color w:val="1E293B"/>
+                <w:sz w:val="16"/>
+              </w:rPr>
+              <w:t>77 500 €</w:t>
+            </w:r>
+          </w:p>
+        </w:tc>
+        <w:tc>
+          <w:tcPr>
+            <w:tcW w:type="dxa" w:w="1632"/>
+            <w:shd w:fill="F8FAFC"/>
+          </w:tcPr>
+          <w:p>
+            <w:pPr>
+              <w:spacing w:before="80" w:after="80"/>
+            </w:pPr>
+            <w:r>
+              <w:rPr>
+                <w:rFonts w:ascii="Arial" w:hAnsi="Arial"/>
+                <w:color w:val="1E293B"/>
+                <w:sz w:val="16"/>
+              </w:rPr>
+              <w:t>Incivilités -65%, Interventions &lt;6min</w:t>
+            </w:r>
+          </w:p>
+        </w:tc>
+      </w:tr>
+      <w:tr>
+        <w:tc>
+          <w:tcPr>
+            <w:tcW w:type="dxa" w:w="1632"/>
+            <w:shd w:fill="FFFFFF"/>
+          </w:tcPr>
+          <w:p>
+            <w:pPr>
+              <w:spacing w:before="80" w:after="80"/>
+            </w:pPr>
+            <w:r>
+              <w:rPr>
+                <w:rFonts w:ascii="Arial" w:hAnsi="Arial"/>
+                <w:color w:val="1E293B"/>
+                <w:sz w:val="16"/>
+              </w:rPr>
+              <w:t>2. AXE MÉTROPOLE (Nice Côte d'Azur)</w:t>
+            </w:r>
+          </w:p>
+        </w:tc>
+        <w:tc>
+          <w:tcPr>
+            <w:tcW w:type="dxa" w:w="1632"/>
+            <w:shd w:fill="FFFFFF"/>
+          </w:tcPr>
+          <w:p>
+            <w:pPr>
+              <w:spacing w:before="80" w:after="80"/>
+            </w:pPr>
+            <w:r>
+              <w:rPr>
+                <w:rFonts w:ascii="Arial" w:hAnsi="Arial"/>
+                <w:color w:val="1E293B"/>
+                <w:sz w:val="16"/>
+              </w:rPr>
+              <w:t>Audit Commande Publique (300M€), SOC Cyber NIS 2, Pôle PME/PMI &amp; AMO (2,5j/sem)</w:t>
+            </w:r>
+          </w:p>
+        </w:tc>
+        <w:tc>
+          <w:tcPr>
+            <w:tcW w:type="dxa" w:w="1632"/>
+            <w:shd w:fill="FFFFFF"/>
+          </w:tcPr>
+          <w:p>
+            <w:pPr>
+              <w:spacing w:before="80" w:after="80"/>
+            </w:pPr>
+            <w:r>
+              <w:rPr>
+                <w:rFonts w:ascii="Arial" w:hAnsi="Arial"/>
+                <w:color w:val="1E293B"/>
+                <w:sz w:val="16"/>
+              </w:rPr>
+              <w:t>160 000 €</w:t>
+            </w:r>
+          </w:p>
+        </w:tc>
+        <w:tc>
+          <w:tcPr>
+            <w:tcW w:type="dxa" w:w="1632"/>
+            <w:shd w:fill="FFFFFF"/>
+          </w:tcPr>
+          <w:p>
+            <w:pPr>
+              <w:spacing w:before="80" w:after="80"/>
+            </w:pPr>
+            <w:r>
+              <w:rPr>
+                <w:rFonts w:ascii="Arial" w:hAnsi="Arial"/>
+                <w:color w:val="1E293B"/>
+                <w:sz w:val="16"/>
+              </w:rPr>
+              <w:t>80 000 €</w:t>
+            </w:r>
+          </w:p>
+        </w:tc>
+        <w:tc>
+          <w:tcPr>
+            <w:tcW w:type="dxa" w:w="1632"/>
+            <w:shd w:fill="FFFFFF"/>
+          </w:tcPr>
+          <w:p>
+            <w:pPr>
+              <w:spacing w:before="80" w:after="80"/>
+            </w:pPr>
+            <w:r>
+              <w:rPr>
+                <w:rFonts w:ascii="Arial" w:hAnsi="Arial"/>
+                <w:color w:val="1E293B"/>
+                <w:sz w:val="16"/>
+              </w:rPr>
+              <w:t>80 000 €</w:t>
+            </w:r>
+          </w:p>
+        </w:tc>
+        <w:tc>
+          <w:tcPr>
+            <w:tcW w:type="dxa" w:w="1632"/>
+            <w:shd w:fill="FFFFFF"/>
+          </w:tcPr>
+          <w:p>
+            <w:pPr>
+              <w:spacing w:before="80" w:after="80"/>
+            </w:pPr>
+            <w:r>
+              <w:rPr>
+                <w:rFonts w:ascii="Arial" w:hAnsi="Arial"/>
+                <w:color w:val="1E293B"/>
+                <w:sz w:val="16"/>
+              </w:rPr>
+              <w:t>+2 500 000 € / an Net (Marchés)</w:t>
+            </w:r>
+          </w:p>
+        </w:tc>
+      </w:tr>
+      <w:tr>
+        <w:tc>
+          <w:tcPr>
+            <w:tcW w:type="dxa" w:w="1632"/>
+            <w:shd w:fill="F8FAFC"/>
+          </w:tcPr>
+          <w:p>
+            <w:pPr>
+              <w:spacing w:before="80" w:after="80"/>
+            </w:pPr>
+            <w:r>
+              <w:rPr>
+                <w:rFonts w:ascii="Arial" w:hAnsi="Arial"/>
+                <w:color w:val="1E293B"/>
+                <w:sz w:val="16"/>
+              </w:rPr>
+              <w:t>3. AXE MONACO (Alliance &amp; Extension)</w:t>
+            </w:r>
+          </w:p>
+        </w:tc>
+        <w:tc>
+          <w:tcPr>
+            <w:tcW w:type="dxa" w:w="1632"/>
+            <w:shd w:fill="F8FAFC"/>
+          </w:tcPr>
+          <w:p>
+            <w:pPr>
+              <w:spacing w:before="80" w:after="80"/>
+            </w:pPr>
+            <w:r>
+              <w:rPr>
+                <w:rFonts w:ascii="Arial" w:hAnsi="Arial"/>
+                <w:color w:val="1E293B"/>
+                <w:sz w:val="16"/>
+              </w:rPr>
+              <w:t>Fibre Monaco Cloud (AMSN), Zone Franche Numérique, Task-Force Gigafactory 500M€</w:t>
+            </w:r>
+          </w:p>
+        </w:tc>
+        <w:tc>
+          <w:tcPr>
+            <w:tcW w:type="dxa" w:w="1632"/>
+            <w:shd w:fill="F8FAFC"/>
+          </w:tcPr>
+          <w:p>
+            <w:pPr>
+              <w:spacing w:before="80" w:after="80"/>
+            </w:pPr>
+            <w:r>
+              <w:rPr>
+                <w:rFonts w:ascii="Arial" w:hAnsi="Arial"/>
+                <w:color w:val="1E293B"/>
+                <w:sz w:val="16"/>
+              </w:rPr>
+              <w:t>120 000 €</w:t>
+            </w:r>
+          </w:p>
+        </w:tc>
+        <w:tc>
+          <w:tcPr>
+            <w:tcW w:type="dxa" w:w="1632"/>
+            <w:shd w:fill="F8FAFC"/>
+          </w:tcPr>
+          <w:p>
+            <w:pPr>
+              <w:spacing w:before="80" w:after="80"/>
+            </w:pPr>
+            <w:r>
+              <w:rPr>
+                <w:rFonts w:ascii="Arial" w:hAnsi="Arial"/>
+                <w:color w:val="1E293B"/>
+                <w:sz w:val="16"/>
+              </w:rPr>
+              <w:t>60 000 €</w:t>
+            </w:r>
+          </w:p>
+        </w:tc>
+        <w:tc>
+          <w:tcPr>
+            <w:tcW w:type="dxa" w:w="1632"/>
+            <w:shd w:fill="F8FAFC"/>
+          </w:tcPr>
+          <w:p>
+            <w:pPr>
+              <w:spacing w:before="80" w:after="80"/>
+            </w:pPr>
+            <w:r>
+              <w:rPr>
+                <w:rFonts w:ascii="Arial" w:hAnsi="Arial"/>
+                <w:color w:val="1E293B"/>
+                <w:sz w:val="16"/>
+              </w:rPr>
+              <w:t>60 000 €</w:t>
+            </w:r>
+          </w:p>
+        </w:tc>
+        <w:tc>
+          <w:tcPr>
+            <w:tcW w:type="dxa" w:w="1632"/>
+            <w:shd w:fill="F8FAFC"/>
+          </w:tcPr>
+          <w:p>
+            <w:pPr>
+              <w:spacing w:before="80" w:after="80"/>
+            </w:pPr>
+            <w:r>
+              <w:rPr>
+                <w:rFonts w:ascii="Arial" w:hAnsi="Arial"/>
+                <w:color w:val="1E293B"/>
+                <w:sz w:val="16"/>
+              </w:rPr>
+              <w:t>1,5M€ à 2,8M€ IT + 8-12M€ CAPEX</w:t>
+            </w:r>
+          </w:p>
+        </w:tc>
+      </w:tr>
+      <w:tr>
+        <w:tc>
+          <w:tcPr>
+            <w:tcW w:type="dxa" w:w="1632"/>
+            <w:shd w:fill="0F172A"/>
+          </w:tcPr>
+          <w:p>
+            <w:pPr>
+              <w:spacing w:before="80" w:after="80"/>
             </w:pPr>
             <w:r>
               <w:rPr>
@@ -6474,63 +6356,44 @@
                 <w:color w:val="FFFFFF"/>
                 <w:sz w:val="16"/>
               </w:rPr>
-              <w:t>Bénéfice Net Métropole</w:t>
-            </w:r>
-          </w:p>
-        </w:tc>
-      </w:tr>
-      <w:tr>
-        <w:tc>
-          <w:tcPr>
-            <w:tcW w:type="dxa" w:w="1378"/>
-            <w:shd w:fill="F8FAFC"/>
-          </w:tcPr>
-          <w:p>
-            <w:pPr>
-              <w:spacing w:before="60" w:after="60"/>
-            </w:pPr>
-            <w:r>
-              <w:rPr>
-                <w:rFonts w:ascii="Arial" w:hAnsi="Arial"/>
-                <w:color w:val="1E293B"/>
-                <w:sz w:val="16"/>
-              </w:rPr>
-              <w:t>ANNÉE 1</w:t>
+              <w:t>TOTAL ANNUEL CONSOLIDÉ</w:t>
             </w:r>
           </w:p>
         </w:tc>
         <w:tc>
           <w:tcPr>
-            <w:tcW w:type="dxa" w:w="1378"/>
-            <w:shd w:fill="F8FAFC"/>
+            <w:tcW w:type="dxa" w:w="1632"/>
+            <w:shd w:fill="0F172A"/>
           </w:tcPr>
           <w:p>
             <w:pPr>
-              <w:spacing w:before="60" w:after="60"/>
+              <w:spacing w:before="80" w:after="80"/>
             </w:pPr>
             <w:r>
               <w:rPr>
                 <w:rFonts w:ascii="Arial" w:hAnsi="Arial"/>
-                <w:color w:val="1E293B"/>
+                <w:b/>
+                <w:color w:val="FFFFFF"/>
                 <w:sz w:val="16"/>
               </w:rPr>
-              <w:t>Septembre 2026 — Août 2027</w:t>
+              <w:t>Ensemble des 3 Piliers Institutionnels (2026-2029)</w:t>
             </w:r>
           </w:p>
         </w:tc>
         <w:tc>
           <w:tcPr>
-            <w:tcW w:type="dxa" w:w="1378"/>
-            <w:shd w:fill="F8FAFC"/>
+            <w:tcW w:type="dxa" w:w="1632"/>
+            <w:shd w:fill="0F172A"/>
           </w:tcPr>
           <w:p>
             <w:pPr>
-              <w:spacing w:before="60" w:after="60"/>
+              <w:spacing w:before="80" w:after="80"/>
             </w:pPr>
             <w:r>
               <w:rPr>
                 <w:rFonts w:ascii="Arial" w:hAnsi="Arial"/>
-                <w:color w:val="1E293B"/>
+                <w:b/>
+                <w:color w:val="FFFFFF"/>
                 <w:sz w:val="16"/>
               </w:rPr>
               <w:t>435 000 €</w:t>
@@ -6539,17 +6402,18 @@
         </w:tc>
         <w:tc>
           <w:tcPr>
-            <w:tcW w:type="dxa" w:w="1378"/>
-            <w:shd w:fill="F8FAFC"/>
+            <w:tcW w:type="dxa" w:w="1632"/>
+            <w:shd w:fill="0F172A"/>
           </w:tcPr>
           <w:p>
             <w:pPr>
-              <w:spacing w:before="60" w:after="60"/>
+              <w:spacing w:before="80" w:after="80"/>
             </w:pPr>
             <w:r>
               <w:rPr>
                 <w:rFonts w:ascii="Arial" w:hAnsi="Arial"/>
-                <w:color w:val="1E293B"/>
+                <w:b/>
+                <w:color w:val="FFFFFF"/>
                 <w:sz w:val="16"/>
               </w:rPr>
               <w:t>217 500 €</w:t>
@@ -6558,17 +6422,18 @@
         </w:tc>
         <w:tc>
           <w:tcPr>
-            <w:tcW w:type="dxa" w:w="1378"/>
-            <w:shd w:fill="F8FAFC"/>
+            <w:tcW w:type="dxa" w:w="1632"/>
+            <w:shd w:fill="0F172A"/>
           </w:tcPr>
           <w:p>
             <w:pPr>
-              <w:spacing w:before="60" w:after="60"/>
+              <w:spacing w:before="80" w:after="80"/>
             </w:pPr>
             <w:r>
               <w:rPr>
                 <w:rFonts w:ascii="Arial" w:hAnsi="Arial"/>
-                <w:color w:val="1E293B"/>
+                <w:b/>
+                <w:color w:val="FFFFFF"/>
                 <w:sz w:val="16"/>
               </w:rPr>
               <w:t>217 500 €</w:t>
@@ -6577,322 +6442,12 @@
         </w:tc>
         <w:tc>
           <w:tcPr>
-            <w:tcW w:type="dxa" w:w="1378"/>
-            <w:shd w:fill="F8FAFC"/>
-          </w:tcPr>
-          <w:p>
-            <w:pPr>
-              <w:spacing w:before="60" w:after="60"/>
-            </w:pPr>
-            <w:r>
-              <w:rPr>
-                <w:rFonts w:ascii="Arial" w:hAnsi="Arial"/>
-                <w:color w:val="1E293B"/>
-                <w:sz w:val="16"/>
-              </w:rPr>
-              <w:t>+2 500 000 €</w:t>
-            </w:r>
-          </w:p>
-        </w:tc>
-        <w:tc>
-          <w:tcPr>
-            <w:tcW w:type="dxa" w:w="1378"/>
-            <w:shd w:fill="F8FAFC"/>
-          </w:tcPr>
-          <w:p>
-            <w:pPr>
-              <w:spacing w:before="60" w:after="60"/>
-            </w:pPr>
-            <w:r>
-              <w:rPr>
-                <w:rFonts w:ascii="Arial" w:hAnsi="Arial"/>
-                <w:color w:val="1E293B"/>
-                <w:sz w:val="16"/>
-              </w:rPr>
-              <w:t>+2 282 500 €</w:t>
-            </w:r>
-          </w:p>
-        </w:tc>
-      </w:tr>
-      <w:tr>
-        <w:tc>
-          <w:tcPr>
-            <w:tcW w:type="dxa" w:w="1378"/>
-            <w:shd w:fill="FFFFFF"/>
-          </w:tcPr>
-          <w:p>
-            <w:pPr>
-              <w:spacing w:before="60" w:after="60"/>
-            </w:pPr>
-            <w:r>
-              <w:rPr>
-                <w:rFonts w:ascii="Arial" w:hAnsi="Arial"/>
-                <w:color w:val="1E293B"/>
-                <w:sz w:val="16"/>
-              </w:rPr>
-              <w:t>ANNÉE 2</w:t>
-            </w:r>
-          </w:p>
-        </w:tc>
-        <w:tc>
-          <w:tcPr>
-            <w:tcW w:type="dxa" w:w="1378"/>
-            <w:shd w:fill="FFFFFF"/>
-          </w:tcPr>
-          <w:p>
-            <w:pPr>
-              <w:spacing w:before="60" w:after="60"/>
-            </w:pPr>
-            <w:r>
-              <w:rPr>
-                <w:rFonts w:ascii="Arial" w:hAnsi="Arial"/>
-                <w:color w:val="1E293B"/>
-                <w:sz w:val="16"/>
-              </w:rPr>
-              <w:t>Septembre 2027 — Août 2028</w:t>
-            </w:r>
-          </w:p>
-        </w:tc>
-        <w:tc>
-          <w:tcPr>
-            <w:tcW w:type="dxa" w:w="1378"/>
-            <w:shd w:fill="FFFFFF"/>
-          </w:tcPr>
-          <w:p>
-            <w:pPr>
-              <w:spacing w:before="60" w:after="60"/>
-            </w:pPr>
-            <w:r>
-              <w:rPr>
-                <w:rFonts w:ascii="Arial" w:hAnsi="Arial"/>
-                <w:color w:val="1E293B"/>
-                <w:sz w:val="16"/>
-              </w:rPr>
-              <w:t>435 000 €</w:t>
-            </w:r>
-          </w:p>
-        </w:tc>
-        <w:tc>
-          <w:tcPr>
-            <w:tcW w:type="dxa" w:w="1378"/>
-            <w:shd w:fill="FFFFFF"/>
-          </w:tcPr>
-          <w:p>
-            <w:pPr>
-              <w:spacing w:before="60" w:after="60"/>
-            </w:pPr>
-            <w:r>
-              <w:rPr>
-                <w:rFonts w:ascii="Arial" w:hAnsi="Arial"/>
-                <w:color w:val="1E293B"/>
-                <w:sz w:val="16"/>
-              </w:rPr>
-              <w:t>217 500 €</w:t>
-            </w:r>
-          </w:p>
-        </w:tc>
-        <w:tc>
-          <w:tcPr>
-            <w:tcW w:type="dxa" w:w="1378"/>
-            <w:shd w:fill="FFFFFF"/>
-          </w:tcPr>
-          <w:p>
-            <w:pPr>
-              <w:spacing w:before="60" w:after="60"/>
-            </w:pPr>
-            <w:r>
-              <w:rPr>
-                <w:rFonts w:ascii="Arial" w:hAnsi="Arial"/>
-                <w:color w:val="1E293B"/>
-                <w:sz w:val="16"/>
-              </w:rPr>
-              <w:t>217 500 €</w:t>
-            </w:r>
-          </w:p>
-        </w:tc>
-        <w:tc>
-          <w:tcPr>
-            <w:tcW w:type="dxa" w:w="1378"/>
-            <w:shd w:fill="FFFFFF"/>
-          </w:tcPr>
-          <w:p>
-            <w:pPr>
-              <w:spacing w:before="60" w:after="60"/>
-            </w:pPr>
-            <w:r>
-              <w:rPr>
-                <w:rFonts w:ascii="Arial" w:hAnsi="Arial"/>
-                <w:color w:val="1E293B"/>
-                <w:sz w:val="16"/>
-              </w:rPr>
-              <w:t>+2 500 000 €</w:t>
-            </w:r>
-          </w:p>
-        </w:tc>
-        <w:tc>
-          <w:tcPr>
-            <w:tcW w:type="dxa" w:w="1378"/>
-            <w:shd w:fill="FFFFFF"/>
-          </w:tcPr>
-          <w:p>
-            <w:pPr>
-              <w:spacing w:before="60" w:after="60"/>
-            </w:pPr>
-            <w:r>
-              <w:rPr>
-                <w:rFonts w:ascii="Arial" w:hAnsi="Arial"/>
-                <w:color w:val="1E293B"/>
-                <w:sz w:val="16"/>
-              </w:rPr>
-              <w:t>+2 282 500 €</w:t>
-            </w:r>
-          </w:p>
-        </w:tc>
-      </w:tr>
-      <w:tr>
-        <w:tc>
-          <w:tcPr>
-            <w:tcW w:type="dxa" w:w="1378"/>
-            <w:shd w:fill="F8FAFC"/>
-          </w:tcPr>
-          <w:p>
-            <w:pPr>
-              <w:spacing w:before="60" w:after="60"/>
-            </w:pPr>
-            <w:r>
-              <w:rPr>
-                <w:rFonts w:ascii="Arial" w:hAnsi="Arial"/>
-                <w:color w:val="1E293B"/>
-                <w:sz w:val="16"/>
-              </w:rPr>
-              <w:t>ANNÉE 3</w:t>
-            </w:r>
-          </w:p>
-        </w:tc>
-        <w:tc>
-          <w:tcPr>
-            <w:tcW w:type="dxa" w:w="1378"/>
-            <w:shd w:fill="F8FAFC"/>
-          </w:tcPr>
-          <w:p>
-            <w:pPr>
-              <w:spacing w:before="60" w:after="60"/>
-            </w:pPr>
-            <w:r>
-              <w:rPr>
-                <w:rFonts w:ascii="Arial" w:hAnsi="Arial"/>
-                <w:color w:val="1E293B"/>
-                <w:sz w:val="16"/>
-              </w:rPr>
-              <w:t>Septembre 2028 — Août 2029</w:t>
-            </w:r>
-          </w:p>
-        </w:tc>
-        <w:tc>
-          <w:tcPr>
-            <w:tcW w:type="dxa" w:w="1378"/>
-            <w:shd w:fill="F8FAFC"/>
-          </w:tcPr>
-          <w:p>
-            <w:pPr>
-              <w:spacing w:before="60" w:after="60"/>
-            </w:pPr>
-            <w:r>
-              <w:rPr>
-                <w:rFonts w:ascii="Arial" w:hAnsi="Arial"/>
-                <w:color w:val="1E293B"/>
-                <w:sz w:val="16"/>
-              </w:rPr>
-              <w:t>435 000 €</w:t>
-            </w:r>
-          </w:p>
-        </w:tc>
-        <w:tc>
-          <w:tcPr>
-            <w:tcW w:type="dxa" w:w="1378"/>
-            <w:shd w:fill="F8FAFC"/>
-          </w:tcPr>
-          <w:p>
-            <w:pPr>
-              <w:spacing w:before="60" w:after="60"/>
-            </w:pPr>
-            <w:r>
-              <w:rPr>
-                <w:rFonts w:ascii="Arial" w:hAnsi="Arial"/>
-                <w:color w:val="1E293B"/>
-                <w:sz w:val="16"/>
-              </w:rPr>
-              <w:t>217 500 €</w:t>
-            </w:r>
-          </w:p>
-        </w:tc>
-        <w:tc>
-          <w:tcPr>
-            <w:tcW w:type="dxa" w:w="1378"/>
-            <w:shd w:fill="F8FAFC"/>
-          </w:tcPr>
-          <w:p>
-            <w:pPr>
-              <w:spacing w:before="60" w:after="60"/>
-            </w:pPr>
-            <w:r>
-              <w:rPr>
-                <w:rFonts w:ascii="Arial" w:hAnsi="Arial"/>
-                <w:color w:val="1E293B"/>
-                <w:sz w:val="16"/>
-              </w:rPr>
-              <w:t>217 500 €</w:t>
-            </w:r>
-          </w:p>
-        </w:tc>
-        <w:tc>
-          <w:tcPr>
-            <w:tcW w:type="dxa" w:w="1378"/>
-            <w:shd w:fill="F8FAFC"/>
-          </w:tcPr>
-          <w:p>
-            <w:pPr>
-              <w:spacing w:before="60" w:after="60"/>
-            </w:pPr>
-            <w:r>
-              <w:rPr>
-                <w:rFonts w:ascii="Arial" w:hAnsi="Arial"/>
-                <w:color w:val="1E293B"/>
-                <w:sz w:val="16"/>
-              </w:rPr>
-              <w:t>+2 500 000 €</w:t>
-            </w:r>
-          </w:p>
-        </w:tc>
-        <w:tc>
-          <w:tcPr>
-            <w:tcW w:type="dxa" w:w="1378"/>
-            <w:shd w:fill="F8FAFC"/>
-          </w:tcPr>
-          <w:p>
-            <w:pPr>
-              <w:spacing w:before="60" w:after="60"/>
-            </w:pPr>
-            <w:r>
-              <w:rPr>
-                <w:rFonts w:ascii="Arial" w:hAnsi="Arial"/>
-                <w:color w:val="1E293B"/>
-                <w:sz w:val="16"/>
-              </w:rPr>
-              <w:t>+2 282 500 €</w:t>
-            </w:r>
-          </w:p>
-        </w:tc>
-      </w:tr>
-      <w:tr>
-        <w:tc>
-          <w:tcPr>
-            <w:tcW w:type="dxa" w:w="1378"/>
+            <w:tcW w:type="dxa" w:w="1632"/>
             <w:shd w:fill="0F172A"/>
           </w:tcPr>
           <w:p>
             <w:pPr>
-              <w:spacing w:before="60" w:after="60"/>
+              <w:spacing w:before="80" w:after="80"/>
             </w:pPr>
             <w:r>
               <w:rPr>
@@ -6901,127 +6456,7 @@
                 <w:color w:val="FFFFFF"/>
                 <w:sz w:val="16"/>
               </w:rPr>
-              <w:t>TOTAL 3 ANS</w:t>
-            </w:r>
-          </w:p>
-        </w:tc>
-        <w:tc>
-          <w:tcPr>
-            <w:tcW w:type="dxa" w:w="1378"/>
-            <w:shd w:fill="0F172A"/>
-          </w:tcPr>
-          <w:p>
-            <w:pPr>
-              <w:spacing w:before="60" w:after="60"/>
-            </w:pPr>
-            <w:r>
-              <w:rPr>
-                <w:rFonts w:ascii="Arial" w:hAnsi="Arial"/>
-                <w:b/>
-                <w:color w:val="FFFFFF"/>
-                <w:sz w:val="16"/>
-              </w:rPr>
-              <w:t>1er Sept 2026 — 31 Août 2029</w:t>
-            </w:r>
-          </w:p>
-        </w:tc>
-        <w:tc>
-          <w:tcPr>
-            <w:tcW w:type="dxa" w:w="1378"/>
-            <w:shd w:fill="0F172A"/>
-          </w:tcPr>
-          <w:p>
-            <w:pPr>
-              <w:spacing w:before="60" w:after="60"/>
-            </w:pPr>
-            <w:r>
-              <w:rPr>
-                <w:rFonts w:ascii="Arial" w:hAnsi="Arial"/>
-                <w:b/>
-                <w:color w:val="FFFFFF"/>
-                <w:sz w:val="16"/>
-              </w:rPr>
-              <w:t>1 305 000 €</w:t>
-            </w:r>
-          </w:p>
-        </w:tc>
-        <w:tc>
-          <w:tcPr>
-            <w:tcW w:type="dxa" w:w="1378"/>
-            <w:shd w:fill="0F172A"/>
-          </w:tcPr>
-          <w:p>
-            <w:pPr>
-              <w:spacing w:before="60" w:after="60"/>
-            </w:pPr>
-            <w:r>
-              <w:rPr>
-                <w:rFonts w:ascii="Arial" w:hAnsi="Arial"/>
-                <w:b/>
-                <w:color w:val="FFFFFF"/>
-                <w:sz w:val="16"/>
-              </w:rPr>
-              <w:t>652 500 €</w:t>
-            </w:r>
-          </w:p>
-        </w:tc>
-        <w:tc>
-          <w:tcPr>
-            <w:tcW w:type="dxa" w:w="1378"/>
-            <w:shd w:fill="0F172A"/>
-          </w:tcPr>
-          <w:p>
-            <w:pPr>
-              <w:spacing w:before="60" w:after="60"/>
-            </w:pPr>
-            <w:r>
-              <w:rPr>
-                <w:rFonts w:ascii="Arial" w:hAnsi="Arial"/>
-                <w:b/>
-                <w:color w:val="FFFFFF"/>
-                <w:sz w:val="16"/>
-              </w:rPr>
-              <w:t>652 500 €</w:t>
-            </w:r>
-          </w:p>
-        </w:tc>
-        <w:tc>
-          <w:tcPr>
-            <w:tcW w:type="dxa" w:w="1378"/>
-            <w:shd w:fill="0F172A"/>
-          </w:tcPr>
-          <w:p>
-            <w:pPr>
-              <w:spacing w:before="60" w:after="60"/>
-            </w:pPr>
-            <w:r>
-              <w:rPr>
-                <w:rFonts w:ascii="Arial" w:hAnsi="Arial"/>
-                <w:b/>
-                <w:color w:val="FFFFFF"/>
-                <w:sz w:val="16"/>
-              </w:rPr>
-              <w:t>+7 500 000 €</w:t>
-            </w:r>
-          </w:p>
-        </w:tc>
-        <w:tc>
-          <w:tcPr>
-            <w:tcW w:type="dxa" w:w="1378"/>
-            <w:shd w:fill="0F172A"/>
-          </w:tcPr>
-          <w:p>
-            <w:pPr>
-              <w:spacing w:before="60" w:after="60"/>
-            </w:pPr>
-            <w:r>
-              <w:rPr>
-                <w:rFonts w:ascii="Arial" w:hAnsi="Arial"/>
-                <w:b/>
-                <w:color w:val="FFFFFF"/>
-                <w:sz w:val="16"/>
-              </w:rPr>
-              <w:t>+6 847 500 €</w:t>
+              <w:t>+2 500 000 € / an (Bénéfice +2,28 M€)</w:t>
             </w:r>
           </w:p>
         </w:tc>
@@ -7292,7 +6727,7 @@
     </w:p>
     <w:sectPr>
       <w:pgSz w:w="12240" w:h="15840"/>
-      <w:pgMar w:top="1296" w:right="1296" w:bottom="1296" w:left="1296" w:header="720" w:footer="720" w:gutter="0"/>
+      <w:pgMar w:top="1224" w:right="1224" w:bottom="1224" w:left="1224" w:header="720" w:footer="720" w:gutter="0"/>
       <w:cols w:space="720"/>
       <w:docGrid w:linePitch="360"/>
     </w:sectPr>

</xml_diff>